<commit_message>
Add support for lists of multiple types
</commit_message>
<xml_diff>
--- a/Masters project notes.docx
+++ b/Masters project notes.docx
@@ -53,11 +53,19 @@
           <w:lang w:val="fr-FR"/>
         </w:rPr>
       </w:pPr>
+      <w:proofErr w:type="spellStart"/>
       <w:r>
         <w:rPr>
           <w:lang w:val="fr-FR"/>
         </w:rPr>
-        <w:t xml:space="preserve">Pythonfuzz </w:t>
+        <w:t>Pythonfuzz</w:t>
+      </w:r>
+      <w:proofErr w:type="spellEnd"/>
+      <w:r>
+        <w:rPr>
+          <w:lang w:val="fr-FR"/>
+        </w:rPr>
+        <w:t xml:space="preserve"> </w:t>
       </w:r>
       <w:hyperlink r:id="rId6" w:history="1">
         <w:r>
@@ -78,7 +86,15 @@
         </w:numPr>
       </w:pPr>
       <w:r>
-        <w:t>Coverage-guided fuzzer for python</w:t>
+        <w:t xml:space="preserve">Coverage-guided </w:t>
+      </w:r>
+      <w:proofErr w:type="spellStart"/>
+      <w:r>
+        <w:t>fuzzer</w:t>
+      </w:r>
+      <w:proofErr w:type="spellEnd"/>
+      <w:r>
+        <w:t xml:space="preserve"> for python</w:t>
       </w:r>
     </w:p>
     <w:p>
@@ -89,8 +105,13 @@
           <w:numId w:val="1"/>
         </w:numPr>
       </w:pPr>
-      <w:r>
-        <w:t xml:space="preserve">Atheris </w:t>
+      <w:proofErr w:type="spellStart"/>
+      <w:r>
+        <w:t>Atheris</w:t>
+      </w:r>
+      <w:proofErr w:type="spellEnd"/>
+      <w:r>
+        <w:t xml:space="preserve"> </w:t>
       </w:r>
       <w:hyperlink r:id="rId7" w:history="1">
         <w:r>
@@ -110,7 +131,15 @@
         </w:numPr>
       </w:pPr>
       <w:r>
-        <w:t>Google’s coverage-guided fuzzer for python</w:t>
+        <w:t xml:space="preserve">Google’s coverage-guided </w:t>
+      </w:r>
+      <w:proofErr w:type="spellStart"/>
+      <w:r>
+        <w:t>fuzzer</w:t>
+      </w:r>
+      <w:proofErr w:type="spellEnd"/>
+      <w:r>
+        <w:t xml:space="preserve"> for python</w:t>
       </w:r>
     </w:p>
     <w:p>
@@ -163,8 +192,13 @@
           <w:numId w:val="1"/>
         </w:numPr>
       </w:pPr>
-      <w:r>
-        <w:t xml:space="preserve">CrossHair </w:t>
+      <w:proofErr w:type="spellStart"/>
+      <w:r>
+        <w:t>CrossHair</w:t>
+      </w:r>
+      <w:proofErr w:type="spellEnd"/>
+      <w:r>
+        <w:t xml:space="preserve"> </w:t>
       </w:r>
       <w:hyperlink r:id="rId9" w:history="1">
         <w:r>
@@ -189,7 +223,39 @@
     </w:p>
     <w:p>
       <w:r>
-        <w:t>From my research, Hypothesis + HypoFuzz seems like it achieves everything that JQF does. Hypothesis is heavily inspired by QuickCheck and gives a property-based testing framework for python. It generates structured inputs and saves failing inputs for reproduction. It operates on the semantic properties of a program, making it inherently semantic-based. It is not coverage-guided by default, so HypoFuzz extends it for coverage-guided exploration thus providing a fuzzing framework.</w:t>
+        <w:t xml:space="preserve">From my research, Hypothesis + </w:t>
+      </w:r>
+      <w:proofErr w:type="spellStart"/>
+      <w:r>
+        <w:t>HypoFuzz</w:t>
+      </w:r>
+      <w:proofErr w:type="spellEnd"/>
+      <w:r>
+        <w:t xml:space="preserve"> seems like it achieves everything that JQF does. Hypothesis is heavily inspired by </w:t>
+      </w:r>
+      <w:proofErr w:type="spellStart"/>
+      <w:r>
+        <w:t>QuickCheck</w:t>
+      </w:r>
+      <w:proofErr w:type="spellEnd"/>
+      <w:r>
+        <w:t xml:space="preserve"> and gives a property-based testing framework for python. It generates structured inputs and saves failing inputs for reproduction. It operates on the semantic properties of a program, making it inherently </w:t>
+      </w:r>
+      <w:proofErr w:type="gramStart"/>
+      <w:r>
+        <w:t>semantic-based</w:t>
+      </w:r>
+      <w:proofErr w:type="gramEnd"/>
+      <w:r>
+        <w:t xml:space="preserve">. It is not coverage-guided by default, so </w:t>
+      </w:r>
+      <w:proofErr w:type="spellStart"/>
+      <w:r>
+        <w:t>HypoFuzz</w:t>
+      </w:r>
+      <w:proofErr w:type="spellEnd"/>
+      <w:r>
+        <w:t xml:space="preserve"> extends it for coverage-guided exploration thus providing a fuzzing framework.</w:t>
       </w:r>
     </w:p>
     <w:p/>
@@ -208,15 +274,175 @@
     </w:p>
     <w:p>
       <w:r>
-        <w:t>Generalise the stack example to any data structure/api</w:t>
-      </w:r>
+        <w:t>Generalise the stack example to any data structure/</w:t>
+      </w:r>
+      <w:proofErr w:type="spellStart"/>
+      <w:r>
+        <w:t>api</w:t>
+      </w:r>
+      <w:proofErr w:type="spellEnd"/>
       <w:r>
         <w:t xml:space="preserve"> that can take any type of arguments.</w:t>
       </w:r>
     </w:p>
     <w:p>
       <w:r>
-        <w:t>At some point, see if you can read the python script, create AST and traverse it in order to create the right test.</w:t>
+        <w:t xml:space="preserve">At some point, see if you can read the python script, create AST and traverse it </w:t>
+      </w:r>
+      <w:proofErr w:type="gramStart"/>
+      <w:r>
+        <w:t>in order to</w:t>
+      </w:r>
+      <w:proofErr w:type="gramEnd"/>
+      <w:r>
+        <w:t xml:space="preserve"> create the right test.</w:t>
+      </w:r>
+    </w:p>
+    <w:p/>
+    <w:p>
+      <w:r>
+        <w:t>Notes on the universal object:</w:t>
+      </w:r>
+    </w:p>
+    <w:p>
+      <w:r>
+        <w:t xml:space="preserve">Using it to test a very simple summing function </w:t>
+      </w:r>
+      <w:r>
+        <w:t xml:space="preserve">doesn’t work very well. I believe because of how universal is configured and how my two simple functions are configured, </w:t>
+      </w:r>
+      <w:proofErr w:type="spellStart"/>
+      <w:r>
+        <w:t>atheris</w:t>
+      </w:r>
+      <w:proofErr w:type="spellEnd"/>
+      <w:r>
+        <w:t xml:space="preserve"> is unable to quickly find the erroneous input.</w:t>
+      </w:r>
+    </w:p>
+    <w:p>
+      <w:r>
+        <w:t xml:space="preserve">The functions tested have minimal branching, the only branch is when x == -14 so </w:t>
+      </w:r>
+      <w:proofErr w:type="spellStart"/>
+      <w:r>
+        <w:t>atheris</w:t>
+      </w:r>
+      <w:proofErr w:type="spellEnd"/>
+      <w:r>
+        <w:t xml:space="preserve"> receives minimal feedback for different inputs. As a result, without branching information it tends to keep “randomly” inputting the same number into the functions </w:t>
+      </w:r>
+      <w:proofErr w:type="gramStart"/>
+      <w:r>
+        <w:t>over and over again</w:t>
+      </w:r>
+      <w:proofErr w:type="gramEnd"/>
+      <w:r>
+        <w:t xml:space="preserve"> and never inputting -14. If I alter the code so that random </w:t>
+      </w:r>
+      <w:proofErr w:type="spellStart"/>
+      <w:r>
+        <w:t>ints</w:t>
+      </w:r>
+      <w:proofErr w:type="spellEnd"/>
+      <w:r>
+        <w:t xml:space="preserve"> are in the range -100 to 100, it finds -14 </w:t>
+      </w:r>
+      <w:proofErr w:type="gramStart"/>
+      <w:r>
+        <w:t>pretty fast</w:t>
+      </w:r>
+      <w:proofErr w:type="gramEnd"/>
+      <w:r>
+        <w:t xml:space="preserve">, but the time taken seems to grow </w:t>
+      </w:r>
+      <w:r>
+        <w:lastRenderedPageBreak/>
+        <w:t xml:space="preserve">exponentially with how large the range of inputs is. It is in fact far worse than if we passed in </w:t>
+      </w:r>
+      <w:proofErr w:type="spellStart"/>
+      <w:r>
+        <w:t>ints</w:t>
+      </w:r>
+      <w:proofErr w:type="spellEnd"/>
+      <w:r>
+        <w:t xml:space="preserve"> sequentially in the range, as </w:t>
+      </w:r>
+      <w:proofErr w:type="gramStart"/>
+      <w:r>
+        <w:t>the vast majority of</w:t>
+      </w:r>
+      <w:proofErr w:type="gramEnd"/>
+      <w:r>
+        <w:t xml:space="preserve"> integer inputs are the same number due to the poor randomisation (-100 or -10000000 depending on the int range specified.)</w:t>
+      </w:r>
+    </w:p>
+    <w:p>
+      <w:r>
+        <w:t>I probably need to perform some type of testing on how the observed time complexity of this approach grows but it seems to be very bad.</w:t>
+      </w:r>
+    </w:p>
+    <w:p>
+      <w:proofErr w:type="spellStart"/>
+      <w:r>
+        <w:t>Atheris</w:t>
+      </w:r>
+      <w:proofErr w:type="spellEnd"/>
+      <w:r>
+        <w:t xml:space="preserve"> runs coverage-based hill climbing. Since the bug in my test function was a simple x == 14, in most cases where the input is </w:t>
+      </w:r>
+      <w:proofErr w:type="gramStart"/>
+      <w:r>
+        <w:t>say</w:t>
+      </w:r>
+      <w:proofErr w:type="gramEnd"/>
+      <w:r>
+        <w:t xml:space="preserve">, -1000, the coverage never changes so </w:t>
+      </w:r>
+      <w:proofErr w:type="spellStart"/>
+      <w:r>
+        <w:t>atheris</w:t>
+      </w:r>
+      <w:proofErr w:type="spellEnd"/>
+      <w:r>
+        <w:t xml:space="preserve"> receives no feedback and continues endlessly testing the same input values.</w:t>
+      </w:r>
+    </w:p>
+    <w:p>
+      <w:r>
+        <w:t>On the other hand, hypothesis/</w:t>
+      </w:r>
+      <w:proofErr w:type="spellStart"/>
+      <w:r>
+        <w:t>hypofuzz</w:t>
+      </w:r>
+      <w:proofErr w:type="spellEnd"/>
+      <w:r>
+        <w:t xml:space="preserve"> does also use coverage, but it is not entirely coverage driven. Default hypothesis does not even support coverage-guided testing. </w:t>
+      </w:r>
+      <w:proofErr w:type="spellStart"/>
+      <w:r>
+        <w:t>Hypofuzz</w:t>
+      </w:r>
+      <w:proofErr w:type="spellEnd"/>
+      <w:r>
+        <w:t xml:space="preserve"> uses both coverage and systematic exploration of integer spaces with some other algorithms and heuristics at play so for this specific example it seems to work better.</w:t>
+      </w:r>
+    </w:p>
+    <w:p/>
+    <w:p>
+      <w:r>
+        <w:t>Important considerations:</w:t>
+      </w:r>
+    </w:p>
+    <w:p>
+      <w:r>
+        <w:t>How do we treat two functions with differing arity or argument types?</w:t>
+      </w:r>
+    </w:p>
+    <w:p>
+      <w:r>
+        <w:t>How do we treat python default/optional arguments?</w:t>
       </w:r>
     </w:p>
     <w:p/>

</xml_diff>

<commit_message>
Add all WIP files to sync with my laptop
</commit_message>
<xml_diff>
--- a/Masters project notes.docx
+++ b/Masters project notes.docx
@@ -432,6 +432,28 @@
     <w:p/>
     <w:p>
       <w:r>
+        <w:t xml:space="preserve">When comparing two different sorting algorithms, </w:t>
+      </w:r>
+      <w:proofErr w:type="spellStart"/>
+      <w:r>
+        <w:t>hypofuzz</w:t>
+      </w:r>
+      <w:proofErr w:type="spellEnd"/>
+      <w:r>
+        <w:t xml:space="preserve"> was unable to spot the difference when I added a small condition to quicksort if length is &gt;= 6, return the reversed list. For these </w:t>
+      </w:r>
+      <w:proofErr w:type="gramStart"/>
+      <w:r>
+        <w:t>one off</w:t>
+      </w:r>
+      <w:proofErr w:type="gramEnd"/>
+      <w:r>
+        <w:t xml:space="preserve"> conditions, coverage guidance actually makes it harder to spot the difference, as they provide very little feedback. Plain hypothesis was able to catch this bug (without coverage guidance)</w:t>
+      </w:r>
+    </w:p>
+    <w:p/>
+    <w:p>
+      <w:r>
         <w:t>Important considerations:</w:t>
       </w:r>
     </w:p>
@@ -443,6 +465,78 @@
     <w:p>
       <w:r>
         <w:t>How do we treat python default/optional arguments?</w:t>
+      </w:r>
+    </w:p>
+    <w:p/>
+    <w:p>
+      <w:r>
+        <w:t>Philosophical questions:</w:t>
+      </w:r>
+    </w:p>
+    <w:p>
+      <w:r>
+        <w:t xml:space="preserve">Supposing I want to traverse the AST of a python function in order to narrow down the set of possible </w:t>
+      </w:r>
+      <w:proofErr w:type="gramStart"/>
+      <w:r>
+        <w:t>types</w:t>
+      </w:r>
+      <w:proofErr w:type="gramEnd"/>
+      <w:r>
+        <w:t xml:space="preserve"> the function argument(s) can take:</w:t>
+      </w:r>
+    </w:p>
+    <w:p>
+      <w:r>
+        <w:t xml:space="preserve">Assume I have a function f(number) which takes the one argument “number”. As a human programmer it is clear to </w:t>
+      </w:r>
+      <w:proofErr w:type="gramStart"/>
+      <w:r>
+        <w:t>me</w:t>
+      </w:r>
+      <w:proofErr w:type="gramEnd"/>
+      <w:r>
+        <w:t xml:space="preserve"> I need to pass in a number as an argument to this function. From the point of view of an AST traverser trying to figure out the possible types of “number”, say it sees some operator that implies the argument </w:t>
+      </w:r>
+      <w:proofErr w:type="gramStart"/>
+      <w:r>
+        <w:t>has to</w:t>
+      </w:r>
+      <w:proofErr w:type="gramEnd"/>
+      <w:r>
+        <w:t xml:space="preserve"> be a number, who is to say it </w:t>
+      </w:r>
+      <w:r>
+        <w:rPr>
+          <w:i/>
+          <w:iCs/>
+        </w:rPr>
+        <w:t>has</w:t>
+      </w:r>
+      <w:r>
+        <w:t xml:space="preserve"> to narrow down the possible types to numbers. String could </w:t>
+      </w:r>
+      <w:proofErr w:type="gramStart"/>
+      <w:r>
+        <w:t>actually be</w:t>
+      </w:r>
+      <w:proofErr w:type="gramEnd"/>
+      <w:r>
+        <w:t xml:space="preserve"> a valid type to this function argument, but this use of a number operator is the result of human error and should actually be flagged, not ignored. </w:t>
+      </w:r>
+    </w:p>
+    <w:p>
+      <w:r>
+        <w:lastRenderedPageBreak/>
+        <w:t xml:space="preserve">Solution here may be to always eliminate types that cause uncaught exceptions, like passing in a string when an int is expected. If the set of possible types is narrowed down to only options that result in no valuable work done in a </w:t>
+      </w:r>
+      <w:proofErr w:type="gramStart"/>
+      <w:r>
+        <w:t>function</w:t>
+      </w:r>
+      <w:proofErr w:type="gramEnd"/>
+      <w:r>
+        <w:t xml:space="preserve"> then that is how the function gets flagged for having issues. This is probably actually fine.</w:t>
       </w:r>
     </w:p>
     <w:p/>
@@ -1535,6 +1629,36 @@
       <w:shd w:val="clear" w:color="auto" w:fill="E1DFDD"/>
     </w:rPr>
   </w:style>
+  <w:style w:type="paragraph" w:styleId="HTMLPreformatted">
+    <w:name w:val="HTML Preformatted"/>
+    <w:basedOn w:val="Normal"/>
+    <w:link w:val="HTMLPreformattedChar"/>
+    <w:uiPriority w:val="99"/>
+    <w:semiHidden/>
+    <w:unhideWhenUsed/>
+    <w:rsid w:val="000F0B35"/>
+    <w:pPr>
+      <w:spacing w:after="0" w:line="240" w:lineRule="auto"/>
+    </w:pPr>
+    <w:rPr>
+      <w:rFonts w:ascii="Consolas" w:hAnsi="Consolas"/>
+      <w:sz w:val="20"/>
+      <w:szCs w:val="20"/>
+    </w:rPr>
+  </w:style>
+  <w:style w:type="character" w:customStyle="1" w:styleId="HTMLPreformattedChar">
+    <w:name w:val="HTML Preformatted Char"/>
+    <w:basedOn w:val="DefaultParagraphFont"/>
+    <w:link w:val="HTMLPreformatted"/>
+    <w:uiPriority w:val="99"/>
+    <w:semiHidden/>
+    <w:rsid w:val="000F0B35"/>
+    <w:rPr>
+      <w:rFonts w:ascii="Consolas" w:hAnsi="Consolas"/>
+      <w:sz w:val="20"/>
+      <w:szCs w:val="20"/>
+    </w:rPr>
+  </w:style>
 </w:styles>
 </file>
 

</xml_diff>

<commit_message>
Bulk commit changes for meeting
</commit_message>
<xml_diff>
--- a/Masters project notes.docx
+++ b/Masters project notes.docx
@@ -242,6 +242,37 @@
       <w:r>
         <w:lastRenderedPageBreak/>
         <w:t>When comparing two different sorting algorithms, hypofuzz was unable to spot the difference when I added a small condition to quicksort if length is &gt;= 6, return the reversed list. For these one off conditions, coverage guidance actually makes it harder to spot the difference, as they provide very little feedback. Plain hypothesis was able to catch this bug (without coverage guidance)</w:t>
+      </w:r>
+    </w:p>
+    <w:p>
+      <w:r>
+        <w:t xml:space="preserve">Testing universal object on two sorting algorithms always results in empty lists as universals value gets set to empty list if len() is called on it. This is bcos if we initialise it as a list of universals, this may be wrong as it may be intended to be a string. </w:t>
+      </w:r>
+    </w:p>
+    <w:p>
+      <w:r>
+        <w:t>Universal needs lt, gt, le, ge operators define</w:t>
+      </w:r>
+      <w:r>
+        <w:t xml:space="preserve"> which I did</w:t>
+      </w:r>
+    </w:p>
+    <w:p>
+      <w:r>
+        <w:t>Universal does not support item assignment</w:t>
+      </w:r>
+      <w:r>
+        <w:t xml:space="preserve"> e.g the line</w:t>
+      </w:r>
+    </w:p>
+    <w:p>
+      <w:r>
+        <w:t>arr[i + 1], arr[high] = arr[high], arr[i + 1]</w:t>
+      </w:r>
+    </w:p>
+    <w:p>
+      <w:r>
+        <w:t>does not work if arr is a universal and each element of arr is a universal</w:t>
       </w:r>
     </w:p>
     <w:p>
@@ -1019,7 +1050,6 @@
   <w:style w:type="character" w:default="1" w:styleId="DefaultParagraphFont">
     <w:name w:val="Default Paragraph Font"/>
     <w:uiPriority w:val="1"/>
-    <w:semiHidden/>
     <w:unhideWhenUsed/>
   </w:style>
   <w:style w:type="table" w:default="1" w:styleId="TableNormal">

</xml_diff>

<commit_message>
sort old approaches into misc folder
</commit_message>
<xml_diff>
--- a/Masters project notes.docx
+++ b/Masters project notes.docx
@@ -53,11 +53,19 @@
           <w:lang w:val="fr-FR"/>
         </w:rPr>
       </w:pPr>
+      <w:proofErr w:type="spellStart"/>
       <w:r>
         <w:rPr>
           <w:lang w:val="fr-FR"/>
         </w:rPr>
-        <w:t xml:space="preserve">Pythonfuzz </w:t>
+        <w:t>Pythonfuzz</w:t>
+      </w:r>
+      <w:proofErr w:type="spellEnd"/>
+      <w:r>
+        <w:rPr>
+          <w:lang w:val="fr-FR"/>
+        </w:rPr>
+        <w:t xml:space="preserve"> </w:t>
       </w:r>
       <w:hyperlink r:id="rId6" w:history="1">
         <w:r>
@@ -78,7 +86,15 @@
         </w:numPr>
       </w:pPr>
       <w:r>
-        <w:t>Coverage-guided fuzzer for python</w:t>
+        <w:t xml:space="preserve">Coverage-guided </w:t>
+      </w:r>
+      <w:proofErr w:type="spellStart"/>
+      <w:r>
+        <w:t>fuzzer</w:t>
+      </w:r>
+      <w:proofErr w:type="spellEnd"/>
+      <w:r>
+        <w:t xml:space="preserve"> for python</w:t>
       </w:r>
     </w:p>
     <w:p>
@@ -89,8 +105,13 @@
           <w:numId w:val="1"/>
         </w:numPr>
       </w:pPr>
-      <w:r>
-        <w:t xml:space="preserve">Atheris </w:t>
+      <w:proofErr w:type="spellStart"/>
+      <w:r>
+        <w:t>Atheris</w:t>
+      </w:r>
+      <w:proofErr w:type="spellEnd"/>
+      <w:r>
+        <w:t xml:space="preserve"> </w:t>
       </w:r>
       <w:hyperlink r:id="rId7" w:history="1">
         <w:r>
@@ -110,7 +131,15 @@
         </w:numPr>
       </w:pPr>
       <w:r>
-        <w:t>Google’s coverage-guided fuzzer for python</w:t>
+        <w:t xml:space="preserve">Google’s coverage-guided </w:t>
+      </w:r>
+      <w:proofErr w:type="spellStart"/>
+      <w:r>
+        <w:t>fuzzer</w:t>
+      </w:r>
+      <w:proofErr w:type="spellEnd"/>
+      <w:r>
+        <w:t xml:space="preserve"> for python</w:t>
       </w:r>
     </w:p>
     <w:p>
@@ -130,15 +159,28 @@
         </w:rPr>
         <w:t xml:space="preserve">HypoFuzz </w:t>
       </w:r>
-      <w:hyperlink r:id="rId8" w:history="1">
-        <w:r>
-          <w:rPr>
-            <w:rStyle w:val="Hyperlink"/>
-            <w:lang w:val="de-DE"/>
-          </w:rPr>
-          <w:t>https://github.com/Zac-HD/hypofuzz</w:t>
-        </w:r>
-      </w:hyperlink>
+      <w:r>
+        <w:fldChar w:fldCharType="begin"/>
+      </w:r>
+      <w:r>
+        <w:rPr>
+          <w:lang w:val="de-DE"/>
+        </w:rPr>
+        <w:instrText>HYPERLINK "https://github.com/Zac-HD/hypofuzz"</w:instrText>
+      </w:r>
+      <w:r>
+        <w:fldChar w:fldCharType="separate"/>
+      </w:r>
+      <w:r>
+        <w:rPr>
+          <w:rStyle w:val="Hyperlink"/>
+          <w:lang w:val="de-DE"/>
+        </w:rPr>
+        <w:t>https://github.com/Zac-HD/hypofuzz</w:t>
+      </w:r>
+      <w:r>
+        <w:fldChar w:fldCharType="end"/>
+      </w:r>
     </w:p>
     <w:p>
       <w:pPr>
@@ -163,10 +205,15 @@
           <w:numId w:val="1"/>
         </w:numPr>
       </w:pPr>
-      <w:r>
-        <w:t xml:space="preserve">CrossHair </w:t>
-      </w:r>
-      <w:hyperlink r:id="rId9" w:history="1">
+      <w:proofErr w:type="spellStart"/>
+      <w:r>
+        <w:t>CrossHair</w:t>
+      </w:r>
+      <w:proofErr w:type="spellEnd"/>
+      <w:r>
+        <w:t xml:space="preserve"> </w:t>
+      </w:r>
+      <w:hyperlink r:id="rId8" w:history="1">
         <w:r>
           <w:rPr>
             <w:rStyle w:val="Hyperlink"/>
@@ -189,7 +236,39 @@
     </w:p>
     <w:p>
       <w:r>
-        <w:t>From my research, Hypothesis + HypoFuzz seems like it achieves everything that JQF does. Hypothesis is heavily inspired by QuickCheck and gives a property-based testing framework for python. It generates structured inputs and saves failing inputs for reproduction. It operates on the semantic properties of a program, making it inherently semantic-based. It is not coverage-guided by default, so HypoFuzz extends it for coverage-guided exploration thus providing a fuzzing framework.</w:t>
+        <w:t xml:space="preserve">From my research, Hypothesis + </w:t>
+      </w:r>
+      <w:proofErr w:type="spellStart"/>
+      <w:r>
+        <w:t>HypoFuzz</w:t>
+      </w:r>
+      <w:proofErr w:type="spellEnd"/>
+      <w:r>
+        <w:t xml:space="preserve"> seems like it achieves everything that JQF does. Hypothesis is heavily inspired by </w:t>
+      </w:r>
+      <w:proofErr w:type="spellStart"/>
+      <w:r>
+        <w:t>QuickCheck</w:t>
+      </w:r>
+      <w:proofErr w:type="spellEnd"/>
+      <w:r>
+        <w:t xml:space="preserve"> and gives a property-based testing framework for python. It generates structured inputs and saves failing inputs for reproduction. It operates on the semantic properties of a program, making it inherently </w:t>
+      </w:r>
+      <w:proofErr w:type="gramStart"/>
+      <w:r>
+        <w:t>semantic-based</w:t>
+      </w:r>
+      <w:proofErr w:type="gramEnd"/>
+      <w:r>
+        <w:t xml:space="preserve">. It is not coverage-guided by default, so </w:t>
+      </w:r>
+      <w:proofErr w:type="spellStart"/>
+      <w:r>
+        <w:t>HypoFuzz</w:t>
+      </w:r>
+      <w:proofErr w:type="spellEnd"/>
+      <w:r>
+        <w:t xml:space="preserve"> extends it for coverage-guided exploration thus providing a fuzzing framework.</w:t>
       </w:r>
     </w:p>
     <w:p/>
@@ -208,15 +287,28 @@
     </w:p>
     <w:p>
       <w:r>
-        <w:t>Generalise the stack example to any data structure/api</w:t>
-      </w:r>
+        <w:t>Generalise the stack example to any data structure/</w:t>
+      </w:r>
+      <w:proofErr w:type="spellStart"/>
+      <w:r>
+        <w:t>api</w:t>
+      </w:r>
+      <w:proofErr w:type="spellEnd"/>
       <w:r>
         <w:t xml:space="preserve"> that can take any type of arguments.</w:t>
       </w:r>
     </w:p>
     <w:p>
       <w:r>
-        <w:t>At some point, see if you can read the python script, create AST and traverse it in order to create the right test.</w:t>
+        <w:t xml:space="preserve">At some point, see if you can read the python script, create AST and traverse it </w:t>
+      </w:r>
+      <w:proofErr w:type="gramStart"/>
+      <w:r>
+        <w:t>in order to</w:t>
+      </w:r>
+      <w:proofErr w:type="gramEnd"/>
+      <w:r>
+        <w:t xml:space="preserve"> create the right test.</w:t>
       </w:r>
     </w:p>
     <w:p/>
@@ -230,18 +322,58 @@
         <w:t xml:space="preserve">Using it to test a very simple summing function </w:t>
       </w:r>
       <w:r>
-        <w:t>doesn’t work very well. I believe because of how universal is configured and how my two simple functions are configured, atheris is unable to quickly find the erroneous input.</w:t>
-      </w:r>
-    </w:p>
-    <w:p>
-      <w:r>
-        <w:t>I think the fact that fuzz testing is obfuscated inside the universal object the module is unable to correctly perform its algorithms to find erroneous inputs. I vibe coded a hypofuzz universal object and also tried manually implementing one and couldn’t get it to spot any bugs but given more time there may be a way to implement this. Just haven’t figured it out yet.</w:t>
+        <w:t xml:space="preserve">doesn’t work very well. I believe because of how universal is configured and how my two simple functions are configured, </w:t>
+      </w:r>
+      <w:proofErr w:type="spellStart"/>
+      <w:r>
+        <w:t>atheris</w:t>
+      </w:r>
+      <w:proofErr w:type="spellEnd"/>
+      <w:r>
+        <w:t xml:space="preserve"> is unable to quickly find the erroneous input.</w:t>
+      </w:r>
+    </w:p>
+    <w:p>
+      <w:r>
+        <w:t xml:space="preserve">I think the fact that fuzz testing is obfuscated inside the universal object the module is unable to correctly perform its algorithms to find erroneous inputs. I vibe coded a </w:t>
+      </w:r>
+      <w:proofErr w:type="spellStart"/>
+      <w:r>
+        <w:t>hypofuzz</w:t>
+      </w:r>
+      <w:proofErr w:type="spellEnd"/>
+      <w:r>
+        <w:t xml:space="preserve"> universal object </w:t>
+      </w:r>
+      <w:proofErr w:type="gramStart"/>
+      <w:r>
+        <w:t>and also</w:t>
+      </w:r>
+      <w:proofErr w:type="gramEnd"/>
+      <w:r>
+        <w:t xml:space="preserve"> tried manually implementing one and couldn’t get it to spot any bugs but given more time there may be a way to implement this. Just haven’t figured it out yet.</w:t>
       </w:r>
     </w:p>
     <w:p>
       <w:r>
         <w:lastRenderedPageBreak/>
-        <w:t>When comparing two different sorting algorithms, hypofuzz was unable to spot the difference when I added a small condition to quicksort if length is &gt;= 6, return the reversed list. For these one off conditions, coverage guidance actually makes it harder to spot the difference, as they provide very little feedback. Plain hypothesis was able to catch this bug (without coverage guidance)</w:t>
+        <w:t xml:space="preserve">When comparing two different sorting algorithms, </w:t>
+      </w:r>
+      <w:proofErr w:type="spellStart"/>
+      <w:r>
+        <w:t>hypofuzz</w:t>
+      </w:r>
+      <w:proofErr w:type="spellEnd"/>
+      <w:r>
+        <w:t xml:space="preserve"> was unable to spot the difference when I added a small condition to quicksort if length is &gt;= 6, return the reversed list. For these </w:t>
+      </w:r>
+      <w:proofErr w:type="gramStart"/>
+      <w:r>
+        <w:t>one off</w:t>
+      </w:r>
+      <w:proofErr w:type="gramEnd"/>
+      <w:r>
+        <w:t xml:space="preserve"> conditions, coverage guidance actually makes it harder to spot the difference, as they provide very little feedback. Plain hypothesis was able to catch this bug (without coverage guidance)</w:t>
       </w:r>
     </w:p>
     <w:p>
@@ -260,12 +392,57 @@
     </w:p>
     <w:p>
       <w:r>
-        <w:t xml:space="preserve">Testing universal object on two sorting algorithms always results in empty lists as universals value gets set to empty list if len() is called on it. This is bcos if we initialise it as a list of universals, this may be wrong as it may be intended to be a string. </w:t>
-      </w:r>
-    </w:p>
-    <w:p>
-      <w:r>
-        <w:t>Universal needs lt, gt, le, ge operators define</w:t>
+        <w:t xml:space="preserve">Testing universal object on two sorting algorithms always results in empty lists as universals value gets set to empty list if </w:t>
+      </w:r>
+      <w:proofErr w:type="spellStart"/>
+      <w:proofErr w:type="gramStart"/>
+      <w:r>
+        <w:t>len</w:t>
+      </w:r>
+      <w:proofErr w:type="spellEnd"/>
+      <w:r>
+        <w:t>(</w:t>
+      </w:r>
+      <w:proofErr w:type="gramEnd"/>
+      <w:r>
+        <w:t xml:space="preserve">) is called on it. This is </w:t>
+      </w:r>
+      <w:proofErr w:type="spellStart"/>
+      <w:r>
+        <w:t>bcos</w:t>
+      </w:r>
+      <w:proofErr w:type="spellEnd"/>
+      <w:r>
+        <w:t xml:space="preserve"> if we initialise it as a list of universals, this may be wrong as it may be intended to be a string. </w:t>
+      </w:r>
+    </w:p>
+    <w:p>
+      <w:r>
+        <w:t xml:space="preserve">Universal needs </w:t>
+      </w:r>
+      <w:proofErr w:type="spellStart"/>
+      <w:r>
+        <w:t>lt</w:t>
+      </w:r>
+      <w:proofErr w:type="spellEnd"/>
+      <w:r>
+        <w:t xml:space="preserve">, </w:t>
+      </w:r>
+      <w:proofErr w:type="spellStart"/>
+      <w:r>
+        <w:t>gt</w:t>
+      </w:r>
+      <w:proofErr w:type="spellEnd"/>
+      <w:r>
+        <w:t xml:space="preserve">, le, </w:t>
+      </w:r>
+      <w:proofErr w:type="spellStart"/>
+      <w:r>
+        <w:t>ge</w:t>
+      </w:r>
+      <w:proofErr w:type="spellEnd"/>
+      <w:r>
+        <w:t xml:space="preserve"> operators define</w:t>
       </w:r>
       <w:r>
         <w:t>d</w:t>
@@ -279,20 +456,99 @@
         <w:t>Universal does not support item assignment</w:t>
       </w:r>
       <w:r>
-        <w:t xml:space="preserve"> e.g the line</w:t>
-      </w:r>
-    </w:p>
-    <w:p>
-      <w:r>
-        <w:t>arr[i + 1], arr[high] = arr[high], arr[i + 1]</w:t>
-      </w:r>
-    </w:p>
-    <w:p>
-      <w:r>
-        <w:t>does not work if arr is a universal and each element of arr is a universal</w:t>
-      </w:r>
-      <w:r>
-        <w:t xml:space="preserve"> I “vibecoded” an implementation of this.</w:t>
+        <w:t xml:space="preserve"> </w:t>
+      </w:r>
+      <w:proofErr w:type="spellStart"/>
+      <w:r>
+        <w:t>e.g</w:t>
+      </w:r>
+      <w:proofErr w:type="spellEnd"/>
+      <w:r>
+        <w:t xml:space="preserve"> the line</w:t>
+      </w:r>
+    </w:p>
+    <w:p>
+      <w:proofErr w:type="spellStart"/>
+      <w:proofErr w:type="gramStart"/>
+      <w:r>
+        <w:t>arr</w:t>
+      </w:r>
+      <w:proofErr w:type="spellEnd"/>
+      <w:r>
+        <w:t>[</w:t>
+      </w:r>
+      <w:proofErr w:type="spellStart"/>
+      <w:proofErr w:type="gramEnd"/>
+      <w:r>
+        <w:t>i</w:t>
+      </w:r>
+      <w:proofErr w:type="spellEnd"/>
+      <w:r>
+        <w:t xml:space="preserve"> + 1], </w:t>
+      </w:r>
+      <w:proofErr w:type="spellStart"/>
+      <w:r>
+        <w:t>arr</w:t>
+      </w:r>
+      <w:proofErr w:type="spellEnd"/>
+      <w:r>
+        <w:t xml:space="preserve">[high] = </w:t>
+      </w:r>
+      <w:proofErr w:type="spellStart"/>
+      <w:r>
+        <w:t>arr</w:t>
+      </w:r>
+      <w:proofErr w:type="spellEnd"/>
+      <w:r>
+        <w:t xml:space="preserve">[high], </w:t>
+      </w:r>
+      <w:proofErr w:type="spellStart"/>
+      <w:r>
+        <w:t>arr</w:t>
+      </w:r>
+      <w:proofErr w:type="spellEnd"/>
+      <w:r>
+        <w:t>[</w:t>
+      </w:r>
+      <w:proofErr w:type="spellStart"/>
+      <w:r>
+        <w:t>i</w:t>
+      </w:r>
+      <w:proofErr w:type="spellEnd"/>
+      <w:r>
+        <w:t xml:space="preserve"> + 1]</w:t>
+      </w:r>
+    </w:p>
+    <w:p>
+      <w:r>
+        <w:t xml:space="preserve">does not work if </w:t>
+      </w:r>
+      <w:proofErr w:type="spellStart"/>
+      <w:r>
+        <w:t>arr</w:t>
+      </w:r>
+      <w:proofErr w:type="spellEnd"/>
+      <w:r>
+        <w:t xml:space="preserve"> is a universal and each element of </w:t>
+      </w:r>
+      <w:proofErr w:type="spellStart"/>
+      <w:r>
+        <w:t>arr</w:t>
+      </w:r>
+      <w:proofErr w:type="spellEnd"/>
+      <w:r>
+        <w:t xml:space="preserve"> is a universal</w:t>
+      </w:r>
+      <w:r>
+        <w:t xml:space="preserve"> I “</w:t>
+      </w:r>
+      <w:proofErr w:type="spellStart"/>
+      <w:r>
+        <w:t>vibecoded</w:t>
+      </w:r>
+      <w:proofErr w:type="spellEnd"/>
+      <w:r>
+        <w:t>” an implementation of this.</w:t>
       </w:r>
     </w:p>
     <w:p>
@@ -308,12 +564,44 @@
     </w:p>
     <w:p>
       <w:r>
-        <w:t>Read TypeEvalPy to find good frameworks for function parameters.</w:t>
-      </w:r>
-    </w:p>
-    <w:p>
-      <w:r>
-        <w:t xml:space="preserve">Tried HeaderGen as it was apparently the best for all categories including function parameters. When I tried it, it would only infer function return types and not parameters. The github only mentions that it can resolve function return types and I could not figure out any way to get it to infer parameter types. </w:t>
+        <w:t xml:space="preserve">Read </w:t>
+      </w:r>
+      <w:proofErr w:type="spellStart"/>
+      <w:r>
+        <w:t>TypeEvalPy</w:t>
+      </w:r>
+      <w:proofErr w:type="spellEnd"/>
+      <w:r>
+        <w:t xml:space="preserve"> to find good frameworks for function parameters.</w:t>
+      </w:r>
+    </w:p>
+    <w:p>
+      <w:r>
+        <w:t xml:space="preserve">Tried </w:t>
+      </w:r>
+      <w:proofErr w:type="spellStart"/>
+      <w:r>
+        <w:t>HeaderGen</w:t>
+      </w:r>
+      <w:proofErr w:type="spellEnd"/>
+      <w:r>
+        <w:t xml:space="preserve"> as it was apparently the best for all categories including function parameters. When I tried it, it would only infer function return types and not parameters. The </w:t>
+      </w:r>
+      <w:proofErr w:type="spellStart"/>
+      <w:r>
+        <w:t>github</w:t>
+      </w:r>
+      <w:proofErr w:type="spellEnd"/>
+      <w:r>
+        <w:t xml:space="preserve"> only mentions that it can resolve function return </w:t>
+      </w:r>
+      <w:proofErr w:type="gramStart"/>
+      <w:r>
+        <w:t>types</w:t>
+      </w:r>
+      <w:proofErr w:type="gramEnd"/>
+      <w:r>
+        <w:t xml:space="preserve"> and I could not figure out any way to get it to infer parameter types. </w:t>
       </w:r>
     </w:p>
     <w:p>
@@ -367,26 +655,103 @@
         </w:numPr>
       </w:pPr>
       <w:r>
-        <w:t xml:space="preserve">Hypothesis/Hypofuzz “Strategies” are how you define what is passed in to the function you want to fuzz. E.g  </w:t>
+        <w:t>Hypothesis/</w:t>
+      </w:r>
+      <w:proofErr w:type="spellStart"/>
+      <w:r>
+        <w:t>Hypofuzz</w:t>
+      </w:r>
+      <w:proofErr w:type="spellEnd"/>
+      <w:r>
+        <w:t xml:space="preserve"> “Strategies” are how you define what is passed </w:t>
+      </w:r>
+      <w:proofErr w:type="gramStart"/>
+      <w:r>
+        <w:t>in to</w:t>
+      </w:r>
+      <w:proofErr w:type="gramEnd"/>
+      <w:r>
+        <w:t xml:space="preserve"> the function you want to fuzz. </w:t>
+      </w:r>
+      <w:proofErr w:type="spellStart"/>
+      <w:r>
+        <w:t>E.g</w:t>
+      </w:r>
+      <w:proofErr w:type="spellEnd"/>
+      <w:r>
+        <w:t xml:space="preserve">  </w:t>
       </w:r>
     </w:p>
     <w:p>
       <w:r>
         <w:lastRenderedPageBreak/>
-        <w:t>@given(st.lists(st.integers() | st.floats()))</w:t>
-      </w:r>
-    </w:p>
-    <w:p>
-      <w:r>
-        <w:t>def test_sort_correct(lst):</w:t>
-      </w:r>
-    </w:p>
-    <w:p>
-      <w:r>
-        <w:t xml:space="preserve">    </w:t>
-      </w:r>
-      <w:r>
-        <w:t>assert(my_sort(lst) == sorted(lst))</w:t>
+        <w:t>@given(</w:t>
+      </w:r>
+      <w:proofErr w:type="gramStart"/>
+      <w:r>
+        <w:t>st.lists</w:t>
+      </w:r>
+      <w:proofErr w:type="gramEnd"/>
+      <w:r>
+        <w:t xml:space="preserve">(st.integers() | </w:t>
+      </w:r>
+      <w:proofErr w:type="spellStart"/>
+      <w:r>
+        <w:t>st.floats</w:t>
+      </w:r>
+      <w:proofErr w:type="spellEnd"/>
+      <w:r>
+        <w:t>()))</w:t>
+      </w:r>
+    </w:p>
+    <w:p>
+      <w:r>
+        <w:t xml:space="preserve">def </w:t>
+      </w:r>
+      <w:proofErr w:type="spellStart"/>
+      <w:r>
+        <w:t>test_sort_correct</w:t>
+      </w:r>
+      <w:proofErr w:type="spellEnd"/>
+      <w:r>
+        <w:t>(</w:t>
+      </w:r>
+      <w:proofErr w:type="spellStart"/>
+      <w:r>
+        <w:t>lst</w:t>
+      </w:r>
+      <w:proofErr w:type="spellEnd"/>
+      <w:r>
+        <w:t>):</w:t>
+      </w:r>
+    </w:p>
+    <w:p>
+      <w:r>
+        <w:t xml:space="preserve">    assert(</w:t>
+      </w:r>
+      <w:proofErr w:type="spellStart"/>
+      <w:r>
+        <w:t>my_sort</w:t>
+      </w:r>
+      <w:proofErr w:type="spellEnd"/>
+      <w:r>
+        <w:t>(</w:t>
+      </w:r>
+      <w:proofErr w:type="spellStart"/>
+      <w:r>
+        <w:t>lst</w:t>
+      </w:r>
+      <w:proofErr w:type="spellEnd"/>
+      <w:r>
+        <w:t>) == sorted(</w:t>
+      </w:r>
+      <w:proofErr w:type="spellStart"/>
+      <w:r>
+        <w:t>lst</w:t>
+      </w:r>
+      <w:proofErr w:type="spellEnd"/>
+      <w:r>
+        <w:t>))</w:t>
       </w:r>
     </w:p>
     <w:p>
@@ -398,7 +763,23 @@
         </w:numPr>
       </w:pPr>
       <w:r>
-        <w:t>In that code snippet, the strategy is to fuzz my_sort with inputs of type list[int|str]</w:t>
+        <w:t xml:space="preserve">In that code snippet, the strategy is to fuzz </w:t>
+      </w:r>
+      <w:proofErr w:type="spellStart"/>
+      <w:r>
+        <w:t>my_sort</w:t>
+      </w:r>
+      <w:proofErr w:type="spellEnd"/>
+      <w:r>
+        <w:t xml:space="preserve"> with inputs of type list[</w:t>
+      </w:r>
+      <w:proofErr w:type="spellStart"/>
+      <w:r>
+        <w:t>int|str</w:t>
+      </w:r>
+      <w:proofErr w:type="spellEnd"/>
+      <w:r>
+        <w:t>]</w:t>
       </w:r>
     </w:p>
     <w:p>
@@ -410,7 +791,15 @@
         </w:numPr>
       </w:pPr>
       <w:r>
-        <w:t>In the case of my universal strategy, I simply fuzz with a strategy that can be though of as the following:</w:t>
+        <w:t xml:space="preserve">In the case of my universal strategy, I simply fuzz with a strategy that can be </w:t>
+      </w:r>
+      <w:proofErr w:type="spellStart"/>
+      <w:r>
+        <w:t>though</w:t>
+      </w:r>
+      <w:proofErr w:type="spellEnd"/>
+      <w:r>
+        <w:t xml:space="preserve"> of as the following:</w:t>
       </w:r>
     </w:p>
     <w:p>
@@ -421,8 +810,55 @@
           <w:numId w:val="3"/>
         </w:numPr>
       </w:pPr>
-      <w:r>
-        <w:t>strat = int|str|float|bool|None|list[strat]|dict[str,strat]|tuple[strat]</w:t>
+      <w:proofErr w:type="spellStart"/>
+      <w:r>
+        <w:t>strat</w:t>
+      </w:r>
+      <w:proofErr w:type="spellEnd"/>
+      <w:r>
+        <w:t xml:space="preserve"> = </w:t>
+      </w:r>
+      <w:proofErr w:type="spellStart"/>
+      <w:r>
+        <w:t>int|str|float|bool|None|list</w:t>
+      </w:r>
+      <w:proofErr w:type="spellEnd"/>
+      <w:r>
+        <w:t>[</w:t>
+      </w:r>
+      <w:proofErr w:type="spellStart"/>
+      <w:r>
+        <w:t>strat</w:t>
+      </w:r>
+      <w:proofErr w:type="spellEnd"/>
+      <w:r>
+        <w:t>]|</w:t>
+      </w:r>
+      <w:proofErr w:type="spellStart"/>
+      <w:r>
+        <w:t>dict</w:t>
+      </w:r>
+      <w:proofErr w:type="spellEnd"/>
+      <w:r>
+        <w:t>[</w:t>
+      </w:r>
+      <w:proofErr w:type="spellStart"/>
+      <w:proofErr w:type="gramStart"/>
+      <w:r>
+        <w:t>str,strat</w:t>
+      </w:r>
+      <w:proofErr w:type="spellEnd"/>
+      <w:proofErr w:type="gramEnd"/>
+      <w:r>
+        <w:t>]|tuple[</w:t>
+      </w:r>
+      <w:proofErr w:type="spellStart"/>
+      <w:r>
+        <w:t>strat</w:t>
+      </w:r>
+      <w:proofErr w:type="spellEnd"/>
+      <w:r>
+        <w:t>]</w:t>
       </w:r>
     </w:p>
     <w:p>
@@ -434,7 +870,15 @@
         </w:numPr>
       </w:pPr>
       <w:r>
-        <w:t>I have logic implemented so that if we encounter a TypeError, we discard the type that caused the error from the pool of possible types in our strategy for future iterations.</w:t>
+        <w:t xml:space="preserve">I have logic implemented so that if we encounter a </w:t>
+      </w:r>
+      <w:proofErr w:type="spellStart"/>
+      <w:r>
+        <w:t>TypeError</w:t>
+      </w:r>
+      <w:proofErr w:type="spellEnd"/>
+      <w:r>
+        <w:t>, we discard the type that caused the error from the pool of possible types in our strategy for future iterations.</w:t>
       </w:r>
     </w:p>
     <w:p>
@@ -446,7 +890,15 @@
         </w:numPr>
       </w:pPr>
       <w:r>
-        <w:t>It seems to work fairly well for the simple tests I have performed so far</w:t>
+        <w:t xml:space="preserve">It seems to work </w:t>
+      </w:r>
+      <w:proofErr w:type="gramStart"/>
+      <w:r>
+        <w:t>fairly well</w:t>
+      </w:r>
+      <w:proofErr w:type="gramEnd"/>
+      <w:r>
+        <w:t xml:space="preserve"> for the simple tests I have performed so far</w:t>
       </w:r>
     </w:p>
     <w:p>
@@ -458,7 +910,15 @@
         </w:numPr>
       </w:pPr>
       <w:r>
-        <w:t>Because it essentially brute forces fuzzing with different types until it works, I can imagine this being quite slow for fuzzing complex functions with lots of arguments but this will have to be tested more</w:t>
+        <w:t xml:space="preserve">Because it essentially brute forces fuzzing with different types until it works, I can imagine this being quite slow for fuzzing complex functions with lots of </w:t>
+      </w:r>
+      <w:proofErr w:type="gramStart"/>
+      <w:r>
+        <w:t>arguments</w:t>
+      </w:r>
+      <w:proofErr w:type="gramEnd"/>
+      <w:r>
+        <w:t xml:space="preserve"> but this will have to be tested more</w:t>
       </w:r>
     </w:p>
     <w:p>
@@ -481,23 +941,76 @@
     </w:p>
     <w:p>
       <w:r>
-        <w:t>If we assume there isn’t any explicit casting in the function we are fuzzing, how would a universal handle a situation where the type is ambiguous e.g calling len(universal). Len is valid for both string and list so how do we lock universal here?</w:t>
-      </w:r>
-    </w:p>
-    <w:p>
-      <w:r>
-        <w:t>Similarly, how would we define operators like plus (+) for example? If we have two universals u1 and u2, the statement u1 + u2 could imply that u1 and u2 are strings, ints, floats, lists, tuples so how can we implement this operator.</w:t>
-      </w:r>
-    </w:p>
-    <w:p>
-      <w:r>
-        <w:t>Theoretically speaking, at best we are determining the type of a (universal) object based on how that object is treated in the code and what functions and operations are applied to it. At best a perfect solution seems to me like it would essentially be a glorified type inference algorithm.</w:t>
+        <w:t xml:space="preserve">If we assume there isn’t any explicit casting in the function we are fuzzing, how would a universal handle a situation where the type is ambiguous </w:t>
+      </w:r>
+      <w:proofErr w:type="spellStart"/>
+      <w:r>
+        <w:t>e.g</w:t>
+      </w:r>
+      <w:proofErr w:type="spellEnd"/>
+      <w:r>
+        <w:t xml:space="preserve"> calling </w:t>
+      </w:r>
+      <w:proofErr w:type="spellStart"/>
+      <w:r>
+        <w:t>len</w:t>
+      </w:r>
+      <w:proofErr w:type="spellEnd"/>
+      <w:r>
+        <w:t>(universal). Len is valid for both string and list so how do we lock universal here?</w:t>
+      </w:r>
+    </w:p>
+    <w:p>
+      <w:r>
+        <w:t xml:space="preserve">Similarly, how would we define operators like plus (+) for example? If we have two universals u1 and u2, the statement u1 + u2 could imply that u1 and u2 are strings, </w:t>
+      </w:r>
+      <w:proofErr w:type="spellStart"/>
+      <w:r>
+        <w:t>ints</w:t>
+      </w:r>
+      <w:proofErr w:type="spellEnd"/>
+      <w:r>
+        <w:t>, floats, lists, tuples so how can we implement this operator.</w:t>
+      </w:r>
+    </w:p>
+    <w:p>
+      <w:r>
+        <w:t xml:space="preserve">Theoretically speaking, at best we are determining the type of a (universal) object based on how that object is treated in the code and what functions and operations are applied to it. At best a perfect solution seems to me like it would essentially be a glorified </w:t>
+      </w:r>
+      <w:proofErr w:type="gramStart"/>
+      <w:r>
+        <w:t>type</w:t>
+      </w:r>
+      <w:proofErr w:type="gramEnd"/>
+      <w:r>
+        <w:t xml:space="preserve"> inference algorithm.</w:t>
       </w:r>
     </w:p>
     <w:p/>
-    <w:p/>
-    <w:p/>
-    <w:p/>
+    <w:p>
+      <w:r>
+        <w:t>Contextual/observational equivalence</w:t>
+      </w:r>
+    </w:p>
+    <w:p>
+      <w:r>
+        <w:t>Think about stateful code, stacks queues etc</w:t>
+      </w:r>
+    </w:p>
+    <w:p>
+      <w:r>
+        <w:lastRenderedPageBreak/>
+        <w:t xml:space="preserve">See if </w:t>
+      </w:r>
+      <w:proofErr w:type="spellStart"/>
+      <w:r>
+        <w:t>func</w:t>
+      </w:r>
+      <w:proofErr w:type="spellEnd"/>
+      <w:r>
+        <w:t xml:space="preserve"> argument is callable, raise exception and print that the code is using callbacks which are not currently supported</w:t>
+      </w:r>
+    </w:p>
     <w:p/>
     <w:p>
       <w:pPr>
@@ -1623,6 +2136,7 @@
   <w:style w:type="character" w:default="1" w:styleId="DefaultParagraphFont">
     <w:name w:val="Default Paragraph Font"/>
     <w:uiPriority w:val="1"/>
+    <w:semiHidden/>
     <w:unhideWhenUsed/>
   </w:style>
   <w:style w:type="table" w:default="1" w:styleId="TableNormal">

</xml_diff>

<commit_message>
begin writing class equivalence framework
</commit_message>
<xml_diff>
--- a/Masters project notes.docx
+++ b/Masters project notes.docx
@@ -1012,6 +1012,178 @@
       </w:r>
     </w:p>
     <w:p/>
+    <w:p>
+      <w:r>
+        <w:t>For testing two implementations of stack:</w:t>
+      </w:r>
+    </w:p>
+    <w:p>
+      <w:r>
+        <w:t xml:space="preserve">Pass in the </w:t>
+      </w:r>
+      <w:r>
+        <w:rPr>
+          <w:b/>
+          <w:bCs/>
+        </w:rPr>
+        <w:t xml:space="preserve">classes </w:t>
+      </w:r>
+      <w:r>
+        <w:t xml:space="preserve">for 2 stack </w:t>
+      </w:r>
+      <w:proofErr w:type="gramStart"/>
+      <w:r>
+        <w:t>implementation</w:t>
+      </w:r>
+      <w:proofErr w:type="gramEnd"/>
+    </w:p>
+    <w:p>
+      <w:r>
+        <w:t xml:space="preserve">The </w:t>
+      </w:r>
+      <w:proofErr w:type="spellStart"/>
+      <w:r>
+        <w:t>fuzzer</w:t>
+      </w:r>
+      <w:proofErr w:type="spellEnd"/>
+      <w:r>
+        <w:t xml:space="preserve"> </w:t>
+      </w:r>
+      <w:proofErr w:type="gramStart"/>
+      <w:r>
+        <w:t>should :</w:t>
+      </w:r>
+      <w:proofErr w:type="gramEnd"/>
+    </w:p>
+    <w:p>
+      <w:r>
+        <w:t>Check the methods of each class. If they differ, they are inequivalent</w:t>
+      </w:r>
+    </w:p>
+    <w:p>
+      <w:r>
+        <w:t>Instantiate an object of each of the 2 classes passed in</w:t>
+      </w:r>
+    </w:p>
+    <w:p>
+      <w:r>
+        <w:t xml:space="preserve">Write algorithm which generates hypothesis strategy </w:t>
+      </w:r>
+    </w:p>
+    <w:p>
+      <w:r>
+        <w:t xml:space="preserve">Start with semi-automatic approach, user defines </w:t>
+      </w:r>
+    </w:p>
+    <w:p/>
+    <w:p>
+      <w:hyperlink r:id="rId9" w:history="1">
+        <w:r>
+          <w:rPr>
+            <w:rStyle w:val="Hyperlink"/>
+          </w:rPr>
+          <w:t>https://sel.ist.osaka-u.ac.jp/lab-db/betuzuri/archive/1298/1298.pdf</w:t>
+        </w:r>
+      </w:hyperlink>
+    </w:p>
+    <w:p>
+      <w:r>
+        <w:t>interesting paper on finding functionally equivalent python functions.</w:t>
+      </w:r>
+    </w:p>
+    <w:p>
+      <w:r>
+        <w:t>Ideas from this paper:</w:t>
+      </w:r>
+    </w:p>
+    <w:p>
+      <w:pPr>
+        <w:pStyle w:val="ListParagraph"/>
+        <w:numPr>
+          <w:ilvl w:val="0"/>
+          <w:numId w:val="5"/>
+        </w:numPr>
+      </w:pPr>
+      <w:r>
+        <w:t xml:space="preserve">One idea </w:t>
+      </w:r>
+      <w:r>
+        <w:t xml:space="preserve">that would be an interesting accessory function if given time would be to cut out fuzzing entirely if the functions are obviously the same. Normalise both functions via AST so variable names are generic and then hash both to identify duplicates, removing the need to fuzz both </w:t>
+      </w:r>
+      <w:proofErr w:type="spellStart"/>
+      <w:r>
+        <w:t>funcs</w:t>
+      </w:r>
+      <w:proofErr w:type="spellEnd"/>
+      <w:r>
+        <w:t>. Useful in practice for speeding up a common case</w:t>
+      </w:r>
+    </w:p>
+    <w:p>
+      <w:pPr>
+        <w:pStyle w:val="ListParagraph"/>
+        <w:numPr>
+          <w:ilvl w:val="0"/>
+          <w:numId w:val="5"/>
+        </w:numPr>
+      </w:pPr>
+      <w:r>
+        <w:t xml:space="preserve">Filter out </w:t>
+      </w:r>
+      <w:proofErr w:type="spellStart"/>
+      <w:r>
+        <w:t>funcs</w:t>
+      </w:r>
+      <w:proofErr w:type="spellEnd"/>
+      <w:r>
+        <w:t xml:space="preserve"> with no parameters and return values</w:t>
+      </w:r>
+    </w:p>
+    <w:p>
+      <w:pPr>
+        <w:pStyle w:val="ListParagraph"/>
+        <w:numPr>
+          <w:ilvl w:val="0"/>
+          <w:numId w:val="5"/>
+        </w:numPr>
+      </w:pPr>
+      <w:r>
+        <w:t xml:space="preserve">Possibly filter out </w:t>
+      </w:r>
+      <w:proofErr w:type="spellStart"/>
+      <w:r>
+        <w:t>funcs</w:t>
+      </w:r>
+      <w:proofErr w:type="spellEnd"/>
+      <w:r>
+        <w:t xml:space="preserve"> that invoke external classes or methods</w:t>
+      </w:r>
+    </w:p>
+    <w:p>
+      <w:pPr>
+        <w:pStyle w:val="ListParagraph"/>
+        <w:numPr>
+          <w:ilvl w:val="0"/>
+          <w:numId w:val="5"/>
+        </w:numPr>
+      </w:pPr>
+      <w:r>
+        <w:t xml:space="preserve">They use </w:t>
+      </w:r>
+      <w:proofErr w:type="spellStart"/>
+      <w:r>
+        <w:t>pynguin</w:t>
+      </w:r>
+      <w:proofErr w:type="spellEnd"/>
+      <w:r>
+        <w:t xml:space="preserve"> which is a test generation framework that does not use fuzz testing</w:t>
+      </w:r>
+    </w:p>
+    <w:p>
+      <w:r>
+        <w:tab/>
+      </w:r>
+    </w:p>
     <w:p>
       <w:pPr>
         <w:rPr>
@@ -1294,6 +1466,119 @@
     </w:lvl>
   </w:abstractNum>
   <w:abstractNum w:abstractNumId="2" w15:restartNumberingAfterBreak="0">
+    <w:nsid w:val="331E3DD0"/>
+    <w:multiLevelType w:val="hybridMultilevel"/>
+    <w:tmpl w:val="4B30DAB0"/>
+    <w:lvl w:ilvl="0" w:tplc="08090001">
+      <w:start w:val="1"/>
+      <w:numFmt w:val="bullet"/>
+      <w:lvlText w:val=""/>
+      <w:lvlJc w:val="left"/>
+      <w:pPr>
+        <w:ind w:left="720" w:hanging="360"/>
+      </w:pPr>
+      <w:rPr>
+        <w:rFonts w:ascii="Symbol" w:hAnsi="Symbol" w:hint="default"/>
+      </w:rPr>
+    </w:lvl>
+    <w:lvl w:ilvl="1" w:tplc="08090003" w:tentative="1">
+      <w:start w:val="1"/>
+      <w:numFmt w:val="bullet"/>
+      <w:lvlText w:val="o"/>
+      <w:lvlJc w:val="left"/>
+      <w:pPr>
+        <w:ind w:left="1440" w:hanging="360"/>
+      </w:pPr>
+      <w:rPr>
+        <w:rFonts w:ascii="Courier New" w:hAnsi="Courier New" w:cs="Courier New" w:hint="default"/>
+      </w:rPr>
+    </w:lvl>
+    <w:lvl w:ilvl="2" w:tplc="08090005" w:tentative="1">
+      <w:start w:val="1"/>
+      <w:numFmt w:val="bullet"/>
+      <w:lvlText w:val=""/>
+      <w:lvlJc w:val="left"/>
+      <w:pPr>
+        <w:ind w:left="2160" w:hanging="360"/>
+      </w:pPr>
+      <w:rPr>
+        <w:rFonts w:ascii="Wingdings" w:hAnsi="Wingdings" w:hint="default"/>
+      </w:rPr>
+    </w:lvl>
+    <w:lvl w:ilvl="3" w:tplc="08090001" w:tentative="1">
+      <w:start w:val="1"/>
+      <w:numFmt w:val="bullet"/>
+      <w:lvlText w:val=""/>
+      <w:lvlJc w:val="left"/>
+      <w:pPr>
+        <w:ind w:left="2880" w:hanging="360"/>
+      </w:pPr>
+      <w:rPr>
+        <w:rFonts w:ascii="Symbol" w:hAnsi="Symbol" w:hint="default"/>
+      </w:rPr>
+    </w:lvl>
+    <w:lvl w:ilvl="4" w:tplc="08090003" w:tentative="1">
+      <w:start w:val="1"/>
+      <w:numFmt w:val="bullet"/>
+      <w:lvlText w:val="o"/>
+      <w:lvlJc w:val="left"/>
+      <w:pPr>
+        <w:ind w:left="3600" w:hanging="360"/>
+      </w:pPr>
+      <w:rPr>
+        <w:rFonts w:ascii="Courier New" w:hAnsi="Courier New" w:cs="Courier New" w:hint="default"/>
+      </w:rPr>
+    </w:lvl>
+    <w:lvl w:ilvl="5" w:tplc="08090005" w:tentative="1">
+      <w:start w:val="1"/>
+      <w:numFmt w:val="bullet"/>
+      <w:lvlText w:val=""/>
+      <w:lvlJc w:val="left"/>
+      <w:pPr>
+        <w:ind w:left="4320" w:hanging="360"/>
+      </w:pPr>
+      <w:rPr>
+        <w:rFonts w:ascii="Wingdings" w:hAnsi="Wingdings" w:hint="default"/>
+      </w:rPr>
+    </w:lvl>
+    <w:lvl w:ilvl="6" w:tplc="08090001" w:tentative="1">
+      <w:start w:val="1"/>
+      <w:numFmt w:val="bullet"/>
+      <w:lvlText w:val=""/>
+      <w:lvlJc w:val="left"/>
+      <w:pPr>
+        <w:ind w:left="5040" w:hanging="360"/>
+      </w:pPr>
+      <w:rPr>
+        <w:rFonts w:ascii="Symbol" w:hAnsi="Symbol" w:hint="default"/>
+      </w:rPr>
+    </w:lvl>
+    <w:lvl w:ilvl="7" w:tplc="08090003" w:tentative="1">
+      <w:start w:val="1"/>
+      <w:numFmt w:val="bullet"/>
+      <w:lvlText w:val="o"/>
+      <w:lvlJc w:val="left"/>
+      <w:pPr>
+        <w:ind w:left="5760" w:hanging="360"/>
+      </w:pPr>
+      <w:rPr>
+        <w:rFonts w:ascii="Courier New" w:hAnsi="Courier New" w:cs="Courier New" w:hint="default"/>
+      </w:rPr>
+    </w:lvl>
+    <w:lvl w:ilvl="8" w:tplc="08090005" w:tentative="1">
+      <w:start w:val="1"/>
+      <w:numFmt w:val="bullet"/>
+      <w:lvlText w:val=""/>
+      <w:lvlJc w:val="left"/>
+      <w:pPr>
+        <w:ind w:left="6480" w:hanging="360"/>
+      </w:pPr>
+      <w:rPr>
+        <w:rFonts w:ascii="Wingdings" w:hAnsi="Wingdings" w:hint="default"/>
+      </w:rPr>
+    </w:lvl>
+  </w:abstractNum>
+  <w:abstractNum w:abstractNumId="3" w15:restartNumberingAfterBreak="0">
     <w:nsid w:val="4B6C3F3B"/>
     <w:multiLevelType w:val="hybridMultilevel"/>
     <w:tmpl w:val="7A6A9006"/>
@@ -1406,7 +1691,7 @@
       </w:rPr>
     </w:lvl>
   </w:abstractNum>
-  <w:abstractNum w:abstractNumId="3" w15:restartNumberingAfterBreak="0">
+  <w:abstractNum w:abstractNumId="4" w15:restartNumberingAfterBreak="0">
     <w:nsid w:val="6AB61A83"/>
     <w:multiLevelType w:val="hybridMultilevel"/>
     <w:tmpl w:val="76844AC0"/>
@@ -1520,16 +1805,19 @@
     </w:lvl>
   </w:abstractNum>
   <w:num w:numId="1" w16cid:durableId="1701930696">
-    <w:abstractNumId w:val="2"/>
+    <w:abstractNumId w:val="3"/>
   </w:num>
   <w:num w:numId="2" w16cid:durableId="1842548276">
     <w:abstractNumId w:val="0"/>
   </w:num>
   <w:num w:numId="3" w16cid:durableId="1539927109">
-    <w:abstractNumId w:val="3"/>
+    <w:abstractNumId w:val="4"/>
   </w:num>
   <w:num w:numId="4" w16cid:durableId="829977371">
     <w:abstractNumId w:val="1"/>
+  </w:num>
+  <w:num w:numId="5" w16cid:durableId="725490437">
+    <w:abstractNumId w:val="2"/>
   </w:num>
 </w:numbering>
 </file>

</xml_diff>

<commit_message>
Add support for functions with varargs and kwargs
</commit_message>
<xml_diff>
--- a/Masters project notes.docx
+++ b/Masters project notes.docx
@@ -159,15 +159,28 @@
         </w:rPr>
         <w:t xml:space="preserve">HypoFuzz </w:t>
       </w:r>
-      <w:hyperlink r:id="rId8" w:history="1">
-        <w:r>
-          <w:rPr>
-            <w:rStyle w:val="Hyperlink"/>
-            <w:lang w:val="de-DE"/>
-          </w:rPr>
-          <w:t>https://github.com/Zac-HD/hypofuzz</w:t>
-        </w:r>
-      </w:hyperlink>
+      <w:r>
+        <w:fldChar w:fldCharType="begin"/>
+      </w:r>
+      <w:r>
+        <w:rPr>
+          <w:lang w:val="de-DE"/>
+        </w:rPr>
+        <w:instrText>HYPERLINK "https://github.com/Zac-HD/hypofuzz"</w:instrText>
+      </w:r>
+      <w:r>
+        <w:fldChar w:fldCharType="separate"/>
+      </w:r>
+      <w:r>
+        <w:rPr>
+          <w:rStyle w:val="Hyperlink"/>
+          <w:lang w:val="de-DE"/>
+        </w:rPr>
+        <w:t>https://github.com/Zac-HD/hypofuzz</w:t>
+      </w:r>
+      <w:r>
+        <w:fldChar w:fldCharType="end"/>
+      </w:r>
     </w:p>
     <w:p>
       <w:pPr>
@@ -200,7 +213,7 @@
       <w:r>
         <w:t xml:space="preserve"> </w:t>
       </w:r>
-      <w:hyperlink r:id="rId9" w:history="1">
+      <w:hyperlink r:id="rId8" w:history="1">
         <w:r>
           <w:rPr>
             <w:rStyle w:val="Hyperlink"/>
@@ -999,6 +1012,7 @@
       </w:r>
     </w:p>
     <w:p/>
+    <w:p/>
     <w:p>
       <w:r>
         <w:t>For testing two implementations of stack:</w:t>
@@ -1055,6 +1069,133 @@
     <w:p>
       <w:r>
         <w:t xml:space="preserve">Write algorithm which generates hypothesis strategy </w:t>
+      </w:r>
+    </w:p>
+    <w:p/>
+    <w:p>
+      <w:r>
+        <w:t xml:space="preserve">Added </w:t>
+      </w:r>
+      <w:proofErr w:type="spellStart"/>
+      <w:r>
+        <w:t>arg</w:t>
+      </w:r>
+      <w:proofErr w:type="spellEnd"/>
+      <w:r>
+        <w:t>/</w:t>
+      </w:r>
+      <w:proofErr w:type="spellStart"/>
+      <w:r>
+        <w:t>kwarg</w:t>
+      </w:r>
+      <w:proofErr w:type="spellEnd"/>
+      <w:r>
+        <w:t xml:space="preserve"> support for fuzz testing strategy</w:t>
+      </w:r>
+    </w:p>
+    <w:p>
+      <w:r>
+        <w:t xml:space="preserve">Wrote basic </w:t>
+      </w:r>
+      <w:proofErr w:type="gramStart"/>
+      <w:r>
+        <w:t>first class</w:t>
+      </w:r>
+      <w:proofErr w:type="gramEnd"/>
+      <w:r>
+        <w:t xml:space="preserve"> equivalence tester</w:t>
+      </w:r>
+    </w:p>
+    <w:p>
+      <w:r>
+        <w:drawing>
+          <wp:inline distT="0" distB="0" distL="0" distR="0" wp14:anchorId="647F52A7" wp14:editId="33CEC697">
+            <wp:extent cx="5731510" cy="3284855"/>
+            <wp:effectExtent l="0" t="0" r="2540" b="0"/>
+            <wp:docPr id="1892852493" name="Picture 1" descr="A screenshot of a computer&#10;&#10;AI-generated content may be incorrect."/>
+            <wp:cNvGraphicFramePr>
+              <a:graphicFrameLocks xmlns:a="http://schemas.openxmlformats.org/drawingml/2006/main" noChangeAspect="1"/>
+            </wp:cNvGraphicFramePr>
+            <a:graphic xmlns:a="http://schemas.openxmlformats.org/drawingml/2006/main">
+              <a:graphicData uri="http://schemas.openxmlformats.org/drawingml/2006/picture">
+                <pic:pic xmlns:pic="http://schemas.openxmlformats.org/drawingml/2006/picture">
+                  <pic:nvPicPr>
+                    <pic:cNvPr id="1892852493" name="Picture 1" descr="A screenshot of a computer&#10;&#10;AI-generated content may be incorrect."/>
+                    <pic:cNvPicPr/>
+                  </pic:nvPicPr>
+                  <pic:blipFill>
+                    <a:blip r:embed="rId9"/>
+                    <a:stretch>
+                      <a:fillRect/>
+                    </a:stretch>
+                  </pic:blipFill>
+                  <pic:spPr>
+                    <a:xfrm>
+                      <a:off x="0" y="0"/>
+                      <a:ext cx="5731510" cy="3284855"/>
+                    </a:xfrm>
+                    <a:prstGeom prst="rect">
+                      <a:avLst/>
+                    </a:prstGeom>
+                  </pic:spPr>
+                </pic:pic>
+              </a:graphicData>
+            </a:graphic>
+          </wp:inline>
+        </w:drawing>
+      </w:r>
+    </w:p>
+    <w:p>
+      <w:r>
+        <w:t>Equivalence testing two stack implementations.</w:t>
+      </w:r>
+    </w:p>
+    <w:p>
+      <w:r>
+        <w:t>My idea for next step</w:t>
+      </w:r>
+      <w:r>
+        <w:t>s</w:t>
+      </w:r>
+      <w:r>
+        <w:t xml:space="preserve">: </w:t>
+      </w:r>
+    </w:p>
+    <w:p>
+      <w:r>
+        <w:t>Expand to module-wide equivalence testing</w:t>
+      </w:r>
+    </w:p>
+    <w:p>
+      <w:r>
+        <w:t>Benchmark the pipeline against real code</w:t>
+      </w:r>
+    </w:p>
+    <w:p>
+      <w:r>
+        <w:lastRenderedPageBreak/>
+        <w:t>add a form of user input, rather than having my code auto generate an equivalence testing pipeline testing very strict equivalence, allow the user to create one.</w:t>
+      </w:r>
+    </w:p>
+    <w:p>
+      <w:r>
+        <w:t xml:space="preserve">What I mean by this is that currently, my code will test two classes for equivalence and if the classes have differing methods or even method names, the code will reject them. Allow the user to define a </w:t>
+      </w:r>
+      <w:proofErr w:type="spellStart"/>
+      <w:r>
+        <w:t>json</w:t>
+      </w:r>
+      <w:proofErr w:type="spellEnd"/>
+      <w:r>
+        <w:t xml:space="preserve"> file with the specific methods from the class that they want tested so they can exclude certain methods if they </w:t>
+      </w:r>
+      <w:proofErr w:type="gramStart"/>
+      <w:r>
+        <w:t>like, and</w:t>
+      </w:r>
+      <w:proofErr w:type="gramEnd"/>
+      <w:r>
+        <w:t xml:space="preserve"> optionally allow the user to also define specifically what arguments each method should be tested with.</w:t>
       </w:r>
     </w:p>
     <w:p/>

</xml_diff>

<commit_message>
Add basic attempt at higher order equivalence in UniverstalStrategy
</commit_message>
<xml_diff>
--- a/Masters project notes.docx
+++ b/Masters project notes.docx
@@ -159,28 +159,15 @@
         </w:rPr>
         <w:t xml:space="preserve">HypoFuzz </w:t>
       </w:r>
-      <w:r>
-        <w:fldChar w:fldCharType="begin"/>
-      </w:r>
-      <w:r>
-        <w:rPr>
-          <w:lang w:val="de-DE"/>
-        </w:rPr>
-        <w:instrText>HYPERLINK "https://github.com/Zac-HD/hypofuzz"</w:instrText>
-      </w:r>
-      <w:r>
-        <w:fldChar w:fldCharType="separate"/>
-      </w:r>
-      <w:r>
-        <w:rPr>
-          <w:rStyle w:val="Hyperlink"/>
-          <w:lang w:val="de-DE"/>
-        </w:rPr>
-        <w:t>https://github.com/Zac-HD/hypofuzz</w:t>
-      </w:r>
-      <w:r>
-        <w:fldChar w:fldCharType="end"/>
-      </w:r>
+      <w:hyperlink r:id="rId8" w:history="1">
+        <w:r>
+          <w:rPr>
+            <w:rStyle w:val="Hyperlink"/>
+            <w:lang w:val="de-DE"/>
+          </w:rPr>
+          <w:t>https://github.com/Zac-HD/hypofuzz</w:t>
+        </w:r>
+      </w:hyperlink>
     </w:p>
     <w:p>
       <w:pPr>
@@ -213,7 +200,7 @@
       <w:r>
         <w:t xml:space="preserve"> </w:t>
       </w:r>
-      <w:hyperlink r:id="rId8" w:history="1">
+      <w:hyperlink r:id="rId9" w:history="1">
         <w:r>
           <w:rPr>
             <w:rStyle w:val="Hyperlink"/>
@@ -1107,7 +1094,71 @@
       </w:r>
     </w:p>
     <w:p>
-      <w:r>
+      <w:pPr>
+        <w:rPr>
+          <w:b/>
+          <w:bCs/>
+        </w:rPr>
+      </w:pPr>
+      <w:r>
+        <w:rPr>
+          <w:b/>
+          <w:bCs/>
+        </w:rPr>
+        <w:t>Check the equality check, if functions return functions etc</w:t>
+      </w:r>
+    </w:p>
+    <w:p>
+      <w:r>
+        <w:t xml:space="preserve">I have tried applying this equivalence tester to small refactors in real classes from open sources repos such as </w:t>
+      </w:r>
+      <w:proofErr w:type="spellStart"/>
+      <w:r>
+        <w:t>openai</w:t>
+      </w:r>
+      <w:proofErr w:type="spellEnd"/>
+      <w:r>
+        <w:t xml:space="preserve"> but have struggled to find working examples. My equivalence tester is quite situational. Method name/signature </w:t>
+      </w:r>
+      <w:proofErr w:type="gramStart"/>
+      <w:r>
+        <w:t>refactors</w:t>
+      </w:r>
+      <w:proofErr w:type="gramEnd"/>
+      <w:r>
+        <w:t xml:space="preserve"> and external dependencies cause issues</w:t>
+      </w:r>
+    </w:p>
+    <w:p>
+      <w:r>
+        <w:t xml:space="preserve">Tested it on two stack implementations, one that throws index error if you try to peek or pop and empty stack, and one that returns None for these operations. The </w:t>
+      </w:r>
+      <w:proofErr w:type="spellStart"/>
+      <w:r>
+        <w:t>fuzzer</w:t>
+      </w:r>
+      <w:proofErr w:type="spellEnd"/>
+      <w:r>
+        <w:t xml:space="preserve"> was able to pick up on this difference immediately</w:t>
+      </w:r>
+    </w:p>
+    <w:p/>
+    <w:p>
+      <w:r>
+        <w:t xml:space="preserve">Maybe queue up different things u want to check equivalence for, if we are checking two objects and they create functions we need to check, we can add those functions to the queue. Maybe store traces for each element in the queue </w:t>
+      </w:r>
+    </w:p>
+    <w:p>
+      <w:r>
+        <w:t>Test on a stack that has a capacity</w:t>
+      </w:r>
+    </w:p>
+    <w:p>
+      <w:r>
+        <w:rPr>
+          <w:noProof/>
+        </w:rPr>
+        <w:lastRenderedPageBreak/>
         <w:drawing>
           <wp:inline distT="0" distB="0" distL="0" distR="0" wp14:anchorId="647F52A7" wp14:editId="33CEC697">
             <wp:extent cx="5731510" cy="3284855"/>
@@ -1124,7 +1175,7 @@
                     <pic:cNvPicPr/>
                   </pic:nvPicPr>
                   <pic:blipFill>
-                    <a:blip r:embed="rId9"/>
+                    <a:blip r:embed="rId10"/>
                     <a:stretch>
                       <a:fillRect/>
                     </a:stretch>
@@ -1173,7 +1224,6 @@
     </w:p>
     <w:p>
       <w:r>
-        <w:lastRenderedPageBreak/>
         <w:t>add a form of user input, rather than having my code auto generate an equivalence testing pipeline testing very strict equivalence, allow the user to create one.</w:t>
       </w:r>
     </w:p>
@@ -1201,7 +1251,7 @@
     <w:p/>
     <w:p/>
     <w:p>
-      <w:hyperlink r:id="rId10" w:history="1">
+      <w:hyperlink r:id="rId11" w:history="1">
         <w:r>
           <w:rPr>
             <w:rStyle w:val="Hyperlink"/>
@@ -1232,7 +1282,11 @@
         <w:t xml:space="preserve">One idea </w:t>
       </w:r>
       <w:r>
-        <w:t xml:space="preserve">that would be an interesting accessory function if given time would be to cut out fuzzing entirely if the functions are obviously the same. Normalise both functions via AST so variable names are generic and then hash both to identify duplicates, removing the need to fuzz both </w:t>
+        <w:t xml:space="preserve">that would be an interesting accessory function if given time would be to cut out fuzzing entirely if the functions are obviously the same. Normalise both functions via AST so variable names are generic and then hash both to identify </w:t>
+      </w:r>
+      <w:r>
+        <w:lastRenderedPageBreak/>
+        <w:t xml:space="preserve">duplicates, removing the need to fuzz both </w:t>
       </w:r>
       <w:proofErr w:type="spellStart"/>
       <w:r>
@@ -1304,8 +1358,118 @@
       </w:r>
     </w:p>
     <w:p>
-      <w:r>
-        <w:tab/>
+      <w:pPr>
+        <w:ind w:left="720"/>
+      </w:pPr>
+    </w:p>
+    <w:p>
+      <w:r>
+        <w:t xml:space="preserve">Generalise so it knows if we pass in class, function, </w:t>
+      </w:r>
+    </w:p>
+    <w:p>
+      <w:r>
+        <w:t>If a function returns a function, maybe that needs to be interleaved in the class equivalence test</w:t>
+      </w:r>
+    </w:p>
+    <w:p>
+      <w:r>
+        <w:t xml:space="preserve">What if u have a class with 1 </w:t>
+      </w:r>
+      <w:proofErr w:type="gramStart"/>
+      <w:r>
+        <w:t>methods</w:t>
+      </w:r>
+      <w:proofErr w:type="gramEnd"/>
+      <w:r>
+        <w:t>, a factory method which gives u back 3 methods</w:t>
+      </w:r>
+    </w:p>
+    <w:p>
+      <w:r>
+        <w:t>If a class functions return a function, that will not be in the class anymore</w:t>
+      </w:r>
+    </w:p>
+    <w:p>
+      <w:r>
+        <w:t xml:space="preserve">Try to capture all the interactions in </w:t>
+      </w:r>
+      <w:r>
+        <w:t>From Bounded Checking to Verification of Equivalence via Symbolic Up-to Techniques</w:t>
+      </w:r>
+    </w:p>
+    <w:p>
+      <w:r>
+        <w:t>https://link.springer.com/content/pdf/10.1007/978-3-030-99527-0_10.pdf</w:t>
+      </w:r>
+    </w:p>
+    <w:p>
+      <w:hyperlink r:id="rId12" w:history="1">
+        <w:r>
+          <w:rPr>
+            <w:rStyle w:val="Hyperlink"/>
+          </w:rPr>
+          <w:t>https://github.com/LaifsV1/Hobbit/tree/main</w:t>
+        </w:r>
+      </w:hyperlink>
+    </w:p>
+    <w:p>
+      <w:r>
+        <w:t xml:space="preserve">could instead go more practical, targeting </w:t>
+      </w:r>
+      <w:proofErr w:type="spellStart"/>
+      <w:r>
+        <w:t>datastructure</w:t>
+      </w:r>
+      <w:proofErr w:type="spellEnd"/>
+      <w:r>
+        <w:t xml:space="preserve"> implementations online</w:t>
+      </w:r>
+    </w:p>
+    <w:p/>
+    <w:p>
+      <w:r>
+        <w:t xml:space="preserve">For function-function verification: I am currently implementing the case where both functions return (create) a new function. In this case I want to then perform the same function-function verification on these two new returned functions. The problem is the </w:t>
+      </w:r>
+      <w:proofErr w:type="spellStart"/>
+      <w:r>
+        <w:t>hypofuzz</w:t>
+      </w:r>
+      <w:proofErr w:type="spellEnd"/>
+      <w:r>
+        <w:t xml:space="preserve"> does not exactly allow for a recursive implementation like this. </w:t>
+      </w:r>
+    </w:p>
+    <w:p>
+      <w:r>
+        <w:t>Two options:</w:t>
+      </w:r>
+    </w:p>
+    <w:p>
+      <w:pPr>
+        <w:pStyle w:val="ListParagraph"/>
+        <w:numPr>
+          <w:ilvl w:val="0"/>
+          <w:numId w:val="6"/>
+        </w:numPr>
+      </w:pPr>
+      <w:r>
+        <w:t>Budgeted local exploration: inner fuzzing shares a data stream with outer fuzzing. This makes fuzzing less effective if both the outer function and inner function takes arguments as they will be attempting to generate arguments to increase coverage/shrink failures from the same data stream</w:t>
+      </w:r>
+      <w:r>
+        <w:t>. In theory this should be fine provided only the bottom level function takes any arguments</w:t>
+      </w:r>
+    </w:p>
+    <w:p>
+      <w:pPr>
+        <w:pStyle w:val="ListParagraph"/>
+        <w:numPr>
+          <w:ilvl w:val="0"/>
+          <w:numId w:val="6"/>
+        </w:numPr>
+      </w:pPr>
+      <w:r>
+        <w:t>Lift inner functions to the top level</w:t>
       </w:r>
     </w:p>
     <w:p>
@@ -1328,6 +1492,7 @@
     </w:p>
     <w:p>
       <w:r>
+        <w:lastRenderedPageBreak/>
         <w:t>How do we treat python default/optional arguments?</w:t>
       </w:r>
     </w:p>
@@ -1703,6 +1868,95 @@
     </w:lvl>
   </w:abstractNum>
   <w:abstractNum w:abstractNumId="3" w15:restartNumberingAfterBreak="0">
+    <w:nsid w:val="48A51D20"/>
+    <w:multiLevelType w:val="hybridMultilevel"/>
+    <w:tmpl w:val="5768A5B8"/>
+    <w:lvl w:ilvl="0" w:tplc="0809000F">
+      <w:start w:val="1"/>
+      <w:numFmt w:val="decimal"/>
+      <w:lvlText w:val="%1."/>
+      <w:lvlJc w:val="left"/>
+      <w:pPr>
+        <w:ind w:left="720" w:hanging="360"/>
+      </w:pPr>
+      <w:rPr>
+        <w:rFonts w:hint="default"/>
+      </w:rPr>
+    </w:lvl>
+    <w:lvl w:ilvl="1" w:tplc="08090019" w:tentative="1">
+      <w:start w:val="1"/>
+      <w:numFmt w:val="lowerLetter"/>
+      <w:lvlText w:val="%2."/>
+      <w:lvlJc w:val="left"/>
+      <w:pPr>
+        <w:ind w:left="1440" w:hanging="360"/>
+      </w:pPr>
+    </w:lvl>
+    <w:lvl w:ilvl="2" w:tplc="0809001B" w:tentative="1">
+      <w:start w:val="1"/>
+      <w:numFmt w:val="lowerRoman"/>
+      <w:lvlText w:val="%3."/>
+      <w:lvlJc w:val="right"/>
+      <w:pPr>
+        <w:ind w:left="2160" w:hanging="180"/>
+      </w:pPr>
+    </w:lvl>
+    <w:lvl w:ilvl="3" w:tplc="0809000F" w:tentative="1">
+      <w:start w:val="1"/>
+      <w:numFmt w:val="decimal"/>
+      <w:lvlText w:val="%4."/>
+      <w:lvlJc w:val="left"/>
+      <w:pPr>
+        <w:ind w:left="2880" w:hanging="360"/>
+      </w:pPr>
+    </w:lvl>
+    <w:lvl w:ilvl="4" w:tplc="08090019" w:tentative="1">
+      <w:start w:val="1"/>
+      <w:numFmt w:val="lowerLetter"/>
+      <w:lvlText w:val="%5."/>
+      <w:lvlJc w:val="left"/>
+      <w:pPr>
+        <w:ind w:left="3600" w:hanging="360"/>
+      </w:pPr>
+    </w:lvl>
+    <w:lvl w:ilvl="5" w:tplc="0809001B" w:tentative="1">
+      <w:start w:val="1"/>
+      <w:numFmt w:val="lowerRoman"/>
+      <w:lvlText w:val="%6."/>
+      <w:lvlJc w:val="right"/>
+      <w:pPr>
+        <w:ind w:left="4320" w:hanging="180"/>
+      </w:pPr>
+    </w:lvl>
+    <w:lvl w:ilvl="6" w:tplc="0809000F" w:tentative="1">
+      <w:start w:val="1"/>
+      <w:numFmt w:val="decimal"/>
+      <w:lvlText w:val="%7."/>
+      <w:lvlJc w:val="left"/>
+      <w:pPr>
+        <w:ind w:left="5040" w:hanging="360"/>
+      </w:pPr>
+    </w:lvl>
+    <w:lvl w:ilvl="7" w:tplc="08090019" w:tentative="1">
+      <w:start w:val="1"/>
+      <w:numFmt w:val="lowerLetter"/>
+      <w:lvlText w:val="%8."/>
+      <w:lvlJc w:val="left"/>
+      <w:pPr>
+        <w:ind w:left="5760" w:hanging="360"/>
+      </w:pPr>
+    </w:lvl>
+    <w:lvl w:ilvl="8" w:tplc="0809001B" w:tentative="1">
+      <w:start w:val="1"/>
+      <w:numFmt w:val="lowerRoman"/>
+      <w:lvlText w:val="%9."/>
+      <w:lvlJc w:val="right"/>
+      <w:pPr>
+        <w:ind w:left="6480" w:hanging="180"/>
+      </w:pPr>
+    </w:lvl>
+  </w:abstractNum>
+  <w:abstractNum w:abstractNumId="4" w15:restartNumberingAfterBreak="0">
     <w:nsid w:val="4B6C3F3B"/>
     <w:multiLevelType w:val="hybridMultilevel"/>
     <w:tmpl w:val="7A6A9006"/>
@@ -1815,7 +2069,7 @@
       </w:rPr>
     </w:lvl>
   </w:abstractNum>
-  <w:abstractNum w:abstractNumId="4" w15:restartNumberingAfterBreak="0">
+  <w:abstractNum w:abstractNumId="5" w15:restartNumberingAfterBreak="0">
     <w:nsid w:val="6AB61A83"/>
     <w:multiLevelType w:val="hybridMultilevel"/>
     <w:tmpl w:val="76844AC0"/>
@@ -1929,19 +2183,22 @@
     </w:lvl>
   </w:abstractNum>
   <w:num w:numId="1" w16cid:durableId="1701930696">
-    <w:abstractNumId w:val="3"/>
+    <w:abstractNumId w:val="4"/>
   </w:num>
   <w:num w:numId="2" w16cid:durableId="1842548276">
     <w:abstractNumId w:val="0"/>
   </w:num>
   <w:num w:numId="3" w16cid:durableId="1539927109">
-    <w:abstractNumId w:val="4"/>
+    <w:abstractNumId w:val="5"/>
   </w:num>
   <w:num w:numId="4" w16cid:durableId="829977371">
     <w:abstractNumId w:val="1"/>
   </w:num>
   <w:num w:numId="5" w16cid:durableId="725490437">
     <w:abstractNumId w:val="2"/>
+  </w:num>
+  <w:num w:numId="6" w16cid:durableId="448285351">
+    <w:abstractNumId w:val="3"/>
   </w:num>
 </w:numbering>
 </file>
@@ -2914,6 +3171,18 @@
       <w:szCs w:val="20"/>
     </w:rPr>
   </w:style>
+  <w:style w:type="character" w:styleId="FollowedHyperlink">
+    <w:name w:val="FollowedHyperlink"/>
+    <w:basedOn w:val="DefaultParagraphFont"/>
+    <w:uiPriority w:val="99"/>
+    <w:semiHidden/>
+    <w:unhideWhenUsed/>
+    <w:rsid w:val="003E619A"/>
+    <w:rPr>
+      <w:color w:val="96607D" w:themeColor="followedHyperlink"/>
+      <w:u w:val="single"/>
+    </w:rPr>
+  </w:style>
 </w:styles>
 </file>
 

</xml_diff>

<commit_message>
Add new test cases
</commit_message>
<xml_diff>
--- a/Masters project notes.docx
+++ b/Masters project notes.docx
@@ -53,19 +53,11 @@
           <w:lang w:val="fr-FR"/>
         </w:rPr>
       </w:pPr>
-      <w:proofErr w:type="spellStart"/>
       <w:r>
         <w:rPr>
           <w:lang w:val="fr-FR"/>
         </w:rPr>
-        <w:t>Pythonfuzz</w:t>
-      </w:r>
-      <w:proofErr w:type="spellEnd"/>
-      <w:r>
-        <w:rPr>
-          <w:lang w:val="fr-FR"/>
-        </w:rPr>
-        <w:t xml:space="preserve"> </w:t>
+        <w:t xml:space="preserve">Pythonfuzz </w:t>
       </w:r>
       <w:hyperlink r:id="rId6" w:history="1">
         <w:r>
@@ -86,15 +78,7 @@
         </w:numPr>
       </w:pPr>
       <w:r>
-        <w:t xml:space="preserve">Coverage-guided </w:t>
-      </w:r>
-      <w:proofErr w:type="spellStart"/>
-      <w:r>
-        <w:t>fuzzer</w:t>
-      </w:r>
-      <w:proofErr w:type="spellEnd"/>
-      <w:r>
-        <w:t xml:space="preserve"> for python</w:t>
+        <w:t>Coverage-guided fuzzer for python</w:t>
       </w:r>
     </w:p>
     <w:p>
@@ -105,13 +89,8 @@
           <w:numId w:val="1"/>
         </w:numPr>
       </w:pPr>
-      <w:proofErr w:type="spellStart"/>
-      <w:r>
-        <w:t>Atheris</w:t>
-      </w:r>
-      <w:proofErr w:type="spellEnd"/>
-      <w:r>
-        <w:t xml:space="preserve"> </w:t>
+      <w:r>
+        <w:t xml:space="preserve">Atheris </w:t>
       </w:r>
       <w:hyperlink r:id="rId7" w:history="1">
         <w:r>
@@ -131,15 +110,7 @@
         </w:numPr>
       </w:pPr>
       <w:r>
-        <w:t xml:space="preserve">Google’s coverage-guided </w:t>
-      </w:r>
-      <w:proofErr w:type="spellStart"/>
-      <w:r>
-        <w:t>fuzzer</w:t>
-      </w:r>
-      <w:proofErr w:type="spellEnd"/>
-      <w:r>
-        <w:t xml:space="preserve"> for python</w:t>
+        <w:t>Google’s coverage-guided fuzzer for python</w:t>
       </w:r>
     </w:p>
     <w:p>
@@ -192,13 +163,8 @@
           <w:numId w:val="1"/>
         </w:numPr>
       </w:pPr>
-      <w:proofErr w:type="spellStart"/>
-      <w:r>
-        <w:t>CrossHair</w:t>
-      </w:r>
-      <w:proofErr w:type="spellEnd"/>
-      <w:r>
-        <w:t xml:space="preserve"> </w:t>
+      <w:r>
+        <w:t xml:space="preserve">CrossHair </w:t>
       </w:r>
       <w:hyperlink r:id="rId9" w:history="1">
         <w:r>
@@ -223,39 +189,7 @@
     </w:p>
     <w:p>
       <w:r>
-        <w:t xml:space="preserve">From my research, Hypothesis + </w:t>
-      </w:r>
-      <w:proofErr w:type="spellStart"/>
-      <w:r>
-        <w:t>HypoFuzz</w:t>
-      </w:r>
-      <w:proofErr w:type="spellEnd"/>
-      <w:r>
-        <w:t xml:space="preserve"> seems like it achieves everything that JQF does. Hypothesis is heavily inspired by </w:t>
-      </w:r>
-      <w:proofErr w:type="spellStart"/>
-      <w:r>
-        <w:t>QuickCheck</w:t>
-      </w:r>
-      <w:proofErr w:type="spellEnd"/>
-      <w:r>
-        <w:t xml:space="preserve"> and gives a property-based testing framework for python. It generates structured inputs and saves failing inputs for reproduction. It operates on the semantic properties of a program, making it inherently </w:t>
-      </w:r>
-      <w:proofErr w:type="gramStart"/>
-      <w:r>
-        <w:t>semantic-based</w:t>
-      </w:r>
-      <w:proofErr w:type="gramEnd"/>
-      <w:r>
-        <w:t xml:space="preserve">. It is not coverage-guided by default, so </w:t>
-      </w:r>
-      <w:proofErr w:type="spellStart"/>
-      <w:r>
-        <w:t>HypoFuzz</w:t>
-      </w:r>
-      <w:proofErr w:type="spellEnd"/>
-      <w:r>
-        <w:t xml:space="preserve"> extends it for coverage-guided exploration thus providing a fuzzing framework.</w:t>
+        <w:t>From my research, Hypothesis + HypoFuzz seems like it achieves everything that JQF does. Hypothesis is heavily inspired by QuickCheck and gives a property-based testing framework for python. It generates structured inputs and saves failing inputs for reproduction. It operates on the semantic properties of a program, making it inherently semantic-based. It is not coverage-guided by default, so HypoFuzz extends it for coverage-guided exploration thus providing a fuzzing framework.</w:t>
       </w:r>
     </w:p>
     <w:p/>
@@ -274,28 +208,15 @@
     </w:p>
     <w:p>
       <w:r>
-        <w:t>Generalise the stack example to any data structure/</w:t>
-      </w:r>
-      <w:proofErr w:type="spellStart"/>
-      <w:r>
-        <w:t>api</w:t>
-      </w:r>
-      <w:proofErr w:type="spellEnd"/>
+        <w:t>Generalise the stack example to any data structure/api</w:t>
+      </w:r>
       <w:r>
         <w:t xml:space="preserve"> that can take any type of arguments.</w:t>
       </w:r>
     </w:p>
     <w:p>
       <w:r>
-        <w:t xml:space="preserve">At some point, see if you can read the python script, create AST and traverse it </w:t>
-      </w:r>
-      <w:proofErr w:type="gramStart"/>
-      <w:r>
-        <w:t>in order to</w:t>
-      </w:r>
-      <w:proofErr w:type="gramEnd"/>
-      <w:r>
-        <w:t xml:space="preserve"> create the right test.</w:t>
+        <w:t>At some point, see if you can read the python script, create AST and traverse it in order to create the right test.</w:t>
       </w:r>
     </w:p>
     <w:p/>
@@ -309,58 +230,18 @@
         <w:t xml:space="preserve">Using it to test a very simple summing function </w:t>
       </w:r>
       <w:r>
-        <w:t xml:space="preserve">doesn’t work very well. I believe because of how universal is configured and how my two simple functions are configured, </w:t>
-      </w:r>
-      <w:proofErr w:type="spellStart"/>
-      <w:r>
-        <w:t>atheris</w:t>
-      </w:r>
-      <w:proofErr w:type="spellEnd"/>
-      <w:r>
-        <w:t xml:space="preserve"> is unable to quickly find the erroneous input.</w:t>
-      </w:r>
-    </w:p>
-    <w:p>
-      <w:r>
-        <w:t xml:space="preserve">I think the fact that fuzz testing is obfuscated inside the universal object the module is unable to correctly perform its algorithms to find erroneous inputs. I vibe coded a </w:t>
-      </w:r>
-      <w:proofErr w:type="spellStart"/>
-      <w:r>
-        <w:t>hypofuzz</w:t>
-      </w:r>
-      <w:proofErr w:type="spellEnd"/>
-      <w:r>
-        <w:t xml:space="preserve"> universal object </w:t>
-      </w:r>
-      <w:proofErr w:type="gramStart"/>
-      <w:r>
-        <w:t>and also</w:t>
-      </w:r>
-      <w:proofErr w:type="gramEnd"/>
-      <w:r>
-        <w:t xml:space="preserve"> tried manually implementing one and couldn’t get it to spot any bugs but given more time there may be a way to implement this. Just haven’t figured it out yet.</w:t>
+        <w:t>doesn’t work very well. I believe because of how universal is configured and how my two simple functions are configured, atheris is unable to quickly find the erroneous input.</w:t>
+      </w:r>
+    </w:p>
+    <w:p>
+      <w:r>
+        <w:t>I think the fact that fuzz testing is obfuscated inside the universal object the module is unable to correctly perform its algorithms to find erroneous inputs. I vibe coded a hypofuzz universal object and also tried manually implementing one and couldn’t get it to spot any bugs but given more time there may be a way to implement this. Just haven’t figured it out yet.</w:t>
       </w:r>
     </w:p>
     <w:p>
       <w:r>
         <w:lastRenderedPageBreak/>
-        <w:t xml:space="preserve">When comparing two different sorting algorithms, </w:t>
-      </w:r>
-      <w:proofErr w:type="spellStart"/>
-      <w:r>
-        <w:t>hypofuzz</w:t>
-      </w:r>
-      <w:proofErr w:type="spellEnd"/>
-      <w:r>
-        <w:t xml:space="preserve"> was unable to spot the difference when I added a small condition to quicksort if length is &gt;= 6, return the reversed list. For these </w:t>
-      </w:r>
-      <w:proofErr w:type="gramStart"/>
-      <w:r>
-        <w:t>one off</w:t>
-      </w:r>
-      <w:proofErr w:type="gramEnd"/>
-      <w:r>
-        <w:t xml:space="preserve"> conditions, coverage guidance actually makes it harder to spot the difference, as they provide very little feedback. Plain hypothesis was able to catch this bug (without coverage guidance)</w:t>
+        <w:t>When comparing two different sorting algorithms, hypofuzz was unable to spot the difference when I added a small condition to quicksort if length is &gt;= 6, return the reversed list. For these one off conditions, coverage guidance actually makes it harder to spot the difference, as they provide very little feedback. Plain hypothesis was able to catch this bug (without coverage guidance)</w:t>
       </w:r>
     </w:p>
     <w:p>
@@ -379,57 +260,12 @@
     </w:p>
     <w:p>
       <w:r>
-        <w:t xml:space="preserve">Testing universal object on two sorting algorithms always results in empty lists as universals value gets set to empty list if </w:t>
-      </w:r>
-      <w:proofErr w:type="spellStart"/>
-      <w:proofErr w:type="gramStart"/>
-      <w:r>
-        <w:t>len</w:t>
-      </w:r>
-      <w:proofErr w:type="spellEnd"/>
-      <w:r>
-        <w:t>(</w:t>
-      </w:r>
-      <w:proofErr w:type="gramEnd"/>
-      <w:r>
-        <w:t xml:space="preserve">) is called on it. This is </w:t>
-      </w:r>
-      <w:proofErr w:type="spellStart"/>
-      <w:r>
-        <w:t>bcos</w:t>
-      </w:r>
-      <w:proofErr w:type="spellEnd"/>
-      <w:r>
-        <w:t xml:space="preserve"> if we initialise it as a list of universals, this may be wrong as it may be intended to be a string. </w:t>
-      </w:r>
-    </w:p>
-    <w:p>
-      <w:r>
-        <w:t xml:space="preserve">Universal needs </w:t>
-      </w:r>
-      <w:proofErr w:type="spellStart"/>
-      <w:r>
-        <w:t>lt</w:t>
-      </w:r>
-      <w:proofErr w:type="spellEnd"/>
-      <w:r>
-        <w:t xml:space="preserve">, </w:t>
-      </w:r>
-      <w:proofErr w:type="spellStart"/>
-      <w:r>
-        <w:t>gt</w:t>
-      </w:r>
-      <w:proofErr w:type="spellEnd"/>
-      <w:r>
-        <w:t xml:space="preserve">, le, </w:t>
-      </w:r>
-      <w:proofErr w:type="spellStart"/>
-      <w:r>
-        <w:t>ge</w:t>
-      </w:r>
-      <w:proofErr w:type="spellEnd"/>
-      <w:r>
-        <w:t xml:space="preserve"> operators define</w:t>
+        <w:t xml:space="preserve">Testing universal object on two sorting algorithms always results in empty lists as universals value gets set to empty list if len() is called on it. This is bcos if we initialise it as a list of universals, this may be wrong as it may be intended to be a string. </w:t>
+      </w:r>
+    </w:p>
+    <w:p>
+      <w:r>
+        <w:t>Universal needs lt, gt, le, ge operators define</w:t>
       </w:r>
       <w:r>
         <w:t>d</w:t>
@@ -443,99 +279,20 @@
         <w:t>Universal does not support item assignment</w:t>
       </w:r>
       <w:r>
-        <w:t xml:space="preserve"> </w:t>
-      </w:r>
-      <w:proofErr w:type="spellStart"/>
-      <w:r>
-        <w:t>e.g</w:t>
-      </w:r>
-      <w:proofErr w:type="spellEnd"/>
-      <w:r>
-        <w:t xml:space="preserve"> the line</w:t>
-      </w:r>
-    </w:p>
-    <w:p>
-      <w:proofErr w:type="spellStart"/>
-      <w:proofErr w:type="gramStart"/>
-      <w:r>
-        <w:t>arr</w:t>
-      </w:r>
-      <w:proofErr w:type="spellEnd"/>
-      <w:r>
-        <w:t>[</w:t>
-      </w:r>
-      <w:proofErr w:type="spellStart"/>
-      <w:proofErr w:type="gramEnd"/>
-      <w:r>
-        <w:t>i</w:t>
-      </w:r>
-      <w:proofErr w:type="spellEnd"/>
-      <w:r>
-        <w:t xml:space="preserve"> + 1], </w:t>
-      </w:r>
-      <w:proofErr w:type="spellStart"/>
-      <w:r>
-        <w:t>arr</w:t>
-      </w:r>
-      <w:proofErr w:type="spellEnd"/>
-      <w:r>
-        <w:t xml:space="preserve">[high] = </w:t>
-      </w:r>
-      <w:proofErr w:type="spellStart"/>
-      <w:r>
-        <w:t>arr</w:t>
-      </w:r>
-      <w:proofErr w:type="spellEnd"/>
-      <w:r>
-        <w:t xml:space="preserve">[high], </w:t>
-      </w:r>
-      <w:proofErr w:type="spellStart"/>
-      <w:r>
-        <w:t>arr</w:t>
-      </w:r>
-      <w:proofErr w:type="spellEnd"/>
-      <w:r>
-        <w:t>[</w:t>
-      </w:r>
-      <w:proofErr w:type="spellStart"/>
-      <w:r>
-        <w:t>i</w:t>
-      </w:r>
-      <w:proofErr w:type="spellEnd"/>
-      <w:r>
-        <w:t xml:space="preserve"> + 1]</w:t>
-      </w:r>
-    </w:p>
-    <w:p>
-      <w:r>
-        <w:t xml:space="preserve">does not work if </w:t>
-      </w:r>
-      <w:proofErr w:type="spellStart"/>
-      <w:r>
-        <w:t>arr</w:t>
-      </w:r>
-      <w:proofErr w:type="spellEnd"/>
-      <w:r>
-        <w:t xml:space="preserve"> is a universal and each element of </w:t>
-      </w:r>
-      <w:proofErr w:type="spellStart"/>
-      <w:r>
-        <w:t>arr</w:t>
-      </w:r>
-      <w:proofErr w:type="spellEnd"/>
-      <w:r>
-        <w:t xml:space="preserve"> is a universal</w:t>
-      </w:r>
-      <w:r>
-        <w:t xml:space="preserve"> I “</w:t>
-      </w:r>
-      <w:proofErr w:type="spellStart"/>
-      <w:r>
-        <w:t>vibecoded</w:t>
-      </w:r>
-      <w:proofErr w:type="spellEnd"/>
-      <w:r>
-        <w:t>” an implementation of this.</w:t>
+        <w:t xml:space="preserve"> e.g the line</w:t>
+      </w:r>
+    </w:p>
+    <w:p>
+      <w:r>
+        <w:t>arr[i + 1], arr[high] = arr[high], arr[i + 1]</w:t>
+      </w:r>
+    </w:p>
+    <w:p>
+      <w:r>
+        <w:t>does not work if arr is a universal and each element of arr is a universal</w:t>
+      </w:r>
+      <w:r>
+        <w:t xml:space="preserve"> I “vibecoded” an implementation of this.</w:t>
       </w:r>
     </w:p>
     <w:p>
@@ -551,44 +308,12 @@
     </w:p>
     <w:p>
       <w:r>
-        <w:t xml:space="preserve">Read </w:t>
-      </w:r>
-      <w:proofErr w:type="spellStart"/>
-      <w:r>
-        <w:t>TypeEvalPy</w:t>
-      </w:r>
-      <w:proofErr w:type="spellEnd"/>
-      <w:r>
-        <w:t xml:space="preserve"> to find good frameworks for function parameters.</w:t>
-      </w:r>
-    </w:p>
-    <w:p>
-      <w:r>
-        <w:t xml:space="preserve">Tried </w:t>
-      </w:r>
-      <w:proofErr w:type="spellStart"/>
-      <w:r>
-        <w:t>HeaderGen</w:t>
-      </w:r>
-      <w:proofErr w:type="spellEnd"/>
-      <w:r>
-        <w:t xml:space="preserve"> as it was apparently the best for all categories including function parameters. When I tried it, it would only infer function return types and not parameters. The </w:t>
-      </w:r>
-      <w:proofErr w:type="spellStart"/>
-      <w:r>
-        <w:t>github</w:t>
-      </w:r>
-      <w:proofErr w:type="spellEnd"/>
-      <w:r>
-        <w:t xml:space="preserve"> only mentions that it can resolve function return </w:t>
-      </w:r>
-      <w:proofErr w:type="gramStart"/>
-      <w:r>
-        <w:t>types</w:t>
-      </w:r>
-      <w:proofErr w:type="gramEnd"/>
-      <w:r>
-        <w:t xml:space="preserve"> and I could not figure out any way to get it to infer parameter types. </w:t>
+        <w:t>Read TypeEvalPy to find good frameworks for function parameters.</w:t>
+      </w:r>
+    </w:p>
+    <w:p>
+      <w:r>
+        <w:t xml:space="preserve">Tried HeaderGen as it was apparently the best for all categories including function parameters. When I tried it, it would only infer function return types and not parameters. The github only mentions that it can resolve function return types and I could not figure out any way to get it to infer parameter types. </w:t>
       </w:r>
     </w:p>
     <w:p>
@@ -642,103 +367,23 @@
         </w:numPr>
       </w:pPr>
       <w:r>
-        <w:t>Hypothesis/</w:t>
-      </w:r>
-      <w:proofErr w:type="spellStart"/>
-      <w:r>
-        <w:t>Hypofuzz</w:t>
-      </w:r>
-      <w:proofErr w:type="spellEnd"/>
-      <w:r>
-        <w:t xml:space="preserve"> “Strategies” are how you define what is passed </w:t>
-      </w:r>
-      <w:proofErr w:type="gramStart"/>
-      <w:r>
-        <w:t>in to</w:t>
-      </w:r>
-      <w:proofErr w:type="gramEnd"/>
-      <w:r>
-        <w:t xml:space="preserve"> the function you want to fuzz. </w:t>
-      </w:r>
-      <w:proofErr w:type="spellStart"/>
-      <w:r>
-        <w:t>E.g</w:t>
-      </w:r>
-      <w:proofErr w:type="spellEnd"/>
-      <w:r>
-        <w:t xml:space="preserve">  </w:t>
+        <w:t xml:space="preserve">Hypothesis/Hypofuzz “Strategies” are how you define what is passed in to the function you want to fuzz. E.g  </w:t>
       </w:r>
     </w:p>
     <w:p>
       <w:r>
         <w:lastRenderedPageBreak/>
-        <w:t>@given(</w:t>
-      </w:r>
-      <w:proofErr w:type="gramStart"/>
-      <w:r>
-        <w:t>st.lists</w:t>
-      </w:r>
-      <w:proofErr w:type="gramEnd"/>
-      <w:r>
-        <w:t xml:space="preserve">(st.integers() | </w:t>
-      </w:r>
-      <w:proofErr w:type="spellStart"/>
-      <w:r>
-        <w:t>st.floats</w:t>
-      </w:r>
-      <w:proofErr w:type="spellEnd"/>
-      <w:r>
-        <w:t>()))</w:t>
-      </w:r>
-    </w:p>
-    <w:p>
-      <w:r>
-        <w:t xml:space="preserve">def </w:t>
-      </w:r>
-      <w:proofErr w:type="spellStart"/>
-      <w:r>
-        <w:t>test_sort_correct</w:t>
-      </w:r>
-      <w:proofErr w:type="spellEnd"/>
-      <w:r>
-        <w:t>(</w:t>
-      </w:r>
-      <w:proofErr w:type="spellStart"/>
-      <w:r>
-        <w:t>lst</w:t>
-      </w:r>
-      <w:proofErr w:type="spellEnd"/>
-      <w:r>
-        <w:t>):</w:t>
-      </w:r>
-    </w:p>
-    <w:p>
-      <w:r>
-        <w:t xml:space="preserve">    assert(</w:t>
-      </w:r>
-      <w:proofErr w:type="spellStart"/>
-      <w:r>
-        <w:t>my_sort</w:t>
-      </w:r>
-      <w:proofErr w:type="spellEnd"/>
-      <w:r>
-        <w:t>(</w:t>
-      </w:r>
-      <w:proofErr w:type="spellStart"/>
-      <w:r>
-        <w:t>lst</w:t>
-      </w:r>
-      <w:proofErr w:type="spellEnd"/>
-      <w:r>
-        <w:t>) == sorted(</w:t>
-      </w:r>
-      <w:proofErr w:type="spellStart"/>
-      <w:r>
-        <w:t>lst</w:t>
-      </w:r>
-      <w:proofErr w:type="spellEnd"/>
-      <w:r>
-        <w:t>))</w:t>
+        <w:t>@given(st.lists(st.integers() | st.floats()))</w:t>
+      </w:r>
+    </w:p>
+    <w:p>
+      <w:r>
+        <w:t>def test_sort_correct(lst):</w:t>
+      </w:r>
+    </w:p>
+    <w:p>
+      <w:r>
+        <w:t xml:space="preserve">    assert(my_sort(lst) == sorted(lst))</w:t>
       </w:r>
     </w:p>
     <w:p>
@@ -750,23 +395,7 @@
         </w:numPr>
       </w:pPr>
       <w:r>
-        <w:t xml:space="preserve">In that code snippet, the strategy is to fuzz </w:t>
-      </w:r>
-      <w:proofErr w:type="spellStart"/>
-      <w:r>
-        <w:t>my_sort</w:t>
-      </w:r>
-      <w:proofErr w:type="spellEnd"/>
-      <w:r>
-        <w:t xml:space="preserve"> with inputs of type list[</w:t>
-      </w:r>
-      <w:proofErr w:type="spellStart"/>
-      <w:r>
-        <w:t>int|str</w:t>
-      </w:r>
-      <w:proofErr w:type="spellEnd"/>
-      <w:r>
-        <w:t>]</w:t>
+        <w:t>In that code snippet, the strategy is to fuzz my_sort with inputs of type list[int|str]</w:t>
       </w:r>
     </w:p>
     <w:p>
@@ -778,15 +407,7 @@
         </w:numPr>
       </w:pPr>
       <w:r>
-        <w:t xml:space="preserve">In the case of my universal strategy, I simply fuzz with a strategy that can be </w:t>
-      </w:r>
-      <w:proofErr w:type="spellStart"/>
-      <w:r>
-        <w:t>though</w:t>
-      </w:r>
-      <w:proofErr w:type="spellEnd"/>
-      <w:r>
-        <w:t xml:space="preserve"> of as the following:</w:t>
+        <w:t>In the case of my universal strategy, I simply fuzz with a strategy that can be though of as the following:</w:t>
       </w:r>
     </w:p>
     <w:p>
@@ -797,55 +418,8 @@
           <w:numId w:val="3"/>
         </w:numPr>
       </w:pPr>
-      <w:proofErr w:type="spellStart"/>
-      <w:r>
-        <w:t>strat</w:t>
-      </w:r>
-      <w:proofErr w:type="spellEnd"/>
-      <w:r>
-        <w:t xml:space="preserve"> = </w:t>
-      </w:r>
-      <w:proofErr w:type="spellStart"/>
-      <w:r>
-        <w:t>int|str|float|bool|None|list</w:t>
-      </w:r>
-      <w:proofErr w:type="spellEnd"/>
-      <w:r>
-        <w:t>[</w:t>
-      </w:r>
-      <w:proofErr w:type="spellStart"/>
-      <w:r>
-        <w:t>strat</w:t>
-      </w:r>
-      <w:proofErr w:type="spellEnd"/>
-      <w:r>
-        <w:t>]|</w:t>
-      </w:r>
-      <w:proofErr w:type="spellStart"/>
-      <w:r>
-        <w:t>dict</w:t>
-      </w:r>
-      <w:proofErr w:type="spellEnd"/>
-      <w:r>
-        <w:t>[</w:t>
-      </w:r>
-      <w:proofErr w:type="spellStart"/>
-      <w:proofErr w:type="gramStart"/>
-      <w:r>
-        <w:t>str,strat</w:t>
-      </w:r>
-      <w:proofErr w:type="spellEnd"/>
-      <w:proofErr w:type="gramEnd"/>
-      <w:r>
-        <w:t>]|tuple[</w:t>
-      </w:r>
-      <w:proofErr w:type="spellStart"/>
-      <w:r>
-        <w:t>strat</w:t>
-      </w:r>
-      <w:proofErr w:type="spellEnd"/>
-      <w:r>
-        <w:t>]</w:t>
+      <w:r>
+        <w:t>strat = int|str|float|bool|None|list[strat]|dict[str,strat]|tuple[strat]</w:t>
       </w:r>
     </w:p>
     <w:p>
@@ -857,15 +431,7 @@
         </w:numPr>
       </w:pPr>
       <w:r>
-        <w:t xml:space="preserve">I have logic implemented so that if we encounter a </w:t>
-      </w:r>
-      <w:proofErr w:type="spellStart"/>
-      <w:r>
-        <w:t>TypeError</w:t>
-      </w:r>
-      <w:proofErr w:type="spellEnd"/>
-      <w:r>
-        <w:t>, we discard the type that caused the error from the pool of possible types in our strategy for future iterations.</w:t>
+        <w:t>I have logic implemented so that if we encounter a TypeError, we discard the type that caused the error from the pool of possible types in our strategy for future iterations.</w:t>
       </w:r>
     </w:p>
     <w:p>
@@ -877,15 +443,7 @@
         </w:numPr>
       </w:pPr>
       <w:r>
-        <w:t xml:space="preserve">It seems to work </w:t>
-      </w:r>
-      <w:proofErr w:type="gramStart"/>
-      <w:r>
-        <w:t>fairly well</w:t>
-      </w:r>
-      <w:proofErr w:type="gramEnd"/>
-      <w:r>
-        <w:t xml:space="preserve"> for the simple tests I have performed so far</w:t>
+        <w:t>It seems to work fairly well for the simple tests I have performed so far</w:t>
       </w:r>
     </w:p>
     <w:p>
@@ -897,15 +455,7 @@
         </w:numPr>
       </w:pPr>
       <w:r>
-        <w:t xml:space="preserve">Because it essentially brute forces fuzzing with different types until it works, I can imagine this being quite slow for fuzzing complex functions with lots of </w:t>
-      </w:r>
-      <w:proofErr w:type="gramStart"/>
-      <w:r>
-        <w:t>arguments</w:t>
-      </w:r>
-      <w:proofErr w:type="gramEnd"/>
-      <w:r>
-        <w:t xml:space="preserve"> but this will have to be tested more</w:t>
+        <w:t>Because it essentially brute forces fuzzing with different types until it works, I can imagine this being quite slow for fuzzing complex functions with lots of arguments but this will have to be tested more</w:t>
       </w:r>
     </w:p>
     <w:p>
@@ -928,49 +478,17 @@
     </w:p>
     <w:p>
       <w:r>
-        <w:t xml:space="preserve">If we assume there isn’t any explicit casting in the function we are fuzzing, how would a universal handle a situation where the type is ambiguous </w:t>
-      </w:r>
-      <w:proofErr w:type="spellStart"/>
-      <w:r>
-        <w:t>e.g</w:t>
-      </w:r>
-      <w:proofErr w:type="spellEnd"/>
-      <w:r>
-        <w:t xml:space="preserve"> calling </w:t>
-      </w:r>
-      <w:proofErr w:type="spellStart"/>
-      <w:r>
-        <w:t>len</w:t>
-      </w:r>
-      <w:proofErr w:type="spellEnd"/>
-      <w:r>
-        <w:t>(universal). Len is valid for both string and list so how do we lock universal here?</w:t>
-      </w:r>
-    </w:p>
-    <w:p>
-      <w:r>
-        <w:t xml:space="preserve">Similarly, how would we define operators like plus (+) for example? If we have two universals u1 and u2, the statement u1 + u2 could imply that u1 and u2 are strings, </w:t>
-      </w:r>
-      <w:proofErr w:type="spellStart"/>
-      <w:r>
-        <w:t>ints</w:t>
-      </w:r>
-      <w:proofErr w:type="spellEnd"/>
-      <w:r>
-        <w:t>, floats, lists, tuples so how can we implement this operator.</w:t>
-      </w:r>
-    </w:p>
-    <w:p>
-      <w:r>
-        <w:t xml:space="preserve">Theoretically speaking, at best we are determining the type of a (universal) object based on how that object is treated in the code and what functions and operations are applied to it. At best a perfect solution seems to me like it would essentially be a glorified </w:t>
-      </w:r>
-      <w:proofErr w:type="gramStart"/>
-      <w:r>
-        <w:t>type</w:t>
-      </w:r>
-      <w:proofErr w:type="gramEnd"/>
-      <w:r>
-        <w:t xml:space="preserve"> inference algorithm.</w:t>
+        <w:t>If we assume there isn’t any explicit casting in the function we are fuzzing, how would a universal handle a situation where the type is ambiguous e.g calling len(universal). Len is valid for both string and list so how do we lock universal here?</w:t>
+      </w:r>
+    </w:p>
+    <w:p>
+      <w:r>
+        <w:t>Similarly, how would we define operators like plus (+) for example? If we have two universals u1 and u2, the statement u1 + u2 could imply that u1 and u2 are strings, ints, floats, lists, tuples so how can we implement this operator.</w:t>
+      </w:r>
+    </w:p>
+    <w:p>
+      <w:r>
+        <w:t>Theoretically speaking, at best we are determining the type of a (universal) object based on how that object is treated in the code and what functions and operations are applied to it. At best a perfect solution seems to me like it would essentially be a glorified type inference algorithm.</w:t>
       </w:r>
     </w:p>
     <w:p/>
@@ -987,15 +505,7 @@
     <w:p>
       <w:r>
         <w:lastRenderedPageBreak/>
-        <w:t xml:space="preserve">See if </w:t>
-      </w:r>
-      <w:proofErr w:type="spellStart"/>
-      <w:r>
-        <w:t>func</w:t>
-      </w:r>
-      <w:proofErr w:type="spellEnd"/>
-      <w:r>
-        <w:t xml:space="preserve"> argument is callable, raise exception and print that the code is using callbacks which are not currently supported</w:t>
+        <w:t>See if func argument is callable, raise exception and print that the code is using callbacks which are not currently supported</w:t>
       </w:r>
     </w:p>
     <w:p/>
@@ -1017,31 +527,13 @@
         <w:t xml:space="preserve">classes </w:t>
       </w:r>
       <w:r>
-        <w:t xml:space="preserve">for 2 stack </w:t>
-      </w:r>
-      <w:proofErr w:type="gramStart"/>
-      <w:r>
-        <w:t>implementation</w:t>
-      </w:r>
-      <w:proofErr w:type="gramEnd"/>
-    </w:p>
-    <w:p>
-      <w:r>
-        <w:t xml:space="preserve">The </w:t>
-      </w:r>
-      <w:proofErr w:type="spellStart"/>
-      <w:r>
-        <w:t>fuzzer</w:t>
-      </w:r>
-      <w:proofErr w:type="spellEnd"/>
-      <w:r>
-        <w:t xml:space="preserve"> </w:t>
-      </w:r>
-      <w:proofErr w:type="gramStart"/>
-      <w:r>
-        <w:t>should :</w:t>
-      </w:r>
-      <w:proofErr w:type="gramEnd"/>
+        <w:t>for 2 stack implementation</w:t>
+      </w:r>
+    </w:p>
+    <w:p>
+      <w:r>
+        <w:t>The fuzzer should :</w:t>
+      </w:r>
     </w:p>
     <w:p>
       <w:r>
@@ -1061,36 +553,12 @@
     <w:p/>
     <w:p>
       <w:r>
-        <w:t xml:space="preserve">Added </w:t>
-      </w:r>
-      <w:proofErr w:type="spellStart"/>
-      <w:r>
-        <w:t>arg</w:t>
-      </w:r>
-      <w:proofErr w:type="spellEnd"/>
-      <w:r>
-        <w:t>/</w:t>
-      </w:r>
-      <w:proofErr w:type="spellStart"/>
-      <w:r>
-        <w:t>kwarg</w:t>
-      </w:r>
-      <w:proofErr w:type="spellEnd"/>
-      <w:r>
-        <w:t xml:space="preserve"> support for fuzz testing strategy</w:t>
-      </w:r>
-    </w:p>
-    <w:p>
-      <w:r>
-        <w:t xml:space="preserve">Wrote basic </w:t>
-      </w:r>
-      <w:proofErr w:type="gramStart"/>
-      <w:r>
-        <w:t>first class</w:t>
-      </w:r>
-      <w:proofErr w:type="gramEnd"/>
-      <w:r>
-        <w:t xml:space="preserve"> equivalence tester</w:t>
+        <w:t>Added arg/kwarg support for fuzz testing strategy</w:t>
+      </w:r>
+    </w:p>
+    <w:p>
+      <w:r>
+        <w:t>Wrote basic first class equivalence tester</w:t>
       </w:r>
     </w:p>
     <w:p>
@@ -1110,36 +578,12 @@
     </w:p>
     <w:p>
       <w:r>
-        <w:t xml:space="preserve">I have tried applying this equivalence tester to small refactors in real classes from open sources repos such as </w:t>
-      </w:r>
-      <w:proofErr w:type="spellStart"/>
-      <w:r>
-        <w:t>openai</w:t>
-      </w:r>
-      <w:proofErr w:type="spellEnd"/>
-      <w:r>
-        <w:t xml:space="preserve"> but have struggled to find working examples. My equivalence tester is quite situational. Method name/signature </w:t>
-      </w:r>
-      <w:proofErr w:type="gramStart"/>
-      <w:r>
-        <w:t>refactors</w:t>
-      </w:r>
-      <w:proofErr w:type="gramEnd"/>
-      <w:r>
-        <w:t xml:space="preserve"> and external dependencies cause issues</w:t>
-      </w:r>
-    </w:p>
-    <w:p>
-      <w:r>
-        <w:t xml:space="preserve">Tested it on two stack implementations, one that throws index error if you try to peek or pop and empty stack, and one that returns None for these operations. The </w:t>
-      </w:r>
-      <w:proofErr w:type="spellStart"/>
-      <w:r>
-        <w:t>fuzzer</w:t>
-      </w:r>
-      <w:proofErr w:type="spellEnd"/>
-      <w:r>
-        <w:t xml:space="preserve"> was able to pick up on this difference immediately</w:t>
+        <w:t>I have tried applying this equivalence tester to small refactors in real classes from open sources repos such as openai but have struggled to find working examples. My equivalence tester is quite situational. Method name/signature refactors and external dependencies cause issues</w:t>
+      </w:r>
+    </w:p>
+    <w:p>
+      <w:r>
+        <w:t>Tested it on two stack implementations, one that throws index error if you try to peek or pop and empty stack, and one that returns None for these operations. The fuzzer was able to pick up on this difference immediately</w:t>
       </w:r>
     </w:p>
     <w:p/>
@@ -1229,23 +673,7 @@
     </w:p>
     <w:p>
       <w:r>
-        <w:t xml:space="preserve">What I mean by this is that currently, my code will test two classes for equivalence and if the classes have differing methods or even method names, the code will reject them. Allow the user to define a </w:t>
-      </w:r>
-      <w:proofErr w:type="spellStart"/>
-      <w:r>
-        <w:t>json</w:t>
-      </w:r>
-      <w:proofErr w:type="spellEnd"/>
-      <w:r>
-        <w:t xml:space="preserve"> file with the specific methods from the class that they want tested so they can exclude certain methods if they </w:t>
-      </w:r>
-      <w:proofErr w:type="gramStart"/>
-      <w:r>
-        <w:t>like, and</w:t>
-      </w:r>
-      <w:proofErr w:type="gramEnd"/>
-      <w:r>
-        <w:t xml:space="preserve"> optionally allow the user to also define specifically what arguments each method should be tested with.</w:t>
+        <w:t>What I mean by this is that currently, my code will test two classes for equivalence and if the classes have differing methods or even method names, the code will reject them. Allow the user to define a json file with the specific methods from the class that they want tested so they can exclude certain methods if they like, and optionally allow the user to also define specifically what arguments each method should be tested with.</w:t>
       </w:r>
     </w:p>
     <w:p/>
@@ -1286,15 +714,7 @@
       </w:r>
       <w:r>
         <w:lastRenderedPageBreak/>
-        <w:t xml:space="preserve">duplicates, removing the need to fuzz both </w:t>
-      </w:r>
-      <w:proofErr w:type="spellStart"/>
-      <w:r>
-        <w:t>funcs</w:t>
-      </w:r>
-      <w:proofErr w:type="spellEnd"/>
-      <w:r>
-        <w:t>. Useful in practice for speeding up a common case</w:t>
+        <w:t>duplicates, removing the need to fuzz both funcs. Useful in practice for speeding up a common case</w:t>
       </w:r>
     </w:p>
     <w:p>
@@ -1306,15 +726,7 @@
         </w:numPr>
       </w:pPr>
       <w:r>
-        <w:t xml:space="preserve">Filter out </w:t>
-      </w:r>
-      <w:proofErr w:type="spellStart"/>
-      <w:r>
-        <w:t>funcs</w:t>
-      </w:r>
-      <w:proofErr w:type="spellEnd"/>
-      <w:r>
-        <w:t xml:space="preserve"> with no parameters and return values</w:t>
+        <w:t>Filter out funcs with no parameters and return values</w:t>
       </w:r>
     </w:p>
     <w:p>
@@ -1326,15 +738,7 @@
         </w:numPr>
       </w:pPr>
       <w:r>
-        <w:t xml:space="preserve">Possibly filter out </w:t>
-      </w:r>
-      <w:proofErr w:type="spellStart"/>
-      <w:r>
-        <w:t>funcs</w:t>
-      </w:r>
-      <w:proofErr w:type="spellEnd"/>
-      <w:r>
-        <w:t xml:space="preserve"> that invoke external classes or methods</w:t>
+        <w:t>Possibly filter out funcs that invoke external classes or methods</w:t>
       </w:r>
     </w:p>
     <w:p>
@@ -1346,15 +750,7 @@
         </w:numPr>
       </w:pPr>
       <w:r>
-        <w:t xml:space="preserve">They use </w:t>
-      </w:r>
-      <w:proofErr w:type="spellStart"/>
-      <w:r>
-        <w:t>pynguin</w:t>
-      </w:r>
-      <w:proofErr w:type="spellEnd"/>
-      <w:r>
-        <w:t xml:space="preserve"> which is a test generation framework that does not use fuzz testing</w:t>
+        <w:t>They use pynguin which is a test generation framework that does not use fuzz testing</w:t>
       </w:r>
     </w:p>
     <w:p>
@@ -1374,15 +770,7 @@
     </w:p>
     <w:p>
       <w:r>
-        <w:t xml:space="preserve">What if u have a class with 1 </w:t>
-      </w:r>
-      <w:proofErr w:type="gramStart"/>
-      <w:r>
-        <w:t>methods</w:t>
-      </w:r>
-      <w:proofErr w:type="gramEnd"/>
-      <w:r>
-        <w:t>, a factory method which gives u back 3 methods</w:t>
+        <w:t>What if u have a class with 1 methods, a factory method which gives u back 3 methods</w:t>
       </w:r>
     </w:p>
     <w:p>
@@ -1415,29 +803,13 @@
     </w:p>
     <w:p>
       <w:r>
-        <w:t xml:space="preserve">could instead go more practical, targeting </w:t>
-      </w:r>
-      <w:proofErr w:type="spellStart"/>
-      <w:r>
-        <w:t>datastructure</w:t>
-      </w:r>
-      <w:proofErr w:type="spellEnd"/>
-      <w:r>
-        <w:t xml:space="preserve"> implementations online</w:t>
+        <w:t>could instead go more practical, targeting datastructure implementations online</w:t>
       </w:r>
     </w:p>
     <w:p/>
     <w:p>
       <w:r>
-        <w:t xml:space="preserve">For function-function verification: I am currently implementing the case where both functions return (create) a new function. In this case I want to then perform the same function-function verification on these two new returned functions. The problem is the </w:t>
-      </w:r>
-      <w:proofErr w:type="spellStart"/>
-      <w:r>
-        <w:t>hypofuzz</w:t>
-      </w:r>
-      <w:proofErr w:type="spellEnd"/>
-      <w:r>
-        <w:t xml:space="preserve"> does not exactly allow for a recursive implementation like this. </w:t>
+        <w:t xml:space="preserve">For function-function verification: I am currently implementing the case where both functions return (create) a new function. In this case I want to then perform the same function-function verification on these two new returned functions. The problem is the hypofuzz does not exactly allow for a recursive implementation like this. </w:t>
       </w:r>
     </w:p>
     <w:p>
@@ -1475,13 +847,26 @@
     <w:p>
       <w:pPr>
         <w:rPr>
-          <w:i/>
+          <w:iCs/>
         </w:rPr>
       </w:pPr>
+      <w:r>
+        <w:rPr>
+          <w:iCs/>
+        </w:rPr>
+        <w:t>Other than this issue, another issue is trying to reason with functions that take callable parameters. Cant exactly fuzz a function as an input so im not sure what to do here</w:t>
+      </w:r>
+      <w:r>
+        <w:rPr>
+          <w:iCs/>
+        </w:rPr>
+        <w:t>, perhaps start with dummy functions.</w:t>
+      </w:r>
     </w:p>
     <w:p/>
     <w:p>
       <w:r>
+        <w:lastRenderedPageBreak/>
         <w:t>Important considerations:</w:t>
       </w:r>
     </w:p>
@@ -1492,7 +877,6 @@
     </w:p>
     <w:p>
       <w:r>
-        <w:lastRenderedPageBreak/>
         <w:t>How do we treat python default/optional arguments?</w:t>
       </w:r>
     </w:p>

</xml_diff>

<commit_message>
Update strategy to not require type annotations for callable args
</commit_message>
<xml_diff>
--- a/Masters project notes.docx
+++ b/Masters project notes.docx
@@ -863,10 +863,89 @@
         <w:t>, perhaps start with dummy functions.</w:t>
       </w:r>
     </w:p>
+    <w:p>
+      <w:pPr>
+        <w:rPr>
+          <w:iCs/>
+        </w:rPr>
+      </w:pPr>
+      <w:r>
+        <w:rPr>
+          <w:iCs/>
+        </w:rPr>
+        <w:lastRenderedPageBreak/>
+        <w:drawing>
+          <wp:inline distT="0" distB="0" distL="0" distR="0" wp14:anchorId="40630A85" wp14:editId="26D01560">
+            <wp:extent cx="5731510" cy="1081405"/>
+            <wp:effectExtent l="0" t="0" r="2540" b="4445"/>
+            <wp:docPr id="1907058153" name="Picture 1" descr="A screenshot of a phone&#10;&#10;AI-generated content may be incorrect."/>
+            <wp:cNvGraphicFramePr>
+              <a:graphicFrameLocks xmlns:a="http://schemas.openxmlformats.org/drawingml/2006/main" noChangeAspect="1"/>
+            </wp:cNvGraphicFramePr>
+            <a:graphic xmlns:a="http://schemas.openxmlformats.org/drawingml/2006/main">
+              <a:graphicData uri="http://schemas.openxmlformats.org/drawingml/2006/picture">
+                <pic:pic xmlns:pic="http://schemas.openxmlformats.org/drawingml/2006/picture">
+                  <pic:nvPicPr>
+                    <pic:cNvPr id="1907058153" name="Picture 1" descr="A screenshot of a phone&#10;&#10;AI-generated content may be incorrect."/>
+                    <pic:cNvPicPr/>
+                  </pic:nvPicPr>
+                  <pic:blipFill>
+                    <a:blip r:embed="rId13"/>
+                    <a:stretch>
+                      <a:fillRect/>
+                    </a:stretch>
+                  </pic:blipFill>
+                  <pic:spPr>
+                    <a:xfrm>
+                      <a:off x="0" y="0"/>
+                      <a:ext cx="5731510" cy="1081405"/>
+                    </a:xfrm>
+                    <a:prstGeom prst="rect">
+                      <a:avLst/>
+                    </a:prstGeom>
+                  </pic:spPr>
+                </pic:pic>
+              </a:graphicData>
+            </a:graphic>
+          </wp:inline>
+        </w:drawing>
+      </w:r>
+    </w:p>
+    <w:p>
+      <w:pPr>
+        <w:rPr>
+          <w:iCs/>
+        </w:rPr>
+      </w:pPr>
+      <w:r>
+        <w:rPr>
+          <w:iCs/>
+        </w:rPr>
+        <w:t>Using universal strategy + dummy functions (the testing framework doesn’t know that the function arg is necessarily callable so it uses universal strategy) it takes 11 minutes to find the difference in call_nested_param_ineq</w:t>
+      </w:r>
+      <w:r>
+        <w:rPr>
+          <w:iCs/>
+        </w:rPr>
+        <w:t>. Chances are, with type annotations this will be a bit faster as the tester will start passing in more callable args from the start</w:t>
+      </w:r>
+    </w:p>
+    <w:p>
+      <w:pPr>
+        <w:rPr>
+          <w:iCs/>
+        </w:rPr>
+      </w:pPr>
+      <w:r>
+        <w:rPr>
+          <w:iCs/>
+        </w:rPr>
+        <w:t>Adding a mechanism to see if an arg is “called” within a function should be pretty easy and should greatly improve time efficiency</w:t>
+      </w:r>
+    </w:p>
     <w:p/>
     <w:p>
       <w:r>
-        <w:lastRenderedPageBreak/>
         <w:t>Important considerations:</w:t>
       </w:r>
     </w:p>

</xml_diff>

<commit_message>
Fix bug in ProgramEquivalence, reorder file structure
</commit_message>
<xml_diff>
--- a/Masters project notes.docx
+++ b/Masters project notes.docx
@@ -53,11 +53,19 @@
           <w:lang w:val="fr-FR"/>
         </w:rPr>
       </w:pPr>
+      <w:proofErr w:type="spellStart"/>
       <w:r>
         <w:rPr>
           <w:lang w:val="fr-FR"/>
         </w:rPr>
-        <w:t xml:space="preserve">Pythonfuzz </w:t>
+        <w:t>Pythonfuzz</w:t>
+      </w:r>
+      <w:proofErr w:type="spellEnd"/>
+      <w:r>
+        <w:rPr>
+          <w:lang w:val="fr-FR"/>
+        </w:rPr>
+        <w:t xml:space="preserve"> </w:t>
       </w:r>
       <w:hyperlink r:id="rId6" w:history="1">
         <w:r>
@@ -78,7 +86,15 @@
         </w:numPr>
       </w:pPr>
       <w:r>
-        <w:t>Coverage-guided fuzzer for python</w:t>
+        <w:t xml:space="preserve">Coverage-guided </w:t>
+      </w:r>
+      <w:proofErr w:type="spellStart"/>
+      <w:r>
+        <w:t>fuzzer</w:t>
+      </w:r>
+      <w:proofErr w:type="spellEnd"/>
+      <w:r>
+        <w:t xml:space="preserve"> for python</w:t>
       </w:r>
     </w:p>
     <w:p>
@@ -110,7 +126,15 @@
         </w:numPr>
       </w:pPr>
       <w:r>
-        <w:t>Google’s coverage-guided fuzzer for python</w:t>
+        <w:t xml:space="preserve">Google’s coverage-guided </w:t>
+      </w:r>
+      <w:proofErr w:type="spellStart"/>
+      <w:r>
+        <w:t>fuzzer</w:t>
+      </w:r>
+      <w:proofErr w:type="spellEnd"/>
+      <w:r>
+        <w:t xml:space="preserve"> for python</w:t>
       </w:r>
     </w:p>
     <w:p>
@@ -130,15 +154,28 @@
         </w:rPr>
         <w:t xml:space="preserve">HypoFuzz </w:t>
       </w:r>
-      <w:hyperlink r:id="rId8" w:history="1">
-        <w:r>
-          <w:rPr>
-            <w:rStyle w:val="Hyperlink"/>
-            <w:lang w:val="de-DE"/>
-          </w:rPr>
-          <w:t>https://github.com/Zac-HD/hypofuzz</w:t>
-        </w:r>
-      </w:hyperlink>
+      <w:r>
+        <w:fldChar w:fldCharType="begin"/>
+      </w:r>
+      <w:r>
+        <w:rPr>
+          <w:lang w:val="de-DE"/>
+        </w:rPr>
+        <w:instrText>HYPERLINK "https://github.com/Zac-HD/hypofuzz"</w:instrText>
+      </w:r>
+      <w:r>
+        <w:fldChar w:fldCharType="separate"/>
+      </w:r>
+      <w:r>
+        <w:rPr>
+          <w:rStyle w:val="Hyperlink"/>
+          <w:lang w:val="de-DE"/>
+        </w:rPr>
+        <w:t>https://github.com/Zac-HD/hypofuzz</w:t>
+      </w:r>
+      <w:r>
+        <w:fldChar w:fldCharType="end"/>
+      </w:r>
     </w:p>
     <w:p>
       <w:pPr>
@@ -163,10 +200,15 @@
           <w:numId w:val="1"/>
         </w:numPr>
       </w:pPr>
-      <w:r>
-        <w:t xml:space="preserve">CrossHair </w:t>
-      </w:r>
-      <w:hyperlink r:id="rId9" w:history="1">
+      <w:proofErr w:type="spellStart"/>
+      <w:r>
+        <w:t>CrossHair</w:t>
+      </w:r>
+      <w:proofErr w:type="spellEnd"/>
+      <w:r>
+        <w:t xml:space="preserve"> </w:t>
+      </w:r>
+      <w:hyperlink r:id="rId8" w:history="1">
         <w:r>
           <w:rPr>
             <w:rStyle w:val="Hyperlink"/>
@@ -189,7 +231,39 @@
     </w:p>
     <w:p>
       <w:r>
-        <w:t>From my research, Hypothesis + HypoFuzz seems like it achieves everything that JQF does. Hypothesis is heavily inspired by QuickCheck and gives a property-based testing framework for python. It generates structured inputs and saves failing inputs for reproduction. It operates on the semantic properties of a program, making it inherently semantic-based. It is not coverage-guided by default, so HypoFuzz extends it for coverage-guided exploration thus providing a fuzzing framework.</w:t>
+        <w:t xml:space="preserve">From my research, Hypothesis + </w:t>
+      </w:r>
+      <w:proofErr w:type="spellStart"/>
+      <w:r>
+        <w:t>HypoFuzz</w:t>
+      </w:r>
+      <w:proofErr w:type="spellEnd"/>
+      <w:r>
+        <w:t xml:space="preserve"> seems like it achieves everything that JQF does. Hypothesis is heavily inspired by </w:t>
+      </w:r>
+      <w:proofErr w:type="spellStart"/>
+      <w:r>
+        <w:t>QuickCheck</w:t>
+      </w:r>
+      <w:proofErr w:type="spellEnd"/>
+      <w:r>
+        <w:t xml:space="preserve"> and gives a property-based testing framework for python. It generates structured inputs and saves failing inputs for reproduction. It operates on the semantic properties of a program, making it inherently </w:t>
+      </w:r>
+      <w:proofErr w:type="gramStart"/>
+      <w:r>
+        <w:t>semantic-based</w:t>
+      </w:r>
+      <w:proofErr w:type="gramEnd"/>
+      <w:r>
+        <w:t xml:space="preserve">. It is not coverage-guided by default, so </w:t>
+      </w:r>
+      <w:proofErr w:type="spellStart"/>
+      <w:r>
+        <w:t>HypoFuzz</w:t>
+      </w:r>
+      <w:proofErr w:type="spellEnd"/>
+      <w:r>
+        <w:t xml:space="preserve"> extends it for coverage-guided exploration thus providing a fuzzing framework.</w:t>
       </w:r>
     </w:p>
     <w:p/>
@@ -208,15 +282,28 @@
     </w:p>
     <w:p>
       <w:r>
-        <w:t>Generalise the stack example to any data structure/api</w:t>
-      </w:r>
+        <w:t>Generalise the stack example to any data structure/</w:t>
+      </w:r>
+      <w:proofErr w:type="spellStart"/>
+      <w:r>
+        <w:t>api</w:t>
+      </w:r>
+      <w:proofErr w:type="spellEnd"/>
       <w:r>
         <w:t xml:space="preserve"> that can take any type of arguments.</w:t>
       </w:r>
     </w:p>
     <w:p>
       <w:r>
-        <w:t>At some point, see if you can read the python script, create AST and traverse it in order to create the right test.</w:t>
+        <w:t xml:space="preserve">At some point, see if you can read the python script, create AST and traverse it </w:t>
+      </w:r>
+      <w:proofErr w:type="gramStart"/>
+      <w:r>
+        <w:t>in order to</w:t>
+      </w:r>
+      <w:proofErr w:type="gramEnd"/>
+      <w:r>
+        <w:t xml:space="preserve"> create the right test.</w:t>
       </w:r>
     </w:p>
     <w:p/>
@@ -230,18 +317,58 @@
         <w:t xml:space="preserve">Using it to test a very simple summing function </w:t>
       </w:r>
       <w:r>
-        <w:t>doesn’t work very well. I believe because of how universal is configured and how my two simple functions are configured, atheris is unable to quickly find the erroneous input.</w:t>
-      </w:r>
-    </w:p>
-    <w:p>
-      <w:r>
-        <w:t>I think the fact that fuzz testing is obfuscated inside the universal object the module is unable to correctly perform its algorithms to find erroneous inputs. I vibe coded a hypofuzz universal object and also tried manually implementing one and couldn’t get it to spot any bugs but given more time there may be a way to implement this. Just haven’t figured it out yet.</w:t>
+        <w:t xml:space="preserve">doesn’t work very well. I believe because of how universal is configured and how my two simple functions are configured, </w:t>
+      </w:r>
+      <w:proofErr w:type="spellStart"/>
+      <w:r>
+        <w:t>atheris</w:t>
+      </w:r>
+      <w:proofErr w:type="spellEnd"/>
+      <w:r>
+        <w:t xml:space="preserve"> is unable to quickly find the erroneous input.</w:t>
+      </w:r>
+    </w:p>
+    <w:p>
+      <w:r>
+        <w:t xml:space="preserve">I think the fact that fuzz testing is obfuscated inside the universal object the module is unable to correctly perform its algorithms to find erroneous inputs. I vibe coded a </w:t>
+      </w:r>
+      <w:proofErr w:type="spellStart"/>
+      <w:r>
+        <w:t>hypofuzz</w:t>
+      </w:r>
+      <w:proofErr w:type="spellEnd"/>
+      <w:r>
+        <w:t xml:space="preserve"> universal object </w:t>
+      </w:r>
+      <w:proofErr w:type="gramStart"/>
+      <w:r>
+        <w:t>and also</w:t>
+      </w:r>
+      <w:proofErr w:type="gramEnd"/>
+      <w:r>
+        <w:t xml:space="preserve"> tried manually implementing one and couldn’t get it to spot any bugs but given more time there may be a way to implement this. Just haven’t figured it out yet.</w:t>
       </w:r>
     </w:p>
     <w:p>
       <w:r>
         <w:lastRenderedPageBreak/>
-        <w:t>When comparing two different sorting algorithms, hypofuzz was unable to spot the difference when I added a small condition to quicksort if length is &gt;= 6, return the reversed list. For these one off conditions, coverage guidance actually makes it harder to spot the difference, as they provide very little feedback. Plain hypothesis was able to catch this bug (without coverage guidance)</w:t>
+        <w:t xml:space="preserve">When comparing two different sorting algorithms, </w:t>
+      </w:r>
+      <w:proofErr w:type="spellStart"/>
+      <w:r>
+        <w:t>hypofuzz</w:t>
+      </w:r>
+      <w:proofErr w:type="spellEnd"/>
+      <w:r>
+        <w:t xml:space="preserve"> was unable to spot the difference when I added a small condition to quicksort if length is &gt;= 6, return the reversed list. For these </w:t>
+      </w:r>
+      <w:proofErr w:type="gramStart"/>
+      <w:r>
+        <w:t>one off</w:t>
+      </w:r>
+      <w:proofErr w:type="gramEnd"/>
+      <w:r>
+        <w:t xml:space="preserve"> conditions, coverage guidance actually makes it harder to spot the difference, as they provide very little feedback. Plain hypothesis was able to catch this bug (without coverage guidance)</w:t>
       </w:r>
     </w:p>
     <w:p>
@@ -260,12 +387,57 @@
     </w:p>
     <w:p>
       <w:r>
-        <w:t xml:space="preserve">Testing universal object on two sorting algorithms always results in empty lists as universals value gets set to empty list if len() is called on it. This is bcos if we initialise it as a list of universals, this may be wrong as it may be intended to be a string. </w:t>
-      </w:r>
-    </w:p>
-    <w:p>
-      <w:r>
-        <w:t>Universal needs lt, gt, le, ge operators define</w:t>
+        <w:t xml:space="preserve">Testing universal object on two sorting algorithms always results in empty lists as universals value gets set to empty list if </w:t>
+      </w:r>
+      <w:proofErr w:type="spellStart"/>
+      <w:proofErr w:type="gramStart"/>
+      <w:r>
+        <w:t>len</w:t>
+      </w:r>
+      <w:proofErr w:type="spellEnd"/>
+      <w:r>
+        <w:t>(</w:t>
+      </w:r>
+      <w:proofErr w:type="gramEnd"/>
+      <w:r>
+        <w:t xml:space="preserve">) is called on it. This is </w:t>
+      </w:r>
+      <w:proofErr w:type="spellStart"/>
+      <w:r>
+        <w:t>bcos</w:t>
+      </w:r>
+      <w:proofErr w:type="spellEnd"/>
+      <w:r>
+        <w:t xml:space="preserve"> if we initialise it as a list of universals, this may be wrong as it may be intended to be a string. </w:t>
+      </w:r>
+    </w:p>
+    <w:p>
+      <w:r>
+        <w:t xml:space="preserve">Universal needs </w:t>
+      </w:r>
+      <w:proofErr w:type="spellStart"/>
+      <w:r>
+        <w:t>lt</w:t>
+      </w:r>
+      <w:proofErr w:type="spellEnd"/>
+      <w:r>
+        <w:t xml:space="preserve">, </w:t>
+      </w:r>
+      <w:proofErr w:type="spellStart"/>
+      <w:r>
+        <w:t>gt</w:t>
+      </w:r>
+      <w:proofErr w:type="spellEnd"/>
+      <w:r>
+        <w:t xml:space="preserve">, le, </w:t>
+      </w:r>
+      <w:proofErr w:type="spellStart"/>
+      <w:r>
+        <w:t>ge</w:t>
+      </w:r>
+      <w:proofErr w:type="spellEnd"/>
+      <w:r>
+        <w:t xml:space="preserve"> operators define</w:t>
       </w:r>
       <w:r>
         <w:t>d</w:t>
@@ -279,20 +451,99 @@
         <w:t>Universal does not support item assignment</w:t>
       </w:r>
       <w:r>
-        <w:t xml:space="preserve"> e.g the line</w:t>
-      </w:r>
-    </w:p>
-    <w:p>
-      <w:r>
-        <w:t>arr[i + 1], arr[high] = arr[high], arr[i + 1]</w:t>
-      </w:r>
-    </w:p>
-    <w:p>
-      <w:r>
-        <w:t>does not work if arr is a universal and each element of arr is a universal</w:t>
-      </w:r>
-      <w:r>
-        <w:t xml:space="preserve"> I “vibecoded” an implementation of this.</w:t>
+        <w:t xml:space="preserve"> </w:t>
+      </w:r>
+      <w:proofErr w:type="spellStart"/>
+      <w:r>
+        <w:t>e.g</w:t>
+      </w:r>
+      <w:proofErr w:type="spellEnd"/>
+      <w:r>
+        <w:t xml:space="preserve"> the line</w:t>
+      </w:r>
+    </w:p>
+    <w:p>
+      <w:proofErr w:type="spellStart"/>
+      <w:proofErr w:type="gramStart"/>
+      <w:r>
+        <w:t>arr</w:t>
+      </w:r>
+      <w:proofErr w:type="spellEnd"/>
+      <w:r>
+        <w:t>[</w:t>
+      </w:r>
+      <w:proofErr w:type="spellStart"/>
+      <w:proofErr w:type="gramEnd"/>
+      <w:r>
+        <w:t>i</w:t>
+      </w:r>
+      <w:proofErr w:type="spellEnd"/>
+      <w:r>
+        <w:t xml:space="preserve"> + 1], </w:t>
+      </w:r>
+      <w:proofErr w:type="spellStart"/>
+      <w:r>
+        <w:t>arr</w:t>
+      </w:r>
+      <w:proofErr w:type="spellEnd"/>
+      <w:r>
+        <w:t xml:space="preserve">[high] = </w:t>
+      </w:r>
+      <w:proofErr w:type="spellStart"/>
+      <w:r>
+        <w:t>arr</w:t>
+      </w:r>
+      <w:proofErr w:type="spellEnd"/>
+      <w:r>
+        <w:t xml:space="preserve">[high], </w:t>
+      </w:r>
+      <w:proofErr w:type="spellStart"/>
+      <w:r>
+        <w:t>arr</w:t>
+      </w:r>
+      <w:proofErr w:type="spellEnd"/>
+      <w:r>
+        <w:t>[</w:t>
+      </w:r>
+      <w:proofErr w:type="spellStart"/>
+      <w:r>
+        <w:t>i</w:t>
+      </w:r>
+      <w:proofErr w:type="spellEnd"/>
+      <w:r>
+        <w:t xml:space="preserve"> + 1]</w:t>
+      </w:r>
+    </w:p>
+    <w:p>
+      <w:r>
+        <w:t xml:space="preserve">does not work if </w:t>
+      </w:r>
+      <w:proofErr w:type="spellStart"/>
+      <w:r>
+        <w:t>arr</w:t>
+      </w:r>
+      <w:proofErr w:type="spellEnd"/>
+      <w:r>
+        <w:t xml:space="preserve"> is a universal and each element of </w:t>
+      </w:r>
+      <w:proofErr w:type="spellStart"/>
+      <w:r>
+        <w:t>arr</w:t>
+      </w:r>
+      <w:proofErr w:type="spellEnd"/>
+      <w:r>
+        <w:t xml:space="preserve"> is a universal</w:t>
+      </w:r>
+      <w:r>
+        <w:t xml:space="preserve"> I “</w:t>
+      </w:r>
+      <w:proofErr w:type="spellStart"/>
+      <w:r>
+        <w:t>vibecoded</w:t>
+      </w:r>
+      <w:proofErr w:type="spellEnd"/>
+      <w:r>
+        <w:t>” an implementation of this.</w:t>
       </w:r>
     </w:p>
     <w:p>
@@ -308,12 +559,36 @@
     </w:p>
     <w:p>
       <w:r>
-        <w:t>Read TypeEvalPy to find good frameworks for function parameters.</w:t>
-      </w:r>
-    </w:p>
-    <w:p>
-      <w:r>
-        <w:t xml:space="preserve">Tried HeaderGen as it was apparently the best for all categories including function parameters. When I tried it, it would only infer function return types and not parameters. The github only mentions that it can resolve function return types and I could not figure out any way to get it to infer parameter types. </w:t>
+        <w:t xml:space="preserve">Read </w:t>
+      </w:r>
+      <w:proofErr w:type="spellStart"/>
+      <w:r>
+        <w:t>TypeEvalPy</w:t>
+      </w:r>
+      <w:proofErr w:type="spellEnd"/>
+      <w:r>
+        <w:t xml:space="preserve"> to find good frameworks for function parameters.</w:t>
+      </w:r>
+    </w:p>
+    <w:p>
+      <w:r>
+        <w:t xml:space="preserve">Tried </w:t>
+      </w:r>
+      <w:proofErr w:type="spellStart"/>
+      <w:r>
+        <w:t>HeaderGen</w:t>
+      </w:r>
+      <w:proofErr w:type="spellEnd"/>
+      <w:r>
+        <w:t xml:space="preserve"> as it was apparently the best for all categories including function parameters. When I tried it, it would only infer function return types and not parameters. The </w:t>
+      </w:r>
+      <w:proofErr w:type="spellStart"/>
+      <w:r>
+        <w:t>github</w:t>
+      </w:r>
+      <w:proofErr w:type="spellEnd"/>
+      <w:r>
+        <w:t xml:space="preserve"> only mentions that it can resolve function return types and I could not figure out any way to get it to infer parameter types. </w:t>
       </w:r>
     </w:p>
     <w:p>
@@ -367,23 +642,103 @@
         </w:numPr>
       </w:pPr>
       <w:r>
-        <w:t xml:space="preserve">Hypothesis/Hypofuzz “Strategies” are how you define what is passed in to the function you want to fuzz. E.g  </w:t>
+        <w:t>Hypothesis/</w:t>
+      </w:r>
+      <w:proofErr w:type="spellStart"/>
+      <w:r>
+        <w:t>Hypofuzz</w:t>
+      </w:r>
+      <w:proofErr w:type="spellEnd"/>
+      <w:r>
+        <w:t xml:space="preserve"> “Strategies” are how you define what is passed </w:t>
+      </w:r>
+      <w:proofErr w:type="gramStart"/>
+      <w:r>
+        <w:t>in to</w:t>
+      </w:r>
+      <w:proofErr w:type="gramEnd"/>
+      <w:r>
+        <w:t xml:space="preserve"> the function you want to fuzz. </w:t>
+      </w:r>
+      <w:proofErr w:type="spellStart"/>
+      <w:r>
+        <w:t>E.g</w:t>
+      </w:r>
+      <w:proofErr w:type="spellEnd"/>
+      <w:r>
+        <w:t xml:space="preserve">  </w:t>
       </w:r>
     </w:p>
     <w:p>
       <w:r>
         <w:lastRenderedPageBreak/>
-        <w:t>@given(st.lists(st.integers() | st.floats()))</w:t>
-      </w:r>
-    </w:p>
-    <w:p>
-      <w:r>
-        <w:t>def test_sort_correct(lst):</w:t>
-      </w:r>
-    </w:p>
-    <w:p>
-      <w:r>
-        <w:t xml:space="preserve">    assert(my_sort(lst) == sorted(lst))</w:t>
+        <w:t>@given(</w:t>
+      </w:r>
+      <w:proofErr w:type="gramStart"/>
+      <w:r>
+        <w:t>st.lists</w:t>
+      </w:r>
+      <w:proofErr w:type="gramEnd"/>
+      <w:r>
+        <w:t xml:space="preserve">(st.integers() | </w:t>
+      </w:r>
+      <w:proofErr w:type="spellStart"/>
+      <w:r>
+        <w:t>st.floats</w:t>
+      </w:r>
+      <w:proofErr w:type="spellEnd"/>
+      <w:r>
+        <w:t>()))</w:t>
+      </w:r>
+    </w:p>
+    <w:p>
+      <w:r>
+        <w:t xml:space="preserve">def </w:t>
+      </w:r>
+      <w:proofErr w:type="spellStart"/>
+      <w:r>
+        <w:t>test_sort_correct</w:t>
+      </w:r>
+      <w:proofErr w:type="spellEnd"/>
+      <w:r>
+        <w:t>(</w:t>
+      </w:r>
+      <w:proofErr w:type="spellStart"/>
+      <w:r>
+        <w:t>lst</w:t>
+      </w:r>
+      <w:proofErr w:type="spellEnd"/>
+      <w:r>
+        <w:t>):</w:t>
+      </w:r>
+    </w:p>
+    <w:p>
+      <w:r>
+        <w:t xml:space="preserve">    assert(</w:t>
+      </w:r>
+      <w:proofErr w:type="spellStart"/>
+      <w:r>
+        <w:t>my_sort</w:t>
+      </w:r>
+      <w:proofErr w:type="spellEnd"/>
+      <w:r>
+        <w:t>(</w:t>
+      </w:r>
+      <w:proofErr w:type="spellStart"/>
+      <w:r>
+        <w:t>lst</w:t>
+      </w:r>
+      <w:proofErr w:type="spellEnd"/>
+      <w:r>
+        <w:t>) == sorted(</w:t>
+      </w:r>
+      <w:proofErr w:type="spellStart"/>
+      <w:r>
+        <w:t>lst</w:t>
+      </w:r>
+      <w:proofErr w:type="spellEnd"/>
+      <w:r>
+        <w:t>))</w:t>
       </w:r>
     </w:p>
     <w:p>
@@ -395,7 +750,23 @@
         </w:numPr>
       </w:pPr>
       <w:r>
-        <w:t>In that code snippet, the strategy is to fuzz my_sort with inputs of type list[int|str]</w:t>
+        <w:t xml:space="preserve">In that code snippet, the strategy is to fuzz </w:t>
+      </w:r>
+      <w:proofErr w:type="spellStart"/>
+      <w:r>
+        <w:t>my_sort</w:t>
+      </w:r>
+      <w:proofErr w:type="spellEnd"/>
+      <w:r>
+        <w:t xml:space="preserve"> with inputs of type list[</w:t>
+      </w:r>
+      <w:proofErr w:type="spellStart"/>
+      <w:r>
+        <w:t>int|str</w:t>
+      </w:r>
+      <w:proofErr w:type="spellEnd"/>
+      <w:r>
+        <w:t>]</w:t>
       </w:r>
     </w:p>
     <w:p>
@@ -407,7 +778,15 @@
         </w:numPr>
       </w:pPr>
       <w:r>
-        <w:t>In the case of my universal strategy, I simply fuzz with a strategy that can be though of as the following:</w:t>
+        <w:t xml:space="preserve">In the case of my universal strategy, I simply fuzz with a strategy that can be </w:t>
+      </w:r>
+      <w:proofErr w:type="spellStart"/>
+      <w:r>
+        <w:t>though</w:t>
+      </w:r>
+      <w:proofErr w:type="spellEnd"/>
+      <w:r>
+        <w:t xml:space="preserve"> of as the following:</w:t>
       </w:r>
     </w:p>
     <w:p>
@@ -418,8 +797,55 @@
           <w:numId w:val="3"/>
         </w:numPr>
       </w:pPr>
-      <w:r>
-        <w:t>strat = int|str|float|bool|None|list[strat]|dict[str,strat]|tuple[strat]</w:t>
+      <w:proofErr w:type="spellStart"/>
+      <w:r>
+        <w:t>strat</w:t>
+      </w:r>
+      <w:proofErr w:type="spellEnd"/>
+      <w:r>
+        <w:t xml:space="preserve"> = </w:t>
+      </w:r>
+      <w:proofErr w:type="spellStart"/>
+      <w:r>
+        <w:t>int|str|float|bool|None|list</w:t>
+      </w:r>
+      <w:proofErr w:type="spellEnd"/>
+      <w:r>
+        <w:t>[</w:t>
+      </w:r>
+      <w:proofErr w:type="spellStart"/>
+      <w:r>
+        <w:t>strat</w:t>
+      </w:r>
+      <w:proofErr w:type="spellEnd"/>
+      <w:r>
+        <w:t>]|</w:t>
+      </w:r>
+      <w:proofErr w:type="spellStart"/>
+      <w:r>
+        <w:t>dict</w:t>
+      </w:r>
+      <w:proofErr w:type="spellEnd"/>
+      <w:r>
+        <w:t>[</w:t>
+      </w:r>
+      <w:proofErr w:type="spellStart"/>
+      <w:proofErr w:type="gramStart"/>
+      <w:r>
+        <w:t>str,strat</w:t>
+      </w:r>
+      <w:proofErr w:type="spellEnd"/>
+      <w:proofErr w:type="gramEnd"/>
+      <w:r>
+        <w:t>]|tuple[</w:t>
+      </w:r>
+      <w:proofErr w:type="spellStart"/>
+      <w:r>
+        <w:t>strat</w:t>
+      </w:r>
+      <w:proofErr w:type="spellEnd"/>
+      <w:r>
+        <w:t>]</w:t>
       </w:r>
     </w:p>
     <w:p>
@@ -431,7 +857,15 @@
         </w:numPr>
       </w:pPr>
       <w:r>
-        <w:t>I have logic implemented so that if we encounter a TypeError, we discard the type that caused the error from the pool of possible types in our strategy for future iterations.</w:t>
+        <w:t xml:space="preserve">I have logic implemented so that if we encounter a </w:t>
+      </w:r>
+      <w:proofErr w:type="spellStart"/>
+      <w:r>
+        <w:t>TypeError</w:t>
+      </w:r>
+      <w:proofErr w:type="spellEnd"/>
+      <w:r>
+        <w:t>, we discard the type that caused the error from the pool of possible types in our strategy for future iterations.</w:t>
       </w:r>
     </w:p>
     <w:p>
@@ -443,7 +877,15 @@
         </w:numPr>
       </w:pPr>
       <w:r>
-        <w:t>It seems to work fairly well for the simple tests I have performed so far</w:t>
+        <w:t xml:space="preserve">It seems to work </w:t>
+      </w:r>
+      <w:proofErr w:type="gramStart"/>
+      <w:r>
+        <w:t>fairly well</w:t>
+      </w:r>
+      <w:proofErr w:type="gramEnd"/>
+      <w:r>
+        <w:t xml:space="preserve"> for the simple tests I have performed so far</w:t>
       </w:r>
     </w:p>
     <w:p>
@@ -455,7 +897,15 @@
         </w:numPr>
       </w:pPr>
       <w:r>
-        <w:t>Because it essentially brute forces fuzzing with different types until it works, I can imagine this being quite slow for fuzzing complex functions with lots of arguments but this will have to be tested more</w:t>
+        <w:t xml:space="preserve">Because it essentially brute forces fuzzing with different types until it works, I can imagine this being quite slow for fuzzing complex functions with lots of </w:t>
+      </w:r>
+      <w:proofErr w:type="gramStart"/>
+      <w:r>
+        <w:t>arguments</w:t>
+      </w:r>
+      <w:proofErr w:type="gramEnd"/>
+      <w:r>
+        <w:t xml:space="preserve"> but this will have to be tested more</w:t>
       </w:r>
     </w:p>
     <w:p>
@@ -478,17 +928,49 @@
     </w:p>
     <w:p>
       <w:r>
-        <w:t>If we assume there isn’t any explicit casting in the function we are fuzzing, how would a universal handle a situation where the type is ambiguous e.g calling len(universal). Len is valid for both string and list so how do we lock universal here?</w:t>
-      </w:r>
-    </w:p>
-    <w:p>
-      <w:r>
-        <w:t>Similarly, how would we define operators like plus (+) for example? If we have two universals u1 and u2, the statement u1 + u2 could imply that u1 and u2 are strings, ints, floats, lists, tuples so how can we implement this operator.</w:t>
-      </w:r>
-    </w:p>
-    <w:p>
-      <w:r>
-        <w:t>Theoretically speaking, at best we are determining the type of a (universal) object based on how that object is treated in the code and what functions and operations are applied to it. At best a perfect solution seems to me like it would essentially be a glorified type inference algorithm.</w:t>
+        <w:t xml:space="preserve">If we assume there isn’t any explicit casting in the function we are fuzzing, how would a universal handle a situation where the type is ambiguous </w:t>
+      </w:r>
+      <w:proofErr w:type="spellStart"/>
+      <w:r>
+        <w:t>e.g</w:t>
+      </w:r>
+      <w:proofErr w:type="spellEnd"/>
+      <w:r>
+        <w:t xml:space="preserve"> calling </w:t>
+      </w:r>
+      <w:proofErr w:type="spellStart"/>
+      <w:r>
+        <w:t>len</w:t>
+      </w:r>
+      <w:proofErr w:type="spellEnd"/>
+      <w:r>
+        <w:t>(universal). Len is valid for both string and list so how do we lock universal here?</w:t>
+      </w:r>
+    </w:p>
+    <w:p>
+      <w:r>
+        <w:t xml:space="preserve">Similarly, how would we define operators like plus (+) for example? If we have two universals u1 and u2, the statement u1 + u2 could imply that u1 and u2 are strings, </w:t>
+      </w:r>
+      <w:proofErr w:type="spellStart"/>
+      <w:r>
+        <w:t>ints</w:t>
+      </w:r>
+      <w:proofErr w:type="spellEnd"/>
+      <w:r>
+        <w:t>, floats, lists, tuples so how can we implement this operator.</w:t>
+      </w:r>
+    </w:p>
+    <w:p>
+      <w:r>
+        <w:t xml:space="preserve">Theoretically speaking, at best we are determining the type of a (universal) object based on how that object is treated in the code and what functions and operations are applied to it. At best a perfect solution seems to me like it would essentially be a glorified </w:t>
+      </w:r>
+      <w:proofErr w:type="gramStart"/>
+      <w:r>
+        <w:t>type</w:t>
+      </w:r>
+      <w:proofErr w:type="gramEnd"/>
+      <w:r>
+        <w:t xml:space="preserve"> inference algorithm.</w:t>
       </w:r>
     </w:p>
     <w:p/>
@@ -505,7 +987,15 @@
     <w:p>
       <w:r>
         <w:lastRenderedPageBreak/>
-        <w:t>See if func argument is callable, raise exception and print that the code is using callbacks which are not currently supported</w:t>
+        <w:t xml:space="preserve">See if </w:t>
+      </w:r>
+      <w:proofErr w:type="spellStart"/>
+      <w:r>
+        <w:t>func</w:t>
+      </w:r>
+      <w:proofErr w:type="spellEnd"/>
+      <w:r>
+        <w:t xml:space="preserve"> argument is callable, raise exception and print that the code is using callbacks which are not currently supported</w:t>
       </w:r>
     </w:p>
     <w:p/>
@@ -527,13 +1017,31 @@
         <w:t xml:space="preserve">classes </w:t>
       </w:r>
       <w:r>
-        <w:t>for 2 stack implementation</w:t>
-      </w:r>
-    </w:p>
-    <w:p>
-      <w:r>
-        <w:t>The fuzzer should :</w:t>
-      </w:r>
+        <w:t xml:space="preserve">for 2 stack </w:t>
+      </w:r>
+      <w:proofErr w:type="gramStart"/>
+      <w:r>
+        <w:t>implementation</w:t>
+      </w:r>
+      <w:proofErr w:type="gramEnd"/>
+    </w:p>
+    <w:p>
+      <w:r>
+        <w:t xml:space="preserve">The </w:t>
+      </w:r>
+      <w:proofErr w:type="spellStart"/>
+      <w:r>
+        <w:t>fuzzer</w:t>
+      </w:r>
+      <w:proofErr w:type="spellEnd"/>
+      <w:r>
+        <w:t xml:space="preserve"> </w:t>
+      </w:r>
+      <w:proofErr w:type="gramStart"/>
+      <w:r>
+        <w:t>should :</w:t>
+      </w:r>
+      <w:proofErr w:type="gramEnd"/>
     </w:p>
     <w:p>
       <w:r>
@@ -553,12 +1061,36 @@
     <w:p/>
     <w:p>
       <w:r>
-        <w:t>Added arg/kwarg support for fuzz testing strategy</w:t>
-      </w:r>
-    </w:p>
-    <w:p>
-      <w:r>
-        <w:t>Wrote basic first class equivalence tester</w:t>
+        <w:t xml:space="preserve">Added </w:t>
+      </w:r>
+      <w:proofErr w:type="spellStart"/>
+      <w:r>
+        <w:t>arg</w:t>
+      </w:r>
+      <w:proofErr w:type="spellEnd"/>
+      <w:r>
+        <w:t>/</w:t>
+      </w:r>
+      <w:proofErr w:type="spellStart"/>
+      <w:r>
+        <w:t>kwarg</w:t>
+      </w:r>
+      <w:proofErr w:type="spellEnd"/>
+      <w:r>
+        <w:t xml:space="preserve"> support for fuzz testing strategy</w:t>
+      </w:r>
+    </w:p>
+    <w:p>
+      <w:r>
+        <w:t xml:space="preserve">Wrote basic </w:t>
+      </w:r>
+      <w:proofErr w:type="gramStart"/>
+      <w:r>
+        <w:t>first class</w:t>
+      </w:r>
+      <w:proofErr w:type="gramEnd"/>
+      <w:r>
+        <w:t xml:space="preserve"> equivalence tester</w:t>
       </w:r>
     </w:p>
     <w:p>
@@ -578,12 +1110,36 @@
     </w:p>
     <w:p>
       <w:r>
-        <w:t>I have tried applying this equivalence tester to small refactors in real classes from open sources repos such as openai but have struggled to find working examples. My equivalence tester is quite situational. Method name/signature refactors and external dependencies cause issues</w:t>
-      </w:r>
-    </w:p>
-    <w:p>
-      <w:r>
-        <w:t>Tested it on two stack implementations, one that throws index error if you try to peek or pop and empty stack, and one that returns None for these operations. The fuzzer was able to pick up on this difference immediately</w:t>
+        <w:t xml:space="preserve">I have tried applying this equivalence tester to small refactors in real classes from open sources repos such as </w:t>
+      </w:r>
+      <w:proofErr w:type="spellStart"/>
+      <w:r>
+        <w:t>openai</w:t>
+      </w:r>
+      <w:proofErr w:type="spellEnd"/>
+      <w:r>
+        <w:t xml:space="preserve"> but have struggled to find working examples. My equivalence tester is quite situational. Method name/signature </w:t>
+      </w:r>
+      <w:proofErr w:type="gramStart"/>
+      <w:r>
+        <w:t>refactors</w:t>
+      </w:r>
+      <w:proofErr w:type="gramEnd"/>
+      <w:r>
+        <w:t xml:space="preserve"> and external dependencies cause issues</w:t>
+      </w:r>
+    </w:p>
+    <w:p>
+      <w:r>
+        <w:t xml:space="preserve">Tested it on two stack implementations, one that throws index error if you try to peek or pop and empty stack, and one that returns None for these operations. The </w:t>
+      </w:r>
+      <w:proofErr w:type="spellStart"/>
+      <w:r>
+        <w:t>fuzzer</w:t>
+      </w:r>
+      <w:proofErr w:type="spellEnd"/>
+      <w:r>
+        <w:t xml:space="preserve"> was able to pick up on this difference immediately</w:t>
       </w:r>
     </w:p>
     <w:p/>
@@ -619,7 +1175,7 @@
                     <pic:cNvPicPr/>
                   </pic:nvPicPr>
                   <pic:blipFill>
-                    <a:blip r:embed="rId10"/>
+                    <a:blip r:embed="rId9"/>
                     <a:stretch>
                       <a:fillRect/>
                     </a:stretch>
@@ -673,13 +1229,29 @@
     </w:p>
     <w:p>
       <w:r>
-        <w:t>What I mean by this is that currently, my code will test two classes for equivalence and if the classes have differing methods or even method names, the code will reject them. Allow the user to define a json file with the specific methods from the class that they want tested so they can exclude certain methods if they like, and optionally allow the user to also define specifically what arguments each method should be tested with.</w:t>
+        <w:t xml:space="preserve">What I mean by this is that currently, my code will test two classes for equivalence and if the classes have differing methods or even method names, the code will reject them. Allow the user to define a </w:t>
+      </w:r>
+      <w:proofErr w:type="spellStart"/>
+      <w:r>
+        <w:t>json</w:t>
+      </w:r>
+      <w:proofErr w:type="spellEnd"/>
+      <w:r>
+        <w:t xml:space="preserve"> file with the specific methods from the class that they want tested so they can exclude certain methods if they </w:t>
+      </w:r>
+      <w:proofErr w:type="gramStart"/>
+      <w:r>
+        <w:t>like, and</w:t>
+      </w:r>
+      <w:proofErr w:type="gramEnd"/>
+      <w:r>
+        <w:t xml:space="preserve"> optionally allow the user to also define specifically what arguments each method should be tested with.</w:t>
       </w:r>
     </w:p>
     <w:p/>
     <w:p/>
     <w:p>
-      <w:hyperlink r:id="rId11" w:history="1">
+      <w:hyperlink r:id="rId10" w:history="1">
         <w:r>
           <w:rPr>
             <w:rStyle w:val="Hyperlink"/>
@@ -714,7 +1286,15 @@
       </w:r>
       <w:r>
         <w:lastRenderedPageBreak/>
-        <w:t>duplicates, removing the need to fuzz both funcs. Useful in practice for speeding up a common case</w:t>
+        <w:t xml:space="preserve">duplicates, removing the need to fuzz both </w:t>
+      </w:r>
+      <w:proofErr w:type="spellStart"/>
+      <w:r>
+        <w:t>funcs</w:t>
+      </w:r>
+      <w:proofErr w:type="spellEnd"/>
+      <w:r>
+        <w:t>. Useful in practice for speeding up a common case</w:t>
       </w:r>
     </w:p>
     <w:p>
@@ -726,7 +1306,15 @@
         </w:numPr>
       </w:pPr>
       <w:r>
-        <w:t>Filter out funcs with no parameters and return values</w:t>
+        <w:t xml:space="preserve">Filter out </w:t>
+      </w:r>
+      <w:proofErr w:type="spellStart"/>
+      <w:r>
+        <w:t>funcs</w:t>
+      </w:r>
+      <w:proofErr w:type="spellEnd"/>
+      <w:r>
+        <w:t xml:space="preserve"> with no parameters and return values</w:t>
       </w:r>
     </w:p>
     <w:p>
@@ -738,7 +1326,15 @@
         </w:numPr>
       </w:pPr>
       <w:r>
-        <w:t>Possibly filter out funcs that invoke external classes or methods</w:t>
+        <w:t xml:space="preserve">Possibly filter out </w:t>
+      </w:r>
+      <w:proofErr w:type="spellStart"/>
+      <w:r>
+        <w:t>funcs</w:t>
+      </w:r>
+      <w:proofErr w:type="spellEnd"/>
+      <w:r>
+        <w:t xml:space="preserve"> that invoke external classes or methods</w:t>
       </w:r>
     </w:p>
     <w:p>
@@ -750,7 +1346,15 @@
         </w:numPr>
       </w:pPr>
       <w:r>
-        <w:t>They use pynguin which is a test generation framework that does not use fuzz testing</w:t>
+        <w:t xml:space="preserve">They use </w:t>
+      </w:r>
+      <w:proofErr w:type="spellStart"/>
+      <w:r>
+        <w:t>pynguin</w:t>
+      </w:r>
+      <w:proofErr w:type="spellEnd"/>
+      <w:r>
+        <w:t xml:space="preserve"> which is a test generation framework that does not use fuzz testing</w:t>
       </w:r>
     </w:p>
     <w:p>
@@ -770,7 +1374,15 @@
     </w:p>
     <w:p>
       <w:r>
-        <w:t>What if u have a class with 1 methods, a factory method which gives u back 3 methods</w:t>
+        <w:t xml:space="preserve">What if u have a class with 1 </w:t>
+      </w:r>
+      <w:proofErr w:type="gramStart"/>
+      <w:r>
+        <w:t>methods</w:t>
+      </w:r>
+      <w:proofErr w:type="gramEnd"/>
+      <w:r>
+        <w:t>, a factory method which gives u back 3 methods</w:t>
       </w:r>
     </w:p>
     <w:p>
@@ -792,7 +1404,7 @@
       </w:r>
     </w:p>
     <w:p>
-      <w:hyperlink r:id="rId12" w:history="1">
+      <w:hyperlink r:id="rId11" w:history="1">
         <w:r>
           <w:rPr>
             <w:rStyle w:val="Hyperlink"/>
@@ -803,13 +1415,29 @@
     </w:p>
     <w:p>
       <w:r>
-        <w:t>could instead go more practical, targeting datastructure implementations online</w:t>
+        <w:t xml:space="preserve">could instead go more practical, targeting </w:t>
+      </w:r>
+      <w:proofErr w:type="spellStart"/>
+      <w:r>
+        <w:t>datastructure</w:t>
+      </w:r>
+      <w:proofErr w:type="spellEnd"/>
+      <w:r>
+        <w:t xml:space="preserve"> implementations online</w:t>
       </w:r>
     </w:p>
     <w:p/>
     <w:p>
       <w:r>
-        <w:t xml:space="preserve">For function-function verification: I am currently implementing the case where both functions return (create) a new function. In this case I want to then perform the same function-function verification on these two new returned functions. The problem is the hypofuzz does not exactly allow for a recursive implementation like this. </w:t>
+        <w:t xml:space="preserve">For function-function verification: I am currently implementing the case where both functions return (create) a new function. In this case I want to then perform the same function-function verification on these two new returned functions. The problem is the </w:t>
+      </w:r>
+      <w:proofErr w:type="spellStart"/>
+      <w:r>
+        <w:t>hypofuzz</w:t>
+      </w:r>
+      <w:proofErr w:type="spellEnd"/>
+      <w:r>
+        <w:t xml:space="preserve"> does not exactly allow for a recursive implementation like this. </w:t>
       </w:r>
     </w:p>
     <w:p>
@@ -854,7 +1482,37 @@
         <w:rPr>
           <w:iCs/>
         </w:rPr>
-        <w:t>Other than this issue, another issue is trying to reason with functions that take callable parameters. Cant exactly fuzz a function as an input so im not sure what to do here</w:t>
+        <w:t xml:space="preserve">Other than this issue, another issue is trying to reason with functions that take callable parameters. </w:t>
+      </w:r>
+      <w:proofErr w:type="spellStart"/>
+      <w:proofErr w:type="gramStart"/>
+      <w:r>
+        <w:rPr>
+          <w:iCs/>
+        </w:rPr>
+        <w:t>Cant</w:t>
+      </w:r>
+      <w:proofErr w:type="spellEnd"/>
+      <w:proofErr w:type="gramEnd"/>
+      <w:r>
+        <w:rPr>
+          <w:iCs/>
+        </w:rPr>
+        <w:t xml:space="preserve"> exactly fuzz a function as an input so </w:t>
+      </w:r>
+      <w:proofErr w:type="spellStart"/>
+      <w:r>
+        <w:rPr>
+          <w:iCs/>
+        </w:rPr>
+        <w:t>im</w:t>
+      </w:r>
+      <w:proofErr w:type="spellEnd"/>
+      <w:r>
+        <w:rPr>
+          <w:iCs/>
+        </w:rPr>
+        <w:t xml:space="preserve"> not sure what to do here</w:t>
       </w:r>
       <w:r>
         <w:rPr>
@@ -872,6 +1530,7 @@
       <w:r>
         <w:rPr>
           <w:iCs/>
+          <w:noProof/>
         </w:rPr>
         <w:lastRenderedPageBreak/>
         <w:drawing>
@@ -890,7 +1549,7 @@
                     <pic:cNvPicPr/>
                   </pic:nvPicPr>
                   <pic:blipFill>
-                    <a:blip r:embed="rId13"/>
+                    <a:blip r:embed="rId12"/>
                     <a:stretch>
                       <a:fillRect/>
                     </a:stretch>
@@ -921,26 +1580,368 @@
         <w:rPr>
           <w:iCs/>
         </w:rPr>
-        <w:t>Using universal strategy + dummy functions (the testing framework doesn’t know that the function arg is necessarily callable so it uses universal strategy) it takes 11 minutes to find the difference in call_nested_param_ineq</w:t>
-      </w:r>
-      <w:r>
-        <w:rPr>
-          <w:iCs/>
-        </w:rPr>
-        <w:t>. Chances are, with type annotations this will be a bit faster as the tester will start passing in more callable args from the start</w:t>
-      </w:r>
-    </w:p>
-    <w:p>
-      <w:pPr>
-        <w:rPr>
-          <w:iCs/>
-        </w:rPr>
-      </w:pPr>
-      <w:r>
-        <w:rPr>
-          <w:iCs/>
-        </w:rPr>
-        <w:t>Adding a mechanism to see if an arg is “called” within a function should be pretty easy and should greatly improve time efficiency</w:t>
+        <w:t xml:space="preserve">Using universal strategy + dummy functions (the testing framework doesn’t know that the function </w:t>
+      </w:r>
+      <w:proofErr w:type="spellStart"/>
+      <w:r>
+        <w:rPr>
+          <w:iCs/>
+        </w:rPr>
+        <w:t>arg</w:t>
+      </w:r>
+      <w:proofErr w:type="spellEnd"/>
+      <w:r>
+        <w:rPr>
+          <w:iCs/>
+        </w:rPr>
+        <w:t xml:space="preserve"> is necessarily </w:t>
+      </w:r>
+      <w:proofErr w:type="gramStart"/>
+      <w:r>
+        <w:rPr>
+          <w:iCs/>
+        </w:rPr>
+        <w:t>callable</w:t>
+      </w:r>
+      <w:proofErr w:type="gramEnd"/>
+      <w:r>
+        <w:rPr>
+          <w:iCs/>
+        </w:rPr>
+        <w:t xml:space="preserve"> so it uses universal strategy) it takes 11 minutes to find the difference in </w:t>
+      </w:r>
+      <w:proofErr w:type="spellStart"/>
+      <w:r>
+        <w:rPr>
+          <w:iCs/>
+        </w:rPr>
+        <w:t>call_nested_param_ineq</w:t>
+      </w:r>
+      <w:proofErr w:type="spellEnd"/>
+      <w:r>
+        <w:rPr>
+          <w:iCs/>
+        </w:rPr>
+        <w:t xml:space="preserve">. Chances are, with type annotations this will be a bit faster as the tester will start passing in more callable </w:t>
+      </w:r>
+      <w:proofErr w:type="spellStart"/>
+      <w:r>
+        <w:rPr>
+          <w:iCs/>
+        </w:rPr>
+        <w:t>args</w:t>
+      </w:r>
+      <w:proofErr w:type="spellEnd"/>
+      <w:r>
+        <w:rPr>
+          <w:iCs/>
+        </w:rPr>
+        <w:t xml:space="preserve"> from the start</w:t>
+      </w:r>
+    </w:p>
+    <w:p>
+      <w:pPr>
+        <w:rPr>
+          <w:iCs/>
+        </w:rPr>
+      </w:pPr>
+      <w:r>
+        <w:rPr>
+          <w:iCs/>
+        </w:rPr>
+        <w:t xml:space="preserve">Adding a mechanism to see if an </w:t>
+      </w:r>
+      <w:proofErr w:type="spellStart"/>
+      <w:r>
+        <w:rPr>
+          <w:iCs/>
+        </w:rPr>
+        <w:t>arg</w:t>
+      </w:r>
+      <w:proofErr w:type="spellEnd"/>
+      <w:r>
+        <w:rPr>
+          <w:iCs/>
+        </w:rPr>
+        <w:t xml:space="preserve"> is “called” within a function should be </w:t>
+      </w:r>
+      <w:proofErr w:type="gramStart"/>
+      <w:r>
+        <w:rPr>
+          <w:iCs/>
+        </w:rPr>
+        <w:t>pretty easy</w:t>
+      </w:r>
+      <w:proofErr w:type="gramEnd"/>
+      <w:r>
+        <w:rPr>
+          <w:iCs/>
+        </w:rPr>
+        <w:t xml:space="preserve"> and should greatly improve time efficiency</w:t>
+      </w:r>
+    </w:p>
+    <w:p>
+      <w:pPr>
+        <w:rPr>
+          <w:iCs/>
+        </w:rPr>
+      </w:pPr>
+    </w:p>
+    <w:p>
+      <w:pPr>
+        <w:rPr>
+          <w:iCs/>
+        </w:rPr>
+      </w:pPr>
+      <w:r>
+        <w:rPr>
+          <w:iCs/>
+        </w:rPr>
+        <w:t xml:space="preserve">To be as faithful to the theory: we need to complicate/generalise </w:t>
+      </w:r>
+      <w:proofErr w:type="gramStart"/>
+      <w:r>
+        <w:rPr>
+          <w:iCs/>
+        </w:rPr>
+        <w:t>f(</w:t>
+      </w:r>
+      <w:proofErr w:type="gramEnd"/>
+      <w:r>
+        <w:rPr>
+          <w:iCs/>
+        </w:rPr>
+        <w:t>) so it can call any function it knows. Bound things, we don’t want more than 2 recursive calls, more than etc.</w:t>
+      </w:r>
+    </w:p>
+    <w:p>
+      <w:pPr>
+        <w:rPr>
+          <w:iCs/>
+        </w:rPr>
+      </w:pPr>
+      <w:r>
+        <w:rPr>
+          <w:iCs/>
+        </w:rPr>
+        <w:t>Otherwise keep things in a more constrained set of traces. No more than x recursions, only enter functions that have been called before</w:t>
+      </w:r>
+      <w:r>
+        <w:rPr>
+          <w:iCs/>
+        </w:rPr>
+        <w:t>.</w:t>
+      </w:r>
+    </w:p>
+    <w:p>
+      <w:pPr>
+        <w:rPr>
+          <w:iCs/>
+        </w:rPr>
+      </w:pPr>
+      <w:r>
+        <w:rPr>
+          <w:iCs/>
+        </w:rPr>
+        <w:t>Generalise f to have a first order type</w:t>
+      </w:r>
+    </w:p>
+    <w:p>
+      <w:pPr>
+        <w:rPr>
+          <w:iCs/>
+        </w:rPr>
+      </w:pPr>
+      <w:r>
+        <w:rPr>
+          <w:iCs/>
+        </w:rPr>
+        <w:t>Testing higher order functions independently might not work</w:t>
+      </w:r>
+    </w:p>
+    <w:p>
+      <w:pPr>
+        <w:rPr>
+          <w:iCs/>
+        </w:rPr>
+      </w:pPr>
+      <w:r>
+        <w:rPr>
+          <w:iCs/>
+        </w:rPr>
+        <w:t xml:space="preserve">Learning functions and interleaving calls of functions </w:t>
+      </w:r>
+    </w:p>
+    <w:p>
+      <w:pPr>
+        <w:rPr>
+          <w:iCs/>
+        </w:rPr>
+      </w:pPr>
+      <w:r>
+        <w:rPr>
+          <w:iCs/>
+        </w:rPr>
+        <w:t xml:space="preserve">If I have time, extend </w:t>
+      </w:r>
+      <w:proofErr w:type="gramStart"/>
+      <w:r>
+        <w:rPr>
+          <w:iCs/>
+        </w:rPr>
+        <w:t>f(</w:t>
+      </w:r>
+      <w:proofErr w:type="gramEnd"/>
+      <w:r>
+        <w:rPr>
+          <w:iCs/>
+        </w:rPr>
+        <w:t>) functions to take and return numbers</w:t>
+      </w:r>
+    </w:p>
+    <w:p>
+      <w:pPr>
+        <w:rPr>
+          <w:iCs/>
+        </w:rPr>
+      </w:pPr>
+      <w:r>
+        <w:rPr>
+          <w:iCs/>
+        </w:rPr>
+        <w:t xml:space="preserve">Then I can look at test suites, try it out in some application areas where equivalence is important, </w:t>
+      </w:r>
+      <w:proofErr w:type="gramStart"/>
+      <w:r>
+        <w:rPr>
+          <w:iCs/>
+        </w:rPr>
+        <w:t>property based</w:t>
+      </w:r>
+      <w:proofErr w:type="gramEnd"/>
+      <w:r>
+        <w:rPr>
+          <w:iCs/>
+        </w:rPr>
+        <w:t xml:space="preserve"> testing test suite and run with my pipeline.</w:t>
+      </w:r>
+    </w:p>
+    <w:p>
+      <w:pPr>
+        <w:rPr>
+          <w:iCs/>
+        </w:rPr>
+      </w:pPr>
+      <w:r>
+        <w:rPr>
+          <w:iCs/>
+        </w:rPr>
+        <w:t>Look at hobbit suite then mutation testing</w:t>
+      </w:r>
+    </w:p>
+    <w:p>
+      <w:pPr>
+        <w:rPr>
+          <w:b/>
+          <w:bCs/>
+          <w:iCs/>
+        </w:rPr>
+      </w:pPr>
+      <w:r>
+        <w:rPr>
+          <w:b/>
+          <w:bCs/>
+          <w:iCs/>
+        </w:rPr>
+        <w:t>Mutation testing: test my test suite, if I only have time for 1 testing thing do this.</w:t>
+      </w:r>
+      <w:r>
+        <w:rPr>
+          <w:b/>
+          <w:bCs/>
+          <w:iCs/>
+        </w:rPr>
+        <w:t xml:space="preserve"> Throw away equivalent mutants and only look for inequivalent mutants.</w:t>
+      </w:r>
+    </w:p>
+    <w:p>
+      <w:pPr>
+        <w:rPr>
+          <w:b/>
+          <w:bCs/>
+          <w:iCs/>
+        </w:rPr>
+      </w:pPr>
+      <w:r>
+        <w:rPr>
+          <w:b/>
+          <w:bCs/>
+          <w:iCs/>
+        </w:rPr>
+        <w:t xml:space="preserve">Pass a </w:t>
+      </w:r>
+      <w:proofErr w:type="spellStart"/>
+      <w:r>
+        <w:rPr>
+          <w:b/>
+          <w:bCs/>
+          <w:iCs/>
+        </w:rPr>
+        <w:t>datastruct</w:t>
+      </w:r>
+      <w:proofErr w:type="spellEnd"/>
+      <w:r>
+        <w:rPr>
+          <w:b/>
+          <w:bCs/>
+          <w:iCs/>
+        </w:rPr>
+        <w:t xml:space="preserve"> library thru a mutation testing suite to see how it performs against my pipeline, try to find examples my pipeline can find that the existing suite </w:t>
+      </w:r>
+      <w:proofErr w:type="gramStart"/>
+      <w:r>
+        <w:rPr>
+          <w:b/>
+          <w:bCs/>
+          <w:iCs/>
+        </w:rPr>
+        <w:t>cant</w:t>
+      </w:r>
+      <w:proofErr w:type="gramEnd"/>
+    </w:p>
+    <w:p>
+      <w:pPr>
+        <w:rPr>
+          <w:b/>
+          <w:bCs/>
+          <w:iCs/>
+        </w:rPr>
+      </w:pPr>
+      <w:r>
+        <w:rPr>
+          <w:b/>
+          <w:bCs/>
+          <w:iCs/>
+        </w:rPr>
+        <w:t xml:space="preserve">Look at </w:t>
+      </w:r>
+      <w:proofErr w:type="gramStart"/>
+      <w:r>
+        <w:rPr>
+          <w:b/>
+          <w:bCs/>
+          <w:iCs/>
+        </w:rPr>
+        <w:t>open source</w:t>
+      </w:r>
+      <w:proofErr w:type="gramEnd"/>
+      <w:r>
+        <w:rPr>
+          <w:b/>
+          <w:bCs/>
+          <w:iCs/>
+        </w:rPr>
+        <w:t xml:space="preserve"> library with tests at the end</w:t>
       </w:r>
     </w:p>
     <w:p/>
@@ -956,6 +1957,7 @@
     </w:p>
     <w:p>
       <w:r>
+        <w:lastRenderedPageBreak/>
         <w:t>How do we treat python default/optional arguments?</w:t>
       </w:r>
     </w:p>

</xml_diff>

<commit_message>
Add scipt to run incomplete hobbit suite
</commit_message>
<xml_diff>
--- a/Masters project notes.docx
+++ b/Masters project notes.docx
@@ -53,19 +53,11 @@
           <w:lang w:val="fr-FR"/>
         </w:rPr>
       </w:pPr>
-      <w:proofErr w:type="spellStart"/>
       <w:r>
         <w:rPr>
           <w:lang w:val="fr-FR"/>
         </w:rPr>
-        <w:t>Pythonfuzz</w:t>
-      </w:r>
-      <w:proofErr w:type="spellEnd"/>
-      <w:r>
-        <w:rPr>
-          <w:lang w:val="fr-FR"/>
-        </w:rPr>
-        <w:t xml:space="preserve"> </w:t>
+        <w:t xml:space="preserve">Pythonfuzz </w:t>
       </w:r>
       <w:hyperlink r:id="rId6" w:history="1">
         <w:r>
@@ -86,15 +78,7 @@
         </w:numPr>
       </w:pPr>
       <w:r>
-        <w:t xml:space="preserve">Coverage-guided </w:t>
-      </w:r>
-      <w:proofErr w:type="spellStart"/>
-      <w:r>
-        <w:t>fuzzer</w:t>
-      </w:r>
-      <w:proofErr w:type="spellEnd"/>
-      <w:r>
-        <w:t xml:space="preserve"> for python</w:t>
+        <w:t>Coverage-guided fuzzer for python</w:t>
       </w:r>
     </w:p>
     <w:p>
@@ -126,15 +110,7 @@
         </w:numPr>
       </w:pPr>
       <w:r>
-        <w:t xml:space="preserve">Google’s coverage-guided </w:t>
-      </w:r>
-      <w:proofErr w:type="spellStart"/>
-      <w:r>
-        <w:t>fuzzer</w:t>
-      </w:r>
-      <w:proofErr w:type="spellEnd"/>
-      <w:r>
-        <w:t xml:space="preserve"> for python</w:t>
+        <w:t>Google’s coverage-guided fuzzer for python</w:t>
       </w:r>
     </w:p>
     <w:p>
@@ -154,28 +130,15 @@
         </w:rPr>
         <w:t xml:space="preserve">HypoFuzz </w:t>
       </w:r>
-      <w:r>
-        <w:fldChar w:fldCharType="begin"/>
-      </w:r>
-      <w:r>
-        <w:rPr>
-          <w:lang w:val="de-DE"/>
-        </w:rPr>
-        <w:instrText>HYPERLINK "https://github.com/Zac-HD/hypofuzz"</w:instrText>
-      </w:r>
-      <w:r>
-        <w:fldChar w:fldCharType="separate"/>
-      </w:r>
-      <w:r>
-        <w:rPr>
-          <w:rStyle w:val="Hyperlink"/>
-          <w:lang w:val="de-DE"/>
-        </w:rPr>
-        <w:t>https://github.com/Zac-HD/hypofuzz</w:t>
-      </w:r>
-      <w:r>
-        <w:fldChar w:fldCharType="end"/>
-      </w:r>
+      <w:hyperlink r:id="rId8" w:history="1">
+        <w:r>
+          <w:rPr>
+            <w:rStyle w:val="Hyperlink"/>
+            <w:lang w:val="de-DE"/>
+          </w:rPr>
+          <w:t>https://github.com/Zac-HD/hypofuzz</w:t>
+        </w:r>
+      </w:hyperlink>
     </w:p>
     <w:p>
       <w:pPr>
@@ -200,15 +163,10 @@
           <w:numId w:val="1"/>
         </w:numPr>
       </w:pPr>
-      <w:proofErr w:type="spellStart"/>
-      <w:r>
-        <w:t>CrossHair</w:t>
-      </w:r>
-      <w:proofErr w:type="spellEnd"/>
-      <w:r>
-        <w:t xml:space="preserve"> </w:t>
-      </w:r>
-      <w:hyperlink r:id="rId8" w:history="1">
+      <w:r>
+        <w:t xml:space="preserve">CrossHair </w:t>
+      </w:r>
+      <w:hyperlink r:id="rId9" w:history="1">
         <w:r>
           <w:rPr>
             <w:rStyle w:val="Hyperlink"/>
@@ -231,39 +189,7 @@
     </w:p>
     <w:p>
       <w:r>
-        <w:t xml:space="preserve">From my research, Hypothesis + </w:t>
-      </w:r>
-      <w:proofErr w:type="spellStart"/>
-      <w:r>
-        <w:t>HypoFuzz</w:t>
-      </w:r>
-      <w:proofErr w:type="spellEnd"/>
-      <w:r>
-        <w:t xml:space="preserve"> seems like it achieves everything that JQF does. Hypothesis is heavily inspired by </w:t>
-      </w:r>
-      <w:proofErr w:type="spellStart"/>
-      <w:r>
-        <w:t>QuickCheck</w:t>
-      </w:r>
-      <w:proofErr w:type="spellEnd"/>
-      <w:r>
-        <w:t xml:space="preserve"> and gives a property-based testing framework for python. It generates structured inputs and saves failing inputs for reproduction. It operates on the semantic properties of a program, making it inherently </w:t>
-      </w:r>
-      <w:proofErr w:type="gramStart"/>
-      <w:r>
-        <w:t>semantic-based</w:t>
-      </w:r>
-      <w:proofErr w:type="gramEnd"/>
-      <w:r>
-        <w:t xml:space="preserve">. It is not coverage-guided by default, so </w:t>
-      </w:r>
-      <w:proofErr w:type="spellStart"/>
-      <w:r>
-        <w:t>HypoFuzz</w:t>
-      </w:r>
-      <w:proofErr w:type="spellEnd"/>
-      <w:r>
-        <w:t xml:space="preserve"> extends it for coverage-guided exploration thus providing a fuzzing framework.</w:t>
+        <w:t>From my research, Hypothesis + HypoFuzz seems like it achieves everything that JQF does. Hypothesis is heavily inspired by QuickCheck and gives a property-based testing framework for python. It generates structured inputs and saves failing inputs for reproduction. It operates on the semantic properties of a program, making it inherently semantic-based. It is not coverage-guided by default, so HypoFuzz extends it for coverage-guided exploration thus providing a fuzzing framework.</w:t>
       </w:r>
     </w:p>
     <w:p/>
@@ -282,28 +208,15 @@
     </w:p>
     <w:p>
       <w:r>
-        <w:t>Generalise the stack example to any data structure/</w:t>
-      </w:r>
-      <w:proofErr w:type="spellStart"/>
-      <w:r>
-        <w:t>api</w:t>
-      </w:r>
-      <w:proofErr w:type="spellEnd"/>
+        <w:t>Generalise the stack example to any data structure/api</w:t>
+      </w:r>
       <w:r>
         <w:t xml:space="preserve"> that can take any type of arguments.</w:t>
       </w:r>
     </w:p>
     <w:p>
       <w:r>
-        <w:t xml:space="preserve">At some point, see if you can read the python script, create AST and traverse it </w:t>
-      </w:r>
-      <w:proofErr w:type="gramStart"/>
-      <w:r>
-        <w:t>in order to</w:t>
-      </w:r>
-      <w:proofErr w:type="gramEnd"/>
-      <w:r>
-        <w:t xml:space="preserve"> create the right test.</w:t>
+        <w:t>At some point, see if you can read the python script, create AST and traverse it in order to create the right test.</w:t>
       </w:r>
     </w:p>
     <w:p/>
@@ -317,58 +230,18 @@
         <w:t xml:space="preserve">Using it to test a very simple summing function </w:t>
       </w:r>
       <w:r>
-        <w:t xml:space="preserve">doesn’t work very well. I believe because of how universal is configured and how my two simple functions are configured, </w:t>
-      </w:r>
-      <w:proofErr w:type="spellStart"/>
-      <w:r>
-        <w:t>atheris</w:t>
-      </w:r>
-      <w:proofErr w:type="spellEnd"/>
-      <w:r>
-        <w:t xml:space="preserve"> is unable to quickly find the erroneous input.</w:t>
-      </w:r>
-    </w:p>
-    <w:p>
-      <w:r>
-        <w:t xml:space="preserve">I think the fact that fuzz testing is obfuscated inside the universal object the module is unable to correctly perform its algorithms to find erroneous inputs. I vibe coded a </w:t>
-      </w:r>
-      <w:proofErr w:type="spellStart"/>
-      <w:r>
-        <w:t>hypofuzz</w:t>
-      </w:r>
-      <w:proofErr w:type="spellEnd"/>
-      <w:r>
-        <w:t xml:space="preserve"> universal object </w:t>
-      </w:r>
-      <w:proofErr w:type="gramStart"/>
-      <w:r>
-        <w:t>and also</w:t>
-      </w:r>
-      <w:proofErr w:type="gramEnd"/>
-      <w:r>
-        <w:t xml:space="preserve"> tried manually implementing one and couldn’t get it to spot any bugs but given more time there may be a way to implement this. Just haven’t figured it out yet.</w:t>
+        <w:t>doesn’t work very well. I believe because of how universal is configured and how my two simple functions are configured, atheris is unable to quickly find the erroneous input.</w:t>
+      </w:r>
+    </w:p>
+    <w:p>
+      <w:r>
+        <w:t>I think the fact that fuzz testing is obfuscated inside the universal object the module is unable to correctly perform its algorithms to find erroneous inputs. I vibe coded a hypofuzz universal object and also tried manually implementing one and couldn’t get it to spot any bugs but given more time there may be a way to implement this. Just haven’t figured it out yet.</w:t>
       </w:r>
     </w:p>
     <w:p>
       <w:r>
         <w:lastRenderedPageBreak/>
-        <w:t xml:space="preserve">When comparing two different sorting algorithms, </w:t>
-      </w:r>
-      <w:proofErr w:type="spellStart"/>
-      <w:r>
-        <w:t>hypofuzz</w:t>
-      </w:r>
-      <w:proofErr w:type="spellEnd"/>
-      <w:r>
-        <w:t xml:space="preserve"> was unable to spot the difference when I added a small condition to quicksort if length is &gt;= 6, return the reversed list. For these </w:t>
-      </w:r>
-      <w:proofErr w:type="gramStart"/>
-      <w:r>
-        <w:t>one off</w:t>
-      </w:r>
-      <w:proofErr w:type="gramEnd"/>
-      <w:r>
-        <w:t xml:space="preserve"> conditions, coverage guidance actually makes it harder to spot the difference, as they provide very little feedback. Plain hypothesis was able to catch this bug (without coverage guidance)</w:t>
+        <w:t>When comparing two different sorting algorithms, hypofuzz was unable to spot the difference when I added a small condition to quicksort if length is &gt;= 6, return the reversed list. For these one off conditions, coverage guidance actually makes it harder to spot the difference, as they provide very little feedback. Plain hypothesis was able to catch this bug (without coverage guidance)</w:t>
       </w:r>
     </w:p>
     <w:p>
@@ -387,57 +260,12 @@
     </w:p>
     <w:p>
       <w:r>
-        <w:t xml:space="preserve">Testing universal object on two sorting algorithms always results in empty lists as universals value gets set to empty list if </w:t>
-      </w:r>
-      <w:proofErr w:type="spellStart"/>
-      <w:proofErr w:type="gramStart"/>
-      <w:r>
-        <w:t>len</w:t>
-      </w:r>
-      <w:proofErr w:type="spellEnd"/>
-      <w:r>
-        <w:t>(</w:t>
-      </w:r>
-      <w:proofErr w:type="gramEnd"/>
-      <w:r>
-        <w:t xml:space="preserve">) is called on it. This is </w:t>
-      </w:r>
-      <w:proofErr w:type="spellStart"/>
-      <w:r>
-        <w:t>bcos</w:t>
-      </w:r>
-      <w:proofErr w:type="spellEnd"/>
-      <w:r>
-        <w:t xml:space="preserve"> if we initialise it as a list of universals, this may be wrong as it may be intended to be a string. </w:t>
-      </w:r>
-    </w:p>
-    <w:p>
-      <w:r>
-        <w:t xml:space="preserve">Universal needs </w:t>
-      </w:r>
-      <w:proofErr w:type="spellStart"/>
-      <w:r>
-        <w:t>lt</w:t>
-      </w:r>
-      <w:proofErr w:type="spellEnd"/>
-      <w:r>
-        <w:t xml:space="preserve">, </w:t>
-      </w:r>
-      <w:proofErr w:type="spellStart"/>
-      <w:r>
-        <w:t>gt</w:t>
-      </w:r>
-      <w:proofErr w:type="spellEnd"/>
-      <w:r>
-        <w:t xml:space="preserve">, le, </w:t>
-      </w:r>
-      <w:proofErr w:type="spellStart"/>
-      <w:r>
-        <w:t>ge</w:t>
-      </w:r>
-      <w:proofErr w:type="spellEnd"/>
-      <w:r>
-        <w:t xml:space="preserve"> operators define</w:t>
+        <w:t xml:space="preserve">Testing universal object on two sorting algorithms always results in empty lists as universals value gets set to empty list if len() is called on it. This is bcos if we initialise it as a list of universals, this may be wrong as it may be intended to be a string. </w:t>
+      </w:r>
+    </w:p>
+    <w:p>
+      <w:r>
+        <w:t>Universal needs lt, gt, le, ge operators define</w:t>
       </w:r>
       <w:r>
         <w:t>d</w:t>
@@ -451,99 +279,20 @@
         <w:t>Universal does not support item assignment</w:t>
       </w:r>
       <w:r>
-        <w:t xml:space="preserve"> </w:t>
-      </w:r>
-      <w:proofErr w:type="spellStart"/>
-      <w:r>
-        <w:t>e.g</w:t>
-      </w:r>
-      <w:proofErr w:type="spellEnd"/>
-      <w:r>
-        <w:t xml:space="preserve"> the line</w:t>
-      </w:r>
-    </w:p>
-    <w:p>
-      <w:proofErr w:type="spellStart"/>
-      <w:proofErr w:type="gramStart"/>
-      <w:r>
-        <w:t>arr</w:t>
-      </w:r>
-      <w:proofErr w:type="spellEnd"/>
-      <w:r>
-        <w:t>[</w:t>
-      </w:r>
-      <w:proofErr w:type="spellStart"/>
-      <w:proofErr w:type="gramEnd"/>
-      <w:r>
-        <w:t>i</w:t>
-      </w:r>
-      <w:proofErr w:type="spellEnd"/>
-      <w:r>
-        <w:t xml:space="preserve"> + 1], </w:t>
-      </w:r>
-      <w:proofErr w:type="spellStart"/>
-      <w:r>
-        <w:t>arr</w:t>
-      </w:r>
-      <w:proofErr w:type="spellEnd"/>
-      <w:r>
-        <w:t xml:space="preserve">[high] = </w:t>
-      </w:r>
-      <w:proofErr w:type="spellStart"/>
-      <w:r>
-        <w:t>arr</w:t>
-      </w:r>
-      <w:proofErr w:type="spellEnd"/>
-      <w:r>
-        <w:t xml:space="preserve">[high], </w:t>
-      </w:r>
-      <w:proofErr w:type="spellStart"/>
-      <w:r>
-        <w:t>arr</w:t>
-      </w:r>
-      <w:proofErr w:type="spellEnd"/>
-      <w:r>
-        <w:t>[</w:t>
-      </w:r>
-      <w:proofErr w:type="spellStart"/>
-      <w:r>
-        <w:t>i</w:t>
-      </w:r>
-      <w:proofErr w:type="spellEnd"/>
-      <w:r>
-        <w:t xml:space="preserve"> + 1]</w:t>
-      </w:r>
-    </w:p>
-    <w:p>
-      <w:r>
-        <w:t xml:space="preserve">does not work if </w:t>
-      </w:r>
-      <w:proofErr w:type="spellStart"/>
-      <w:r>
-        <w:t>arr</w:t>
-      </w:r>
-      <w:proofErr w:type="spellEnd"/>
-      <w:r>
-        <w:t xml:space="preserve"> is a universal and each element of </w:t>
-      </w:r>
-      <w:proofErr w:type="spellStart"/>
-      <w:r>
-        <w:t>arr</w:t>
-      </w:r>
-      <w:proofErr w:type="spellEnd"/>
-      <w:r>
-        <w:t xml:space="preserve"> is a universal</w:t>
-      </w:r>
-      <w:r>
-        <w:t xml:space="preserve"> I “</w:t>
-      </w:r>
-      <w:proofErr w:type="spellStart"/>
-      <w:r>
-        <w:t>vibecoded</w:t>
-      </w:r>
-      <w:proofErr w:type="spellEnd"/>
-      <w:r>
-        <w:t>” an implementation of this.</w:t>
+        <w:t xml:space="preserve"> e.g the line</w:t>
+      </w:r>
+    </w:p>
+    <w:p>
+      <w:r>
+        <w:t>arr[i + 1], arr[high] = arr[high], arr[i + 1]</w:t>
+      </w:r>
+    </w:p>
+    <w:p>
+      <w:r>
+        <w:t>does not work if arr is a universal and each element of arr is a universal</w:t>
+      </w:r>
+      <w:r>
+        <w:t xml:space="preserve"> I “vibecoded” an implementation of this.</w:t>
       </w:r>
     </w:p>
     <w:p>
@@ -559,36 +308,12 @@
     </w:p>
     <w:p>
       <w:r>
-        <w:t xml:space="preserve">Read </w:t>
-      </w:r>
-      <w:proofErr w:type="spellStart"/>
-      <w:r>
-        <w:t>TypeEvalPy</w:t>
-      </w:r>
-      <w:proofErr w:type="spellEnd"/>
-      <w:r>
-        <w:t xml:space="preserve"> to find good frameworks for function parameters.</w:t>
-      </w:r>
-    </w:p>
-    <w:p>
-      <w:r>
-        <w:t xml:space="preserve">Tried </w:t>
-      </w:r>
-      <w:proofErr w:type="spellStart"/>
-      <w:r>
-        <w:t>HeaderGen</w:t>
-      </w:r>
-      <w:proofErr w:type="spellEnd"/>
-      <w:r>
-        <w:t xml:space="preserve"> as it was apparently the best for all categories including function parameters. When I tried it, it would only infer function return types and not parameters. The </w:t>
-      </w:r>
-      <w:proofErr w:type="spellStart"/>
-      <w:r>
-        <w:t>github</w:t>
-      </w:r>
-      <w:proofErr w:type="spellEnd"/>
-      <w:r>
-        <w:t xml:space="preserve"> only mentions that it can resolve function return types and I could not figure out any way to get it to infer parameter types. </w:t>
+        <w:t>Read TypeEvalPy to find good frameworks for function parameters.</w:t>
+      </w:r>
+    </w:p>
+    <w:p>
+      <w:r>
+        <w:t xml:space="preserve">Tried HeaderGen as it was apparently the best for all categories including function parameters. When I tried it, it would only infer function return types and not parameters. The github only mentions that it can resolve function return types and I could not figure out any way to get it to infer parameter types. </w:t>
       </w:r>
     </w:p>
     <w:p>
@@ -642,103 +367,23 @@
         </w:numPr>
       </w:pPr>
       <w:r>
-        <w:t>Hypothesis/</w:t>
-      </w:r>
-      <w:proofErr w:type="spellStart"/>
-      <w:r>
-        <w:t>Hypofuzz</w:t>
-      </w:r>
-      <w:proofErr w:type="spellEnd"/>
-      <w:r>
-        <w:t xml:space="preserve"> “Strategies” are how you define what is passed </w:t>
-      </w:r>
-      <w:proofErr w:type="gramStart"/>
-      <w:r>
-        <w:t>in to</w:t>
-      </w:r>
-      <w:proofErr w:type="gramEnd"/>
-      <w:r>
-        <w:t xml:space="preserve"> the function you want to fuzz. </w:t>
-      </w:r>
-      <w:proofErr w:type="spellStart"/>
-      <w:r>
-        <w:t>E.g</w:t>
-      </w:r>
-      <w:proofErr w:type="spellEnd"/>
-      <w:r>
-        <w:t xml:space="preserve">  </w:t>
+        <w:t xml:space="preserve">Hypothesis/Hypofuzz “Strategies” are how you define what is passed in to the function you want to fuzz. E.g  </w:t>
       </w:r>
     </w:p>
     <w:p>
       <w:r>
         <w:lastRenderedPageBreak/>
-        <w:t>@given(</w:t>
-      </w:r>
-      <w:proofErr w:type="gramStart"/>
-      <w:r>
-        <w:t>st.lists</w:t>
-      </w:r>
-      <w:proofErr w:type="gramEnd"/>
-      <w:r>
-        <w:t xml:space="preserve">(st.integers() | </w:t>
-      </w:r>
-      <w:proofErr w:type="spellStart"/>
-      <w:r>
-        <w:t>st.floats</w:t>
-      </w:r>
-      <w:proofErr w:type="spellEnd"/>
-      <w:r>
-        <w:t>()))</w:t>
-      </w:r>
-    </w:p>
-    <w:p>
-      <w:r>
-        <w:t xml:space="preserve">def </w:t>
-      </w:r>
-      <w:proofErr w:type="spellStart"/>
-      <w:r>
-        <w:t>test_sort_correct</w:t>
-      </w:r>
-      <w:proofErr w:type="spellEnd"/>
-      <w:r>
-        <w:t>(</w:t>
-      </w:r>
-      <w:proofErr w:type="spellStart"/>
-      <w:r>
-        <w:t>lst</w:t>
-      </w:r>
-      <w:proofErr w:type="spellEnd"/>
-      <w:r>
-        <w:t>):</w:t>
-      </w:r>
-    </w:p>
-    <w:p>
-      <w:r>
-        <w:t xml:space="preserve">    assert(</w:t>
-      </w:r>
-      <w:proofErr w:type="spellStart"/>
-      <w:r>
-        <w:t>my_sort</w:t>
-      </w:r>
-      <w:proofErr w:type="spellEnd"/>
-      <w:r>
-        <w:t>(</w:t>
-      </w:r>
-      <w:proofErr w:type="spellStart"/>
-      <w:r>
-        <w:t>lst</w:t>
-      </w:r>
-      <w:proofErr w:type="spellEnd"/>
-      <w:r>
-        <w:t>) == sorted(</w:t>
-      </w:r>
-      <w:proofErr w:type="spellStart"/>
-      <w:r>
-        <w:t>lst</w:t>
-      </w:r>
-      <w:proofErr w:type="spellEnd"/>
-      <w:r>
-        <w:t>))</w:t>
+        <w:t>@given(st.lists(st.integers() | st.floats()))</w:t>
+      </w:r>
+    </w:p>
+    <w:p>
+      <w:r>
+        <w:t>def test_sort_correct(lst):</w:t>
+      </w:r>
+    </w:p>
+    <w:p>
+      <w:r>
+        <w:t xml:space="preserve">    assert(my_sort(lst) == sorted(lst))</w:t>
       </w:r>
     </w:p>
     <w:p>
@@ -750,23 +395,7 @@
         </w:numPr>
       </w:pPr>
       <w:r>
-        <w:t xml:space="preserve">In that code snippet, the strategy is to fuzz </w:t>
-      </w:r>
-      <w:proofErr w:type="spellStart"/>
-      <w:r>
-        <w:t>my_sort</w:t>
-      </w:r>
-      <w:proofErr w:type="spellEnd"/>
-      <w:r>
-        <w:t xml:space="preserve"> with inputs of type list[</w:t>
-      </w:r>
-      <w:proofErr w:type="spellStart"/>
-      <w:r>
-        <w:t>int|str</w:t>
-      </w:r>
-      <w:proofErr w:type="spellEnd"/>
-      <w:r>
-        <w:t>]</w:t>
+        <w:t>In that code snippet, the strategy is to fuzz my_sort with inputs of type list[int|str]</w:t>
       </w:r>
     </w:p>
     <w:p>
@@ -778,15 +407,7 @@
         </w:numPr>
       </w:pPr>
       <w:r>
-        <w:t xml:space="preserve">In the case of my universal strategy, I simply fuzz with a strategy that can be </w:t>
-      </w:r>
-      <w:proofErr w:type="spellStart"/>
-      <w:r>
-        <w:t>though</w:t>
-      </w:r>
-      <w:proofErr w:type="spellEnd"/>
-      <w:r>
-        <w:t xml:space="preserve"> of as the following:</w:t>
+        <w:t>In the case of my universal strategy, I simply fuzz with a strategy that can be though of as the following:</w:t>
       </w:r>
     </w:p>
     <w:p>
@@ -797,55 +418,8 @@
           <w:numId w:val="3"/>
         </w:numPr>
       </w:pPr>
-      <w:proofErr w:type="spellStart"/>
-      <w:r>
-        <w:t>strat</w:t>
-      </w:r>
-      <w:proofErr w:type="spellEnd"/>
-      <w:r>
-        <w:t xml:space="preserve"> = </w:t>
-      </w:r>
-      <w:proofErr w:type="spellStart"/>
-      <w:r>
-        <w:t>int|str|float|bool|None|list</w:t>
-      </w:r>
-      <w:proofErr w:type="spellEnd"/>
-      <w:r>
-        <w:t>[</w:t>
-      </w:r>
-      <w:proofErr w:type="spellStart"/>
-      <w:r>
-        <w:t>strat</w:t>
-      </w:r>
-      <w:proofErr w:type="spellEnd"/>
-      <w:r>
-        <w:t>]|</w:t>
-      </w:r>
-      <w:proofErr w:type="spellStart"/>
-      <w:r>
-        <w:t>dict</w:t>
-      </w:r>
-      <w:proofErr w:type="spellEnd"/>
-      <w:r>
-        <w:t>[</w:t>
-      </w:r>
-      <w:proofErr w:type="spellStart"/>
-      <w:proofErr w:type="gramStart"/>
-      <w:r>
-        <w:t>str,strat</w:t>
-      </w:r>
-      <w:proofErr w:type="spellEnd"/>
-      <w:proofErr w:type="gramEnd"/>
-      <w:r>
-        <w:t>]|tuple[</w:t>
-      </w:r>
-      <w:proofErr w:type="spellStart"/>
-      <w:r>
-        <w:t>strat</w:t>
-      </w:r>
-      <w:proofErr w:type="spellEnd"/>
-      <w:r>
-        <w:t>]</w:t>
+      <w:r>
+        <w:t>strat = int|str|float|bool|None|list[strat]|dict[str,strat]|tuple[strat]</w:t>
       </w:r>
     </w:p>
     <w:p>
@@ -857,15 +431,7 @@
         </w:numPr>
       </w:pPr>
       <w:r>
-        <w:t xml:space="preserve">I have logic implemented so that if we encounter a </w:t>
-      </w:r>
-      <w:proofErr w:type="spellStart"/>
-      <w:r>
-        <w:t>TypeError</w:t>
-      </w:r>
-      <w:proofErr w:type="spellEnd"/>
-      <w:r>
-        <w:t>, we discard the type that caused the error from the pool of possible types in our strategy for future iterations.</w:t>
+        <w:t>I have logic implemented so that if we encounter a TypeError, we discard the type that caused the error from the pool of possible types in our strategy for future iterations.</w:t>
       </w:r>
     </w:p>
     <w:p>
@@ -877,15 +443,7 @@
         </w:numPr>
       </w:pPr>
       <w:r>
-        <w:t xml:space="preserve">It seems to work </w:t>
-      </w:r>
-      <w:proofErr w:type="gramStart"/>
-      <w:r>
-        <w:t>fairly well</w:t>
-      </w:r>
-      <w:proofErr w:type="gramEnd"/>
-      <w:r>
-        <w:t xml:space="preserve"> for the simple tests I have performed so far</w:t>
+        <w:t>It seems to work fairly well for the simple tests I have performed so far</w:t>
       </w:r>
     </w:p>
     <w:p>
@@ -897,15 +455,7 @@
         </w:numPr>
       </w:pPr>
       <w:r>
-        <w:t xml:space="preserve">Because it essentially brute forces fuzzing with different types until it works, I can imagine this being quite slow for fuzzing complex functions with lots of </w:t>
-      </w:r>
-      <w:proofErr w:type="gramStart"/>
-      <w:r>
-        <w:t>arguments</w:t>
-      </w:r>
-      <w:proofErr w:type="gramEnd"/>
-      <w:r>
-        <w:t xml:space="preserve"> but this will have to be tested more</w:t>
+        <w:t>Because it essentially brute forces fuzzing with different types until it works, I can imagine this being quite slow for fuzzing complex functions with lots of arguments but this will have to be tested more</w:t>
       </w:r>
     </w:p>
     <w:p>
@@ -928,49 +478,17 @@
     </w:p>
     <w:p>
       <w:r>
-        <w:t xml:space="preserve">If we assume there isn’t any explicit casting in the function we are fuzzing, how would a universal handle a situation where the type is ambiguous </w:t>
-      </w:r>
-      <w:proofErr w:type="spellStart"/>
-      <w:r>
-        <w:t>e.g</w:t>
-      </w:r>
-      <w:proofErr w:type="spellEnd"/>
-      <w:r>
-        <w:t xml:space="preserve"> calling </w:t>
-      </w:r>
-      <w:proofErr w:type="spellStart"/>
-      <w:r>
-        <w:t>len</w:t>
-      </w:r>
-      <w:proofErr w:type="spellEnd"/>
-      <w:r>
-        <w:t>(universal). Len is valid for both string and list so how do we lock universal here?</w:t>
-      </w:r>
-    </w:p>
-    <w:p>
-      <w:r>
-        <w:t xml:space="preserve">Similarly, how would we define operators like plus (+) for example? If we have two universals u1 and u2, the statement u1 + u2 could imply that u1 and u2 are strings, </w:t>
-      </w:r>
-      <w:proofErr w:type="spellStart"/>
-      <w:r>
-        <w:t>ints</w:t>
-      </w:r>
-      <w:proofErr w:type="spellEnd"/>
-      <w:r>
-        <w:t>, floats, lists, tuples so how can we implement this operator.</w:t>
-      </w:r>
-    </w:p>
-    <w:p>
-      <w:r>
-        <w:t xml:space="preserve">Theoretically speaking, at best we are determining the type of a (universal) object based on how that object is treated in the code and what functions and operations are applied to it. At best a perfect solution seems to me like it would essentially be a glorified </w:t>
-      </w:r>
-      <w:proofErr w:type="gramStart"/>
-      <w:r>
-        <w:t>type</w:t>
-      </w:r>
-      <w:proofErr w:type="gramEnd"/>
-      <w:r>
-        <w:t xml:space="preserve"> inference algorithm.</w:t>
+        <w:t>If we assume there isn’t any explicit casting in the function we are fuzzing, how would a universal handle a situation where the type is ambiguous e.g calling len(universal). Len is valid for both string and list so how do we lock universal here?</w:t>
+      </w:r>
+    </w:p>
+    <w:p>
+      <w:r>
+        <w:t>Similarly, how would we define operators like plus (+) for example? If we have two universals u1 and u2, the statement u1 + u2 could imply that u1 and u2 are strings, ints, floats, lists, tuples so how can we implement this operator.</w:t>
+      </w:r>
+    </w:p>
+    <w:p>
+      <w:r>
+        <w:t>Theoretically speaking, at best we are determining the type of a (universal) object based on how that object is treated in the code and what functions and operations are applied to it. At best a perfect solution seems to me like it would essentially be a glorified type inference algorithm.</w:t>
       </w:r>
     </w:p>
     <w:p/>
@@ -987,15 +505,7 @@
     <w:p>
       <w:r>
         <w:lastRenderedPageBreak/>
-        <w:t xml:space="preserve">See if </w:t>
-      </w:r>
-      <w:proofErr w:type="spellStart"/>
-      <w:r>
-        <w:t>func</w:t>
-      </w:r>
-      <w:proofErr w:type="spellEnd"/>
-      <w:r>
-        <w:t xml:space="preserve"> argument is callable, raise exception and print that the code is using callbacks which are not currently supported</w:t>
+        <w:t>See if func argument is callable, raise exception and print that the code is using callbacks which are not currently supported</w:t>
       </w:r>
     </w:p>
     <w:p/>
@@ -1017,31 +527,13 @@
         <w:t xml:space="preserve">classes </w:t>
       </w:r>
       <w:r>
-        <w:t xml:space="preserve">for 2 stack </w:t>
-      </w:r>
-      <w:proofErr w:type="gramStart"/>
-      <w:r>
-        <w:t>implementation</w:t>
-      </w:r>
-      <w:proofErr w:type="gramEnd"/>
-    </w:p>
-    <w:p>
-      <w:r>
-        <w:t xml:space="preserve">The </w:t>
-      </w:r>
-      <w:proofErr w:type="spellStart"/>
-      <w:r>
-        <w:t>fuzzer</w:t>
-      </w:r>
-      <w:proofErr w:type="spellEnd"/>
-      <w:r>
-        <w:t xml:space="preserve"> </w:t>
-      </w:r>
-      <w:proofErr w:type="gramStart"/>
-      <w:r>
-        <w:t>should :</w:t>
-      </w:r>
-      <w:proofErr w:type="gramEnd"/>
+        <w:t>for 2 stack implementation</w:t>
+      </w:r>
+    </w:p>
+    <w:p>
+      <w:r>
+        <w:t>The fuzzer should :</w:t>
+      </w:r>
     </w:p>
     <w:p>
       <w:r>
@@ -1061,36 +553,12 @@
     <w:p/>
     <w:p>
       <w:r>
-        <w:t xml:space="preserve">Added </w:t>
-      </w:r>
-      <w:proofErr w:type="spellStart"/>
-      <w:r>
-        <w:t>arg</w:t>
-      </w:r>
-      <w:proofErr w:type="spellEnd"/>
-      <w:r>
-        <w:t>/</w:t>
-      </w:r>
-      <w:proofErr w:type="spellStart"/>
-      <w:r>
-        <w:t>kwarg</w:t>
-      </w:r>
-      <w:proofErr w:type="spellEnd"/>
-      <w:r>
-        <w:t xml:space="preserve"> support for fuzz testing strategy</w:t>
-      </w:r>
-    </w:p>
-    <w:p>
-      <w:r>
-        <w:t xml:space="preserve">Wrote basic </w:t>
-      </w:r>
-      <w:proofErr w:type="gramStart"/>
-      <w:r>
-        <w:t>first class</w:t>
-      </w:r>
-      <w:proofErr w:type="gramEnd"/>
-      <w:r>
-        <w:t xml:space="preserve"> equivalence tester</w:t>
+        <w:t>Added arg/kwarg support for fuzz testing strategy</w:t>
+      </w:r>
+    </w:p>
+    <w:p>
+      <w:r>
+        <w:t>Wrote basic first class equivalence tester</w:t>
       </w:r>
     </w:p>
     <w:p>
@@ -1110,36 +578,12 @@
     </w:p>
     <w:p>
       <w:r>
-        <w:t xml:space="preserve">I have tried applying this equivalence tester to small refactors in real classes from open sources repos such as </w:t>
-      </w:r>
-      <w:proofErr w:type="spellStart"/>
-      <w:r>
-        <w:t>openai</w:t>
-      </w:r>
-      <w:proofErr w:type="spellEnd"/>
-      <w:r>
-        <w:t xml:space="preserve"> but have struggled to find working examples. My equivalence tester is quite situational. Method name/signature </w:t>
-      </w:r>
-      <w:proofErr w:type="gramStart"/>
-      <w:r>
-        <w:t>refactors</w:t>
-      </w:r>
-      <w:proofErr w:type="gramEnd"/>
-      <w:r>
-        <w:t xml:space="preserve"> and external dependencies cause issues</w:t>
-      </w:r>
-    </w:p>
-    <w:p>
-      <w:r>
-        <w:t xml:space="preserve">Tested it on two stack implementations, one that throws index error if you try to peek or pop and empty stack, and one that returns None for these operations. The </w:t>
-      </w:r>
-      <w:proofErr w:type="spellStart"/>
-      <w:r>
-        <w:t>fuzzer</w:t>
-      </w:r>
-      <w:proofErr w:type="spellEnd"/>
-      <w:r>
-        <w:t xml:space="preserve"> was able to pick up on this difference immediately</w:t>
+        <w:t>I have tried applying this equivalence tester to small refactors in real classes from open sources repos such as openai but have struggled to find working examples. My equivalence tester is quite situational. Method name/signature refactors and external dependencies cause issues</w:t>
+      </w:r>
+    </w:p>
+    <w:p>
+      <w:r>
+        <w:t>Tested it on two stack implementations, one that throws index error if you try to peek or pop and empty stack, and one that returns None for these operations. The fuzzer was able to pick up on this difference immediately</w:t>
       </w:r>
     </w:p>
     <w:p/>
@@ -1175,7 +619,7 @@
                     <pic:cNvPicPr/>
                   </pic:nvPicPr>
                   <pic:blipFill>
-                    <a:blip r:embed="rId9"/>
+                    <a:blip r:embed="rId10"/>
                     <a:stretch>
                       <a:fillRect/>
                     </a:stretch>
@@ -1229,29 +673,13 @@
     </w:p>
     <w:p>
       <w:r>
-        <w:t xml:space="preserve">What I mean by this is that currently, my code will test two classes for equivalence and if the classes have differing methods or even method names, the code will reject them. Allow the user to define a </w:t>
-      </w:r>
-      <w:proofErr w:type="spellStart"/>
-      <w:r>
-        <w:t>json</w:t>
-      </w:r>
-      <w:proofErr w:type="spellEnd"/>
-      <w:r>
-        <w:t xml:space="preserve"> file with the specific methods from the class that they want tested so they can exclude certain methods if they </w:t>
-      </w:r>
-      <w:proofErr w:type="gramStart"/>
-      <w:r>
-        <w:t>like, and</w:t>
-      </w:r>
-      <w:proofErr w:type="gramEnd"/>
-      <w:r>
-        <w:t xml:space="preserve"> optionally allow the user to also define specifically what arguments each method should be tested with.</w:t>
+        <w:t>What I mean by this is that currently, my code will test two classes for equivalence and if the classes have differing methods or even method names, the code will reject them. Allow the user to define a json file with the specific methods from the class that they want tested so they can exclude certain methods if they like, and optionally allow the user to also define specifically what arguments each method should be tested with.</w:t>
       </w:r>
     </w:p>
     <w:p/>
     <w:p/>
     <w:p>
-      <w:hyperlink r:id="rId10" w:history="1">
+      <w:hyperlink r:id="rId11" w:history="1">
         <w:r>
           <w:rPr>
             <w:rStyle w:val="Hyperlink"/>
@@ -1286,15 +714,7 @@
       </w:r>
       <w:r>
         <w:lastRenderedPageBreak/>
-        <w:t xml:space="preserve">duplicates, removing the need to fuzz both </w:t>
-      </w:r>
-      <w:proofErr w:type="spellStart"/>
-      <w:r>
-        <w:t>funcs</w:t>
-      </w:r>
-      <w:proofErr w:type="spellEnd"/>
-      <w:r>
-        <w:t>. Useful in practice for speeding up a common case</w:t>
+        <w:t>duplicates, removing the need to fuzz both funcs. Useful in practice for speeding up a common case</w:t>
       </w:r>
     </w:p>
     <w:p>
@@ -1306,15 +726,7 @@
         </w:numPr>
       </w:pPr>
       <w:r>
-        <w:t xml:space="preserve">Filter out </w:t>
-      </w:r>
-      <w:proofErr w:type="spellStart"/>
-      <w:r>
-        <w:t>funcs</w:t>
-      </w:r>
-      <w:proofErr w:type="spellEnd"/>
-      <w:r>
-        <w:t xml:space="preserve"> with no parameters and return values</w:t>
+        <w:t>Filter out funcs with no parameters and return values</w:t>
       </w:r>
     </w:p>
     <w:p>
@@ -1326,15 +738,7 @@
         </w:numPr>
       </w:pPr>
       <w:r>
-        <w:t xml:space="preserve">Possibly filter out </w:t>
-      </w:r>
-      <w:proofErr w:type="spellStart"/>
-      <w:r>
-        <w:t>funcs</w:t>
-      </w:r>
-      <w:proofErr w:type="spellEnd"/>
-      <w:r>
-        <w:t xml:space="preserve"> that invoke external classes or methods</w:t>
+        <w:t>Possibly filter out funcs that invoke external classes or methods</w:t>
       </w:r>
     </w:p>
     <w:p>
@@ -1346,15 +750,7 @@
         </w:numPr>
       </w:pPr>
       <w:r>
-        <w:t xml:space="preserve">They use </w:t>
-      </w:r>
-      <w:proofErr w:type="spellStart"/>
-      <w:r>
-        <w:t>pynguin</w:t>
-      </w:r>
-      <w:proofErr w:type="spellEnd"/>
-      <w:r>
-        <w:t xml:space="preserve"> which is a test generation framework that does not use fuzz testing</w:t>
+        <w:t>They use pynguin which is a test generation framework that does not use fuzz testing</w:t>
       </w:r>
     </w:p>
     <w:p>
@@ -1374,15 +770,7 @@
     </w:p>
     <w:p>
       <w:r>
-        <w:t xml:space="preserve">What if u have a class with 1 </w:t>
-      </w:r>
-      <w:proofErr w:type="gramStart"/>
-      <w:r>
-        <w:t>methods</w:t>
-      </w:r>
-      <w:proofErr w:type="gramEnd"/>
-      <w:r>
-        <w:t>, a factory method which gives u back 3 methods</w:t>
+        <w:t>What if u have a class with 1 methods, a factory method which gives u back 3 methods</w:t>
       </w:r>
     </w:p>
     <w:p>
@@ -1404,7 +792,7 @@
       </w:r>
     </w:p>
     <w:p>
-      <w:hyperlink r:id="rId11" w:history="1">
+      <w:hyperlink r:id="rId12" w:history="1">
         <w:r>
           <w:rPr>
             <w:rStyle w:val="Hyperlink"/>
@@ -1415,29 +803,13 @@
     </w:p>
     <w:p>
       <w:r>
-        <w:t xml:space="preserve">could instead go more practical, targeting </w:t>
-      </w:r>
-      <w:proofErr w:type="spellStart"/>
-      <w:r>
-        <w:t>datastructure</w:t>
-      </w:r>
-      <w:proofErr w:type="spellEnd"/>
-      <w:r>
-        <w:t xml:space="preserve"> implementations online</w:t>
+        <w:t>could instead go more practical, targeting datastructure implementations online</w:t>
       </w:r>
     </w:p>
     <w:p/>
     <w:p>
       <w:r>
-        <w:t xml:space="preserve">For function-function verification: I am currently implementing the case where both functions return (create) a new function. In this case I want to then perform the same function-function verification on these two new returned functions. The problem is the </w:t>
-      </w:r>
-      <w:proofErr w:type="spellStart"/>
-      <w:r>
-        <w:t>hypofuzz</w:t>
-      </w:r>
-      <w:proofErr w:type="spellEnd"/>
-      <w:r>
-        <w:t xml:space="preserve"> does not exactly allow for a recursive implementation like this. </w:t>
+        <w:t xml:space="preserve">For function-function verification: I am currently implementing the case where both functions return (create) a new function. In this case I want to then perform the same function-function verification on these two new returned functions. The problem is the hypofuzz does not exactly allow for a recursive implementation like this. </w:t>
       </w:r>
     </w:p>
     <w:p>
@@ -1482,37 +854,7 @@
         <w:rPr>
           <w:iCs/>
         </w:rPr>
-        <w:t xml:space="preserve">Other than this issue, another issue is trying to reason with functions that take callable parameters. </w:t>
-      </w:r>
-      <w:proofErr w:type="spellStart"/>
-      <w:proofErr w:type="gramStart"/>
-      <w:r>
-        <w:rPr>
-          <w:iCs/>
-        </w:rPr>
-        <w:t>Cant</w:t>
-      </w:r>
-      <w:proofErr w:type="spellEnd"/>
-      <w:proofErr w:type="gramEnd"/>
-      <w:r>
-        <w:rPr>
-          <w:iCs/>
-        </w:rPr>
-        <w:t xml:space="preserve"> exactly fuzz a function as an input so </w:t>
-      </w:r>
-      <w:proofErr w:type="spellStart"/>
-      <w:r>
-        <w:rPr>
-          <w:iCs/>
-        </w:rPr>
-        <w:t>im</w:t>
-      </w:r>
-      <w:proofErr w:type="spellEnd"/>
-      <w:r>
-        <w:rPr>
-          <w:iCs/>
-        </w:rPr>
-        <w:t xml:space="preserve"> not sure what to do here</w:t>
+        <w:t>Other than this issue, another issue is trying to reason with functions that take callable parameters. Cant exactly fuzz a function as an input so im not sure what to do here</w:t>
       </w:r>
       <w:r>
         <w:rPr>
@@ -1549,7 +891,7 @@
                     <pic:cNvPicPr/>
                   </pic:nvPicPr>
                   <pic:blipFill>
-                    <a:blip r:embed="rId12"/>
+                    <a:blip r:embed="rId13"/>
                     <a:stretch>
                       <a:fillRect/>
                     </a:stretch>
@@ -1580,138 +922,46 @@
         <w:rPr>
           <w:iCs/>
         </w:rPr>
-        <w:t xml:space="preserve">Using universal strategy + dummy functions (the testing framework doesn’t know that the function </w:t>
-      </w:r>
-      <w:proofErr w:type="spellStart"/>
-      <w:r>
-        <w:rPr>
-          <w:iCs/>
-        </w:rPr>
-        <w:t>arg</w:t>
-      </w:r>
-      <w:proofErr w:type="spellEnd"/>
-      <w:r>
-        <w:rPr>
-          <w:iCs/>
-        </w:rPr>
-        <w:t xml:space="preserve"> is necessarily </w:t>
-      </w:r>
-      <w:proofErr w:type="gramStart"/>
-      <w:r>
-        <w:rPr>
-          <w:iCs/>
-        </w:rPr>
-        <w:t>callable</w:t>
-      </w:r>
-      <w:proofErr w:type="gramEnd"/>
-      <w:r>
-        <w:rPr>
-          <w:iCs/>
-        </w:rPr>
-        <w:t xml:space="preserve"> so it uses universal strategy) it takes 11 minutes to find the difference in </w:t>
-      </w:r>
-      <w:proofErr w:type="spellStart"/>
-      <w:r>
-        <w:rPr>
-          <w:iCs/>
-        </w:rPr>
-        <w:t>call_nested_param_ineq</w:t>
-      </w:r>
-      <w:proofErr w:type="spellEnd"/>
-      <w:r>
-        <w:rPr>
-          <w:iCs/>
-        </w:rPr>
-        <w:t xml:space="preserve">. Chances are, with type annotations this will be a bit faster as the tester will start passing in more callable </w:t>
-      </w:r>
-      <w:proofErr w:type="spellStart"/>
-      <w:r>
-        <w:rPr>
-          <w:iCs/>
-        </w:rPr>
-        <w:t>args</w:t>
-      </w:r>
-      <w:proofErr w:type="spellEnd"/>
-      <w:r>
-        <w:rPr>
-          <w:iCs/>
-        </w:rPr>
-        <w:t xml:space="preserve"> from the start</w:t>
-      </w:r>
-    </w:p>
-    <w:p>
-      <w:pPr>
-        <w:rPr>
-          <w:iCs/>
-        </w:rPr>
-      </w:pPr>
-      <w:r>
-        <w:rPr>
-          <w:iCs/>
-        </w:rPr>
-        <w:t xml:space="preserve">Adding a mechanism to see if an </w:t>
-      </w:r>
-      <w:proofErr w:type="spellStart"/>
-      <w:r>
-        <w:rPr>
-          <w:iCs/>
-        </w:rPr>
-        <w:t>arg</w:t>
-      </w:r>
-      <w:proofErr w:type="spellEnd"/>
-      <w:r>
-        <w:rPr>
-          <w:iCs/>
-        </w:rPr>
-        <w:t xml:space="preserve"> is “called” within a function should be </w:t>
-      </w:r>
-      <w:proofErr w:type="gramStart"/>
-      <w:r>
-        <w:rPr>
-          <w:iCs/>
-        </w:rPr>
-        <w:t>pretty easy</w:t>
-      </w:r>
-      <w:proofErr w:type="gramEnd"/>
-      <w:r>
-        <w:rPr>
-          <w:iCs/>
-        </w:rPr>
-        <w:t xml:space="preserve"> and should greatly improve time efficiency</w:t>
-      </w:r>
-    </w:p>
-    <w:p>
-      <w:pPr>
-        <w:rPr>
-          <w:iCs/>
-        </w:rPr>
-      </w:pPr>
-    </w:p>
-    <w:p>
-      <w:pPr>
-        <w:rPr>
-          <w:iCs/>
-        </w:rPr>
-      </w:pPr>
-      <w:r>
-        <w:rPr>
-          <w:iCs/>
-        </w:rPr>
-        <w:t xml:space="preserve">To be as faithful to the theory: we need to complicate/generalise </w:t>
-      </w:r>
-      <w:proofErr w:type="gramStart"/>
-      <w:r>
-        <w:rPr>
-          <w:iCs/>
-        </w:rPr>
-        <w:t>f(</w:t>
-      </w:r>
-      <w:proofErr w:type="gramEnd"/>
-      <w:r>
-        <w:rPr>
-          <w:iCs/>
-        </w:rPr>
-        <w:t>) so it can call any function it knows. Bound things, we don’t want more than 2 recursive calls, more than etc.</w:t>
+        <w:t>Using universal strategy + dummy functions (the testing framework doesn’t know that the function arg is necessarily callable so it uses universal strategy) it takes 11 minutes to find the difference in call_nested_param_ineq</w:t>
+      </w:r>
+      <w:r>
+        <w:rPr>
+          <w:iCs/>
+        </w:rPr>
+        <w:t>. Chances are, with type annotations this will be a bit faster as the tester will start passing in more callable args from the start</w:t>
+      </w:r>
+    </w:p>
+    <w:p>
+      <w:pPr>
+        <w:rPr>
+          <w:iCs/>
+        </w:rPr>
+      </w:pPr>
+      <w:r>
+        <w:rPr>
+          <w:iCs/>
+        </w:rPr>
+        <w:t>Adding a mechanism to see if an arg is “called” within a function should be pretty easy and should greatly improve time efficiency</w:t>
+      </w:r>
+    </w:p>
+    <w:p>
+      <w:pPr>
+        <w:rPr>
+          <w:iCs/>
+        </w:rPr>
+      </w:pPr>
+    </w:p>
+    <w:p>
+      <w:pPr>
+        <w:rPr>
+          <w:iCs/>
+        </w:rPr>
+      </w:pPr>
+      <w:r>
+        <w:rPr>
+          <w:iCs/>
+        </w:rPr>
+        <w:t>To be as faithful to the theory: we need to complicate/generalise f() so it can call any function it knows. Bound things, we don’t want more than 2 recursive calls, more than etc.</w:t>
       </w:r>
     </w:p>
     <w:p>
@@ -1782,48 +1032,20 @@
         <w:rPr>
           <w:iCs/>
         </w:rPr>
-        <w:t xml:space="preserve">If I have time, extend </w:t>
-      </w:r>
-      <w:proofErr w:type="gramStart"/>
-      <w:r>
-        <w:rPr>
-          <w:iCs/>
-        </w:rPr>
-        <w:t>f(</w:t>
-      </w:r>
-      <w:proofErr w:type="gramEnd"/>
-      <w:r>
-        <w:rPr>
-          <w:iCs/>
-        </w:rPr>
-        <w:t>) functions to take and return numbers</w:t>
-      </w:r>
-    </w:p>
-    <w:p>
-      <w:pPr>
-        <w:rPr>
-          <w:iCs/>
-        </w:rPr>
-      </w:pPr>
-      <w:r>
-        <w:rPr>
-          <w:iCs/>
-        </w:rPr>
-        <w:t xml:space="preserve">Then I can look at test suites, try it out in some application areas where equivalence is important, </w:t>
-      </w:r>
-      <w:proofErr w:type="gramStart"/>
-      <w:r>
-        <w:rPr>
-          <w:iCs/>
-        </w:rPr>
-        <w:t>property based</w:t>
-      </w:r>
-      <w:proofErr w:type="gramEnd"/>
-      <w:r>
-        <w:rPr>
-          <w:iCs/>
-        </w:rPr>
-        <w:t xml:space="preserve"> testing test suite and run with my pipeline.</w:t>
+        <w:t>If I have time, extend f() functions to take and return numbers</w:t>
+      </w:r>
+    </w:p>
+    <w:p>
+      <w:pPr>
+        <w:rPr>
+          <w:iCs/>
+        </w:rPr>
+      </w:pPr>
+      <w:r>
+        <w:rPr>
+          <w:iCs/>
+        </w:rPr>
+        <w:t>Then I can look at test suites, try it out in some application areas where equivalence is important, property based testing test suite and run with my pipeline.</w:t>
       </w:r>
     </w:p>
     <w:p>
@@ -1878,70 +1100,127 @@
           <w:bCs/>
           <w:iCs/>
         </w:rPr>
-        <w:t xml:space="preserve">Pass a </w:t>
-      </w:r>
-      <w:proofErr w:type="spellStart"/>
-      <w:r>
+        <w:t>Pass a datastruct library thru a mutation testing suite to see how it performs against my pipeline, try to find examples my pipeline can find that the existing suite cant</w:t>
+      </w:r>
+    </w:p>
+    <w:p>
+      <w:pPr>
         <w:rPr>
           <w:b/>
           <w:bCs/>
           <w:iCs/>
         </w:rPr>
-        <w:t>datastruct</w:t>
-      </w:r>
-      <w:proofErr w:type="spellEnd"/>
+      </w:pPr>
       <w:r>
         <w:rPr>
           <w:b/>
           <w:bCs/>
           <w:iCs/>
         </w:rPr>
-        <w:t xml:space="preserve"> library thru a mutation testing suite to see how it performs against my pipeline, try to find examples my pipeline can find that the existing suite </w:t>
-      </w:r>
-      <w:proofErr w:type="gramStart"/>
-      <w:r>
+        <w:t>Look at open source library with tests at the end</w:t>
+      </w:r>
+    </w:p>
+    <w:p>
+      <w:pPr>
         <w:rPr>
           <w:b/>
           <w:bCs/>
           <w:iCs/>
         </w:rPr>
-        <w:t>cant</w:t>
-      </w:r>
-      <w:proofErr w:type="gramEnd"/>
-    </w:p>
-    <w:p>
-      <w:pPr>
-        <w:rPr>
-          <w:b/>
-          <w:bCs/>
-          <w:iCs/>
-        </w:rPr>
-      </w:pPr>
-      <w:r>
-        <w:rPr>
-          <w:b/>
-          <w:bCs/>
-          <w:iCs/>
-        </w:rPr>
-        <w:t xml:space="preserve">Look at </w:t>
-      </w:r>
-      <w:proofErr w:type="gramStart"/>
-      <w:r>
-        <w:rPr>
-          <w:b/>
-          <w:bCs/>
-          <w:iCs/>
-        </w:rPr>
-        <w:t>open source</w:t>
-      </w:r>
-      <w:proofErr w:type="gramEnd"/>
-      <w:r>
-        <w:rPr>
-          <w:b/>
-          <w:bCs/>
-          <w:iCs/>
-        </w:rPr>
-        <w:t xml:space="preserve"> library with tests at the end</w:t>
+      </w:pPr>
+    </w:p>
+    <w:p>
+      <w:pPr>
+        <w:rPr>
+          <w:iCs/>
+        </w:rPr>
+      </w:pPr>
+      <w:r>
+        <w:rPr>
+          <w:iCs/>
+        </w:rPr>
+        <w:t>May want to update</w:t>
+      </w:r>
+      <w:r>
+        <w:rPr>
+          <w:iCs/>
+        </w:rPr>
+        <w:t xml:space="preserve"> are_equivalent for profiler to check that the arguments to any function called by the top level</w:t>
+      </w:r>
+      <w:r>
+        <w:rPr>
+          <w:iCs/>
+        </w:rPr>
+        <w:t xml:space="preserve"> are equivalent</w:t>
+      </w:r>
+    </w:p>
+    <w:p>
+      <w:pPr>
+        <w:rPr>
+          <w:iCs/>
+        </w:rPr>
+      </w:pPr>
+    </w:p>
+    <w:p>
+      <w:pPr>
+        <w:rPr>
+          <w:iCs/>
+        </w:rPr>
+      </w:pPr>
+      <w:r>
+        <w:rPr>
+          <w:iCs/>
+        </w:rPr>
+        <w:t>How do I improve passing in functions as arguments?</w:t>
+      </w:r>
+    </w:p>
+    <w:p>
+      <w:pPr>
+        <w:rPr>
+          <w:iCs/>
+        </w:rPr>
+      </w:pPr>
+      <w:r>
+        <w:rPr>
+          <w:iCs/>
+        </w:rPr>
+        <w:t>One idea: perform static analysis on the function we are fuzzing before we fuzz it to see if it takes a function f as a param, if that function f itself takes a param. Thus we can narrow down which function fuzzing strategy to employ</w:t>
+      </w:r>
+    </w:p>
+    <w:p>
+      <w:pPr>
+        <w:pStyle w:val="ListParagraph"/>
+        <w:numPr>
+          <w:ilvl w:val="0"/>
+          <w:numId w:val="9"/>
+        </w:numPr>
+        <w:rPr>
+          <w:iCs/>
+        </w:rPr>
+      </w:pPr>
+      <w:r>
+        <w:rPr>
+          <w:iCs/>
+        </w:rPr>
+        <w:t>Functions that take single int param and return that same int</w:t>
+      </w:r>
+    </w:p>
+    <w:p>
+      <w:pPr>
+        <w:pStyle w:val="ListParagraph"/>
+        <w:numPr>
+          <w:ilvl w:val="0"/>
+          <w:numId w:val="9"/>
+        </w:numPr>
+        <w:rPr>
+          <w:iCs/>
+        </w:rPr>
+      </w:pPr>
+      <w:r>
+        <w:rPr>
+          <w:iCs/>
+        </w:rPr>
+        <w:t>Functions f that take a single function as a param like f(h): we can check the sig of the function h given, and fuzz some input accordingly to call h with within f.</w:t>
       </w:r>
     </w:p>
     <w:p/>
@@ -1957,7 +1236,6 @@
     </w:p>
     <w:p>
       <w:r>
-        <w:lastRenderedPageBreak/>
         <w:t>How do we treat python default/optional arguments?</w:t>
       </w:r>
     </w:p>
@@ -2333,6 +1611,119 @@
     </w:lvl>
   </w:abstractNum>
   <w:abstractNum w:abstractNumId="3" w15:restartNumberingAfterBreak="0">
+    <w:nsid w:val="3F1B4245"/>
+    <w:multiLevelType w:val="hybridMultilevel"/>
+    <w:tmpl w:val="31E0EA9E"/>
+    <w:lvl w:ilvl="0" w:tplc="08090001">
+      <w:start w:val="1"/>
+      <w:numFmt w:val="bullet"/>
+      <w:lvlText w:val=""/>
+      <w:lvlJc w:val="left"/>
+      <w:pPr>
+        <w:ind w:left="720" w:hanging="360"/>
+      </w:pPr>
+      <w:rPr>
+        <w:rFonts w:ascii="Symbol" w:hAnsi="Symbol" w:hint="default"/>
+      </w:rPr>
+    </w:lvl>
+    <w:lvl w:ilvl="1" w:tplc="08090003" w:tentative="1">
+      <w:start w:val="1"/>
+      <w:numFmt w:val="bullet"/>
+      <w:lvlText w:val="o"/>
+      <w:lvlJc w:val="left"/>
+      <w:pPr>
+        <w:ind w:left="1440" w:hanging="360"/>
+      </w:pPr>
+      <w:rPr>
+        <w:rFonts w:ascii="Courier New" w:hAnsi="Courier New" w:cs="Courier New" w:hint="default"/>
+      </w:rPr>
+    </w:lvl>
+    <w:lvl w:ilvl="2" w:tplc="08090005" w:tentative="1">
+      <w:start w:val="1"/>
+      <w:numFmt w:val="bullet"/>
+      <w:lvlText w:val=""/>
+      <w:lvlJc w:val="left"/>
+      <w:pPr>
+        <w:ind w:left="2160" w:hanging="360"/>
+      </w:pPr>
+      <w:rPr>
+        <w:rFonts w:ascii="Wingdings" w:hAnsi="Wingdings" w:hint="default"/>
+      </w:rPr>
+    </w:lvl>
+    <w:lvl w:ilvl="3" w:tplc="08090001" w:tentative="1">
+      <w:start w:val="1"/>
+      <w:numFmt w:val="bullet"/>
+      <w:lvlText w:val=""/>
+      <w:lvlJc w:val="left"/>
+      <w:pPr>
+        <w:ind w:left="2880" w:hanging="360"/>
+      </w:pPr>
+      <w:rPr>
+        <w:rFonts w:ascii="Symbol" w:hAnsi="Symbol" w:hint="default"/>
+      </w:rPr>
+    </w:lvl>
+    <w:lvl w:ilvl="4" w:tplc="08090003" w:tentative="1">
+      <w:start w:val="1"/>
+      <w:numFmt w:val="bullet"/>
+      <w:lvlText w:val="o"/>
+      <w:lvlJc w:val="left"/>
+      <w:pPr>
+        <w:ind w:left="3600" w:hanging="360"/>
+      </w:pPr>
+      <w:rPr>
+        <w:rFonts w:ascii="Courier New" w:hAnsi="Courier New" w:cs="Courier New" w:hint="default"/>
+      </w:rPr>
+    </w:lvl>
+    <w:lvl w:ilvl="5" w:tplc="08090005" w:tentative="1">
+      <w:start w:val="1"/>
+      <w:numFmt w:val="bullet"/>
+      <w:lvlText w:val=""/>
+      <w:lvlJc w:val="left"/>
+      <w:pPr>
+        <w:ind w:left="4320" w:hanging="360"/>
+      </w:pPr>
+      <w:rPr>
+        <w:rFonts w:ascii="Wingdings" w:hAnsi="Wingdings" w:hint="default"/>
+      </w:rPr>
+    </w:lvl>
+    <w:lvl w:ilvl="6" w:tplc="08090001" w:tentative="1">
+      <w:start w:val="1"/>
+      <w:numFmt w:val="bullet"/>
+      <w:lvlText w:val=""/>
+      <w:lvlJc w:val="left"/>
+      <w:pPr>
+        <w:ind w:left="5040" w:hanging="360"/>
+      </w:pPr>
+      <w:rPr>
+        <w:rFonts w:ascii="Symbol" w:hAnsi="Symbol" w:hint="default"/>
+      </w:rPr>
+    </w:lvl>
+    <w:lvl w:ilvl="7" w:tplc="08090003" w:tentative="1">
+      <w:start w:val="1"/>
+      <w:numFmt w:val="bullet"/>
+      <w:lvlText w:val="o"/>
+      <w:lvlJc w:val="left"/>
+      <w:pPr>
+        <w:ind w:left="5760" w:hanging="360"/>
+      </w:pPr>
+      <w:rPr>
+        <w:rFonts w:ascii="Courier New" w:hAnsi="Courier New" w:cs="Courier New" w:hint="default"/>
+      </w:rPr>
+    </w:lvl>
+    <w:lvl w:ilvl="8" w:tplc="08090005" w:tentative="1">
+      <w:start w:val="1"/>
+      <w:numFmt w:val="bullet"/>
+      <w:lvlText w:val=""/>
+      <w:lvlJc w:val="left"/>
+      <w:pPr>
+        <w:ind w:left="6480" w:hanging="360"/>
+      </w:pPr>
+      <w:rPr>
+        <w:rFonts w:ascii="Wingdings" w:hAnsi="Wingdings" w:hint="default"/>
+      </w:rPr>
+    </w:lvl>
+  </w:abstractNum>
+  <w:abstractNum w:abstractNumId="4" w15:restartNumberingAfterBreak="0">
     <w:nsid w:val="48A51D20"/>
     <w:multiLevelType w:val="hybridMultilevel"/>
     <w:tmpl w:val="5768A5B8"/>
@@ -2421,7 +1812,7 @@
       </w:pPr>
     </w:lvl>
   </w:abstractNum>
-  <w:abstractNum w:abstractNumId="4" w15:restartNumberingAfterBreak="0">
+  <w:abstractNum w:abstractNumId="5" w15:restartNumberingAfterBreak="0">
     <w:nsid w:val="4B6C3F3B"/>
     <w:multiLevelType w:val="hybridMultilevel"/>
     <w:tmpl w:val="7A6A9006"/>
@@ -2534,7 +1925,120 @@
       </w:rPr>
     </w:lvl>
   </w:abstractNum>
-  <w:abstractNum w:abstractNumId="5" w15:restartNumberingAfterBreak="0">
+  <w:abstractNum w:abstractNumId="6" w15:restartNumberingAfterBreak="0">
+    <w:nsid w:val="579A06EE"/>
+    <w:multiLevelType w:val="hybridMultilevel"/>
+    <w:tmpl w:val="F2F43A54"/>
+    <w:lvl w:ilvl="0" w:tplc="08090001">
+      <w:start w:val="1"/>
+      <w:numFmt w:val="bullet"/>
+      <w:lvlText w:val=""/>
+      <w:lvlJc w:val="left"/>
+      <w:pPr>
+        <w:ind w:left="1440" w:hanging="360"/>
+      </w:pPr>
+      <w:rPr>
+        <w:rFonts w:ascii="Symbol" w:hAnsi="Symbol" w:hint="default"/>
+      </w:rPr>
+    </w:lvl>
+    <w:lvl w:ilvl="1" w:tplc="08090003" w:tentative="1">
+      <w:start w:val="1"/>
+      <w:numFmt w:val="bullet"/>
+      <w:lvlText w:val="o"/>
+      <w:lvlJc w:val="left"/>
+      <w:pPr>
+        <w:ind w:left="2160" w:hanging="360"/>
+      </w:pPr>
+      <w:rPr>
+        <w:rFonts w:ascii="Courier New" w:hAnsi="Courier New" w:cs="Courier New" w:hint="default"/>
+      </w:rPr>
+    </w:lvl>
+    <w:lvl w:ilvl="2" w:tplc="08090005" w:tentative="1">
+      <w:start w:val="1"/>
+      <w:numFmt w:val="bullet"/>
+      <w:lvlText w:val=""/>
+      <w:lvlJc w:val="left"/>
+      <w:pPr>
+        <w:ind w:left="2880" w:hanging="360"/>
+      </w:pPr>
+      <w:rPr>
+        <w:rFonts w:ascii="Wingdings" w:hAnsi="Wingdings" w:hint="default"/>
+      </w:rPr>
+    </w:lvl>
+    <w:lvl w:ilvl="3" w:tplc="08090001" w:tentative="1">
+      <w:start w:val="1"/>
+      <w:numFmt w:val="bullet"/>
+      <w:lvlText w:val=""/>
+      <w:lvlJc w:val="left"/>
+      <w:pPr>
+        <w:ind w:left="3600" w:hanging="360"/>
+      </w:pPr>
+      <w:rPr>
+        <w:rFonts w:ascii="Symbol" w:hAnsi="Symbol" w:hint="default"/>
+      </w:rPr>
+    </w:lvl>
+    <w:lvl w:ilvl="4" w:tplc="08090003" w:tentative="1">
+      <w:start w:val="1"/>
+      <w:numFmt w:val="bullet"/>
+      <w:lvlText w:val="o"/>
+      <w:lvlJc w:val="left"/>
+      <w:pPr>
+        <w:ind w:left="4320" w:hanging="360"/>
+      </w:pPr>
+      <w:rPr>
+        <w:rFonts w:ascii="Courier New" w:hAnsi="Courier New" w:cs="Courier New" w:hint="default"/>
+      </w:rPr>
+    </w:lvl>
+    <w:lvl w:ilvl="5" w:tplc="08090005" w:tentative="1">
+      <w:start w:val="1"/>
+      <w:numFmt w:val="bullet"/>
+      <w:lvlText w:val=""/>
+      <w:lvlJc w:val="left"/>
+      <w:pPr>
+        <w:ind w:left="5040" w:hanging="360"/>
+      </w:pPr>
+      <w:rPr>
+        <w:rFonts w:ascii="Wingdings" w:hAnsi="Wingdings" w:hint="default"/>
+      </w:rPr>
+    </w:lvl>
+    <w:lvl w:ilvl="6" w:tplc="08090001" w:tentative="1">
+      <w:start w:val="1"/>
+      <w:numFmt w:val="bullet"/>
+      <w:lvlText w:val=""/>
+      <w:lvlJc w:val="left"/>
+      <w:pPr>
+        <w:ind w:left="5760" w:hanging="360"/>
+      </w:pPr>
+      <w:rPr>
+        <w:rFonts w:ascii="Symbol" w:hAnsi="Symbol" w:hint="default"/>
+      </w:rPr>
+    </w:lvl>
+    <w:lvl w:ilvl="7" w:tplc="08090003" w:tentative="1">
+      <w:start w:val="1"/>
+      <w:numFmt w:val="bullet"/>
+      <w:lvlText w:val="o"/>
+      <w:lvlJc w:val="left"/>
+      <w:pPr>
+        <w:ind w:left="6480" w:hanging="360"/>
+      </w:pPr>
+      <w:rPr>
+        <w:rFonts w:ascii="Courier New" w:hAnsi="Courier New" w:cs="Courier New" w:hint="default"/>
+      </w:rPr>
+    </w:lvl>
+    <w:lvl w:ilvl="8" w:tplc="08090005" w:tentative="1">
+      <w:start w:val="1"/>
+      <w:numFmt w:val="bullet"/>
+      <w:lvlText w:val=""/>
+      <w:lvlJc w:val="left"/>
+      <w:pPr>
+        <w:ind w:left="7200" w:hanging="360"/>
+      </w:pPr>
+      <w:rPr>
+        <w:rFonts w:ascii="Wingdings" w:hAnsi="Wingdings" w:hint="default"/>
+      </w:rPr>
+    </w:lvl>
+  </w:abstractNum>
+  <w:abstractNum w:abstractNumId="7" w15:restartNumberingAfterBreak="0">
     <w:nsid w:val="6AB61A83"/>
     <w:multiLevelType w:val="hybridMultilevel"/>
     <w:tmpl w:val="76844AC0"/>
@@ -2647,14 +2151,127 @@
       </w:rPr>
     </w:lvl>
   </w:abstractNum>
+  <w:abstractNum w:abstractNumId="8" w15:restartNumberingAfterBreak="0">
+    <w:nsid w:val="6E9A5F6C"/>
+    <w:multiLevelType w:val="hybridMultilevel"/>
+    <w:tmpl w:val="0F1AB72E"/>
+    <w:lvl w:ilvl="0" w:tplc="08090001">
+      <w:start w:val="1"/>
+      <w:numFmt w:val="bullet"/>
+      <w:lvlText w:val=""/>
+      <w:lvlJc w:val="left"/>
+      <w:pPr>
+        <w:ind w:left="720" w:hanging="360"/>
+      </w:pPr>
+      <w:rPr>
+        <w:rFonts w:ascii="Symbol" w:hAnsi="Symbol" w:hint="default"/>
+      </w:rPr>
+    </w:lvl>
+    <w:lvl w:ilvl="1" w:tplc="08090003" w:tentative="1">
+      <w:start w:val="1"/>
+      <w:numFmt w:val="bullet"/>
+      <w:lvlText w:val="o"/>
+      <w:lvlJc w:val="left"/>
+      <w:pPr>
+        <w:ind w:left="1440" w:hanging="360"/>
+      </w:pPr>
+      <w:rPr>
+        <w:rFonts w:ascii="Courier New" w:hAnsi="Courier New" w:cs="Courier New" w:hint="default"/>
+      </w:rPr>
+    </w:lvl>
+    <w:lvl w:ilvl="2" w:tplc="08090005" w:tentative="1">
+      <w:start w:val="1"/>
+      <w:numFmt w:val="bullet"/>
+      <w:lvlText w:val=""/>
+      <w:lvlJc w:val="left"/>
+      <w:pPr>
+        <w:ind w:left="2160" w:hanging="360"/>
+      </w:pPr>
+      <w:rPr>
+        <w:rFonts w:ascii="Wingdings" w:hAnsi="Wingdings" w:hint="default"/>
+      </w:rPr>
+    </w:lvl>
+    <w:lvl w:ilvl="3" w:tplc="08090001" w:tentative="1">
+      <w:start w:val="1"/>
+      <w:numFmt w:val="bullet"/>
+      <w:lvlText w:val=""/>
+      <w:lvlJc w:val="left"/>
+      <w:pPr>
+        <w:ind w:left="2880" w:hanging="360"/>
+      </w:pPr>
+      <w:rPr>
+        <w:rFonts w:ascii="Symbol" w:hAnsi="Symbol" w:hint="default"/>
+      </w:rPr>
+    </w:lvl>
+    <w:lvl w:ilvl="4" w:tplc="08090003" w:tentative="1">
+      <w:start w:val="1"/>
+      <w:numFmt w:val="bullet"/>
+      <w:lvlText w:val="o"/>
+      <w:lvlJc w:val="left"/>
+      <w:pPr>
+        <w:ind w:left="3600" w:hanging="360"/>
+      </w:pPr>
+      <w:rPr>
+        <w:rFonts w:ascii="Courier New" w:hAnsi="Courier New" w:cs="Courier New" w:hint="default"/>
+      </w:rPr>
+    </w:lvl>
+    <w:lvl w:ilvl="5" w:tplc="08090005" w:tentative="1">
+      <w:start w:val="1"/>
+      <w:numFmt w:val="bullet"/>
+      <w:lvlText w:val=""/>
+      <w:lvlJc w:val="left"/>
+      <w:pPr>
+        <w:ind w:left="4320" w:hanging="360"/>
+      </w:pPr>
+      <w:rPr>
+        <w:rFonts w:ascii="Wingdings" w:hAnsi="Wingdings" w:hint="default"/>
+      </w:rPr>
+    </w:lvl>
+    <w:lvl w:ilvl="6" w:tplc="08090001" w:tentative="1">
+      <w:start w:val="1"/>
+      <w:numFmt w:val="bullet"/>
+      <w:lvlText w:val=""/>
+      <w:lvlJc w:val="left"/>
+      <w:pPr>
+        <w:ind w:left="5040" w:hanging="360"/>
+      </w:pPr>
+      <w:rPr>
+        <w:rFonts w:ascii="Symbol" w:hAnsi="Symbol" w:hint="default"/>
+      </w:rPr>
+    </w:lvl>
+    <w:lvl w:ilvl="7" w:tplc="08090003" w:tentative="1">
+      <w:start w:val="1"/>
+      <w:numFmt w:val="bullet"/>
+      <w:lvlText w:val="o"/>
+      <w:lvlJc w:val="left"/>
+      <w:pPr>
+        <w:ind w:left="5760" w:hanging="360"/>
+      </w:pPr>
+      <w:rPr>
+        <w:rFonts w:ascii="Courier New" w:hAnsi="Courier New" w:cs="Courier New" w:hint="default"/>
+      </w:rPr>
+    </w:lvl>
+    <w:lvl w:ilvl="8" w:tplc="08090005" w:tentative="1">
+      <w:start w:val="1"/>
+      <w:numFmt w:val="bullet"/>
+      <w:lvlText w:val=""/>
+      <w:lvlJc w:val="left"/>
+      <w:pPr>
+        <w:ind w:left="6480" w:hanging="360"/>
+      </w:pPr>
+      <w:rPr>
+        <w:rFonts w:ascii="Wingdings" w:hAnsi="Wingdings" w:hint="default"/>
+      </w:rPr>
+    </w:lvl>
+  </w:abstractNum>
   <w:num w:numId="1" w16cid:durableId="1701930696">
-    <w:abstractNumId w:val="4"/>
+    <w:abstractNumId w:val="5"/>
   </w:num>
   <w:num w:numId="2" w16cid:durableId="1842548276">
     <w:abstractNumId w:val="0"/>
   </w:num>
   <w:num w:numId="3" w16cid:durableId="1539927109">
-    <w:abstractNumId w:val="5"/>
+    <w:abstractNumId w:val="7"/>
   </w:num>
   <w:num w:numId="4" w16cid:durableId="829977371">
     <w:abstractNumId w:val="1"/>
@@ -2663,7 +2280,16 @@
     <w:abstractNumId w:val="2"/>
   </w:num>
   <w:num w:numId="6" w16cid:durableId="448285351">
+    <w:abstractNumId w:val="4"/>
+  </w:num>
+  <w:num w:numId="7" w16cid:durableId="1989281346">
     <w:abstractNumId w:val="3"/>
+  </w:num>
+  <w:num w:numId="8" w16cid:durableId="1263143941">
+    <w:abstractNumId w:val="6"/>
+  </w:num>
+  <w:num w:numId="9" w16cid:durableId="1135561271">
+    <w:abstractNumId w:val="8"/>
   </w:num>
 </w:numbering>
 </file>

</xml_diff>

<commit_message>
Add more cases from hobbit suite
</commit_message>
<xml_diff>
--- a/Masters project notes.docx
+++ b/Masters project notes.docx
@@ -53,11 +53,19 @@
           <w:lang w:val="fr-FR"/>
         </w:rPr>
       </w:pPr>
+      <w:proofErr w:type="spellStart"/>
       <w:r>
         <w:rPr>
           <w:lang w:val="fr-FR"/>
         </w:rPr>
-        <w:t xml:space="preserve">Pythonfuzz </w:t>
+        <w:t>Pythonfuzz</w:t>
+      </w:r>
+      <w:proofErr w:type="spellEnd"/>
+      <w:r>
+        <w:rPr>
+          <w:lang w:val="fr-FR"/>
+        </w:rPr>
+        <w:t xml:space="preserve"> </w:t>
       </w:r>
       <w:hyperlink r:id="rId6" w:history="1">
         <w:r>
@@ -78,7 +86,15 @@
         </w:numPr>
       </w:pPr>
       <w:r>
-        <w:t>Coverage-guided fuzzer for python</w:t>
+        <w:t xml:space="preserve">Coverage-guided </w:t>
+      </w:r>
+      <w:proofErr w:type="spellStart"/>
+      <w:r>
+        <w:t>fuzzer</w:t>
+      </w:r>
+      <w:proofErr w:type="spellEnd"/>
+      <w:r>
+        <w:t xml:space="preserve"> for python</w:t>
       </w:r>
     </w:p>
     <w:p>
@@ -110,7 +126,15 @@
         </w:numPr>
       </w:pPr>
       <w:r>
-        <w:t>Google’s coverage-guided fuzzer for python</w:t>
+        <w:t xml:space="preserve">Google’s coverage-guided </w:t>
+      </w:r>
+      <w:proofErr w:type="spellStart"/>
+      <w:r>
+        <w:t>fuzzer</w:t>
+      </w:r>
+      <w:proofErr w:type="spellEnd"/>
+      <w:r>
+        <w:t xml:space="preserve"> for python</w:t>
       </w:r>
     </w:p>
     <w:p>
@@ -130,15 +154,28 @@
         </w:rPr>
         <w:t xml:space="preserve">HypoFuzz </w:t>
       </w:r>
-      <w:hyperlink r:id="rId8" w:history="1">
-        <w:r>
-          <w:rPr>
-            <w:rStyle w:val="Hyperlink"/>
-            <w:lang w:val="de-DE"/>
-          </w:rPr>
-          <w:t>https://github.com/Zac-HD/hypofuzz</w:t>
-        </w:r>
-      </w:hyperlink>
+      <w:r>
+        <w:fldChar w:fldCharType="begin"/>
+      </w:r>
+      <w:r>
+        <w:rPr>
+          <w:lang w:val="de-DE"/>
+        </w:rPr>
+        <w:instrText>HYPERLINK "https://github.com/Zac-HD/hypofuzz"</w:instrText>
+      </w:r>
+      <w:r>
+        <w:fldChar w:fldCharType="separate"/>
+      </w:r>
+      <w:r>
+        <w:rPr>
+          <w:rStyle w:val="Hyperlink"/>
+          <w:lang w:val="de-DE"/>
+        </w:rPr>
+        <w:t>https://github.com/Zac-HD/hypofuzz</w:t>
+      </w:r>
+      <w:r>
+        <w:fldChar w:fldCharType="end"/>
+      </w:r>
     </w:p>
     <w:p>
       <w:pPr>
@@ -163,10 +200,15 @@
           <w:numId w:val="1"/>
         </w:numPr>
       </w:pPr>
-      <w:r>
-        <w:t xml:space="preserve">CrossHair </w:t>
-      </w:r>
-      <w:hyperlink r:id="rId9" w:history="1">
+      <w:proofErr w:type="spellStart"/>
+      <w:r>
+        <w:t>CrossHair</w:t>
+      </w:r>
+      <w:proofErr w:type="spellEnd"/>
+      <w:r>
+        <w:t xml:space="preserve"> </w:t>
+      </w:r>
+      <w:hyperlink r:id="rId8" w:history="1">
         <w:r>
           <w:rPr>
             <w:rStyle w:val="Hyperlink"/>
@@ -189,7 +231,39 @@
     </w:p>
     <w:p>
       <w:r>
-        <w:t>From my research, Hypothesis + HypoFuzz seems like it achieves everything that JQF does. Hypothesis is heavily inspired by QuickCheck and gives a property-based testing framework for python. It generates structured inputs and saves failing inputs for reproduction. It operates on the semantic properties of a program, making it inherently semantic-based. It is not coverage-guided by default, so HypoFuzz extends it for coverage-guided exploration thus providing a fuzzing framework.</w:t>
+        <w:t xml:space="preserve">From my research, Hypothesis + </w:t>
+      </w:r>
+      <w:proofErr w:type="spellStart"/>
+      <w:r>
+        <w:t>HypoFuzz</w:t>
+      </w:r>
+      <w:proofErr w:type="spellEnd"/>
+      <w:r>
+        <w:t xml:space="preserve"> seems like it achieves everything that JQF does. Hypothesis is heavily inspired by </w:t>
+      </w:r>
+      <w:proofErr w:type="spellStart"/>
+      <w:r>
+        <w:t>QuickCheck</w:t>
+      </w:r>
+      <w:proofErr w:type="spellEnd"/>
+      <w:r>
+        <w:t xml:space="preserve"> and gives a property-based testing framework for python. It generates structured inputs and saves failing inputs for reproduction. It operates on the semantic properties of a program, making it inherently </w:t>
+      </w:r>
+      <w:proofErr w:type="gramStart"/>
+      <w:r>
+        <w:t>semantic-based</w:t>
+      </w:r>
+      <w:proofErr w:type="gramEnd"/>
+      <w:r>
+        <w:t xml:space="preserve">. It is not coverage-guided by default, so </w:t>
+      </w:r>
+      <w:proofErr w:type="spellStart"/>
+      <w:r>
+        <w:t>HypoFuzz</w:t>
+      </w:r>
+      <w:proofErr w:type="spellEnd"/>
+      <w:r>
+        <w:t xml:space="preserve"> extends it for coverage-guided exploration thus providing a fuzzing framework.</w:t>
       </w:r>
     </w:p>
     <w:p/>
@@ -208,15 +282,28 @@
     </w:p>
     <w:p>
       <w:r>
-        <w:t>Generalise the stack example to any data structure/api</w:t>
-      </w:r>
+        <w:t>Generalise the stack example to any data structure/</w:t>
+      </w:r>
+      <w:proofErr w:type="spellStart"/>
+      <w:r>
+        <w:t>api</w:t>
+      </w:r>
+      <w:proofErr w:type="spellEnd"/>
       <w:r>
         <w:t xml:space="preserve"> that can take any type of arguments.</w:t>
       </w:r>
     </w:p>
     <w:p>
       <w:r>
-        <w:t>At some point, see if you can read the python script, create AST and traverse it in order to create the right test.</w:t>
+        <w:t xml:space="preserve">At some point, see if you can read the python script, create AST and traverse it </w:t>
+      </w:r>
+      <w:proofErr w:type="gramStart"/>
+      <w:r>
+        <w:t>in order to</w:t>
+      </w:r>
+      <w:proofErr w:type="gramEnd"/>
+      <w:r>
+        <w:t xml:space="preserve"> create the right test.</w:t>
       </w:r>
     </w:p>
     <w:p/>
@@ -230,18 +317,58 @@
         <w:t xml:space="preserve">Using it to test a very simple summing function </w:t>
       </w:r>
       <w:r>
-        <w:t>doesn’t work very well. I believe because of how universal is configured and how my two simple functions are configured, atheris is unable to quickly find the erroneous input.</w:t>
-      </w:r>
-    </w:p>
-    <w:p>
-      <w:r>
-        <w:t>I think the fact that fuzz testing is obfuscated inside the universal object the module is unable to correctly perform its algorithms to find erroneous inputs. I vibe coded a hypofuzz universal object and also tried manually implementing one and couldn’t get it to spot any bugs but given more time there may be a way to implement this. Just haven’t figured it out yet.</w:t>
+        <w:t xml:space="preserve">doesn’t work very well. I believe because of how universal is configured and how my two simple functions are configured, </w:t>
+      </w:r>
+      <w:proofErr w:type="spellStart"/>
+      <w:r>
+        <w:t>atheris</w:t>
+      </w:r>
+      <w:proofErr w:type="spellEnd"/>
+      <w:r>
+        <w:t xml:space="preserve"> is unable to quickly find the erroneous input.</w:t>
+      </w:r>
+    </w:p>
+    <w:p>
+      <w:r>
+        <w:t xml:space="preserve">I think the fact that fuzz testing is obfuscated inside the universal object the module is unable to correctly perform its algorithms to find erroneous inputs. I vibe coded a </w:t>
+      </w:r>
+      <w:proofErr w:type="spellStart"/>
+      <w:r>
+        <w:t>hypofuzz</w:t>
+      </w:r>
+      <w:proofErr w:type="spellEnd"/>
+      <w:r>
+        <w:t xml:space="preserve"> universal object </w:t>
+      </w:r>
+      <w:proofErr w:type="gramStart"/>
+      <w:r>
+        <w:t>and also</w:t>
+      </w:r>
+      <w:proofErr w:type="gramEnd"/>
+      <w:r>
+        <w:t xml:space="preserve"> tried manually implementing one and couldn’t get it to spot any bugs but given more time there may be a way to implement this. Just haven’t figured it out yet.</w:t>
       </w:r>
     </w:p>
     <w:p>
       <w:r>
         <w:lastRenderedPageBreak/>
-        <w:t>When comparing two different sorting algorithms, hypofuzz was unable to spot the difference when I added a small condition to quicksort if length is &gt;= 6, return the reversed list. For these one off conditions, coverage guidance actually makes it harder to spot the difference, as they provide very little feedback. Plain hypothesis was able to catch this bug (without coverage guidance)</w:t>
+        <w:t xml:space="preserve">When comparing two different sorting algorithms, </w:t>
+      </w:r>
+      <w:proofErr w:type="spellStart"/>
+      <w:r>
+        <w:t>hypofuzz</w:t>
+      </w:r>
+      <w:proofErr w:type="spellEnd"/>
+      <w:r>
+        <w:t xml:space="preserve"> was unable to spot the difference when I added a small condition to quicksort if length is &gt;= 6, return the reversed list. For these </w:t>
+      </w:r>
+      <w:proofErr w:type="gramStart"/>
+      <w:r>
+        <w:t>one off</w:t>
+      </w:r>
+      <w:proofErr w:type="gramEnd"/>
+      <w:r>
+        <w:t xml:space="preserve"> conditions, coverage guidance actually makes it harder to spot the difference, as they provide very little feedback. Plain hypothesis was able to catch this bug (without coverage guidance)</w:t>
       </w:r>
     </w:p>
     <w:p>
@@ -260,12 +387,57 @@
     </w:p>
     <w:p>
       <w:r>
-        <w:t xml:space="preserve">Testing universal object on two sorting algorithms always results in empty lists as universals value gets set to empty list if len() is called on it. This is bcos if we initialise it as a list of universals, this may be wrong as it may be intended to be a string. </w:t>
-      </w:r>
-    </w:p>
-    <w:p>
-      <w:r>
-        <w:t>Universal needs lt, gt, le, ge operators define</w:t>
+        <w:t xml:space="preserve">Testing universal object on two sorting algorithms always results in empty lists as universals value gets set to empty list if </w:t>
+      </w:r>
+      <w:proofErr w:type="spellStart"/>
+      <w:proofErr w:type="gramStart"/>
+      <w:r>
+        <w:t>len</w:t>
+      </w:r>
+      <w:proofErr w:type="spellEnd"/>
+      <w:r>
+        <w:t>(</w:t>
+      </w:r>
+      <w:proofErr w:type="gramEnd"/>
+      <w:r>
+        <w:t xml:space="preserve">) is called on it. This is </w:t>
+      </w:r>
+      <w:proofErr w:type="spellStart"/>
+      <w:r>
+        <w:t>bcos</w:t>
+      </w:r>
+      <w:proofErr w:type="spellEnd"/>
+      <w:r>
+        <w:t xml:space="preserve"> if we initialise it as a list of universals, this may be wrong as it may be intended to be a string. </w:t>
+      </w:r>
+    </w:p>
+    <w:p>
+      <w:r>
+        <w:t xml:space="preserve">Universal needs </w:t>
+      </w:r>
+      <w:proofErr w:type="spellStart"/>
+      <w:r>
+        <w:t>lt</w:t>
+      </w:r>
+      <w:proofErr w:type="spellEnd"/>
+      <w:r>
+        <w:t xml:space="preserve">, </w:t>
+      </w:r>
+      <w:proofErr w:type="spellStart"/>
+      <w:r>
+        <w:t>gt</w:t>
+      </w:r>
+      <w:proofErr w:type="spellEnd"/>
+      <w:r>
+        <w:t xml:space="preserve">, le, </w:t>
+      </w:r>
+      <w:proofErr w:type="spellStart"/>
+      <w:r>
+        <w:t>ge</w:t>
+      </w:r>
+      <w:proofErr w:type="spellEnd"/>
+      <w:r>
+        <w:t xml:space="preserve"> operators define</w:t>
       </w:r>
       <w:r>
         <w:t>d</w:t>
@@ -279,20 +451,99 @@
         <w:t>Universal does not support item assignment</w:t>
       </w:r>
       <w:r>
-        <w:t xml:space="preserve"> e.g the line</w:t>
-      </w:r>
-    </w:p>
-    <w:p>
-      <w:r>
-        <w:t>arr[i + 1], arr[high] = arr[high], arr[i + 1]</w:t>
-      </w:r>
-    </w:p>
-    <w:p>
-      <w:r>
-        <w:t>does not work if arr is a universal and each element of arr is a universal</w:t>
-      </w:r>
-      <w:r>
-        <w:t xml:space="preserve"> I “vibecoded” an implementation of this.</w:t>
+        <w:t xml:space="preserve"> </w:t>
+      </w:r>
+      <w:proofErr w:type="spellStart"/>
+      <w:r>
+        <w:t>e.g</w:t>
+      </w:r>
+      <w:proofErr w:type="spellEnd"/>
+      <w:r>
+        <w:t xml:space="preserve"> the line</w:t>
+      </w:r>
+    </w:p>
+    <w:p>
+      <w:proofErr w:type="spellStart"/>
+      <w:proofErr w:type="gramStart"/>
+      <w:r>
+        <w:t>arr</w:t>
+      </w:r>
+      <w:proofErr w:type="spellEnd"/>
+      <w:r>
+        <w:t>[</w:t>
+      </w:r>
+      <w:proofErr w:type="spellStart"/>
+      <w:proofErr w:type="gramEnd"/>
+      <w:r>
+        <w:t>i</w:t>
+      </w:r>
+      <w:proofErr w:type="spellEnd"/>
+      <w:r>
+        <w:t xml:space="preserve"> + 1], </w:t>
+      </w:r>
+      <w:proofErr w:type="spellStart"/>
+      <w:r>
+        <w:t>arr</w:t>
+      </w:r>
+      <w:proofErr w:type="spellEnd"/>
+      <w:r>
+        <w:t xml:space="preserve">[high] = </w:t>
+      </w:r>
+      <w:proofErr w:type="spellStart"/>
+      <w:r>
+        <w:t>arr</w:t>
+      </w:r>
+      <w:proofErr w:type="spellEnd"/>
+      <w:r>
+        <w:t xml:space="preserve">[high], </w:t>
+      </w:r>
+      <w:proofErr w:type="spellStart"/>
+      <w:r>
+        <w:t>arr</w:t>
+      </w:r>
+      <w:proofErr w:type="spellEnd"/>
+      <w:r>
+        <w:t>[</w:t>
+      </w:r>
+      <w:proofErr w:type="spellStart"/>
+      <w:r>
+        <w:t>i</w:t>
+      </w:r>
+      <w:proofErr w:type="spellEnd"/>
+      <w:r>
+        <w:t xml:space="preserve"> + 1]</w:t>
+      </w:r>
+    </w:p>
+    <w:p>
+      <w:r>
+        <w:t xml:space="preserve">does not work if </w:t>
+      </w:r>
+      <w:proofErr w:type="spellStart"/>
+      <w:r>
+        <w:t>arr</w:t>
+      </w:r>
+      <w:proofErr w:type="spellEnd"/>
+      <w:r>
+        <w:t xml:space="preserve"> is a universal and each element of </w:t>
+      </w:r>
+      <w:proofErr w:type="spellStart"/>
+      <w:r>
+        <w:t>arr</w:t>
+      </w:r>
+      <w:proofErr w:type="spellEnd"/>
+      <w:r>
+        <w:t xml:space="preserve"> is a universal</w:t>
+      </w:r>
+      <w:r>
+        <w:t xml:space="preserve"> I “</w:t>
+      </w:r>
+      <w:proofErr w:type="spellStart"/>
+      <w:r>
+        <w:t>vibecoded</w:t>
+      </w:r>
+      <w:proofErr w:type="spellEnd"/>
+      <w:r>
+        <w:t>” an implementation of this.</w:t>
       </w:r>
     </w:p>
     <w:p>
@@ -308,12 +559,36 @@
     </w:p>
     <w:p>
       <w:r>
-        <w:t>Read TypeEvalPy to find good frameworks for function parameters.</w:t>
-      </w:r>
-    </w:p>
-    <w:p>
-      <w:r>
-        <w:t xml:space="preserve">Tried HeaderGen as it was apparently the best for all categories including function parameters. When I tried it, it would only infer function return types and not parameters. The github only mentions that it can resolve function return types and I could not figure out any way to get it to infer parameter types. </w:t>
+        <w:t xml:space="preserve">Read </w:t>
+      </w:r>
+      <w:proofErr w:type="spellStart"/>
+      <w:r>
+        <w:t>TypeEvalPy</w:t>
+      </w:r>
+      <w:proofErr w:type="spellEnd"/>
+      <w:r>
+        <w:t xml:space="preserve"> to find good frameworks for function parameters.</w:t>
+      </w:r>
+    </w:p>
+    <w:p>
+      <w:r>
+        <w:t xml:space="preserve">Tried </w:t>
+      </w:r>
+      <w:proofErr w:type="spellStart"/>
+      <w:r>
+        <w:t>HeaderGen</w:t>
+      </w:r>
+      <w:proofErr w:type="spellEnd"/>
+      <w:r>
+        <w:t xml:space="preserve"> as it was apparently the best for all categories including function parameters. When I tried it, it would only infer function return types and not parameters. The </w:t>
+      </w:r>
+      <w:proofErr w:type="spellStart"/>
+      <w:r>
+        <w:t>github</w:t>
+      </w:r>
+      <w:proofErr w:type="spellEnd"/>
+      <w:r>
+        <w:t xml:space="preserve"> only mentions that it can resolve function return types and I could not figure out any way to get it to infer parameter types. </w:t>
       </w:r>
     </w:p>
     <w:p>
@@ -367,23 +642,103 @@
         </w:numPr>
       </w:pPr>
       <w:r>
-        <w:t xml:space="preserve">Hypothesis/Hypofuzz “Strategies” are how you define what is passed in to the function you want to fuzz. E.g  </w:t>
+        <w:t>Hypothesis/</w:t>
+      </w:r>
+      <w:proofErr w:type="spellStart"/>
+      <w:r>
+        <w:t>Hypofuzz</w:t>
+      </w:r>
+      <w:proofErr w:type="spellEnd"/>
+      <w:r>
+        <w:t xml:space="preserve"> “Strategies” are how you define what is passed </w:t>
+      </w:r>
+      <w:proofErr w:type="gramStart"/>
+      <w:r>
+        <w:t>in to</w:t>
+      </w:r>
+      <w:proofErr w:type="gramEnd"/>
+      <w:r>
+        <w:t xml:space="preserve"> the function you want to fuzz. </w:t>
+      </w:r>
+      <w:proofErr w:type="spellStart"/>
+      <w:r>
+        <w:t>E.g</w:t>
+      </w:r>
+      <w:proofErr w:type="spellEnd"/>
+      <w:r>
+        <w:t xml:space="preserve">  </w:t>
       </w:r>
     </w:p>
     <w:p>
       <w:r>
         <w:lastRenderedPageBreak/>
-        <w:t>@given(st.lists(st.integers() | st.floats()))</w:t>
-      </w:r>
-    </w:p>
-    <w:p>
-      <w:r>
-        <w:t>def test_sort_correct(lst):</w:t>
-      </w:r>
-    </w:p>
-    <w:p>
-      <w:r>
-        <w:t xml:space="preserve">    assert(my_sort(lst) == sorted(lst))</w:t>
+        <w:t>@given(</w:t>
+      </w:r>
+      <w:proofErr w:type="gramStart"/>
+      <w:r>
+        <w:t>st.lists</w:t>
+      </w:r>
+      <w:proofErr w:type="gramEnd"/>
+      <w:r>
+        <w:t xml:space="preserve">(st.integers() | </w:t>
+      </w:r>
+      <w:proofErr w:type="spellStart"/>
+      <w:r>
+        <w:t>st.floats</w:t>
+      </w:r>
+      <w:proofErr w:type="spellEnd"/>
+      <w:r>
+        <w:t>()))</w:t>
+      </w:r>
+    </w:p>
+    <w:p>
+      <w:r>
+        <w:t xml:space="preserve">def </w:t>
+      </w:r>
+      <w:proofErr w:type="spellStart"/>
+      <w:r>
+        <w:t>test_sort_correct</w:t>
+      </w:r>
+      <w:proofErr w:type="spellEnd"/>
+      <w:r>
+        <w:t>(</w:t>
+      </w:r>
+      <w:proofErr w:type="spellStart"/>
+      <w:r>
+        <w:t>lst</w:t>
+      </w:r>
+      <w:proofErr w:type="spellEnd"/>
+      <w:r>
+        <w:t>):</w:t>
+      </w:r>
+    </w:p>
+    <w:p>
+      <w:r>
+        <w:t xml:space="preserve">    assert(</w:t>
+      </w:r>
+      <w:proofErr w:type="spellStart"/>
+      <w:r>
+        <w:t>my_sort</w:t>
+      </w:r>
+      <w:proofErr w:type="spellEnd"/>
+      <w:r>
+        <w:t>(</w:t>
+      </w:r>
+      <w:proofErr w:type="spellStart"/>
+      <w:r>
+        <w:t>lst</w:t>
+      </w:r>
+      <w:proofErr w:type="spellEnd"/>
+      <w:r>
+        <w:t>) == sorted(</w:t>
+      </w:r>
+      <w:proofErr w:type="spellStart"/>
+      <w:r>
+        <w:t>lst</w:t>
+      </w:r>
+      <w:proofErr w:type="spellEnd"/>
+      <w:r>
+        <w:t>))</w:t>
       </w:r>
     </w:p>
     <w:p>
@@ -395,7 +750,23 @@
         </w:numPr>
       </w:pPr>
       <w:r>
-        <w:t>In that code snippet, the strategy is to fuzz my_sort with inputs of type list[int|str]</w:t>
+        <w:t xml:space="preserve">In that code snippet, the strategy is to fuzz </w:t>
+      </w:r>
+      <w:proofErr w:type="spellStart"/>
+      <w:r>
+        <w:t>my_sort</w:t>
+      </w:r>
+      <w:proofErr w:type="spellEnd"/>
+      <w:r>
+        <w:t xml:space="preserve"> with inputs of type list[</w:t>
+      </w:r>
+      <w:proofErr w:type="spellStart"/>
+      <w:r>
+        <w:t>int|str</w:t>
+      </w:r>
+      <w:proofErr w:type="spellEnd"/>
+      <w:r>
+        <w:t>]</w:t>
       </w:r>
     </w:p>
     <w:p>
@@ -407,7 +778,15 @@
         </w:numPr>
       </w:pPr>
       <w:r>
-        <w:t>In the case of my universal strategy, I simply fuzz with a strategy that can be though of as the following:</w:t>
+        <w:t xml:space="preserve">In the case of my universal strategy, I simply fuzz with a strategy that can be </w:t>
+      </w:r>
+      <w:proofErr w:type="spellStart"/>
+      <w:r>
+        <w:t>though</w:t>
+      </w:r>
+      <w:proofErr w:type="spellEnd"/>
+      <w:r>
+        <w:t xml:space="preserve"> of as the following:</w:t>
       </w:r>
     </w:p>
     <w:p>
@@ -418,8 +797,55 @@
           <w:numId w:val="3"/>
         </w:numPr>
       </w:pPr>
-      <w:r>
-        <w:t>strat = int|str|float|bool|None|list[strat]|dict[str,strat]|tuple[strat]</w:t>
+      <w:proofErr w:type="spellStart"/>
+      <w:r>
+        <w:t>strat</w:t>
+      </w:r>
+      <w:proofErr w:type="spellEnd"/>
+      <w:r>
+        <w:t xml:space="preserve"> = </w:t>
+      </w:r>
+      <w:proofErr w:type="spellStart"/>
+      <w:r>
+        <w:t>int|str|float|bool|None|list</w:t>
+      </w:r>
+      <w:proofErr w:type="spellEnd"/>
+      <w:r>
+        <w:t>[</w:t>
+      </w:r>
+      <w:proofErr w:type="spellStart"/>
+      <w:r>
+        <w:t>strat</w:t>
+      </w:r>
+      <w:proofErr w:type="spellEnd"/>
+      <w:r>
+        <w:t>]|</w:t>
+      </w:r>
+      <w:proofErr w:type="spellStart"/>
+      <w:r>
+        <w:t>dict</w:t>
+      </w:r>
+      <w:proofErr w:type="spellEnd"/>
+      <w:r>
+        <w:t>[</w:t>
+      </w:r>
+      <w:proofErr w:type="spellStart"/>
+      <w:proofErr w:type="gramStart"/>
+      <w:r>
+        <w:t>str,strat</w:t>
+      </w:r>
+      <w:proofErr w:type="spellEnd"/>
+      <w:proofErr w:type="gramEnd"/>
+      <w:r>
+        <w:t>]|tuple[</w:t>
+      </w:r>
+      <w:proofErr w:type="spellStart"/>
+      <w:r>
+        <w:t>strat</w:t>
+      </w:r>
+      <w:proofErr w:type="spellEnd"/>
+      <w:r>
+        <w:t>]</w:t>
       </w:r>
     </w:p>
     <w:p>
@@ -431,7 +857,15 @@
         </w:numPr>
       </w:pPr>
       <w:r>
-        <w:t>I have logic implemented so that if we encounter a TypeError, we discard the type that caused the error from the pool of possible types in our strategy for future iterations.</w:t>
+        <w:t xml:space="preserve">I have logic implemented so that if we encounter a </w:t>
+      </w:r>
+      <w:proofErr w:type="spellStart"/>
+      <w:r>
+        <w:t>TypeError</w:t>
+      </w:r>
+      <w:proofErr w:type="spellEnd"/>
+      <w:r>
+        <w:t>, we discard the type that caused the error from the pool of possible types in our strategy for future iterations.</w:t>
       </w:r>
     </w:p>
     <w:p>
@@ -443,7 +877,15 @@
         </w:numPr>
       </w:pPr>
       <w:r>
-        <w:t>It seems to work fairly well for the simple tests I have performed so far</w:t>
+        <w:t xml:space="preserve">It seems to work </w:t>
+      </w:r>
+      <w:proofErr w:type="gramStart"/>
+      <w:r>
+        <w:t>fairly well</w:t>
+      </w:r>
+      <w:proofErr w:type="gramEnd"/>
+      <w:r>
+        <w:t xml:space="preserve"> for the simple tests I have performed so far</w:t>
       </w:r>
     </w:p>
     <w:p>
@@ -455,7 +897,15 @@
         </w:numPr>
       </w:pPr>
       <w:r>
-        <w:t>Because it essentially brute forces fuzzing with different types until it works, I can imagine this being quite slow for fuzzing complex functions with lots of arguments but this will have to be tested more</w:t>
+        <w:t xml:space="preserve">Because it essentially brute forces fuzzing with different types until it works, I can imagine this being quite slow for fuzzing complex functions with lots of </w:t>
+      </w:r>
+      <w:proofErr w:type="gramStart"/>
+      <w:r>
+        <w:t>arguments</w:t>
+      </w:r>
+      <w:proofErr w:type="gramEnd"/>
+      <w:r>
+        <w:t xml:space="preserve"> but this will have to be tested more</w:t>
       </w:r>
     </w:p>
     <w:p>
@@ -478,17 +928,49 @@
     </w:p>
     <w:p>
       <w:r>
-        <w:t>If we assume there isn’t any explicit casting in the function we are fuzzing, how would a universal handle a situation where the type is ambiguous e.g calling len(universal). Len is valid for both string and list so how do we lock universal here?</w:t>
-      </w:r>
-    </w:p>
-    <w:p>
-      <w:r>
-        <w:t>Similarly, how would we define operators like plus (+) for example? If we have two universals u1 and u2, the statement u1 + u2 could imply that u1 and u2 are strings, ints, floats, lists, tuples so how can we implement this operator.</w:t>
-      </w:r>
-    </w:p>
-    <w:p>
-      <w:r>
-        <w:t>Theoretically speaking, at best we are determining the type of a (universal) object based on how that object is treated in the code and what functions and operations are applied to it. At best a perfect solution seems to me like it would essentially be a glorified type inference algorithm.</w:t>
+        <w:t xml:space="preserve">If we assume there isn’t any explicit casting in the function we are fuzzing, how would a universal handle a situation where the type is ambiguous </w:t>
+      </w:r>
+      <w:proofErr w:type="spellStart"/>
+      <w:r>
+        <w:t>e.g</w:t>
+      </w:r>
+      <w:proofErr w:type="spellEnd"/>
+      <w:r>
+        <w:t xml:space="preserve"> calling </w:t>
+      </w:r>
+      <w:proofErr w:type="spellStart"/>
+      <w:r>
+        <w:t>len</w:t>
+      </w:r>
+      <w:proofErr w:type="spellEnd"/>
+      <w:r>
+        <w:t>(universal). Len is valid for both string and list so how do we lock universal here?</w:t>
+      </w:r>
+    </w:p>
+    <w:p>
+      <w:r>
+        <w:t xml:space="preserve">Similarly, how would we define operators like plus (+) for example? If we have two universals u1 and u2, the statement u1 + u2 could imply that u1 and u2 are strings, </w:t>
+      </w:r>
+      <w:proofErr w:type="spellStart"/>
+      <w:r>
+        <w:t>ints</w:t>
+      </w:r>
+      <w:proofErr w:type="spellEnd"/>
+      <w:r>
+        <w:t>, floats, lists, tuples so how can we implement this operator.</w:t>
+      </w:r>
+    </w:p>
+    <w:p>
+      <w:r>
+        <w:t xml:space="preserve">Theoretically speaking, at best we are determining the type of a (universal) object based on how that object is treated in the code and what functions and operations are applied to it. At best a perfect solution seems to me like it would essentially be a glorified </w:t>
+      </w:r>
+      <w:proofErr w:type="gramStart"/>
+      <w:r>
+        <w:t>type</w:t>
+      </w:r>
+      <w:proofErr w:type="gramEnd"/>
+      <w:r>
+        <w:t xml:space="preserve"> inference algorithm.</w:t>
       </w:r>
     </w:p>
     <w:p/>
@@ -505,7 +987,15 @@
     <w:p>
       <w:r>
         <w:lastRenderedPageBreak/>
-        <w:t>See if func argument is callable, raise exception and print that the code is using callbacks which are not currently supported</w:t>
+        <w:t xml:space="preserve">See if </w:t>
+      </w:r>
+      <w:proofErr w:type="spellStart"/>
+      <w:r>
+        <w:t>func</w:t>
+      </w:r>
+      <w:proofErr w:type="spellEnd"/>
+      <w:r>
+        <w:t xml:space="preserve"> argument is callable, raise exception and print that the code is using callbacks which are not currently supported</w:t>
       </w:r>
     </w:p>
     <w:p/>
@@ -527,13 +1017,31 @@
         <w:t xml:space="preserve">classes </w:t>
       </w:r>
       <w:r>
-        <w:t>for 2 stack implementation</w:t>
-      </w:r>
-    </w:p>
-    <w:p>
-      <w:r>
-        <w:t>The fuzzer should :</w:t>
-      </w:r>
+        <w:t xml:space="preserve">for 2 stack </w:t>
+      </w:r>
+      <w:proofErr w:type="gramStart"/>
+      <w:r>
+        <w:t>implementation</w:t>
+      </w:r>
+      <w:proofErr w:type="gramEnd"/>
+    </w:p>
+    <w:p>
+      <w:r>
+        <w:t xml:space="preserve">The </w:t>
+      </w:r>
+      <w:proofErr w:type="spellStart"/>
+      <w:r>
+        <w:t>fuzzer</w:t>
+      </w:r>
+      <w:proofErr w:type="spellEnd"/>
+      <w:r>
+        <w:t xml:space="preserve"> </w:t>
+      </w:r>
+      <w:proofErr w:type="gramStart"/>
+      <w:r>
+        <w:t>should :</w:t>
+      </w:r>
+      <w:proofErr w:type="gramEnd"/>
     </w:p>
     <w:p>
       <w:r>
@@ -553,12 +1061,36 @@
     <w:p/>
     <w:p>
       <w:r>
-        <w:t>Added arg/kwarg support for fuzz testing strategy</w:t>
-      </w:r>
-    </w:p>
-    <w:p>
-      <w:r>
-        <w:t>Wrote basic first class equivalence tester</w:t>
+        <w:t xml:space="preserve">Added </w:t>
+      </w:r>
+      <w:proofErr w:type="spellStart"/>
+      <w:r>
+        <w:t>arg</w:t>
+      </w:r>
+      <w:proofErr w:type="spellEnd"/>
+      <w:r>
+        <w:t>/</w:t>
+      </w:r>
+      <w:proofErr w:type="spellStart"/>
+      <w:r>
+        <w:t>kwarg</w:t>
+      </w:r>
+      <w:proofErr w:type="spellEnd"/>
+      <w:r>
+        <w:t xml:space="preserve"> support for fuzz testing strategy</w:t>
+      </w:r>
+    </w:p>
+    <w:p>
+      <w:r>
+        <w:t xml:space="preserve">Wrote basic </w:t>
+      </w:r>
+      <w:proofErr w:type="gramStart"/>
+      <w:r>
+        <w:t>first class</w:t>
+      </w:r>
+      <w:proofErr w:type="gramEnd"/>
+      <w:r>
+        <w:t xml:space="preserve"> equivalence tester</w:t>
       </w:r>
     </w:p>
     <w:p>
@@ -578,12 +1110,36 @@
     </w:p>
     <w:p>
       <w:r>
-        <w:t>I have tried applying this equivalence tester to small refactors in real classes from open sources repos such as openai but have struggled to find working examples. My equivalence tester is quite situational. Method name/signature refactors and external dependencies cause issues</w:t>
-      </w:r>
-    </w:p>
-    <w:p>
-      <w:r>
-        <w:t>Tested it on two stack implementations, one that throws index error if you try to peek or pop and empty stack, and one that returns None for these operations. The fuzzer was able to pick up on this difference immediately</w:t>
+        <w:t xml:space="preserve">I have tried applying this equivalence tester to small refactors in real classes from open sources repos such as </w:t>
+      </w:r>
+      <w:proofErr w:type="spellStart"/>
+      <w:r>
+        <w:t>openai</w:t>
+      </w:r>
+      <w:proofErr w:type="spellEnd"/>
+      <w:r>
+        <w:t xml:space="preserve"> but have struggled to find working examples. My equivalence tester is quite situational. Method name/signature </w:t>
+      </w:r>
+      <w:proofErr w:type="gramStart"/>
+      <w:r>
+        <w:t>refactors</w:t>
+      </w:r>
+      <w:proofErr w:type="gramEnd"/>
+      <w:r>
+        <w:t xml:space="preserve"> and external dependencies cause issues</w:t>
+      </w:r>
+    </w:p>
+    <w:p>
+      <w:r>
+        <w:t xml:space="preserve">Tested it on two stack implementations, one that throws index error if you try to peek or pop and empty stack, and one that returns None for these operations. The </w:t>
+      </w:r>
+      <w:proofErr w:type="spellStart"/>
+      <w:r>
+        <w:t>fuzzer</w:t>
+      </w:r>
+      <w:proofErr w:type="spellEnd"/>
+      <w:r>
+        <w:t xml:space="preserve"> was able to pick up on this difference immediately</w:t>
       </w:r>
     </w:p>
     <w:p/>
@@ -619,7 +1175,7 @@
                     <pic:cNvPicPr/>
                   </pic:nvPicPr>
                   <pic:blipFill>
-                    <a:blip r:embed="rId10"/>
+                    <a:blip r:embed="rId9"/>
                     <a:stretch>
                       <a:fillRect/>
                     </a:stretch>
@@ -673,13 +1229,29 @@
     </w:p>
     <w:p>
       <w:r>
-        <w:t>What I mean by this is that currently, my code will test two classes for equivalence and if the classes have differing methods or even method names, the code will reject them. Allow the user to define a json file with the specific methods from the class that they want tested so they can exclude certain methods if they like, and optionally allow the user to also define specifically what arguments each method should be tested with.</w:t>
+        <w:t xml:space="preserve">What I mean by this is that currently, my code will test two classes for equivalence and if the classes have differing methods or even method names, the code will reject them. Allow the user to define a </w:t>
+      </w:r>
+      <w:proofErr w:type="spellStart"/>
+      <w:r>
+        <w:t>json</w:t>
+      </w:r>
+      <w:proofErr w:type="spellEnd"/>
+      <w:r>
+        <w:t xml:space="preserve"> file with the specific methods from the class that they want tested so they can exclude certain methods if they </w:t>
+      </w:r>
+      <w:proofErr w:type="gramStart"/>
+      <w:r>
+        <w:t>like, and</w:t>
+      </w:r>
+      <w:proofErr w:type="gramEnd"/>
+      <w:r>
+        <w:t xml:space="preserve"> optionally allow the user to also define specifically what arguments each method should be tested with.</w:t>
       </w:r>
     </w:p>
     <w:p/>
     <w:p/>
     <w:p>
-      <w:hyperlink r:id="rId11" w:history="1">
+      <w:hyperlink r:id="rId10" w:history="1">
         <w:r>
           <w:rPr>
             <w:rStyle w:val="Hyperlink"/>
@@ -714,7 +1286,15 @@
       </w:r>
       <w:r>
         <w:lastRenderedPageBreak/>
-        <w:t>duplicates, removing the need to fuzz both funcs. Useful in practice for speeding up a common case</w:t>
+        <w:t xml:space="preserve">duplicates, removing the need to fuzz both </w:t>
+      </w:r>
+      <w:proofErr w:type="spellStart"/>
+      <w:r>
+        <w:t>funcs</w:t>
+      </w:r>
+      <w:proofErr w:type="spellEnd"/>
+      <w:r>
+        <w:t>. Useful in practice for speeding up a common case</w:t>
       </w:r>
     </w:p>
     <w:p>
@@ -726,7 +1306,15 @@
         </w:numPr>
       </w:pPr>
       <w:r>
-        <w:t>Filter out funcs with no parameters and return values</w:t>
+        <w:t xml:space="preserve">Filter out </w:t>
+      </w:r>
+      <w:proofErr w:type="spellStart"/>
+      <w:r>
+        <w:t>funcs</w:t>
+      </w:r>
+      <w:proofErr w:type="spellEnd"/>
+      <w:r>
+        <w:t xml:space="preserve"> with no parameters and return values</w:t>
       </w:r>
     </w:p>
     <w:p>
@@ -738,7 +1326,15 @@
         </w:numPr>
       </w:pPr>
       <w:r>
-        <w:t>Possibly filter out funcs that invoke external classes or methods</w:t>
+        <w:t xml:space="preserve">Possibly filter out </w:t>
+      </w:r>
+      <w:proofErr w:type="spellStart"/>
+      <w:r>
+        <w:t>funcs</w:t>
+      </w:r>
+      <w:proofErr w:type="spellEnd"/>
+      <w:r>
+        <w:t xml:space="preserve"> that invoke external classes or methods</w:t>
       </w:r>
     </w:p>
     <w:p>
@@ -750,7 +1346,15 @@
         </w:numPr>
       </w:pPr>
       <w:r>
-        <w:t>They use pynguin which is a test generation framework that does not use fuzz testing</w:t>
+        <w:t xml:space="preserve">They use </w:t>
+      </w:r>
+      <w:proofErr w:type="spellStart"/>
+      <w:r>
+        <w:t>pynguin</w:t>
+      </w:r>
+      <w:proofErr w:type="spellEnd"/>
+      <w:r>
+        <w:t xml:space="preserve"> which is a test generation framework that does not use fuzz testing</w:t>
       </w:r>
     </w:p>
     <w:p>
@@ -770,7 +1374,15 @@
     </w:p>
     <w:p>
       <w:r>
-        <w:t>What if u have a class with 1 methods, a factory method which gives u back 3 methods</w:t>
+        <w:t xml:space="preserve">What if u have a class with 1 </w:t>
+      </w:r>
+      <w:proofErr w:type="gramStart"/>
+      <w:r>
+        <w:t>methods</w:t>
+      </w:r>
+      <w:proofErr w:type="gramEnd"/>
+      <w:r>
+        <w:t>, a factory method which gives u back 3 methods</w:t>
       </w:r>
     </w:p>
     <w:p>
@@ -792,7 +1404,7 @@
       </w:r>
     </w:p>
     <w:p>
-      <w:hyperlink r:id="rId12" w:history="1">
+      <w:hyperlink r:id="rId11" w:history="1">
         <w:r>
           <w:rPr>
             <w:rStyle w:val="Hyperlink"/>
@@ -803,13 +1415,29 @@
     </w:p>
     <w:p>
       <w:r>
-        <w:t>could instead go more practical, targeting datastructure implementations online</w:t>
+        <w:t xml:space="preserve">could instead go more practical, targeting </w:t>
+      </w:r>
+      <w:proofErr w:type="spellStart"/>
+      <w:r>
+        <w:t>datastructure</w:t>
+      </w:r>
+      <w:proofErr w:type="spellEnd"/>
+      <w:r>
+        <w:t xml:space="preserve"> implementations online</w:t>
       </w:r>
     </w:p>
     <w:p/>
     <w:p>
       <w:r>
-        <w:t xml:space="preserve">For function-function verification: I am currently implementing the case where both functions return (create) a new function. In this case I want to then perform the same function-function verification on these two new returned functions. The problem is the hypofuzz does not exactly allow for a recursive implementation like this. </w:t>
+        <w:t xml:space="preserve">For function-function verification: I am currently implementing the case where both functions return (create) a new function. In this case I want to then perform the same function-function verification on these two new returned functions. The problem is the </w:t>
+      </w:r>
+      <w:proofErr w:type="spellStart"/>
+      <w:r>
+        <w:t>hypofuzz</w:t>
+      </w:r>
+      <w:proofErr w:type="spellEnd"/>
+      <w:r>
+        <w:t xml:space="preserve"> does not exactly allow for a recursive implementation like this. </w:t>
       </w:r>
     </w:p>
     <w:p>
@@ -854,7 +1482,37 @@
         <w:rPr>
           <w:iCs/>
         </w:rPr>
-        <w:t>Other than this issue, another issue is trying to reason with functions that take callable parameters. Cant exactly fuzz a function as an input so im not sure what to do here</w:t>
+        <w:t xml:space="preserve">Other than this issue, another issue is trying to reason with functions that take callable parameters. </w:t>
+      </w:r>
+      <w:proofErr w:type="spellStart"/>
+      <w:proofErr w:type="gramStart"/>
+      <w:r>
+        <w:rPr>
+          <w:iCs/>
+        </w:rPr>
+        <w:t>Cant</w:t>
+      </w:r>
+      <w:proofErr w:type="spellEnd"/>
+      <w:proofErr w:type="gramEnd"/>
+      <w:r>
+        <w:rPr>
+          <w:iCs/>
+        </w:rPr>
+        <w:t xml:space="preserve"> exactly fuzz a function as an input so </w:t>
+      </w:r>
+      <w:proofErr w:type="spellStart"/>
+      <w:r>
+        <w:rPr>
+          <w:iCs/>
+        </w:rPr>
+        <w:t>im</w:t>
+      </w:r>
+      <w:proofErr w:type="spellEnd"/>
+      <w:r>
+        <w:rPr>
+          <w:iCs/>
+        </w:rPr>
+        <w:t xml:space="preserve"> not sure what to do here</w:t>
       </w:r>
       <w:r>
         <w:rPr>
@@ -891,7 +1549,7 @@
                     <pic:cNvPicPr/>
                   </pic:nvPicPr>
                   <pic:blipFill>
-                    <a:blip r:embed="rId13"/>
+                    <a:blip r:embed="rId12"/>
                     <a:stretch>
                       <a:fillRect/>
                     </a:stretch>
@@ -922,46 +1580,138 @@
         <w:rPr>
           <w:iCs/>
         </w:rPr>
-        <w:t>Using universal strategy + dummy functions (the testing framework doesn’t know that the function arg is necessarily callable so it uses universal strategy) it takes 11 minutes to find the difference in call_nested_param_ineq</w:t>
-      </w:r>
-      <w:r>
-        <w:rPr>
-          <w:iCs/>
-        </w:rPr>
-        <w:t>. Chances are, with type annotations this will be a bit faster as the tester will start passing in more callable args from the start</w:t>
-      </w:r>
-    </w:p>
-    <w:p>
-      <w:pPr>
-        <w:rPr>
-          <w:iCs/>
-        </w:rPr>
-      </w:pPr>
-      <w:r>
-        <w:rPr>
-          <w:iCs/>
-        </w:rPr>
-        <w:t>Adding a mechanism to see if an arg is “called” within a function should be pretty easy and should greatly improve time efficiency</w:t>
-      </w:r>
-    </w:p>
-    <w:p>
-      <w:pPr>
-        <w:rPr>
-          <w:iCs/>
-        </w:rPr>
-      </w:pPr>
-    </w:p>
-    <w:p>
-      <w:pPr>
-        <w:rPr>
-          <w:iCs/>
-        </w:rPr>
-      </w:pPr>
-      <w:r>
-        <w:rPr>
-          <w:iCs/>
-        </w:rPr>
-        <w:t>To be as faithful to the theory: we need to complicate/generalise f() so it can call any function it knows. Bound things, we don’t want more than 2 recursive calls, more than etc.</w:t>
+        <w:t xml:space="preserve">Using universal strategy + dummy functions (the testing framework doesn’t know that the function </w:t>
+      </w:r>
+      <w:proofErr w:type="spellStart"/>
+      <w:r>
+        <w:rPr>
+          <w:iCs/>
+        </w:rPr>
+        <w:t>arg</w:t>
+      </w:r>
+      <w:proofErr w:type="spellEnd"/>
+      <w:r>
+        <w:rPr>
+          <w:iCs/>
+        </w:rPr>
+        <w:t xml:space="preserve"> is necessarily </w:t>
+      </w:r>
+      <w:proofErr w:type="gramStart"/>
+      <w:r>
+        <w:rPr>
+          <w:iCs/>
+        </w:rPr>
+        <w:t>callable</w:t>
+      </w:r>
+      <w:proofErr w:type="gramEnd"/>
+      <w:r>
+        <w:rPr>
+          <w:iCs/>
+        </w:rPr>
+        <w:t xml:space="preserve"> so it uses universal strategy) it takes 11 minutes to find the difference in </w:t>
+      </w:r>
+      <w:proofErr w:type="spellStart"/>
+      <w:r>
+        <w:rPr>
+          <w:iCs/>
+        </w:rPr>
+        <w:t>call_nested_param_ineq</w:t>
+      </w:r>
+      <w:proofErr w:type="spellEnd"/>
+      <w:r>
+        <w:rPr>
+          <w:iCs/>
+        </w:rPr>
+        <w:t xml:space="preserve">. Chances are, with type annotations this will be a bit faster as the tester will start passing in more callable </w:t>
+      </w:r>
+      <w:proofErr w:type="spellStart"/>
+      <w:r>
+        <w:rPr>
+          <w:iCs/>
+        </w:rPr>
+        <w:t>args</w:t>
+      </w:r>
+      <w:proofErr w:type="spellEnd"/>
+      <w:r>
+        <w:rPr>
+          <w:iCs/>
+        </w:rPr>
+        <w:t xml:space="preserve"> from the start</w:t>
+      </w:r>
+    </w:p>
+    <w:p>
+      <w:pPr>
+        <w:rPr>
+          <w:iCs/>
+        </w:rPr>
+      </w:pPr>
+      <w:r>
+        <w:rPr>
+          <w:iCs/>
+        </w:rPr>
+        <w:t xml:space="preserve">Adding a mechanism to see if an </w:t>
+      </w:r>
+      <w:proofErr w:type="spellStart"/>
+      <w:r>
+        <w:rPr>
+          <w:iCs/>
+        </w:rPr>
+        <w:t>arg</w:t>
+      </w:r>
+      <w:proofErr w:type="spellEnd"/>
+      <w:r>
+        <w:rPr>
+          <w:iCs/>
+        </w:rPr>
+        <w:t xml:space="preserve"> is “called” within a function should be </w:t>
+      </w:r>
+      <w:proofErr w:type="gramStart"/>
+      <w:r>
+        <w:rPr>
+          <w:iCs/>
+        </w:rPr>
+        <w:t>pretty easy</w:t>
+      </w:r>
+      <w:proofErr w:type="gramEnd"/>
+      <w:r>
+        <w:rPr>
+          <w:iCs/>
+        </w:rPr>
+        <w:t xml:space="preserve"> and should greatly improve time efficiency</w:t>
+      </w:r>
+    </w:p>
+    <w:p>
+      <w:pPr>
+        <w:rPr>
+          <w:iCs/>
+        </w:rPr>
+      </w:pPr>
+    </w:p>
+    <w:p>
+      <w:pPr>
+        <w:rPr>
+          <w:iCs/>
+        </w:rPr>
+      </w:pPr>
+      <w:r>
+        <w:rPr>
+          <w:iCs/>
+        </w:rPr>
+        <w:t xml:space="preserve">To be as faithful to the theory: we need to complicate/generalise </w:t>
+      </w:r>
+      <w:proofErr w:type="gramStart"/>
+      <w:r>
+        <w:rPr>
+          <w:iCs/>
+        </w:rPr>
+        <w:t>f(</w:t>
+      </w:r>
+      <w:proofErr w:type="gramEnd"/>
+      <w:r>
+        <w:rPr>
+          <w:iCs/>
+        </w:rPr>
+        <w:t>) so it can call any function it knows. Bound things, we don’t want more than 2 recursive calls, more than etc.</w:t>
       </w:r>
     </w:p>
     <w:p>
@@ -1032,20 +1782,48 @@
         <w:rPr>
           <w:iCs/>
         </w:rPr>
-        <w:t>If I have time, extend f() functions to take and return numbers</w:t>
-      </w:r>
-    </w:p>
-    <w:p>
-      <w:pPr>
-        <w:rPr>
-          <w:iCs/>
-        </w:rPr>
-      </w:pPr>
-      <w:r>
-        <w:rPr>
-          <w:iCs/>
-        </w:rPr>
-        <w:t>Then I can look at test suites, try it out in some application areas where equivalence is important, property based testing test suite and run with my pipeline.</w:t>
+        <w:t xml:space="preserve">If I have time, extend </w:t>
+      </w:r>
+      <w:proofErr w:type="gramStart"/>
+      <w:r>
+        <w:rPr>
+          <w:iCs/>
+        </w:rPr>
+        <w:t>f(</w:t>
+      </w:r>
+      <w:proofErr w:type="gramEnd"/>
+      <w:r>
+        <w:rPr>
+          <w:iCs/>
+        </w:rPr>
+        <w:t>) functions to take and return numbers</w:t>
+      </w:r>
+    </w:p>
+    <w:p>
+      <w:pPr>
+        <w:rPr>
+          <w:iCs/>
+        </w:rPr>
+      </w:pPr>
+      <w:r>
+        <w:rPr>
+          <w:iCs/>
+        </w:rPr>
+        <w:t xml:space="preserve">Then I can look at test suites, try it out in some application areas where equivalence is important, </w:t>
+      </w:r>
+      <w:proofErr w:type="gramStart"/>
+      <w:r>
+        <w:rPr>
+          <w:iCs/>
+        </w:rPr>
+        <w:t>property based</w:t>
+      </w:r>
+      <w:proofErr w:type="gramEnd"/>
+      <w:r>
+        <w:rPr>
+          <w:iCs/>
+        </w:rPr>
+        <w:t xml:space="preserve"> testing test suite and run with my pipeline.</w:t>
       </w:r>
     </w:p>
     <w:p>
@@ -1100,33 +1878,79 @@
           <w:bCs/>
           <w:iCs/>
         </w:rPr>
-        <w:t>Pass a datastruct library thru a mutation testing suite to see how it performs against my pipeline, try to find examples my pipeline can find that the existing suite cant</w:t>
-      </w:r>
-    </w:p>
-    <w:p>
-      <w:pPr>
+        <w:t xml:space="preserve">Pass a </w:t>
+      </w:r>
+      <w:proofErr w:type="spellStart"/>
+      <w:r>
         <w:rPr>
           <w:b/>
           <w:bCs/>
           <w:iCs/>
         </w:rPr>
-      </w:pPr>
+        <w:t>datastruct</w:t>
+      </w:r>
+      <w:proofErr w:type="spellEnd"/>
       <w:r>
         <w:rPr>
           <w:b/>
           <w:bCs/>
           <w:iCs/>
         </w:rPr>
-        <w:t>Look at open source library with tests at the end</w:t>
-      </w:r>
-    </w:p>
-    <w:p>
-      <w:pPr>
+        <w:t xml:space="preserve"> library thru a mutation testing suite to see how it performs against my pipeline, try to find examples my pipeline can find that the existing suite </w:t>
+      </w:r>
+      <w:proofErr w:type="gramStart"/>
+      <w:r>
         <w:rPr>
           <w:b/>
           <w:bCs/>
           <w:iCs/>
         </w:rPr>
+        <w:t>cant</w:t>
+      </w:r>
+      <w:proofErr w:type="gramEnd"/>
+    </w:p>
+    <w:p>
+      <w:pPr>
+        <w:rPr>
+          <w:b/>
+          <w:bCs/>
+          <w:iCs/>
+        </w:rPr>
+      </w:pPr>
+      <w:r>
+        <w:rPr>
+          <w:b/>
+          <w:bCs/>
+          <w:iCs/>
+        </w:rPr>
+        <w:t xml:space="preserve">Look at </w:t>
+      </w:r>
+      <w:proofErr w:type="gramStart"/>
+      <w:r>
+        <w:rPr>
+          <w:b/>
+          <w:bCs/>
+          <w:iCs/>
+        </w:rPr>
+        <w:t>open source</w:t>
+      </w:r>
+      <w:proofErr w:type="gramEnd"/>
+      <w:r>
+        <w:rPr>
+          <w:b/>
+          <w:bCs/>
+          <w:iCs/>
+        </w:rPr>
+        <w:t xml:space="preserve"> library with tests at the end</w:t>
+      </w:r>
+    </w:p>
+    <w:p>
+      <w:pPr>
+        <w:rPr>
+          <w:b/>
+          <w:bCs/>
+          <w:iCs/>
+        </w:rPr>
       </w:pPr>
     </w:p>
     <w:p>
@@ -1145,7 +1969,21 @@
         <w:rPr>
           <w:iCs/>
         </w:rPr>
-        <w:t xml:space="preserve"> are_equivalent for profiler to check that the arguments to any function called by the top level</w:t>
+        <w:t xml:space="preserve"> </w:t>
+      </w:r>
+      <w:proofErr w:type="spellStart"/>
+      <w:r>
+        <w:rPr>
+          <w:iCs/>
+        </w:rPr>
+        <w:t>are_equivalent</w:t>
+      </w:r>
+      <w:proofErr w:type="spellEnd"/>
+      <w:r>
+        <w:rPr>
+          <w:iCs/>
+        </w:rPr>
+        <w:t xml:space="preserve"> for profiler to check that the arguments to any function called by the top level</w:t>
       </w:r>
       <w:r>
         <w:rPr>
@@ -1184,7 +2022,21 @@
         <w:rPr>
           <w:iCs/>
         </w:rPr>
-        <w:t>One idea: perform static analysis on the function we are fuzzing before we fuzz it to see if it takes a function f as a param, if that function f itself takes a param. Thus we can narrow down which function fuzzing strategy to employ</w:t>
+        <w:t xml:space="preserve">One idea: perform static analysis on the function we are fuzzing before we fuzz it to see if it takes a function f as a param, if that function f itself takes a param. </w:t>
+      </w:r>
+      <w:proofErr w:type="gramStart"/>
+      <w:r>
+        <w:rPr>
+          <w:iCs/>
+        </w:rPr>
+        <w:t>Thus</w:t>
+      </w:r>
+      <w:proofErr w:type="gramEnd"/>
+      <w:r>
+        <w:rPr>
+          <w:iCs/>
+        </w:rPr>
+        <w:t xml:space="preserve"> we can narrow down which function fuzzing strategy to employ</w:t>
       </w:r>
     </w:p>
     <w:p>
@@ -1220,8 +2072,56 @@
         <w:rPr>
           <w:iCs/>
         </w:rPr>
-        <w:t>Functions f that take a single function as a param like f(h): we can check the sig of the function h given, and fuzz some input accordingly to call h with within f.</w:t>
-      </w:r>
+        <w:t xml:space="preserve">Functions f that </w:t>
+      </w:r>
+      <w:proofErr w:type="gramStart"/>
+      <w:r>
+        <w:rPr>
+          <w:iCs/>
+        </w:rPr>
+        <w:t>take</w:t>
+      </w:r>
+      <w:proofErr w:type="gramEnd"/>
+      <w:r>
+        <w:rPr>
+          <w:iCs/>
+        </w:rPr>
+        <w:t xml:space="preserve"> a single function as a param like f(h): we can check the </w:t>
+      </w:r>
+      <w:proofErr w:type="spellStart"/>
+      <w:r>
+        <w:rPr>
+          <w:iCs/>
+        </w:rPr>
+        <w:t>sig</w:t>
+      </w:r>
+      <w:proofErr w:type="spellEnd"/>
+      <w:r>
+        <w:rPr>
+          <w:iCs/>
+        </w:rPr>
+        <w:t xml:space="preserve"> of the function h given, and fuzz some input accordingly to call h with within f.</w:t>
+      </w:r>
+    </w:p>
+    <w:p>
+      <w:pPr>
+        <w:rPr>
+          <w:iCs/>
+        </w:rPr>
+      </w:pPr>
+      <w:r>
+        <w:rPr>
+          <w:iCs/>
+        </w:rPr>
+        <w:t>We can reduce the search space of our program equivalence tester by filtering out “pure” functions. Generally, determining if a function in python in pure makes no sense since inputs to functions can be custom objects with overloaded definitions of operators that could violate purity, but since we only fuzz on a known set of types which are pythons basic data types, we can actually tell if a function is pure in this context and filter it from the set of possible operations called by program (module) equivalence.</w:t>
+      </w:r>
+    </w:p>
+    <w:p>
+      <w:pPr>
+        <w:rPr>
+          <w:iCs/>
+        </w:rPr>
+      </w:pPr>
     </w:p>
     <w:p/>
     <w:p>

</xml_diff>

<commit_message>
Add check for global state in program equivalence
</commit_message>
<xml_diff>
--- a/Masters project notes.docx
+++ b/Masters project notes.docx
@@ -247,15 +247,7 @@
       </w:r>
       <w:proofErr w:type="spellEnd"/>
       <w:r>
-        <w:t xml:space="preserve"> and gives a property-based testing framework for python. It generates structured inputs and saves failing inputs for reproduction. It operates on the semantic properties of a program, making it inherently </w:t>
-      </w:r>
-      <w:proofErr w:type="gramStart"/>
-      <w:r>
-        <w:t>semantic-based</w:t>
-      </w:r>
-      <w:proofErr w:type="gramEnd"/>
-      <w:r>
-        <w:t xml:space="preserve">. It is not coverage-guided by default, so </w:t>
+        <w:t xml:space="preserve"> and gives a property-based testing framework for python. It generates structured inputs and saves failing inputs for reproduction. It operates on the semantic properties of a program, making it inherently semantic-based. It is not coverage-guided by default, so </w:t>
       </w:r>
       <w:proofErr w:type="spellStart"/>
       <w:r>
@@ -295,15 +287,7 @@
     </w:p>
     <w:p>
       <w:r>
-        <w:t xml:space="preserve">At some point, see if you can read the python script, create AST and traverse it </w:t>
-      </w:r>
-      <w:proofErr w:type="gramStart"/>
-      <w:r>
-        <w:t>in order to</w:t>
-      </w:r>
-      <w:proofErr w:type="gramEnd"/>
-      <w:r>
-        <w:t xml:space="preserve"> create the right test.</w:t>
+        <w:t>At some point, see if you can read the python script, create AST and traverse it in order to create the right test.</w:t>
       </w:r>
     </w:p>
     <w:p/>
@@ -338,15 +322,7 @@
       </w:r>
       <w:proofErr w:type="spellEnd"/>
       <w:r>
-        <w:t xml:space="preserve"> universal object </w:t>
-      </w:r>
-      <w:proofErr w:type="gramStart"/>
-      <w:r>
-        <w:t>and also</w:t>
-      </w:r>
-      <w:proofErr w:type="gramEnd"/>
-      <w:r>
-        <w:t xml:space="preserve"> tried manually implementing one and couldn’t get it to spot any bugs but given more time there may be a way to implement this. Just haven’t figured it out yet.</w:t>
+        <w:t xml:space="preserve"> universal object and also tried manually implementing one and couldn’t get it to spot any bugs but given more time there may be a way to implement this. Just haven’t figured it out yet.</w:t>
       </w:r>
     </w:p>
     <w:p>
@@ -360,15 +336,7 @@
       </w:r>
       <w:proofErr w:type="spellEnd"/>
       <w:r>
-        <w:t xml:space="preserve"> was unable to spot the difference when I added a small condition to quicksort if length is &gt;= 6, return the reversed list. For these </w:t>
-      </w:r>
-      <w:proofErr w:type="gramStart"/>
-      <w:r>
-        <w:t>one off</w:t>
-      </w:r>
-      <w:proofErr w:type="gramEnd"/>
-      <w:r>
-        <w:t xml:space="preserve"> conditions, coverage guidance actually makes it harder to spot the difference, as they provide very little feedback. Plain hypothesis was able to catch this bug (without coverage guidance)</w:t>
+        <w:t xml:space="preserve"> was unable to spot the difference when I added a small condition to quicksort if length is &gt;= 6, return the reversed list. For these one off conditions, coverage guidance actually makes it harder to spot the difference, as they provide very little feedback. Plain hypothesis was able to catch this bug (without coverage guidance)</w:t>
       </w:r>
     </w:p>
     <w:p>
@@ -390,17 +358,12 @@
         <w:t xml:space="preserve">Testing universal object on two sorting algorithms always results in empty lists as universals value gets set to empty list if </w:t>
       </w:r>
       <w:proofErr w:type="spellStart"/>
-      <w:proofErr w:type="gramStart"/>
       <w:r>
         <w:t>len</w:t>
       </w:r>
       <w:proofErr w:type="spellEnd"/>
       <w:r>
-        <w:t>(</w:t>
-      </w:r>
-      <w:proofErr w:type="gramEnd"/>
-      <w:r>
-        <w:t xml:space="preserve">) is called on it. This is </w:t>
+        <w:t xml:space="preserve">() is called on it. This is </w:t>
       </w:r>
       <w:proofErr w:type="spellStart"/>
       <w:r>
@@ -464,7 +427,6 @@
     </w:p>
     <w:p>
       <w:proofErr w:type="spellStart"/>
-      <w:proofErr w:type="gramStart"/>
       <w:r>
         <w:t>arr</w:t>
       </w:r>
@@ -473,7 +435,6 @@
         <w:t>[</w:t>
       </w:r>
       <w:proofErr w:type="spellStart"/>
-      <w:proofErr w:type="gramEnd"/>
       <w:r>
         <w:t>i</w:t>
       </w:r>
@@ -650,15 +611,7 @@
       </w:r>
       <w:proofErr w:type="spellEnd"/>
       <w:r>
-        <w:t xml:space="preserve"> “Strategies” are how you define what is passed </w:t>
-      </w:r>
-      <w:proofErr w:type="gramStart"/>
-      <w:r>
-        <w:t>in to</w:t>
-      </w:r>
-      <w:proofErr w:type="gramEnd"/>
-      <w:r>
-        <w:t xml:space="preserve"> the function you want to fuzz. </w:t>
+        <w:t xml:space="preserve"> “Strategies” are how you define what is passed in to the function you want to fuzz. </w:t>
       </w:r>
       <w:proofErr w:type="spellStart"/>
       <w:r>
@@ -672,15 +625,7 @@
     <w:p>
       <w:r>
         <w:lastRenderedPageBreak/>
-        <w:t>@given(</w:t>
-      </w:r>
-      <w:proofErr w:type="gramStart"/>
-      <w:r>
-        <w:t>st.lists</w:t>
-      </w:r>
-      <w:proofErr w:type="gramEnd"/>
-      <w:r>
-        <w:t xml:space="preserve">(st.integers() | </w:t>
+        <w:t xml:space="preserve">@given(st.lists(st.integers() | </w:t>
       </w:r>
       <w:proofErr w:type="spellStart"/>
       <w:r>
@@ -830,12 +775,10 @@
         <w:t>[</w:t>
       </w:r>
       <w:proofErr w:type="spellStart"/>
-      <w:proofErr w:type="gramStart"/>
       <w:r>
         <w:t>str,strat</w:t>
       </w:r>
       <w:proofErr w:type="spellEnd"/>
-      <w:proofErr w:type="gramEnd"/>
       <w:r>
         <w:t>]|tuple[</w:t>
       </w:r>
@@ -877,15 +820,7 @@
         </w:numPr>
       </w:pPr>
       <w:r>
-        <w:t xml:space="preserve">It seems to work </w:t>
-      </w:r>
-      <w:proofErr w:type="gramStart"/>
-      <w:r>
-        <w:t>fairly well</w:t>
-      </w:r>
-      <w:proofErr w:type="gramEnd"/>
-      <w:r>
-        <w:t xml:space="preserve"> for the simple tests I have performed so far</w:t>
+        <w:t>It seems to work fairly well for the simple tests I have performed so far</w:t>
       </w:r>
     </w:p>
     <w:p>
@@ -897,15 +832,7 @@
         </w:numPr>
       </w:pPr>
       <w:r>
-        <w:t xml:space="preserve">Because it essentially brute forces fuzzing with different types until it works, I can imagine this being quite slow for fuzzing complex functions with lots of </w:t>
-      </w:r>
-      <w:proofErr w:type="gramStart"/>
-      <w:r>
-        <w:t>arguments</w:t>
-      </w:r>
-      <w:proofErr w:type="gramEnd"/>
-      <w:r>
-        <w:t xml:space="preserve"> but this will have to be tested more</w:t>
+        <w:t>Because it essentially brute forces fuzzing with different types until it works, I can imagine this being quite slow for fuzzing complex functions with lots of arguments but this will have to be tested more</w:t>
       </w:r>
     </w:p>
     <w:p>
@@ -962,15 +889,7 @@
     </w:p>
     <w:p>
       <w:r>
-        <w:t xml:space="preserve">Theoretically speaking, at best we are determining the type of a (universal) object based on how that object is treated in the code and what functions and operations are applied to it. At best a perfect solution seems to me like it would essentially be a glorified </w:t>
-      </w:r>
-      <w:proofErr w:type="gramStart"/>
-      <w:r>
-        <w:t>type</w:t>
-      </w:r>
-      <w:proofErr w:type="gramEnd"/>
-      <w:r>
-        <w:t xml:space="preserve"> inference algorithm.</w:t>
+        <w:t>Theoretically speaking, at best we are determining the type of a (universal) object based on how that object is treated in the code and what functions and operations are applied to it. At best a perfect solution seems to me like it would essentially be a glorified type inference algorithm.</w:t>
       </w:r>
     </w:p>
     <w:p/>
@@ -1017,13 +936,8 @@
         <w:t xml:space="preserve">classes </w:t>
       </w:r>
       <w:r>
-        <w:t xml:space="preserve">for 2 stack </w:t>
-      </w:r>
-      <w:proofErr w:type="gramStart"/>
-      <w:r>
-        <w:t>implementation</w:t>
-      </w:r>
-      <w:proofErr w:type="gramEnd"/>
+        <w:t>for 2 stack implementation</w:t>
+      </w:r>
     </w:p>
     <w:p>
       <w:r>
@@ -1035,13 +949,8 @@
       </w:r>
       <w:proofErr w:type="spellEnd"/>
       <w:r>
-        <w:t xml:space="preserve"> </w:t>
-      </w:r>
-      <w:proofErr w:type="gramStart"/>
-      <w:r>
-        <w:t>should :</w:t>
-      </w:r>
-      <w:proofErr w:type="gramEnd"/>
+        <w:t xml:space="preserve"> should :</w:t>
+      </w:r>
     </w:p>
     <w:p>
       <w:r>
@@ -1082,15 +991,7 @@
     </w:p>
     <w:p>
       <w:r>
-        <w:t xml:space="preserve">Wrote basic </w:t>
-      </w:r>
-      <w:proofErr w:type="gramStart"/>
-      <w:r>
-        <w:t>first class</w:t>
-      </w:r>
-      <w:proofErr w:type="gramEnd"/>
-      <w:r>
-        <w:t xml:space="preserve"> equivalence tester</w:t>
+        <w:t>Wrote basic first class equivalence tester</w:t>
       </w:r>
     </w:p>
     <w:p>
@@ -1118,15 +1019,7 @@
       </w:r>
       <w:proofErr w:type="spellEnd"/>
       <w:r>
-        <w:t xml:space="preserve"> but have struggled to find working examples. My equivalence tester is quite situational. Method name/signature </w:t>
-      </w:r>
-      <w:proofErr w:type="gramStart"/>
-      <w:r>
-        <w:t>refactors</w:t>
-      </w:r>
-      <w:proofErr w:type="gramEnd"/>
-      <w:r>
-        <w:t xml:space="preserve"> and external dependencies cause issues</w:t>
+        <w:t xml:space="preserve"> but have struggled to find working examples. My equivalence tester is quite situational. Method name/signature refactors and external dependencies cause issues</w:t>
       </w:r>
     </w:p>
     <w:p>
@@ -1237,15 +1130,7 @@
       </w:r>
       <w:proofErr w:type="spellEnd"/>
       <w:r>
-        <w:t xml:space="preserve"> file with the specific methods from the class that they want tested so they can exclude certain methods if they </w:t>
-      </w:r>
-      <w:proofErr w:type="gramStart"/>
-      <w:r>
-        <w:t>like, and</w:t>
-      </w:r>
-      <w:proofErr w:type="gramEnd"/>
-      <w:r>
-        <w:t xml:space="preserve"> optionally allow the user to also define specifically what arguments each method should be tested with.</w:t>
+        <w:t xml:space="preserve"> file with the specific methods from the class that they want tested so they can exclude certain methods if they like, and optionally allow the user to also define specifically what arguments each method should be tested with.</w:t>
       </w:r>
     </w:p>
     <w:p/>
@@ -1374,15 +1259,7 @@
     </w:p>
     <w:p>
       <w:r>
-        <w:t xml:space="preserve">What if u have a class with 1 </w:t>
-      </w:r>
-      <w:proofErr w:type="gramStart"/>
-      <w:r>
-        <w:t>methods</w:t>
-      </w:r>
-      <w:proofErr w:type="gramEnd"/>
-      <w:r>
-        <w:t>, a factory method which gives u back 3 methods</w:t>
+        <w:t>What if u have a class with 1 methods, a factory method which gives u back 3 methods</w:t>
       </w:r>
     </w:p>
     <w:p>
@@ -1485,7 +1362,6 @@
         <w:t xml:space="preserve">Other than this issue, another issue is trying to reason with functions that take callable parameters. </w:t>
       </w:r>
       <w:proofErr w:type="spellStart"/>
-      <w:proofErr w:type="gramStart"/>
       <w:r>
         <w:rPr>
           <w:iCs/>
@@ -1493,7 +1369,6 @@
         <w:t>Cant</w:t>
       </w:r>
       <w:proofErr w:type="spellEnd"/>
-      <w:proofErr w:type="gramEnd"/>
       <w:r>
         <w:rPr>
           <w:iCs/>
@@ -1594,21 +1469,7 @@
         <w:rPr>
           <w:iCs/>
         </w:rPr>
-        <w:t xml:space="preserve"> is necessarily </w:t>
-      </w:r>
-      <w:proofErr w:type="gramStart"/>
-      <w:r>
-        <w:rPr>
-          <w:iCs/>
-        </w:rPr>
-        <w:t>callable</w:t>
-      </w:r>
-      <w:proofErr w:type="gramEnd"/>
-      <w:r>
-        <w:rPr>
-          <w:iCs/>
-        </w:rPr>
-        <w:t xml:space="preserve"> so it uses universal strategy) it takes 11 minutes to find the difference in </w:t>
+        <w:t xml:space="preserve"> is necessarily callable so it uses universal strategy) it takes 11 minutes to find the difference in </w:t>
       </w:r>
       <w:proofErr w:type="spellStart"/>
       <w:r>
@@ -1663,55 +1524,27 @@
         <w:rPr>
           <w:iCs/>
         </w:rPr>
-        <w:t xml:space="preserve"> is “called” within a function should be </w:t>
-      </w:r>
-      <w:proofErr w:type="gramStart"/>
-      <w:r>
-        <w:rPr>
-          <w:iCs/>
-        </w:rPr>
-        <w:t>pretty easy</w:t>
-      </w:r>
-      <w:proofErr w:type="gramEnd"/>
-      <w:r>
-        <w:rPr>
-          <w:iCs/>
-        </w:rPr>
-        <w:t xml:space="preserve"> and should greatly improve time efficiency</w:t>
-      </w:r>
-    </w:p>
-    <w:p>
-      <w:pPr>
-        <w:rPr>
-          <w:iCs/>
-        </w:rPr>
-      </w:pPr>
-    </w:p>
-    <w:p>
-      <w:pPr>
-        <w:rPr>
-          <w:iCs/>
-        </w:rPr>
-      </w:pPr>
-      <w:r>
-        <w:rPr>
-          <w:iCs/>
-        </w:rPr>
-        <w:t xml:space="preserve">To be as faithful to the theory: we need to complicate/generalise </w:t>
-      </w:r>
-      <w:proofErr w:type="gramStart"/>
-      <w:r>
-        <w:rPr>
-          <w:iCs/>
-        </w:rPr>
-        <w:t>f(</w:t>
-      </w:r>
-      <w:proofErr w:type="gramEnd"/>
-      <w:r>
-        <w:rPr>
-          <w:iCs/>
-        </w:rPr>
-        <w:t>) so it can call any function it knows. Bound things, we don’t want more than 2 recursive calls, more than etc.</w:t>
+        <w:t xml:space="preserve"> is “called” within a function should be pretty easy and should greatly improve time efficiency</w:t>
+      </w:r>
+    </w:p>
+    <w:p>
+      <w:pPr>
+        <w:rPr>
+          <w:iCs/>
+        </w:rPr>
+      </w:pPr>
+    </w:p>
+    <w:p>
+      <w:pPr>
+        <w:rPr>
+          <w:iCs/>
+        </w:rPr>
+      </w:pPr>
+      <w:r>
+        <w:rPr>
+          <w:iCs/>
+        </w:rPr>
+        <w:t>To be as faithful to the theory: we need to complicate/generalise f() so it can call any function it knows. Bound things, we don’t want more than 2 recursive calls, more than etc.</w:t>
       </w:r>
     </w:p>
     <w:p>
@@ -1782,48 +1615,20 @@
         <w:rPr>
           <w:iCs/>
         </w:rPr>
-        <w:t xml:space="preserve">If I have time, extend </w:t>
-      </w:r>
-      <w:proofErr w:type="gramStart"/>
-      <w:r>
-        <w:rPr>
-          <w:iCs/>
-        </w:rPr>
-        <w:t>f(</w:t>
-      </w:r>
-      <w:proofErr w:type="gramEnd"/>
-      <w:r>
-        <w:rPr>
-          <w:iCs/>
-        </w:rPr>
-        <w:t>) functions to take and return numbers</w:t>
-      </w:r>
-    </w:p>
-    <w:p>
-      <w:pPr>
-        <w:rPr>
-          <w:iCs/>
-        </w:rPr>
-      </w:pPr>
-      <w:r>
-        <w:rPr>
-          <w:iCs/>
-        </w:rPr>
-        <w:t xml:space="preserve">Then I can look at test suites, try it out in some application areas where equivalence is important, </w:t>
-      </w:r>
-      <w:proofErr w:type="gramStart"/>
-      <w:r>
-        <w:rPr>
-          <w:iCs/>
-        </w:rPr>
-        <w:t>property based</w:t>
-      </w:r>
-      <w:proofErr w:type="gramEnd"/>
-      <w:r>
-        <w:rPr>
-          <w:iCs/>
-        </w:rPr>
-        <w:t xml:space="preserve"> testing test suite and run with my pipeline.</w:t>
+        <w:t>If I have time, extend f() functions to take and return numbers</w:t>
+      </w:r>
+    </w:p>
+    <w:p>
+      <w:pPr>
+        <w:rPr>
+          <w:iCs/>
+        </w:rPr>
+      </w:pPr>
+      <w:r>
+        <w:rPr>
+          <w:iCs/>
+        </w:rPr>
+        <w:t>Then I can look at test suites, try it out in some application areas where equivalence is important, property based testing test suite and run with my pipeline.</w:t>
       </w:r>
     </w:p>
     <w:p>
@@ -1896,61 +1701,33 @@
           <w:bCs/>
           <w:iCs/>
         </w:rPr>
-        <w:t xml:space="preserve"> library thru a mutation testing suite to see how it performs against my pipeline, try to find examples my pipeline can find that the existing suite </w:t>
-      </w:r>
-      <w:proofErr w:type="gramStart"/>
-      <w:r>
+        <w:t xml:space="preserve"> library thru a mutation testing suite to see how it performs against my pipeline, try to find examples my pipeline can find that the existing suite cant</w:t>
+      </w:r>
+    </w:p>
+    <w:p>
+      <w:pPr>
         <w:rPr>
           <w:b/>
           <w:bCs/>
           <w:iCs/>
         </w:rPr>
-        <w:t>cant</w:t>
-      </w:r>
-      <w:proofErr w:type="gramEnd"/>
-    </w:p>
-    <w:p>
-      <w:pPr>
+      </w:pPr>
+      <w:r>
         <w:rPr>
           <w:b/>
           <w:bCs/>
           <w:iCs/>
         </w:rPr>
-      </w:pPr>
-      <w:r>
+        <w:t>Look at open source library with tests at the end</w:t>
+      </w:r>
+    </w:p>
+    <w:p>
+      <w:pPr>
         <w:rPr>
           <w:b/>
           <w:bCs/>
           <w:iCs/>
         </w:rPr>
-        <w:t xml:space="preserve">Look at </w:t>
-      </w:r>
-      <w:proofErr w:type="gramStart"/>
-      <w:r>
-        <w:rPr>
-          <w:b/>
-          <w:bCs/>
-          <w:iCs/>
-        </w:rPr>
-        <w:t>open source</w:t>
-      </w:r>
-      <w:proofErr w:type="gramEnd"/>
-      <w:r>
-        <w:rPr>
-          <w:b/>
-          <w:bCs/>
-          <w:iCs/>
-        </w:rPr>
-        <w:t xml:space="preserve"> library with tests at the end</w:t>
-      </w:r>
-    </w:p>
-    <w:p>
-      <w:pPr>
-        <w:rPr>
-          <w:b/>
-          <w:bCs/>
-          <w:iCs/>
-        </w:rPr>
       </w:pPr>
     </w:p>
     <w:p>
@@ -2022,21 +1799,7 @@
         <w:rPr>
           <w:iCs/>
         </w:rPr>
-        <w:t xml:space="preserve">One idea: perform static analysis on the function we are fuzzing before we fuzz it to see if it takes a function f as a param, if that function f itself takes a param. </w:t>
-      </w:r>
-      <w:proofErr w:type="gramStart"/>
-      <w:r>
-        <w:rPr>
-          <w:iCs/>
-        </w:rPr>
-        <w:t>Thus</w:t>
-      </w:r>
-      <w:proofErr w:type="gramEnd"/>
-      <w:r>
-        <w:rPr>
-          <w:iCs/>
-        </w:rPr>
-        <w:t xml:space="preserve"> we can narrow down which function fuzzing strategy to employ</w:t>
+        <w:t>One idea: perform static analysis on the function we are fuzzing before we fuzz it to see if it takes a function f as a param, if that function f itself takes a param. Thus we can narrow down which function fuzzing strategy to employ</w:t>
       </w:r>
     </w:p>
     <w:p>
@@ -2072,21 +1835,7 @@
         <w:rPr>
           <w:iCs/>
         </w:rPr>
-        <w:t xml:space="preserve">Functions f that </w:t>
-      </w:r>
-      <w:proofErr w:type="gramStart"/>
-      <w:r>
-        <w:rPr>
-          <w:iCs/>
-        </w:rPr>
-        <w:t>take</w:t>
-      </w:r>
-      <w:proofErr w:type="gramEnd"/>
-      <w:r>
-        <w:rPr>
-          <w:iCs/>
-        </w:rPr>
-        <w:t xml:space="preserve"> a single function as a param like f(h): we can check the </w:t>
+        <w:t xml:space="preserve">Functions f that take a single function as a param like f(h): we can check the </w:t>
       </w:r>
       <w:proofErr w:type="spellStart"/>
       <w:r>
@@ -2115,6 +1864,310 @@
         </w:rPr>
         <w:t>We can reduce the search space of our program equivalence tester by filtering out “pure” functions. Generally, determining if a function in python in pure makes no sense since inputs to functions can be custom objects with overloaded definitions of operators that could violate purity, but since we only fuzz on a known set of types which are pythons basic data types, we can actually tell if a function is pure in this context and filter it from the set of possible operations called by program (module) equivalence.</w:t>
       </w:r>
+    </w:p>
+    <w:p>
+      <w:pPr>
+        <w:rPr>
+          <w:iCs/>
+        </w:rPr>
+      </w:pPr>
+    </w:p>
+    <w:p>
+      <w:pPr>
+        <w:rPr>
+          <w:iCs/>
+        </w:rPr>
+      </w:pPr>
+      <w:r>
+        <w:rPr>
+          <w:iCs/>
+        </w:rPr>
+        <w:t>To remember for the report:</w:t>
+      </w:r>
+    </w:p>
+    <w:p>
+      <w:pPr>
+        <w:rPr>
+          <w:iCs/>
+        </w:rPr>
+      </w:pPr>
+      <w:r>
+        <w:rPr>
+          <w:iCs/>
+        </w:rPr>
+        <w:t xml:space="preserve">If (state of </w:t>
+      </w:r>
+      <w:proofErr w:type="spellStart"/>
+      <w:r>
+        <w:rPr>
+          <w:iCs/>
+        </w:rPr>
+        <w:t>module_a</w:t>
+      </w:r>
+      <w:proofErr w:type="spellEnd"/>
+      <w:r>
+        <w:rPr>
+          <w:iCs/>
+        </w:rPr>
+        <w:t xml:space="preserve"> before running == state of </w:t>
+      </w:r>
+      <w:proofErr w:type="spellStart"/>
+      <w:r>
+        <w:rPr>
+          <w:iCs/>
+        </w:rPr>
+        <w:t>module_a</w:t>
+      </w:r>
+      <w:proofErr w:type="spellEnd"/>
+      <w:r>
+        <w:rPr>
+          <w:iCs/>
+        </w:rPr>
+        <w:t xml:space="preserve"> after n steps) !=</w:t>
+      </w:r>
+      <w:r>
+        <w:rPr>
+          <w:iCs/>
+        </w:rPr>
+        <w:br/>
+        <w:t xml:space="preserve">   (state of </w:t>
+      </w:r>
+      <w:proofErr w:type="spellStart"/>
+      <w:r>
+        <w:rPr>
+          <w:iCs/>
+        </w:rPr>
+        <w:t>module_b</w:t>
+      </w:r>
+      <w:proofErr w:type="spellEnd"/>
+      <w:r>
+        <w:rPr>
+          <w:iCs/>
+        </w:rPr>
+        <w:t xml:space="preserve"> before running == state of </w:t>
+      </w:r>
+      <w:proofErr w:type="spellStart"/>
+      <w:r>
+        <w:rPr>
+          <w:iCs/>
+        </w:rPr>
+        <w:t>module_b</w:t>
+      </w:r>
+      <w:proofErr w:type="spellEnd"/>
+      <w:r>
+        <w:rPr>
+          <w:iCs/>
+        </w:rPr>
+        <w:t xml:space="preserve"> after n steps):</w:t>
+      </w:r>
+      <w:r>
+        <w:rPr>
+          <w:iCs/>
+        </w:rPr>
+        <w:br/>
+        <w:t xml:space="preserve">   they are </w:t>
+      </w:r>
+      <w:proofErr w:type="spellStart"/>
+      <w:r>
+        <w:rPr>
+          <w:iCs/>
+        </w:rPr>
+        <w:t>inequiv</w:t>
+      </w:r>
+      <w:proofErr w:type="spellEnd"/>
+      <w:r>
+        <w:rPr>
+          <w:iCs/>
+        </w:rPr>
+        <w:br/>
+        <w:t xml:space="preserve">   </w:t>
+      </w:r>
+      <w:r>
+        <w:rPr>
+          <w:iCs/>
+        </w:rPr>
+        <w:br/>
+        <w:t xml:space="preserve">Some examples in plain </w:t>
+      </w:r>
+      <w:proofErr w:type="spellStart"/>
+      <w:r>
+        <w:rPr>
+          <w:iCs/>
+        </w:rPr>
+        <w:t>english</w:t>
+      </w:r>
+      <w:proofErr w:type="spellEnd"/>
+      <w:r>
+        <w:rPr>
+          <w:iCs/>
+        </w:rPr>
+        <w:t xml:space="preserve"> for my own sanity: </w:t>
+      </w:r>
+      <w:r>
+        <w:rPr>
+          <w:iCs/>
+        </w:rPr>
+        <w:br/>
+      </w:r>
+      <w:r>
+        <w:rPr>
+          <w:iCs/>
+        </w:rPr>
+        <w:br/>
+        <w:t xml:space="preserve">if </w:t>
+      </w:r>
+      <w:proofErr w:type="spellStart"/>
+      <w:r>
+        <w:rPr>
+          <w:iCs/>
+        </w:rPr>
+        <w:t>module_a</w:t>
+      </w:r>
+      <w:proofErr w:type="spellEnd"/>
+      <w:r>
+        <w:rPr>
+          <w:iCs/>
+        </w:rPr>
+        <w:t xml:space="preserve"> alters a global variable x after running n steps, but </w:t>
+      </w:r>
+      <w:proofErr w:type="spellStart"/>
+      <w:r>
+        <w:rPr>
+          <w:iCs/>
+        </w:rPr>
+        <w:t>module_b</w:t>
+      </w:r>
+      <w:proofErr w:type="spellEnd"/>
+      <w:r>
+        <w:rPr>
+          <w:iCs/>
+        </w:rPr>
+        <w:br/>
+        <w:t>does not alter any global variable x after running n steps, they are INEQUIVALENT.</w:t>
+      </w:r>
+      <w:r>
+        <w:rPr>
+          <w:iCs/>
+        </w:rPr>
+        <w:br/>
+      </w:r>
+      <w:r>
+        <w:rPr>
+          <w:iCs/>
+        </w:rPr>
+        <w:br/>
+        <w:t>if they both alter a global variable x in the same way after n steps, they are EQUIVALENT.</w:t>
+      </w:r>
+      <w:r>
+        <w:rPr>
+          <w:iCs/>
+        </w:rPr>
+        <w:br/>
+      </w:r>
+      <w:r>
+        <w:rPr>
+          <w:iCs/>
+        </w:rPr>
+        <w:br/>
+        <w:t xml:space="preserve">if </w:t>
+      </w:r>
+      <w:proofErr w:type="spellStart"/>
+      <w:r>
+        <w:rPr>
+          <w:iCs/>
+        </w:rPr>
+        <w:t>module_a</w:t>
+      </w:r>
+      <w:proofErr w:type="spellEnd"/>
+      <w:r>
+        <w:rPr>
+          <w:iCs/>
+        </w:rPr>
+        <w:t xml:space="preserve"> contains the definition of a global variable x, but it does not change, and </w:t>
+      </w:r>
+      <w:proofErr w:type="spellStart"/>
+      <w:r>
+        <w:rPr>
+          <w:iCs/>
+        </w:rPr>
+        <w:t>module_b</w:t>
+      </w:r>
+      <w:proofErr w:type="spellEnd"/>
+      <w:r>
+        <w:rPr>
+          <w:iCs/>
+        </w:rPr>
+        <w:t xml:space="preserve"> does not</w:t>
+      </w:r>
+      <w:r>
+        <w:rPr>
+          <w:iCs/>
+        </w:rPr>
+        <w:br/>
+        <w:t xml:space="preserve">define any global variables, then both modules states have changed (or not changed) in the same way and </w:t>
+      </w:r>
+      <w:r>
+        <w:rPr>
+          <w:iCs/>
+        </w:rPr>
+        <w:br/>
+        <w:t>they are INEQUIVALENT.</w:t>
+      </w:r>
+      <w:r>
+        <w:rPr>
+          <w:iCs/>
+        </w:rPr>
+        <w:br/>
+      </w:r>
+      <w:r>
+        <w:rPr>
+          <w:iCs/>
+        </w:rPr>
+        <w:br/>
+        <w:t xml:space="preserve">if </w:t>
+      </w:r>
+      <w:proofErr w:type="spellStart"/>
+      <w:r>
+        <w:rPr>
+          <w:iCs/>
+        </w:rPr>
+        <w:t>module_a</w:t>
+      </w:r>
+      <w:proofErr w:type="spellEnd"/>
+      <w:r>
+        <w:rPr>
+          <w:iCs/>
+        </w:rPr>
+        <w:t xml:space="preserve"> alters a global string variable s after running n steps, but </w:t>
+      </w:r>
+      <w:proofErr w:type="spellStart"/>
+      <w:r>
+        <w:rPr>
+          <w:iCs/>
+        </w:rPr>
+        <w:t>module_b</w:t>
+      </w:r>
+      <w:proofErr w:type="spellEnd"/>
+      <w:r>
+        <w:rPr>
+          <w:iCs/>
+        </w:rPr>
+        <w:t xml:space="preserve"> alters a global int</w:t>
+      </w:r>
+      <w:r>
+        <w:rPr>
+          <w:iCs/>
+        </w:rPr>
+        <w:br/>
+        <w:t>variable x after running n steps, they are INEQUIVALENT.</w:t>
+      </w:r>
+    </w:p>
+    <w:p>
+      <w:pPr>
+        <w:rPr>
+          <w:iCs/>
+        </w:rPr>
+      </w:pPr>
     </w:p>
     <w:p>
       <w:pPr>
@@ -3796,7 +3849,6 @@
   <w:style w:type="character" w:default="1" w:styleId="DefaultParagraphFont">
     <w:name w:val="Default Paragraph Font"/>
     <w:uiPriority w:val="1"/>
-    <w:semiHidden/>
     <w:unhideWhenUsed/>
   </w:style>
   <w:style w:type="table" w:default="1" w:styleId="TableNormal">

</xml_diff>

<commit_message>
Add more test cases, reorganise files
</commit_message>
<xml_diff>
--- a/Masters project notes.docx
+++ b/Masters project notes.docx
@@ -53,19 +53,11 @@
           <w:lang w:val="fr-FR"/>
         </w:rPr>
       </w:pPr>
-      <w:proofErr w:type="spellStart"/>
       <w:r>
         <w:rPr>
           <w:lang w:val="fr-FR"/>
         </w:rPr>
-        <w:t>Pythonfuzz</w:t>
-      </w:r>
-      <w:proofErr w:type="spellEnd"/>
-      <w:r>
-        <w:rPr>
-          <w:lang w:val="fr-FR"/>
-        </w:rPr>
-        <w:t xml:space="preserve"> </w:t>
+        <w:t xml:space="preserve">Pythonfuzz </w:t>
       </w:r>
       <w:hyperlink r:id="rId6" w:history="1">
         <w:r>
@@ -86,15 +78,7 @@
         </w:numPr>
       </w:pPr>
       <w:r>
-        <w:t xml:space="preserve">Coverage-guided </w:t>
-      </w:r>
-      <w:proofErr w:type="spellStart"/>
-      <w:r>
-        <w:t>fuzzer</w:t>
-      </w:r>
-      <w:proofErr w:type="spellEnd"/>
-      <w:r>
-        <w:t xml:space="preserve"> for python</w:t>
+        <w:t>Coverage-guided fuzzer for python</w:t>
       </w:r>
     </w:p>
     <w:p>
@@ -126,15 +110,7 @@
         </w:numPr>
       </w:pPr>
       <w:r>
-        <w:t xml:space="preserve">Google’s coverage-guided </w:t>
-      </w:r>
-      <w:proofErr w:type="spellStart"/>
-      <w:r>
-        <w:t>fuzzer</w:t>
-      </w:r>
-      <w:proofErr w:type="spellEnd"/>
-      <w:r>
-        <w:t xml:space="preserve"> for python</w:t>
+        <w:t>Google’s coverage-guided fuzzer for python</w:t>
       </w:r>
     </w:p>
     <w:p>
@@ -154,28 +130,15 @@
         </w:rPr>
         <w:t xml:space="preserve">HypoFuzz </w:t>
       </w:r>
-      <w:r>
-        <w:fldChar w:fldCharType="begin"/>
-      </w:r>
-      <w:r>
-        <w:rPr>
-          <w:lang w:val="de-DE"/>
-        </w:rPr>
-        <w:instrText>HYPERLINK "https://github.com/Zac-HD/hypofuzz"</w:instrText>
-      </w:r>
-      <w:r>
-        <w:fldChar w:fldCharType="separate"/>
-      </w:r>
-      <w:r>
-        <w:rPr>
-          <w:rStyle w:val="Hyperlink"/>
-          <w:lang w:val="de-DE"/>
-        </w:rPr>
-        <w:t>https://github.com/Zac-HD/hypofuzz</w:t>
-      </w:r>
-      <w:r>
-        <w:fldChar w:fldCharType="end"/>
-      </w:r>
+      <w:hyperlink r:id="rId8" w:history="1">
+        <w:r>
+          <w:rPr>
+            <w:rStyle w:val="Hyperlink"/>
+            <w:lang w:val="de-DE"/>
+          </w:rPr>
+          <w:t>https://github.com/Zac-HD/hypofuzz</w:t>
+        </w:r>
+      </w:hyperlink>
     </w:p>
     <w:p>
       <w:pPr>
@@ -200,15 +163,10 @@
           <w:numId w:val="1"/>
         </w:numPr>
       </w:pPr>
-      <w:proofErr w:type="spellStart"/>
-      <w:r>
-        <w:t>CrossHair</w:t>
-      </w:r>
-      <w:proofErr w:type="spellEnd"/>
-      <w:r>
-        <w:t xml:space="preserve"> </w:t>
-      </w:r>
-      <w:hyperlink r:id="rId8" w:history="1">
+      <w:r>
+        <w:t xml:space="preserve">CrossHair </w:t>
+      </w:r>
+      <w:hyperlink r:id="rId9" w:history="1">
         <w:r>
           <w:rPr>
             <w:rStyle w:val="Hyperlink"/>
@@ -231,31 +189,15 @@
     </w:p>
     <w:p>
       <w:r>
-        <w:t xml:space="preserve">From my research, Hypothesis + </w:t>
-      </w:r>
-      <w:proofErr w:type="spellStart"/>
-      <w:r>
-        <w:t>HypoFuzz</w:t>
-      </w:r>
-      <w:proofErr w:type="spellEnd"/>
-      <w:r>
-        <w:t xml:space="preserve"> seems like it achieves everything that JQF does. Hypothesis is heavily inspired by </w:t>
-      </w:r>
-      <w:proofErr w:type="spellStart"/>
-      <w:r>
-        <w:t>QuickCheck</w:t>
-      </w:r>
-      <w:proofErr w:type="spellEnd"/>
-      <w:r>
-        <w:t xml:space="preserve"> and gives a property-based testing framework for python. It generates structured inputs and saves failing inputs for reproduction. It operates on the semantic properties of a program, making it inherently semantic-based. It is not coverage-guided by default, so </w:t>
-      </w:r>
-      <w:proofErr w:type="spellStart"/>
-      <w:r>
-        <w:t>HypoFuzz</w:t>
-      </w:r>
-      <w:proofErr w:type="spellEnd"/>
-      <w:r>
-        <w:t xml:space="preserve"> extends it for coverage-guided exploration thus providing a fuzzing framework.</w:t>
+        <w:t xml:space="preserve">From my research, Hypothesis + HypoFuzz seems like it achieves everything that JQF does. Hypothesis is heavily inspired by QuickCheck and gives a property-based testing framework for python. It generates structured inputs and saves failing inputs for reproduction. It operates on the semantic properties of a program, making it inherently </w:t>
+      </w:r>
+      <w:proofErr w:type="gramStart"/>
+      <w:r>
+        <w:t>semantic-based</w:t>
+      </w:r>
+      <w:proofErr w:type="gramEnd"/>
+      <w:r>
+        <w:t>. It is not coverage-guided by default, so HypoFuzz extends it for coverage-guided exploration thus providing a fuzzing framework.</w:t>
       </w:r>
     </w:p>
     <w:p/>
@@ -274,20 +216,23 @@
     </w:p>
     <w:p>
       <w:r>
-        <w:t>Generalise the stack example to any data structure/</w:t>
-      </w:r>
-      <w:proofErr w:type="spellStart"/>
-      <w:r>
-        <w:t>api</w:t>
-      </w:r>
-      <w:proofErr w:type="spellEnd"/>
+        <w:t>Generalise the stack example to any data structure/api</w:t>
+      </w:r>
       <w:r>
         <w:t xml:space="preserve"> that can take any type of arguments.</w:t>
       </w:r>
     </w:p>
     <w:p>
       <w:r>
-        <w:t>At some point, see if you can read the python script, create AST and traverse it in order to create the right test.</w:t>
+        <w:t xml:space="preserve">At some point, see if you can read the python script, create AST and traverse it </w:t>
+      </w:r>
+      <w:proofErr w:type="gramStart"/>
+      <w:r>
+        <w:t>in order to</w:t>
+      </w:r>
+      <w:proofErr w:type="gramEnd"/>
+      <w:r>
+        <w:t xml:space="preserve"> create the right test.</w:t>
       </w:r>
     </w:p>
     <w:p/>
@@ -301,42 +246,34 @@
         <w:t xml:space="preserve">Using it to test a very simple summing function </w:t>
       </w:r>
       <w:r>
-        <w:t xml:space="preserve">doesn’t work very well. I believe because of how universal is configured and how my two simple functions are configured, </w:t>
-      </w:r>
-      <w:proofErr w:type="spellStart"/>
-      <w:r>
-        <w:t>atheris</w:t>
-      </w:r>
-      <w:proofErr w:type="spellEnd"/>
-      <w:r>
-        <w:t xml:space="preserve"> is unable to quickly find the erroneous input.</w:t>
-      </w:r>
-    </w:p>
-    <w:p>
-      <w:r>
-        <w:t xml:space="preserve">I think the fact that fuzz testing is obfuscated inside the universal object the module is unable to correctly perform its algorithms to find erroneous inputs. I vibe coded a </w:t>
-      </w:r>
-      <w:proofErr w:type="spellStart"/>
-      <w:r>
-        <w:t>hypofuzz</w:t>
-      </w:r>
-      <w:proofErr w:type="spellEnd"/>
-      <w:r>
-        <w:t xml:space="preserve"> universal object and also tried manually implementing one and couldn’t get it to spot any bugs but given more time there may be a way to implement this. Just haven’t figured it out yet.</w:t>
+        <w:t>doesn’t work very well. I believe because of how universal is configured and how my two simple functions are configured, atheris is unable to quickly find the erroneous input.</w:t>
+      </w:r>
+    </w:p>
+    <w:p>
+      <w:r>
+        <w:t xml:space="preserve">I think the fact that fuzz testing is obfuscated inside the universal object the module is unable to correctly perform its algorithms to find erroneous inputs. I vibe coded a hypofuzz universal object </w:t>
+      </w:r>
+      <w:proofErr w:type="gramStart"/>
+      <w:r>
+        <w:t>and also</w:t>
+      </w:r>
+      <w:proofErr w:type="gramEnd"/>
+      <w:r>
+        <w:t xml:space="preserve"> tried manually implementing one and couldn’t get it to spot any bugs but given more time there may be a way to implement this. Just haven’t figured it out yet.</w:t>
       </w:r>
     </w:p>
     <w:p>
       <w:r>
         <w:lastRenderedPageBreak/>
-        <w:t xml:space="preserve">When comparing two different sorting algorithms, </w:t>
-      </w:r>
-      <w:proofErr w:type="spellStart"/>
-      <w:r>
-        <w:t>hypofuzz</w:t>
-      </w:r>
-      <w:proofErr w:type="spellEnd"/>
-      <w:r>
-        <w:t xml:space="preserve"> was unable to spot the difference when I added a small condition to quicksort if length is &gt;= 6, return the reversed list. For these one off conditions, coverage guidance actually makes it harder to spot the difference, as they provide very little feedback. Plain hypothesis was able to catch this bug (without coverage guidance)</w:t>
+        <w:t xml:space="preserve">When comparing two different sorting algorithms, hypofuzz was unable to spot the difference when I added a small condition to quicksort if length is &gt;= 6, return the reversed list. For these </w:t>
+      </w:r>
+      <w:proofErr w:type="gramStart"/>
+      <w:r>
+        <w:t>one off</w:t>
+      </w:r>
+      <w:proofErr w:type="gramEnd"/>
+      <w:r>
+        <w:t xml:space="preserve"> conditions, coverage guidance actually makes it harder to spot the difference, as they provide very little feedback. Plain hypothesis was able to catch this bug (without coverage guidance)</w:t>
       </w:r>
     </w:p>
     <w:p>
@@ -357,50 +294,18 @@
       <w:r>
         <w:t xml:space="preserve">Testing universal object on two sorting algorithms always results in empty lists as universals value gets set to empty list if </w:t>
       </w:r>
-      <w:proofErr w:type="spellStart"/>
-      <w:r>
-        <w:t>len</w:t>
-      </w:r>
-      <w:proofErr w:type="spellEnd"/>
-      <w:r>
-        <w:t xml:space="preserve">() is called on it. This is </w:t>
-      </w:r>
-      <w:proofErr w:type="spellStart"/>
-      <w:r>
-        <w:t>bcos</w:t>
-      </w:r>
-      <w:proofErr w:type="spellEnd"/>
-      <w:r>
-        <w:t xml:space="preserve"> if we initialise it as a list of universals, this may be wrong as it may be intended to be a string. </w:t>
-      </w:r>
-    </w:p>
-    <w:p>
-      <w:r>
-        <w:t xml:space="preserve">Universal needs </w:t>
-      </w:r>
-      <w:proofErr w:type="spellStart"/>
-      <w:r>
-        <w:t>lt</w:t>
-      </w:r>
-      <w:proofErr w:type="spellEnd"/>
-      <w:r>
-        <w:t xml:space="preserve">, </w:t>
-      </w:r>
-      <w:proofErr w:type="spellStart"/>
-      <w:r>
-        <w:t>gt</w:t>
-      </w:r>
-      <w:proofErr w:type="spellEnd"/>
-      <w:r>
-        <w:t xml:space="preserve">, le, </w:t>
-      </w:r>
-      <w:proofErr w:type="spellStart"/>
-      <w:r>
-        <w:t>ge</w:t>
-      </w:r>
-      <w:proofErr w:type="spellEnd"/>
-      <w:r>
-        <w:t xml:space="preserve"> operators define</w:t>
+      <w:proofErr w:type="gramStart"/>
+      <w:r>
+        <w:t>len(</w:t>
+      </w:r>
+      <w:proofErr w:type="gramEnd"/>
+      <w:r>
+        <w:t xml:space="preserve">) is called on it. This is bcos if we initialise it as a list of universals, this may be wrong as it may be intended to be a string. </w:t>
+      </w:r>
+    </w:p>
+    <w:p>
+      <w:r>
+        <w:t>Universal needs lt, gt, le, ge operators define</w:t>
       </w:r>
       <w:r>
         <w:t>d</w:t>
@@ -414,97 +319,25 @@
         <w:t>Universal does not support item assignment</w:t>
       </w:r>
       <w:r>
-        <w:t xml:space="preserve"> </w:t>
-      </w:r>
-      <w:proofErr w:type="spellStart"/>
-      <w:r>
-        <w:t>e.g</w:t>
-      </w:r>
-      <w:proofErr w:type="spellEnd"/>
-      <w:r>
-        <w:t xml:space="preserve"> the line</w:t>
-      </w:r>
-    </w:p>
-    <w:p>
-      <w:proofErr w:type="spellStart"/>
-      <w:r>
-        <w:t>arr</w:t>
-      </w:r>
-      <w:proofErr w:type="spellEnd"/>
-      <w:r>
-        <w:t>[</w:t>
-      </w:r>
-      <w:proofErr w:type="spellStart"/>
-      <w:r>
-        <w:t>i</w:t>
-      </w:r>
-      <w:proofErr w:type="spellEnd"/>
-      <w:r>
-        <w:t xml:space="preserve"> + 1], </w:t>
-      </w:r>
-      <w:proofErr w:type="spellStart"/>
-      <w:r>
-        <w:t>arr</w:t>
-      </w:r>
-      <w:proofErr w:type="spellEnd"/>
-      <w:r>
-        <w:t xml:space="preserve">[high] = </w:t>
-      </w:r>
-      <w:proofErr w:type="spellStart"/>
-      <w:r>
-        <w:t>arr</w:t>
-      </w:r>
-      <w:proofErr w:type="spellEnd"/>
-      <w:r>
-        <w:t xml:space="preserve">[high], </w:t>
-      </w:r>
-      <w:proofErr w:type="spellStart"/>
-      <w:r>
-        <w:t>arr</w:t>
-      </w:r>
-      <w:proofErr w:type="spellEnd"/>
-      <w:r>
-        <w:t>[</w:t>
-      </w:r>
-      <w:proofErr w:type="spellStart"/>
-      <w:r>
-        <w:t>i</w:t>
-      </w:r>
-      <w:proofErr w:type="spellEnd"/>
-      <w:r>
-        <w:t xml:space="preserve"> + 1]</w:t>
-      </w:r>
-    </w:p>
-    <w:p>
-      <w:r>
-        <w:t xml:space="preserve">does not work if </w:t>
-      </w:r>
-      <w:proofErr w:type="spellStart"/>
-      <w:r>
-        <w:t>arr</w:t>
-      </w:r>
-      <w:proofErr w:type="spellEnd"/>
-      <w:r>
-        <w:t xml:space="preserve"> is a universal and each element of </w:t>
-      </w:r>
-      <w:proofErr w:type="spellStart"/>
-      <w:r>
-        <w:t>arr</w:t>
-      </w:r>
-      <w:proofErr w:type="spellEnd"/>
-      <w:r>
-        <w:t xml:space="preserve"> is a universal</w:t>
-      </w:r>
-      <w:r>
-        <w:t xml:space="preserve"> I “</w:t>
-      </w:r>
-      <w:proofErr w:type="spellStart"/>
-      <w:r>
-        <w:t>vibecoded</w:t>
-      </w:r>
-      <w:proofErr w:type="spellEnd"/>
-      <w:r>
-        <w:t>” an implementation of this.</w:t>
+        <w:t xml:space="preserve"> e.g the line</w:t>
+      </w:r>
+    </w:p>
+    <w:p>
+      <w:proofErr w:type="gramStart"/>
+      <w:r>
+        <w:t>arr[</w:t>
+      </w:r>
+      <w:proofErr w:type="gramEnd"/>
+      <w:r>
+        <w:t>i + 1], arr[high] = arr[high], arr[i + 1]</w:t>
+      </w:r>
+    </w:p>
+    <w:p>
+      <w:r>
+        <w:t>does not work if arr is a universal and each element of arr is a universal</w:t>
+      </w:r>
+      <w:r>
+        <w:t xml:space="preserve"> I “vibecoded” an implementation of this.</w:t>
       </w:r>
     </w:p>
     <w:p>
@@ -520,36 +353,12 @@
     </w:p>
     <w:p>
       <w:r>
-        <w:t xml:space="preserve">Read </w:t>
-      </w:r>
-      <w:proofErr w:type="spellStart"/>
-      <w:r>
-        <w:t>TypeEvalPy</w:t>
-      </w:r>
-      <w:proofErr w:type="spellEnd"/>
-      <w:r>
-        <w:t xml:space="preserve"> to find good frameworks for function parameters.</w:t>
-      </w:r>
-    </w:p>
-    <w:p>
-      <w:r>
-        <w:t xml:space="preserve">Tried </w:t>
-      </w:r>
-      <w:proofErr w:type="spellStart"/>
-      <w:r>
-        <w:t>HeaderGen</w:t>
-      </w:r>
-      <w:proofErr w:type="spellEnd"/>
-      <w:r>
-        <w:t xml:space="preserve"> as it was apparently the best for all categories including function parameters. When I tried it, it would only infer function return types and not parameters. The </w:t>
-      </w:r>
-      <w:proofErr w:type="spellStart"/>
-      <w:r>
-        <w:t>github</w:t>
-      </w:r>
-      <w:proofErr w:type="spellEnd"/>
-      <w:r>
-        <w:t xml:space="preserve"> only mentions that it can resolve function return types and I could not figure out any way to get it to infer parameter types. </w:t>
+        <w:t>Read TypeEvalPy to find good frameworks for function parameters.</w:t>
+      </w:r>
+    </w:p>
+    <w:p>
+      <w:r>
+        <w:t xml:space="preserve">Tried HeaderGen as it was apparently the best for all categories including function parameters. When I tried it, it would only infer function return types and not parameters. The github only mentions that it can resolve function return types and I could not figure out any way to get it to infer parameter types. </w:t>
       </w:r>
     </w:p>
     <w:p>
@@ -603,87 +412,39 @@
         </w:numPr>
       </w:pPr>
       <w:r>
-        <w:t>Hypothesis/</w:t>
-      </w:r>
-      <w:proofErr w:type="spellStart"/>
-      <w:r>
-        <w:t>Hypofuzz</w:t>
-      </w:r>
-      <w:proofErr w:type="spellEnd"/>
-      <w:r>
-        <w:t xml:space="preserve"> “Strategies” are how you define what is passed in to the function you want to fuzz. </w:t>
-      </w:r>
-      <w:proofErr w:type="spellStart"/>
-      <w:r>
-        <w:t>E.g</w:t>
-      </w:r>
-      <w:proofErr w:type="spellEnd"/>
-      <w:r>
-        <w:t xml:space="preserve">  </w:t>
+        <w:t xml:space="preserve">Hypothesis/Hypofuzz “Strategies” are how you define what is passed </w:t>
+      </w:r>
+      <w:proofErr w:type="gramStart"/>
+      <w:r>
+        <w:t>in to</w:t>
+      </w:r>
+      <w:proofErr w:type="gramEnd"/>
+      <w:r>
+        <w:t xml:space="preserve"> the function you want to fuzz. E.g  </w:t>
       </w:r>
     </w:p>
     <w:p>
       <w:r>
         <w:lastRenderedPageBreak/>
-        <w:t xml:space="preserve">@given(st.lists(st.integers() | </w:t>
-      </w:r>
-      <w:proofErr w:type="spellStart"/>
-      <w:r>
-        <w:t>st.floats</w:t>
-      </w:r>
-      <w:proofErr w:type="spellEnd"/>
-      <w:r>
-        <w:t>()))</w:t>
-      </w:r>
-    </w:p>
-    <w:p>
-      <w:r>
-        <w:t xml:space="preserve">def </w:t>
-      </w:r>
-      <w:proofErr w:type="spellStart"/>
-      <w:r>
-        <w:t>test_sort_correct</w:t>
-      </w:r>
-      <w:proofErr w:type="spellEnd"/>
-      <w:r>
-        <w:t>(</w:t>
-      </w:r>
-      <w:proofErr w:type="spellStart"/>
-      <w:r>
-        <w:t>lst</w:t>
-      </w:r>
-      <w:proofErr w:type="spellEnd"/>
-      <w:r>
-        <w:t>):</w:t>
-      </w:r>
-    </w:p>
-    <w:p>
-      <w:r>
-        <w:t xml:space="preserve">    assert(</w:t>
-      </w:r>
-      <w:proofErr w:type="spellStart"/>
-      <w:r>
-        <w:t>my_sort</w:t>
-      </w:r>
-      <w:proofErr w:type="spellEnd"/>
-      <w:r>
-        <w:t>(</w:t>
-      </w:r>
-      <w:proofErr w:type="spellStart"/>
-      <w:r>
-        <w:t>lst</w:t>
-      </w:r>
-      <w:proofErr w:type="spellEnd"/>
-      <w:r>
-        <w:t>) == sorted(</w:t>
-      </w:r>
-      <w:proofErr w:type="spellStart"/>
-      <w:r>
-        <w:t>lst</w:t>
-      </w:r>
-      <w:proofErr w:type="spellEnd"/>
-      <w:r>
-        <w:t>))</w:t>
+        <w:t>@given(</w:t>
+      </w:r>
+      <w:proofErr w:type="gramStart"/>
+      <w:r>
+        <w:t>st.lists</w:t>
+      </w:r>
+      <w:proofErr w:type="gramEnd"/>
+      <w:r>
+        <w:t>(st.integers() | st.floats()))</w:t>
+      </w:r>
+    </w:p>
+    <w:p>
+      <w:r>
+        <w:t>def test_sort_correct(lst):</w:t>
+      </w:r>
+    </w:p>
+    <w:p>
+      <w:r>
+        <w:t xml:space="preserve">    assert(my_sort(lst) == sorted(lst))</w:t>
       </w:r>
     </w:p>
     <w:p>
@@ -695,23 +456,7 @@
         </w:numPr>
       </w:pPr>
       <w:r>
-        <w:t xml:space="preserve">In that code snippet, the strategy is to fuzz </w:t>
-      </w:r>
-      <w:proofErr w:type="spellStart"/>
-      <w:r>
-        <w:t>my_sort</w:t>
-      </w:r>
-      <w:proofErr w:type="spellEnd"/>
-      <w:r>
-        <w:t xml:space="preserve"> with inputs of type list[</w:t>
-      </w:r>
-      <w:proofErr w:type="spellStart"/>
-      <w:r>
-        <w:t>int|str</w:t>
-      </w:r>
-      <w:proofErr w:type="spellEnd"/>
-      <w:r>
-        <w:t>]</w:t>
+        <w:t>In that code snippet, the strategy is to fuzz my_sort with inputs of type list[int|str]</w:t>
       </w:r>
     </w:p>
     <w:p>
@@ -723,15 +468,7 @@
         </w:numPr>
       </w:pPr>
       <w:r>
-        <w:t xml:space="preserve">In the case of my universal strategy, I simply fuzz with a strategy that can be </w:t>
-      </w:r>
-      <w:proofErr w:type="spellStart"/>
-      <w:r>
-        <w:t>though</w:t>
-      </w:r>
-      <w:proofErr w:type="spellEnd"/>
-      <w:r>
-        <w:t xml:space="preserve"> of as the following:</w:t>
+        <w:t>In the case of my universal strategy, I simply fuzz with a strategy that can be though of as the following:</w:t>
       </w:r>
     </w:p>
     <w:p>
@@ -742,53 +479,16 @@
           <w:numId w:val="3"/>
         </w:numPr>
       </w:pPr>
-      <w:proofErr w:type="spellStart"/>
-      <w:r>
-        <w:t>strat</w:t>
-      </w:r>
-      <w:proofErr w:type="spellEnd"/>
-      <w:r>
-        <w:t xml:space="preserve"> = </w:t>
-      </w:r>
-      <w:proofErr w:type="spellStart"/>
-      <w:r>
-        <w:t>int|str|float|bool|None|list</w:t>
-      </w:r>
-      <w:proofErr w:type="spellEnd"/>
-      <w:r>
-        <w:t>[</w:t>
-      </w:r>
-      <w:proofErr w:type="spellStart"/>
-      <w:r>
-        <w:t>strat</w:t>
-      </w:r>
-      <w:proofErr w:type="spellEnd"/>
-      <w:r>
-        <w:t>]|</w:t>
-      </w:r>
-      <w:proofErr w:type="spellStart"/>
-      <w:r>
-        <w:t>dict</w:t>
-      </w:r>
-      <w:proofErr w:type="spellEnd"/>
-      <w:r>
-        <w:t>[</w:t>
-      </w:r>
-      <w:proofErr w:type="spellStart"/>
+      <w:r>
+        <w:t>strat = int|str|float|bool|None|list[strat]|dict[</w:t>
+      </w:r>
+      <w:proofErr w:type="gramStart"/>
       <w:r>
         <w:t>str,strat</w:t>
       </w:r>
-      <w:proofErr w:type="spellEnd"/>
-      <w:r>
-        <w:t>]|tuple[</w:t>
-      </w:r>
-      <w:proofErr w:type="spellStart"/>
-      <w:r>
-        <w:t>strat</w:t>
-      </w:r>
-      <w:proofErr w:type="spellEnd"/>
-      <w:r>
-        <w:t>]</w:t>
+      <w:proofErr w:type="gramEnd"/>
+      <w:r>
+        <w:t>]|tuple[strat]</w:t>
       </w:r>
     </w:p>
     <w:p>
@@ -800,15 +500,7 @@
         </w:numPr>
       </w:pPr>
       <w:r>
-        <w:t xml:space="preserve">I have logic implemented so that if we encounter a </w:t>
-      </w:r>
-      <w:proofErr w:type="spellStart"/>
-      <w:r>
-        <w:t>TypeError</w:t>
-      </w:r>
-      <w:proofErr w:type="spellEnd"/>
-      <w:r>
-        <w:t>, we discard the type that caused the error from the pool of possible types in our strategy for future iterations.</w:t>
+        <w:t>I have logic implemented so that if we encounter a TypeError, we discard the type that caused the error from the pool of possible types in our strategy for future iterations.</w:t>
       </w:r>
     </w:p>
     <w:p>
@@ -820,7 +512,15 @@
         </w:numPr>
       </w:pPr>
       <w:r>
-        <w:t>It seems to work fairly well for the simple tests I have performed so far</w:t>
+        <w:t xml:space="preserve">It seems to work </w:t>
+      </w:r>
+      <w:proofErr w:type="gramStart"/>
+      <w:r>
+        <w:t>fairly well</w:t>
+      </w:r>
+      <w:proofErr w:type="gramEnd"/>
+      <w:r>
+        <w:t xml:space="preserve"> for the simple tests I have performed so far</w:t>
       </w:r>
     </w:p>
     <w:p>
@@ -832,7 +532,15 @@
         </w:numPr>
       </w:pPr>
       <w:r>
-        <w:t>Because it essentially brute forces fuzzing with different types until it works, I can imagine this being quite slow for fuzzing complex functions with lots of arguments but this will have to be tested more</w:t>
+        <w:t xml:space="preserve">Because it essentially brute forces fuzzing with different types until it works, I can imagine this being quite slow for fuzzing complex functions with lots of </w:t>
+      </w:r>
+      <w:proofErr w:type="gramStart"/>
+      <w:r>
+        <w:t>arguments</w:t>
+      </w:r>
+      <w:proofErr w:type="gramEnd"/>
+      <w:r>
+        <w:t xml:space="preserve"> but this will have to be tested more</w:t>
       </w:r>
     </w:p>
     <w:p>
@@ -855,41 +563,25 @@
     </w:p>
     <w:p>
       <w:r>
-        <w:t xml:space="preserve">If we assume there isn’t any explicit casting in the function we are fuzzing, how would a universal handle a situation where the type is ambiguous </w:t>
-      </w:r>
-      <w:proofErr w:type="spellStart"/>
-      <w:r>
-        <w:t>e.g</w:t>
-      </w:r>
-      <w:proofErr w:type="spellEnd"/>
-      <w:r>
-        <w:t xml:space="preserve"> calling </w:t>
-      </w:r>
-      <w:proofErr w:type="spellStart"/>
-      <w:r>
-        <w:t>len</w:t>
-      </w:r>
-      <w:proofErr w:type="spellEnd"/>
-      <w:r>
-        <w:t>(universal). Len is valid for both string and list so how do we lock universal here?</w:t>
-      </w:r>
-    </w:p>
-    <w:p>
-      <w:r>
-        <w:t xml:space="preserve">Similarly, how would we define operators like plus (+) for example? If we have two universals u1 and u2, the statement u1 + u2 could imply that u1 and u2 are strings, </w:t>
-      </w:r>
-      <w:proofErr w:type="spellStart"/>
-      <w:r>
-        <w:t>ints</w:t>
-      </w:r>
-      <w:proofErr w:type="spellEnd"/>
-      <w:r>
-        <w:t>, floats, lists, tuples so how can we implement this operator.</w:t>
-      </w:r>
-    </w:p>
-    <w:p>
-      <w:r>
-        <w:t>Theoretically speaking, at best we are determining the type of a (universal) object based on how that object is treated in the code and what functions and operations are applied to it. At best a perfect solution seems to me like it would essentially be a glorified type inference algorithm.</w:t>
+        <w:t>If we assume there isn’t any explicit casting in the function we are fuzzing, how would a universal handle a situation where the type is ambiguous e.g calling len(universal). Len is valid for both string and list so how do we lock universal here?</w:t>
+      </w:r>
+    </w:p>
+    <w:p>
+      <w:r>
+        <w:t>Similarly, how would we define operators like plus (+) for example? If we have two universals u1 and u2, the statement u1 + u2 could imply that u1 and u2 are strings, ints, floats, lists, tuples so how can we implement this operator.</w:t>
+      </w:r>
+    </w:p>
+    <w:p>
+      <w:r>
+        <w:t xml:space="preserve">Theoretically speaking, at best we are determining the type of a (universal) object based on how that object is treated in the code and what functions and operations are applied to it. At best a perfect solution seems to me like it would essentially be a glorified </w:t>
+      </w:r>
+      <w:proofErr w:type="gramStart"/>
+      <w:r>
+        <w:t>type</w:t>
+      </w:r>
+      <w:proofErr w:type="gramEnd"/>
+      <w:r>
+        <w:t xml:space="preserve"> inference algorithm.</w:t>
       </w:r>
     </w:p>
     <w:p/>
@@ -906,15 +598,7 @@
     <w:p>
       <w:r>
         <w:lastRenderedPageBreak/>
-        <w:t xml:space="preserve">See if </w:t>
-      </w:r>
-      <w:proofErr w:type="spellStart"/>
-      <w:r>
-        <w:t>func</w:t>
-      </w:r>
-      <w:proofErr w:type="spellEnd"/>
-      <w:r>
-        <w:t xml:space="preserve"> argument is callable, raise exception and print that the code is using callbacks which are not currently supported</w:t>
+        <w:t>See if func argument is callable, raise exception and print that the code is using callbacks which are not currently supported</w:t>
       </w:r>
     </w:p>
     <w:p/>
@@ -936,21 +620,23 @@
         <w:t xml:space="preserve">classes </w:t>
       </w:r>
       <w:r>
-        <w:t>for 2 stack implementation</w:t>
-      </w:r>
-    </w:p>
-    <w:p>
-      <w:r>
-        <w:t xml:space="preserve">The </w:t>
-      </w:r>
-      <w:proofErr w:type="spellStart"/>
-      <w:r>
-        <w:t>fuzzer</w:t>
-      </w:r>
-      <w:proofErr w:type="spellEnd"/>
-      <w:r>
-        <w:t xml:space="preserve"> should :</w:t>
-      </w:r>
+        <w:t xml:space="preserve">for 2 stack </w:t>
+      </w:r>
+      <w:proofErr w:type="gramStart"/>
+      <w:r>
+        <w:t>implementation</w:t>
+      </w:r>
+      <w:proofErr w:type="gramEnd"/>
+    </w:p>
+    <w:p>
+      <w:r>
+        <w:t xml:space="preserve">The fuzzer </w:t>
+      </w:r>
+      <w:proofErr w:type="gramStart"/>
+      <w:r>
+        <w:t>should :</w:t>
+      </w:r>
+      <w:proofErr w:type="gramEnd"/>
     </w:p>
     <w:p>
       <w:r>
@@ -970,28 +656,20 @@
     <w:p/>
     <w:p>
       <w:r>
-        <w:t xml:space="preserve">Added </w:t>
-      </w:r>
-      <w:proofErr w:type="spellStart"/>
-      <w:r>
-        <w:t>arg</w:t>
-      </w:r>
-      <w:proofErr w:type="spellEnd"/>
-      <w:r>
-        <w:t>/</w:t>
-      </w:r>
-      <w:proofErr w:type="spellStart"/>
-      <w:r>
-        <w:t>kwarg</w:t>
-      </w:r>
-      <w:proofErr w:type="spellEnd"/>
-      <w:r>
-        <w:t xml:space="preserve"> support for fuzz testing strategy</w:t>
-      </w:r>
-    </w:p>
-    <w:p>
-      <w:r>
-        <w:t>Wrote basic first class equivalence tester</w:t>
+        <w:t>Added arg/kwarg support for fuzz testing strategy</w:t>
+      </w:r>
+    </w:p>
+    <w:p>
+      <w:r>
+        <w:t xml:space="preserve">Wrote basic </w:t>
+      </w:r>
+      <w:proofErr w:type="gramStart"/>
+      <w:r>
+        <w:t>first class</w:t>
+      </w:r>
+      <w:proofErr w:type="gramEnd"/>
+      <w:r>
+        <w:t xml:space="preserve"> equivalence tester</w:t>
       </w:r>
     </w:p>
     <w:p>
@@ -1011,28 +689,20 @@
     </w:p>
     <w:p>
       <w:r>
-        <w:t xml:space="preserve">I have tried applying this equivalence tester to small refactors in real classes from open sources repos such as </w:t>
-      </w:r>
-      <w:proofErr w:type="spellStart"/>
-      <w:r>
-        <w:t>openai</w:t>
-      </w:r>
-      <w:proofErr w:type="spellEnd"/>
-      <w:r>
-        <w:t xml:space="preserve"> but have struggled to find working examples. My equivalence tester is quite situational. Method name/signature refactors and external dependencies cause issues</w:t>
-      </w:r>
-    </w:p>
-    <w:p>
-      <w:r>
-        <w:t xml:space="preserve">Tested it on two stack implementations, one that throws index error if you try to peek or pop and empty stack, and one that returns None for these operations. The </w:t>
-      </w:r>
-      <w:proofErr w:type="spellStart"/>
-      <w:r>
-        <w:t>fuzzer</w:t>
-      </w:r>
-      <w:proofErr w:type="spellEnd"/>
-      <w:r>
-        <w:t xml:space="preserve"> was able to pick up on this difference immediately</w:t>
+        <w:t xml:space="preserve">I have tried applying this equivalence tester to small refactors in real classes from open sources repos such as openai but have struggled to find working examples. My equivalence tester is quite situational. Method name/signature </w:t>
+      </w:r>
+      <w:proofErr w:type="gramStart"/>
+      <w:r>
+        <w:t>refactors</w:t>
+      </w:r>
+      <w:proofErr w:type="gramEnd"/>
+      <w:r>
+        <w:t xml:space="preserve"> and external dependencies cause issues</w:t>
+      </w:r>
+    </w:p>
+    <w:p>
+      <w:r>
+        <w:t>Tested it on two stack implementations, one that throws index error if you try to peek or pop and empty stack, and one that returns None for these operations. The fuzzer was able to pick up on this difference immediately</w:t>
       </w:r>
     </w:p>
     <w:p/>
@@ -1068,7 +738,7 @@
                     <pic:cNvPicPr/>
                   </pic:nvPicPr>
                   <pic:blipFill>
-                    <a:blip r:embed="rId9"/>
+                    <a:blip r:embed="rId10"/>
                     <a:stretch>
                       <a:fillRect/>
                     </a:stretch>
@@ -1122,21 +792,21 @@
     </w:p>
     <w:p>
       <w:r>
-        <w:t xml:space="preserve">What I mean by this is that currently, my code will test two classes for equivalence and if the classes have differing methods or even method names, the code will reject them. Allow the user to define a </w:t>
-      </w:r>
-      <w:proofErr w:type="spellStart"/>
-      <w:r>
-        <w:t>json</w:t>
-      </w:r>
-      <w:proofErr w:type="spellEnd"/>
-      <w:r>
-        <w:t xml:space="preserve"> file with the specific methods from the class that they want tested so they can exclude certain methods if they like, and optionally allow the user to also define specifically what arguments each method should be tested with.</w:t>
+        <w:t xml:space="preserve">What I mean by this is that currently, my code will test two classes for equivalence and if the classes have differing methods or even method names, the code will reject them. Allow the user to define a json file with the specific methods from the class that they want tested so they can exclude certain methods if they </w:t>
+      </w:r>
+      <w:proofErr w:type="gramStart"/>
+      <w:r>
+        <w:t>like, and</w:t>
+      </w:r>
+      <w:proofErr w:type="gramEnd"/>
+      <w:r>
+        <w:t xml:space="preserve"> optionally allow the user to also define specifically what arguments each method should be tested with.</w:t>
       </w:r>
     </w:p>
     <w:p/>
     <w:p/>
     <w:p>
-      <w:hyperlink r:id="rId10" w:history="1">
+      <w:hyperlink r:id="rId11" w:history="1">
         <w:r>
           <w:rPr>
             <w:rStyle w:val="Hyperlink"/>
@@ -1171,15 +841,7 @@
       </w:r>
       <w:r>
         <w:lastRenderedPageBreak/>
-        <w:t xml:space="preserve">duplicates, removing the need to fuzz both </w:t>
-      </w:r>
-      <w:proofErr w:type="spellStart"/>
-      <w:r>
-        <w:t>funcs</w:t>
-      </w:r>
-      <w:proofErr w:type="spellEnd"/>
-      <w:r>
-        <w:t>. Useful in practice for speeding up a common case</w:t>
+        <w:t>duplicates, removing the need to fuzz both funcs. Useful in practice for speeding up a common case</w:t>
       </w:r>
     </w:p>
     <w:p>
@@ -1191,15 +853,7 @@
         </w:numPr>
       </w:pPr>
       <w:r>
-        <w:t xml:space="preserve">Filter out </w:t>
-      </w:r>
-      <w:proofErr w:type="spellStart"/>
-      <w:r>
-        <w:t>funcs</w:t>
-      </w:r>
-      <w:proofErr w:type="spellEnd"/>
-      <w:r>
-        <w:t xml:space="preserve"> with no parameters and return values</w:t>
+        <w:t>Filter out funcs with no parameters and return values</w:t>
       </w:r>
     </w:p>
     <w:p>
@@ -1211,15 +865,7 @@
         </w:numPr>
       </w:pPr>
       <w:r>
-        <w:t xml:space="preserve">Possibly filter out </w:t>
-      </w:r>
-      <w:proofErr w:type="spellStart"/>
-      <w:r>
-        <w:t>funcs</w:t>
-      </w:r>
-      <w:proofErr w:type="spellEnd"/>
-      <w:r>
-        <w:t xml:space="preserve"> that invoke external classes or methods</w:t>
+        <w:t>Possibly filter out funcs that invoke external classes or methods</w:t>
       </w:r>
     </w:p>
     <w:p>
@@ -1231,15 +877,7 @@
         </w:numPr>
       </w:pPr>
       <w:r>
-        <w:t xml:space="preserve">They use </w:t>
-      </w:r>
-      <w:proofErr w:type="spellStart"/>
-      <w:r>
-        <w:t>pynguin</w:t>
-      </w:r>
-      <w:proofErr w:type="spellEnd"/>
-      <w:r>
-        <w:t xml:space="preserve"> which is a test generation framework that does not use fuzz testing</w:t>
+        <w:t>They use pynguin which is a test generation framework that does not use fuzz testing</w:t>
       </w:r>
     </w:p>
     <w:p>
@@ -1259,7 +897,15 @@
     </w:p>
     <w:p>
       <w:r>
-        <w:t>What if u have a class with 1 methods, a factory method which gives u back 3 methods</w:t>
+        <w:t xml:space="preserve">What if u have a class with 1 </w:t>
+      </w:r>
+      <w:proofErr w:type="gramStart"/>
+      <w:r>
+        <w:t>methods</w:t>
+      </w:r>
+      <w:proofErr w:type="gramEnd"/>
+      <w:r>
+        <w:t>, a factory method which gives u back 3 methods</w:t>
       </w:r>
     </w:p>
     <w:p>
@@ -1281,7 +927,7 @@
       </w:r>
     </w:p>
     <w:p>
-      <w:hyperlink r:id="rId11" w:history="1">
+      <w:hyperlink r:id="rId12" w:history="1">
         <w:r>
           <w:rPr>
             <w:rStyle w:val="Hyperlink"/>
@@ -1292,29 +938,13 @@
     </w:p>
     <w:p>
       <w:r>
-        <w:t xml:space="preserve">could instead go more practical, targeting </w:t>
-      </w:r>
-      <w:proofErr w:type="spellStart"/>
-      <w:r>
-        <w:t>datastructure</w:t>
-      </w:r>
-      <w:proofErr w:type="spellEnd"/>
-      <w:r>
-        <w:t xml:space="preserve"> implementations online</w:t>
+        <w:t>could instead go more practical, targeting datastructure implementations online</w:t>
       </w:r>
     </w:p>
     <w:p/>
     <w:p>
       <w:r>
-        <w:t xml:space="preserve">For function-function verification: I am currently implementing the case where both functions return (create) a new function. In this case I want to then perform the same function-function verification on these two new returned functions. The problem is the </w:t>
-      </w:r>
-      <w:proofErr w:type="spellStart"/>
-      <w:r>
-        <w:t>hypofuzz</w:t>
-      </w:r>
-      <w:proofErr w:type="spellEnd"/>
-      <w:r>
-        <w:t xml:space="preserve"> does not exactly allow for a recursive implementation like this. </w:t>
+        <w:t xml:space="preserve">For function-function verification: I am currently implementing the case where both functions return (create) a new function. In this case I want to then perform the same function-function verification on these two new returned functions. The problem is the hypofuzz does not exactly allow for a recursive implementation like this. </w:t>
       </w:r>
     </w:p>
     <w:p>
@@ -1361,33 +991,19 @@
         </w:rPr>
         <w:t xml:space="preserve">Other than this issue, another issue is trying to reason with functions that take callable parameters. </w:t>
       </w:r>
-      <w:proofErr w:type="spellStart"/>
+      <w:proofErr w:type="gramStart"/>
       <w:r>
         <w:rPr>
           <w:iCs/>
         </w:rPr>
         <w:t>Cant</w:t>
       </w:r>
-      <w:proofErr w:type="spellEnd"/>
-      <w:r>
-        <w:rPr>
-          <w:iCs/>
-        </w:rPr>
-        <w:t xml:space="preserve"> exactly fuzz a function as an input so </w:t>
-      </w:r>
-      <w:proofErr w:type="spellStart"/>
-      <w:r>
-        <w:rPr>
-          <w:iCs/>
-        </w:rPr>
-        <w:t>im</w:t>
-      </w:r>
-      <w:proofErr w:type="spellEnd"/>
-      <w:r>
-        <w:rPr>
-          <w:iCs/>
-        </w:rPr>
-        <w:t xml:space="preserve"> not sure what to do here</w:t>
+      <w:proofErr w:type="gramEnd"/>
+      <w:r>
+        <w:rPr>
+          <w:iCs/>
+        </w:rPr>
+        <w:t xml:space="preserve"> exactly fuzz a function as an input so im not sure what to do here</w:t>
       </w:r>
       <w:r>
         <w:rPr>
@@ -1424,7 +1040,7 @@
                     <pic:cNvPicPr/>
                   </pic:nvPicPr>
                   <pic:blipFill>
-                    <a:blip r:embed="rId12"/>
+                    <a:blip r:embed="rId13"/>
                     <a:stretch>
                       <a:fillRect/>
                     </a:stretch>
@@ -1455,96 +1071,88 @@
         <w:rPr>
           <w:iCs/>
         </w:rPr>
-        <w:t xml:space="preserve">Using universal strategy + dummy functions (the testing framework doesn’t know that the function </w:t>
-      </w:r>
-      <w:proofErr w:type="spellStart"/>
-      <w:r>
-        <w:rPr>
-          <w:iCs/>
-        </w:rPr>
-        <w:t>arg</w:t>
-      </w:r>
-      <w:proofErr w:type="spellEnd"/>
-      <w:r>
-        <w:rPr>
-          <w:iCs/>
-        </w:rPr>
-        <w:t xml:space="preserve"> is necessarily callable so it uses universal strategy) it takes 11 minutes to find the difference in </w:t>
-      </w:r>
-      <w:proofErr w:type="spellStart"/>
-      <w:r>
-        <w:rPr>
-          <w:iCs/>
-        </w:rPr>
-        <w:t>call_nested_param_ineq</w:t>
-      </w:r>
-      <w:proofErr w:type="spellEnd"/>
-      <w:r>
-        <w:rPr>
-          <w:iCs/>
-        </w:rPr>
-        <w:t xml:space="preserve">. Chances are, with type annotations this will be a bit faster as the tester will start passing in more callable </w:t>
-      </w:r>
-      <w:proofErr w:type="spellStart"/>
-      <w:r>
-        <w:rPr>
-          <w:iCs/>
-        </w:rPr>
-        <w:t>args</w:t>
-      </w:r>
-      <w:proofErr w:type="spellEnd"/>
-      <w:r>
-        <w:rPr>
-          <w:iCs/>
-        </w:rPr>
-        <w:t xml:space="preserve"> from the start</w:t>
-      </w:r>
-    </w:p>
-    <w:p>
-      <w:pPr>
-        <w:rPr>
-          <w:iCs/>
-        </w:rPr>
-      </w:pPr>
-      <w:r>
-        <w:rPr>
-          <w:iCs/>
-        </w:rPr>
-        <w:t xml:space="preserve">Adding a mechanism to see if an </w:t>
-      </w:r>
-      <w:proofErr w:type="spellStart"/>
-      <w:r>
-        <w:rPr>
-          <w:iCs/>
-        </w:rPr>
-        <w:t>arg</w:t>
-      </w:r>
-      <w:proofErr w:type="spellEnd"/>
-      <w:r>
-        <w:rPr>
-          <w:iCs/>
-        </w:rPr>
-        <w:t xml:space="preserve"> is “called” within a function should be pretty easy and should greatly improve time efficiency</w:t>
-      </w:r>
-    </w:p>
-    <w:p>
-      <w:pPr>
-        <w:rPr>
-          <w:iCs/>
-        </w:rPr>
-      </w:pPr>
-    </w:p>
-    <w:p>
-      <w:pPr>
-        <w:rPr>
-          <w:iCs/>
-        </w:rPr>
-      </w:pPr>
-      <w:r>
-        <w:rPr>
-          <w:iCs/>
-        </w:rPr>
-        <w:t>To be as faithful to the theory: we need to complicate/generalise f() so it can call any function it knows. Bound things, we don’t want more than 2 recursive calls, more than etc.</w:t>
+        <w:t xml:space="preserve">Using universal strategy + dummy functions (the testing framework doesn’t know that the function arg is necessarily </w:t>
+      </w:r>
+      <w:proofErr w:type="gramStart"/>
+      <w:r>
+        <w:rPr>
+          <w:iCs/>
+        </w:rPr>
+        <w:t>callable</w:t>
+      </w:r>
+      <w:proofErr w:type="gramEnd"/>
+      <w:r>
+        <w:rPr>
+          <w:iCs/>
+        </w:rPr>
+        <w:t xml:space="preserve"> so it uses universal strategy) it takes 11 minutes to find the difference in call_nested_param_ineq</w:t>
+      </w:r>
+      <w:r>
+        <w:rPr>
+          <w:iCs/>
+        </w:rPr>
+        <w:t>. Chances are, with type annotations this will be a bit faster as the tester will start passing in more callable args from the start</w:t>
+      </w:r>
+    </w:p>
+    <w:p>
+      <w:pPr>
+        <w:rPr>
+          <w:iCs/>
+        </w:rPr>
+      </w:pPr>
+      <w:r>
+        <w:rPr>
+          <w:iCs/>
+        </w:rPr>
+        <w:t xml:space="preserve">Adding a mechanism to see if an arg is “called” within a function should be </w:t>
+      </w:r>
+      <w:proofErr w:type="gramStart"/>
+      <w:r>
+        <w:rPr>
+          <w:iCs/>
+        </w:rPr>
+        <w:t>pretty easy</w:t>
+      </w:r>
+      <w:proofErr w:type="gramEnd"/>
+      <w:r>
+        <w:rPr>
+          <w:iCs/>
+        </w:rPr>
+        <w:t xml:space="preserve"> and should greatly improve time efficiency</w:t>
+      </w:r>
+    </w:p>
+    <w:p>
+      <w:pPr>
+        <w:rPr>
+          <w:iCs/>
+        </w:rPr>
+      </w:pPr>
+    </w:p>
+    <w:p>
+      <w:pPr>
+        <w:rPr>
+          <w:iCs/>
+        </w:rPr>
+      </w:pPr>
+      <w:r>
+        <w:rPr>
+          <w:iCs/>
+        </w:rPr>
+        <w:t xml:space="preserve">To be as faithful to the theory: we need to complicate/generalise </w:t>
+      </w:r>
+      <w:proofErr w:type="gramStart"/>
+      <w:r>
+        <w:rPr>
+          <w:iCs/>
+        </w:rPr>
+        <w:t>f(</w:t>
+      </w:r>
+      <w:proofErr w:type="gramEnd"/>
+      <w:r>
+        <w:rPr>
+          <w:iCs/>
+        </w:rPr>
+        <w:t>) so it can call any function it knows. Bound things, we don’t want more than 2 recursive calls, more than etc.</w:t>
       </w:r>
     </w:p>
     <w:p>
@@ -1615,20 +1223,48 @@
         <w:rPr>
           <w:iCs/>
         </w:rPr>
-        <w:t>If I have time, extend f() functions to take and return numbers</w:t>
-      </w:r>
-    </w:p>
-    <w:p>
-      <w:pPr>
-        <w:rPr>
-          <w:iCs/>
-        </w:rPr>
-      </w:pPr>
-      <w:r>
-        <w:rPr>
-          <w:iCs/>
-        </w:rPr>
-        <w:t>Then I can look at test suites, try it out in some application areas where equivalence is important, property based testing test suite and run with my pipeline.</w:t>
+        <w:t xml:space="preserve">If I have time, extend </w:t>
+      </w:r>
+      <w:proofErr w:type="gramStart"/>
+      <w:r>
+        <w:rPr>
+          <w:iCs/>
+        </w:rPr>
+        <w:t>f(</w:t>
+      </w:r>
+      <w:proofErr w:type="gramEnd"/>
+      <w:r>
+        <w:rPr>
+          <w:iCs/>
+        </w:rPr>
+        <w:t>) functions to take and return numbers</w:t>
+      </w:r>
+    </w:p>
+    <w:p>
+      <w:pPr>
+        <w:rPr>
+          <w:iCs/>
+        </w:rPr>
+      </w:pPr>
+      <w:r>
+        <w:rPr>
+          <w:iCs/>
+        </w:rPr>
+        <w:t xml:space="preserve">Then I can look at test suites, try it out in some application areas where equivalence is important, </w:t>
+      </w:r>
+      <w:proofErr w:type="gramStart"/>
+      <w:r>
+        <w:rPr>
+          <w:iCs/>
+        </w:rPr>
+        <w:t>property based</w:t>
+      </w:r>
+      <w:proofErr w:type="gramEnd"/>
+      <w:r>
+        <w:rPr>
+          <w:iCs/>
+        </w:rPr>
+        <w:t xml:space="preserve"> testing test suite and run with my pipeline.</w:t>
       </w:r>
     </w:p>
     <w:p>
@@ -1683,51 +1319,61 @@
           <w:bCs/>
           <w:iCs/>
         </w:rPr>
-        <w:t xml:space="preserve">Pass a </w:t>
-      </w:r>
-      <w:proofErr w:type="spellStart"/>
+        <w:t xml:space="preserve">Pass a datastruct library thru a mutation testing suite to see how it performs against my pipeline, try to find examples my pipeline can find that the existing suite </w:t>
+      </w:r>
+      <w:proofErr w:type="gramStart"/>
       <w:r>
         <w:rPr>
           <w:b/>
           <w:bCs/>
           <w:iCs/>
         </w:rPr>
-        <w:t>datastruct</w:t>
-      </w:r>
-      <w:proofErr w:type="spellEnd"/>
-      <w:r>
+        <w:t>cant</w:t>
+      </w:r>
+      <w:proofErr w:type="gramEnd"/>
+    </w:p>
+    <w:p>
+      <w:pPr>
         <w:rPr>
           <w:b/>
           <w:bCs/>
           <w:iCs/>
         </w:rPr>
-        <w:t xml:space="preserve"> library thru a mutation testing suite to see how it performs against my pipeline, try to find examples my pipeline can find that the existing suite cant</w:t>
-      </w:r>
-    </w:p>
-    <w:p>
-      <w:pPr>
+      </w:pPr>
+      <w:r>
         <w:rPr>
           <w:b/>
           <w:bCs/>
           <w:iCs/>
         </w:rPr>
-      </w:pPr>
+        <w:t xml:space="preserve">Look at </w:t>
+      </w:r>
+      <w:proofErr w:type="gramStart"/>
       <w:r>
         <w:rPr>
           <w:b/>
           <w:bCs/>
           <w:iCs/>
         </w:rPr>
-        <w:t>Look at open source library with tests at the end</w:t>
-      </w:r>
-    </w:p>
-    <w:p>
-      <w:pPr>
+        <w:t>open source</w:t>
+      </w:r>
+      <w:proofErr w:type="gramEnd"/>
+      <w:r>
         <w:rPr>
           <w:b/>
           <w:bCs/>
           <w:iCs/>
         </w:rPr>
+        <w:t xml:space="preserve"> library with tests at the end</w:t>
+      </w:r>
+    </w:p>
+    <w:p>
+      <w:pPr>
+        <w:rPr>
+          <w:b/>
+          <w:bCs/>
+          <w:iCs/>
+        </w:rPr>
       </w:pPr>
     </w:p>
     <w:p>
@@ -1746,21 +1392,7 @@
         <w:rPr>
           <w:iCs/>
         </w:rPr>
-        <w:t xml:space="preserve"> </w:t>
-      </w:r>
-      <w:proofErr w:type="spellStart"/>
-      <w:r>
-        <w:rPr>
-          <w:iCs/>
-        </w:rPr>
-        <w:t>are_equivalent</w:t>
-      </w:r>
-      <w:proofErr w:type="spellEnd"/>
-      <w:r>
-        <w:rPr>
-          <w:iCs/>
-        </w:rPr>
-        <w:t xml:space="preserve"> for profiler to check that the arguments to any function called by the top level</w:t>
+        <w:t xml:space="preserve"> are_equivalent for profiler to check that the arguments to any function called by the top level</w:t>
       </w:r>
       <w:r>
         <w:rPr>
@@ -1799,7 +1431,21 @@
         <w:rPr>
           <w:iCs/>
         </w:rPr>
-        <w:t>One idea: perform static analysis on the function we are fuzzing before we fuzz it to see if it takes a function f as a param, if that function f itself takes a param. Thus we can narrow down which function fuzzing strategy to employ</w:t>
+        <w:t xml:space="preserve">One idea: perform static analysis on the function we are fuzzing before we fuzz it to see if it takes a function f as a param, if that function f itself takes a param. </w:t>
+      </w:r>
+      <w:proofErr w:type="gramStart"/>
+      <w:r>
+        <w:rPr>
+          <w:iCs/>
+        </w:rPr>
+        <w:t>Thus</w:t>
+      </w:r>
+      <w:proofErr w:type="gramEnd"/>
+      <w:r>
+        <w:rPr>
+          <w:iCs/>
+        </w:rPr>
+        <w:t xml:space="preserve"> we can narrow down which function fuzzing strategy to employ</w:t>
       </w:r>
     </w:p>
     <w:p>
@@ -1835,21 +1481,21 @@
         <w:rPr>
           <w:iCs/>
         </w:rPr>
-        <w:t xml:space="preserve">Functions f that take a single function as a param like f(h): we can check the </w:t>
-      </w:r>
-      <w:proofErr w:type="spellStart"/>
-      <w:r>
-        <w:rPr>
-          <w:iCs/>
-        </w:rPr>
-        <w:t>sig</w:t>
-      </w:r>
-      <w:proofErr w:type="spellEnd"/>
-      <w:r>
-        <w:rPr>
-          <w:iCs/>
-        </w:rPr>
-        <w:t xml:space="preserve"> of the function h given, and fuzz some input accordingly to call h with within f.</w:t>
+        <w:t xml:space="preserve">Functions f that </w:t>
+      </w:r>
+      <w:proofErr w:type="gramStart"/>
+      <w:r>
+        <w:rPr>
+          <w:iCs/>
+        </w:rPr>
+        <w:t>take</w:t>
+      </w:r>
+      <w:proofErr w:type="gramEnd"/>
+      <w:r>
+        <w:rPr>
+          <w:iCs/>
+        </w:rPr>
+        <w:t xml:space="preserve"> a single function as a param like f(h): we can check the sig of the function h given, and fuzz some input accordingly to call h with within f.</w:t>
       </w:r>
     </w:p>
     <w:p>
@@ -1895,86 +1541,22 @@
         <w:rPr>
           <w:iCs/>
         </w:rPr>
-        <w:t xml:space="preserve">If (state of </w:t>
-      </w:r>
-      <w:proofErr w:type="spellStart"/>
-      <w:r>
-        <w:rPr>
-          <w:iCs/>
-        </w:rPr>
-        <w:t>module_a</w:t>
-      </w:r>
-      <w:proofErr w:type="spellEnd"/>
-      <w:r>
-        <w:rPr>
-          <w:iCs/>
-        </w:rPr>
-        <w:t xml:space="preserve"> before running == state of </w:t>
-      </w:r>
-      <w:proofErr w:type="spellStart"/>
-      <w:r>
-        <w:rPr>
-          <w:iCs/>
-        </w:rPr>
-        <w:t>module_a</w:t>
-      </w:r>
-      <w:proofErr w:type="spellEnd"/>
-      <w:r>
-        <w:rPr>
-          <w:iCs/>
-        </w:rPr>
-        <w:t xml:space="preserve"> after n steps) !=</w:t>
+        <w:t>If (state of module_a before running == state of module_a after n steps) !=</w:t>
       </w:r>
       <w:r>
         <w:rPr>
           <w:iCs/>
         </w:rPr>
         <w:br/>
-        <w:t xml:space="preserve">   (state of </w:t>
-      </w:r>
-      <w:proofErr w:type="spellStart"/>
-      <w:r>
-        <w:rPr>
-          <w:iCs/>
-        </w:rPr>
-        <w:t>module_b</w:t>
-      </w:r>
-      <w:proofErr w:type="spellEnd"/>
-      <w:r>
-        <w:rPr>
-          <w:iCs/>
-        </w:rPr>
-        <w:t xml:space="preserve"> before running == state of </w:t>
-      </w:r>
-      <w:proofErr w:type="spellStart"/>
-      <w:r>
-        <w:rPr>
-          <w:iCs/>
-        </w:rPr>
-        <w:t>module_b</w:t>
-      </w:r>
-      <w:proofErr w:type="spellEnd"/>
-      <w:r>
-        <w:rPr>
-          <w:iCs/>
-        </w:rPr>
-        <w:t xml:space="preserve"> after n steps):</w:t>
+        <w:t xml:space="preserve">   (state of module_b before running == state of module_b after n steps):</w:t>
       </w:r>
       <w:r>
         <w:rPr>
           <w:iCs/>
         </w:rPr>
         <w:br/>
-        <w:t xml:space="preserve">   they are </w:t>
-      </w:r>
-      <w:proofErr w:type="spellStart"/>
-      <w:r>
-        <w:rPr>
-          <w:iCs/>
-        </w:rPr>
-        <w:t>inequiv</w:t>
-      </w:r>
-      <w:proofErr w:type="spellEnd"/>
+        <w:t xml:space="preserve">   they are inequiv</w:t>
+      </w:r>
       <w:r>
         <w:rPr>
           <w:iCs/>
@@ -1987,21 +1569,7 @@
           <w:iCs/>
         </w:rPr>
         <w:br/>
-        <w:t xml:space="preserve">Some examples in plain </w:t>
-      </w:r>
-      <w:proofErr w:type="spellStart"/>
-      <w:r>
-        <w:rPr>
-          <w:iCs/>
-        </w:rPr>
-        <w:t>english</w:t>
-      </w:r>
-      <w:proofErr w:type="spellEnd"/>
-      <w:r>
-        <w:rPr>
-          <w:iCs/>
-        </w:rPr>
-        <w:t xml:space="preserve"> for my own sanity: </w:t>
+        <w:t xml:space="preserve">Some examples in plain english for my own sanity: </w:t>
       </w:r>
       <w:r>
         <w:rPr>
@@ -2014,30 +1582,8 @@
           <w:iCs/>
         </w:rPr>
         <w:br/>
-        <w:t xml:space="preserve">if </w:t>
-      </w:r>
-      <w:proofErr w:type="spellStart"/>
-      <w:r>
-        <w:rPr>
-          <w:iCs/>
-        </w:rPr>
-        <w:t>module_a</w:t>
-      </w:r>
-      <w:proofErr w:type="spellEnd"/>
-      <w:r>
-        <w:rPr>
-          <w:iCs/>
-        </w:rPr>
-        <w:t xml:space="preserve"> alters a global variable x after running n steps, but </w:t>
-      </w:r>
-      <w:proofErr w:type="spellStart"/>
-      <w:r>
-        <w:rPr>
-          <w:iCs/>
-        </w:rPr>
-        <w:t>module_b</w:t>
-      </w:r>
-      <w:proofErr w:type="spellEnd"/>
+        <w:t>if module_a alters a global variable x after running n steps, but module_b</w:t>
+      </w:r>
       <w:r>
         <w:rPr>
           <w:iCs/>
@@ -2069,35 +1615,7 @@
           <w:iCs/>
         </w:rPr>
         <w:br/>
-        <w:t xml:space="preserve">if </w:t>
-      </w:r>
-      <w:proofErr w:type="spellStart"/>
-      <w:r>
-        <w:rPr>
-          <w:iCs/>
-        </w:rPr>
-        <w:t>module_a</w:t>
-      </w:r>
-      <w:proofErr w:type="spellEnd"/>
-      <w:r>
-        <w:rPr>
-          <w:iCs/>
-        </w:rPr>
-        <w:t xml:space="preserve"> contains the definition of a global variable x, but it does not change, and </w:t>
-      </w:r>
-      <w:proofErr w:type="spellStart"/>
-      <w:r>
-        <w:rPr>
-          <w:iCs/>
-        </w:rPr>
-        <w:t>module_b</w:t>
-      </w:r>
-      <w:proofErr w:type="spellEnd"/>
-      <w:r>
-        <w:rPr>
-          <w:iCs/>
-        </w:rPr>
-        <w:t xml:space="preserve"> does not</w:t>
+        <w:t>if module_a contains the definition of a global variable x, but it does not change, and module_b does not</w:t>
       </w:r>
       <w:r>
         <w:rPr>
@@ -2124,35 +1642,7 @@
           <w:iCs/>
         </w:rPr>
         <w:br/>
-        <w:t xml:space="preserve">if </w:t>
-      </w:r>
-      <w:proofErr w:type="spellStart"/>
-      <w:r>
-        <w:rPr>
-          <w:iCs/>
-        </w:rPr>
-        <w:t>module_a</w:t>
-      </w:r>
-      <w:proofErr w:type="spellEnd"/>
-      <w:r>
-        <w:rPr>
-          <w:iCs/>
-        </w:rPr>
-        <w:t xml:space="preserve"> alters a global string variable s after running n steps, but </w:t>
-      </w:r>
-      <w:proofErr w:type="spellStart"/>
-      <w:r>
-        <w:rPr>
-          <w:iCs/>
-        </w:rPr>
-        <w:t>module_b</w:t>
-      </w:r>
-      <w:proofErr w:type="spellEnd"/>
-      <w:r>
-        <w:rPr>
-          <w:iCs/>
-        </w:rPr>
-        <w:t xml:space="preserve"> alters a global int</w:t>
+        <w:t>if module_a alters a global string variable s after running n steps, but module_b alters a global int</w:t>
       </w:r>
       <w:r>
         <w:rPr>
@@ -2168,6 +1658,20 @@
           <w:iCs/>
         </w:rPr>
       </w:pPr>
+    </w:p>
+    <w:p>
+      <w:pPr>
+        <w:rPr>
+          <w:iCs/>
+        </w:rPr>
+      </w:pPr>
+      <w:r>
+        <w:rPr>
+          <w:iCs/>
+        </w:rPr>
+        <w:lastRenderedPageBreak/>
+        <w:t>Notes for meeting 10/2:</w:t>
+      </w:r>
     </w:p>
     <w:p>
       <w:pPr>
@@ -3849,6 +3353,7 @@
   <w:style w:type="character" w:default="1" w:styleId="DefaultParagraphFont">
     <w:name w:val="Default Paragraph Font"/>
     <w:uiPriority w:val="1"/>
+    <w:semiHidden/>
     <w:unhideWhenUsed/>
   </w:style>
   <w:style w:type="table" w:default="1" w:styleId="TableNormal">

</xml_diff>

<commit_message>
Create mechanism to test equivalence tester with mutation testing
</commit_message>
<xml_diff>
--- a/Masters project notes.docx
+++ b/Masters project notes.docx
@@ -53,11 +53,19 @@
           <w:lang w:val="fr-FR"/>
         </w:rPr>
       </w:pPr>
+      <w:proofErr w:type="spellStart"/>
       <w:r>
         <w:rPr>
           <w:lang w:val="fr-FR"/>
         </w:rPr>
-        <w:t xml:space="preserve">Pythonfuzz </w:t>
+        <w:t>Pythonfuzz</w:t>
+      </w:r>
+      <w:proofErr w:type="spellEnd"/>
+      <w:r>
+        <w:rPr>
+          <w:lang w:val="fr-FR"/>
+        </w:rPr>
+        <w:t xml:space="preserve"> </w:t>
       </w:r>
       <w:hyperlink r:id="rId6" w:history="1">
         <w:r>
@@ -78,7 +86,15 @@
         </w:numPr>
       </w:pPr>
       <w:r>
-        <w:t>Coverage-guided fuzzer for python</w:t>
+        <w:t xml:space="preserve">Coverage-guided </w:t>
+      </w:r>
+      <w:proofErr w:type="spellStart"/>
+      <w:r>
+        <w:t>fuzzer</w:t>
+      </w:r>
+      <w:proofErr w:type="spellEnd"/>
+      <w:r>
+        <w:t xml:space="preserve"> for python</w:t>
       </w:r>
     </w:p>
     <w:p>
@@ -110,7 +126,15 @@
         </w:numPr>
       </w:pPr>
       <w:r>
-        <w:t>Google’s coverage-guided fuzzer for python</w:t>
+        <w:t xml:space="preserve">Google’s coverage-guided </w:t>
+      </w:r>
+      <w:proofErr w:type="spellStart"/>
+      <w:r>
+        <w:t>fuzzer</w:t>
+      </w:r>
+      <w:proofErr w:type="spellEnd"/>
+      <w:r>
+        <w:t xml:space="preserve"> for python</w:t>
       </w:r>
     </w:p>
     <w:p>
@@ -130,15 +154,28 @@
         </w:rPr>
         <w:t xml:space="preserve">HypoFuzz </w:t>
       </w:r>
-      <w:hyperlink r:id="rId8" w:history="1">
-        <w:r>
-          <w:rPr>
-            <w:rStyle w:val="Hyperlink"/>
-            <w:lang w:val="de-DE"/>
-          </w:rPr>
-          <w:t>https://github.com/Zac-HD/hypofuzz</w:t>
-        </w:r>
-      </w:hyperlink>
+      <w:r>
+        <w:fldChar w:fldCharType="begin"/>
+      </w:r>
+      <w:r>
+        <w:rPr>
+          <w:lang w:val="de-DE"/>
+        </w:rPr>
+        <w:instrText>HYPERLINK "https://github.com/Zac-HD/hypofuzz"</w:instrText>
+      </w:r>
+      <w:r>
+        <w:fldChar w:fldCharType="separate"/>
+      </w:r>
+      <w:r>
+        <w:rPr>
+          <w:rStyle w:val="Hyperlink"/>
+          <w:lang w:val="de-DE"/>
+        </w:rPr>
+        <w:t>https://github.com/Zac-HD/hypofuzz</w:t>
+      </w:r>
+      <w:r>
+        <w:fldChar w:fldCharType="end"/>
+      </w:r>
     </w:p>
     <w:p>
       <w:pPr>
@@ -163,10 +200,15 @@
           <w:numId w:val="1"/>
         </w:numPr>
       </w:pPr>
-      <w:r>
-        <w:t xml:space="preserve">CrossHair </w:t>
-      </w:r>
-      <w:hyperlink r:id="rId9" w:history="1">
+      <w:proofErr w:type="spellStart"/>
+      <w:r>
+        <w:t>CrossHair</w:t>
+      </w:r>
+      <w:proofErr w:type="spellEnd"/>
+      <w:r>
+        <w:t xml:space="preserve"> </w:t>
+      </w:r>
+      <w:hyperlink r:id="rId8" w:history="1">
         <w:r>
           <w:rPr>
             <w:rStyle w:val="Hyperlink"/>
@@ -189,7 +231,23 @@
     </w:p>
     <w:p>
       <w:r>
-        <w:t xml:space="preserve">From my research, Hypothesis + HypoFuzz seems like it achieves everything that JQF does. Hypothesis is heavily inspired by QuickCheck and gives a property-based testing framework for python. It generates structured inputs and saves failing inputs for reproduction. It operates on the semantic properties of a program, making it inherently </w:t>
+        <w:t xml:space="preserve">From my research, Hypothesis + </w:t>
+      </w:r>
+      <w:proofErr w:type="spellStart"/>
+      <w:r>
+        <w:t>HypoFuzz</w:t>
+      </w:r>
+      <w:proofErr w:type="spellEnd"/>
+      <w:r>
+        <w:t xml:space="preserve"> seems like it achieves everything that JQF does. Hypothesis is heavily inspired by </w:t>
+      </w:r>
+      <w:proofErr w:type="spellStart"/>
+      <w:r>
+        <w:t>QuickCheck</w:t>
+      </w:r>
+      <w:proofErr w:type="spellEnd"/>
+      <w:r>
+        <w:t xml:space="preserve"> and gives a property-based testing framework for python. It generates structured inputs and saves failing inputs for reproduction. It operates on the semantic properties of a program, making it inherently </w:t>
       </w:r>
       <w:proofErr w:type="gramStart"/>
       <w:r>
@@ -197,7 +255,15 @@
       </w:r>
       <w:proofErr w:type="gramEnd"/>
       <w:r>
-        <w:t>. It is not coverage-guided by default, so HypoFuzz extends it for coverage-guided exploration thus providing a fuzzing framework.</w:t>
+        <w:t xml:space="preserve">. It is not coverage-guided by default, so </w:t>
+      </w:r>
+      <w:proofErr w:type="spellStart"/>
+      <w:r>
+        <w:t>HypoFuzz</w:t>
+      </w:r>
+      <w:proofErr w:type="spellEnd"/>
+      <w:r>
+        <w:t xml:space="preserve"> extends it for coverage-guided exploration thus providing a fuzzing framework.</w:t>
       </w:r>
     </w:p>
     <w:p/>
@@ -216,8 +282,13 @@
     </w:p>
     <w:p>
       <w:r>
-        <w:t>Generalise the stack example to any data structure/api</w:t>
-      </w:r>
+        <w:t>Generalise the stack example to any data structure/</w:t>
+      </w:r>
+      <w:proofErr w:type="spellStart"/>
+      <w:r>
+        <w:t>api</w:t>
+      </w:r>
+      <w:proofErr w:type="spellEnd"/>
       <w:r>
         <w:t xml:space="preserve"> that can take any type of arguments.</w:t>
       </w:r>
@@ -246,12 +317,28 @@
         <w:t xml:space="preserve">Using it to test a very simple summing function </w:t>
       </w:r>
       <w:r>
-        <w:t>doesn’t work very well. I believe because of how universal is configured and how my two simple functions are configured, atheris is unable to quickly find the erroneous input.</w:t>
-      </w:r>
-    </w:p>
-    <w:p>
-      <w:r>
-        <w:t xml:space="preserve">I think the fact that fuzz testing is obfuscated inside the universal object the module is unable to correctly perform its algorithms to find erroneous inputs. I vibe coded a hypofuzz universal object </w:t>
+        <w:t xml:space="preserve">doesn’t work very well. I believe because of how universal is configured and how my two simple functions are configured, </w:t>
+      </w:r>
+      <w:proofErr w:type="spellStart"/>
+      <w:r>
+        <w:t>atheris</w:t>
+      </w:r>
+      <w:proofErr w:type="spellEnd"/>
+      <w:r>
+        <w:t xml:space="preserve"> is unable to quickly find the erroneous input.</w:t>
+      </w:r>
+    </w:p>
+    <w:p>
+      <w:r>
+        <w:t xml:space="preserve">I think the fact that fuzz testing is obfuscated inside the universal object the module is unable to correctly perform its algorithms to find erroneous inputs. I vibe coded a </w:t>
+      </w:r>
+      <w:proofErr w:type="spellStart"/>
+      <w:r>
+        <w:t>hypofuzz</w:t>
+      </w:r>
+      <w:proofErr w:type="spellEnd"/>
+      <w:r>
+        <w:t xml:space="preserve"> universal object </w:t>
       </w:r>
       <w:proofErr w:type="gramStart"/>
       <w:r>
@@ -265,7 +352,15 @@
     <w:p>
       <w:r>
         <w:lastRenderedPageBreak/>
-        <w:t xml:space="preserve">When comparing two different sorting algorithms, hypofuzz was unable to spot the difference when I added a small condition to quicksort if length is &gt;= 6, return the reversed list. For these </w:t>
+        <w:t xml:space="preserve">When comparing two different sorting algorithms, </w:t>
+      </w:r>
+      <w:proofErr w:type="spellStart"/>
+      <w:r>
+        <w:t>hypofuzz</w:t>
+      </w:r>
+      <w:proofErr w:type="spellEnd"/>
+      <w:r>
+        <w:t xml:space="preserve"> was unable to spot the difference when I added a small condition to quicksort if length is &gt;= 6, return the reversed list. For these </w:t>
       </w:r>
       <w:proofErr w:type="gramStart"/>
       <w:r>
@@ -294,18 +389,55 @@
       <w:r>
         <w:t xml:space="preserve">Testing universal object on two sorting algorithms always results in empty lists as universals value gets set to empty list if </w:t>
       </w:r>
+      <w:proofErr w:type="spellStart"/>
       <w:proofErr w:type="gramStart"/>
       <w:r>
-        <w:t>len(</w:t>
+        <w:t>len</w:t>
+      </w:r>
+      <w:proofErr w:type="spellEnd"/>
+      <w:r>
+        <w:t>(</w:t>
       </w:r>
       <w:proofErr w:type="gramEnd"/>
       <w:r>
-        <w:t xml:space="preserve">) is called on it. This is bcos if we initialise it as a list of universals, this may be wrong as it may be intended to be a string. </w:t>
-      </w:r>
-    </w:p>
-    <w:p>
-      <w:r>
-        <w:t>Universal needs lt, gt, le, ge operators define</w:t>
+        <w:t xml:space="preserve">) is called on it. This is </w:t>
+      </w:r>
+      <w:proofErr w:type="spellStart"/>
+      <w:r>
+        <w:t>bcos</w:t>
+      </w:r>
+      <w:proofErr w:type="spellEnd"/>
+      <w:r>
+        <w:t xml:space="preserve"> if we initialise it as a list of universals, this may be wrong as it may be intended to be a string. </w:t>
+      </w:r>
+    </w:p>
+    <w:p>
+      <w:r>
+        <w:t xml:space="preserve">Universal needs </w:t>
+      </w:r>
+      <w:proofErr w:type="spellStart"/>
+      <w:r>
+        <w:t>lt</w:t>
+      </w:r>
+      <w:proofErr w:type="spellEnd"/>
+      <w:r>
+        <w:t xml:space="preserve">, </w:t>
+      </w:r>
+      <w:proofErr w:type="spellStart"/>
+      <w:r>
+        <w:t>gt</w:t>
+      </w:r>
+      <w:proofErr w:type="spellEnd"/>
+      <w:r>
+        <w:t xml:space="preserve">, le, </w:t>
+      </w:r>
+      <w:proofErr w:type="spellStart"/>
+      <w:r>
+        <w:t>ge</w:t>
+      </w:r>
+      <w:proofErr w:type="spellEnd"/>
+      <w:r>
+        <w:t xml:space="preserve"> operators define</w:t>
       </w:r>
       <w:r>
         <w:t>d</w:t>
@@ -319,25 +451,99 @@
         <w:t>Universal does not support item assignment</w:t>
       </w:r>
       <w:r>
-        <w:t xml:space="preserve"> e.g the line</w:t>
-      </w:r>
-    </w:p>
-    <w:p>
+        <w:t xml:space="preserve"> </w:t>
+      </w:r>
+      <w:proofErr w:type="spellStart"/>
+      <w:r>
+        <w:t>e.g</w:t>
+      </w:r>
+      <w:proofErr w:type="spellEnd"/>
+      <w:r>
+        <w:t xml:space="preserve"> the line</w:t>
+      </w:r>
+    </w:p>
+    <w:p>
+      <w:proofErr w:type="spellStart"/>
       <w:proofErr w:type="gramStart"/>
       <w:r>
-        <w:t>arr[</w:t>
-      </w:r>
+        <w:t>arr</w:t>
+      </w:r>
+      <w:proofErr w:type="spellEnd"/>
+      <w:r>
+        <w:t>[</w:t>
+      </w:r>
+      <w:proofErr w:type="spellStart"/>
       <w:proofErr w:type="gramEnd"/>
       <w:r>
-        <w:t>i + 1], arr[high] = arr[high], arr[i + 1]</w:t>
-      </w:r>
-    </w:p>
-    <w:p>
-      <w:r>
-        <w:t>does not work if arr is a universal and each element of arr is a universal</w:t>
-      </w:r>
-      <w:r>
-        <w:t xml:space="preserve"> I “vibecoded” an implementation of this.</w:t>
+        <w:t>i</w:t>
+      </w:r>
+      <w:proofErr w:type="spellEnd"/>
+      <w:r>
+        <w:t xml:space="preserve"> + 1], </w:t>
+      </w:r>
+      <w:proofErr w:type="spellStart"/>
+      <w:r>
+        <w:t>arr</w:t>
+      </w:r>
+      <w:proofErr w:type="spellEnd"/>
+      <w:r>
+        <w:t xml:space="preserve">[high] = </w:t>
+      </w:r>
+      <w:proofErr w:type="spellStart"/>
+      <w:r>
+        <w:t>arr</w:t>
+      </w:r>
+      <w:proofErr w:type="spellEnd"/>
+      <w:r>
+        <w:t xml:space="preserve">[high], </w:t>
+      </w:r>
+      <w:proofErr w:type="spellStart"/>
+      <w:r>
+        <w:t>arr</w:t>
+      </w:r>
+      <w:proofErr w:type="spellEnd"/>
+      <w:r>
+        <w:t>[</w:t>
+      </w:r>
+      <w:proofErr w:type="spellStart"/>
+      <w:r>
+        <w:t>i</w:t>
+      </w:r>
+      <w:proofErr w:type="spellEnd"/>
+      <w:r>
+        <w:t xml:space="preserve"> + 1]</w:t>
+      </w:r>
+    </w:p>
+    <w:p>
+      <w:r>
+        <w:t xml:space="preserve">does not work if </w:t>
+      </w:r>
+      <w:proofErr w:type="spellStart"/>
+      <w:r>
+        <w:t>arr</w:t>
+      </w:r>
+      <w:proofErr w:type="spellEnd"/>
+      <w:r>
+        <w:t xml:space="preserve"> is a universal and each element of </w:t>
+      </w:r>
+      <w:proofErr w:type="spellStart"/>
+      <w:r>
+        <w:t>arr</w:t>
+      </w:r>
+      <w:proofErr w:type="spellEnd"/>
+      <w:r>
+        <w:t xml:space="preserve"> is a universal</w:t>
+      </w:r>
+      <w:r>
+        <w:t xml:space="preserve"> I “</w:t>
+      </w:r>
+      <w:proofErr w:type="spellStart"/>
+      <w:r>
+        <w:t>vibecoded</w:t>
+      </w:r>
+      <w:proofErr w:type="spellEnd"/>
+      <w:r>
+        <w:t>” an implementation of this.</w:t>
       </w:r>
     </w:p>
     <w:p>
@@ -353,12 +559,36 @@
     </w:p>
     <w:p>
       <w:r>
-        <w:t>Read TypeEvalPy to find good frameworks for function parameters.</w:t>
-      </w:r>
-    </w:p>
-    <w:p>
-      <w:r>
-        <w:t xml:space="preserve">Tried HeaderGen as it was apparently the best for all categories including function parameters. When I tried it, it would only infer function return types and not parameters. The github only mentions that it can resolve function return types and I could not figure out any way to get it to infer parameter types. </w:t>
+        <w:t xml:space="preserve">Read </w:t>
+      </w:r>
+      <w:proofErr w:type="spellStart"/>
+      <w:r>
+        <w:t>TypeEvalPy</w:t>
+      </w:r>
+      <w:proofErr w:type="spellEnd"/>
+      <w:r>
+        <w:t xml:space="preserve"> to find good frameworks for function parameters.</w:t>
+      </w:r>
+    </w:p>
+    <w:p>
+      <w:r>
+        <w:t xml:space="preserve">Tried </w:t>
+      </w:r>
+      <w:proofErr w:type="spellStart"/>
+      <w:r>
+        <w:t>HeaderGen</w:t>
+      </w:r>
+      <w:proofErr w:type="spellEnd"/>
+      <w:r>
+        <w:t xml:space="preserve"> as it was apparently the best for all categories including function parameters. When I tried it, it would only infer function return types and not parameters. The </w:t>
+      </w:r>
+      <w:proofErr w:type="spellStart"/>
+      <w:r>
+        <w:t>github</w:t>
+      </w:r>
+      <w:proofErr w:type="spellEnd"/>
+      <w:r>
+        <w:t xml:space="preserve"> only mentions that it can resolve function return types and I could not figure out any way to get it to infer parameter types. </w:t>
       </w:r>
     </w:p>
     <w:p>
@@ -412,7 +642,15 @@
         </w:numPr>
       </w:pPr>
       <w:r>
-        <w:t xml:space="preserve">Hypothesis/Hypofuzz “Strategies” are how you define what is passed </w:t>
+        <w:t>Hypothesis/</w:t>
+      </w:r>
+      <w:proofErr w:type="spellStart"/>
+      <w:r>
+        <w:t>Hypofuzz</w:t>
+      </w:r>
+      <w:proofErr w:type="spellEnd"/>
+      <w:r>
+        <w:t xml:space="preserve"> “Strategies” are how you define what is passed </w:t>
       </w:r>
       <w:proofErr w:type="gramStart"/>
       <w:r>
@@ -420,7 +658,15 @@
       </w:r>
       <w:proofErr w:type="gramEnd"/>
       <w:r>
-        <w:t xml:space="preserve"> the function you want to fuzz. E.g  </w:t>
+        <w:t xml:space="preserve"> the function you want to fuzz. </w:t>
+      </w:r>
+      <w:proofErr w:type="spellStart"/>
+      <w:r>
+        <w:t>E.g</w:t>
+      </w:r>
+      <w:proofErr w:type="spellEnd"/>
+      <w:r>
+        <w:t xml:space="preserve">  </w:t>
       </w:r>
     </w:p>
     <w:p>
@@ -434,17 +680,65 @@
       </w:r>
       <w:proofErr w:type="gramEnd"/>
       <w:r>
-        <w:t>(st.integers() | st.floats()))</w:t>
-      </w:r>
-    </w:p>
-    <w:p>
-      <w:r>
-        <w:t>def test_sort_correct(lst):</w:t>
-      </w:r>
-    </w:p>
-    <w:p>
-      <w:r>
-        <w:t xml:space="preserve">    assert(my_sort(lst) == sorted(lst))</w:t>
+        <w:t xml:space="preserve">(st.integers() | </w:t>
+      </w:r>
+      <w:proofErr w:type="spellStart"/>
+      <w:r>
+        <w:t>st.floats</w:t>
+      </w:r>
+      <w:proofErr w:type="spellEnd"/>
+      <w:r>
+        <w:t>()))</w:t>
+      </w:r>
+    </w:p>
+    <w:p>
+      <w:r>
+        <w:t xml:space="preserve">def </w:t>
+      </w:r>
+      <w:proofErr w:type="spellStart"/>
+      <w:r>
+        <w:t>test_sort_correct</w:t>
+      </w:r>
+      <w:proofErr w:type="spellEnd"/>
+      <w:r>
+        <w:t>(</w:t>
+      </w:r>
+      <w:proofErr w:type="spellStart"/>
+      <w:r>
+        <w:t>lst</w:t>
+      </w:r>
+      <w:proofErr w:type="spellEnd"/>
+      <w:r>
+        <w:t>):</w:t>
+      </w:r>
+    </w:p>
+    <w:p>
+      <w:r>
+        <w:t xml:space="preserve">    assert(</w:t>
+      </w:r>
+      <w:proofErr w:type="spellStart"/>
+      <w:r>
+        <w:t>my_sort</w:t>
+      </w:r>
+      <w:proofErr w:type="spellEnd"/>
+      <w:r>
+        <w:t>(</w:t>
+      </w:r>
+      <w:proofErr w:type="spellStart"/>
+      <w:r>
+        <w:t>lst</w:t>
+      </w:r>
+      <w:proofErr w:type="spellEnd"/>
+      <w:r>
+        <w:t>) == sorted(</w:t>
+      </w:r>
+      <w:proofErr w:type="spellStart"/>
+      <w:r>
+        <w:t>lst</w:t>
+      </w:r>
+      <w:proofErr w:type="spellEnd"/>
+      <w:r>
+        <w:t>))</w:t>
       </w:r>
     </w:p>
     <w:p>
@@ -456,7 +750,23 @@
         </w:numPr>
       </w:pPr>
       <w:r>
-        <w:t>In that code snippet, the strategy is to fuzz my_sort with inputs of type list[int|str]</w:t>
+        <w:t xml:space="preserve">In that code snippet, the strategy is to fuzz </w:t>
+      </w:r>
+      <w:proofErr w:type="spellStart"/>
+      <w:r>
+        <w:t>my_sort</w:t>
+      </w:r>
+      <w:proofErr w:type="spellEnd"/>
+      <w:r>
+        <w:t xml:space="preserve"> with inputs of type list[</w:t>
+      </w:r>
+      <w:proofErr w:type="spellStart"/>
+      <w:r>
+        <w:t>int|str</w:t>
+      </w:r>
+      <w:proofErr w:type="spellEnd"/>
+      <w:r>
+        <w:t>]</w:t>
       </w:r>
     </w:p>
     <w:p>
@@ -468,7 +778,15 @@
         </w:numPr>
       </w:pPr>
       <w:r>
-        <w:t>In the case of my universal strategy, I simply fuzz with a strategy that can be though of as the following:</w:t>
+        <w:t xml:space="preserve">In the case of my universal strategy, I simply fuzz with a strategy that can be </w:t>
+      </w:r>
+      <w:proofErr w:type="spellStart"/>
+      <w:r>
+        <w:t>though</w:t>
+      </w:r>
+      <w:proofErr w:type="spellEnd"/>
+      <w:r>
+        <w:t xml:space="preserve"> of as the following:</w:t>
       </w:r>
     </w:p>
     <w:p>
@@ -479,16 +797,55 @@
           <w:numId w:val="3"/>
         </w:numPr>
       </w:pPr>
-      <w:r>
-        <w:t>strat = int|str|float|bool|None|list[strat]|dict[</w:t>
-      </w:r>
+      <w:proofErr w:type="spellStart"/>
+      <w:r>
+        <w:t>strat</w:t>
+      </w:r>
+      <w:proofErr w:type="spellEnd"/>
+      <w:r>
+        <w:t xml:space="preserve"> = </w:t>
+      </w:r>
+      <w:proofErr w:type="spellStart"/>
+      <w:r>
+        <w:t>int|str|float|bool|None|list</w:t>
+      </w:r>
+      <w:proofErr w:type="spellEnd"/>
+      <w:r>
+        <w:t>[</w:t>
+      </w:r>
+      <w:proofErr w:type="spellStart"/>
+      <w:r>
+        <w:t>strat</w:t>
+      </w:r>
+      <w:proofErr w:type="spellEnd"/>
+      <w:r>
+        <w:t>]|</w:t>
+      </w:r>
+      <w:proofErr w:type="spellStart"/>
+      <w:r>
+        <w:t>dict</w:t>
+      </w:r>
+      <w:proofErr w:type="spellEnd"/>
+      <w:r>
+        <w:t>[</w:t>
+      </w:r>
+      <w:proofErr w:type="spellStart"/>
       <w:proofErr w:type="gramStart"/>
       <w:r>
         <w:t>str,strat</w:t>
       </w:r>
+      <w:proofErr w:type="spellEnd"/>
       <w:proofErr w:type="gramEnd"/>
       <w:r>
-        <w:t>]|tuple[strat]</w:t>
+        <w:t>]|tuple[</w:t>
+      </w:r>
+      <w:proofErr w:type="spellStart"/>
+      <w:r>
+        <w:t>strat</w:t>
+      </w:r>
+      <w:proofErr w:type="spellEnd"/>
+      <w:r>
+        <w:t>]</w:t>
       </w:r>
     </w:p>
     <w:p>
@@ -500,7 +857,15 @@
         </w:numPr>
       </w:pPr>
       <w:r>
-        <w:t>I have logic implemented so that if we encounter a TypeError, we discard the type that caused the error from the pool of possible types in our strategy for future iterations.</w:t>
+        <w:t xml:space="preserve">I have logic implemented so that if we encounter a </w:t>
+      </w:r>
+      <w:proofErr w:type="spellStart"/>
+      <w:r>
+        <w:t>TypeError</w:t>
+      </w:r>
+      <w:proofErr w:type="spellEnd"/>
+      <w:r>
+        <w:t>, we discard the type that caused the error from the pool of possible types in our strategy for future iterations.</w:t>
       </w:r>
     </w:p>
     <w:p>
@@ -563,12 +928,36 @@
     </w:p>
     <w:p>
       <w:r>
-        <w:t>If we assume there isn’t any explicit casting in the function we are fuzzing, how would a universal handle a situation where the type is ambiguous e.g calling len(universal). Len is valid for both string and list so how do we lock universal here?</w:t>
-      </w:r>
-    </w:p>
-    <w:p>
-      <w:r>
-        <w:t>Similarly, how would we define operators like plus (+) for example? If we have two universals u1 and u2, the statement u1 + u2 could imply that u1 and u2 are strings, ints, floats, lists, tuples so how can we implement this operator.</w:t>
+        <w:t xml:space="preserve">If we assume there isn’t any explicit casting in the function we are fuzzing, how would a universal handle a situation where the type is ambiguous </w:t>
+      </w:r>
+      <w:proofErr w:type="spellStart"/>
+      <w:r>
+        <w:t>e.g</w:t>
+      </w:r>
+      <w:proofErr w:type="spellEnd"/>
+      <w:r>
+        <w:t xml:space="preserve"> calling </w:t>
+      </w:r>
+      <w:proofErr w:type="spellStart"/>
+      <w:r>
+        <w:t>len</w:t>
+      </w:r>
+      <w:proofErr w:type="spellEnd"/>
+      <w:r>
+        <w:t>(universal). Len is valid for both string and list so how do we lock universal here?</w:t>
+      </w:r>
+    </w:p>
+    <w:p>
+      <w:r>
+        <w:t xml:space="preserve">Similarly, how would we define operators like plus (+) for example? If we have two universals u1 and u2, the statement u1 + u2 could imply that u1 and u2 are strings, </w:t>
+      </w:r>
+      <w:proofErr w:type="spellStart"/>
+      <w:r>
+        <w:t>ints</w:t>
+      </w:r>
+      <w:proofErr w:type="spellEnd"/>
+      <w:r>
+        <w:t>, floats, lists, tuples so how can we implement this operator.</w:t>
       </w:r>
     </w:p>
     <w:p>
@@ -598,7 +987,15 @@
     <w:p>
       <w:r>
         <w:lastRenderedPageBreak/>
-        <w:t>See if func argument is callable, raise exception and print that the code is using callbacks which are not currently supported</w:t>
+        <w:t xml:space="preserve">See if </w:t>
+      </w:r>
+      <w:proofErr w:type="spellStart"/>
+      <w:r>
+        <w:t>func</w:t>
+      </w:r>
+      <w:proofErr w:type="spellEnd"/>
+      <w:r>
+        <w:t xml:space="preserve"> argument is callable, raise exception and print that the code is using callbacks which are not currently supported</w:t>
       </w:r>
     </w:p>
     <w:p/>
@@ -630,7 +1027,15 @@
     </w:p>
     <w:p>
       <w:r>
-        <w:t xml:space="preserve">The fuzzer </w:t>
+        <w:t xml:space="preserve">The </w:t>
+      </w:r>
+      <w:proofErr w:type="spellStart"/>
+      <w:r>
+        <w:t>fuzzer</w:t>
+      </w:r>
+      <w:proofErr w:type="spellEnd"/>
+      <w:r>
+        <w:t xml:space="preserve"> </w:t>
       </w:r>
       <w:proofErr w:type="gramStart"/>
       <w:r>
@@ -656,7 +1061,23 @@
     <w:p/>
     <w:p>
       <w:r>
-        <w:t>Added arg/kwarg support for fuzz testing strategy</w:t>
+        <w:t xml:space="preserve">Added </w:t>
+      </w:r>
+      <w:proofErr w:type="spellStart"/>
+      <w:r>
+        <w:t>arg</w:t>
+      </w:r>
+      <w:proofErr w:type="spellEnd"/>
+      <w:r>
+        <w:t>/</w:t>
+      </w:r>
+      <w:proofErr w:type="spellStart"/>
+      <w:r>
+        <w:t>kwarg</w:t>
+      </w:r>
+      <w:proofErr w:type="spellEnd"/>
+      <w:r>
+        <w:t xml:space="preserve"> support for fuzz testing strategy</w:t>
       </w:r>
     </w:p>
     <w:p>
@@ -689,7 +1110,15 @@
     </w:p>
     <w:p>
       <w:r>
-        <w:t xml:space="preserve">I have tried applying this equivalence tester to small refactors in real classes from open sources repos such as openai but have struggled to find working examples. My equivalence tester is quite situational. Method name/signature </w:t>
+        <w:t xml:space="preserve">I have tried applying this equivalence tester to small refactors in real classes from open sources repos such as </w:t>
+      </w:r>
+      <w:proofErr w:type="spellStart"/>
+      <w:r>
+        <w:t>openai</w:t>
+      </w:r>
+      <w:proofErr w:type="spellEnd"/>
+      <w:r>
+        <w:t xml:space="preserve"> but have struggled to find working examples. My equivalence tester is quite situational. Method name/signature </w:t>
       </w:r>
       <w:proofErr w:type="gramStart"/>
       <w:r>
@@ -702,7 +1131,15 @@
     </w:p>
     <w:p>
       <w:r>
-        <w:t>Tested it on two stack implementations, one that throws index error if you try to peek or pop and empty stack, and one that returns None for these operations. The fuzzer was able to pick up on this difference immediately</w:t>
+        <w:t xml:space="preserve">Tested it on two stack implementations, one that throws index error if you try to peek or pop and empty stack, and one that returns None for these operations. The </w:t>
+      </w:r>
+      <w:proofErr w:type="spellStart"/>
+      <w:r>
+        <w:t>fuzzer</w:t>
+      </w:r>
+      <w:proofErr w:type="spellEnd"/>
+      <w:r>
+        <w:t xml:space="preserve"> was able to pick up on this difference immediately</w:t>
       </w:r>
     </w:p>
     <w:p/>
@@ -738,7 +1175,7 @@
                     <pic:cNvPicPr/>
                   </pic:nvPicPr>
                   <pic:blipFill>
-                    <a:blip r:embed="rId10"/>
+                    <a:blip r:embed="rId9"/>
                     <a:stretch>
                       <a:fillRect/>
                     </a:stretch>
@@ -792,7 +1229,15 @@
     </w:p>
     <w:p>
       <w:r>
-        <w:t xml:space="preserve">What I mean by this is that currently, my code will test two classes for equivalence and if the classes have differing methods or even method names, the code will reject them. Allow the user to define a json file with the specific methods from the class that they want tested so they can exclude certain methods if they </w:t>
+        <w:t xml:space="preserve">What I mean by this is that currently, my code will test two classes for equivalence and if the classes have differing methods or even method names, the code will reject them. Allow the user to define a </w:t>
+      </w:r>
+      <w:proofErr w:type="spellStart"/>
+      <w:r>
+        <w:t>json</w:t>
+      </w:r>
+      <w:proofErr w:type="spellEnd"/>
+      <w:r>
+        <w:t xml:space="preserve"> file with the specific methods from the class that they want tested so they can exclude certain methods if they </w:t>
       </w:r>
       <w:proofErr w:type="gramStart"/>
       <w:r>
@@ -806,7 +1251,7 @@
     <w:p/>
     <w:p/>
     <w:p>
-      <w:hyperlink r:id="rId11" w:history="1">
+      <w:hyperlink r:id="rId10" w:history="1">
         <w:r>
           <w:rPr>
             <w:rStyle w:val="Hyperlink"/>
@@ -841,7 +1286,15 @@
       </w:r>
       <w:r>
         <w:lastRenderedPageBreak/>
-        <w:t>duplicates, removing the need to fuzz both funcs. Useful in practice for speeding up a common case</w:t>
+        <w:t xml:space="preserve">duplicates, removing the need to fuzz both </w:t>
+      </w:r>
+      <w:proofErr w:type="spellStart"/>
+      <w:r>
+        <w:t>funcs</w:t>
+      </w:r>
+      <w:proofErr w:type="spellEnd"/>
+      <w:r>
+        <w:t>. Useful in practice for speeding up a common case</w:t>
       </w:r>
     </w:p>
     <w:p>
@@ -853,7 +1306,15 @@
         </w:numPr>
       </w:pPr>
       <w:r>
-        <w:t>Filter out funcs with no parameters and return values</w:t>
+        <w:t xml:space="preserve">Filter out </w:t>
+      </w:r>
+      <w:proofErr w:type="spellStart"/>
+      <w:r>
+        <w:t>funcs</w:t>
+      </w:r>
+      <w:proofErr w:type="spellEnd"/>
+      <w:r>
+        <w:t xml:space="preserve"> with no parameters and return values</w:t>
       </w:r>
     </w:p>
     <w:p>
@@ -865,7 +1326,15 @@
         </w:numPr>
       </w:pPr>
       <w:r>
-        <w:t>Possibly filter out funcs that invoke external classes or methods</w:t>
+        <w:t xml:space="preserve">Possibly filter out </w:t>
+      </w:r>
+      <w:proofErr w:type="spellStart"/>
+      <w:r>
+        <w:t>funcs</w:t>
+      </w:r>
+      <w:proofErr w:type="spellEnd"/>
+      <w:r>
+        <w:t xml:space="preserve"> that invoke external classes or methods</w:t>
       </w:r>
     </w:p>
     <w:p>
@@ -877,7 +1346,15 @@
         </w:numPr>
       </w:pPr>
       <w:r>
-        <w:t>They use pynguin which is a test generation framework that does not use fuzz testing</w:t>
+        <w:t xml:space="preserve">They use </w:t>
+      </w:r>
+      <w:proofErr w:type="spellStart"/>
+      <w:r>
+        <w:t>pynguin</w:t>
+      </w:r>
+      <w:proofErr w:type="spellEnd"/>
+      <w:r>
+        <w:t xml:space="preserve"> which is a test generation framework that does not use fuzz testing</w:t>
       </w:r>
     </w:p>
     <w:p>
@@ -927,7 +1404,7 @@
       </w:r>
     </w:p>
     <w:p>
-      <w:hyperlink r:id="rId12" w:history="1">
+      <w:hyperlink r:id="rId11" w:history="1">
         <w:r>
           <w:rPr>
             <w:rStyle w:val="Hyperlink"/>
@@ -938,13 +1415,29 @@
     </w:p>
     <w:p>
       <w:r>
-        <w:t>could instead go more practical, targeting datastructure implementations online</w:t>
+        <w:t xml:space="preserve">could instead go more practical, targeting </w:t>
+      </w:r>
+      <w:proofErr w:type="spellStart"/>
+      <w:r>
+        <w:t>datastructure</w:t>
+      </w:r>
+      <w:proofErr w:type="spellEnd"/>
+      <w:r>
+        <w:t xml:space="preserve"> implementations online</w:t>
       </w:r>
     </w:p>
     <w:p/>
     <w:p>
       <w:r>
-        <w:t xml:space="preserve">For function-function verification: I am currently implementing the case where both functions return (create) a new function. In this case I want to then perform the same function-function verification on these two new returned functions. The problem is the hypofuzz does not exactly allow for a recursive implementation like this. </w:t>
+        <w:t xml:space="preserve">For function-function verification: I am currently implementing the case where both functions return (create) a new function. In this case I want to then perform the same function-function verification on these two new returned functions. The problem is the </w:t>
+      </w:r>
+      <w:proofErr w:type="spellStart"/>
+      <w:r>
+        <w:t>hypofuzz</w:t>
+      </w:r>
+      <w:proofErr w:type="spellEnd"/>
+      <w:r>
+        <w:t xml:space="preserve"> does not exactly allow for a recursive implementation like this. </w:t>
       </w:r>
     </w:p>
     <w:p>
@@ -991,6 +1484,7 @@
         </w:rPr>
         <w:t xml:space="preserve">Other than this issue, another issue is trying to reason with functions that take callable parameters. </w:t>
       </w:r>
+      <w:proofErr w:type="spellStart"/>
       <w:proofErr w:type="gramStart"/>
       <w:r>
         <w:rPr>
@@ -998,12 +1492,27 @@
         </w:rPr>
         <w:t>Cant</w:t>
       </w:r>
+      <w:proofErr w:type="spellEnd"/>
       <w:proofErr w:type="gramEnd"/>
       <w:r>
         <w:rPr>
           <w:iCs/>
         </w:rPr>
-        <w:t xml:space="preserve"> exactly fuzz a function as an input so im not sure what to do here</w:t>
+        <w:t xml:space="preserve"> exactly fuzz a function as an input so </w:t>
+      </w:r>
+      <w:proofErr w:type="spellStart"/>
+      <w:r>
+        <w:rPr>
+          <w:iCs/>
+        </w:rPr>
+        <w:t>im</w:t>
+      </w:r>
+      <w:proofErr w:type="spellEnd"/>
+      <w:r>
+        <w:rPr>
+          <w:iCs/>
+        </w:rPr>
+        <w:t xml:space="preserve"> not sure what to do here</w:t>
       </w:r>
       <w:r>
         <w:rPr>
@@ -1040,7 +1549,7 @@
                     <pic:cNvPicPr/>
                   </pic:nvPicPr>
                   <pic:blipFill>
-                    <a:blip r:embed="rId13"/>
+                    <a:blip r:embed="rId12"/>
                     <a:stretch>
                       <a:fillRect/>
                     </a:stretch>
@@ -1071,7 +1580,21 @@
         <w:rPr>
           <w:iCs/>
         </w:rPr>
-        <w:t xml:space="preserve">Using universal strategy + dummy functions (the testing framework doesn’t know that the function arg is necessarily </w:t>
+        <w:t xml:space="preserve">Using universal strategy + dummy functions (the testing framework doesn’t know that the function </w:t>
+      </w:r>
+      <w:proofErr w:type="spellStart"/>
+      <w:r>
+        <w:rPr>
+          <w:iCs/>
+        </w:rPr>
+        <w:t>arg</w:t>
+      </w:r>
+      <w:proofErr w:type="spellEnd"/>
+      <w:r>
+        <w:rPr>
+          <w:iCs/>
+        </w:rPr>
+        <w:t xml:space="preserve"> is necessarily </w:t>
       </w:r>
       <w:proofErr w:type="gramStart"/>
       <w:r>
@@ -1085,26 +1608,62 @@
         <w:rPr>
           <w:iCs/>
         </w:rPr>
-        <w:t xml:space="preserve"> so it uses universal strategy) it takes 11 minutes to find the difference in call_nested_param_ineq</w:t>
-      </w:r>
-      <w:r>
-        <w:rPr>
-          <w:iCs/>
-        </w:rPr>
-        <w:t>. Chances are, with type annotations this will be a bit faster as the tester will start passing in more callable args from the start</w:t>
-      </w:r>
-    </w:p>
-    <w:p>
-      <w:pPr>
-        <w:rPr>
-          <w:iCs/>
-        </w:rPr>
-      </w:pPr>
-      <w:r>
-        <w:rPr>
-          <w:iCs/>
-        </w:rPr>
-        <w:t xml:space="preserve">Adding a mechanism to see if an arg is “called” within a function should be </w:t>
+        <w:t xml:space="preserve"> so it uses universal strategy) it takes 11 minutes to find the difference in </w:t>
+      </w:r>
+      <w:proofErr w:type="spellStart"/>
+      <w:r>
+        <w:rPr>
+          <w:iCs/>
+        </w:rPr>
+        <w:t>call_nested_param_ineq</w:t>
+      </w:r>
+      <w:proofErr w:type="spellEnd"/>
+      <w:r>
+        <w:rPr>
+          <w:iCs/>
+        </w:rPr>
+        <w:t xml:space="preserve">. Chances are, with type annotations this will be a bit faster as the tester will start passing in more callable </w:t>
+      </w:r>
+      <w:proofErr w:type="spellStart"/>
+      <w:r>
+        <w:rPr>
+          <w:iCs/>
+        </w:rPr>
+        <w:t>args</w:t>
+      </w:r>
+      <w:proofErr w:type="spellEnd"/>
+      <w:r>
+        <w:rPr>
+          <w:iCs/>
+        </w:rPr>
+        <w:t xml:space="preserve"> from the start</w:t>
+      </w:r>
+    </w:p>
+    <w:p>
+      <w:pPr>
+        <w:rPr>
+          <w:iCs/>
+        </w:rPr>
+      </w:pPr>
+      <w:r>
+        <w:rPr>
+          <w:iCs/>
+        </w:rPr>
+        <w:t xml:space="preserve">Adding a mechanism to see if an </w:t>
+      </w:r>
+      <w:proofErr w:type="spellStart"/>
+      <w:r>
+        <w:rPr>
+          <w:iCs/>
+        </w:rPr>
+        <w:t>arg</w:t>
+      </w:r>
+      <w:proofErr w:type="spellEnd"/>
+      <w:r>
+        <w:rPr>
+          <w:iCs/>
+        </w:rPr>
+        <w:t xml:space="preserve"> is “called” within a function should be </w:t>
       </w:r>
       <w:proofErr w:type="gramStart"/>
       <w:r>
@@ -1319,61 +1878,79 @@
           <w:bCs/>
           <w:iCs/>
         </w:rPr>
-        <w:t xml:space="preserve">Pass a datastruct library thru a mutation testing suite to see how it performs against my pipeline, try to find examples my pipeline can find that the existing suite </w:t>
-      </w:r>
-      <w:proofErr w:type="gramStart"/>
+        <w:t xml:space="preserve">Pass a </w:t>
+      </w:r>
+      <w:proofErr w:type="spellStart"/>
       <w:r>
         <w:rPr>
           <w:b/>
           <w:bCs/>
           <w:iCs/>
         </w:rPr>
-        <w:t>cant</w:t>
-      </w:r>
-      <w:proofErr w:type="gramEnd"/>
-    </w:p>
-    <w:p>
-      <w:pPr>
+        <w:t>datastruct</w:t>
+      </w:r>
+      <w:proofErr w:type="spellEnd"/>
+      <w:r>
         <w:rPr>
           <w:b/>
           <w:bCs/>
           <w:iCs/>
         </w:rPr>
-      </w:pPr>
+        <w:t xml:space="preserve"> library thru a mutation testing suite to see how it performs against my pipeline, try to find examples my pipeline can find that the existing suite </w:t>
+      </w:r>
+      <w:proofErr w:type="gramStart"/>
       <w:r>
         <w:rPr>
           <w:b/>
           <w:bCs/>
           <w:iCs/>
         </w:rPr>
-        <w:t xml:space="preserve">Look at </w:t>
-      </w:r>
-      <w:proofErr w:type="gramStart"/>
-      <w:r>
+        <w:t>cant</w:t>
+      </w:r>
+      <w:proofErr w:type="gramEnd"/>
+    </w:p>
+    <w:p>
+      <w:pPr>
         <w:rPr>
           <w:b/>
           <w:bCs/>
           <w:iCs/>
         </w:rPr>
-        <w:t>open source</w:t>
-      </w:r>
-      <w:proofErr w:type="gramEnd"/>
+      </w:pPr>
       <w:r>
         <w:rPr>
           <w:b/>
           <w:bCs/>
           <w:iCs/>
         </w:rPr>
-        <w:t xml:space="preserve"> library with tests at the end</w:t>
-      </w:r>
-    </w:p>
-    <w:p>
-      <w:pPr>
+        <w:t xml:space="preserve">Look at </w:t>
+      </w:r>
+      <w:proofErr w:type="gramStart"/>
+      <w:r>
         <w:rPr>
           <w:b/>
           <w:bCs/>
           <w:iCs/>
         </w:rPr>
+        <w:t>open source</w:t>
+      </w:r>
+      <w:proofErr w:type="gramEnd"/>
+      <w:r>
+        <w:rPr>
+          <w:b/>
+          <w:bCs/>
+          <w:iCs/>
+        </w:rPr>
+        <w:t xml:space="preserve"> library with tests at the end</w:t>
+      </w:r>
+    </w:p>
+    <w:p>
+      <w:pPr>
+        <w:rPr>
+          <w:b/>
+          <w:bCs/>
+          <w:iCs/>
+        </w:rPr>
       </w:pPr>
     </w:p>
     <w:p>
@@ -1392,7 +1969,21 @@
         <w:rPr>
           <w:iCs/>
         </w:rPr>
-        <w:t xml:space="preserve"> are_equivalent for profiler to check that the arguments to any function called by the top level</w:t>
+        <w:t xml:space="preserve"> </w:t>
+      </w:r>
+      <w:proofErr w:type="spellStart"/>
+      <w:r>
+        <w:rPr>
+          <w:iCs/>
+        </w:rPr>
+        <w:t>are_equivalent</w:t>
+      </w:r>
+      <w:proofErr w:type="spellEnd"/>
+      <w:r>
+        <w:rPr>
+          <w:iCs/>
+        </w:rPr>
+        <w:t xml:space="preserve"> for profiler to check that the arguments to any function called by the top level</w:t>
       </w:r>
       <w:r>
         <w:rPr>
@@ -1495,7 +2086,21 @@
         <w:rPr>
           <w:iCs/>
         </w:rPr>
-        <w:t xml:space="preserve"> a single function as a param like f(h): we can check the sig of the function h given, and fuzz some input accordingly to call h with within f.</w:t>
+        <w:t xml:space="preserve"> a single function as a param like f(h): we can check the </w:t>
+      </w:r>
+      <w:proofErr w:type="spellStart"/>
+      <w:r>
+        <w:rPr>
+          <w:iCs/>
+        </w:rPr>
+        <w:t>sig</w:t>
+      </w:r>
+      <w:proofErr w:type="spellEnd"/>
+      <w:r>
+        <w:rPr>
+          <w:iCs/>
+        </w:rPr>
+        <w:t xml:space="preserve"> of the function h given, and fuzz some input accordingly to call h with within f.</w:t>
       </w:r>
     </w:p>
     <w:p>
@@ -1541,22 +2146,86 @@
         <w:rPr>
           <w:iCs/>
         </w:rPr>
-        <w:t>If (state of module_a before running == state of module_a after n steps) !=</w:t>
+        <w:t xml:space="preserve">If (state of </w:t>
+      </w:r>
+      <w:proofErr w:type="spellStart"/>
+      <w:r>
+        <w:rPr>
+          <w:iCs/>
+        </w:rPr>
+        <w:t>module_a</w:t>
+      </w:r>
+      <w:proofErr w:type="spellEnd"/>
+      <w:r>
+        <w:rPr>
+          <w:iCs/>
+        </w:rPr>
+        <w:t xml:space="preserve"> before running == state of </w:t>
+      </w:r>
+      <w:proofErr w:type="spellStart"/>
+      <w:r>
+        <w:rPr>
+          <w:iCs/>
+        </w:rPr>
+        <w:t>module_a</w:t>
+      </w:r>
+      <w:proofErr w:type="spellEnd"/>
+      <w:r>
+        <w:rPr>
+          <w:iCs/>
+        </w:rPr>
+        <w:t xml:space="preserve"> after n steps) !=</w:t>
       </w:r>
       <w:r>
         <w:rPr>
           <w:iCs/>
         </w:rPr>
         <w:br/>
-        <w:t xml:space="preserve">   (state of module_b before running == state of module_b after n steps):</w:t>
+        <w:t xml:space="preserve">   (state of </w:t>
+      </w:r>
+      <w:proofErr w:type="spellStart"/>
+      <w:r>
+        <w:rPr>
+          <w:iCs/>
+        </w:rPr>
+        <w:t>module_b</w:t>
+      </w:r>
+      <w:proofErr w:type="spellEnd"/>
+      <w:r>
+        <w:rPr>
+          <w:iCs/>
+        </w:rPr>
+        <w:t xml:space="preserve"> before running == state of </w:t>
+      </w:r>
+      <w:proofErr w:type="spellStart"/>
+      <w:r>
+        <w:rPr>
+          <w:iCs/>
+        </w:rPr>
+        <w:t>module_b</w:t>
+      </w:r>
+      <w:proofErr w:type="spellEnd"/>
+      <w:r>
+        <w:rPr>
+          <w:iCs/>
+        </w:rPr>
+        <w:t xml:space="preserve"> after n steps):</w:t>
       </w:r>
       <w:r>
         <w:rPr>
           <w:iCs/>
         </w:rPr>
         <w:br/>
-        <w:t xml:space="preserve">   they are inequiv</w:t>
-      </w:r>
+        <w:t xml:space="preserve">   they are </w:t>
+      </w:r>
+      <w:proofErr w:type="spellStart"/>
+      <w:r>
+        <w:rPr>
+          <w:iCs/>
+        </w:rPr>
+        <w:t>inequiv</w:t>
+      </w:r>
+      <w:proofErr w:type="spellEnd"/>
       <w:r>
         <w:rPr>
           <w:iCs/>
@@ -1569,7 +2238,21 @@
           <w:iCs/>
         </w:rPr>
         <w:br/>
-        <w:t xml:space="preserve">Some examples in plain english for my own sanity: </w:t>
+        <w:t xml:space="preserve">Some examples in plain </w:t>
+      </w:r>
+      <w:proofErr w:type="spellStart"/>
+      <w:r>
+        <w:rPr>
+          <w:iCs/>
+        </w:rPr>
+        <w:t>english</w:t>
+      </w:r>
+      <w:proofErr w:type="spellEnd"/>
+      <w:r>
+        <w:rPr>
+          <w:iCs/>
+        </w:rPr>
+        <w:t xml:space="preserve"> for my own sanity: </w:t>
       </w:r>
       <w:r>
         <w:rPr>
@@ -1582,8 +2265,30 @@
           <w:iCs/>
         </w:rPr>
         <w:br/>
-        <w:t>if module_a alters a global variable x after running n steps, but module_b</w:t>
-      </w:r>
+        <w:t xml:space="preserve">if </w:t>
+      </w:r>
+      <w:proofErr w:type="spellStart"/>
+      <w:r>
+        <w:rPr>
+          <w:iCs/>
+        </w:rPr>
+        <w:t>module_a</w:t>
+      </w:r>
+      <w:proofErr w:type="spellEnd"/>
+      <w:r>
+        <w:rPr>
+          <w:iCs/>
+        </w:rPr>
+        <w:t xml:space="preserve"> alters a global variable x after running n steps, but </w:t>
+      </w:r>
+      <w:proofErr w:type="spellStart"/>
+      <w:r>
+        <w:rPr>
+          <w:iCs/>
+        </w:rPr>
+        <w:t>module_b</w:t>
+      </w:r>
+      <w:proofErr w:type="spellEnd"/>
       <w:r>
         <w:rPr>
           <w:iCs/>
@@ -1615,7 +2320,35 @@
           <w:iCs/>
         </w:rPr>
         <w:br/>
-        <w:t>if module_a contains the definition of a global variable x, but it does not change, and module_b does not</w:t>
+        <w:t xml:space="preserve">if </w:t>
+      </w:r>
+      <w:proofErr w:type="spellStart"/>
+      <w:r>
+        <w:rPr>
+          <w:iCs/>
+        </w:rPr>
+        <w:t>module_a</w:t>
+      </w:r>
+      <w:proofErr w:type="spellEnd"/>
+      <w:r>
+        <w:rPr>
+          <w:iCs/>
+        </w:rPr>
+        <w:t xml:space="preserve"> contains the definition of a global variable x, but it does not change, and </w:t>
+      </w:r>
+      <w:proofErr w:type="spellStart"/>
+      <w:r>
+        <w:rPr>
+          <w:iCs/>
+        </w:rPr>
+        <w:t>module_b</w:t>
+      </w:r>
+      <w:proofErr w:type="spellEnd"/>
+      <w:r>
+        <w:rPr>
+          <w:iCs/>
+        </w:rPr>
+        <w:t xml:space="preserve"> does not</w:t>
       </w:r>
       <w:r>
         <w:rPr>
@@ -1642,7 +2375,35 @@
           <w:iCs/>
         </w:rPr>
         <w:br/>
-        <w:t>if module_a alters a global string variable s after running n steps, but module_b alters a global int</w:t>
+        <w:t xml:space="preserve">if </w:t>
+      </w:r>
+      <w:proofErr w:type="spellStart"/>
+      <w:r>
+        <w:rPr>
+          <w:iCs/>
+        </w:rPr>
+        <w:t>module_a</w:t>
+      </w:r>
+      <w:proofErr w:type="spellEnd"/>
+      <w:r>
+        <w:rPr>
+          <w:iCs/>
+        </w:rPr>
+        <w:t xml:space="preserve"> alters a global string variable s after running n steps, but </w:t>
+      </w:r>
+      <w:proofErr w:type="spellStart"/>
+      <w:r>
+        <w:rPr>
+          <w:iCs/>
+        </w:rPr>
+        <w:t>module_b</w:t>
+      </w:r>
+      <w:proofErr w:type="spellEnd"/>
+      <w:r>
+        <w:rPr>
+          <w:iCs/>
+        </w:rPr>
+        <w:t xml:space="preserve"> alters a global int</w:t>
       </w:r>
       <w:r>
         <w:rPr>
@@ -1679,6 +2440,86 @@
           <w:iCs/>
         </w:rPr>
       </w:pPr>
+      <w:r>
+        <w:rPr>
+          <w:iCs/>
+        </w:rPr>
+        <w:t xml:space="preserve">Experimented with mutation testing. Started with </w:t>
+      </w:r>
+      <w:hyperlink r:id="rId13" w:history="1">
+        <w:r>
+          <w:rPr>
+            <w:rStyle w:val="Hyperlink"/>
+            <w:iCs/>
+          </w:rPr>
+          <w:t>https://github.com/Soumyadeeps006/tested-utility-library/tree/main</w:t>
+        </w:r>
+      </w:hyperlink>
+    </w:p>
+    <w:p>
+      <w:pPr>
+        <w:rPr>
+          <w:iCs/>
+        </w:rPr>
+      </w:pPr>
+      <w:r>
+        <w:rPr>
+          <w:iCs/>
+        </w:rPr>
+        <w:t>A simple repo of utility functions with tests.</w:t>
+      </w:r>
+    </w:p>
+    <w:p>
+      <w:pPr>
+        <w:rPr>
+          <w:iCs/>
+        </w:rPr>
+      </w:pPr>
+      <w:r>
+        <w:rPr>
+          <w:iCs/>
+        </w:rPr>
+        <w:t xml:space="preserve">When testing the </w:t>
+      </w:r>
+      <w:proofErr w:type="spellStart"/>
+      <w:r>
+        <w:rPr>
+          <w:iCs/>
+        </w:rPr>
+        <w:t>file_io</w:t>
+      </w:r>
+      <w:proofErr w:type="spellEnd"/>
+      <w:r>
+        <w:rPr>
+          <w:iCs/>
+        </w:rPr>
+        <w:t xml:space="preserve"> utils, got 21/24</w:t>
+      </w:r>
+    </w:p>
+    <w:p>
+      <w:pPr>
+        <w:rPr>
+          <w:iCs/>
+        </w:rPr>
+      </w:pPr>
+      <w:r>
+        <w:rPr>
+          <w:iCs/>
+        </w:rPr>
+        <w:t xml:space="preserve">Math utils: </w:t>
+      </w:r>
+      <w:r>
+        <w:rPr>
+          <w:iCs/>
+        </w:rPr>
+        <w:t>9</w:t>
+      </w:r>
+      <w:r>
+        <w:rPr>
+          <w:iCs/>
+        </w:rPr>
+        <w:t xml:space="preserve"> + </w:t>
+      </w:r>
     </w:p>
     <w:p/>
     <w:p>

</xml_diff>

<commit_message>
Update code for testing mutants
</commit_message>
<xml_diff>
--- a/Masters project notes.docx
+++ b/Masters project notes.docx
@@ -53,19 +53,11 @@
           <w:lang w:val="fr-FR"/>
         </w:rPr>
       </w:pPr>
-      <w:proofErr w:type="spellStart"/>
       <w:r>
         <w:rPr>
           <w:lang w:val="fr-FR"/>
         </w:rPr>
-        <w:t>Pythonfuzz</w:t>
-      </w:r>
-      <w:proofErr w:type="spellEnd"/>
-      <w:r>
-        <w:rPr>
-          <w:lang w:val="fr-FR"/>
-        </w:rPr>
-        <w:t xml:space="preserve"> </w:t>
+        <w:t xml:space="preserve">Pythonfuzz </w:t>
       </w:r>
       <w:hyperlink r:id="rId6" w:history="1">
         <w:r>
@@ -86,15 +78,7 @@
         </w:numPr>
       </w:pPr>
       <w:r>
-        <w:t xml:space="preserve">Coverage-guided </w:t>
-      </w:r>
-      <w:proofErr w:type="spellStart"/>
-      <w:r>
-        <w:t>fuzzer</w:t>
-      </w:r>
-      <w:proofErr w:type="spellEnd"/>
-      <w:r>
-        <w:t xml:space="preserve"> for python</w:t>
+        <w:t>Coverage-guided fuzzer for python</w:t>
       </w:r>
     </w:p>
     <w:p>
@@ -126,15 +110,7 @@
         </w:numPr>
       </w:pPr>
       <w:r>
-        <w:t xml:space="preserve">Google’s coverage-guided </w:t>
-      </w:r>
-      <w:proofErr w:type="spellStart"/>
-      <w:r>
-        <w:t>fuzzer</w:t>
-      </w:r>
-      <w:proofErr w:type="spellEnd"/>
-      <w:r>
-        <w:t xml:space="preserve"> for python</w:t>
+        <w:t>Google’s coverage-guided fuzzer for python</w:t>
       </w:r>
     </w:p>
     <w:p>
@@ -154,28 +130,15 @@
         </w:rPr>
         <w:t xml:space="preserve">HypoFuzz </w:t>
       </w:r>
-      <w:r>
-        <w:fldChar w:fldCharType="begin"/>
-      </w:r>
-      <w:r>
-        <w:rPr>
-          <w:lang w:val="de-DE"/>
-        </w:rPr>
-        <w:instrText>HYPERLINK "https://github.com/Zac-HD/hypofuzz"</w:instrText>
-      </w:r>
-      <w:r>
-        <w:fldChar w:fldCharType="separate"/>
-      </w:r>
-      <w:r>
-        <w:rPr>
-          <w:rStyle w:val="Hyperlink"/>
-          <w:lang w:val="de-DE"/>
-        </w:rPr>
-        <w:t>https://github.com/Zac-HD/hypofuzz</w:t>
-      </w:r>
-      <w:r>
-        <w:fldChar w:fldCharType="end"/>
-      </w:r>
+      <w:hyperlink r:id="rId8" w:history="1">
+        <w:r>
+          <w:rPr>
+            <w:rStyle w:val="Hyperlink"/>
+            <w:lang w:val="de-DE"/>
+          </w:rPr>
+          <w:t>https://github.com/Zac-HD/hypofuzz</w:t>
+        </w:r>
+      </w:hyperlink>
     </w:p>
     <w:p>
       <w:pPr>
@@ -200,15 +163,10 @@
           <w:numId w:val="1"/>
         </w:numPr>
       </w:pPr>
-      <w:proofErr w:type="spellStart"/>
-      <w:r>
-        <w:t>CrossHair</w:t>
-      </w:r>
-      <w:proofErr w:type="spellEnd"/>
-      <w:r>
-        <w:t xml:space="preserve"> </w:t>
-      </w:r>
-      <w:hyperlink r:id="rId8" w:history="1">
+      <w:r>
+        <w:t xml:space="preserve">CrossHair </w:t>
+      </w:r>
+      <w:hyperlink r:id="rId9" w:history="1">
         <w:r>
           <w:rPr>
             <w:rStyle w:val="Hyperlink"/>
@@ -231,39 +189,7 @@
     </w:p>
     <w:p>
       <w:r>
-        <w:t xml:space="preserve">From my research, Hypothesis + </w:t>
-      </w:r>
-      <w:proofErr w:type="spellStart"/>
-      <w:r>
-        <w:t>HypoFuzz</w:t>
-      </w:r>
-      <w:proofErr w:type="spellEnd"/>
-      <w:r>
-        <w:t xml:space="preserve"> seems like it achieves everything that JQF does. Hypothesis is heavily inspired by </w:t>
-      </w:r>
-      <w:proofErr w:type="spellStart"/>
-      <w:r>
-        <w:t>QuickCheck</w:t>
-      </w:r>
-      <w:proofErr w:type="spellEnd"/>
-      <w:r>
-        <w:t xml:space="preserve"> and gives a property-based testing framework for python. It generates structured inputs and saves failing inputs for reproduction. It operates on the semantic properties of a program, making it inherently </w:t>
-      </w:r>
-      <w:proofErr w:type="gramStart"/>
-      <w:r>
-        <w:t>semantic-based</w:t>
-      </w:r>
-      <w:proofErr w:type="gramEnd"/>
-      <w:r>
-        <w:t xml:space="preserve">. It is not coverage-guided by default, so </w:t>
-      </w:r>
-      <w:proofErr w:type="spellStart"/>
-      <w:r>
-        <w:t>HypoFuzz</w:t>
-      </w:r>
-      <w:proofErr w:type="spellEnd"/>
-      <w:r>
-        <w:t xml:space="preserve"> extends it for coverage-guided exploration thus providing a fuzzing framework.</w:t>
+        <w:t>From my research, Hypothesis + HypoFuzz seems like it achieves everything that JQF does. Hypothesis is heavily inspired by QuickCheck and gives a property-based testing framework for python. It generates structured inputs and saves failing inputs for reproduction. It operates on the semantic properties of a program, making it inherently semantic-based. It is not coverage-guided by default, so HypoFuzz extends it for coverage-guided exploration thus providing a fuzzing framework.</w:t>
       </w:r>
     </w:p>
     <w:p/>
@@ -282,28 +208,15 @@
     </w:p>
     <w:p>
       <w:r>
-        <w:t>Generalise the stack example to any data structure/</w:t>
-      </w:r>
-      <w:proofErr w:type="spellStart"/>
-      <w:r>
-        <w:t>api</w:t>
-      </w:r>
-      <w:proofErr w:type="spellEnd"/>
+        <w:t>Generalise the stack example to any data structure/api</w:t>
+      </w:r>
       <w:r>
         <w:t xml:space="preserve"> that can take any type of arguments.</w:t>
       </w:r>
     </w:p>
     <w:p>
       <w:r>
-        <w:t xml:space="preserve">At some point, see if you can read the python script, create AST and traverse it </w:t>
-      </w:r>
-      <w:proofErr w:type="gramStart"/>
-      <w:r>
-        <w:t>in order to</w:t>
-      </w:r>
-      <w:proofErr w:type="gramEnd"/>
-      <w:r>
-        <w:t xml:space="preserve"> create the right test.</w:t>
+        <w:t>At some point, see if you can read the python script, create AST and traverse it in order to create the right test.</w:t>
       </w:r>
     </w:p>
     <w:p/>
@@ -317,58 +230,18 @@
         <w:t xml:space="preserve">Using it to test a very simple summing function </w:t>
       </w:r>
       <w:r>
-        <w:t xml:space="preserve">doesn’t work very well. I believe because of how universal is configured and how my two simple functions are configured, </w:t>
-      </w:r>
-      <w:proofErr w:type="spellStart"/>
-      <w:r>
-        <w:t>atheris</w:t>
-      </w:r>
-      <w:proofErr w:type="spellEnd"/>
-      <w:r>
-        <w:t xml:space="preserve"> is unable to quickly find the erroneous input.</w:t>
-      </w:r>
-    </w:p>
-    <w:p>
-      <w:r>
-        <w:t xml:space="preserve">I think the fact that fuzz testing is obfuscated inside the universal object the module is unable to correctly perform its algorithms to find erroneous inputs. I vibe coded a </w:t>
-      </w:r>
-      <w:proofErr w:type="spellStart"/>
-      <w:r>
-        <w:t>hypofuzz</w:t>
-      </w:r>
-      <w:proofErr w:type="spellEnd"/>
-      <w:r>
-        <w:t xml:space="preserve"> universal object </w:t>
-      </w:r>
-      <w:proofErr w:type="gramStart"/>
-      <w:r>
-        <w:t>and also</w:t>
-      </w:r>
-      <w:proofErr w:type="gramEnd"/>
-      <w:r>
-        <w:t xml:space="preserve"> tried manually implementing one and couldn’t get it to spot any bugs but given more time there may be a way to implement this. Just haven’t figured it out yet.</w:t>
+        <w:t>doesn’t work very well. I believe because of how universal is configured and how my two simple functions are configured, atheris is unable to quickly find the erroneous input.</w:t>
+      </w:r>
+    </w:p>
+    <w:p>
+      <w:r>
+        <w:t>I think the fact that fuzz testing is obfuscated inside the universal object the module is unable to correctly perform its algorithms to find erroneous inputs. I vibe coded a hypofuzz universal object and also tried manually implementing one and couldn’t get it to spot any bugs but given more time there may be a way to implement this. Just haven’t figured it out yet.</w:t>
       </w:r>
     </w:p>
     <w:p>
       <w:r>
         <w:lastRenderedPageBreak/>
-        <w:t xml:space="preserve">When comparing two different sorting algorithms, </w:t>
-      </w:r>
-      <w:proofErr w:type="spellStart"/>
-      <w:r>
-        <w:t>hypofuzz</w:t>
-      </w:r>
-      <w:proofErr w:type="spellEnd"/>
-      <w:r>
-        <w:t xml:space="preserve"> was unable to spot the difference when I added a small condition to quicksort if length is &gt;= 6, return the reversed list. For these </w:t>
-      </w:r>
-      <w:proofErr w:type="gramStart"/>
-      <w:r>
-        <w:t>one off</w:t>
-      </w:r>
-      <w:proofErr w:type="gramEnd"/>
-      <w:r>
-        <w:t xml:space="preserve"> conditions, coverage guidance actually makes it harder to spot the difference, as they provide very little feedback. Plain hypothesis was able to catch this bug (without coverage guidance)</w:t>
+        <w:t>When comparing two different sorting algorithms, hypofuzz was unable to spot the difference when I added a small condition to quicksort if length is &gt;= 6, return the reversed list. For these one off conditions, coverage guidance actually makes it harder to spot the difference, as they provide very little feedback. Plain hypothesis was able to catch this bug (without coverage guidance)</w:t>
       </w:r>
     </w:p>
     <w:p>
@@ -387,57 +260,12 @@
     </w:p>
     <w:p>
       <w:r>
-        <w:t xml:space="preserve">Testing universal object on two sorting algorithms always results in empty lists as universals value gets set to empty list if </w:t>
-      </w:r>
-      <w:proofErr w:type="spellStart"/>
-      <w:proofErr w:type="gramStart"/>
-      <w:r>
-        <w:t>len</w:t>
-      </w:r>
-      <w:proofErr w:type="spellEnd"/>
-      <w:r>
-        <w:t>(</w:t>
-      </w:r>
-      <w:proofErr w:type="gramEnd"/>
-      <w:r>
-        <w:t xml:space="preserve">) is called on it. This is </w:t>
-      </w:r>
-      <w:proofErr w:type="spellStart"/>
-      <w:r>
-        <w:t>bcos</w:t>
-      </w:r>
-      <w:proofErr w:type="spellEnd"/>
-      <w:r>
-        <w:t xml:space="preserve"> if we initialise it as a list of universals, this may be wrong as it may be intended to be a string. </w:t>
-      </w:r>
-    </w:p>
-    <w:p>
-      <w:r>
-        <w:t xml:space="preserve">Universal needs </w:t>
-      </w:r>
-      <w:proofErr w:type="spellStart"/>
-      <w:r>
-        <w:t>lt</w:t>
-      </w:r>
-      <w:proofErr w:type="spellEnd"/>
-      <w:r>
-        <w:t xml:space="preserve">, </w:t>
-      </w:r>
-      <w:proofErr w:type="spellStart"/>
-      <w:r>
-        <w:t>gt</w:t>
-      </w:r>
-      <w:proofErr w:type="spellEnd"/>
-      <w:r>
-        <w:t xml:space="preserve">, le, </w:t>
-      </w:r>
-      <w:proofErr w:type="spellStart"/>
-      <w:r>
-        <w:t>ge</w:t>
-      </w:r>
-      <w:proofErr w:type="spellEnd"/>
-      <w:r>
-        <w:t xml:space="preserve"> operators define</w:t>
+        <w:t xml:space="preserve">Testing universal object on two sorting algorithms always results in empty lists as universals value gets set to empty list if len() is called on it. This is bcos if we initialise it as a list of universals, this may be wrong as it may be intended to be a string. </w:t>
+      </w:r>
+    </w:p>
+    <w:p>
+      <w:r>
+        <w:t>Universal needs lt, gt, le, ge operators define</w:t>
       </w:r>
       <w:r>
         <w:t>d</w:t>
@@ -451,99 +279,20 @@
         <w:t>Universal does not support item assignment</w:t>
       </w:r>
       <w:r>
-        <w:t xml:space="preserve"> </w:t>
-      </w:r>
-      <w:proofErr w:type="spellStart"/>
-      <w:r>
-        <w:t>e.g</w:t>
-      </w:r>
-      <w:proofErr w:type="spellEnd"/>
-      <w:r>
-        <w:t xml:space="preserve"> the line</w:t>
-      </w:r>
-    </w:p>
-    <w:p>
-      <w:proofErr w:type="spellStart"/>
-      <w:proofErr w:type="gramStart"/>
-      <w:r>
-        <w:t>arr</w:t>
-      </w:r>
-      <w:proofErr w:type="spellEnd"/>
-      <w:r>
-        <w:t>[</w:t>
-      </w:r>
-      <w:proofErr w:type="spellStart"/>
-      <w:proofErr w:type="gramEnd"/>
-      <w:r>
-        <w:t>i</w:t>
-      </w:r>
-      <w:proofErr w:type="spellEnd"/>
-      <w:r>
-        <w:t xml:space="preserve"> + 1], </w:t>
-      </w:r>
-      <w:proofErr w:type="spellStart"/>
-      <w:r>
-        <w:t>arr</w:t>
-      </w:r>
-      <w:proofErr w:type="spellEnd"/>
-      <w:r>
-        <w:t xml:space="preserve">[high] = </w:t>
-      </w:r>
-      <w:proofErr w:type="spellStart"/>
-      <w:r>
-        <w:t>arr</w:t>
-      </w:r>
-      <w:proofErr w:type="spellEnd"/>
-      <w:r>
-        <w:t xml:space="preserve">[high], </w:t>
-      </w:r>
-      <w:proofErr w:type="spellStart"/>
-      <w:r>
-        <w:t>arr</w:t>
-      </w:r>
-      <w:proofErr w:type="spellEnd"/>
-      <w:r>
-        <w:t>[</w:t>
-      </w:r>
-      <w:proofErr w:type="spellStart"/>
-      <w:r>
-        <w:t>i</w:t>
-      </w:r>
-      <w:proofErr w:type="spellEnd"/>
-      <w:r>
-        <w:t xml:space="preserve"> + 1]</w:t>
-      </w:r>
-    </w:p>
-    <w:p>
-      <w:r>
-        <w:t xml:space="preserve">does not work if </w:t>
-      </w:r>
-      <w:proofErr w:type="spellStart"/>
-      <w:r>
-        <w:t>arr</w:t>
-      </w:r>
-      <w:proofErr w:type="spellEnd"/>
-      <w:r>
-        <w:t xml:space="preserve"> is a universal and each element of </w:t>
-      </w:r>
-      <w:proofErr w:type="spellStart"/>
-      <w:r>
-        <w:t>arr</w:t>
-      </w:r>
-      <w:proofErr w:type="spellEnd"/>
-      <w:r>
-        <w:t xml:space="preserve"> is a universal</w:t>
-      </w:r>
-      <w:r>
-        <w:t xml:space="preserve"> I “</w:t>
-      </w:r>
-      <w:proofErr w:type="spellStart"/>
-      <w:r>
-        <w:t>vibecoded</w:t>
-      </w:r>
-      <w:proofErr w:type="spellEnd"/>
-      <w:r>
-        <w:t>” an implementation of this.</w:t>
+        <w:t xml:space="preserve"> e.g the line</w:t>
+      </w:r>
+    </w:p>
+    <w:p>
+      <w:r>
+        <w:t>arr[i + 1], arr[high] = arr[high], arr[i + 1]</w:t>
+      </w:r>
+    </w:p>
+    <w:p>
+      <w:r>
+        <w:t>does not work if arr is a universal and each element of arr is a universal</w:t>
+      </w:r>
+      <w:r>
+        <w:t xml:space="preserve"> I “vibecoded” an implementation of this.</w:t>
       </w:r>
     </w:p>
     <w:p>
@@ -559,36 +308,12 @@
     </w:p>
     <w:p>
       <w:r>
-        <w:t xml:space="preserve">Read </w:t>
-      </w:r>
-      <w:proofErr w:type="spellStart"/>
-      <w:r>
-        <w:t>TypeEvalPy</w:t>
-      </w:r>
-      <w:proofErr w:type="spellEnd"/>
-      <w:r>
-        <w:t xml:space="preserve"> to find good frameworks for function parameters.</w:t>
-      </w:r>
-    </w:p>
-    <w:p>
-      <w:r>
-        <w:t xml:space="preserve">Tried </w:t>
-      </w:r>
-      <w:proofErr w:type="spellStart"/>
-      <w:r>
-        <w:t>HeaderGen</w:t>
-      </w:r>
-      <w:proofErr w:type="spellEnd"/>
-      <w:r>
-        <w:t xml:space="preserve"> as it was apparently the best for all categories including function parameters. When I tried it, it would only infer function return types and not parameters. The </w:t>
-      </w:r>
-      <w:proofErr w:type="spellStart"/>
-      <w:r>
-        <w:t>github</w:t>
-      </w:r>
-      <w:proofErr w:type="spellEnd"/>
-      <w:r>
-        <w:t xml:space="preserve"> only mentions that it can resolve function return types and I could not figure out any way to get it to infer parameter types. </w:t>
+        <w:t>Read TypeEvalPy to find good frameworks for function parameters.</w:t>
+      </w:r>
+    </w:p>
+    <w:p>
+      <w:r>
+        <w:t xml:space="preserve">Tried HeaderGen as it was apparently the best for all categories including function parameters. When I tried it, it would only infer function return types and not parameters. The github only mentions that it can resolve function return types and I could not figure out any way to get it to infer parameter types. </w:t>
       </w:r>
     </w:p>
     <w:p>
@@ -642,103 +367,23 @@
         </w:numPr>
       </w:pPr>
       <w:r>
-        <w:t>Hypothesis/</w:t>
-      </w:r>
-      <w:proofErr w:type="spellStart"/>
-      <w:r>
-        <w:t>Hypofuzz</w:t>
-      </w:r>
-      <w:proofErr w:type="spellEnd"/>
-      <w:r>
-        <w:t xml:space="preserve"> “Strategies” are how you define what is passed </w:t>
-      </w:r>
-      <w:proofErr w:type="gramStart"/>
-      <w:r>
-        <w:t>in to</w:t>
-      </w:r>
-      <w:proofErr w:type="gramEnd"/>
-      <w:r>
-        <w:t xml:space="preserve"> the function you want to fuzz. </w:t>
-      </w:r>
-      <w:proofErr w:type="spellStart"/>
-      <w:r>
-        <w:t>E.g</w:t>
-      </w:r>
-      <w:proofErr w:type="spellEnd"/>
-      <w:r>
-        <w:t xml:space="preserve">  </w:t>
+        <w:t xml:space="preserve">Hypothesis/Hypofuzz “Strategies” are how you define what is passed in to the function you want to fuzz. E.g  </w:t>
       </w:r>
     </w:p>
     <w:p>
       <w:r>
         <w:lastRenderedPageBreak/>
-        <w:t>@given(</w:t>
-      </w:r>
-      <w:proofErr w:type="gramStart"/>
-      <w:r>
-        <w:t>st.lists</w:t>
-      </w:r>
-      <w:proofErr w:type="gramEnd"/>
-      <w:r>
-        <w:t xml:space="preserve">(st.integers() | </w:t>
-      </w:r>
-      <w:proofErr w:type="spellStart"/>
-      <w:r>
-        <w:t>st.floats</w:t>
-      </w:r>
-      <w:proofErr w:type="spellEnd"/>
-      <w:r>
-        <w:t>()))</w:t>
-      </w:r>
-    </w:p>
-    <w:p>
-      <w:r>
-        <w:t xml:space="preserve">def </w:t>
-      </w:r>
-      <w:proofErr w:type="spellStart"/>
-      <w:r>
-        <w:t>test_sort_correct</w:t>
-      </w:r>
-      <w:proofErr w:type="spellEnd"/>
-      <w:r>
-        <w:t>(</w:t>
-      </w:r>
-      <w:proofErr w:type="spellStart"/>
-      <w:r>
-        <w:t>lst</w:t>
-      </w:r>
-      <w:proofErr w:type="spellEnd"/>
-      <w:r>
-        <w:t>):</w:t>
-      </w:r>
-    </w:p>
-    <w:p>
-      <w:r>
-        <w:t xml:space="preserve">    assert(</w:t>
-      </w:r>
-      <w:proofErr w:type="spellStart"/>
-      <w:r>
-        <w:t>my_sort</w:t>
-      </w:r>
-      <w:proofErr w:type="spellEnd"/>
-      <w:r>
-        <w:t>(</w:t>
-      </w:r>
-      <w:proofErr w:type="spellStart"/>
-      <w:r>
-        <w:t>lst</w:t>
-      </w:r>
-      <w:proofErr w:type="spellEnd"/>
-      <w:r>
-        <w:t>) == sorted(</w:t>
-      </w:r>
-      <w:proofErr w:type="spellStart"/>
-      <w:r>
-        <w:t>lst</w:t>
-      </w:r>
-      <w:proofErr w:type="spellEnd"/>
-      <w:r>
-        <w:t>))</w:t>
+        <w:t>@given(st.lists(st.integers() | st.floats()))</w:t>
+      </w:r>
+    </w:p>
+    <w:p>
+      <w:r>
+        <w:t>def test_sort_correct(lst):</w:t>
+      </w:r>
+    </w:p>
+    <w:p>
+      <w:r>
+        <w:t xml:space="preserve">    assert(my_sort(lst) == sorted(lst))</w:t>
       </w:r>
     </w:p>
     <w:p>
@@ -750,23 +395,7 @@
         </w:numPr>
       </w:pPr>
       <w:r>
-        <w:t xml:space="preserve">In that code snippet, the strategy is to fuzz </w:t>
-      </w:r>
-      <w:proofErr w:type="spellStart"/>
-      <w:r>
-        <w:t>my_sort</w:t>
-      </w:r>
-      <w:proofErr w:type="spellEnd"/>
-      <w:r>
-        <w:t xml:space="preserve"> with inputs of type list[</w:t>
-      </w:r>
-      <w:proofErr w:type="spellStart"/>
-      <w:r>
-        <w:t>int|str</w:t>
-      </w:r>
-      <w:proofErr w:type="spellEnd"/>
-      <w:r>
-        <w:t>]</w:t>
+        <w:t>In that code snippet, the strategy is to fuzz my_sort with inputs of type list[int|str]</w:t>
       </w:r>
     </w:p>
     <w:p>
@@ -778,15 +407,7 @@
         </w:numPr>
       </w:pPr>
       <w:r>
-        <w:t xml:space="preserve">In the case of my universal strategy, I simply fuzz with a strategy that can be </w:t>
-      </w:r>
-      <w:proofErr w:type="spellStart"/>
-      <w:r>
-        <w:t>though</w:t>
-      </w:r>
-      <w:proofErr w:type="spellEnd"/>
-      <w:r>
-        <w:t xml:space="preserve"> of as the following:</w:t>
+        <w:t>In the case of my universal strategy, I simply fuzz with a strategy that can be though of as the following:</w:t>
       </w:r>
     </w:p>
     <w:p>
@@ -797,55 +418,8 @@
           <w:numId w:val="3"/>
         </w:numPr>
       </w:pPr>
-      <w:proofErr w:type="spellStart"/>
-      <w:r>
-        <w:t>strat</w:t>
-      </w:r>
-      <w:proofErr w:type="spellEnd"/>
-      <w:r>
-        <w:t xml:space="preserve"> = </w:t>
-      </w:r>
-      <w:proofErr w:type="spellStart"/>
-      <w:r>
-        <w:t>int|str|float|bool|None|list</w:t>
-      </w:r>
-      <w:proofErr w:type="spellEnd"/>
-      <w:r>
-        <w:t>[</w:t>
-      </w:r>
-      <w:proofErr w:type="spellStart"/>
-      <w:r>
-        <w:t>strat</w:t>
-      </w:r>
-      <w:proofErr w:type="spellEnd"/>
-      <w:r>
-        <w:t>]|</w:t>
-      </w:r>
-      <w:proofErr w:type="spellStart"/>
-      <w:r>
-        <w:t>dict</w:t>
-      </w:r>
-      <w:proofErr w:type="spellEnd"/>
-      <w:r>
-        <w:t>[</w:t>
-      </w:r>
-      <w:proofErr w:type="spellStart"/>
-      <w:proofErr w:type="gramStart"/>
-      <w:r>
-        <w:t>str,strat</w:t>
-      </w:r>
-      <w:proofErr w:type="spellEnd"/>
-      <w:proofErr w:type="gramEnd"/>
-      <w:r>
-        <w:t>]|tuple[</w:t>
-      </w:r>
-      <w:proofErr w:type="spellStart"/>
-      <w:r>
-        <w:t>strat</w:t>
-      </w:r>
-      <w:proofErr w:type="spellEnd"/>
-      <w:r>
-        <w:t>]</w:t>
+      <w:r>
+        <w:t>strat = int|str|float|bool|None|list[strat]|dict[str,strat]|tuple[strat]</w:t>
       </w:r>
     </w:p>
     <w:p>
@@ -857,15 +431,7 @@
         </w:numPr>
       </w:pPr>
       <w:r>
-        <w:t xml:space="preserve">I have logic implemented so that if we encounter a </w:t>
-      </w:r>
-      <w:proofErr w:type="spellStart"/>
-      <w:r>
-        <w:t>TypeError</w:t>
-      </w:r>
-      <w:proofErr w:type="spellEnd"/>
-      <w:r>
-        <w:t>, we discard the type that caused the error from the pool of possible types in our strategy for future iterations.</w:t>
+        <w:t>I have logic implemented so that if we encounter a TypeError, we discard the type that caused the error from the pool of possible types in our strategy for future iterations.</w:t>
       </w:r>
     </w:p>
     <w:p>
@@ -877,15 +443,7 @@
         </w:numPr>
       </w:pPr>
       <w:r>
-        <w:t xml:space="preserve">It seems to work </w:t>
-      </w:r>
-      <w:proofErr w:type="gramStart"/>
-      <w:r>
-        <w:t>fairly well</w:t>
-      </w:r>
-      <w:proofErr w:type="gramEnd"/>
-      <w:r>
-        <w:t xml:space="preserve"> for the simple tests I have performed so far</w:t>
+        <w:t>It seems to work fairly well for the simple tests I have performed so far</w:t>
       </w:r>
     </w:p>
     <w:p>
@@ -897,15 +455,7 @@
         </w:numPr>
       </w:pPr>
       <w:r>
-        <w:t xml:space="preserve">Because it essentially brute forces fuzzing with different types until it works, I can imagine this being quite slow for fuzzing complex functions with lots of </w:t>
-      </w:r>
-      <w:proofErr w:type="gramStart"/>
-      <w:r>
-        <w:t>arguments</w:t>
-      </w:r>
-      <w:proofErr w:type="gramEnd"/>
-      <w:r>
-        <w:t xml:space="preserve"> but this will have to be tested more</w:t>
+        <w:t>Because it essentially brute forces fuzzing with different types until it works, I can imagine this being quite slow for fuzzing complex functions with lots of arguments but this will have to be tested more</w:t>
       </w:r>
     </w:p>
     <w:p>
@@ -928,49 +478,17 @@
     </w:p>
     <w:p>
       <w:r>
-        <w:t xml:space="preserve">If we assume there isn’t any explicit casting in the function we are fuzzing, how would a universal handle a situation where the type is ambiguous </w:t>
-      </w:r>
-      <w:proofErr w:type="spellStart"/>
-      <w:r>
-        <w:t>e.g</w:t>
-      </w:r>
-      <w:proofErr w:type="spellEnd"/>
-      <w:r>
-        <w:t xml:space="preserve"> calling </w:t>
-      </w:r>
-      <w:proofErr w:type="spellStart"/>
-      <w:r>
-        <w:t>len</w:t>
-      </w:r>
-      <w:proofErr w:type="spellEnd"/>
-      <w:r>
-        <w:t>(universal). Len is valid for both string and list so how do we lock universal here?</w:t>
-      </w:r>
-    </w:p>
-    <w:p>
-      <w:r>
-        <w:t xml:space="preserve">Similarly, how would we define operators like plus (+) for example? If we have two universals u1 and u2, the statement u1 + u2 could imply that u1 and u2 are strings, </w:t>
-      </w:r>
-      <w:proofErr w:type="spellStart"/>
-      <w:r>
-        <w:t>ints</w:t>
-      </w:r>
-      <w:proofErr w:type="spellEnd"/>
-      <w:r>
-        <w:t>, floats, lists, tuples so how can we implement this operator.</w:t>
-      </w:r>
-    </w:p>
-    <w:p>
-      <w:r>
-        <w:t xml:space="preserve">Theoretically speaking, at best we are determining the type of a (universal) object based on how that object is treated in the code and what functions and operations are applied to it. At best a perfect solution seems to me like it would essentially be a glorified </w:t>
-      </w:r>
-      <w:proofErr w:type="gramStart"/>
-      <w:r>
-        <w:t>type</w:t>
-      </w:r>
-      <w:proofErr w:type="gramEnd"/>
-      <w:r>
-        <w:t xml:space="preserve"> inference algorithm.</w:t>
+        <w:t>If we assume there isn’t any explicit casting in the function we are fuzzing, how would a universal handle a situation where the type is ambiguous e.g calling len(universal). Len is valid for both string and list so how do we lock universal here?</w:t>
+      </w:r>
+    </w:p>
+    <w:p>
+      <w:r>
+        <w:t>Similarly, how would we define operators like plus (+) for example? If we have two universals u1 and u2, the statement u1 + u2 could imply that u1 and u2 are strings, ints, floats, lists, tuples so how can we implement this operator.</w:t>
+      </w:r>
+    </w:p>
+    <w:p>
+      <w:r>
+        <w:t>Theoretically speaking, at best we are determining the type of a (universal) object based on how that object is treated in the code and what functions and operations are applied to it. At best a perfect solution seems to me like it would essentially be a glorified type inference algorithm.</w:t>
       </w:r>
     </w:p>
     <w:p/>
@@ -987,15 +505,7 @@
     <w:p>
       <w:r>
         <w:lastRenderedPageBreak/>
-        <w:t xml:space="preserve">See if </w:t>
-      </w:r>
-      <w:proofErr w:type="spellStart"/>
-      <w:r>
-        <w:t>func</w:t>
-      </w:r>
-      <w:proofErr w:type="spellEnd"/>
-      <w:r>
-        <w:t xml:space="preserve"> argument is callable, raise exception and print that the code is using callbacks which are not currently supported</w:t>
+        <w:t>See if func argument is callable, raise exception and print that the code is using callbacks which are not currently supported</w:t>
       </w:r>
     </w:p>
     <w:p/>
@@ -1017,31 +527,13 @@
         <w:t xml:space="preserve">classes </w:t>
       </w:r>
       <w:r>
-        <w:t xml:space="preserve">for 2 stack </w:t>
-      </w:r>
-      <w:proofErr w:type="gramStart"/>
-      <w:r>
-        <w:t>implementation</w:t>
-      </w:r>
-      <w:proofErr w:type="gramEnd"/>
-    </w:p>
-    <w:p>
-      <w:r>
-        <w:t xml:space="preserve">The </w:t>
-      </w:r>
-      <w:proofErr w:type="spellStart"/>
-      <w:r>
-        <w:t>fuzzer</w:t>
-      </w:r>
-      <w:proofErr w:type="spellEnd"/>
-      <w:r>
-        <w:t xml:space="preserve"> </w:t>
-      </w:r>
-      <w:proofErr w:type="gramStart"/>
-      <w:r>
-        <w:t>should :</w:t>
-      </w:r>
-      <w:proofErr w:type="gramEnd"/>
+        <w:t>for 2 stack implementation</w:t>
+      </w:r>
+    </w:p>
+    <w:p>
+      <w:r>
+        <w:t>The fuzzer should :</w:t>
+      </w:r>
     </w:p>
     <w:p>
       <w:r>
@@ -1061,36 +553,12 @@
     <w:p/>
     <w:p>
       <w:r>
-        <w:t xml:space="preserve">Added </w:t>
-      </w:r>
-      <w:proofErr w:type="spellStart"/>
-      <w:r>
-        <w:t>arg</w:t>
-      </w:r>
-      <w:proofErr w:type="spellEnd"/>
-      <w:r>
-        <w:t>/</w:t>
-      </w:r>
-      <w:proofErr w:type="spellStart"/>
-      <w:r>
-        <w:t>kwarg</w:t>
-      </w:r>
-      <w:proofErr w:type="spellEnd"/>
-      <w:r>
-        <w:t xml:space="preserve"> support for fuzz testing strategy</w:t>
-      </w:r>
-    </w:p>
-    <w:p>
-      <w:r>
-        <w:t xml:space="preserve">Wrote basic </w:t>
-      </w:r>
-      <w:proofErr w:type="gramStart"/>
-      <w:r>
-        <w:t>first class</w:t>
-      </w:r>
-      <w:proofErr w:type="gramEnd"/>
-      <w:r>
-        <w:t xml:space="preserve"> equivalence tester</w:t>
+        <w:t>Added arg/kwarg support for fuzz testing strategy</w:t>
+      </w:r>
+    </w:p>
+    <w:p>
+      <w:r>
+        <w:t>Wrote basic first class equivalence tester</w:t>
       </w:r>
     </w:p>
     <w:p>
@@ -1110,36 +578,12 @@
     </w:p>
     <w:p>
       <w:r>
-        <w:t xml:space="preserve">I have tried applying this equivalence tester to small refactors in real classes from open sources repos such as </w:t>
-      </w:r>
-      <w:proofErr w:type="spellStart"/>
-      <w:r>
-        <w:t>openai</w:t>
-      </w:r>
-      <w:proofErr w:type="spellEnd"/>
-      <w:r>
-        <w:t xml:space="preserve"> but have struggled to find working examples. My equivalence tester is quite situational. Method name/signature </w:t>
-      </w:r>
-      <w:proofErr w:type="gramStart"/>
-      <w:r>
-        <w:t>refactors</w:t>
-      </w:r>
-      <w:proofErr w:type="gramEnd"/>
-      <w:r>
-        <w:t xml:space="preserve"> and external dependencies cause issues</w:t>
-      </w:r>
-    </w:p>
-    <w:p>
-      <w:r>
-        <w:t xml:space="preserve">Tested it on two stack implementations, one that throws index error if you try to peek or pop and empty stack, and one that returns None for these operations. The </w:t>
-      </w:r>
-      <w:proofErr w:type="spellStart"/>
-      <w:r>
-        <w:t>fuzzer</w:t>
-      </w:r>
-      <w:proofErr w:type="spellEnd"/>
-      <w:r>
-        <w:t xml:space="preserve"> was able to pick up on this difference immediately</w:t>
+        <w:t>I have tried applying this equivalence tester to small refactors in real classes from open sources repos such as openai but have struggled to find working examples. My equivalence tester is quite situational. Method name/signature refactors and external dependencies cause issues</w:t>
+      </w:r>
+    </w:p>
+    <w:p>
+      <w:r>
+        <w:t>Tested it on two stack implementations, one that throws index error if you try to peek or pop and empty stack, and one that returns None for these operations. The fuzzer was able to pick up on this difference immediately</w:t>
       </w:r>
     </w:p>
     <w:p/>
@@ -1175,7 +619,7 @@
                     <pic:cNvPicPr/>
                   </pic:nvPicPr>
                   <pic:blipFill>
-                    <a:blip r:embed="rId9"/>
+                    <a:blip r:embed="rId10"/>
                     <a:stretch>
                       <a:fillRect/>
                     </a:stretch>
@@ -1229,29 +673,13 @@
     </w:p>
     <w:p>
       <w:r>
-        <w:t xml:space="preserve">What I mean by this is that currently, my code will test two classes for equivalence and if the classes have differing methods or even method names, the code will reject them. Allow the user to define a </w:t>
-      </w:r>
-      <w:proofErr w:type="spellStart"/>
-      <w:r>
-        <w:t>json</w:t>
-      </w:r>
-      <w:proofErr w:type="spellEnd"/>
-      <w:r>
-        <w:t xml:space="preserve"> file with the specific methods from the class that they want tested so they can exclude certain methods if they </w:t>
-      </w:r>
-      <w:proofErr w:type="gramStart"/>
-      <w:r>
-        <w:t>like, and</w:t>
-      </w:r>
-      <w:proofErr w:type="gramEnd"/>
-      <w:r>
-        <w:t xml:space="preserve"> optionally allow the user to also define specifically what arguments each method should be tested with.</w:t>
+        <w:t>What I mean by this is that currently, my code will test two classes for equivalence and if the classes have differing methods or even method names, the code will reject them. Allow the user to define a json file with the specific methods from the class that they want tested so they can exclude certain methods if they like, and optionally allow the user to also define specifically what arguments each method should be tested with.</w:t>
       </w:r>
     </w:p>
     <w:p/>
     <w:p/>
     <w:p>
-      <w:hyperlink r:id="rId10" w:history="1">
+      <w:hyperlink r:id="rId11" w:history="1">
         <w:r>
           <w:rPr>
             <w:rStyle w:val="Hyperlink"/>
@@ -1286,15 +714,7 @@
       </w:r>
       <w:r>
         <w:lastRenderedPageBreak/>
-        <w:t xml:space="preserve">duplicates, removing the need to fuzz both </w:t>
-      </w:r>
-      <w:proofErr w:type="spellStart"/>
-      <w:r>
-        <w:t>funcs</w:t>
-      </w:r>
-      <w:proofErr w:type="spellEnd"/>
-      <w:r>
-        <w:t>. Useful in practice for speeding up a common case</w:t>
+        <w:t>duplicates, removing the need to fuzz both funcs. Useful in practice for speeding up a common case</w:t>
       </w:r>
     </w:p>
     <w:p>
@@ -1306,15 +726,7 @@
         </w:numPr>
       </w:pPr>
       <w:r>
-        <w:t xml:space="preserve">Filter out </w:t>
-      </w:r>
-      <w:proofErr w:type="spellStart"/>
-      <w:r>
-        <w:t>funcs</w:t>
-      </w:r>
-      <w:proofErr w:type="spellEnd"/>
-      <w:r>
-        <w:t xml:space="preserve"> with no parameters and return values</w:t>
+        <w:t>Filter out funcs with no parameters and return values</w:t>
       </w:r>
     </w:p>
     <w:p>
@@ -1326,15 +738,7 @@
         </w:numPr>
       </w:pPr>
       <w:r>
-        <w:t xml:space="preserve">Possibly filter out </w:t>
-      </w:r>
-      <w:proofErr w:type="spellStart"/>
-      <w:r>
-        <w:t>funcs</w:t>
-      </w:r>
-      <w:proofErr w:type="spellEnd"/>
-      <w:r>
-        <w:t xml:space="preserve"> that invoke external classes or methods</w:t>
+        <w:t>Possibly filter out funcs that invoke external classes or methods</w:t>
       </w:r>
     </w:p>
     <w:p>
@@ -1346,15 +750,7 @@
         </w:numPr>
       </w:pPr>
       <w:r>
-        <w:t xml:space="preserve">They use </w:t>
-      </w:r>
-      <w:proofErr w:type="spellStart"/>
-      <w:r>
-        <w:t>pynguin</w:t>
-      </w:r>
-      <w:proofErr w:type="spellEnd"/>
-      <w:r>
-        <w:t xml:space="preserve"> which is a test generation framework that does not use fuzz testing</w:t>
+        <w:t>They use pynguin which is a test generation framework that does not use fuzz testing</w:t>
       </w:r>
     </w:p>
     <w:p>
@@ -1374,15 +770,7 @@
     </w:p>
     <w:p>
       <w:r>
-        <w:t xml:space="preserve">What if u have a class with 1 </w:t>
-      </w:r>
-      <w:proofErr w:type="gramStart"/>
-      <w:r>
-        <w:t>methods</w:t>
-      </w:r>
-      <w:proofErr w:type="gramEnd"/>
-      <w:r>
-        <w:t>, a factory method which gives u back 3 methods</w:t>
+        <w:t>What if u have a class with 1 methods, a factory method which gives u back 3 methods</w:t>
       </w:r>
     </w:p>
     <w:p>
@@ -1404,7 +792,7 @@
       </w:r>
     </w:p>
     <w:p>
-      <w:hyperlink r:id="rId11" w:history="1">
+      <w:hyperlink r:id="rId12" w:history="1">
         <w:r>
           <w:rPr>
             <w:rStyle w:val="Hyperlink"/>
@@ -1415,29 +803,13 @@
     </w:p>
     <w:p>
       <w:r>
-        <w:t xml:space="preserve">could instead go more practical, targeting </w:t>
-      </w:r>
-      <w:proofErr w:type="spellStart"/>
-      <w:r>
-        <w:t>datastructure</w:t>
-      </w:r>
-      <w:proofErr w:type="spellEnd"/>
-      <w:r>
-        <w:t xml:space="preserve"> implementations online</w:t>
+        <w:t>could instead go more practical, targeting datastructure implementations online</w:t>
       </w:r>
     </w:p>
     <w:p/>
     <w:p>
       <w:r>
-        <w:t xml:space="preserve">For function-function verification: I am currently implementing the case where both functions return (create) a new function. In this case I want to then perform the same function-function verification on these two new returned functions. The problem is the </w:t>
-      </w:r>
-      <w:proofErr w:type="spellStart"/>
-      <w:r>
-        <w:t>hypofuzz</w:t>
-      </w:r>
-      <w:proofErr w:type="spellEnd"/>
-      <w:r>
-        <w:t xml:space="preserve"> does not exactly allow for a recursive implementation like this. </w:t>
+        <w:t xml:space="preserve">For function-function verification: I am currently implementing the case where both functions return (create) a new function. In this case I want to then perform the same function-function verification on these two new returned functions. The problem is the hypofuzz does not exactly allow for a recursive implementation like this. </w:t>
       </w:r>
     </w:p>
     <w:p>
@@ -1482,37 +854,7 @@
         <w:rPr>
           <w:iCs/>
         </w:rPr>
-        <w:t xml:space="preserve">Other than this issue, another issue is trying to reason with functions that take callable parameters. </w:t>
-      </w:r>
-      <w:proofErr w:type="spellStart"/>
-      <w:proofErr w:type="gramStart"/>
-      <w:r>
-        <w:rPr>
-          <w:iCs/>
-        </w:rPr>
-        <w:t>Cant</w:t>
-      </w:r>
-      <w:proofErr w:type="spellEnd"/>
-      <w:proofErr w:type="gramEnd"/>
-      <w:r>
-        <w:rPr>
-          <w:iCs/>
-        </w:rPr>
-        <w:t xml:space="preserve"> exactly fuzz a function as an input so </w:t>
-      </w:r>
-      <w:proofErr w:type="spellStart"/>
-      <w:r>
-        <w:rPr>
-          <w:iCs/>
-        </w:rPr>
-        <w:t>im</w:t>
-      </w:r>
-      <w:proofErr w:type="spellEnd"/>
-      <w:r>
-        <w:rPr>
-          <w:iCs/>
-        </w:rPr>
-        <w:t xml:space="preserve"> not sure what to do here</w:t>
+        <w:t>Other than this issue, another issue is trying to reason with functions that take callable parameters. Cant exactly fuzz a function as an input so im not sure what to do here</w:t>
       </w:r>
       <w:r>
         <w:rPr>
@@ -1549,7 +891,7 @@
                     <pic:cNvPicPr/>
                   </pic:nvPicPr>
                   <pic:blipFill>
-                    <a:blip r:embed="rId12"/>
+                    <a:blip r:embed="rId13"/>
                     <a:stretch>
                       <a:fillRect/>
                     </a:stretch>
@@ -1580,138 +922,46 @@
         <w:rPr>
           <w:iCs/>
         </w:rPr>
-        <w:t xml:space="preserve">Using universal strategy + dummy functions (the testing framework doesn’t know that the function </w:t>
-      </w:r>
-      <w:proofErr w:type="spellStart"/>
-      <w:r>
-        <w:rPr>
-          <w:iCs/>
-        </w:rPr>
-        <w:t>arg</w:t>
-      </w:r>
-      <w:proofErr w:type="spellEnd"/>
-      <w:r>
-        <w:rPr>
-          <w:iCs/>
-        </w:rPr>
-        <w:t xml:space="preserve"> is necessarily </w:t>
-      </w:r>
-      <w:proofErr w:type="gramStart"/>
-      <w:r>
-        <w:rPr>
-          <w:iCs/>
-        </w:rPr>
-        <w:t>callable</w:t>
-      </w:r>
-      <w:proofErr w:type="gramEnd"/>
-      <w:r>
-        <w:rPr>
-          <w:iCs/>
-        </w:rPr>
-        <w:t xml:space="preserve"> so it uses universal strategy) it takes 11 minutes to find the difference in </w:t>
-      </w:r>
-      <w:proofErr w:type="spellStart"/>
-      <w:r>
-        <w:rPr>
-          <w:iCs/>
-        </w:rPr>
-        <w:t>call_nested_param_ineq</w:t>
-      </w:r>
-      <w:proofErr w:type="spellEnd"/>
-      <w:r>
-        <w:rPr>
-          <w:iCs/>
-        </w:rPr>
-        <w:t xml:space="preserve">. Chances are, with type annotations this will be a bit faster as the tester will start passing in more callable </w:t>
-      </w:r>
-      <w:proofErr w:type="spellStart"/>
-      <w:r>
-        <w:rPr>
-          <w:iCs/>
-        </w:rPr>
-        <w:t>args</w:t>
-      </w:r>
-      <w:proofErr w:type="spellEnd"/>
-      <w:r>
-        <w:rPr>
-          <w:iCs/>
-        </w:rPr>
-        <w:t xml:space="preserve"> from the start</w:t>
-      </w:r>
-    </w:p>
-    <w:p>
-      <w:pPr>
-        <w:rPr>
-          <w:iCs/>
-        </w:rPr>
-      </w:pPr>
-      <w:r>
-        <w:rPr>
-          <w:iCs/>
-        </w:rPr>
-        <w:t xml:space="preserve">Adding a mechanism to see if an </w:t>
-      </w:r>
-      <w:proofErr w:type="spellStart"/>
-      <w:r>
-        <w:rPr>
-          <w:iCs/>
-        </w:rPr>
-        <w:t>arg</w:t>
-      </w:r>
-      <w:proofErr w:type="spellEnd"/>
-      <w:r>
-        <w:rPr>
-          <w:iCs/>
-        </w:rPr>
-        <w:t xml:space="preserve"> is “called” within a function should be </w:t>
-      </w:r>
-      <w:proofErr w:type="gramStart"/>
-      <w:r>
-        <w:rPr>
-          <w:iCs/>
-        </w:rPr>
-        <w:t>pretty easy</w:t>
-      </w:r>
-      <w:proofErr w:type="gramEnd"/>
-      <w:r>
-        <w:rPr>
-          <w:iCs/>
-        </w:rPr>
-        <w:t xml:space="preserve"> and should greatly improve time efficiency</w:t>
-      </w:r>
-    </w:p>
-    <w:p>
-      <w:pPr>
-        <w:rPr>
-          <w:iCs/>
-        </w:rPr>
-      </w:pPr>
-    </w:p>
-    <w:p>
-      <w:pPr>
-        <w:rPr>
-          <w:iCs/>
-        </w:rPr>
-      </w:pPr>
-      <w:r>
-        <w:rPr>
-          <w:iCs/>
-        </w:rPr>
-        <w:t xml:space="preserve">To be as faithful to the theory: we need to complicate/generalise </w:t>
-      </w:r>
-      <w:proofErr w:type="gramStart"/>
-      <w:r>
-        <w:rPr>
-          <w:iCs/>
-        </w:rPr>
-        <w:t>f(</w:t>
-      </w:r>
-      <w:proofErr w:type="gramEnd"/>
-      <w:r>
-        <w:rPr>
-          <w:iCs/>
-        </w:rPr>
-        <w:t>) so it can call any function it knows. Bound things, we don’t want more than 2 recursive calls, more than etc.</w:t>
+        <w:t>Using universal strategy + dummy functions (the testing framework doesn’t know that the function arg is necessarily callable so it uses universal strategy) it takes 11 minutes to find the difference in call_nested_param_ineq</w:t>
+      </w:r>
+      <w:r>
+        <w:rPr>
+          <w:iCs/>
+        </w:rPr>
+        <w:t>. Chances are, with type annotations this will be a bit faster as the tester will start passing in more callable args from the start</w:t>
+      </w:r>
+    </w:p>
+    <w:p>
+      <w:pPr>
+        <w:rPr>
+          <w:iCs/>
+        </w:rPr>
+      </w:pPr>
+      <w:r>
+        <w:rPr>
+          <w:iCs/>
+        </w:rPr>
+        <w:t>Adding a mechanism to see if an arg is “called” within a function should be pretty easy and should greatly improve time efficiency</w:t>
+      </w:r>
+    </w:p>
+    <w:p>
+      <w:pPr>
+        <w:rPr>
+          <w:iCs/>
+        </w:rPr>
+      </w:pPr>
+    </w:p>
+    <w:p>
+      <w:pPr>
+        <w:rPr>
+          <w:iCs/>
+        </w:rPr>
+      </w:pPr>
+      <w:r>
+        <w:rPr>
+          <w:iCs/>
+        </w:rPr>
+        <w:t>To be as faithful to the theory: we need to complicate/generalise f() so it can call any function it knows. Bound things, we don’t want more than 2 recursive calls, more than etc.</w:t>
       </w:r>
     </w:p>
     <w:p>
@@ -1782,48 +1032,20 @@
         <w:rPr>
           <w:iCs/>
         </w:rPr>
-        <w:t xml:space="preserve">If I have time, extend </w:t>
-      </w:r>
-      <w:proofErr w:type="gramStart"/>
-      <w:r>
-        <w:rPr>
-          <w:iCs/>
-        </w:rPr>
-        <w:t>f(</w:t>
-      </w:r>
-      <w:proofErr w:type="gramEnd"/>
-      <w:r>
-        <w:rPr>
-          <w:iCs/>
-        </w:rPr>
-        <w:t>) functions to take and return numbers</w:t>
-      </w:r>
-    </w:p>
-    <w:p>
-      <w:pPr>
-        <w:rPr>
-          <w:iCs/>
-        </w:rPr>
-      </w:pPr>
-      <w:r>
-        <w:rPr>
-          <w:iCs/>
-        </w:rPr>
-        <w:t xml:space="preserve">Then I can look at test suites, try it out in some application areas where equivalence is important, </w:t>
-      </w:r>
-      <w:proofErr w:type="gramStart"/>
-      <w:r>
-        <w:rPr>
-          <w:iCs/>
-        </w:rPr>
-        <w:t>property based</w:t>
-      </w:r>
-      <w:proofErr w:type="gramEnd"/>
-      <w:r>
-        <w:rPr>
-          <w:iCs/>
-        </w:rPr>
-        <w:t xml:space="preserve"> testing test suite and run with my pipeline.</w:t>
+        <w:t>If I have time, extend f() functions to take and return numbers</w:t>
+      </w:r>
+    </w:p>
+    <w:p>
+      <w:pPr>
+        <w:rPr>
+          <w:iCs/>
+        </w:rPr>
+      </w:pPr>
+      <w:r>
+        <w:rPr>
+          <w:iCs/>
+        </w:rPr>
+        <w:t>Then I can look at test suites, try it out in some application areas where equivalence is important, property based testing test suite and run with my pipeline.</w:t>
       </w:r>
     </w:p>
     <w:p>
@@ -1878,79 +1100,33 @@
           <w:bCs/>
           <w:iCs/>
         </w:rPr>
-        <w:t xml:space="preserve">Pass a </w:t>
-      </w:r>
-      <w:proofErr w:type="spellStart"/>
-      <w:r>
+        <w:t>Pass a datastruct library thru a mutation testing suite to see how it performs against my pipeline, try to find examples my pipeline can find that the existing suite cant</w:t>
+      </w:r>
+    </w:p>
+    <w:p>
+      <w:pPr>
         <w:rPr>
           <w:b/>
           <w:bCs/>
           <w:iCs/>
         </w:rPr>
-        <w:t>datastruct</w:t>
-      </w:r>
-      <w:proofErr w:type="spellEnd"/>
+      </w:pPr>
       <w:r>
         <w:rPr>
           <w:b/>
           <w:bCs/>
           <w:iCs/>
         </w:rPr>
-        <w:t xml:space="preserve"> library thru a mutation testing suite to see how it performs against my pipeline, try to find examples my pipeline can find that the existing suite </w:t>
-      </w:r>
-      <w:proofErr w:type="gramStart"/>
-      <w:r>
+        <w:t>Look at open source library with tests at the end</w:t>
+      </w:r>
+    </w:p>
+    <w:p>
+      <w:pPr>
         <w:rPr>
           <w:b/>
           <w:bCs/>
           <w:iCs/>
         </w:rPr>
-        <w:t>cant</w:t>
-      </w:r>
-      <w:proofErr w:type="gramEnd"/>
-    </w:p>
-    <w:p>
-      <w:pPr>
-        <w:rPr>
-          <w:b/>
-          <w:bCs/>
-          <w:iCs/>
-        </w:rPr>
-      </w:pPr>
-      <w:r>
-        <w:rPr>
-          <w:b/>
-          <w:bCs/>
-          <w:iCs/>
-        </w:rPr>
-        <w:t xml:space="preserve">Look at </w:t>
-      </w:r>
-      <w:proofErr w:type="gramStart"/>
-      <w:r>
-        <w:rPr>
-          <w:b/>
-          <w:bCs/>
-          <w:iCs/>
-        </w:rPr>
-        <w:t>open source</w:t>
-      </w:r>
-      <w:proofErr w:type="gramEnd"/>
-      <w:r>
-        <w:rPr>
-          <w:b/>
-          <w:bCs/>
-          <w:iCs/>
-        </w:rPr>
-        <w:t xml:space="preserve"> library with tests at the end</w:t>
-      </w:r>
-    </w:p>
-    <w:p>
-      <w:pPr>
-        <w:rPr>
-          <w:b/>
-          <w:bCs/>
-          <w:iCs/>
-        </w:rPr>
       </w:pPr>
     </w:p>
     <w:p>
@@ -1969,21 +1145,7 @@
         <w:rPr>
           <w:iCs/>
         </w:rPr>
-        <w:t xml:space="preserve"> </w:t>
-      </w:r>
-      <w:proofErr w:type="spellStart"/>
-      <w:r>
-        <w:rPr>
-          <w:iCs/>
-        </w:rPr>
-        <w:t>are_equivalent</w:t>
-      </w:r>
-      <w:proofErr w:type="spellEnd"/>
-      <w:r>
-        <w:rPr>
-          <w:iCs/>
-        </w:rPr>
-        <w:t xml:space="preserve"> for profiler to check that the arguments to any function called by the top level</w:t>
+        <w:t xml:space="preserve"> are_equivalent for profiler to check that the arguments to any function called by the top level</w:t>
       </w:r>
       <w:r>
         <w:rPr>
@@ -2022,21 +1184,7 @@
         <w:rPr>
           <w:iCs/>
         </w:rPr>
-        <w:t xml:space="preserve">One idea: perform static analysis on the function we are fuzzing before we fuzz it to see if it takes a function f as a param, if that function f itself takes a param. </w:t>
-      </w:r>
-      <w:proofErr w:type="gramStart"/>
-      <w:r>
-        <w:rPr>
-          <w:iCs/>
-        </w:rPr>
-        <w:t>Thus</w:t>
-      </w:r>
-      <w:proofErr w:type="gramEnd"/>
-      <w:r>
-        <w:rPr>
-          <w:iCs/>
-        </w:rPr>
-        <w:t xml:space="preserve"> we can narrow down which function fuzzing strategy to employ</w:t>
+        <w:t>One idea: perform static analysis on the function we are fuzzing before we fuzz it to see if it takes a function f as a param, if that function f itself takes a param. Thus we can narrow down which function fuzzing strategy to employ</w:t>
       </w:r>
     </w:p>
     <w:p>
@@ -2072,35 +1220,7 @@
         <w:rPr>
           <w:iCs/>
         </w:rPr>
-        <w:t xml:space="preserve">Functions f that </w:t>
-      </w:r>
-      <w:proofErr w:type="gramStart"/>
-      <w:r>
-        <w:rPr>
-          <w:iCs/>
-        </w:rPr>
-        <w:t>take</w:t>
-      </w:r>
-      <w:proofErr w:type="gramEnd"/>
-      <w:r>
-        <w:rPr>
-          <w:iCs/>
-        </w:rPr>
-        <w:t xml:space="preserve"> a single function as a param like f(h): we can check the </w:t>
-      </w:r>
-      <w:proofErr w:type="spellStart"/>
-      <w:r>
-        <w:rPr>
-          <w:iCs/>
-        </w:rPr>
-        <w:t>sig</w:t>
-      </w:r>
-      <w:proofErr w:type="spellEnd"/>
-      <w:r>
-        <w:rPr>
-          <w:iCs/>
-        </w:rPr>
-        <w:t xml:space="preserve"> of the function h given, and fuzz some input accordingly to call h with within f.</w:t>
+        <w:t>Functions f that take a single function as a param like f(h): we can check the sig of the function h given, and fuzz some input accordingly to call h with within f.</w:t>
       </w:r>
     </w:p>
     <w:p>
@@ -2146,86 +1266,22 @@
         <w:rPr>
           <w:iCs/>
         </w:rPr>
-        <w:t xml:space="preserve">If (state of </w:t>
-      </w:r>
-      <w:proofErr w:type="spellStart"/>
-      <w:r>
-        <w:rPr>
-          <w:iCs/>
-        </w:rPr>
-        <w:t>module_a</w:t>
-      </w:r>
-      <w:proofErr w:type="spellEnd"/>
-      <w:r>
-        <w:rPr>
-          <w:iCs/>
-        </w:rPr>
-        <w:t xml:space="preserve"> before running == state of </w:t>
-      </w:r>
-      <w:proofErr w:type="spellStart"/>
-      <w:r>
-        <w:rPr>
-          <w:iCs/>
-        </w:rPr>
-        <w:t>module_a</w:t>
-      </w:r>
-      <w:proofErr w:type="spellEnd"/>
-      <w:r>
-        <w:rPr>
-          <w:iCs/>
-        </w:rPr>
-        <w:t xml:space="preserve"> after n steps) !=</w:t>
+        <w:t>If (state of module_a before running == state of module_a after n steps) !=</w:t>
       </w:r>
       <w:r>
         <w:rPr>
           <w:iCs/>
         </w:rPr>
         <w:br/>
-        <w:t xml:space="preserve">   (state of </w:t>
-      </w:r>
-      <w:proofErr w:type="spellStart"/>
-      <w:r>
-        <w:rPr>
-          <w:iCs/>
-        </w:rPr>
-        <w:t>module_b</w:t>
-      </w:r>
-      <w:proofErr w:type="spellEnd"/>
-      <w:r>
-        <w:rPr>
-          <w:iCs/>
-        </w:rPr>
-        <w:t xml:space="preserve"> before running == state of </w:t>
-      </w:r>
-      <w:proofErr w:type="spellStart"/>
-      <w:r>
-        <w:rPr>
-          <w:iCs/>
-        </w:rPr>
-        <w:t>module_b</w:t>
-      </w:r>
-      <w:proofErr w:type="spellEnd"/>
-      <w:r>
-        <w:rPr>
-          <w:iCs/>
-        </w:rPr>
-        <w:t xml:space="preserve"> after n steps):</w:t>
+        <w:t xml:space="preserve">   (state of module_b before running == state of module_b after n steps):</w:t>
       </w:r>
       <w:r>
         <w:rPr>
           <w:iCs/>
         </w:rPr>
         <w:br/>
-        <w:t xml:space="preserve">   they are </w:t>
-      </w:r>
-      <w:proofErr w:type="spellStart"/>
-      <w:r>
-        <w:rPr>
-          <w:iCs/>
-        </w:rPr>
-        <w:t>inequiv</w:t>
-      </w:r>
-      <w:proofErr w:type="spellEnd"/>
+        <w:t xml:space="preserve">   they are inequiv</w:t>
+      </w:r>
       <w:r>
         <w:rPr>
           <w:iCs/>
@@ -2238,21 +1294,7 @@
           <w:iCs/>
         </w:rPr>
         <w:br/>
-        <w:t xml:space="preserve">Some examples in plain </w:t>
-      </w:r>
-      <w:proofErr w:type="spellStart"/>
-      <w:r>
-        <w:rPr>
-          <w:iCs/>
-        </w:rPr>
-        <w:t>english</w:t>
-      </w:r>
-      <w:proofErr w:type="spellEnd"/>
-      <w:r>
-        <w:rPr>
-          <w:iCs/>
-        </w:rPr>
-        <w:t xml:space="preserve"> for my own sanity: </w:t>
+        <w:t xml:space="preserve">Some examples in plain english for my own sanity: </w:t>
       </w:r>
       <w:r>
         <w:rPr>
@@ -2265,30 +1307,8 @@
           <w:iCs/>
         </w:rPr>
         <w:br/>
-        <w:t xml:space="preserve">if </w:t>
-      </w:r>
-      <w:proofErr w:type="spellStart"/>
-      <w:r>
-        <w:rPr>
-          <w:iCs/>
-        </w:rPr>
-        <w:t>module_a</w:t>
-      </w:r>
-      <w:proofErr w:type="spellEnd"/>
-      <w:r>
-        <w:rPr>
-          <w:iCs/>
-        </w:rPr>
-        <w:t xml:space="preserve"> alters a global variable x after running n steps, but </w:t>
-      </w:r>
-      <w:proofErr w:type="spellStart"/>
-      <w:r>
-        <w:rPr>
-          <w:iCs/>
-        </w:rPr>
-        <w:t>module_b</w:t>
-      </w:r>
-      <w:proofErr w:type="spellEnd"/>
+        <w:t>if module_a alters a global variable x after running n steps, but module_b</w:t>
+      </w:r>
       <w:r>
         <w:rPr>
           <w:iCs/>
@@ -2320,35 +1340,7 @@
           <w:iCs/>
         </w:rPr>
         <w:br/>
-        <w:t xml:space="preserve">if </w:t>
-      </w:r>
-      <w:proofErr w:type="spellStart"/>
-      <w:r>
-        <w:rPr>
-          <w:iCs/>
-        </w:rPr>
-        <w:t>module_a</w:t>
-      </w:r>
-      <w:proofErr w:type="spellEnd"/>
-      <w:r>
-        <w:rPr>
-          <w:iCs/>
-        </w:rPr>
-        <w:t xml:space="preserve"> contains the definition of a global variable x, but it does not change, and </w:t>
-      </w:r>
-      <w:proofErr w:type="spellStart"/>
-      <w:r>
-        <w:rPr>
-          <w:iCs/>
-        </w:rPr>
-        <w:t>module_b</w:t>
-      </w:r>
-      <w:proofErr w:type="spellEnd"/>
-      <w:r>
-        <w:rPr>
-          <w:iCs/>
-        </w:rPr>
-        <w:t xml:space="preserve"> does not</w:t>
+        <w:t>if module_a contains the definition of a global variable x, but it does not change, and module_b does not</w:t>
       </w:r>
       <w:r>
         <w:rPr>
@@ -2375,35 +1367,7 @@
           <w:iCs/>
         </w:rPr>
         <w:br/>
-        <w:t xml:space="preserve">if </w:t>
-      </w:r>
-      <w:proofErr w:type="spellStart"/>
-      <w:r>
-        <w:rPr>
-          <w:iCs/>
-        </w:rPr>
-        <w:t>module_a</w:t>
-      </w:r>
-      <w:proofErr w:type="spellEnd"/>
-      <w:r>
-        <w:rPr>
-          <w:iCs/>
-        </w:rPr>
-        <w:t xml:space="preserve"> alters a global string variable s after running n steps, but </w:t>
-      </w:r>
-      <w:proofErr w:type="spellStart"/>
-      <w:r>
-        <w:rPr>
-          <w:iCs/>
-        </w:rPr>
-        <w:t>module_b</w:t>
-      </w:r>
-      <w:proofErr w:type="spellEnd"/>
-      <w:r>
-        <w:rPr>
-          <w:iCs/>
-        </w:rPr>
-        <w:t xml:space="preserve"> alters a global int</w:t>
+        <w:t>if module_a alters a global string variable s after running n steps, but module_b alters a global int</w:t>
       </w:r>
       <w:r>
         <w:rPr>
@@ -2446,7 +1410,7 @@
         </w:rPr>
         <w:t xml:space="preserve">Experimented with mutation testing. Started with </w:t>
       </w:r>
-      <w:hyperlink r:id="rId13" w:history="1">
+      <w:hyperlink r:id="rId14" w:history="1">
         <w:r>
           <w:rPr>
             <w:rStyle w:val="Hyperlink"/>
@@ -2479,47 +1443,272 @@
         <w:rPr>
           <w:iCs/>
         </w:rPr>
-        <w:t xml:space="preserve">When testing the </w:t>
-      </w:r>
-      <w:proofErr w:type="spellStart"/>
-      <w:r>
-        <w:rPr>
-          <w:iCs/>
-        </w:rPr>
-        <w:t>file_io</w:t>
-      </w:r>
-      <w:proofErr w:type="spellEnd"/>
-      <w:r>
-        <w:rPr>
-          <w:iCs/>
-        </w:rPr>
-        <w:t xml:space="preserve"> utils, got 21/24</w:t>
-      </w:r>
-    </w:p>
-    <w:p>
-      <w:pPr>
-        <w:rPr>
-          <w:iCs/>
-        </w:rPr>
-      </w:pPr>
-      <w:r>
-        <w:rPr>
-          <w:iCs/>
-        </w:rPr>
-        <w:t xml:space="preserve">Math utils: </w:t>
-      </w:r>
-      <w:r>
-        <w:rPr>
-          <w:iCs/>
-        </w:rPr>
-        <w:t>9</w:t>
-      </w:r>
-      <w:r>
-        <w:rPr>
-          <w:iCs/>
-        </w:rPr>
-        <w:t xml:space="preserve"> + </w:t>
-      </w:r>
+        <w:t>5</w:t>
+      </w:r>
+      <w:r>
+        <w:rPr>
+          <w:iCs/>
+        </w:rPr>
+        <w:t>7</w:t>
+      </w:r>
+      <w:r>
+        <w:rPr>
+          <w:iCs/>
+        </w:rPr>
+        <w:t>/77</w:t>
+      </w:r>
+      <w:r>
+        <w:rPr>
+          <w:iCs/>
+        </w:rPr>
+        <w:t xml:space="preserve"> in 6.8 mins</w:t>
+      </w:r>
+      <w:r>
+        <w:rPr>
+          <w:iCs/>
+        </w:rPr>
+        <w:t>, whereas the existing test suite got 57/77</w:t>
+      </w:r>
+      <w:r>
+        <w:rPr>
+          <w:iCs/>
+        </w:rPr>
+        <w:t xml:space="preserve"> </w:t>
+      </w:r>
+    </w:p>
+    <w:p>
+      <w:pPr>
+        <w:rPr>
+          <w:iCs/>
+        </w:rPr>
+      </w:pPr>
+      <w:r>
+        <w:rPr>
+          <w:iCs/>
+        </w:rPr>
+        <w:t xml:space="preserve">Testing requests: had to exclude some tests </w:t>
+      </w:r>
+    </w:p>
+    <w:p>
+      <w:pPr>
+        <w:rPr>
+          <w:b/>
+          <w:bCs/>
+          <w:iCs/>
+        </w:rPr>
+      </w:pPr>
+      <w:r>
+        <w:rPr>
+          <w:b/>
+          <w:bCs/>
+          <w:iCs/>
+        </w:rPr>
+        <w:t xml:space="preserve">Running mutmut on requests: </w:t>
+      </w:r>
+    </w:p>
+    <w:p>
+      <w:pPr>
+        <w:rPr>
+          <w:iCs/>
+        </w:rPr>
+      </w:pPr>
+      <w:r>
+        <w:rPr>
+          <w:iCs/>
+        </w:rPr>
+        <w:t>Running mutation testing</w:t>
+      </w:r>
+    </w:p>
+    <w:p>
+      <w:pPr>
+        <w:rPr>
+          <w:iCs/>
+        </w:rPr>
+      </w:pPr>
+      <w:r>
+        <w:rPr>
+          <w:rFonts w:ascii="Segoe UI Symbol" w:hAnsi="Segoe UI Symbol" w:cs="Segoe UI Symbol"/>
+          <w:iCs/>
+        </w:rPr>
+        <w:t>⠧</w:t>
+      </w:r>
+      <w:r>
+        <w:rPr>
+          <w:iCs/>
+        </w:rPr>
+        <w:t xml:space="preserve"> 3673/</w:t>
+      </w:r>
+      <w:proofErr w:type="gramStart"/>
+      <w:r>
+        <w:rPr>
+          <w:iCs/>
+        </w:rPr>
+        <w:t xml:space="preserve">3673  </w:t>
+      </w:r>
+      <w:r>
+        <w:rPr>
+          <w:rFonts w:ascii="Segoe UI Emoji" w:hAnsi="Segoe UI Emoji" w:cs="Segoe UI Emoji"/>
+          <w:iCs/>
+        </w:rPr>
+        <w:t>🎉</w:t>
+      </w:r>
+      <w:proofErr w:type="gramEnd"/>
+      <w:r>
+        <w:rPr>
+          <w:iCs/>
+        </w:rPr>
+        <w:t xml:space="preserve"> 2241 </w:t>
+      </w:r>
+      <w:r>
+        <w:rPr>
+          <w:rFonts w:ascii="Aptos" w:hAnsi="Aptos" w:cs="Aptos"/>
+          <w:iCs/>
+        </w:rPr>
+        <w:t>🫥</w:t>
+      </w:r>
+      <w:r>
+        <w:rPr>
+          <w:iCs/>
+        </w:rPr>
+        <w:t xml:space="preserve"> 337  </w:t>
+      </w:r>
+      <w:r>
+        <w:rPr>
+          <w:rFonts w:ascii="Segoe UI Emoji" w:hAnsi="Segoe UI Emoji" w:cs="Segoe UI Emoji"/>
+          <w:iCs/>
+        </w:rPr>
+        <w:t>⏰</w:t>
+      </w:r>
+      <w:r>
+        <w:rPr>
+          <w:iCs/>
+        </w:rPr>
+        <w:t xml:space="preserve"> 453  </w:t>
+      </w:r>
+      <w:r>
+        <w:rPr>
+          <w:rFonts w:ascii="Segoe UI Emoji" w:hAnsi="Segoe UI Emoji" w:cs="Segoe UI Emoji"/>
+          <w:iCs/>
+        </w:rPr>
+        <w:t>🤔</w:t>
+      </w:r>
+      <w:r>
+        <w:rPr>
+          <w:iCs/>
+        </w:rPr>
+        <w:t xml:space="preserve"> 0  </w:t>
+      </w:r>
+      <w:r>
+        <w:rPr>
+          <w:rFonts w:ascii="Segoe UI Emoji" w:hAnsi="Segoe UI Emoji" w:cs="Segoe UI Emoji"/>
+          <w:iCs/>
+        </w:rPr>
+        <w:t>🙁</w:t>
+      </w:r>
+      <w:r>
+        <w:rPr>
+          <w:iCs/>
+        </w:rPr>
+        <w:t xml:space="preserve"> 642  </w:t>
+      </w:r>
+      <w:r>
+        <w:rPr>
+          <w:rFonts w:ascii="Segoe UI Emoji" w:hAnsi="Segoe UI Emoji" w:cs="Segoe UI Emoji"/>
+          <w:iCs/>
+        </w:rPr>
+        <w:t>🔇</w:t>
+      </w:r>
+      <w:r>
+        <w:rPr>
+          <w:iCs/>
+        </w:rPr>
+        <w:t xml:space="preserve"> 0</w:t>
+      </w:r>
+    </w:p>
+    <w:p>
+      <w:pPr>
+        <w:rPr>
+          <w:iCs/>
+        </w:rPr>
+      </w:pPr>
+      <w:r>
+        <w:rPr>
+          <w:iCs/>
+        </w:rPr>
+        <w:t>Mutants identified: 347/1449</w:t>
+      </w:r>
+      <w:r>
+        <w:rPr>
+          <w:iCs/>
+        </w:rPr>
+        <w:t xml:space="preserve"> – not sure why not all mutants were hit</w:t>
+      </w:r>
+    </w:p>
+    <w:p>
+      <w:pPr>
+        <w:rPr>
+          <w:iCs/>
+        </w:rPr>
+      </w:pPr>
+      <w:r>
+        <w:rPr>
+          <w:iCs/>
+        </w:rPr>
+        <w:t>Completed in 13372.785392045975 seconds.</w:t>
+      </w:r>
+      <w:r>
+        <w:rPr>
+          <w:iCs/>
+        </w:rPr>
+        <w:t xml:space="preserve"> (3.7 hrs)</w:t>
+      </w:r>
+    </w:p>
+    <w:p>
+      <w:pPr>
+        <w:rPr>
+          <w:iCs/>
+        </w:rPr>
+      </w:pPr>
+    </w:p>
+    <w:p>
+      <w:pPr>
+        <w:rPr>
+          <w:iCs/>
+        </w:rPr>
+      </w:pPr>
+      <w:r>
+        <w:rPr>
+          <w:iCs/>
+        </w:rPr>
+        <w:t>With the following addition to pyproject.toml</w:t>
+      </w:r>
+    </w:p>
+    <w:p>
+      <w:pPr>
+        <w:rPr>
+          <w:iCs/>
+        </w:rPr>
+      </w:pPr>
+      <w:r>
+        <w:rPr>
+          <w:iCs/>
+        </w:rPr>
+        <w:t>[tool.mutmut]</w:t>
+      </w:r>
+      <w:r>
+        <w:rPr>
+          <w:iCs/>
+        </w:rPr>
+        <w:br/>
+        <w:t>pytest_add_cli_args = ["-k", "not test_env_cert_bundles and not test_different_connection_pool_for_tls_settings_verify_bundle_unexpired_cert"]</w:t>
+      </w:r>
+    </w:p>
+    <w:p>
+      <w:pPr>
+        <w:rPr>
+          <w:iCs/>
+        </w:rPr>
+      </w:pPr>
     </w:p>
     <w:p/>
     <w:p>

</xml_diff>

<commit_message>
Add the rest of the inequiv test suite
</commit_message>
<xml_diff>
--- a/Masters project notes.docx
+++ b/Masters project notes.docx
@@ -1661,6 +1661,64 @@
           <w:iCs/>
         </w:rPr>
         <w:t xml:space="preserve"> (3.7 hrs)</w:t>
+      </w:r>
+    </w:p>
+    <w:p>
+      <w:pPr>
+        <w:rPr>
+          <w:iCs/>
+        </w:rPr>
+      </w:pPr>
+      <w:r>
+        <w:rPr>
+          <w:iCs/>
+        </w:rPr>
+        <w:t>Changed it to include class methods</w:t>
+      </w:r>
+    </w:p>
+    <w:p>
+      <w:pPr>
+        <w:rPr>
+          <w:iCs/>
+        </w:rPr>
+      </w:pPr>
+      <w:r>
+        <w:rPr>
+          <w:iCs/>
+        </w:rPr>
+        <w:t>Mutants identified: 200/4467</w:t>
+      </w:r>
+    </w:p>
+    <w:p>
+      <w:pPr>
+        <w:rPr>
+          <w:iCs/>
+        </w:rPr>
+      </w:pPr>
+      <w:r>
+        <w:rPr>
+          <w:iCs/>
+        </w:rPr>
+        <w:t>Completed in 45184.606248140335 seconds.</w:t>
+      </w:r>
+      <w:r>
+        <w:rPr>
+          <w:iCs/>
+        </w:rPr>
+        <w:t xml:space="preserve"> (12.5hrs)</w:t>
+      </w:r>
+    </w:p>
+    <w:p>
+      <w:pPr>
+        <w:rPr>
+          <w:iCs/>
+        </w:rPr>
+      </w:pPr>
+      <w:r>
+        <w:rPr>
+          <w:iCs/>
+        </w:rPr>
+        <w:t>Somehow less mutants and more methods??</w:t>
       </w:r>
     </w:p>
     <w:p>

</xml_diff>

<commit_message>
Allow callable args to H-O functions to interleave execution of functions they themselves are given as arguments
</commit_message>
<xml_diff>
--- a/Masters project notes.docx
+++ b/Masters project notes.docx
@@ -130,15 +130,28 @@
         </w:rPr>
         <w:t xml:space="preserve">HypoFuzz </w:t>
       </w:r>
-      <w:hyperlink r:id="rId8" w:history="1">
-        <w:r>
-          <w:rPr>
-            <w:rStyle w:val="Hyperlink"/>
-            <w:lang w:val="de-DE"/>
-          </w:rPr>
-          <w:t>https://github.com/Zac-HD/hypofuzz</w:t>
-        </w:r>
-      </w:hyperlink>
+      <w:r>
+        <w:fldChar w:fldCharType="begin"/>
+      </w:r>
+      <w:r>
+        <w:rPr>
+          <w:lang w:val="de-DE"/>
+        </w:rPr>
+        <w:instrText>HYPERLINK "https://github.com/Zac-HD/hypofuzz"</w:instrText>
+      </w:r>
+      <w:r>
+        <w:fldChar w:fldCharType="separate"/>
+      </w:r>
+      <w:r>
+        <w:rPr>
+          <w:rStyle w:val="Hyperlink"/>
+          <w:lang w:val="de-DE"/>
+        </w:rPr>
+        <w:t>https://github.com/Zac-HD/hypofuzz</w:t>
+      </w:r>
+      <w:r>
+        <w:fldChar w:fldCharType="end"/>
+      </w:r>
     </w:p>
     <w:p>
       <w:pPr>
@@ -166,7 +179,7 @@
       <w:r>
         <w:t xml:space="preserve">CrossHair </w:t>
       </w:r>
-      <w:hyperlink r:id="rId9" w:history="1">
+      <w:hyperlink r:id="rId8" w:history="1">
         <w:r>
           <w:rPr>
             <w:rStyle w:val="Hyperlink"/>
@@ -619,7 +632,7 @@
                     <pic:cNvPicPr/>
                   </pic:nvPicPr>
                   <pic:blipFill>
-                    <a:blip r:embed="rId10"/>
+                    <a:blip r:embed="rId9"/>
                     <a:stretch>
                       <a:fillRect/>
                     </a:stretch>
@@ -679,7 +692,7 @@
     <w:p/>
     <w:p/>
     <w:p>
-      <w:hyperlink r:id="rId11" w:history="1">
+      <w:hyperlink r:id="rId10" w:history="1">
         <w:r>
           <w:rPr>
             <w:rStyle w:val="Hyperlink"/>
@@ -792,7 +805,7 @@
       </w:r>
     </w:p>
     <w:p>
-      <w:hyperlink r:id="rId12" w:history="1">
+      <w:hyperlink r:id="rId11" w:history="1">
         <w:r>
           <w:rPr>
             <w:rStyle w:val="Hyperlink"/>
@@ -891,7 +904,7 @@
                     <pic:cNvPicPr/>
                   </pic:nvPicPr>
                   <pic:blipFill>
-                    <a:blip r:embed="rId13"/>
+                    <a:blip r:embed="rId12"/>
                     <a:stretch>
                       <a:fillRect/>
                     </a:stretch>
@@ -1410,7 +1423,7 @@
         </w:rPr>
         <w:t xml:space="preserve">Experimented with mutation testing. Started with </w:t>
       </w:r>
-      <w:hyperlink r:id="rId14" w:history="1">
+      <w:hyperlink r:id="rId13" w:history="1">
         <w:r>
           <w:rPr>
             <w:rStyle w:val="Hyperlink"/>
@@ -1536,14 +1549,7 @@
         <w:rPr>
           <w:iCs/>
         </w:rPr>
-        <w:t xml:space="preserve"> 3673/</w:t>
-      </w:r>
-      <w:proofErr w:type="gramStart"/>
-      <w:r>
-        <w:rPr>
-          <w:iCs/>
-        </w:rPr>
-        <w:t xml:space="preserve">3673  </w:t>
+        <w:t xml:space="preserve"> 3673/3673  </w:t>
       </w:r>
       <w:r>
         <w:rPr>
@@ -1552,7 +1558,6 @@
         </w:rPr>
         <w:t>🎉</w:t>
       </w:r>
-      <w:proofErr w:type="gramEnd"/>
       <w:r>
         <w:rPr>
           <w:iCs/>
@@ -1767,6 +1772,465 @@
           <w:iCs/>
         </w:rPr>
       </w:pPr>
+    </w:p>
+    <w:p>
+      <w:pPr>
+        <w:rPr>
+          <w:iCs/>
+        </w:rPr>
+      </w:pPr>
+      <w:r>
+        <w:rPr>
+          <w:iCs/>
+        </w:rPr>
+        <w:t>Additions:</w:t>
+      </w:r>
+    </w:p>
+    <w:p>
+      <w:pPr>
+        <w:rPr>
+          <w:iCs/>
+        </w:rPr>
+      </w:pPr>
+      <w:r>
+        <w:rPr>
+          <w:iCs/>
+        </w:rPr>
+        <w:t>Tested more hobbit suite</w:t>
+      </w:r>
+    </w:p>
+    <w:p>
+      <w:pPr>
+        <w:rPr>
+          <w:iCs/>
+        </w:rPr>
+      </w:pPr>
+      <w:r>
+        <w:rPr>
+          <w:iCs/>
+        </w:rPr>
+        <w:t>Wrote program equivalence</w:t>
+      </w:r>
+    </w:p>
+    <w:p>
+      <w:pPr>
+        <w:rPr>
+          <w:iCs/>
+        </w:rPr>
+      </w:pPr>
+      <w:r>
+        <w:rPr>
+          <w:iCs/>
+        </w:rPr>
+        <w:t>Wrote script to run entire hobbit suite</w:t>
+      </w:r>
+    </w:p>
+    <w:p>
+      <w:pPr>
+        <w:rPr>
+          <w:iCs/>
+        </w:rPr>
+      </w:pPr>
+      <w:r>
+        <w:rPr>
+          <w:iCs/>
+        </w:rPr>
+        <w:t>Functions can alter  global state</w:t>
+      </w:r>
+    </w:p>
+    <w:p>
+      <w:pPr>
+        <w:rPr>
+          <w:iCs/>
+        </w:rPr>
+      </w:pPr>
+      <w:r>
+        <w:rPr>
+          <w:iCs/>
+        </w:rPr>
+        <w:t>Mutation testing stuff</w:t>
+      </w:r>
+    </w:p>
+    <w:p>
+      <w:pPr>
+        <w:rPr>
+          <w:iCs/>
+        </w:rPr>
+      </w:pPr>
+    </w:p>
+    <w:p>
+      <w:pPr>
+        <w:rPr>
+          <w:iCs/>
+        </w:rPr>
+      </w:pPr>
+      <w:r>
+        <w:rPr>
+          <w:iCs/>
+        </w:rPr>
+        <w:t>Questions:</w:t>
+      </w:r>
+    </w:p>
+    <w:p>
+      <w:pPr>
+        <w:rPr>
+          <w:iCs/>
+        </w:rPr>
+      </w:pPr>
+      <w:r>
+        <w:rPr>
+          <w:iCs/>
+        </w:rPr>
+        <w:lastRenderedPageBreak/>
+        <w:t xml:space="preserve">What do I say about translating hobbit to python in the thesis? That I used </w:t>
+      </w:r>
+      <w:proofErr w:type="spellStart"/>
+      <w:r>
+        <w:rPr>
+          <w:iCs/>
+        </w:rPr>
+        <w:t>gpt</w:t>
+      </w:r>
+      <w:proofErr w:type="spellEnd"/>
+      <w:r>
+        <w:rPr>
+          <w:iCs/>
+        </w:rPr>
+        <w:t>?</w:t>
+      </w:r>
+    </w:p>
+    <w:p>
+      <w:pPr>
+        <w:rPr>
+          <w:iCs/>
+        </w:rPr>
+      </w:pPr>
+      <w:r>
+        <w:rPr>
+          <w:iCs/>
+        </w:rPr>
+        <w:t>Yes. Include sample prompts with responses</w:t>
+      </w:r>
+    </w:p>
+    <w:p>
+      <w:pPr>
+        <w:rPr>
+          <w:iCs/>
+        </w:rPr>
+      </w:pPr>
+      <w:r>
+        <w:rPr>
+          <w:iCs/>
+        </w:rPr>
+        <w:t xml:space="preserve">How do I treat two programs where 1 has global state and the other </w:t>
+      </w:r>
+      <w:proofErr w:type="spellStart"/>
+      <w:r>
+        <w:rPr>
+          <w:iCs/>
+        </w:rPr>
+        <w:t>doesnt</w:t>
+      </w:r>
+      <w:proofErr w:type="spellEnd"/>
+    </w:p>
+    <w:p>
+      <w:pPr>
+        <w:rPr>
+          <w:iCs/>
+        </w:rPr>
+      </w:pPr>
+    </w:p>
+    <w:p>
+      <w:pPr>
+        <w:rPr>
+          <w:iCs/>
+        </w:rPr>
+      </w:pPr>
+      <w:r>
+        <w:rPr>
+          <w:iCs/>
+        </w:rPr>
+        <w:t>The trace is from the perspective of the observer</w:t>
+      </w:r>
+    </w:p>
+    <w:p>
+      <w:pPr>
+        <w:rPr>
+          <w:iCs/>
+        </w:rPr>
+      </w:pPr>
+      <w:r>
+        <w:rPr>
+          <w:iCs/>
+        </w:rPr>
+        <w:t xml:space="preserve">We </w:t>
+      </w:r>
+      <w:proofErr w:type="spellStart"/>
+      <w:r>
+        <w:rPr>
+          <w:iCs/>
+        </w:rPr>
+        <w:t>cant</w:t>
+      </w:r>
+      <w:proofErr w:type="spellEnd"/>
+      <w:r>
+        <w:rPr>
+          <w:iCs/>
+        </w:rPr>
+        <w:t xml:space="preserve"> see internal recursion</w:t>
+      </w:r>
+    </w:p>
+    <w:p>
+      <w:pPr>
+        <w:rPr>
+          <w:iCs/>
+        </w:rPr>
+      </w:pPr>
+      <w:r>
+        <w:rPr>
+          <w:iCs/>
+        </w:rPr>
+        <w:t>If function returns function, observer can call that function maybe</w:t>
+      </w:r>
+    </w:p>
+    <w:p>
+      <w:pPr>
+        <w:rPr>
+          <w:iCs/>
+        </w:rPr>
+      </w:pPr>
+      <w:proofErr w:type="spellStart"/>
+      <w:r>
+        <w:rPr>
+          <w:iCs/>
+        </w:rPr>
+        <w:t>Reentrancy</w:t>
+      </w:r>
+      <w:proofErr w:type="spellEnd"/>
+      <w:r>
+        <w:rPr>
+          <w:iCs/>
+        </w:rPr>
+        <w:t xml:space="preserve">. </w:t>
+      </w:r>
+    </w:p>
+    <w:p>
+      <w:pPr>
+        <w:rPr>
+          <w:iCs/>
+        </w:rPr>
+      </w:pPr>
+      <w:r>
+        <w:rPr>
+          <w:iCs/>
+        </w:rPr>
+        <w:t xml:space="preserve">Function can make a choice between all </w:t>
+      </w:r>
+      <w:proofErr w:type="spellStart"/>
+      <w:r>
+        <w:rPr>
+          <w:iCs/>
+        </w:rPr>
+        <w:t>funcs</w:t>
+      </w:r>
+      <w:proofErr w:type="spellEnd"/>
+      <w:r>
+        <w:rPr>
+          <w:iCs/>
+        </w:rPr>
+        <w:t xml:space="preserve"> it knows</w:t>
+      </w:r>
+    </w:p>
+    <w:p>
+      <w:pPr>
+        <w:rPr>
+          <w:iCs/>
+        </w:rPr>
+      </w:pPr>
+      <w:r>
+        <w:rPr>
+          <w:iCs/>
+        </w:rPr>
+        <w:t>Maybe make observers store return values received in sequence</w:t>
+      </w:r>
+    </w:p>
+    <w:p>
+      <w:pPr>
+        <w:rPr>
+          <w:iCs/>
+        </w:rPr>
+      </w:pPr>
+      <w:r>
+        <w:rPr>
+          <w:iCs/>
+        </w:rPr>
+        <w:t>F can write a stream to a file</w:t>
+      </w:r>
+    </w:p>
+    <w:p>
+      <w:pPr>
+        <w:rPr>
+          <w:iCs/>
+        </w:rPr>
+      </w:pPr>
+      <w:r>
+        <w:rPr>
+          <w:iCs/>
+        </w:rPr>
+        <w:t>Have to retranslate hobbit suite</w:t>
+      </w:r>
+    </w:p>
+    <w:p>
+      <w:pPr>
+        <w:rPr>
+          <w:iCs/>
+        </w:rPr>
+      </w:pPr>
+      <w:r>
+        <w:rPr>
+          <w:iCs/>
+        </w:rPr>
+        <w:t xml:space="preserve">Currently, catch </w:t>
+      </w:r>
+      <w:r>
+        <w:rPr>
+          <w:iCs/>
+        </w:rPr>
+        <w:t>38-</w:t>
+      </w:r>
+      <w:r>
+        <w:rPr>
+          <w:iCs/>
+        </w:rPr>
+        <w:t>44/79 from hobbit suite</w:t>
+      </w:r>
+      <w:r>
+        <w:rPr>
+          <w:iCs/>
+        </w:rPr>
+        <w:t xml:space="preserve"> in 14-17 mins</w:t>
+      </w:r>
+    </w:p>
+    <w:p>
+      <w:pPr>
+        <w:rPr>
+          <w:iCs/>
+        </w:rPr>
+      </w:pPr>
+      <w:r>
+        <w:rPr>
+          <w:iCs/>
+        </w:rPr>
+        <w:t>Need to check if input arguments get mutated</w:t>
+      </w:r>
+    </w:p>
+    <w:p>
+      <w:pPr>
+        <w:rPr>
+          <w:iCs/>
+        </w:rPr>
+      </w:pPr>
+      <w:r>
+        <w:rPr>
+          <w:iCs/>
+        </w:rPr>
+        <w:t>There is a demo</w:t>
+      </w:r>
+    </w:p>
+    <w:p>
+      <w:pPr>
+        <w:rPr>
+          <w:b/>
+          <w:bCs/>
+          <w:iCs/>
+        </w:rPr>
+      </w:pPr>
+      <w:r>
+        <w:rPr>
+          <w:b/>
+          <w:bCs/>
+          <w:iCs/>
+        </w:rPr>
+        <w:t xml:space="preserve">Check on </w:t>
+      </w:r>
+      <w:proofErr w:type="spellStart"/>
+      <w:r>
+        <w:rPr>
+          <w:b/>
+          <w:bCs/>
+          <w:iCs/>
+        </w:rPr>
+        <w:t>cross_reentrancy_param</w:t>
+      </w:r>
+      <w:proofErr w:type="spellEnd"/>
+    </w:p>
+    <w:p>
+      <w:pPr>
+        <w:rPr>
+          <w:iCs/>
+        </w:rPr>
+      </w:pPr>
+      <w:r>
+        <w:rPr>
+          <w:iCs/>
+        </w:rPr>
+        <w:t xml:space="preserve">Added functionality that if a higher order function returns a </w:t>
+      </w:r>
+      <w:r>
+        <w:rPr>
+          <w:b/>
+          <w:bCs/>
+          <w:iCs/>
+        </w:rPr>
+        <w:t>tuple</w:t>
+      </w:r>
+      <w:r>
+        <w:rPr>
+          <w:iCs/>
+        </w:rPr>
+        <w:t xml:space="preserve"> of functions, we interleave the execution of those functions</w:t>
+      </w:r>
+      <w:r>
+        <w:rPr>
+          <w:iCs/>
+        </w:rPr>
+        <w:t xml:space="preserve">. </w:t>
+      </w:r>
+    </w:p>
+    <w:p>
+      <w:pPr>
+        <w:rPr>
+          <w:iCs/>
+        </w:rPr>
+      </w:pPr>
+      <w:r>
+        <w:rPr>
+          <w:iCs/>
+        </w:rPr>
+        <w:t>Added functionality that if a higher order function takes a callable parameter, and then calls that callable parameter passing in multiple functions as arguments to that callable parameter, then that callable parameter can interleave the execution of the functions it is given</w:t>
+      </w:r>
+    </w:p>
+    <w:p>
+      <w:pPr>
+        <w:rPr>
+          <w:b/>
+          <w:bCs/>
+          <w:iCs/>
+        </w:rPr>
+      </w:pPr>
+    </w:p>
+    <w:p>
+      <w:pPr>
+        <w:rPr>
+          <w:iCs/>
+        </w:rPr>
+      </w:pPr>
+      <w:r>
+        <w:rPr>
+          <w:iCs/>
+        </w:rPr>
+        <w:t>Need to consider if the function we are testing returns a tuple containing a function</w:t>
+      </w:r>
     </w:p>
     <w:p/>
     <w:p>

</xml_diff>

<commit_message>
Improve mutation testing runner to incorporate class equivalence
</commit_message>
<xml_diff>
--- a/Masters project notes.docx
+++ b/Masters project notes.docx
@@ -130,28 +130,15 @@
         </w:rPr>
         <w:t xml:space="preserve">HypoFuzz </w:t>
       </w:r>
-      <w:r>
-        <w:fldChar w:fldCharType="begin"/>
-      </w:r>
-      <w:r>
-        <w:rPr>
-          <w:lang w:val="de-DE"/>
-        </w:rPr>
-        <w:instrText>HYPERLINK "https://github.com/Zac-HD/hypofuzz"</w:instrText>
-      </w:r>
-      <w:r>
-        <w:fldChar w:fldCharType="separate"/>
-      </w:r>
-      <w:r>
-        <w:rPr>
-          <w:rStyle w:val="Hyperlink"/>
-          <w:lang w:val="de-DE"/>
-        </w:rPr>
-        <w:t>https://github.com/Zac-HD/hypofuzz</w:t>
-      </w:r>
-      <w:r>
-        <w:fldChar w:fldCharType="end"/>
-      </w:r>
+      <w:hyperlink r:id="rId8" w:history="1">
+        <w:r>
+          <w:rPr>
+            <w:rStyle w:val="Hyperlink"/>
+            <w:lang w:val="de-DE"/>
+          </w:rPr>
+          <w:t>https://github.com/Zac-HD/hypofuzz</w:t>
+        </w:r>
+      </w:hyperlink>
     </w:p>
     <w:p>
       <w:pPr>
@@ -179,7 +166,7 @@
       <w:r>
         <w:t xml:space="preserve">CrossHair </w:t>
       </w:r>
-      <w:hyperlink r:id="rId8" w:history="1">
+      <w:hyperlink r:id="rId9" w:history="1">
         <w:r>
           <w:rPr>
             <w:rStyle w:val="Hyperlink"/>
@@ -632,7 +619,7 @@
                     <pic:cNvPicPr/>
                   </pic:nvPicPr>
                   <pic:blipFill>
-                    <a:blip r:embed="rId9"/>
+                    <a:blip r:embed="rId10"/>
                     <a:stretch>
                       <a:fillRect/>
                     </a:stretch>
@@ -692,7 +679,7 @@
     <w:p/>
     <w:p/>
     <w:p>
-      <w:hyperlink r:id="rId10" w:history="1">
+      <w:hyperlink r:id="rId11" w:history="1">
         <w:r>
           <w:rPr>
             <w:rStyle w:val="Hyperlink"/>
@@ -805,7 +792,7 @@
       </w:r>
     </w:p>
     <w:p>
-      <w:hyperlink r:id="rId11" w:history="1">
+      <w:hyperlink r:id="rId12" w:history="1">
         <w:r>
           <w:rPr>
             <w:rStyle w:val="Hyperlink"/>
@@ -904,7 +891,7 @@
                     <pic:cNvPicPr/>
                   </pic:nvPicPr>
                   <pic:blipFill>
-                    <a:blip r:embed="rId12"/>
+                    <a:blip r:embed="rId13"/>
                     <a:stretch>
                       <a:fillRect/>
                     </a:stretch>
@@ -1423,7 +1410,7 @@
         </w:rPr>
         <w:t xml:space="preserve">Experimented with mutation testing. Started with </w:t>
       </w:r>
-      <w:hyperlink r:id="rId13" w:history="1">
+      <w:hyperlink r:id="rId14" w:history="1">
         <w:r>
           <w:rPr>
             <w:rStyle w:val="Hyperlink"/>
@@ -1743,6 +1730,169 @@
         <w:rPr>
           <w:iCs/>
         </w:rPr>
+        <w:t>Ran it on a library of data structures:</w:t>
+      </w:r>
+    </w:p>
+    <w:p>
+      <w:pPr>
+        <w:rPr>
+          <w:iCs/>
+        </w:rPr>
+      </w:pPr>
+      <w:r>
+        <w:rPr>
+          <w:iCs/>
+        </w:rPr>
+        <w:t>https://github.com/clair3st/Data-Structures/tree/master</w:t>
+      </w:r>
+    </w:p>
+    <w:p>
+      <w:pPr>
+        <w:rPr>
+          <w:iCs/>
+        </w:rPr>
+      </w:pPr>
+      <w:r>
+        <w:rPr>
+          <w:rFonts w:ascii="Segoe UI Symbol" w:hAnsi="Segoe UI Symbol" w:cs="Segoe UI Symbol"/>
+          <w:iCs/>
+        </w:rPr>
+        <w:t>⠸</w:t>
+      </w:r>
+      <w:r>
+        <w:rPr>
+          <w:iCs/>
+        </w:rPr>
+        <w:t xml:space="preserve"> 445/445  </w:t>
+      </w:r>
+      <w:r>
+        <w:rPr>
+          <w:rFonts w:ascii="Segoe UI Emoji" w:hAnsi="Segoe UI Emoji" w:cs="Segoe UI Emoji"/>
+          <w:iCs/>
+        </w:rPr>
+        <w:t>🎉</w:t>
+      </w:r>
+      <w:r>
+        <w:rPr>
+          <w:iCs/>
+        </w:rPr>
+        <w:t xml:space="preserve"> 383 </w:t>
+      </w:r>
+      <w:r>
+        <w:rPr>
+          <w:rFonts w:ascii="Aptos" w:hAnsi="Aptos" w:cs="Aptos"/>
+          <w:iCs/>
+        </w:rPr>
+        <w:t>🫥</w:t>
+      </w:r>
+      <w:r>
+        <w:rPr>
+          <w:iCs/>
+        </w:rPr>
+        <w:t xml:space="preserve"> 4  </w:t>
+      </w:r>
+      <w:r>
+        <w:rPr>
+          <w:rFonts w:ascii="Segoe UI Emoji" w:hAnsi="Segoe UI Emoji" w:cs="Segoe UI Emoji"/>
+          <w:iCs/>
+        </w:rPr>
+        <w:t>⏰</w:t>
+      </w:r>
+      <w:r>
+        <w:rPr>
+          <w:iCs/>
+        </w:rPr>
+        <w:t xml:space="preserve"> 10  </w:t>
+      </w:r>
+      <w:r>
+        <w:rPr>
+          <w:rFonts w:ascii="Segoe UI Emoji" w:hAnsi="Segoe UI Emoji" w:cs="Segoe UI Emoji"/>
+          <w:iCs/>
+        </w:rPr>
+        <w:t>🤔</w:t>
+      </w:r>
+      <w:r>
+        <w:rPr>
+          <w:iCs/>
+        </w:rPr>
+        <w:t xml:space="preserve"> 0  </w:t>
+      </w:r>
+      <w:r>
+        <w:rPr>
+          <w:rFonts w:ascii="Segoe UI Emoji" w:hAnsi="Segoe UI Emoji" w:cs="Segoe UI Emoji"/>
+          <w:iCs/>
+        </w:rPr>
+        <w:t>🙁</w:t>
+      </w:r>
+      <w:r>
+        <w:rPr>
+          <w:iCs/>
+        </w:rPr>
+        <w:t xml:space="preserve"> 48  </w:t>
+      </w:r>
+      <w:r>
+        <w:rPr>
+          <w:rFonts w:ascii="Segoe UI Emoji" w:hAnsi="Segoe UI Emoji" w:cs="Segoe UI Emoji"/>
+          <w:iCs/>
+        </w:rPr>
+        <w:t>🔇</w:t>
+      </w:r>
+      <w:r>
+        <w:rPr>
+          <w:iCs/>
+        </w:rPr>
+        <w:t xml:space="preserve"> 0</w:t>
+      </w:r>
+    </w:p>
+    <w:p>
+      <w:pPr>
+        <w:rPr>
+          <w:iCs/>
+        </w:rPr>
+      </w:pPr>
+      <w:r>
+        <w:rPr>
+          <w:iCs/>
+        </w:rPr>
+        <w:t>11</w:t>
+      </w:r>
+      <w:r>
+        <w:rPr>
+          <w:iCs/>
+        </w:rPr>
+        <w:t>8/445</w:t>
+      </w:r>
+    </w:p>
+    <w:p>
+      <w:pPr>
+        <w:rPr>
+          <w:iCs/>
+        </w:rPr>
+      </w:pPr>
+      <w:r>
+        <w:rPr>
+          <w:iCs/>
+        </w:rPr>
+        <w:t>270/445 after adding more class based stuff</w:t>
+      </w:r>
+    </w:p>
+    <w:p>
+      <w:pPr>
+        <w:rPr>
+          <w:iCs/>
+        </w:rPr>
+      </w:pPr>
+    </w:p>
+    <w:p>
+      <w:pPr>
+        <w:rPr>
+          <w:iCs/>
+        </w:rPr>
+      </w:pPr>
+      <w:r>
+        <w:rPr>
+          <w:iCs/>
+        </w:rPr>
         <w:t>With the following addition to pyproject.toml</w:t>
       </w:r>
     </w:p>
@@ -1809,6 +1959,7 @@
         <w:rPr>
           <w:iCs/>
         </w:rPr>
+        <w:lastRenderedPageBreak/>
         <w:t>Wrote program equivalence</w:t>
       </w:r>
     </w:p>
@@ -1881,22 +2032,7 @@
         <w:rPr>
           <w:iCs/>
         </w:rPr>
-        <w:lastRenderedPageBreak/>
-        <w:t xml:space="preserve">What do I say about translating hobbit to python in the thesis? That I used </w:t>
-      </w:r>
-      <w:proofErr w:type="spellStart"/>
-      <w:r>
-        <w:rPr>
-          <w:iCs/>
-        </w:rPr>
-        <w:t>gpt</w:t>
-      </w:r>
-      <w:proofErr w:type="spellEnd"/>
-      <w:r>
-        <w:rPr>
-          <w:iCs/>
-        </w:rPr>
-        <w:t>?</w:t>
+        <w:t>What do I say about translating hobbit to python in the thesis? That I used gpt?</w:t>
       </w:r>
     </w:p>
     <w:p>
@@ -1922,16 +2058,8 @@
         <w:rPr>
           <w:iCs/>
         </w:rPr>
-        <w:t xml:space="preserve">How do I treat two programs where 1 has global state and the other </w:t>
-      </w:r>
-      <w:proofErr w:type="spellStart"/>
-      <w:r>
-        <w:rPr>
-          <w:iCs/>
-        </w:rPr>
-        <w:t>doesnt</w:t>
-      </w:r>
-      <w:proofErr w:type="spellEnd"/>
+        <w:t>How do I treat two programs where 1 has global state and the other doesnt</w:t>
+      </w:r>
     </w:p>
     <w:p>
       <w:pPr>
@@ -1963,21 +2091,7 @@
         <w:rPr>
           <w:iCs/>
         </w:rPr>
-        <w:t xml:space="preserve">We </w:t>
-      </w:r>
-      <w:proofErr w:type="spellStart"/>
-      <w:r>
-        <w:rPr>
-          <w:iCs/>
-        </w:rPr>
-        <w:t>cant</w:t>
-      </w:r>
-      <w:proofErr w:type="spellEnd"/>
-      <w:r>
-        <w:rPr>
-          <w:iCs/>
-        </w:rPr>
-        <w:t xml:space="preserve"> see internal recursion</w:t>
+        <w:t>We cant see internal recursion</w:t>
       </w:r>
     </w:p>
     <w:p>
@@ -1999,46 +2113,24 @@
           <w:iCs/>
         </w:rPr>
       </w:pPr>
-      <w:proofErr w:type="spellStart"/>
-      <w:r>
-        <w:rPr>
-          <w:iCs/>
-        </w:rPr>
-        <w:t>Reentrancy</w:t>
-      </w:r>
-      <w:proofErr w:type="spellEnd"/>
-      <w:r>
-        <w:rPr>
-          <w:iCs/>
-        </w:rPr>
-        <w:t xml:space="preserve">. </w:t>
-      </w:r>
-    </w:p>
-    <w:p>
-      <w:pPr>
-        <w:rPr>
-          <w:iCs/>
-        </w:rPr>
-      </w:pPr>
-      <w:r>
-        <w:rPr>
-          <w:iCs/>
-        </w:rPr>
-        <w:t xml:space="preserve">Function can make a choice between all </w:t>
-      </w:r>
-      <w:proofErr w:type="spellStart"/>
-      <w:r>
-        <w:rPr>
-          <w:iCs/>
-        </w:rPr>
-        <w:t>funcs</w:t>
-      </w:r>
-      <w:proofErr w:type="spellEnd"/>
-      <w:r>
-        <w:rPr>
-          <w:iCs/>
-        </w:rPr>
-        <w:t xml:space="preserve"> it knows</w:t>
+      <w:r>
+        <w:rPr>
+          <w:iCs/>
+        </w:rPr>
+        <w:t xml:space="preserve">Reentrancy. </w:t>
+      </w:r>
+    </w:p>
+    <w:p>
+      <w:pPr>
+        <w:rPr>
+          <w:iCs/>
+        </w:rPr>
+      </w:pPr>
+      <w:r>
+        <w:rPr>
+          <w:iCs/>
+        </w:rPr>
+        <w:t>Function can make a choice between all funcs it knows</w:t>
       </w:r>
     </w:p>
     <w:p>
@@ -2096,13 +2188,13 @@
         <w:rPr>
           <w:iCs/>
         </w:rPr>
-        <w:t>38-</w:t>
-      </w:r>
-      <w:r>
-        <w:rPr>
-          <w:iCs/>
-        </w:rPr>
-        <w:t>44/79 from hobbit suite</w:t>
+        <w:t>41-47</w:t>
+      </w:r>
+      <w:r>
+        <w:rPr>
+          <w:iCs/>
+        </w:rPr>
+        <w:t>/79 from hobbit suite</w:t>
       </w:r>
       <w:r>
         <w:rPr>
@@ -2151,72 +2243,89 @@
           <w:bCs/>
           <w:iCs/>
         </w:rPr>
-        <w:t xml:space="preserve">Check on </w:t>
-      </w:r>
-      <w:proofErr w:type="spellStart"/>
+        <w:t>Check on cross_reentrancy_param</w:t>
+      </w:r>
+    </w:p>
+    <w:p>
+      <w:pPr>
+        <w:rPr>
+          <w:iCs/>
+        </w:rPr>
+      </w:pPr>
+      <w:r>
+        <w:rPr>
+          <w:iCs/>
+        </w:rPr>
+        <w:t xml:space="preserve">Added functionality that if a higher order function returns a </w:t>
+      </w:r>
       <w:r>
         <w:rPr>
           <w:b/>
           <w:bCs/>
           <w:iCs/>
         </w:rPr>
-        <w:t>cross_reentrancy_param</w:t>
-      </w:r>
-      <w:proofErr w:type="spellEnd"/>
-    </w:p>
-    <w:p>
-      <w:pPr>
-        <w:rPr>
-          <w:iCs/>
-        </w:rPr>
-      </w:pPr>
-      <w:r>
-        <w:rPr>
-          <w:iCs/>
-        </w:rPr>
-        <w:t xml:space="preserve">Added functionality that if a higher order function returns a </w:t>
-      </w:r>
-      <w:r>
+        <w:t>tuple</w:t>
+      </w:r>
+      <w:r>
+        <w:rPr>
+          <w:iCs/>
+        </w:rPr>
+        <w:t xml:space="preserve"> of functions, we interleave the execution of those functions</w:t>
+      </w:r>
+      <w:r>
+        <w:rPr>
+          <w:iCs/>
+        </w:rPr>
+        <w:t xml:space="preserve">. </w:t>
+      </w:r>
+    </w:p>
+    <w:p>
+      <w:pPr>
+        <w:rPr>
+          <w:iCs/>
+        </w:rPr>
+      </w:pPr>
+      <w:r>
+        <w:rPr>
+          <w:iCs/>
+        </w:rPr>
+        <w:t>Added functionality that if a higher order function takes a callable parameter, and then calls that callable parameter passing in multiple functions as arguments to that callable parameter, then that callable parameter can interleave the execution of the functions it is given</w:t>
+      </w:r>
+    </w:p>
+    <w:p>
+      <w:pPr>
+        <w:rPr>
+          <w:iCs/>
+        </w:rPr>
+      </w:pPr>
+      <w:r>
+        <w:rPr>
+          <w:iCs/>
+        </w:rPr>
+        <w:t xml:space="preserve">Curried interaction plan: </w:t>
+      </w:r>
+    </w:p>
+    <w:p>
+      <w:pPr>
+        <w:rPr>
+          <w:iCs/>
+        </w:rPr>
+      </w:pPr>
+      <w:r>
+        <w:rPr>
+          <w:iCs/>
+        </w:rPr>
+        <w:lastRenderedPageBreak/>
+        <w:t xml:space="preserve">For combiner-style HOFs, </w:t>
+      </w:r>
+    </w:p>
+    <w:p>
+      <w:pPr>
         <w:rPr>
           <w:b/>
           <w:bCs/>
           <w:iCs/>
         </w:rPr>
-        <w:t>tuple</w:t>
-      </w:r>
-      <w:r>
-        <w:rPr>
-          <w:iCs/>
-        </w:rPr>
-        <w:t xml:space="preserve"> of functions, we interleave the execution of those functions</w:t>
-      </w:r>
-      <w:r>
-        <w:rPr>
-          <w:iCs/>
-        </w:rPr>
-        <w:t xml:space="preserve">. </w:t>
-      </w:r>
-    </w:p>
-    <w:p>
-      <w:pPr>
-        <w:rPr>
-          <w:iCs/>
-        </w:rPr>
-      </w:pPr>
-      <w:r>
-        <w:rPr>
-          <w:iCs/>
-        </w:rPr>
-        <w:t>Added functionality that if a higher order function takes a callable parameter, and then calls that callable parameter passing in multiple functions as arguments to that callable parameter, then that callable parameter can interleave the execution of the functions it is given</w:t>
-      </w:r>
-    </w:p>
-    <w:p>
-      <w:pPr>
-        <w:rPr>
-          <w:b/>
-          <w:bCs/>
-          <w:iCs/>
-        </w:rPr>
       </w:pPr>
     </w:p>
     <w:p>
@@ -2230,6 +2339,26 @@
           <w:iCs/>
         </w:rPr>
         <w:t>Need to consider if the function we are testing returns a tuple containing a function</w:t>
+      </w:r>
+    </w:p>
+    <w:p>
+      <w:pPr>
+        <w:rPr>
+          <w:iCs/>
+        </w:rPr>
+      </w:pPr>
+    </w:p>
+    <w:p>
+      <w:pPr>
+        <w:rPr>
+          <w:iCs/>
+        </w:rPr>
+      </w:pPr>
+      <w:r>
+        <w:rPr>
+          <w:iCs/>
+        </w:rPr>
+        <w:t>Seemingly obvious bugs might be overlooked. For bsearch_1, the failing input is 2. Even if I add an int type annotation, the fuzzer can fully fail to discover the bug because it never tried 2, it tried thousands of other numbers but not 2. Highlights a weakness of coverage-guidedness in a function where coverage wont change meaningfully</w:t>
       </w:r>
     </w:p>
     <w:p/>

</xml_diff>

<commit_message>
Experiment with stub function args
</commit_message>
<xml_diff>
--- a/Masters project notes.docx
+++ b/Masters project notes.docx
@@ -53,19 +53,11 @@
           <w:lang w:val="fr-FR"/>
         </w:rPr>
       </w:pPr>
-      <w:proofErr w:type="spellStart"/>
       <w:r>
         <w:rPr>
           <w:lang w:val="fr-FR"/>
         </w:rPr>
-        <w:t>Pythonfuzz</w:t>
-      </w:r>
-      <w:proofErr w:type="spellEnd"/>
-      <w:r>
-        <w:rPr>
-          <w:lang w:val="fr-FR"/>
-        </w:rPr>
-        <w:t xml:space="preserve"> </w:t>
+        <w:t xml:space="preserve">Pythonfuzz </w:t>
       </w:r>
       <w:hyperlink r:id="rId6" w:history="1">
         <w:r>
@@ -86,15 +78,7 @@
         </w:numPr>
       </w:pPr>
       <w:r>
-        <w:t xml:space="preserve">Coverage-guided </w:t>
-      </w:r>
-      <w:proofErr w:type="spellStart"/>
-      <w:r>
-        <w:t>fuzzer</w:t>
-      </w:r>
-      <w:proofErr w:type="spellEnd"/>
-      <w:r>
-        <w:t xml:space="preserve"> for python</w:t>
+        <w:t>Coverage-guided fuzzer for python</w:t>
       </w:r>
     </w:p>
     <w:p>
@@ -126,15 +110,7 @@
         </w:numPr>
       </w:pPr>
       <w:r>
-        <w:t xml:space="preserve">Google’s coverage-guided </w:t>
-      </w:r>
-      <w:proofErr w:type="spellStart"/>
-      <w:r>
-        <w:t>fuzzer</w:t>
-      </w:r>
-      <w:proofErr w:type="spellEnd"/>
-      <w:r>
-        <w:t xml:space="preserve"> for python</w:t>
+        <w:t>Google’s coverage-guided fuzzer for python</w:t>
       </w:r>
     </w:p>
     <w:p>
@@ -154,28 +130,15 @@
         </w:rPr>
         <w:t xml:space="preserve">HypoFuzz </w:t>
       </w:r>
-      <w:r>
-        <w:fldChar w:fldCharType="begin"/>
-      </w:r>
-      <w:r>
-        <w:rPr>
-          <w:lang w:val="de-DE"/>
-        </w:rPr>
-        <w:instrText>HYPERLINK "https://github.com/Zac-HD/hypofuzz"</w:instrText>
-      </w:r>
-      <w:r>
-        <w:fldChar w:fldCharType="separate"/>
-      </w:r>
-      <w:r>
-        <w:rPr>
-          <w:rStyle w:val="Hyperlink"/>
-          <w:lang w:val="de-DE"/>
-        </w:rPr>
-        <w:t>https://github.com/Zac-HD/hypofuzz</w:t>
-      </w:r>
-      <w:r>
-        <w:fldChar w:fldCharType="end"/>
-      </w:r>
+      <w:hyperlink r:id="rId8" w:history="1">
+        <w:r>
+          <w:rPr>
+            <w:rStyle w:val="Hyperlink"/>
+            <w:lang w:val="de-DE"/>
+          </w:rPr>
+          <w:t>https://github.com/Zac-HD/hypofuzz</w:t>
+        </w:r>
+      </w:hyperlink>
     </w:p>
     <w:p>
       <w:pPr>
@@ -200,15 +163,10 @@
           <w:numId w:val="1"/>
         </w:numPr>
       </w:pPr>
-      <w:proofErr w:type="spellStart"/>
-      <w:r>
-        <w:t>CrossHair</w:t>
-      </w:r>
-      <w:proofErr w:type="spellEnd"/>
-      <w:r>
-        <w:t xml:space="preserve"> </w:t>
-      </w:r>
-      <w:hyperlink r:id="rId8" w:history="1">
+      <w:r>
+        <w:t xml:space="preserve">CrossHair </w:t>
+      </w:r>
+      <w:hyperlink r:id="rId9" w:history="1">
         <w:r>
           <w:rPr>
             <w:rStyle w:val="Hyperlink"/>
@@ -231,39 +189,7 @@
     </w:p>
     <w:p>
       <w:r>
-        <w:t xml:space="preserve">From my research, Hypothesis + </w:t>
-      </w:r>
-      <w:proofErr w:type="spellStart"/>
-      <w:r>
-        <w:t>HypoFuzz</w:t>
-      </w:r>
-      <w:proofErr w:type="spellEnd"/>
-      <w:r>
-        <w:t xml:space="preserve"> seems like it achieves everything that JQF does. Hypothesis is heavily inspired by </w:t>
-      </w:r>
-      <w:proofErr w:type="spellStart"/>
-      <w:r>
-        <w:t>QuickCheck</w:t>
-      </w:r>
-      <w:proofErr w:type="spellEnd"/>
-      <w:r>
-        <w:t xml:space="preserve"> and gives a property-based testing framework for python. It generates structured inputs and saves failing inputs for reproduction. It operates on the semantic properties of a program, making it inherently </w:t>
-      </w:r>
-      <w:proofErr w:type="gramStart"/>
-      <w:r>
-        <w:t>semantic-based</w:t>
-      </w:r>
-      <w:proofErr w:type="gramEnd"/>
-      <w:r>
-        <w:t xml:space="preserve">. It is not coverage-guided by default, so </w:t>
-      </w:r>
-      <w:proofErr w:type="spellStart"/>
-      <w:r>
-        <w:t>HypoFuzz</w:t>
-      </w:r>
-      <w:proofErr w:type="spellEnd"/>
-      <w:r>
-        <w:t xml:space="preserve"> extends it for coverage-guided exploration thus providing a fuzzing framework.</w:t>
+        <w:t>From my research, Hypothesis + HypoFuzz seems like it achieves everything that JQF does. Hypothesis is heavily inspired by QuickCheck and gives a property-based testing framework for python. It generates structured inputs and saves failing inputs for reproduction. It operates on the semantic properties of a program, making it inherently semantic-based. It is not coverage-guided by default, so HypoFuzz extends it for coverage-guided exploration thus providing a fuzzing framework.</w:t>
       </w:r>
     </w:p>
     <w:p/>
@@ -282,28 +208,15 @@
     </w:p>
     <w:p>
       <w:r>
-        <w:t>Generalise the stack example to any data structure/</w:t>
-      </w:r>
-      <w:proofErr w:type="spellStart"/>
-      <w:r>
-        <w:t>api</w:t>
-      </w:r>
-      <w:proofErr w:type="spellEnd"/>
+        <w:t>Generalise the stack example to any data structure/api</w:t>
+      </w:r>
       <w:r>
         <w:t xml:space="preserve"> that can take any type of arguments.</w:t>
       </w:r>
     </w:p>
     <w:p>
       <w:r>
-        <w:t xml:space="preserve">At some point, see if you can read the python script, create AST and traverse it </w:t>
-      </w:r>
-      <w:proofErr w:type="gramStart"/>
-      <w:r>
-        <w:t>in order to</w:t>
-      </w:r>
-      <w:proofErr w:type="gramEnd"/>
-      <w:r>
-        <w:t xml:space="preserve"> create the right test.</w:t>
+        <w:t>At some point, see if you can read the python script, create AST and traverse it in order to create the right test.</w:t>
       </w:r>
     </w:p>
     <w:p/>
@@ -317,58 +230,18 @@
         <w:t xml:space="preserve">Using it to test a very simple summing function </w:t>
       </w:r>
       <w:r>
-        <w:t xml:space="preserve">doesn’t work very well. I believe because of how universal is configured and how my two simple functions are configured, </w:t>
-      </w:r>
-      <w:proofErr w:type="spellStart"/>
-      <w:r>
-        <w:t>atheris</w:t>
-      </w:r>
-      <w:proofErr w:type="spellEnd"/>
-      <w:r>
-        <w:t xml:space="preserve"> is unable to quickly find the erroneous input.</w:t>
-      </w:r>
-    </w:p>
-    <w:p>
-      <w:r>
-        <w:t xml:space="preserve">I think the fact that fuzz testing is obfuscated inside the universal object the module is unable to correctly perform its algorithms to find erroneous inputs. I vibe coded a </w:t>
-      </w:r>
-      <w:proofErr w:type="spellStart"/>
-      <w:r>
-        <w:t>hypofuzz</w:t>
-      </w:r>
-      <w:proofErr w:type="spellEnd"/>
-      <w:r>
-        <w:t xml:space="preserve"> universal object </w:t>
-      </w:r>
-      <w:proofErr w:type="gramStart"/>
-      <w:r>
-        <w:t>and also</w:t>
-      </w:r>
-      <w:proofErr w:type="gramEnd"/>
-      <w:r>
-        <w:t xml:space="preserve"> tried manually implementing one and couldn’t get it to spot any bugs but given more time there may be a way to implement this. Just haven’t figured it out yet.</w:t>
+        <w:t>doesn’t work very well. I believe because of how universal is configured and how my two simple functions are configured, atheris is unable to quickly find the erroneous input.</w:t>
+      </w:r>
+    </w:p>
+    <w:p>
+      <w:r>
+        <w:t>I think the fact that fuzz testing is obfuscated inside the universal object the module is unable to correctly perform its algorithms to find erroneous inputs. I vibe coded a hypofuzz universal object and also tried manually implementing one and couldn’t get it to spot any bugs but given more time there may be a way to implement this. Just haven’t figured it out yet.</w:t>
       </w:r>
     </w:p>
     <w:p>
       <w:r>
         <w:lastRenderedPageBreak/>
-        <w:t xml:space="preserve">When comparing two different sorting algorithms, </w:t>
-      </w:r>
-      <w:proofErr w:type="spellStart"/>
-      <w:r>
-        <w:t>hypofuzz</w:t>
-      </w:r>
-      <w:proofErr w:type="spellEnd"/>
-      <w:r>
-        <w:t xml:space="preserve"> was unable to spot the difference when I added a small condition to quicksort if length is &gt;= 6, return the reversed list. For these </w:t>
-      </w:r>
-      <w:proofErr w:type="gramStart"/>
-      <w:r>
-        <w:t>one off</w:t>
-      </w:r>
-      <w:proofErr w:type="gramEnd"/>
-      <w:r>
-        <w:t xml:space="preserve"> conditions, coverage guidance actually makes it harder to spot the difference, as they provide very little feedback. Plain hypothesis was able to catch this bug (without coverage guidance)</w:t>
+        <w:t>When comparing two different sorting algorithms, hypofuzz was unable to spot the difference when I added a small condition to quicksort if length is &gt;= 6, return the reversed list. For these one off conditions, coverage guidance actually makes it harder to spot the difference, as they provide very little feedback. Plain hypothesis was able to catch this bug (without coverage guidance)</w:t>
       </w:r>
     </w:p>
     <w:p>
@@ -387,57 +260,12 @@
     </w:p>
     <w:p>
       <w:r>
-        <w:t xml:space="preserve">Testing universal object on two sorting algorithms always results in empty lists as universals value gets set to empty list if </w:t>
-      </w:r>
-      <w:proofErr w:type="spellStart"/>
-      <w:proofErr w:type="gramStart"/>
-      <w:r>
-        <w:t>len</w:t>
-      </w:r>
-      <w:proofErr w:type="spellEnd"/>
-      <w:r>
-        <w:t>(</w:t>
-      </w:r>
-      <w:proofErr w:type="gramEnd"/>
-      <w:r>
-        <w:t xml:space="preserve">) is called on it. This is </w:t>
-      </w:r>
-      <w:proofErr w:type="spellStart"/>
-      <w:r>
-        <w:t>bcos</w:t>
-      </w:r>
-      <w:proofErr w:type="spellEnd"/>
-      <w:r>
-        <w:t xml:space="preserve"> if we initialise it as a list of universals, this may be wrong as it may be intended to be a string. </w:t>
-      </w:r>
-    </w:p>
-    <w:p>
-      <w:r>
-        <w:t xml:space="preserve">Universal needs </w:t>
-      </w:r>
-      <w:proofErr w:type="spellStart"/>
-      <w:r>
-        <w:t>lt</w:t>
-      </w:r>
-      <w:proofErr w:type="spellEnd"/>
-      <w:r>
-        <w:t xml:space="preserve">, </w:t>
-      </w:r>
-      <w:proofErr w:type="spellStart"/>
-      <w:r>
-        <w:t>gt</w:t>
-      </w:r>
-      <w:proofErr w:type="spellEnd"/>
-      <w:r>
-        <w:t xml:space="preserve">, le, </w:t>
-      </w:r>
-      <w:proofErr w:type="spellStart"/>
-      <w:r>
-        <w:t>ge</w:t>
-      </w:r>
-      <w:proofErr w:type="spellEnd"/>
-      <w:r>
-        <w:t xml:space="preserve"> operators define</w:t>
+        <w:t xml:space="preserve">Testing universal object on two sorting algorithms always results in empty lists as universals value gets set to empty list if len() is called on it. This is bcos if we initialise it as a list of universals, this may be wrong as it may be intended to be a string. </w:t>
+      </w:r>
+    </w:p>
+    <w:p>
+      <w:r>
+        <w:t>Universal needs lt, gt, le, ge operators define</w:t>
       </w:r>
       <w:r>
         <w:t>d</w:t>
@@ -451,99 +279,20 @@
         <w:t>Universal does not support item assignment</w:t>
       </w:r>
       <w:r>
-        <w:t xml:space="preserve"> </w:t>
-      </w:r>
-      <w:proofErr w:type="spellStart"/>
-      <w:r>
-        <w:t>e.g</w:t>
-      </w:r>
-      <w:proofErr w:type="spellEnd"/>
-      <w:r>
-        <w:t xml:space="preserve"> the line</w:t>
-      </w:r>
-    </w:p>
-    <w:p>
-      <w:proofErr w:type="spellStart"/>
-      <w:proofErr w:type="gramStart"/>
-      <w:r>
-        <w:t>arr</w:t>
-      </w:r>
-      <w:proofErr w:type="spellEnd"/>
-      <w:r>
-        <w:t>[</w:t>
-      </w:r>
-      <w:proofErr w:type="spellStart"/>
-      <w:proofErr w:type="gramEnd"/>
-      <w:r>
-        <w:t>i</w:t>
-      </w:r>
-      <w:proofErr w:type="spellEnd"/>
-      <w:r>
-        <w:t xml:space="preserve"> + 1], </w:t>
-      </w:r>
-      <w:proofErr w:type="spellStart"/>
-      <w:r>
-        <w:t>arr</w:t>
-      </w:r>
-      <w:proofErr w:type="spellEnd"/>
-      <w:r>
-        <w:t xml:space="preserve">[high] = </w:t>
-      </w:r>
-      <w:proofErr w:type="spellStart"/>
-      <w:r>
-        <w:t>arr</w:t>
-      </w:r>
-      <w:proofErr w:type="spellEnd"/>
-      <w:r>
-        <w:t xml:space="preserve">[high], </w:t>
-      </w:r>
-      <w:proofErr w:type="spellStart"/>
-      <w:r>
-        <w:t>arr</w:t>
-      </w:r>
-      <w:proofErr w:type="spellEnd"/>
-      <w:r>
-        <w:t>[</w:t>
-      </w:r>
-      <w:proofErr w:type="spellStart"/>
-      <w:r>
-        <w:t>i</w:t>
-      </w:r>
-      <w:proofErr w:type="spellEnd"/>
-      <w:r>
-        <w:t xml:space="preserve"> + 1]</w:t>
-      </w:r>
-    </w:p>
-    <w:p>
-      <w:r>
-        <w:t xml:space="preserve">does not work if </w:t>
-      </w:r>
-      <w:proofErr w:type="spellStart"/>
-      <w:r>
-        <w:t>arr</w:t>
-      </w:r>
-      <w:proofErr w:type="spellEnd"/>
-      <w:r>
-        <w:t xml:space="preserve"> is a universal and each element of </w:t>
-      </w:r>
-      <w:proofErr w:type="spellStart"/>
-      <w:r>
-        <w:t>arr</w:t>
-      </w:r>
-      <w:proofErr w:type="spellEnd"/>
-      <w:r>
-        <w:t xml:space="preserve"> is a universal</w:t>
-      </w:r>
-      <w:r>
-        <w:t xml:space="preserve"> I “</w:t>
-      </w:r>
-      <w:proofErr w:type="spellStart"/>
-      <w:r>
-        <w:t>vibecoded</w:t>
-      </w:r>
-      <w:proofErr w:type="spellEnd"/>
-      <w:r>
-        <w:t>” an implementation of this.</w:t>
+        <w:t xml:space="preserve"> e.g the line</w:t>
+      </w:r>
+    </w:p>
+    <w:p>
+      <w:r>
+        <w:t>arr[i + 1], arr[high] = arr[high], arr[i + 1]</w:t>
+      </w:r>
+    </w:p>
+    <w:p>
+      <w:r>
+        <w:t>does not work if arr is a universal and each element of arr is a universal</w:t>
+      </w:r>
+      <w:r>
+        <w:t xml:space="preserve"> I “vibecoded” an implementation of this.</w:t>
       </w:r>
     </w:p>
     <w:p>
@@ -559,36 +308,12 @@
     </w:p>
     <w:p>
       <w:r>
-        <w:t xml:space="preserve">Read </w:t>
-      </w:r>
-      <w:proofErr w:type="spellStart"/>
-      <w:r>
-        <w:t>TypeEvalPy</w:t>
-      </w:r>
-      <w:proofErr w:type="spellEnd"/>
-      <w:r>
-        <w:t xml:space="preserve"> to find good frameworks for function parameters.</w:t>
-      </w:r>
-    </w:p>
-    <w:p>
-      <w:r>
-        <w:t xml:space="preserve">Tried </w:t>
-      </w:r>
-      <w:proofErr w:type="spellStart"/>
-      <w:r>
-        <w:t>HeaderGen</w:t>
-      </w:r>
-      <w:proofErr w:type="spellEnd"/>
-      <w:r>
-        <w:t xml:space="preserve"> as it was apparently the best for all categories including function parameters. When I tried it, it would only infer function return types and not parameters. The </w:t>
-      </w:r>
-      <w:proofErr w:type="spellStart"/>
-      <w:r>
-        <w:t>github</w:t>
-      </w:r>
-      <w:proofErr w:type="spellEnd"/>
-      <w:r>
-        <w:t xml:space="preserve"> only mentions that it can resolve function return types and I could not figure out any way to get it to infer parameter types. </w:t>
+        <w:t>Read TypeEvalPy to find good frameworks for function parameters.</w:t>
+      </w:r>
+    </w:p>
+    <w:p>
+      <w:r>
+        <w:t xml:space="preserve">Tried HeaderGen as it was apparently the best for all categories including function parameters. When I tried it, it would only infer function return types and not parameters. The github only mentions that it can resolve function return types and I could not figure out any way to get it to infer parameter types. </w:t>
       </w:r>
     </w:p>
     <w:p>
@@ -642,103 +367,23 @@
         </w:numPr>
       </w:pPr>
       <w:r>
-        <w:t>Hypothesis/</w:t>
-      </w:r>
-      <w:proofErr w:type="spellStart"/>
-      <w:r>
-        <w:t>Hypofuzz</w:t>
-      </w:r>
-      <w:proofErr w:type="spellEnd"/>
-      <w:r>
-        <w:t xml:space="preserve"> “Strategies” are how you define what is passed </w:t>
-      </w:r>
-      <w:proofErr w:type="gramStart"/>
-      <w:r>
-        <w:t>in to</w:t>
-      </w:r>
-      <w:proofErr w:type="gramEnd"/>
-      <w:r>
-        <w:t xml:space="preserve"> the function you want to fuzz. </w:t>
-      </w:r>
-      <w:proofErr w:type="spellStart"/>
-      <w:r>
-        <w:t>E.g</w:t>
-      </w:r>
-      <w:proofErr w:type="spellEnd"/>
-      <w:r>
-        <w:t xml:space="preserve">  </w:t>
+        <w:t xml:space="preserve">Hypothesis/Hypofuzz “Strategies” are how you define what is passed in to the function you want to fuzz. E.g  </w:t>
       </w:r>
     </w:p>
     <w:p>
       <w:r>
         <w:lastRenderedPageBreak/>
-        <w:t>@given(</w:t>
-      </w:r>
-      <w:proofErr w:type="gramStart"/>
-      <w:r>
-        <w:t>st.lists</w:t>
-      </w:r>
-      <w:proofErr w:type="gramEnd"/>
-      <w:r>
-        <w:t xml:space="preserve">(st.integers() | </w:t>
-      </w:r>
-      <w:proofErr w:type="spellStart"/>
-      <w:r>
-        <w:t>st.floats</w:t>
-      </w:r>
-      <w:proofErr w:type="spellEnd"/>
-      <w:r>
-        <w:t>()))</w:t>
-      </w:r>
-    </w:p>
-    <w:p>
-      <w:r>
-        <w:t xml:space="preserve">def </w:t>
-      </w:r>
-      <w:proofErr w:type="spellStart"/>
-      <w:r>
-        <w:t>test_sort_correct</w:t>
-      </w:r>
-      <w:proofErr w:type="spellEnd"/>
-      <w:r>
-        <w:t>(</w:t>
-      </w:r>
-      <w:proofErr w:type="spellStart"/>
-      <w:r>
-        <w:t>lst</w:t>
-      </w:r>
-      <w:proofErr w:type="spellEnd"/>
-      <w:r>
-        <w:t>):</w:t>
-      </w:r>
-    </w:p>
-    <w:p>
-      <w:r>
-        <w:t xml:space="preserve">    assert(</w:t>
-      </w:r>
-      <w:proofErr w:type="spellStart"/>
-      <w:r>
-        <w:t>my_sort</w:t>
-      </w:r>
-      <w:proofErr w:type="spellEnd"/>
-      <w:r>
-        <w:t>(</w:t>
-      </w:r>
-      <w:proofErr w:type="spellStart"/>
-      <w:r>
-        <w:t>lst</w:t>
-      </w:r>
-      <w:proofErr w:type="spellEnd"/>
-      <w:r>
-        <w:t>) == sorted(</w:t>
-      </w:r>
-      <w:proofErr w:type="spellStart"/>
-      <w:r>
-        <w:t>lst</w:t>
-      </w:r>
-      <w:proofErr w:type="spellEnd"/>
-      <w:r>
-        <w:t>))</w:t>
+        <w:t>@given(st.lists(st.integers() | st.floats()))</w:t>
+      </w:r>
+    </w:p>
+    <w:p>
+      <w:r>
+        <w:t>def test_sort_correct(lst):</w:t>
+      </w:r>
+    </w:p>
+    <w:p>
+      <w:r>
+        <w:t xml:space="preserve">    assert(my_sort(lst) == sorted(lst))</w:t>
       </w:r>
     </w:p>
     <w:p>
@@ -750,23 +395,7 @@
         </w:numPr>
       </w:pPr>
       <w:r>
-        <w:t xml:space="preserve">In that code snippet, the strategy is to fuzz </w:t>
-      </w:r>
-      <w:proofErr w:type="spellStart"/>
-      <w:r>
-        <w:t>my_sort</w:t>
-      </w:r>
-      <w:proofErr w:type="spellEnd"/>
-      <w:r>
-        <w:t xml:space="preserve"> with inputs of type list[</w:t>
-      </w:r>
-      <w:proofErr w:type="spellStart"/>
-      <w:r>
-        <w:t>int|str</w:t>
-      </w:r>
-      <w:proofErr w:type="spellEnd"/>
-      <w:r>
-        <w:t>]</w:t>
+        <w:t>In that code snippet, the strategy is to fuzz my_sort with inputs of type list[int|str]</w:t>
       </w:r>
     </w:p>
     <w:p>
@@ -778,15 +407,7 @@
         </w:numPr>
       </w:pPr>
       <w:r>
-        <w:t xml:space="preserve">In the case of my universal strategy, I simply fuzz with a strategy that can be </w:t>
-      </w:r>
-      <w:proofErr w:type="spellStart"/>
-      <w:r>
-        <w:t>though</w:t>
-      </w:r>
-      <w:proofErr w:type="spellEnd"/>
-      <w:r>
-        <w:t xml:space="preserve"> of as the following:</w:t>
+        <w:t>In the case of my universal strategy, I simply fuzz with a strategy that can be though of as the following:</w:t>
       </w:r>
     </w:p>
     <w:p>
@@ -797,55 +418,8 @@
           <w:numId w:val="3"/>
         </w:numPr>
       </w:pPr>
-      <w:proofErr w:type="spellStart"/>
-      <w:r>
-        <w:t>strat</w:t>
-      </w:r>
-      <w:proofErr w:type="spellEnd"/>
-      <w:r>
-        <w:t xml:space="preserve"> = </w:t>
-      </w:r>
-      <w:proofErr w:type="spellStart"/>
-      <w:r>
-        <w:t>int|str|float|bool|None|list</w:t>
-      </w:r>
-      <w:proofErr w:type="spellEnd"/>
-      <w:r>
-        <w:t>[</w:t>
-      </w:r>
-      <w:proofErr w:type="spellStart"/>
-      <w:r>
-        <w:t>strat</w:t>
-      </w:r>
-      <w:proofErr w:type="spellEnd"/>
-      <w:r>
-        <w:t>]|</w:t>
-      </w:r>
-      <w:proofErr w:type="spellStart"/>
-      <w:r>
-        <w:t>dict</w:t>
-      </w:r>
-      <w:proofErr w:type="spellEnd"/>
-      <w:r>
-        <w:t>[</w:t>
-      </w:r>
-      <w:proofErr w:type="spellStart"/>
-      <w:proofErr w:type="gramStart"/>
-      <w:r>
-        <w:t>str,strat</w:t>
-      </w:r>
-      <w:proofErr w:type="spellEnd"/>
-      <w:proofErr w:type="gramEnd"/>
-      <w:r>
-        <w:t>]|tuple[</w:t>
-      </w:r>
-      <w:proofErr w:type="spellStart"/>
-      <w:r>
-        <w:t>strat</w:t>
-      </w:r>
-      <w:proofErr w:type="spellEnd"/>
-      <w:r>
-        <w:t>]</w:t>
+      <w:r>
+        <w:t>strat = int|str|float|bool|None|list[strat]|dict[str,strat]|tuple[strat]</w:t>
       </w:r>
     </w:p>
     <w:p>
@@ -857,15 +431,7 @@
         </w:numPr>
       </w:pPr>
       <w:r>
-        <w:t xml:space="preserve">I have logic implemented so that if we encounter a </w:t>
-      </w:r>
-      <w:proofErr w:type="spellStart"/>
-      <w:r>
-        <w:t>TypeError</w:t>
-      </w:r>
-      <w:proofErr w:type="spellEnd"/>
-      <w:r>
-        <w:t>, we discard the type that caused the error from the pool of possible types in our strategy for future iterations.</w:t>
+        <w:t>I have logic implemented so that if we encounter a TypeError, we discard the type that caused the error from the pool of possible types in our strategy for future iterations.</w:t>
       </w:r>
     </w:p>
     <w:p>
@@ -877,15 +443,7 @@
         </w:numPr>
       </w:pPr>
       <w:r>
-        <w:t xml:space="preserve">It seems to work </w:t>
-      </w:r>
-      <w:proofErr w:type="gramStart"/>
-      <w:r>
-        <w:t>fairly well</w:t>
-      </w:r>
-      <w:proofErr w:type="gramEnd"/>
-      <w:r>
-        <w:t xml:space="preserve"> for the simple tests I have performed so far</w:t>
+        <w:t>It seems to work fairly well for the simple tests I have performed so far</w:t>
       </w:r>
     </w:p>
     <w:p>
@@ -897,15 +455,7 @@
         </w:numPr>
       </w:pPr>
       <w:r>
-        <w:t xml:space="preserve">Because it essentially brute forces fuzzing with different types until it works, I can imagine this being quite slow for fuzzing complex functions with lots of </w:t>
-      </w:r>
-      <w:proofErr w:type="gramStart"/>
-      <w:r>
-        <w:t>arguments</w:t>
-      </w:r>
-      <w:proofErr w:type="gramEnd"/>
-      <w:r>
-        <w:t xml:space="preserve"> but this will have to be tested more</w:t>
+        <w:t>Because it essentially brute forces fuzzing with different types until it works, I can imagine this being quite slow for fuzzing complex functions with lots of arguments but this will have to be tested more</w:t>
       </w:r>
     </w:p>
     <w:p>
@@ -928,49 +478,17 @@
     </w:p>
     <w:p>
       <w:r>
-        <w:t xml:space="preserve">If we assume there isn’t any explicit casting in the function we are fuzzing, how would a universal handle a situation where the type is ambiguous </w:t>
-      </w:r>
-      <w:proofErr w:type="spellStart"/>
-      <w:r>
-        <w:t>e.g</w:t>
-      </w:r>
-      <w:proofErr w:type="spellEnd"/>
-      <w:r>
-        <w:t xml:space="preserve"> calling </w:t>
-      </w:r>
-      <w:proofErr w:type="spellStart"/>
-      <w:r>
-        <w:t>len</w:t>
-      </w:r>
-      <w:proofErr w:type="spellEnd"/>
-      <w:r>
-        <w:t>(universal). Len is valid for both string and list so how do we lock universal here?</w:t>
-      </w:r>
-    </w:p>
-    <w:p>
-      <w:r>
-        <w:t xml:space="preserve">Similarly, how would we define operators like plus (+) for example? If we have two universals u1 and u2, the statement u1 + u2 could imply that u1 and u2 are strings, </w:t>
-      </w:r>
-      <w:proofErr w:type="spellStart"/>
-      <w:r>
-        <w:t>ints</w:t>
-      </w:r>
-      <w:proofErr w:type="spellEnd"/>
-      <w:r>
-        <w:t>, floats, lists, tuples so how can we implement this operator.</w:t>
-      </w:r>
-    </w:p>
-    <w:p>
-      <w:r>
-        <w:t xml:space="preserve">Theoretically speaking, at best we are determining the type of a (universal) object based on how that object is treated in the code and what functions and operations are applied to it. At best a perfect solution seems to me like it would essentially be a glorified </w:t>
-      </w:r>
-      <w:proofErr w:type="gramStart"/>
-      <w:r>
-        <w:t>type</w:t>
-      </w:r>
-      <w:proofErr w:type="gramEnd"/>
-      <w:r>
-        <w:t xml:space="preserve"> inference algorithm.</w:t>
+        <w:t>If we assume there isn’t any explicit casting in the function we are fuzzing, how would a universal handle a situation where the type is ambiguous e.g calling len(universal). Len is valid for both string and list so how do we lock universal here?</w:t>
+      </w:r>
+    </w:p>
+    <w:p>
+      <w:r>
+        <w:t>Similarly, how would we define operators like plus (+) for example? If we have two universals u1 and u2, the statement u1 + u2 could imply that u1 and u2 are strings, ints, floats, lists, tuples so how can we implement this operator.</w:t>
+      </w:r>
+    </w:p>
+    <w:p>
+      <w:r>
+        <w:t>Theoretically speaking, at best we are determining the type of a (universal) object based on how that object is treated in the code and what functions and operations are applied to it. At best a perfect solution seems to me like it would essentially be a glorified type inference algorithm.</w:t>
       </w:r>
     </w:p>
     <w:p/>
@@ -987,15 +505,7 @@
     <w:p>
       <w:r>
         <w:lastRenderedPageBreak/>
-        <w:t xml:space="preserve">See if </w:t>
-      </w:r>
-      <w:proofErr w:type="spellStart"/>
-      <w:r>
-        <w:t>func</w:t>
-      </w:r>
-      <w:proofErr w:type="spellEnd"/>
-      <w:r>
-        <w:t xml:space="preserve"> argument is callable, raise exception and print that the code is using callbacks which are not currently supported</w:t>
+        <w:t>See if func argument is callable, raise exception and print that the code is using callbacks which are not currently supported</w:t>
       </w:r>
     </w:p>
     <w:p/>
@@ -1017,31 +527,13 @@
         <w:t xml:space="preserve">classes </w:t>
       </w:r>
       <w:r>
-        <w:t xml:space="preserve">for 2 stack </w:t>
-      </w:r>
-      <w:proofErr w:type="gramStart"/>
-      <w:r>
-        <w:t>implementation</w:t>
-      </w:r>
-      <w:proofErr w:type="gramEnd"/>
-    </w:p>
-    <w:p>
-      <w:r>
-        <w:t xml:space="preserve">The </w:t>
-      </w:r>
-      <w:proofErr w:type="spellStart"/>
-      <w:r>
-        <w:t>fuzzer</w:t>
-      </w:r>
-      <w:proofErr w:type="spellEnd"/>
-      <w:r>
-        <w:t xml:space="preserve"> </w:t>
-      </w:r>
-      <w:proofErr w:type="gramStart"/>
-      <w:r>
-        <w:t>should :</w:t>
-      </w:r>
-      <w:proofErr w:type="gramEnd"/>
+        <w:t>for 2 stack implementation</w:t>
+      </w:r>
+    </w:p>
+    <w:p>
+      <w:r>
+        <w:t>The fuzzer should :</w:t>
+      </w:r>
     </w:p>
     <w:p>
       <w:r>
@@ -1061,36 +553,12 @@
     <w:p/>
     <w:p>
       <w:r>
-        <w:t xml:space="preserve">Added </w:t>
-      </w:r>
-      <w:proofErr w:type="spellStart"/>
-      <w:r>
-        <w:t>arg</w:t>
-      </w:r>
-      <w:proofErr w:type="spellEnd"/>
-      <w:r>
-        <w:t>/</w:t>
-      </w:r>
-      <w:proofErr w:type="spellStart"/>
-      <w:r>
-        <w:t>kwarg</w:t>
-      </w:r>
-      <w:proofErr w:type="spellEnd"/>
-      <w:r>
-        <w:t xml:space="preserve"> support for fuzz testing strategy</w:t>
-      </w:r>
-    </w:p>
-    <w:p>
-      <w:r>
-        <w:t xml:space="preserve">Wrote basic </w:t>
-      </w:r>
-      <w:proofErr w:type="gramStart"/>
-      <w:r>
-        <w:t>first class</w:t>
-      </w:r>
-      <w:proofErr w:type="gramEnd"/>
-      <w:r>
-        <w:t xml:space="preserve"> equivalence tester</w:t>
+        <w:t>Added arg/kwarg support for fuzz testing strategy</w:t>
+      </w:r>
+    </w:p>
+    <w:p>
+      <w:r>
+        <w:t>Wrote basic first class equivalence tester</w:t>
       </w:r>
     </w:p>
     <w:p>
@@ -1110,36 +578,12 @@
     </w:p>
     <w:p>
       <w:r>
-        <w:t xml:space="preserve">I have tried applying this equivalence tester to small refactors in real classes from open sources repos such as </w:t>
-      </w:r>
-      <w:proofErr w:type="spellStart"/>
-      <w:r>
-        <w:t>openai</w:t>
-      </w:r>
-      <w:proofErr w:type="spellEnd"/>
-      <w:r>
-        <w:t xml:space="preserve"> but have struggled to find working examples. My equivalence tester is quite situational. Method name/signature </w:t>
-      </w:r>
-      <w:proofErr w:type="gramStart"/>
-      <w:r>
-        <w:t>refactors</w:t>
-      </w:r>
-      <w:proofErr w:type="gramEnd"/>
-      <w:r>
-        <w:t xml:space="preserve"> and external dependencies cause issues</w:t>
-      </w:r>
-    </w:p>
-    <w:p>
-      <w:r>
-        <w:t xml:space="preserve">Tested it on two stack implementations, one that throws index error if you try to peek or pop and empty stack, and one that returns None for these operations. The </w:t>
-      </w:r>
-      <w:proofErr w:type="spellStart"/>
-      <w:r>
-        <w:t>fuzzer</w:t>
-      </w:r>
-      <w:proofErr w:type="spellEnd"/>
-      <w:r>
-        <w:t xml:space="preserve"> was able to pick up on this difference immediately</w:t>
+        <w:t>I have tried applying this equivalence tester to small refactors in real classes from open sources repos such as openai but have struggled to find working examples. My equivalence tester is quite situational. Method name/signature refactors and external dependencies cause issues</w:t>
+      </w:r>
+    </w:p>
+    <w:p>
+      <w:r>
+        <w:t>Tested it on two stack implementations, one that throws index error if you try to peek or pop and empty stack, and one that returns None for these operations. The fuzzer was able to pick up on this difference immediately</w:t>
       </w:r>
     </w:p>
     <w:p/>
@@ -1175,7 +619,7 @@
                     <pic:cNvPicPr/>
                   </pic:nvPicPr>
                   <pic:blipFill>
-                    <a:blip r:embed="rId9"/>
+                    <a:blip r:embed="rId10"/>
                     <a:stretch>
                       <a:fillRect/>
                     </a:stretch>
@@ -1229,29 +673,13 @@
     </w:p>
     <w:p>
       <w:r>
-        <w:t xml:space="preserve">What I mean by this is that currently, my code will test two classes for equivalence and if the classes have differing methods or even method names, the code will reject them. Allow the user to define a </w:t>
-      </w:r>
-      <w:proofErr w:type="spellStart"/>
-      <w:r>
-        <w:t>json</w:t>
-      </w:r>
-      <w:proofErr w:type="spellEnd"/>
-      <w:r>
-        <w:t xml:space="preserve"> file with the specific methods from the class that they want tested so they can exclude certain methods if they </w:t>
-      </w:r>
-      <w:proofErr w:type="gramStart"/>
-      <w:r>
-        <w:t>like, and</w:t>
-      </w:r>
-      <w:proofErr w:type="gramEnd"/>
-      <w:r>
-        <w:t xml:space="preserve"> optionally allow the user to also define specifically what arguments each method should be tested with.</w:t>
+        <w:t>What I mean by this is that currently, my code will test two classes for equivalence and if the classes have differing methods or even method names, the code will reject them. Allow the user to define a json file with the specific methods from the class that they want tested so they can exclude certain methods if they like, and optionally allow the user to also define specifically what arguments each method should be tested with.</w:t>
       </w:r>
     </w:p>
     <w:p/>
     <w:p/>
     <w:p>
-      <w:hyperlink r:id="rId10" w:history="1">
+      <w:hyperlink r:id="rId11" w:history="1">
         <w:r>
           <w:rPr>
             <w:rStyle w:val="Hyperlink"/>
@@ -1286,15 +714,7 @@
       </w:r>
       <w:r>
         <w:lastRenderedPageBreak/>
-        <w:t xml:space="preserve">duplicates, removing the need to fuzz both </w:t>
-      </w:r>
-      <w:proofErr w:type="spellStart"/>
-      <w:r>
-        <w:t>funcs</w:t>
-      </w:r>
-      <w:proofErr w:type="spellEnd"/>
-      <w:r>
-        <w:t>. Useful in practice for speeding up a common case</w:t>
+        <w:t>duplicates, removing the need to fuzz both funcs. Useful in practice for speeding up a common case</w:t>
       </w:r>
     </w:p>
     <w:p>
@@ -1306,15 +726,7 @@
         </w:numPr>
       </w:pPr>
       <w:r>
-        <w:t xml:space="preserve">Filter out </w:t>
-      </w:r>
-      <w:proofErr w:type="spellStart"/>
-      <w:r>
-        <w:t>funcs</w:t>
-      </w:r>
-      <w:proofErr w:type="spellEnd"/>
-      <w:r>
-        <w:t xml:space="preserve"> with no parameters and return values</w:t>
+        <w:t>Filter out funcs with no parameters and return values</w:t>
       </w:r>
     </w:p>
     <w:p>
@@ -1326,15 +738,7 @@
         </w:numPr>
       </w:pPr>
       <w:r>
-        <w:t xml:space="preserve">Possibly filter out </w:t>
-      </w:r>
-      <w:proofErr w:type="spellStart"/>
-      <w:r>
-        <w:t>funcs</w:t>
-      </w:r>
-      <w:proofErr w:type="spellEnd"/>
-      <w:r>
-        <w:t xml:space="preserve"> that invoke external classes or methods</w:t>
+        <w:t>Possibly filter out funcs that invoke external classes or methods</w:t>
       </w:r>
     </w:p>
     <w:p>
@@ -1346,15 +750,7 @@
         </w:numPr>
       </w:pPr>
       <w:r>
-        <w:t xml:space="preserve">They use </w:t>
-      </w:r>
-      <w:proofErr w:type="spellStart"/>
-      <w:r>
-        <w:t>pynguin</w:t>
-      </w:r>
-      <w:proofErr w:type="spellEnd"/>
-      <w:r>
-        <w:t xml:space="preserve"> which is a test generation framework that does not use fuzz testing</w:t>
+        <w:t>They use pynguin which is a test generation framework that does not use fuzz testing</w:t>
       </w:r>
     </w:p>
     <w:p>
@@ -1374,15 +770,7 @@
     </w:p>
     <w:p>
       <w:r>
-        <w:t xml:space="preserve">What if u have a class with 1 </w:t>
-      </w:r>
-      <w:proofErr w:type="gramStart"/>
-      <w:r>
-        <w:t>methods</w:t>
-      </w:r>
-      <w:proofErr w:type="gramEnd"/>
-      <w:r>
-        <w:t>, a factory method which gives u back 3 methods</w:t>
+        <w:t>What if u have a class with 1 methods, a factory method which gives u back 3 methods</w:t>
       </w:r>
     </w:p>
     <w:p>
@@ -1404,7 +792,7 @@
       </w:r>
     </w:p>
     <w:p>
-      <w:hyperlink r:id="rId11" w:history="1">
+      <w:hyperlink r:id="rId12" w:history="1">
         <w:r>
           <w:rPr>
             <w:rStyle w:val="Hyperlink"/>
@@ -1415,29 +803,13 @@
     </w:p>
     <w:p>
       <w:r>
-        <w:t xml:space="preserve">could instead go more practical, targeting </w:t>
-      </w:r>
-      <w:proofErr w:type="spellStart"/>
-      <w:r>
-        <w:t>datastructure</w:t>
-      </w:r>
-      <w:proofErr w:type="spellEnd"/>
-      <w:r>
-        <w:t xml:space="preserve"> implementations online</w:t>
+        <w:t>could instead go more practical, targeting datastructure implementations online</w:t>
       </w:r>
     </w:p>
     <w:p/>
     <w:p>
       <w:r>
-        <w:t xml:space="preserve">For function-function verification: I am currently implementing the case where both functions return (create) a new function. In this case I want to then perform the same function-function verification on these two new returned functions. The problem is the </w:t>
-      </w:r>
-      <w:proofErr w:type="spellStart"/>
-      <w:r>
-        <w:t>hypofuzz</w:t>
-      </w:r>
-      <w:proofErr w:type="spellEnd"/>
-      <w:r>
-        <w:t xml:space="preserve"> does not exactly allow for a recursive implementation like this. </w:t>
+        <w:t xml:space="preserve">For function-function verification: I am currently implementing the case where both functions return (create) a new function. In this case I want to then perform the same function-function verification on these two new returned functions. The problem is the hypofuzz does not exactly allow for a recursive implementation like this. </w:t>
       </w:r>
     </w:p>
     <w:p>
@@ -1482,37 +854,7 @@
         <w:rPr>
           <w:iCs/>
         </w:rPr>
-        <w:t xml:space="preserve">Other than this issue, another issue is trying to reason with functions that take callable parameters. </w:t>
-      </w:r>
-      <w:proofErr w:type="spellStart"/>
-      <w:proofErr w:type="gramStart"/>
-      <w:r>
-        <w:rPr>
-          <w:iCs/>
-        </w:rPr>
-        <w:t>Cant</w:t>
-      </w:r>
-      <w:proofErr w:type="spellEnd"/>
-      <w:proofErr w:type="gramEnd"/>
-      <w:r>
-        <w:rPr>
-          <w:iCs/>
-        </w:rPr>
-        <w:t xml:space="preserve"> exactly fuzz a function as an input so </w:t>
-      </w:r>
-      <w:proofErr w:type="spellStart"/>
-      <w:r>
-        <w:rPr>
-          <w:iCs/>
-        </w:rPr>
-        <w:t>im</w:t>
-      </w:r>
-      <w:proofErr w:type="spellEnd"/>
-      <w:r>
-        <w:rPr>
-          <w:iCs/>
-        </w:rPr>
-        <w:t xml:space="preserve"> not sure what to do here</w:t>
+        <w:t>Other than this issue, another issue is trying to reason with functions that take callable parameters. Cant exactly fuzz a function as an input so im not sure what to do here</w:t>
       </w:r>
       <w:r>
         <w:rPr>
@@ -1549,7 +891,7 @@
                     <pic:cNvPicPr/>
                   </pic:nvPicPr>
                   <pic:blipFill>
-                    <a:blip r:embed="rId12"/>
+                    <a:blip r:embed="rId13"/>
                     <a:stretch>
                       <a:fillRect/>
                     </a:stretch>
@@ -1580,138 +922,46 @@
         <w:rPr>
           <w:iCs/>
         </w:rPr>
-        <w:t xml:space="preserve">Using universal strategy + dummy functions (the testing framework doesn’t know that the function </w:t>
-      </w:r>
-      <w:proofErr w:type="spellStart"/>
-      <w:r>
-        <w:rPr>
-          <w:iCs/>
-        </w:rPr>
-        <w:t>arg</w:t>
-      </w:r>
-      <w:proofErr w:type="spellEnd"/>
-      <w:r>
-        <w:rPr>
-          <w:iCs/>
-        </w:rPr>
-        <w:t xml:space="preserve"> is necessarily </w:t>
-      </w:r>
-      <w:proofErr w:type="gramStart"/>
-      <w:r>
-        <w:rPr>
-          <w:iCs/>
-        </w:rPr>
-        <w:t>callable</w:t>
-      </w:r>
-      <w:proofErr w:type="gramEnd"/>
-      <w:r>
-        <w:rPr>
-          <w:iCs/>
-        </w:rPr>
-        <w:t xml:space="preserve"> so it uses universal strategy) it takes 11 minutes to find the difference in </w:t>
-      </w:r>
-      <w:proofErr w:type="spellStart"/>
-      <w:r>
-        <w:rPr>
-          <w:iCs/>
-        </w:rPr>
-        <w:t>call_nested_param_ineq</w:t>
-      </w:r>
-      <w:proofErr w:type="spellEnd"/>
-      <w:r>
-        <w:rPr>
-          <w:iCs/>
-        </w:rPr>
-        <w:t xml:space="preserve">. Chances are, with type annotations this will be a bit faster as the tester will start passing in more callable </w:t>
-      </w:r>
-      <w:proofErr w:type="spellStart"/>
-      <w:r>
-        <w:rPr>
-          <w:iCs/>
-        </w:rPr>
-        <w:t>args</w:t>
-      </w:r>
-      <w:proofErr w:type="spellEnd"/>
-      <w:r>
-        <w:rPr>
-          <w:iCs/>
-        </w:rPr>
-        <w:t xml:space="preserve"> from the start</w:t>
-      </w:r>
-    </w:p>
-    <w:p>
-      <w:pPr>
-        <w:rPr>
-          <w:iCs/>
-        </w:rPr>
-      </w:pPr>
-      <w:r>
-        <w:rPr>
-          <w:iCs/>
-        </w:rPr>
-        <w:t xml:space="preserve">Adding a mechanism to see if an </w:t>
-      </w:r>
-      <w:proofErr w:type="spellStart"/>
-      <w:r>
-        <w:rPr>
-          <w:iCs/>
-        </w:rPr>
-        <w:t>arg</w:t>
-      </w:r>
-      <w:proofErr w:type="spellEnd"/>
-      <w:r>
-        <w:rPr>
-          <w:iCs/>
-        </w:rPr>
-        <w:t xml:space="preserve"> is “called” within a function should be </w:t>
-      </w:r>
-      <w:proofErr w:type="gramStart"/>
-      <w:r>
-        <w:rPr>
-          <w:iCs/>
-        </w:rPr>
-        <w:t>pretty easy</w:t>
-      </w:r>
-      <w:proofErr w:type="gramEnd"/>
-      <w:r>
-        <w:rPr>
-          <w:iCs/>
-        </w:rPr>
-        <w:t xml:space="preserve"> and should greatly improve time efficiency</w:t>
-      </w:r>
-    </w:p>
-    <w:p>
-      <w:pPr>
-        <w:rPr>
-          <w:iCs/>
-        </w:rPr>
-      </w:pPr>
-    </w:p>
-    <w:p>
-      <w:pPr>
-        <w:rPr>
-          <w:iCs/>
-        </w:rPr>
-      </w:pPr>
-      <w:r>
-        <w:rPr>
-          <w:iCs/>
-        </w:rPr>
-        <w:t xml:space="preserve">To be as faithful to the theory: we need to complicate/generalise </w:t>
-      </w:r>
-      <w:proofErr w:type="gramStart"/>
-      <w:r>
-        <w:rPr>
-          <w:iCs/>
-        </w:rPr>
-        <w:t>f(</w:t>
-      </w:r>
-      <w:proofErr w:type="gramEnd"/>
-      <w:r>
-        <w:rPr>
-          <w:iCs/>
-        </w:rPr>
-        <w:t>) so it can call any function it knows. Bound things, we don’t want more than 2 recursive calls, more than etc.</w:t>
+        <w:t>Using universal strategy + dummy functions (the testing framework doesn’t know that the function arg is necessarily callable so it uses universal strategy) it takes 11 minutes to find the difference in call_nested_param_ineq</w:t>
+      </w:r>
+      <w:r>
+        <w:rPr>
+          <w:iCs/>
+        </w:rPr>
+        <w:t>. Chances are, with type annotations this will be a bit faster as the tester will start passing in more callable args from the start</w:t>
+      </w:r>
+    </w:p>
+    <w:p>
+      <w:pPr>
+        <w:rPr>
+          <w:iCs/>
+        </w:rPr>
+      </w:pPr>
+      <w:r>
+        <w:rPr>
+          <w:iCs/>
+        </w:rPr>
+        <w:t>Adding a mechanism to see if an arg is “called” within a function should be pretty easy and should greatly improve time efficiency</w:t>
+      </w:r>
+    </w:p>
+    <w:p>
+      <w:pPr>
+        <w:rPr>
+          <w:iCs/>
+        </w:rPr>
+      </w:pPr>
+    </w:p>
+    <w:p>
+      <w:pPr>
+        <w:rPr>
+          <w:iCs/>
+        </w:rPr>
+      </w:pPr>
+      <w:r>
+        <w:rPr>
+          <w:iCs/>
+        </w:rPr>
+        <w:t>To be as faithful to the theory: we need to complicate/generalise f() so it can call any function it knows. Bound things, we don’t want more than 2 recursive calls, more than etc.</w:t>
       </w:r>
     </w:p>
     <w:p>
@@ -1782,48 +1032,20 @@
         <w:rPr>
           <w:iCs/>
         </w:rPr>
-        <w:t xml:space="preserve">If I have time, extend </w:t>
-      </w:r>
-      <w:proofErr w:type="gramStart"/>
-      <w:r>
-        <w:rPr>
-          <w:iCs/>
-        </w:rPr>
-        <w:t>f(</w:t>
-      </w:r>
-      <w:proofErr w:type="gramEnd"/>
-      <w:r>
-        <w:rPr>
-          <w:iCs/>
-        </w:rPr>
-        <w:t>) functions to take and return numbers</w:t>
-      </w:r>
-    </w:p>
-    <w:p>
-      <w:pPr>
-        <w:rPr>
-          <w:iCs/>
-        </w:rPr>
-      </w:pPr>
-      <w:r>
-        <w:rPr>
-          <w:iCs/>
-        </w:rPr>
-        <w:t xml:space="preserve">Then I can look at test suites, try it out in some application areas where equivalence is important, </w:t>
-      </w:r>
-      <w:proofErr w:type="gramStart"/>
-      <w:r>
-        <w:rPr>
-          <w:iCs/>
-        </w:rPr>
-        <w:t>property based</w:t>
-      </w:r>
-      <w:proofErr w:type="gramEnd"/>
-      <w:r>
-        <w:rPr>
-          <w:iCs/>
-        </w:rPr>
-        <w:t xml:space="preserve"> testing test suite and run with my pipeline.</w:t>
+        <w:t>If I have time, extend f() functions to take and return numbers</w:t>
+      </w:r>
+    </w:p>
+    <w:p>
+      <w:pPr>
+        <w:rPr>
+          <w:iCs/>
+        </w:rPr>
+      </w:pPr>
+      <w:r>
+        <w:rPr>
+          <w:iCs/>
+        </w:rPr>
+        <w:t>Then I can look at test suites, try it out in some application areas where equivalence is important, property based testing test suite and run with my pipeline.</w:t>
       </w:r>
     </w:p>
     <w:p>
@@ -1878,79 +1100,33 @@
           <w:bCs/>
           <w:iCs/>
         </w:rPr>
-        <w:t xml:space="preserve">Pass a </w:t>
-      </w:r>
-      <w:proofErr w:type="spellStart"/>
-      <w:r>
+        <w:t>Pass a datastruct library thru a mutation testing suite to see how it performs against my pipeline, try to find examples my pipeline can find that the existing suite cant</w:t>
+      </w:r>
+    </w:p>
+    <w:p>
+      <w:pPr>
         <w:rPr>
           <w:b/>
           <w:bCs/>
           <w:iCs/>
         </w:rPr>
-        <w:t>datastruct</w:t>
-      </w:r>
-      <w:proofErr w:type="spellEnd"/>
+      </w:pPr>
       <w:r>
         <w:rPr>
           <w:b/>
           <w:bCs/>
           <w:iCs/>
         </w:rPr>
-        <w:t xml:space="preserve"> library thru a mutation testing suite to see how it performs against my pipeline, try to find examples my pipeline can find that the existing suite </w:t>
-      </w:r>
-      <w:proofErr w:type="gramStart"/>
-      <w:r>
+        <w:t>Look at open source library with tests at the end</w:t>
+      </w:r>
+    </w:p>
+    <w:p>
+      <w:pPr>
         <w:rPr>
           <w:b/>
           <w:bCs/>
           <w:iCs/>
         </w:rPr>
-        <w:t>cant</w:t>
-      </w:r>
-      <w:proofErr w:type="gramEnd"/>
-    </w:p>
-    <w:p>
-      <w:pPr>
-        <w:rPr>
-          <w:b/>
-          <w:bCs/>
-          <w:iCs/>
-        </w:rPr>
-      </w:pPr>
-      <w:r>
-        <w:rPr>
-          <w:b/>
-          <w:bCs/>
-          <w:iCs/>
-        </w:rPr>
-        <w:t xml:space="preserve">Look at </w:t>
-      </w:r>
-      <w:proofErr w:type="gramStart"/>
-      <w:r>
-        <w:rPr>
-          <w:b/>
-          <w:bCs/>
-          <w:iCs/>
-        </w:rPr>
-        <w:t>open source</w:t>
-      </w:r>
-      <w:proofErr w:type="gramEnd"/>
-      <w:r>
-        <w:rPr>
-          <w:b/>
-          <w:bCs/>
-          <w:iCs/>
-        </w:rPr>
-        <w:t xml:space="preserve"> library with tests at the end</w:t>
-      </w:r>
-    </w:p>
-    <w:p>
-      <w:pPr>
-        <w:rPr>
-          <w:b/>
-          <w:bCs/>
-          <w:iCs/>
-        </w:rPr>
       </w:pPr>
     </w:p>
     <w:p>
@@ -1969,21 +1145,7 @@
         <w:rPr>
           <w:iCs/>
         </w:rPr>
-        <w:t xml:space="preserve"> </w:t>
-      </w:r>
-      <w:proofErr w:type="spellStart"/>
-      <w:r>
-        <w:rPr>
-          <w:iCs/>
-        </w:rPr>
-        <w:t>are_equivalent</w:t>
-      </w:r>
-      <w:proofErr w:type="spellEnd"/>
-      <w:r>
-        <w:rPr>
-          <w:iCs/>
-        </w:rPr>
-        <w:t xml:space="preserve"> for profiler to check that the arguments to any function called by the top level</w:t>
+        <w:t xml:space="preserve"> are_equivalent for profiler to check that the arguments to any function called by the top level</w:t>
       </w:r>
       <w:r>
         <w:rPr>
@@ -2022,21 +1184,7 @@
         <w:rPr>
           <w:iCs/>
         </w:rPr>
-        <w:t xml:space="preserve">One idea: perform static analysis on the function we are fuzzing before we fuzz it to see if it takes a function f as a param, if that function f itself takes a param. </w:t>
-      </w:r>
-      <w:proofErr w:type="gramStart"/>
-      <w:r>
-        <w:rPr>
-          <w:iCs/>
-        </w:rPr>
-        <w:t>Thus</w:t>
-      </w:r>
-      <w:proofErr w:type="gramEnd"/>
-      <w:r>
-        <w:rPr>
-          <w:iCs/>
-        </w:rPr>
-        <w:t xml:space="preserve"> we can narrow down which function fuzzing strategy to employ</w:t>
+        <w:t>One idea: perform static analysis on the function we are fuzzing before we fuzz it to see if it takes a function f as a param, if that function f itself takes a param. Thus we can narrow down which function fuzzing strategy to employ</w:t>
       </w:r>
     </w:p>
     <w:p>
@@ -2072,35 +1220,7 @@
         <w:rPr>
           <w:iCs/>
         </w:rPr>
-        <w:t xml:space="preserve">Functions f that </w:t>
-      </w:r>
-      <w:proofErr w:type="gramStart"/>
-      <w:r>
-        <w:rPr>
-          <w:iCs/>
-        </w:rPr>
-        <w:t>take</w:t>
-      </w:r>
-      <w:proofErr w:type="gramEnd"/>
-      <w:r>
-        <w:rPr>
-          <w:iCs/>
-        </w:rPr>
-        <w:t xml:space="preserve"> a single function as a param like f(h): we can check the </w:t>
-      </w:r>
-      <w:proofErr w:type="spellStart"/>
-      <w:r>
-        <w:rPr>
-          <w:iCs/>
-        </w:rPr>
-        <w:t>sig</w:t>
-      </w:r>
-      <w:proofErr w:type="spellEnd"/>
-      <w:r>
-        <w:rPr>
-          <w:iCs/>
-        </w:rPr>
-        <w:t xml:space="preserve"> of the function h given, and fuzz some input accordingly to call h with within f.</w:t>
+        <w:t>Functions f that take a single function as a param like f(h): we can check the sig of the function h given, and fuzz some input accordingly to call h with within f.</w:t>
       </w:r>
     </w:p>
     <w:p>
@@ -2146,86 +1266,22 @@
         <w:rPr>
           <w:iCs/>
         </w:rPr>
-        <w:t xml:space="preserve">If (state of </w:t>
-      </w:r>
-      <w:proofErr w:type="spellStart"/>
-      <w:r>
-        <w:rPr>
-          <w:iCs/>
-        </w:rPr>
-        <w:t>module_a</w:t>
-      </w:r>
-      <w:proofErr w:type="spellEnd"/>
-      <w:r>
-        <w:rPr>
-          <w:iCs/>
-        </w:rPr>
-        <w:t xml:space="preserve"> before running == state of </w:t>
-      </w:r>
-      <w:proofErr w:type="spellStart"/>
-      <w:r>
-        <w:rPr>
-          <w:iCs/>
-        </w:rPr>
-        <w:t>module_a</w:t>
-      </w:r>
-      <w:proofErr w:type="spellEnd"/>
-      <w:r>
-        <w:rPr>
-          <w:iCs/>
-        </w:rPr>
-        <w:t xml:space="preserve"> after n steps) !=</w:t>
+        <w:t>If (state of module_a before running == state of module_a after n steps) !=</w:t>
       </w:r>
       <w:r>
         <w:rPr>
           <w:iCs/>
         </w:rPr>
         <w:br/>
-        <w:t xml:space="preserve">   (state of </w:t>
-      </w:r>
-      <w:proofErr w:type="spellStart"/>
-      <w:r>
-        <w:rPr>
-          <w:iCs/>
-        </w:rPr>
-        <w:t>module_b</w:t>
-      </w:r>
-      <w:proofErr w:type="spellEnd"/>
-      <w:r>
-        <w:rPr>
-          <w:iCs/>
-        </w:rPr>
-        <w:t xml:space="preserve"> before running == state of </w:t>
-      </w:r>
-      <w:proofErr w:type="spellStart"/>
-      <w:r>
-        <w:rPr>
-          <w:iCs/>
-        </w:rPr>
-        <w:t>module_b</w:t>
-      </w:r>
-      <w:proofErr w:type="spellEnd"/>
-      <w:r>
-        <w:rPr>
-          <w:iCs/>
-        </w:rPr>
-        <w:t xml:space="preserve"> after n steps):</w:t>
+        <w:t xml:space="preserve">   (state of module_b before running == state of module_b after n steps):</w:t>
       </w:r>
       <w:r>
         <w:rPr>
           <w:iCs/>
         </w:rPr>
         <w:br/>
-        <w:t xml:space="preserve">   they are </w:t>
-      </w:r>
-      <w:proofErr w:type="spellStart"/>
-      <w:r>
-        <w:rPr>
-          <w:iCs/>
-        </w:rPr>
-        <w:t>inequiv</w:t>
-      </w:r>
-      <w:proofErr w:type="spellEnd"/>
+        <w:t xml:space="preserve">   they are inequiv</w:t>
+      </w:r>
       <w:r>
         <w:rPr>
           <w:iCs/>
@@ -2238,21 +1294,7 @@
           <w:iCs/>
         </w:rPr>
         <w:br/>
-        <w:t xml:space="preserve">Some examples in plain </w:t>
-      </w:r>
-      <w:proofErr w:type="spellStart"/>
-      <w:r>
-        <w:rPr>
-          <w:iCs/>
-        </w:rPr>
-        <w:t>english</w:t>
-      </w:r>
-      <w:proofErr w:type="spellEnd"/>
-      <w:r>
-        <w:rPr>
-          <w:iCs/>
-        </w:rPr>
-        <w:t xml:space="preserve"> for my own sanity: </w:t>
+        <w:t xml:space="preserve">Some examples in plain english for my own sanity: </w:t>
       </w:r>
       <w:r>
         <w:rPr>
@@ -2265,30 +1307,8 @@
           <w:iCs/>
         </w:rPr>
         <w:br/>
-        <w:t xml:space="preserve">if </w:t>
-      </w:r>
-      <w:proofErr w:type="spellStart"/>
-      <w:r>
-        <w:rPr>
-          <w:iCs/>
-        </w:rPr>
-        <w:t>module_a</w:t>
-      </w:r>
-      <w:proofErr w:type="spellEnd"/>
-      <w:r>
-        <w:rPr>
-          <w:iCs/>
-        </w:rPr>
-        <w:t xml:space="preserve"> alters a global variable x after running n steps, but </w:t>
-      </w:r>
-      <w:proofErr w:type="spellStart"/>
-      <w:r>
-        <w:rPr>
-          <w:iCs/>
-        </w:rPr>
-        <w:t>module_b</w:t>
-      </w:r>
-      <w:proofErr w:type="spellEnd"/>
+        <w:t>if module_a alters a global variable x after running n steps, but module_b</w:t>
+      </w:r>
       <w:r>
         <w:rPr>
           <w:iCs/>
@@ -2320,35 +1340,7 @@
           <w:iCs/>
         </w:rPr>
         <w:br/>
-        <w:t xml:space="preserve">if </w:t>
-      </w:r>
-      <w:proofErr w:type="spellStart"/>
-      <w:r>
-        <w:rPr>
-          <w:iCs/>
-        </w:rPr>
-        <w:t>module_a</w:t>
-      </w:r>
-      <w:proofErr w:type="spellEnd"/>
-      <w:r>
-        <w:rPr>
-          <w:iCs/>
-        </w:rPr>
-        <w:t xml:space="preserve"> contains the definition of a global variable x, but it does not change, and </w:t>
-      </w:r>
-      <w:proofErr w:type="spellStart"/>
-      <w:r>
-        <w:rPr>
-          <w:iCs/>
-        </w:rPr>
-        <w:t>module_b</w:t>
-      </w:r>
-      <w:proofErr w:type="spellEnd"/>
-      <w:r>
-        <w:rPr>
-          <w:iCs/>
-        </w:rPr>
-        <w:t xml:space="preserve"> does not</w:t>
+        <w:t>if module_a contains the definition of a global variable x, but it does not change, and module_b does not</w:t>
       </w:r>
       <w:r>
         <w:rPr>
@@ -2375,35 +1367,7 @@
           <w:iCs/>
         </w:rPr>
         <w:br/>
-        <w:t xml:space="preserve">if </w:t>
-      </w:r>
-      <w:proofErr w:type="spellStart"/>
-      <w:r>
-        <w:rPr>
-          <w:iCs/>
-        </w:rPr>
-        <w:t>module_a</w:t>
-      </w:r>
-      <w:proofErr w:type="spellEnd"/>
-      <w:r>
-        <w:rPr>
-          <w:iCs/>
-        </w:rPr>
-        <w:t xml:space="preserve"> alters a global string variable s after running n steps, but </w:t>
-      </w:r>
-      <w:proofErr w:type="spellStart"/>
-      <w:r>
-        <w:rPr>
-          <w:iCs/>
-        </w:rPr>
-        <w:t>module_b</w:t>
-      </w:r>
-      <w:proofErr w:type="spellEnd"/>
-      <w:r>
-        <w:rPr>
-          <w:iCs/>
-        </w:rPr>
-        <w:t xml:space="preserve"> alters a global int</w:t>
+        <w:t>if module_a alters a global string variable s after running n steps, but module_b alters a global int</w:t>
       </w:r>
       <w:r>
         <w:rPr>
@@ -2446,7 +1410,7 @@
         </w:rPr>
         <w:t xml:space="preserve">Experimented with mutation testing. Started with </w:t>
       </w:r>
-      <w:hyperlink r:id="rId13" w:history="1">
+      <w:hyperlink r:id="rId14" w:history="1">
         <w:r>
           <w:rPr>
             <w:rStyle w:val="Hyperlink"/>
@@ -2539,1080 +1503,836 @@
           <w:bCs/>
           <w:iCs/>
         </w:rPr>
-        <w:t xml:space="preserve">Running </w:t>
-      </w:r>
-      <w:proofErr w:type="spellStart"/>
-      <w:r>
+        <w:t xml:space="preserve">Running mutmut on requests: </w:t>
+      </w:r>
+    </w:p>
+    <w:p>
+      <w:pPr>
+        <w:rPr>
+          <w:iCs/>
+        </w:rPr>
+      </w:pPr>
+      <w:r>
+        <w:rPr>
+          <w:iCs/>
+        </w:rPr>
+        <w:t>Running mutation testing</w:t>
+      </w:r>
+    </w:p>
+    <w:p>
+      <w:pPr>
+        <w:rPr>
+          <w:iCs/>
+        </w:rPr>
+      </w:pPr>
+      <w:r>
+        <w:rPr>
+          <w:rFonts w:ascii="Segoe UI Symbol" w:hAnsi="Segoe UI Symbol" w:cs="Segoe UI Symbol"/>
+          <w:iCs/>
+        </w:rPr>
+        <w:t>⠧</w:t>
+      </w:r>
+      <w:r>
+        <w:rPr>
+          <w:iCs/>
+        </w:rPr>
+        <w:t xml:space="preserve"> 3673/3673  </w:t>
+      </w:r>
+      <w:r>
+        <w:rPr>
+          <w:rFonts w:ascii="Segoe UI Emoji" w:hAnsi="Segoe UI Emoji" w:cs="Segoe UI Emoji"/>
+          <w:iCs/>
+        </w:rPr>
+        <w:t>🎉</w:t>
+      </w:r>
+      <w:r>
+        <w:rPr>
+          <w:iCs/>
+        </w:rPr>
+        <w:t xml:space="preserve"> 2241 </w:t>
+      </w:r>
+      <w:r>
+        <w:rPr>
+          <w:rFonts w:ascii="Aptos" w:hAnsi="Aptos" w:cs="Aptos"/>
+          <w:iCs/>
+        </w:rPr>
+        <w:t>🫥</w:t>
+      </w:r>
+      <w:r>
+        <w:rPr>
+          <w:iCs/>
+        </w:rPr>
+        <w:t xml:space="preserve"> 337  </w:t>
+      </w:r>
+      <w:r>
+        <w:rPr>
+          <w:rFonts w:ascii="Segoe UI Emoji" w:hAnsi="Segoe UI Emoji" w:cs="Segoe UI Emoji"/>
+          <w:iCs/>
+        </w:rPr>
+        <w:t>⏰</w:t>
+      </w:r>
+      <w:r>
+        <w:rPr>
+          <w:iCs/>
+        </w:rPr>
+        <w:t xml:space="preserve"> 453  </w:t>
+      </w:r>
+      <w:r>
+        <w:rPr>
+          <w:rFonts w:ascii="Segoe UI Emoji" w:hAnsi="Segoe UI Emoji" w:cs="Segoe UI Emoji"/>
+          <w:iCs/>
+        </w:rPr>
+        <w:t>🤔</w:t>
+      </w:r>
+      <w:r>
+        <w:rPr>
+          <w:iCs/>
+        </w:rPr>
+        <w:t xml:space="preserve"> 0  </w:t>
+      </w:r>
+      <w:r>
+        <w:rPr>
+          <w:rFonts w:ascii="Segoe UI Emoji" w:hAnsi="Segoe UI Emoji" w:cs="Segoe UI Emoji"/>
+          <w:iCs/>
+        </w:rPr>
+        <w:t>🙁</w:t>
+      </w:r>
+      <w:r>
+        <w:rPr>
+          <w:iCs/>
+        </w:rPr>
+        <w:t xml:space="preserve"> 642  </w:t>
+      </w:r>
+      <w:r>
+        <w:rPr>
+          <w:rFonts w:ascii="Segoe UI Emoji" w:hAnsi="Segoe UI Emoji" w:cs="Segoe UI Emoji"/>
+          <w:iCs/>
+        </w:rPr>
+        <w:t>🔇</w:t>
+      </w:r>
+      <w:r>
+        <w:rPr>
+          <w:iCs/>
+        </w:rPr>
+        <w:t xml:space="preserve"> 0</w:t>
+      </w:r>
+    </w:p>
+    <w:p>
+      <w:pPr>
+        <w:rPr>
+          <w:iCs/>
+        </w:rPr>
+      </w:pPr>
+      <w:r>
+        <w:rPr>
+          <w:iCs/>
+        </w:rPr>
+        <w:t>Mutants identified: 347/1449</w:t>
+      </w:r>
+      <w:r>
+        <w:rPr>
+          <w:iCs/>
+        </w:rPr>
+        <w:t xml:space="preserve"> – not sure why not all mutants were hit</w:t>
+      </w:r>
+    </w:p>
+    <w:p>
+      <w:pPr>
+        <w:rPr>
+          <w:iCs/>
+        </w:rPr>
+      </w:pPr>
+      <w:r>
+        <w:rPr>
+          <w:iCs/>
+        </w:rPr>
+        <w:t>Completed in 13372.785392045975 seconds.</w:t>
+      </w:r>
+      <w:r>
+        <w:rPr>
+          <w:iCs/>
+        </w:rPr>
+        <w:t xml:space="preserve"> (3.7 hrs)</w:t>
+      </w:r>
+    </w:p>
+    <w:p>
+      <w:pPr>
+        <w:rPr>
+          <w:iCs/>
+        </w:rPr>
+      </w:pPr>
+    </w:p>
+    <w:p>
+      <w:pPr>
+        <w:rPr>
+          <w:iCs/>
+        </w:rPr>
+      </w:pPr>
+      <w:r>
+        <w:rPr>
+          <w:iCs/>
+        </w:rPr>
+        <w:t>After adding class based stuff</w:t>
+      </w:r>
+    </w:p>
+    <w:p>
+      <w:pPr>
+        <w:rPr>
+          <w:iCs/>
+        </w:rPr>
+      </w:pPr>
+      <w:r>
+        <w:rPr>
+          <w:iCs/>
+        </w:rPr>
+        <w:t>Mutants identified: 917/4467</w:t>
+      </w:r>
+      <w:r>
+        <w:rPr>
+          <w:iCs/>
+        </w:rPr>
+        <w:t xml:space="preserve"> in 6.8 hrs (but I suspect this may be over eager)</w:t>
+      </w:r>
+    </w:p>
+    <w:p>
+      <w:pPr>
+        <w:rPr>
+          <w:iCs/>
+        </w:rPr>
+      </w:pPr>
+      <w:r>
+        <w:rPr>
+          <w:iCs/>
+        </w:rPr>
+        <w:t>537/4467</w:t>
+      </w:r>
+      <w:r>
+        <w:rPr>
+          <w:iCs/>
+        </w:rPr>
+        <w:t xml:space="preserve"> after fixing it in 7.4 hrs</w:t>
+      </w:r>
+    </w:p>
+    <w:p>
+      <w:pPr>
+        <w:rPr>
+          <w:iCs/>
+        </w:rPr>
+      </w:pPr>
+    </w:p>
+    <w:p>
+      <w:pPr>
+        <w:rPr>
+          <w:iCs/>
+        </w:rPr>
+      </w:pPr>
+      <w:r>
+        <w:rPr>
+          <w:iCs/>
+        </w:rPr>
+        <w:t>Ran it on a library of data structures:</w:t>
+      </w:r>
+    </w:p>
+    <w:p>
+      <w:pPr>
+        <w:rPr>
+          <w:iCs/>
+        </w:rPr>
+      </w:pPr>
+      <w:r>
+        <w:rPr>
+          <w:iCs/>
+        </w:rPr>
+        <w:t>https://github.com/clair3st/Data-Structures/tree/master</w:t>
+      </w:r>
+    </w:p>
+    <w:p>
+      <w:pPr>
+        <w:rPr>
+          <w:iCs/>
+        </w:rPr>
+      </w:pPr>
+      <w:r>
+        <w:rPr>
+          <w:rFonts w:ascii="Segoe UI Symbol" w:hAnsi="Segoe UI Symbol" w:cs="Segoe UI Symbol"/>
+          <w:iCs/>
+        </w:rPr>
+        <w:t>⠸</w:t>
+      </w:r>
+      <w:r>
+        <w:rPr>
+          <w:iCs/>
+        </w:rPr>
+        <w:t xml:space="preserve"> 445/445  </w:t>
+      </w:r>
+      <w:r>
+        <w:rPr>
+          <w:rFonts w:ascii="Segoe UI Emoji" w:hAnsi="Segoe UI Emoji" w:cs="Segoe UI Emoji"/>
+          <w:iCs/>
+        </w:rPr>
+        <w:t>🎉</w:t>
+      </w:r>
+      <w:r>
+        <w:rPr>
+          <w:iCs/>
+        </w:rPr>
+        <w:t xml:space="preserve"> 383 </w:t>
+      </w:r>
+      <w:r>
+        <w:rPr>
+          <w:rFonts w:ascii="Aptos" w:hAnsi="Aptos" w:cs="Aptos"/>
+          <w:iCs/>
+        </w:rPr>
+        <w:t>🫥</w:t>
+      </w:r>
+      <w:r>
+        <w:rPr>
+          <w:iCs/>
+        </w:rPr>
+        <w:t xml:space="preserve"> 4  </w:t>
+      </w:r>
+      <w:r>
+        <w:rPr>
+          <w:rFonts w:ascii="Segoe UI Emoji" w:hAnsi="Segoe UI Emoji" w:cs="Segoe UI Emoji"/>
+          <w:iCs/>
+        </w:rPr>
+        <w:t>⏰</w:t>
+      </w:r>
+      <w:r>
+        <w:rPr>
+          <w:iCs/>
+        </w:rPr>
+        <w:t xml:space="preserve"> 10  </w:t>
+      </w:r>
+      <w:r>
+        <w:rPr>
+          <w:rFonts w:ascii="Segoe UI Emoji" w:hAnsi="Segoe UI Emoji" w:cs="Segoe UI Emoji"/>
+          <w:iCs/>
+        </w:rPr>
+        <w:t>🤔</w:t>
+      </w:r>
+      <w:r>
+        <w:rPr>
+          <w:iCs/>
+        </w:rPr>
+        <w:t xml:space="preserve"> 0  </w:t>
+      </w:r>
+      <w:r>
+        <w:rPr>
+          <w:rFonts w:ascii="Segoe UI Emoji" w:hAnsi="Segoe UI Emoji" w:cs="Segoe UI Emoji"/>
+          <w:iCs/>
+        </w:rPr>
+        <w:t>🙁</w:t>
+      </w:r>
+      <w:r>
+        <w:rPr>
+          <w:iCs/>
+        </w:rPr>
+        <w:t xml:space="preserve"> 48  </w:t>
+      </w:r>
+      <w:r>
+        <w:rPr>
+          <w:rFonts w:ascii="Segoe UI Emoji" w:hAnsi="Segoe UI Emoji" w:cs="Segoe UI Emoji"/>
+          <w:iCs/>
+        </w:rPr>
+        <w:t>🔇</w:t>
+      </w:r>
+      <w:r>
+        <w:rPr>
+          <w:iCs/>
+        </w:rPr>
+        <w:t xml:space="preserve"> 0</w:t>
+      </w:r>
+    </w:p>
+    <w:p>
+      <w:pPr>
+        <w:rPr>
+          <w:iCs/>
+        </w:rPr>
+      </w:pPr>
+      <w:r>
+        <w:rPr>
+          <w:iCs/>
+        </w:rPr>
+        <w:t>11</w:t>
+      </w:r>
+      <w:r>
+        <w:rPr>
+          <w:iCs/>
+        </w:rPr>
+        <w:t>8/445</w:t>
+      </w:r>
+    </w:p>
+    <w:p>
+      <w:pPr>
+        <w:rPr>
+          <w:iCs/>
+        </w:rPr>
+      </w:pPr>
+      <w:r>
+        <w:rPr>
+          <w:iCs/>
+        </w:rPr>
+        <w:t>270/445 after adding more class based stuff</w:t>
+      </w:r>
+    </w:p>
+    <w:p>
+      <w:pPr>
+        <w:rPr>
+          <w:iCs/>
+        </w:rPr>
+      </w:pPr>
+    </w:p>
+    <w:p>
+      <w:pPr>
+        <w:rPr>
+          <w:iCs/>
+        </w:rPr>
+      </w:pPr>
+    </w:p>
+    <w:p>
+      <w:pPr>
+        <w:rPr>
+          <w:iCs/>
+        </w:rPr>
+      </w:pPr>
+      <w:r>
+        <w:rPr>
+          <w:iCs/>
+        </w:rPr>
+        <w:t>With the following addition to pyproject.toml</w:t>
+      </w:r>
+    </w:p>
+    <w:p>
+      <w:pPr>
+        <w:rPr>
+          <w:iCs/>
+        </w:rPr>
+      </w:pPr>
+      <w:r>
+        <w:rPr>
+          <w:iCs/>
+        </w:rPr>
+        <w:t>[tool.mutmut]</w:t>
+      </w:r>
+      <w:r>
+        <w:rPr>
+          <w:iCs/>
+        </w:rPr>
+        <w:br/>
+        <w:t>pytest_add_cli_args = ["-k", "not test_env_cert_bundles and not test_different_connection_pool_for_tls_settings_verify_bundle_unexpired_cert"]</w:t>
+      </w:r>
+    </w:p>
+    <w:p>
+      <w:pPr>
+        <w:rPr>
+          <w:iCs/>
+        </w:rPr>
+      </w:pPr>
+    </w:p>
+    <w:p>
+      <w:pPr>
+        <w:rPr>
+          <w:iCs/>
+        </w:rPr>
+      </w:pPr>
+      <w:r>
+        <w:rPr>
+          <w:iCs/>
+        </w:rPr>
+        <w:t>Additions:</w:t>
+      </w:r>
+    </w:p>
+    <w:p>
+      <w:pPr>
+        <w:rPr>
+          <w:iCs/>
+        </w:rPr>
+      </w:pPr>
+      <w:r>
+        <w:rPr>
+          <w:iCs/>
+        </w:rPr>
+        <w:lastRenderedPageBreak/>
+        <w:t>Tested more hobbit suite</w:t>
+      </w:r>
+    </w:p>
+    <w:p>
+      <w:pPr>
+        <w:rPr>
+          <w:iCs/>
+        </w:rPr>
+      </w:pPr>
+      <w:r>
+        <w:rPr>
+          <w:iCs/>
+        </w:rPr>
+        <w:t>Wrote program equivalence</w:t>
+      </w:r>
+    </w:p>
+    <w:p>
+      <w:pPr>
+        <w:rPr>
+          <w:iCs/>
+        </w:rPr>
+      </w:pPr>
+      <w:r>
+        <w:rPr>
+          <w:iCs/>
+        </w:rPr>
+        <w:t>Wrote script to run entire hobbit suite</w:t>
+      </w:r>
+    </w:p>
+    <w:p>
+      <w:pPr>
+        <w:rPr>
+          <w:iCs/>
+        </w:rPr>
+      </w:pPr>
+      <w:r>
+        <w:rPr>
+          <w:iCs/>
+        </w:rPr>
+        <w:t>Functions can alter  global state</w:t>
+      </w:r>
+    </w:p>
+    <w:p>
+      <w:pPr>
+        <w:rPr>
+          <w:iCs/>
+        </w:rPr>
+      </w:pPr>
+      <w:r>
+        <w:rPr>
+          <w:iCs/>
+        </w:rPr>
+        <w:t>Mutation testing stuff</w:t>
+      </w:r>
+    </w:p>
+    <w:p>
+      <w:pPr>
+        <w:rPr>
+          <w:iCs/>
+        </w:rPr>
+      </w:pPr>
+    </w:p>
+    <w:p>
+      <w:pPr>
+        <w:rPr>
+          <w:iCs/>
+        </w:rPr>
+      </w:pPr>
+      <w:r>
+        <w:rPr>
+          <w:iCs/>
+        </w:rPr>
+        <w:t>Questions:</w:t>
+      </w:r>
+    </w:p>
+    <w:p>
+      <w:pPr>
+        <w:rPr>
+          <w:iCs/>
+        </w:rPr>
+      </w:pPr>
+      <w:r>
+        <w:rPr>
+          <w:iCs/>
+        </w:rPr>
+        <w:t>What do I say about translating hobbit to python in the thesis? That I used gpt?</w:t>
+      </w:r>
+    </w:p>
+    <w:p>
+      <w:pPr>
+        <w:rPr>
+          <w:iCs/>
+        </w:rPr>
+      </w:pPr>
+      <w:r>
+        <w:rPr>
+          <w:iCs/>
+        </w:rPr>
+        <w:t>Yes. Include sample prompts with responses</w:t>
+      </w:r>
+    </w:p>
+    <w:p>
+      <w:pPr>
+        <w:rPr>
+          <w:iCs/>
+        </w:rPr>
+      </w:pPr>
+      <w:r>
+        <w:rPr>
+          <w:iCs/>
+        </w:rPr>
+        <w:t>How do I treat two programs where 1 has global state and the other doesnt</w:t>
+      </w:r>
+    </w:p>
+    <w:p>
+      <w:pPr>
+        <w:rPr>
+          <w:iCs/>
+        </w:rPr>
+      </w:pPr>
+    </w:p>
+    <w:p>
+      <w:pPr>
+        <w:rPr>
+          <w:iCs/>
+        </w:rPr>
+      </w:pPr>
+      <w:r>
+        <w:rPr>
+          <w:iCs/>
+        </w:rPr>
+        <w:t>The trace is from the perspective of the observer</w:t>
+      </w:r>
+    </w:p>
+    <w:p>
+      <w:pPr>
+        <w:rPr>
+          <w:iCs/>
+        </w:rPr>
+      </w:pPr>
+      <w:r>
+        <w:rPr>
+          <w:iCs/>
+        </w:rPr>
+        <w:t>We cant see internal recursion</w:t>
+      </w:r>
+    </w:p>
+    <w:p>
+      <w:pPr>
+        <w:rPr>
+          <w:iCs/>
+        </w:rPr>
+      </w:pPr>
+      <w:r>
+        <w:rPr>
+          <w:iCs/>
+        </w:rPr>
+        <w:t>If function returns function, observer can call that function maybe</w:t>
+      </w:r>
+    </w:p>
+    <w:p>
+      <w:pPr>
+        <w:rPr>
+          <w:iCs/>
+        </w:rPr>
+      </w:pPr>
+      <w:r>
+        <w:rPr>
+          <w:iCs/>
+        </w:rPr>
+        <w:t xml:space="preserve">Reentrancy. </w:t>
+      </w:r>
+    </w:p>
+    <w:p>
+      <w:pPr>
+        <w:rPr>
+          <w:iCs/>
+        </w:rPr>
+      </w:pPr>
+      <w:r>
+        <w:rPr>
+          <w:iCs/>
+        </w:rPr>
+        <w:t>Function can make a choice between all funcs it knows</w:t>
+      </w:r>
+    </w:p>
+    <w:p>
+      <w:pPr>
+        <w:rPr>
+          <w:iCs/>
+        </w:rPr>
+      </w:pPr>
+      <w:r>
+        <w:rPr>
+          <w:iCs/>
+        </w:rPr>
+        <w:t>Maybe make observers store return values received in sequence</w:t>
+      </w:r>
+    </w:p>
+    <w:p>
+      <w:pPr>
+        <w:rPr>
+          <w:iCs/>
+        </w:rPr>
+      </w:pPr>
+      <w:r>
+        <w:rPr>
+          <w:iCs/>
+        </w:rPr>
+        <w:t>F can write a stream to a file</w:t>
+      </w:r>
+    </w:p>
+    <w:p>
+      <w:pPr>
+        <w:rPr>
+          <w:iCs/>
+        </w:rPr>
+      </w:pPr>
+      <w:r>
+        <w:rPr>
+          <w:iCs/>
+        </w:rPr>
+        <w:t>Have to retranslate hobbit suite</w:t>
+      </w:r>
+    </w:p>
+    <w:p>
+      <w:pPr>
+        <w:rPr>
+          <w:iCs/>
+        </w:rPr>
+      </w:pPr>
+      <w:r>
+        <w:rPr>
+          <w:iCs/>
+        </w:rPr>
+        <w:t xml:space="preserve">Currently, catch </w:t>
+      </w:r>
+      <w:r>
+        <w:rPr>
+          <w:iCs/>
+        </w:rPr>
+        <w:t>41-47</w:t>
+      </w:r>
+      <w:r>
+        <w:rPr>
+          <w:iCs/>
+        </w:rPr>
+        <w:t>/79 from hobbit suite</w:t>
+      </w:r>
+      <w:r>
+        <w:rPr>
+          <w:iCs/>
+        </w:rPr>
+        <w:t xml:space="preserve"> in 14-17 mins</w:t>
+      </w:r>
+    </w:p>
+    <w:p>
+      <w:pPr>
+        <w:rPr>
+          <w:iCs/>
+        </w:rPr>
+      </w:pPr>
+      <w:r>
+        <w:rPr>
+          <w:iCs/>
+        </w:rPr>
+        <w:t>Need to check if input arguments get mutated</w:t>
+      </w:r>
+    </w:p>
+    <w:p>
+      <w:pPr>
+        <w:rPr>
+          <w:iCs/>
+        </w:rPr>
+      </w:pPr>
+      <w:r>
+        <w:rPr>
+          <w:iCs/>
+        </w:rPr>
+        <w:t>There is a demo</w:t>
+      </w:r>
+    </w:p>
+    <w:p>
+      <w:pPr>
         <w:rPr>
           <w:b/>
           <w:bCs/>
           <w:iCs/>
         </w:rPr>
-        <w:t>mutmut</w:t>
-      </w:r>
-      <w:proofErr w:type="spellEnd"/>
+      </w:pPr>
       <w:r>
         <w:rPr>
           <w:b/>
           <w:bCs/>
           <w:iCs/>
         </w:rPr>
-        <w:t xml:space="preserve"> on requests: </w:t>
-      </w:r>
-    </w:p>
-    <w:p>
-      <w:pPr>
-        <w:rPr>
-          <w:iCs/>
-        </w:rPr>
-      </w:pPr>
-      <w:r>
-        <w:rPr>
-          <w:iCs/>
-        </w:rPr>
-        <w:t>Running mutation testing</w:t>
-      </w:r>
-    </w:p>
-    <w:p>
-      <w:pPr>
-        <w:rPr>
-          <w:iCs/>
-        </w:rPr>
-      </w:pPr>
-      <w:r>
-        <w:rPr>
-          <w:rFonts w:ascii="Segoe UI Symbol" w:hAnsi="Segoe UI Symbol" w:cs="Segoe UI Symbol"/>
-          <w:iCs/>
-        </w:rPr>
-        <w:t>⠧</w:t>
-      </w:r>
-      <w:r>
-        <w:rPr>
-          <w:iCs/>
-        </w:rPr>
-        <w:t xml:space="preserve"> 3673/</w:t>
-      </w:r>
-      <w:proofErr w:type="gramStart"/>
-      <w:r>
-        <w:rPr>
-          <w:iCs/>
-        </w:rPr>
-        <w:t xml:space="preserve">3673  </w:t>
-      </w:r>
-      <w:r>
-        <w:rPr>
-          <w:rFonts w:ascii="Segoe UI Emoji" w:hAnsi="Segoe UI Emoji" w:cs="Segoe UI Emoji"/>
-          <w:iCs/>
-        </w:rPr>
-        <w:t>🎉</w:t>
-      </w:r>
-      <w:proofErr w:type="gramEnd"/>
-      <w:r>
-        <w:rPr>
-          <w:iCs/>
-        </w:rPr>
-        <w:t xml:space="preserve"> 2241 </w:t>
-      </w:r>
-      <w:r>
-        <w:rPr>
-          <w:rFonts w:ascii="Aptos" w:hAnsi="Aptos" w:cs="Aptos"/>
-          <w:iCs/>
-        </w:rPr>
-        <w:t>🫥</w:t>
-      </w:r>
-      <w:r>
-        <w:rPr>
-          <w:iCs/>
-        </w:rPr>
-        <w:t xml:space="preserve"> 337  </w:t>
-      </w:r>
-      <w:r>
-        <w:rPr>
-          <w:rFonts w:ascii="Segoe UI Emoji" w:hAnsi="Segoe UI Emoji" w:cs="Segoe UI Emoji"/>
-          <w:iCs/>
-        </w:rPr>
-        <w:t>⏰</w:t>
-      </w:r>
-      <w:r>
-        <w:rPr>
-          <w:iCs/>
-        </w:rPr>
-        <w:t xml:space="preserve"> 453  </w:t>
-      </w:r>
-      <w:r>
-        <w:rPr>
-          <w:rFonts w:ascii="Segoe UI Emoji" w:hAnsi="Segoe UI Emoji" w:cs="Segoe UI Emoji"/>
-          <w:iCs/>
-        </w:rPr>
-        <w:t>🤔</w:t>
-      </w:r>
-      <w:r>
-        <w:rPr>
-          <w:iCs/>
-        </w:rPr>
-        <w:t xml:space="preserve"> 0  </w:t>
-      </w:r>
-      <w:r>
-        <w:rPr>
-          <w:rFonts w:ascii="Segoe UI Emoji" w:hAnsi="Segoe UI Emoji" w:cs="Segoe UI Emoji"/>
-          <w:iCs/>
-        </w:rPr>
-        <w:t>🙁</w:t>
-      </w:r>
-      <w:r>
-        <w:rPr>
-          <w:iCs/>
-        </w:rPr>
-        <w:t xml:space="preserve"> 642  </w:t>
-      </w:r>
-      <w:r>
-        <w:rPr>
-          <w:rFonts w:ascii="Segoe UI Emoji" w:hAnsi="Segoe UI Emoji" w:cs="Segoe UI Emoji"/>
-          <w:iCs/>
-        </w:rPr>
-        <w:t>🔇</w:t>
-      </w:r>
-      <w:r>
-        <w:rPr>
-          <w:iCs/>
-        </w:rPr>
-        <w:t xml:space="preserve"> 0</w:t>
-      </w:r>
-    </w:p>
-    <w:p>
-      <w:pPr>
-        <w:rPr>
-          <w:iCs/>
-        </w:rPr>
-      </w:pPr>
-      <w:r>
-        <w:rPr>
-          <w:iCs/>
-        </w:rPr>
-        <w:t>Mutants identified: 347/1449</w:t>
-      </w:r>
-      <w:r>
-        <w:rPr>
-          <w:iCs/>
-        </w:rPr>
-        <w:t xml:space="preserve"> – not sure why not all mutants were hit</w:t>
-      </w:r>
-    </w:p>
-    <w:p>
-      <w:pPr>
-        <w:rPr>
-          <w:iCs/>
-        </w:rPr>
-      </w:pPr>
-      <w:r>
-        <w:rPr>
-          <w:iCs/>
-        </w:rPr>
-        <w:t>Completed in 13372.785392045975 seconds.</w:t>
-      </w:r>
-      <w:r>
-        <w:rPr>
-          <w:iCs/>
-        </w:rPr>
-        <w:t xml:space="preserve"> (3.7 hrs)</w:t>
-      </w:r>
-    </w:p>
-    <w:p>
-      <w:pPr>
-        <w:rPr>
-          <w:iCs/>
-        </w:rPr>
-      </w:pPr>
-      <w:r>
-        <w:rPr>
-          <w:iCs/>
-        </w:rPr>
-        <w:t>Changed it to include class methods</w:t>
-      </w:r>
-    </w:p>
-    <w:p>
-      <w:pPr>
-        <w:rPr>
-          <w:iCs/>
-        </w:rPr>
-      </w:pPr>
-      <w:r>
-        <w:rPr>
-          <w:iCs/>
-        </w:rPr>
-        <w:t>Mutants identified: 200/4467</w:t>
-      </w:r>
-    </w:p>
-    <w:p>
-      <w:pPr>
-        <w:rPr>
-          <w:iCs/>
-        </w:rPr>
-      </w:pPr>
-      <w:r>
-        <w:rPr>
-          <w:iCs/>
-        </w:rPr>
-        <w:t>Completed in 45184.606248140335 seconds.</w:t>
-      </w:r>
-      <w:r>
-        <w:rPr>
-          <w:iCs/>
-        </w:rPr>
-        <w:t xml:space="preserve"> (12.5hrs)</w:t>
-      </w:r>
-    </w:p>
-    <w:p>
-      <w:pPr>
-        <w:rPr>
-          <w:iCs/>
-        </w:rPr>
-      </w:pPr>
-      <w:r>
-        <w:rPr>
-          <w:iCs/>
-        </w:rPr>
-        <w:t>Somehow less mutants and more methods??</w:t>
-      </w:r>
-    </w:p>
-    <w:p>
-      <w:pPr>
-        <w:rPr>
-          <w:iCs/>
-        </w:rPr>
-      </w:pPr>
-    </w:p>
-    <w:p>
-      <w:pPr>
-        <w:rPr>
-          <w:iCs/>
-        </w:rPr>
-      </w:pPr>
-      <w:r>
-        <w:rPr>
-          <w:iCs/>
-        </w:rPr>
-        <w:t xml:space="preserve">After adding </w:t>
-      </w:r>
-      <w:proofErr w:type="gramStart"/>
-      <w:r>
-        <w:rPr>
-          <w:iCs/>
-        </w:rPr>
-        <w:t>class based</w:t>
-      </w:r>
-      <w:proofErr w:type="gramEnd"/>
-      <w:r>
-        <w:rPr>
-          <w:iCs/>
-        </w:rPr>
-        <w:t xml:space="preserve"> stuff</w:t>
-      </w:r>
-    </w:p>
-    <w:p>
-      <w:pPr>
-        <w:rPr>
-          <w:iCs/>
-        </w:rPr>
-      </w:pPr>
-      <w:r>
-        <w:rPr>
-          <w:iCs/>
-        </w:rPr>
-        <w:t>Mutants identified: 917/4467</w:t>
-      </w:r>
-      <w:r>
-        <w:rPr>
-          <w:iCs/>
-        </w:rPr>
-        <w:t xml:space="preserve"> in 6.8 hrs (but I suspect this may be over eager)</w:t>
-      </w:r>
-    </w:p>
-    <w:p>
-      <w:pPr>
-        <w:rPr>
-          <w:iCs/>
-        </w:rPr>
-      </w:pPr>
-    </w:p>
-    <w:p>
-      <w:pPr>
-        <w:rPr>
-          <w:iCs/>
-        </w:rPr>
-      </w:pPr>
-      <w:r>
-        <w:rPr>
-          <w:iCs/>
-        </w:rPr>
-        <w:t>Ran it on a library of data structures:</w:t>
-      </w:r>
-    </w:p>
-    <w:p>
-      <w:pPr>
-        <w:rPr>
-          <w:iCs/>
-        </w:rPr>
-      </w:pPr>
-      <w:r>
-        <w:rPr>
-          <w:iCs/>
-        </w:rPr>
-        <w:t>https://github.com/clair3st/Data-Structures/tree/master</w:t>
-      </w:r>
-    </w:p>
-    <w:p>
-      <w:pPr>
-        <w:rPr>
-          <w:iCs/>
-        </w:rPr>
-      </w:pPr>
-      <w:r>
-        <w:rPr>
-          <w:rFonts w:ascii="Segoe UI Symbol" w:hAnsi="Segoe UI Symbol" w:cs="Segoe UI Symbol"/>
-          <w:iCs/>
-        </w:rPr>
-        <w:t>⠸</w:t>
-      </w:r>
-      <w:r>
-        <w:rPr>
-          <w:iCs/>
-        </w:rPr>
-        <w:t xml:space="preserve"> 445/</w:t>
-      </w:r>
-      <w:proofErr w:type="gramStart"/>
-      <w:r>
-        <w:rPr>
-          <w:iCs/>
-        </w:rPr>
-        <w:t xml:space="preserve">445  </w:t>
-      </w:r>
-      <w:r>
-        <w:rPr>
-          <w:rFonts w:ascii="Segoe UI Emoji" w:hAnsi="Segoe UI Emoji" w:cs="Segoe UI Emoji"/>
-          <w:iCs/>
-        </w:rPr>
-        <w:t>🎉</w:t>
-      </w:r>
-      <w:proofErr w:type="gramEnd"/>
-      <w:r>
-        <w:rPr>
-          <w:iCs/>
-        </w:rPr>
-        <w:t xml:space="preserve"> 383 </w:t>
-      </w:r>
-      <w:r>
-        <w:rPr>
-          <w:rFonts w:ascii="Aptos" w:hAnsi="Aptos" w:cs="Aptos"/>
-          <w:iCs/>
-        </w:rPr>
-        <w:t>🫥</w:t>
-      </w:r>
-      <w:r>
-        <w:rPr>
-          <w:iCs/>
-        </w:rPr>
-        <w:t xml:space="preserve"> 4  </w:t>
-      </w:r>
-      <w:r>
-        <w:rPr>
-          <w:rFonts w:ascii="Segoe UI Emoji" w:hAnsi="Segoe UI Emoji" w:cs="Segoe UI Emoji"/>
-          <w:iCs/>
-        </w:rPr>
-        <w:t>⏰</w:t>
-      </w:r>
-      <w:r>
-        <w:rPr>
-          <w:iCs/>
-        </w:rPr>
-        <w:t xml:space="preserve"> 10  </w:t>
-      </w:r>
-      <w:r>
-        <w:rPr>
-          <w:rFonts w:ascii="Segoe UI Emoji" w:hAnsi="Segoe UI Emoji" w:cs="Segoe UI Emoji"/>
-          <w:iCs/>
-        </w:rPr>
-        <w:t>🤔</w:t>
-      </w:r>
-      <w:r>
-        <w:rPr>
-          <w:iCs/>
-        </w:rPr>
-        <w:t xml:space="preserve"> 0  </w:t>
-      </w:r>
-      <w:r>
-        <w:rPr>
-          <w:rFonts w:ascii="Segoe UI Emoji" w:hAnsi="Segoe UI Emoji" w:cs="Segoe UI Emoji"/>
-          <w:iCs/>
-        </w:rPr>
-        <w:t>🙁</w:t>
-      </w:r>
-      <w:r>
-        <w:rPr>
-          <w:iCs/>
-        </w:rPr>
-        <w:t xml:space="preserve"> 48  </w:t>
-      </w:r>
-      <w:r>
-        <w:rPr>
-          <w:rFonts w:ascii="Segoe UI Emoji" w:hAnsi="Segoe UI Emoji" w:cs="Segoe UI Emoji"/>
-          <w:iCs/>
-        </w:rPr>
-        <w:t>🔇</w:t>
-      </w:r>
-      <w:r>
-        <w:rPr>
-          <w:iCs/>
-        </w:rPr>
-        <w:t xml:space="preserve"> 0</w:t>
-      </w:r>
-    </w:p>
-    <w:p>
-      <w:pPr>
-        <w:rPr>
-          <w:iCs/>
-        </w:rPr>
-      </w:pPr>
-      <w:r>
-        <w:rPr>
-          <w:iCs/>
-        </w:rPr>
-        <w:t>11</w:t>
-      </w:r>
-      <w:r>
-        <w:rPr>
-          <w:iCs/>
-        </w:rPr>
-        <w:t>8/445</w:t>
-      </w:r>
-    </w:p>
-    <w:p>
-      <w:pPr>
-        <w:rPr>
-          <w:iCs/>
-        </w:rPr>
-      </w:pPr>
-      <w:r>
-        <w:rPr>
-          <w:iCs/>
-        </w:rPr>
-        <w:t xml:space="preserve">270/445 after adding more </w:t>
-      </w:r>
-      <w:proofErr w:type="gramStart"/>
-      <w:r>
-        <w:rPr>
-          <w:iCs/>
-        </w:rPr>
-        <w:t>class based</w:t>
-      </w:r>
-      <w:proofErr w:type="gramEnd"/>
-      <w:r>
-        <w:rPr>
-          <w:iCs/>
-        </w:rPr>
-        <w:t xml:space="preserve"> stuff</w:t>
-      </w:r>
-    </w:p>
-    <w:p>
-      <w:pPr>
-        <w:rPr>
-          <w:iCs/>
-        </w:rPr>
-      </w:pPr>
-    </w:p>
-    <w:p>
-      <w:pPr>
-        <w:rPr>
-          <w:iCs/>
-        </w:rPr>
-      </w:pPr>
-      <w:r>
-        <w:rPr>
-          <w:iCs/>
-        </w:rPr>
-        <w:t xml:space="preserve">With the following addition to </w:t>
-      </w:r>
-      <w:proofErr w:type="spellStart"/>
-      <w:proofErr w:type="gramStart"/>
-      <w:r>
-        <w:rPr>
-          <w:iCs/>
-        </w:rPr>
-        <w:t>pyproject.toml</w:t>
-      </w:r>
-      <w:proofErr w:type="spellEnd"/>
-      <w:proofErr w:type="gramEnd"/>
-    </w:p>
-    <w:p>
-      <w:pPr>
-        <w:rPr>
-          <w:iCs/>
-        </w:rPr>
-      </w:pPr>
-      <w:r>
-        <w:rPr>
-          <w:iCs/>
-        </w:rPr>
-        <w:t>[</w:t>
-      </w:r>
-      <w:proofErr w:type="spellStart"/>
-      <w:proofErr w:type="gramStart"/>
-      <w:r>
-        <w:rPr>
-          <w:iCs/>
-        </w:rPr>
-        <w:t>tool.mutmut</w:t>
-      </w:r>
-      <w:proofErr w:type="spellEnd"/>
-      <w:proofErr w:type="gramEnd"/>
-      <w:r>
-        <w:rPr>
-          <w:iCs/>
-        </w:rPr>
-        <w:t>]</w:t>
-      </w:r>
-      <w:r>
-        <w:rPr>
-          <w:iCs/>
-        </w:rPr>
-        <w:br/>
-      </w:r>
-      <w:proofErr w:type="spellStart"/>
-      <w:r>
-        <w:rPr>
-          <w:iCs/>
-        </w:rPr>
-        <w:t>pytest_add_cli_args</w:t>
-      </w:r>
-      <w:proofErr w:type="spellEnd"/>
-      <w:r>
-        <w:rPr>
-          <w:iCs/>
-        </w:rPr>
-        <w:t xml:space="preserve"> = ["-k", "not </w:t>
-      </w:r>
-      <w:proofErr w:type="spellStart"/>
-      <w:r>
-        <w:rPr>
-          <w:iCs/>
-        </w:rPr>
-        <w:t>test_env_cert_bundles</w:t>
-      </w:r>
-      <w:proofErr w:type="spellEnd"/>
-      <w:r>
-        <w:rPr>
-          <w:iCs/>
-        </w:rPr>
-        <w:t xml:space="preserve"> and not test_different_connection_pool_for_tls_settings_verify_bundle_unexpired_cert"]</w:t>
-      </w:r>
-    </w:p>
-    <w:p>
-      <w:pPr>
-        <w:rPr>
-          <w:iCs/>
-        </w:rPr>
-      </w:pPr>
-    </w:p>
-    <w:p>
-      <w:pPr>
-        <w:rPr>
-          <w:iCs/>
-        </w:rPr>
-      </w:pPr>
-      <w:r>
-        <w:rPr>
-          <w:iCs/>
-        </w:rPr>
-        <w:t>Additions:</w:t>
-      </w:r>
-    </w:p>
-    <w:p>
-      <w:pPr>
-        <w:rPr>
-          <w:iCs/>
-        </w:rPr>
-      </w:pPr>
-      <w:r>
-        <w:rPr>
-          <w:iCs/>
-        </w:rPr>
-        <w:t>Tested more hobbit suite</w:t>
-      </w:r>
-    </w:p>
-    <w:p>
-      <w:pPr>
-        <w:rPr>
-          <w:iCs/>
-        </w:rPr>
-      </w:pPr>
-      <w:r>
-        <w:rPr>
-          <w:iCs/>
-        </w:rPr>
-        <w:t>Wrote program equivalence</w:t>
-      </w:r>
-    </w:p>
-    <w:p>
-      <w:pPr>
-        <w:rPr>
-          <w:iCs/>
-        </w:rPr>
-      </w:pPr>
-      <w:r>
-        <w:rPr>
-          <w:iCs/>
-        </w:rPr>
-        <w:t>Wrote script to run entire hobbit suite</w:t>
-      </w:r>
-    </w:p>
-    <w:p>
-      <w:pPr>
-        <w:rPr>
-          <w:iCs/>
-        </w:rPr>
-      </w:pPr>
-      <w:r>
-        <w:rPr>
-          <w:iCs/>
-        </w:rPr>
-        <w:t xml:space="preserve">Functions can </w:t>
-      </w:r>
-      <w:proofErr w:type="gramStart"/>
-      <w:r>
-        <w:rPr>
-          <w:iCs/>
-        </w:rPr>
-        <w:t>alter  global</w:t>
-      </w:r>
-      <w:proofErr w:type="gramEnd"/>
-      <w:r>
-        <w:rPr>
-          <w:iCs/>
-        </w:rPr>
-        <w:t xml:space="preserve"> state</w:t>
-      </w:r>
-    </w:p>
-    <w:p>
-      <w:pPr>
-        <w:rPr>
-          <w:iCs/>
-        </w:rPr>
-      </w:pPr>
-      <w:r>
-        <w:rPr>
-          <w:iCs/>
-        </w:rPr>
-        <w:t>Mutation testing stuff</w:t>
-      </w:r>
-    </w:p>
-    <w:p>
-      <w:pPr>
-        <w:rPr>
-          <w:iCs/>
-        </w:rPr>
-      </w:pPr>
-    </w:p>
-    <w:p>
-      <w:pPr>
-        <w:rPr>
-          <w:iCs/>
-        </w:rPr>
-      </w:pPr>
-      <w:r>
-        <w:rPr>
-          <w:iCs/>
-        </w:rPr>
-        <w:t>Questions:</w:t>
-      </w:r>
-    </w:p>
-    <w:p>
-      <w:pPr>
-        <w:rPr>
-          <w:iCs/>
-        </w:rPr>
-      </w:pPr>
-      <w:r>
-        <w:rPr>
-          <w:iCs/>
-        </w:rPr>
-        <w:t xml:space="preserve">What do I say about translating hobbit to python in the thesis? That I used </w:t>
-      </w:r>
-      <w:proofErr w:type="spellStart"/>
-      <w:r>
-        <w:rPr>
-          <w:iCs/>
-        </w:rPr>
-        <w:t>gpt</w:t>
-      </w:r>
-      <w:proofErr w:type="spellEnd"/>
-      <w:r>
-        <w:rPr>
-          <w:iCs/>
-        </w:rPr>
-        <w:t>?</w:t>
-      </w:r>
-    </w:p>
-    <w:p>
-      <w:pPr>
-        <w:rPr>
-          <w:iCs/>
-        </w:rPr>
-      </w:pPr>
-      <w:r>
-        <w:rPr>
-          <w:iCs/>
-        </w:rPr>
-        <w:t>Yes. Include sample prompts with responses</w:t>
-      </w:r>
-    </w:p>
-    <w:p>
-      <w:pPr>
-        <w:rPr>
-          <w:iCs/>
-        </w:rPr>
-      </w:pPr>
-      <w:r>
-        <w:rPr>
-          <w:iCs/>
-        </w:rPr>
-        <w:t xml:space="preserve">How do I treat two programs where 1 has global state and the other </w:t>
-      </w:r>
-      <w:proofErr w:type="spellStart"/>
-      <w:r>
-        <w:rPr>
-          <w:iCs/>
-        </w:rPr>
-        <w:t>doesnt</w:t>
-      </w:r>
-      <w:proofErr w:type="spellEnd"/>
-    </w:p>
-    <w:p>
-      <w:pPr>
-        <w:rPr>
-          <w:iCs/>
-        </w:rPr>
-      </w:pPr>
-    </w:p>
-    <w:p>
-      <w:pPr>
-        <w:rPr>
-          <w:iCs/>
-        </w:rPr>
-      </w:pPr>
-      <w:r>
-        <w:rPr>
-          <w:iCs/>
-        </w:rPr>
-        <w:t>The trace is from the perspective of the observer</w:t>
-      </w:r>
-    </w:p>
-    <w:p>
-      <w:pPr>
-        <w:rPr>
-          <w:iCs/>
-        </w:rPr>
-      </w:pPr>
-      <w:r>
-        <w:rPr>
-          <w:iCs/>
-        </w:rPr>
-        <w:t xml:space="preserve">We </w:t>
-      </w:r>
-      <w:proofErr w:type="spellStart"/>
-      <w:proofErr w:type="gramStart"/>
-      <w:r>
-        <w:rPr>
-          <w:iCs/>
-        </w:rPr>
-        <w:t>cant</w:t>
-      </w:r>
-      <w:proofErr w:type="spellEnd"/>
-      <w:proofErr w:type="gramEnd"/>
-      <w:r>
-        <w:rPr>
-          <w:iCs/>
-        </w:rPr>
-        <w:t xml:space="preserve"> see internal recursion</w:t>
-      </w:r>
-    </w:p>
-    <w:p>
-      <w:pPr>
-        <w:rPr>
-          <w:iCs/>
-        </w:rPr>
-      </w:pPr>
-      <w:r>
-        <w:rPr>
-          <w:iCs/>
-        </w:rPr>
-        <w:t>If function returns function, observer can call that function maybe</w:t>
-      </w:r>
-    </w:p>
-    <w:p>
-      <w:pPr>
-        <w:rPr>
-          <w:iCs/>
-        </w:rPr>
-      </w:pPr>
-      <w:proofErr w:type="spellStart"/>
-      <w:r>
-        <w:rPr>
-          <w:iCs/>
-        </w:rPr>
-        <w:t>Reentrancy</w:t>
-      </w:r>
-      <w:proofErr w:type="spellEnd"/>
-      <w:r>
-        <w:rPr>
-          <w:iCs/>
-        </w:rPr>
-        <w:t xml:space="preserve">. </w:t>
-      </w:r>
-    </w:p>
-    <w:p>
-      <w:pPr>
-        <w:rPr>
-          <w:iCs/>
-        </w:rPr>
-      </w:pPr>
-      <w:r>
-        <w:rPr>
-          <w:iCs/>
-        </w:rPr>
-        <w:t xml:space="preserve">Function can make a choice between all </w:t>
-      </w:r>
-      <w:proofErr w:type="spellStart"/>
-      <w:r>
-        <w:rPr>
-          <w:iCs/>
-        </w:rPr>
-        <w:t>funcs</w:t>
-      </w:r>
-      <w:proofErr w:type="spellEnd"/>
-      <w:r>
-        <w:rPr>
-          <w:iCs/>
-        </w:rPr>
-        <w:t xml:space="preserve"> it knows</w:t>
-      </w:r>
-    </w:p>
-    <w:p>
-      <w:pPr>
-        <w:rPr>
-          <w:iCs/>
-        </w:rPr>
-      </w:pPr>
-      <w:r>
-        <w:rPr>
-          <w:iCs/>
-        </w:rPr>
-        <w:t>Maybe make observers store return values received in sequence</w:t>
-      </w:r>
-    </w:p>
-    <w:p>
-      <w:pPr>
-        <w:rPr>
-          <w:iCs/>
-        </w:rPr>
-      </w:pPr>
-      <w:r>
-        <w:rPr>
-          <w:iCs/>
-        </w:rPr>
-        <w:t>F can write a stream to a file</w:t>
-      </w:r>
-    </w:p>
-    <w:p>
-      <w:pPr>
-        <w:rPr>
-          <w:iCs/>
-        </w:rPr>
-      </w:pPr>
-      <w:proofErr w:type="gramStart"/>
-      <w:r>
-        <w:rPr>
-          <w:iCs/>
-        </w:rPr>
-        <w:t>Have to</w:t>
-      </w:r>
-      <w:proofErr w:type="gramEnd"/>
-      <w:r>
-        <w:rPr>
-          <w:iCs/>
-        </w:rPr>
-        <w:t xml:space="preserve"> retranslate hobbit suite</w:t>
-      </w:r>
-    </w:p>
-    <w:p>
-      <w:pPr>
-        <w:rPr>
-          <w:iCs/>
-        </w:rPr>
-      </w:pPr>
-      <w:r>
-        <w:rPr>
-          <w:iCs/>
-        </w:rPr>
-        <w:t xml:space="preserve">Currently, catch </w:t>
-      </w:r>
-      <w:r>
-        <w:rPr>
-          <w:iCs/>
-        </w:rPr>
-        <w:t>41-47</w:t>
-      </w:r>
-      <w:r>
-        <w:rPr>
-          <w:iCs/>
-        </w:rPr>
-        <w:t>/79 from hobbit suite</w:t>
-      </w:r>
-      <w:r>
-        <w:rPr>
-          <w:iCs/>
-        </w:rPr>
-        <w:t xml:space="preserve"> in 14-17 mins</w:t>
-      </w:r>
-    </w:p>
-    <w:p>
-      <w:pPr>
-        <w:rPr>
-          <w:iCs/>
-        </w:rPr>
-      </w:pPr>
-      <w:r>
-        <w:rPr>
-          <w:iCs/>
-        </w:rPr>
-        <w:t>Need to check if input arguments get mutated</w:t>
-      </w:r>
-    </w:p>
-    <w:p>
-      <w:pPr>
-        <w:rPr>
-          <w:iCs/>
-        </w:rPr>
-      </w:pPr>
-      <w:r>
-        <w:rPr>
-          <w:iCs/>
-        </w:rPr>
-        <w:t>There is a demo</w:t>
-      </w:r>
-    </w:p>
-    <w:p>
-      <w:pPr>
+        <w:t>Check on cross_reentrancy_param</w:t>
+      </w:r>
+    </w:p>
+    <w:p>
+      <w:pPr>
+        <w:rPr>
+          <w:iCs/>
+        </w:rPr>
+      </w:pPr>
+      <w:r>
+        <w:rPr>
+          <w:iCs/>
+        </w:rPr>
+        <w:t xml:space="preserve">Added functionality that if a higher order function returns a </w:t>
+      </w:r>
+      <w:r>
         <w:rPr>
           <w:b/>
           <w:bCs/>
           <w:iCs/>
         </w:rPr>
-      </w:pPr>
-      <w:r>
+        <w:t>tuple</w:t>
+      </w:r>
+      <w:r>
+        <w:rPr>
+          <w:iCs/>
+        </w:rPr>
+        <w:t xml:space="preserve"> of functions, we interleave the execution of those functions</w:t>
+      </w:r>
+      <w:r>
+        <w:rPr>
+          <w:iCs/>
+        </w:rPr>
+        <w:t xml:space="preserve">. </w:t>
+      </w:r>
+    </w:p>
+    <w:p>
+      <w:pPr>
+        <w:rPr>
+          <w:iCs/>
+        </w:rPr>
+      </w:pPr>
+      <w:r>
+        <w:rPr>
+          <w:iCs/>
+        </w:rPr>
+        <w:t>Added functionality that if a higher order function takes a callable parameter, and then calls that callable parameter passing in multiple functions as arguments to that callable parameter, then that callable parameter can interleave the execution of the functions it is given</w:t>
+      </w:r>
+    </w:p>
+    <w:p>
+      <w:pPr>
+        <w:rPr>
+          <w:iCs/>
+        </w:rPr>
+      </w:pPr>
+      <w:r>
+        <w:rPr>
+          <w:iCs/>
+        </w:rPr>
+        <w:lastRenderedPageBreak/>
+        <w:t xml:space="preserve">Curried interaction plan: </w:t>
+      </w:r>
+    </w:p>
+    <w:p>
+      <w:pPr>
+        <w:rPr>
+          <w:iCs/>
+        </w:rPr>
+      </w:pPr>
+      <w:r>
+        <w:rPr>
+          <w:iCs/>
+        </w:rPr>
+        <w:t xml:space="preserve">For combiner-style HOFs, </w:t>
+      </w:r>
+    </w:p>
+    <w:p>
+      <w:pPr>
         <w:rPr>
           <w:b/>
           <w:bCs/>
           <w:iCs/>
         </w:rPr>
-        <w:t xml:space="preserve">Check on </w:t>
-      </w:r>
-      <w:proofErr w:type="spellStart"/>
-      <w:r>
-        <w:rPr>
-          <w:b/>
-          <w:bCs/>
-          <w:iCs/>
-        </w:rPr>
-        <w:t>cross_reentrancy_param</w:t>
-      </w:r>
-      <w:proofErr w:type="spellEnd"/>
-    </w:p>
-    <w:p>
-      <w:pPr>
-        <w:rPr>
-          <w:iCs/>
-        </w:rPr>
-      </w:pPr>
-      <w:r>
-        <w:rPr>
-          <w:iCs/>
-        </w:rPr>
-        <w:t xml:space="preserve">Added functionality that if a higher order function returns a </w:t>
-      </w:r>
-      <w:r>
-        <w:rPr>
-          <w:b/>
-          <w:bCs/>
-          <w:iCs/>
-        </w:rPr>
-        <w:t>tuple</w:t>
-      </w:r>
-      <w:r>
-        <w:rPr>
-          <w:iCs/>
-        </w:rPr>
-        <w:t xml:space="preserve"> of functions, we interleave the execution of those functions</w:t>
-      </w:r>
-      <w:r>
-        <w:rPr>
-          <w:iCs/>
-        </w:rPr>
-        <w:t xml:space="preserve">. </w:t>
-      </w:r>
-    </w:p>
-    <w:p>
-      <w:pPr>
-        <w:rPr>
-          <w:iCs/>
-        </w:rPr>
-      </w:pPr>
-      <w:r>
-        <w:rPr>
-          <w:iCs/>
-        </w:rPr>
-        <w:t xml:space="preserve">Added functionality that if a higher order function takes a callable parameter, and then calls that callable parameter passing in multiple functions as arguments to that callable </w:t>
-      </w:r>
-      <w:r>
-        <w:rPr>
-          <w:iCs/>
-        </w:rPr>
-        <w:lastRenderedPageBreak/>
-        <w:t>parameter, then that callable parameter can interleave the execution of the functions it is given</w:t>
-      </w:r>
-    </w:p>
-    <w:p>
-      <w:pPr>
-        <w:rPr>
-          <w:iCs/>
-        </w:rPr>
-      </w:pPr>
-      <w:r>
-        <w:rPr>
-          <w:iCs/>
-        </w:rPr>
-        <w:t xml:space="preserve">Curried interaction plan: </w:t>
-      </w:r>
-    </w:p>
-    <w:p>
-      <w:pPr>
-        <w:rPr>
-          <w:iCs/>
-        </w:rPr>
-      </w:pPr>
-      <w:r>
-        <w:rPr>
-          <w:iCs/>
-        </w:rPr>
-        <w:t xml:space="preserve">For combiner-style HOFs, </w:t>
-      </w:r>
-    </w:p>
-    <w:p>
-      <w:pPr>
-        <w:rPr>
-          <w:b/>
-          <w:bCs/>
-          <w:iCs/>
-        </w:rPr>
       </w:pPr>
     </w:p>
     <w:p>
@@ -3645,63 +2365,73 @@
         <w:rPr>
           <w:iCs/>
         </w:rPr>
-        <w:t xml:space="preserve">Seemingly obvious bugs might be overlooked. For bsearch_1, the failing input is 2. Even if I add an int type annotation, the </w:t>
-      </w:r>
-      <w:proofErr w:type="spellStart"/>
-      <w:r>
-        <w:rPr>
-          <w:iCs/>
-        </w:rPr>
-        <w:t>fuzzer</w:t>
-      </w:r>
-      <w:proofErr w:type="spellEnd"/>
-      <w:r>
-        <w:rPr>
-          <w:iCs/>
-        </w:rPr>
-        <w:t xml:space="preserve"> can fully fail to discover the bug because it never tried 2, it tried thousands of other numbers but not 2. Highlights a weakness of coverage-</w:t>
-      </w:r>
-      <w:proofErr w:type="spellStart"/>
-      <w:r>
-        <w:rPr>
-          <w:iCs/>
-        </w:rPr>
-        <w:t>guidedness</w:t>
-      </w:r>
-      <w:proofErr w:type="spellEnd"/>
-      <w:r>
-        <w:rPr>
-          <w:iCs/>
-        </w:rPr>
-        <w:t xml:space="preserve"> in a function </w:t>
-      </w:r>
-      <w:proofErr w:type="gramStart"/>
-      <w:r>
-        <w:rPr>
-          <w:iCs/>
-        </w:rPr>
-        <w:t>where</w:t>
-      </w:r>
-      <w:proofErr w:type="gramEnd"/>
-      <w:r>
-        <w:rPr>
-          <w:iCs/>
-        </w:rPr>
-        <w:t xml:space="preserve"> coverage </w:t>
-      </w:r>
-      <w:proofErr w:type="spellStart"/>
-      <w:r>
-        <w:rPr>
-          <w:iCs/>
-        </w:rPr>
-        <w:t>wont</w:t>
-      </w:r>
-      <w:proofErr w:type="spellEnd"/>
-      <w:r>
-        <w:rPr>
-          <w:iCs/>
-        </w:rPr>
-        <w:t xml:space="preserve"> change meaningfully</w:t>
+        <w:t>Seemingly obvious bugs might be overlooked. For bsearch_1, the failing input is 2. Even if I add an int type annotation, the fuzzer can fully fail to discover the bug because it never tried 2, it tried thousands of other numbers but not 2. Highlights a weakness of coverage-guidedness in a function where coverage wont change meaningfully</w:t>
+      </w:r>
+    </w:p>
+    <w:p>
+      <w:pPr>
+        <w:rPr>
+          <w:iCs/>
+        </w:rPr>
+      </w:pPr>
+    </w:p>
+    <w:p>
+      <w:pPr>
+        <w:rPr>
+          <w:iCs/>
+        </w:rPr>
+      </w:pPr>
+      <w:r>
+        <w:rPr>
+          <w:iCs/>
+        </w:rPr>
+        <w:t>Added ability for fuzzer to handle functions that take objects of custom classes as arguments but only if the argument is type annotation.</w:t>
+      </w:r>
+    </w:p>
+    <w:p>
+      <w:pPr>
+        <w:rPr>
+          <w:iCs/>
+        </w:rPr>
+      </w:pPr>
+      <w:r>
+        <w:rPr>
+          <w:iCs/>
+        </w:rPr>
+        <w:t>Improved ability to use type annotations, specifically we can now create containers of callables from type annotations</w:t>
+      </w:r>
+    </w:p>
+    <w:p>
+      <w:pPr>
+        <w:rPr>
+          <w:iCs/>
+        </w:rPr>
+      </w:pPr>
+    </w:p>
+    <w:p>
+      <w:pPr>
+        <w:rPr>
+          <w:iCs/>
+        </w:rPr>
+      </w:pPr>
+      <w:r>
+        <w:rPr>
+          <w:iCs/>
+        </w:rPr>
+        <w:t>Need to add functionality for:</w:t>
+      </w:r>
+    </w:p>
+    <w:p>
+      <w:pPr>
+        <w:rPr>
+          <w:iCs/>
+        </w:rPr>
+      </w:pPr>
+      <w:r>
+        <w:rPr>
+          <w:iCs/>
+        </w:rPr>
+        <w:t xml:space="preserve">Function that </w:t>
       </w:r>
     </w:p>
     <w:p/>

</xml_diff>

<commit_message>
Add more equiv test cases
</commit_message>
<xml_diff>
--- a/Masters project notes.docx
+++ b/Masters project notes.docx
@@ -53,11 +53,19 @@
           <w:lang w:val="fr-FR"/>
         </w:rPr>
       </w:pPr>
+      <w:proofErr w:type="spellStart"/>
       <w:r>
         <w:rPr>
           <w:lang w:val="fr-FR"/>
         </w:rPr>
-        <w:t xml:space="preserve">Pythonfuzz </w:t>
+        <w:t>Pythonfuzz</w:t>
+      </w:r>
+      <w:proofErr w:type="spellEnd"/>
+      <w:r>
+        <w:rPr>
+          <w:lang w:val="fr-FR"/>
+        </w:rPr>
+        <w:t xml:space="preserve"> </w:t>
       </w:r>
       <w:hyperlink r:id="rId6" w:history="1">
         <w:r>
@@ -78,7 +86,15 @@
         </w:numPr>
       </w:pPr>
       <w:r>
-        <w:t>Coverage-guided fuzzer for python</w:t>
+        <w:t xml:space="preserve">Coverage-guided </w:t>
+      </w:r>
+      <w:proofErr w:type="spellStart"/>
+      <w:r>
+        <w:t>fuzzer</w:t>
+      </w:r>
+      <w:proofErr w:type="spellEnd"/>
+      <w:r>
+        <w:t xml:space="preserve"> for python</w:t>
       </w:r>
     </w:p>
     <w:p>
@@ -110,7 +126,15 @@
         </w:numPr>
       </w:pPr>
       <w:r>
-        <w:t>Google’s coverage-guided fuzzer for python</w:t>
+        <w:t xml:space="preserve">Google’s coverage-guided </w:t>
+      </w:r>
+      <w:proofErr w:type="spellStart"/>
+      <w:r>
+        <w:t>fuzzer</w:t>
+      </w:r>
+      <w:proofErr w:type="spellEnd"/>
+      <w:r>
+        <w:t xml:space="preserve"> for python</w:t>
       </w:r>
     </w:p>
     <w:p>
@@ -130,15 +154,28 @@
         </w:rPr>
         <w:t xml:space="preserve">HypoFuzz </w:t>
       </w:r>
-      <w:hyperlink r:id="rId8" w:history="1">
-        <w:r>
-          <w:rPr>
-            <w:rStyle w:val="Hyperlink"/>
-            <w:lang w:val="de-DE"/>
-          </w:rPr>
-          <w:t>https://github.com/Zac-HD/hypofuzz</w:t>
-        </w:r>
-      </w:hyperlink>
+      <w:r>
+        <w:fldChar w:fldCharType="begin"/>
+      </w:r>
+      <w:r>
+        <w:rPr>
+          <w:lang w:val="de-DE"/>
+        </w:rPr>
+        <w:instrText>HYPERLINK "https://github.com/Zac-HD/hypofuzz"</w:instrText>
+      </w:r>
+      <w:r>
+        <w:fldChar w:fldCharType="separate"/>
+      </w:r>
+      <w:r>
+        <w:rPr>
+          <w:rStyle w:val="Hyperlink"/>
+          <w:lang w:val="de-DE"/>
+        </w:rPr>
+        <w:t>https://github.com/Zac-HD/hypofuzz</w:t>
+      </w:r>
+      <w:r>
+        <w:fldChar w:fldCharType="end"/>
+      </w:r>
     </w:p>
     <w:p>
       <w:pPr>
@@ -163,10 +200,15 @@
           <w:numId w:val="1"/>
         </w:numPr>
       </w:pPr>
-      <w:r>
-        <w:t xml:space="preserve">CrossHair </w:t>
-      </w:r>
-      <w:hyperlink r:id="rId9" w:history="1">
+      <w:proofErr w:type="spellStart"/>
+      <w:r>
+        <w:t>CrossHair</w:t>
+      </w:r>
+      <w:proofErr w:type="spellEnd"/>
+      <w:r>
+        <w:t xml:space="preserve"> </w:t>
+      </w:r>
+      <w:hyperlink r:id="rId8" w:history="1">
         <w:r>
           <w:rPr>
             <w:rStyle w:val="Hyperlink"/>
@@ -189,7 +231,39 @@
     </w:p>
     <w:p>
       <w:r>
-        <w:t>From my research, Hypothesis + HypoFuzz seems like it achieves everything that JQF does. Hypothesis is heavily inspired by QuickCheck and gives a property-based testing framework for python. It generates structured inputs and saves failing inputs for reproduction. It operates on the semantic properties of a program, making it inherently semantic-based. It is not coverage-guided by default, so HypoFuzz extends it for coverage-guided exploration thus providing a fuzzing framework.</w:t>
+        <w:t xml:space="preserve">From my research, Hypothesis + </w:t>
+      </w:r>
+      <w:proofErr w:type="spellStart"/>
+      <w:r>
+        <w:t>HypoFuzz</w:t>
+      </w:r>
+      <w:proofErr w:type="spellEnd"/>
+      <w:r>
+        <w:t xml:space="preserve"> seems like it achieves everything that JQF does. Hypothesis is heavily inspired by </w:t>
+      </w:r>
+      <w:proofErr w:type="spellStart"/>
+      <w:r>
+        <w:t>QuickCheck</w:t>
+      </w:r>
+      <w:proofErr w:type="spellEnd"/>
+      <w:r>
+        <w:t xml:space="preserve"> and gives a property-based testing framework for python. It generates structured inputs and saves failing inputs for reproduction. It operates on the semantic properties of a program, making it inherently </w:t>
+      </w:r>
+      <w:proofErr w:type="gramStart"/>
+      <w:r>
+        <w:t>semantic-based</w:t>
+      </w:r>
+      <w:proofErr w:type="gramEnd"/>
+      <w:r>
+        <w:t xml:space="preserve">. It is not coverage-guided by default, so </w:t>
+      </w:r>
+      <w:proofErr w:type="spellStart"/>
+      <w:r>
+        <w:t>HypoFuzz</w:t>
+      </w:r>
+      <w:proofErr w:type="spellEnd"/>
+      <w:r>
+        <w:t xml:space="preserve"> extends it for coverage-guided exploration thus providing a fuzzing framework.</w:t>
       </w:r>
     </w:p>
     <w:p/>
@@ -208,15 +282,28 @@
     </w:p>
     <w:p>
       <w:r>
-        <w:t>Generalise the stack example to any data structure/api</w:t>
-      </w:r>
+        <w:t>Generalise the stack example to any data structure/</w:t>
+      </w:r>
+      <w:proofErr w:type="spellStart"/>
+      <w:r>
+        <w:t>api</w:t>
+      </w:r>
+      <w:proofErr w:type="spellEnd"/>
       <w:r>
         <w:t xml:space="preserve"> that can take any type of arguments.</w:t>
       </w:r>
     </w:p>
     <w:p>
       <w:r>
-        <w:t>At some point, see if you can read the python script, create AST and traverse it in order to create the right test.</w:t>
+        <w:t xml:space="preserve">At some point, see if you can read the python script, create AST and traverse it </w:t>
+      </w:r>
+      <w:proofErr w:type="gramStart"/>
+      <w:r>
+        <w:t>in order to</w:t>
+      </w:r>
+      <w:proofErr w:type="gramEnd"/>
+      <w:r>
+        <w:t xml:space="preserve"> create the right test.</w:t>
       </w:r>
     </w:p>
     <w:p/>
@@ -230,18 +317,58 @@
         <w:t xml:space="preserve">Using it to test a very simple summing function </w:t>
       </w:r>
       <w:r>
-        <w:t>doesn’t work very well. I believe because of how universal is configured and how my two simple functions are configured, atheris is unable to quickly find the erroneous input.</w:t>
-      </w:r>
-    </w:p>
-    <w:p>
-      <w:r>
-        <w:t>I think the fact that fuzz testing is obfuscated inside the universal object the module is unable to correctly perform its algorithms to find erroneous inputs. I vibe coded a hypofuzz universal object and also tried manually implementing one and couldn’t get it to spot any bugs but given more time there may be a way to implement this. Just haven’t figured it out yet.</w:t>
+        <w:t xml:space="preserve">doesn’t work very well. I believe because of how universal is configured and how my two simple functions are configured, </w:t>
+      </w:r>
+      <w:proofErr w:type="spellStart"/>
+      <w:r>
+        <w:t>atheris</w:t>
+      </w:r>
+      <w:proofErr w:type="spellEnd"/>
+      <w:r>
+        <w:t xml:space="preserve"> is unable to quickly find the erroneous input.</w:t>
+      </w:r>
+    </w:p>
+    <w:p>
+      <w:r>
+        <w:t xml:space="preserve">I think the fact that fuzz testing is obfuscated inside the universal object the module is unable to correctly perform its algorithms to find erroneous inputs. I vibe coded a </w:t>
+      </w:r>
+      <w:proofErr w:type="spellStart"/>
+      <w:r>
+        <w:t>hypofuzz</w:t>
+      </w:r>
+      <w:proofErr w:type="spellEnd"/>
+      <w:r>
+        <w:t xml:space="preserve"> universal object </w:t>
+      </w:r>
+      <w:proofErr w:type="gramStart"/>
+      <w:r>
+        <w:t>and also</w:t>
+      </w:r>
+      <w:proofErr w:type="gramEnd"/>
+      <w:r>
+        <w:t xml:space="preserve"> tried manually implementing one and couldn’t get it to spot any bugs but given more time there may be a way to implement this. Just haven’t figured it out yet.</w:t>
       </w:r>
     </w:p>
     <w:p>
       <w:r>
         <w:lastRenderedPageBreak/>
-        <w:t>When comparing two different sorting algorithms, hypofuzz was unable to spot the difference when I added a small condition to quicksort if length is &gt;= 6, return the reversed list. For these one off conditions, coverage guidance actually makes it harder to spot the difference, as they provide very little feedback. Plain hypothesis was able to catch this bug (without coverage guidance)</w:t>
+        <w:t xml:space="preserve">When comparing two different sorting algorithms, </w:t>
+      </w:r>
+      <w:proofErr w:type="spellStart"/>
+      <w:r>
+        <w:t>hypofuzz</w:t>
+      </w:r>
+      <w:proofErr w:type="spellEnd"/>
+      <w:r>
+        <w:t xml:space="preserve"> was unable to spot the difference when I added a small condition to quicksort if length is &gt;= 6, return the reversed list. For these </w:t>
+      </w:r>
+      <w:proofErr w:type="gramStart"/>
+      <w:r>
+        <w:t>one off</w:t>
+      </w:r>
+      <w:proofErr w:type="gramEnd"/>
+      <w:r>
+        <w:t xml:space="preserve"> conditions, coverage guidance actually makes it harder to spot the difference, as they provide very little feedback. Plain hypothesis was able to catch this bug (without coverage guidance)</w:t>
       </w:r>
     </w:p>
     <w:p>
@@ -260,12 +387,57 @@
     </w:p>
     <w:p>
       <w:r>
-        <w:t xml:space="preserve">Testing universal object on two sorting algorithms always results in empty lists as universals value gets set to empty list if len() is called on it. This is bcos if we initialise it as a list of universals, this may be wrong as it may be intended to be a string. </w:t>
-      </w:r>
-    </w:p>
-    <w:p>
-      <w:r>
-        <w:t>Universal needs lt, gt, le, ge operators define</w:t>
+        <w:t xml:space="preserve">Testing universal object on two sorting algorithms always results in empty lists as universals value gets set to empty list if </w:t>
+      </w:r>
+      <w:proofErr w:type="spellStart"/>
+      <w:proofErr w:type="gramStart"/>
+      <w:r>
+        <w:t>len</w:t>
+      </w:r>
+      <w:proofErr w:type="spellEnd"/>
+      <w:r>
+        <w:t>(</w:t>
+      </w:r>
+      <w:proofErr w:type="gramEnd"/>
+      <w:r>
+        <w:t xml:space="preserve">) is called on it. This is </w:t>
+      </w:r>
+      <w:proofErr w:type="spellStart"/>
+      <w:r>
+        <w:t>bcos</w:t>
+      </w:r>
+      <w:proofErr w:type="spellEnd"/>
+      <w:r>
+        <w:t xml:space="preserve"> if we initialise it as a list of universals, this may be wrong as it may be intended to be a string. </w:t>
+      </w:r>
+    </w:p>
+    <w:p>
+      <w:r>
+        <w:t xml:space="preserve">Universal needs </w:t>
+      </w:r>
+      <w:proofErr w:type="spellStart"/>
+      <w:r>
+        <w:t>lt</w:t>
+      </w:r>
+      <w:proofErr w:type="spellEnd"/>
+      <w:r>
+        <w:t xml:space="preserve">, </w:t>
+      </w:r>
+      <w:proofErr w:type="spellStart"/>
+      <w:r>
+        <w:t>gt</w:t>
+      </w:r>
+      <w:proofErr w:type="spellEnd"/>
+      <w:r>
+        <w:t xml:space="preserve">, le, </w:t>
+      </w:r>
+      <w:proofErr w:type="spellStart"/>
+      <w:r>
+        <w:t>ge</w:t>
+      </w:r>
+      <w:proofErr w:type="spellEnd"/>
+      <w:r>
+        <w:t xml:space="preserve"> operators define</w:t>
       </w:r>
       <w:r>
         <w:t>d</w:t>
@@ -279,20 +451,99 @@
         <w:t>Universal does not support item assignment</w:t>
       </w:r>
       <w:r>
-        <w:t xml:space="preserve"> e.g the line</w:t>
-      </w:r>
-    </w:p>
-    <w:p>
-      <w:r>
-        <w:t>arr[i + 1], arr[high] = arr[high], arr[i + 1]</w:t>
-      </w:r>
-    </w:p>
-    <w:p>
-      <w:r>
-        <w:t>does not work if arr is a universal and each element of arr is a universal</w:t>
-      </w:r>
-      <w:r>
-        <w:t xml:space="preserve"> I “vibecoded” an implementation of this.</w:t>
+        <w:t xml:space="preserve"> </w:t>
+      </w:r>
+      <w:proofErr w:type="spellStart"/>
+      <w:r>
+        <w:t>e.g</w:t>
+      </w:r>
+      <w:proofErr w:type="spellEnd"/>
+      <w:r>
+        <w:t xml:space="preserve"> the line</w:t>
+      </w:r>
+    </w:p>
+    <w:p>
+      <w:proofErr w:type="spellStart"/>
+      <w:proofErr w:type="gramStart"/>
+      <w:r>
+        <w:t>arr</w:t>
+      </w:r>
+      <w:proofErr w:type="spellEnd"/>
+      <w:r>
+        <w:t>[</w:t>
+      </w:r>
+      <w:proofErr w:type="spellStart"/>
+      <w:proofErr w:type="gramEnd"/>
+      <w:r>
+        <w:t>i</w:t>
+      </w:r>
+      <w:proofErr w:type="spellEnd"/>
+      <w:r>
+        <w:t xml:space="preserve"> + 1], </w:t>
+      </w:r>
+      <w:proofErr w:type="spellStart"/>
+      <w:r>
+        <w:t>arr</w:t>
+      </w:r>
+      <w:proofErr w:type="spellEnd"/>
+      <w:r>
+        <w:t xml:space="preserve">[high] = </w:t>
+      </w:r>
+      <w:proofErr w:type="spellStart"/>
+      <w:r>
+        <w:t>arr</w:t>
+      </w:r>
+      <w:proofErr w:type="spellEnd"/>
+      <w:r>
+        <w:t xml:space="preserve">[high], </w:t>
+      </w:r>
+      <w:proofErr w:type="spellStart"/>
+      <w:r>
+        <w:t>arr</w:t>
+      </w:r>
+      <w:proofErr w:type="spellEnd"/>
+      <w:r>
+        <w:t>[</w:t>
+      </w:r>
+      <w:proofErr w:type="spellStart"/>
+      <w:r>
+        <w:t>i</w:t>
+      </w:r>
+      <w:proofErr w:type="spellEnd"/>
+      <w:r>
+        <w:t xml:space="preserve"> + 1]</w:t>
+      </w:r>
+    </w:p>
+    <w:p>
+      <w:r>
+        <w:t xml:space="preserve">does not work if </w:t>
+      </w:r>
+      <w:proofErr w:type="spellStart"/>
+      <w:r>
+        <w:t>arr</w:t>
+      </w:r>
+      <w:proofErr w:type="spellEnd"/>
+      <w:r>
+        <w:t xml:space="preserve"> is a universal and each element of </w:t>
+      </w:r>
+      <w:proofErr w:type="spellStart"/>
+      <w:r>
+        <w:t>arr</w:t>
+      </w:r>
+      <w:proofErr w:type="spellEnd"/>
+      <w:r>
+        <w:t xml:space="preserve"> is a universal</w:t>
+      </w:r>
+      <w:r>
+        <w:t xml:space="preserve"> I “</w:t>
+      </w:r>
+      <w:proofErr w:type="spellStart"/>
+      <w:r>
+        <w:t>vibecoded</w:t>
+      </w:r>
+      <w:proofErr w:type="spellEnd"/>
+      <w:r>
+        <w:t>” an implementation of this.</w:t>
       </w:r>
     </w:p>
     <w:p>
@@ -308,12 +559,36 @@
     </w:p>
     <w:p>
       <w:r>
-        <w:t>Read TypeEvalPy to find good frameworks for function parameters.</w:t>
-      </w:r>
-    </w:p>
-    <w:p>
-      <w:r>
-        <w:t xml:space="preserve">Tried HeaderGen as it was apparently the best for all categories including function parameters. When I tried it, it would only infer function return types and not parameters. The github only mentions that it can resolve function return types and I could not figure out any way to get it to infer parameter types. </w:t>
+        <w:t xml:space="preserve">Read </w:t>
+      </w:r>
+      <w:proofErr w:type="spellStart"/>
+      <w:r>
+        <w:t>TypeEvalPy</w:t>
+      </w:r>
+      <w:proofErr w:type="spellEnd"/>
+      <w:r>
+        <w:t xml:space="preserve"> to find good frameworks for function parameters.</w:t>
+      </w:r>
+    </w:p>
+    <w:p>
+      <w:r>
+        <w:t xml:space="preserve">Tried </w:t>
+      </w:r>
+      <w:proofErr w:type="spellStart"/>
+      <w:r>
+        <w:t>HeaderGen</w:t>
+      </w:r>
+      <w:proofErr w:type="spellEnd"/>
+      <w:r>
+        <w:t xml:space="preserve"> as it was apparently the best for all categories including function parameters. When I tried it, it would only infer function return types and not parameters. The </w:t>
+      </w:r>
+      <w:proofErr w:type="spellStart"/>
+      <w:r>
+        <w:t>github</w:t>
+      </w:r>
+      <w:proofErr w:type="spellEnd"/>
+      <w:r>
+        <w:t xml:space="preserve"> only mentions that it can resolve function return types and I could not figure out any way to get it to infer parameter types. </w:t>
       </w:r>
     </w:p>
     <w:p>
@@ -367,23 +642,103 @@
         </w:numPr>
       </w:pPr>
       <w:r>
-        <w:t xml:space="preserve">Hypothesis/Hypofuzz “Strategies” are how you define what is passed in to the function you want to fuzz. E.g  </w:t>
+        <w:t>Hypothesis/</w:t>
+      </w:r>
+      <w:proofErr w:type="spellStart"/>
+      <w:r>
+        <w:t>Hypofuzz</w:t>
+      </w:r>
+      <w:proofErr w:type="spellEnd"/>
+      <w:r>
+        <w:t xml:space="preserve"> “Strategies” are how you define what is passed </w:t>
+      </w:r>
+      <w:proofErr w:type="gramStart"/>
+      <w:r>
+        <w:t>in to</w:t>
+      </w:r>
+      <w:proofErr w:type="gramEnd"/>
+      <w:r>
+        <w:t xml:space="preserve"> the function you want to fuzz. </w:t>
+      </w:r>
+      <w:proofErr w:type="spellStart"/>
+      <w:r>
+        <w:t>E.g</w:t>
+      </w:r>
+      <w:proofErr w:type="spellEnd"/>
+      <w:r>
+        <w:t xml:space="preserve">  </w:t>
       </w:r>
     </w:p>
     <w:p>
       <w:r>
         <w:lastRenderedPageBreak/>
-        <w:t>@given(st.lists(st.integers() | st.floats()))</w:t>
-      </w:r>
-    </w:p>
-    <w:p>
-      <w:r>
-        <w:t>def test_sort_correct(lst):</w:t>
-      </w:r>
-    </w:p>
-    <w:p>
-      <w:r>
-        <w:t xml:space="preserve">    assert(my_sort(lst) == sorted(lst))</w:t>
+        <w:t>@given(</w:t>
+      </w:r>
+      <w:proofErr w:type="gramStart"/>
+      <w:r>
+        <w:t>st.lists</w:t>
+      </w:r>
+      <w:proofErr w:type="gramEnd"/>
+      <w:r>
+        <w:t xml:space="preserve">(st.integers() | </w:t>
+      </w:r>
+      <w:proofErr w:type="spellStart"/>
+      <w:r>
+        <w:t>st.floats</w:t>
+      </w:r>
+      <w:proofErr w:type="spellEnd"/>
+      <w:r>
+        <w:t>()))</w:t>
+      </w:r>
+    </w:p>
+    <w:p>
+      <w:r>
+        <w:t xml:space="preserve">def </w:t>
+      </w:r>
+      <w:proofErr w:type="spellStart"/>
+      <w:r>
+        <w:t>test_sort_correct</w:t>
+      </w:r>
+      <w:proofErr w:type="spellEnd"/>
+      <w:r>
+        <w:t>(</w:t>
+      </w:r>
+      <w:proofErr w:type="spellStart"/>
+      <w:r>
+        <w:t>lst</w:t>
+      </w:r>
+      <w:proofErr w:type="spellEnd"/>
+      <w:r>
+        <w:t>):</w:t>
+      </w:r>
+    </w:p>
+    <w:p>
+      <w:r>
+        <w:t xml:space="preserve">    assert(</w:t>
+      </w:r>
+      <w:proofErr w:type="spellStart"/>
+      <w:r>
+        <w:t>my_sort</w:t>
+      </w:r>
+      <w:proofErr w:type="spellEnd"/>
+      <w:r>
+        <w:t>(</w:t>
+      </w:r>
+      <w:proofErr w:type="spellStart"/>
+      <w:r>
+        <w:t>lst</w:t>
+      </w:r>
+      <w:proofErr w:type="spellEnd"/>
+      <w:r>
+        <w:t>) == sorted(</w:t>
+      </w:r>
+      <w:proofErr w:type="spellStart"/>
+      <w:r>
+        <w:t>lst</w:t>
+      </w:r>
+      <w:proofErr w:type="spellEnd"/>
+      <w:r>
+        <w:t>))</w:t>
       </w:r>
     </w:p>
     <w:p>
@@ -395,7 +750,23 @@
         </w:numPr>
       </w:pPr>
       <w:r>
-        <w:t>In that code snippet, the strategy is to fuzz my_sort with inputs of type list[int|str]</w:t>
+        <w:t xml:space="preserve">In that code snippet, the strategy is to fuzz </w:t>
+      </w:r>
+      <w:proofErr w:type="spellStart"/>
+      <w:r>
+        <w:t>my_sort</w:t>
+      </w:r>
+      <w:proofErr w:type="spellEnd"/>
+      <w:r>
+        <w:t xml:space="preserve"> with inputs of type list[</w:t>
+      </w:r>
+      <w:proofErr w:type="spellStart"/>
+      <w:r>
+        <w:t>int|str</w:t>
+      </w:r>
+      <w:proofErr w:type="spellEnd"/>
+      <w:r>
+        <w:t>]</w:t>
       </w:r>
     </w:p>
     <w:p>
@@ -407,7 +778,15 @@
         </w:numPr>
       </w:pPr>
       <w:r>
-        <w:t>In the case of my universal strategy, I simply fuzz with a strategy that can be though of as the following:</w:t>
+        <w:t xml:space="preserve">In the case of my universal strategy, I simply fuzz with a strategy that can be </w:t>
+      </w:r>
+      <w:proofErr w:type="spellStart"/>
+      <w:r>
+        <w:t>though</w:t>
+      </w:r>
+      <w:proofErr w:type="spellEnd"/>
+      <w:r>
+        <w:t xml:space="preserve"> of as the following:</w:t>
       </w:r>
     </w:p>
     <w:p>
@@ -418,8 +797,55 @@
           <w:numId w:val="3"/>
         </w:numPr>
       </w:pPr>
-      <w:r>
-        <w:t>strat = int|str|float|bool|None|list[strat]|dict[str,strat]|tuple[strat]</w:t>
+      <w:proofErr w:type="spellStart"/>
+      <w:r>
+        <w:t>strat</w:t>
+      </w:r>
+      <w:proofErr w:type="spellEnd"/>
+      <w:r>
+        <w:t xml:space="preserve"> = </w:t>
+      </w:r>
+      <w:proofErr w:type="spellStart"/>
+      <w:r>
+        <w:t>int|str|float|bool|None|list</w:t>
+      </w:r>
+      <w:proofErr w:type="spellEnd"/>
+      <w:r>
+        <w:t>[</w:t>
+      </w:r>
+      <w:proofErr w:type="spellStart"/>
+      <w:r>
+        <w:t>strat</w:t>
+      </w:r>
+      <w:proofErr w:type="spellEnd"/>
+      <w:r>
+        <w:t>]|</w:t>
+      </w:r>
+      <w:proofErr w:type="spellStart"/>
+      <w:r>
+        <w:t>dict</w:t>
+      </w:r>
+      <w:proofErr w:type="spellEnd"/>
+      <w:r>
+        <w:t>[</w:t>
+      </w:r>
+      <w:proofErr w:type="spellStart"/>
+      <w:proofErr w:type="gramStart"/>
+      <w:r>
+        <w:t>str,strat</w:t>
+      </w:r>
+      <w:proofErr w:type="spellEnd"/>
+      <w:proofErr w:type="gramEnd"/>
+      <w:r>
+        <w:t>]|tuple[</w:t>
+      </w:r>
+      <w:proofErr w:type="spellStart"/>
+      <w:r>
+        <w:t>strat</w:t>
+      </w:r>
+      <w:proofErr w:type="spellEnd"/>
+      <w:r>
+        <w:t>]</w:t>
       </w:r>
     </w:p>
     <w:p>
@@ -431,7 +857,15 @@
         </w:numPr>
       </w:pPr>
       <w:r>
-        <w:t>I have logic implemented so that if we encounter a TypeError, we discard the type that caused the error from the pool of possible types in our strategy for future iterations.</w:t>
+        <w:t xml:space="preserve">I have logic implemented so that if we encounter a </w:t>
+      </w:r>
+      <w:proofErr w:type="spellStart"/>
+      <w:r>
+        <w:t>TypeError</w:t>
+      </w:r>
+      <w:proofErr w:type="spellEnd"/>
+      <w:r>
+        <w:t>, we discard the type that caused the error from the pool of possible types in our strategy for future iterations.</w:t>
       </w:r>
     </w:p>
     <w:p>
@@ -443,7 +877,15 @@
         </w:numPr>
       </w:pPr>
       <w:r>
-        <w:t>It seems to work fairly well for the simple tests I have performed so far</w:t>
+        <w:t xml:space="preserve">It seems to work </w:t>
+      </w:r>
+      <w:proofErr w:type="gramStart"/>
+      <w:r>
+        <w:t>fairly well</w:t>
+      </w:r>
+      <w:proofErr w:type="gramEnd"/>
+      <w:r>
+        <w:t xml:space="preserve"> for the simple tests I have performed so far</w:t>
       </w:r>
     </w:p>
     <w:p>
@@ -455,7 +897,15 @@
         </w:numPr>
       </w:pPr>
       <w:r>
-        <w:t>Because it essentially brute forces fuzzing with different types until it works, I can imagine this being quite slow for fuzzing complex functions with lots of arguments but this will have to be tested more</w:t>
+        <w:t xml:space="preserve">Because it essentially brute forces fuzzing with different types until it works, I can imagine this being quite slow for fuzzing complex functions with lots of </w:t>
+      </w:r>
+      <w:proofErr w:type="gramStart"/>
+      <w:r>
+        <w:t>arguments</w:t>
+      </w:r>
+      <w:proofErr w:type="gramEnd"/>
+      <w:r>
+        <w:t xml:space="preserve"> but this will have to be tested more</w:t>
       </w:r>
     </w:p>
     <w:p>
@@ -478,17 +928,49 @@
     </w:p>
     <w:p>
       <w:r>
-        <w:t>If we assume there isn’t any explicit casting in the function we are fuzzing, how would a universal handle a situation where the type is ambiguous e.g calling len(universal). Len is valid for both string and list so how do we lock universal here?</w:t>
-      </w:r>
-    </w:p>
-    <w:p>
-      <w:r>
-        <w:t>Similarly, how would we define operators like plus (+) for example? If we have two universals u1 and u2, the statement u1 + u2 could imply that u1 and u2 are strings, ints, floats, lists, tuples so how can we implement this operator.</w:t>
-      </w:r>
-    </w:p>
-    <w:p>
-      <w:r>
-        <w:t>Theoretically speaking, at best we are determining the type of a (universal) object based on how that object is treated in the code and what functions and operations are applied to it. At best a perfect solution seems to me like it would essentially be a glorified type inference algorithm.</w:t>
+        <w:t xml:space="preserve">If we assume there isn’t any explicit casting in the function we are fuzzing, how would a universal handle a situation where the type is ambiguous </w:t>
+      </w:r>
+      <w:proofErr w:type="spellStart"/>
+      <w:r>
+        <w:t>e.g</w:t>
+      </w:r>
+      <w:proofErr w:type="spellEnd"/>
+      <w:r>
+        <w:t xml:space="preserve"> calling </w:t>
+      </w:r>
+      <w:proofErr w:type="spellStart"/>
+      <w:r>
+        <w:t>len</w:t>
+      </w:r>
+      <w:proofErr w:type="spellEnd"/>
+      <w:r>
+        <w:t>(universal). Len is valid for both string and list so how do we lock universal here?</w:t>
+      </w:r>
+    </w:p>
+    <w:p>
+      <w:r>
+        <w:t xml:space="preserve">Similarly, how would we define operators like plus (+) for example? If we have two universals u1 and u2, the statement u1 + u2 could imply that u1 and u2 are strings, </w:t>
+      </w:r>
+      <w:proofErr w:type="spellStart"/>
+      <w:r>
+        <w:t>ints</w:t>
+      </w:r>
+      <w:proofErr w:type="spellEnd"/>
+      <w:r>
+        <w:t>, floats, lists, tuples so how can we implement this operator.</w:t>
+      </w:r>
+    </w:p>
+    <w:p>
+      <w:r>
+        <w:t xml:space="preserve">Theoretically speaking, at best we are determining the type of a (universal) object based on how that object is treated in the code and what functions and operations are applied to it. At best a perfect solution seems to me like it would essentially be a glorified </w:t>
+      </w:r>
+      <w:proofErr w:type="gramStart"/>
+      <w:r>
+        <w:t>type</w:t>
+      </w:r>
+      <w:proofErr w:type="gramEnd"/>
+      <w:r>
+        <w:t xml:space="preserve"> inference algorithm.</w:t>
       </w:r>
     </w:p>
     <w:p/>
@@ -505,7 +987,15 @@
     <w:p>
       <w:r>
         <w:lastRenderedPageBreak/>
-        <w:t>See if func argument is callable, raise exception and print that the code is using callbacks which are not currently supported</w:t>
+        <w:t xml:space="preserve">See if </w:t>
+      </w:r>
+      <w:proofErr w:type="spellStart"/>
+      <w:r>
+        <w:t>func</w:t>
+      </w:r>
+      <w:proofErr w:type="spellEnd"/>
+      <w:r>
+        <w:t xml:space="preserve"> argument is callable, raise exception and print that the code is using callbacks which are not currently supported</w:t>
       </w:r>
     </w:p>
     <w:p/>
@@ -527,13 +1017,31 @@
         <w:t xml:space="preserve">classes </w:t>
       </w:r>
       <w:r>
-        <w:t>for 2 stack implementation</w:t>
-      </w:r>
-    </w:p>
-    <w:p>
-      <w:r>
-        <w:t>The fuzzer should :</w:t>
-      </w:r>
+        <w:t xml:space="preserve">for 2 stack </w:t>
+      </w:r>
+      <w:proofErr w:type="gramStart"/>
+      <w:r>
+        <w:t>implementation</w:t>
+      </w:r>
+      <w:proofErr w:type="gramEnd"/>
+    </w:p>
+    <w:p>
+      <w:r>
+        <w:t xml:space="preserve">The </w:t>
+      </w:r>
+      <w:proofErr w:type="spellStart"/>
+      <w:r>
+        <w:t>fuzzer</w:t>
+      </w:r>
+      <w:proofErr w:type="spellEnd"/>
+      <w:r>
+        <w:t xml:space="preserve"> </w:t>
+      </w:r>
+      <w:proofErr w:type="gramStart"/>
+      <w:r>
+        <w:t>should :</w:t>
+      </w:r>
+      <w:proofErr w:type="gramEnd"/>
     </w:p>
     <w:p>
       <w:r>
@@ -553,12 +1061,36 @@
     <w:p/>
     <w:p>
       <w:r>
-        <w:t>Added arg/kwarg support for fuzz testing strategy</w:t>
-      </w:r>
-    </w:p>
-    <w:p>
-      <w:r>
-        <w:t>Wrote basic first class equivalence tester</w:t>
+        <w:t xml:space="preserve">Added </w:t>
+      </w:r>
+      <w:proofErr w:type="spellStart"/>
+      <w:r>
+        <w:t>arg</w:t>
+      </w:r>
+      <w:proofErr w:type="spellEnd"/>
+      <w:r>
+        <w:t>/</w:t>
+      </w:r>
+      <w:proofErr w:type="spellStart"/>
+      <w:r>
+        <w:t>kwarg</w:t>
+      </w:r>
+      <w:proofErr w:type="spellEnd"/>
+      <w:r>
+        <w:t xml:space="preserve"> support for fuzz testing strategy</w:t>
+      </w:r>
+    </w:p>
+    <w:p>
+      <w:r>
+        <w:t xml:space="preserve">Wrote basic </w:t>
+      </w:r>
+      <w:proofErr w:type="gramStart"/>
+      <w:r>
+        <w:t>first class</w:t>
+      </w:r>
+      <w:proofErr w:type="gramEnd"/>
+      <w:r>
+        <w:t xml:space="preserve"> equivalence tester</w:t>
       </w:r>
     </w:p>
     <w:p>
@@ -578,12 +1110,36 @@
     </w:p>
     <w:p>
       <w:r>
-        <w:t>I have tried applying this equivalence tester to small refactors in real classes from open sources repos such as openai but have struggled to find working examples. My equivalence tester is quite situational. Method name/signature refactors and external dependencies cause issues</w:t>
-      </w:r>
-    </w:p>
-    <w:p>
-      <w:r>
-        <w:t>Tested it on two stack implementations, one that throws index error if you try to peek or pop and empty stack, and one that returns None for these operations. The fuzzer was able to pick up on this difference immediately</w:t>
+        <w:t xml:space="preserve">I have tried applying this equivalence tester to small refactors in real classes from open sources repos such as </w:t>
+      </w:r>
+      <w:proofErr w:type="spellStart"/>
+      <w:r>
+        <w:t>openai</w:t>
+      </w:r>
+      <w:proofErr w:type="spellEnd"/>
+      <w:r>
+        <w:t xml:space="preserve"> but have struggled to find working examples. My equivalence tester is quite situational. Method name/signature </w:t>
+      </w:r>
+      <w:proofErr w:type="gramStart"/>
+      <w:r>
+        <w:t>refactors</w:t>
+      </w:r>
+      <w:proofErr w:type="gramEnd"/>
+      <w:r>
+        <w:t xml:space="preserve"> and external dependencies cause issues</w:t>
+      </w:r>
+    </w:p>
+    <w:p>
+      <w:r>
+        <w:t xml:space="preserve">Tested it on two stack implementations, one that throws index error if you try to peek or pop and empty stack, and one that returns None for these operations. The </w:t>
+      </w:r>
+      <w:proofErr w:type="spellStart"/>
+      <w:r>
+        <w:t>fuzzer</w:t>
+      </w:r>
+      <w:proofErr w:type="spellEnd"/>
+      <w:r>
+        <w:t xml:space="preserve"> was able to pick up on this difference immediately</w:t>
       </w:r>
     </w:p>
     <w:p/>
@@ -619,7 +1175,7 @@
                     <pic:cNvPicPr/>
                   </pic:nvPicPr>
                   <pic:blipFill>
-                    <a:blip r:embed="rId10"/>
+                    <a:blip r:embed="rId9"/>
                     <a:stretch>
                       <a:fillRect/>
                     </a:stretch>
@@ -673,13 +1229,29 @@
     </w:p>
     <w:p>
       <w:r>
-        <w:t>What I mean by this is that currently, my code will test two classes for equivalence and if the classes have differing methods or even method names, the code will reject them. Allow the user to define a json file with the specific methods from the class that they want tested so they can exclude certain methods if they like, and optionally allow the user to also define specifically what arguments each method should be tested with.</w:t>
+        <w:t xml:space="preserve">What I mean by this is that currently, my code will test two classes for equivalence and if the classes have differing methods or even method names, the code will reject them. Allow the user to define a </w:t>
+      </w:r>
+      <w:proofErr w:type="spellStart"/>
+      <w:r>
+        <w:t>json</w:t>
+      </w:r>
+      <w:proofErr w:type="spellEnd"/>
+      <w:r>
+        <w:t xml:space="preserve"> file with the specific methods from the class that they want tested so they can exclude certain methods if they </w:t>
+      </w:r>
+      <w:proofErr w:type="gramStart"/>
+      <w:r>
+        <w:t>like, and</w:t>
+      </w:r>
+      <w:proofErr w:type="gramEnd"/>
+      <w:r>
+        <w:t xml:space="preserve"> optionally allow the user to also define specifically what arguments each method should be tested with.</w:t>
       </w:r>
     </w:p>
     <w:p/>
     <w:p/>
     <w:p>
-      <w:hyperlink r:id="rId11" w:history="1">
+      <w:hyperlink r:id="rId10" w:history="1">
         <w:r>
           <w:rPr>
             <w:rStyle w:val="Hyperlink"/>
@@ -714,7 +1286,15 @@
       </w:r>
       <w:r>
         <w:lastRenderedPageBreak/>
-        <w:t>duplicates, removing the need to fuzz both funcs. Useful in practice for speeding up a common case</w:t>
+        <w:t xml:space="preserve">duplicates, removing the need to fuzz both </w:t>
+      </w:r>
+      <w:proofErr w:type="spellStart"/>
+      <w:r>
+        <w:t>funcs</w:t>
+      </w:r>
+      <w:proofErr w:type="spellEnd"/>
+      <w:r>
+        <w:t>. Useful in practice for speeding up a common case</w:t>
       </w:r>
     </w:p>
     <w:p>
@@ -726,7 +1306,15 @@
         </w:numPr>
       </w:pPr>
       <w:r>
-        <w:t>Filter out funcs with no parameters and return values</w:t>
+        <w:t xml:space="preserve">Filter out </w:t>
+      </w:r>
+      <w:proofErr w:type="spellStart"/>
+      <w:r>
+        <w:t>funcs</w:t>
+      </w:r>
+      <w:proofErr w:type="spellEnd"/>
+      <w:r>
+        <w:t xml:space="preserve"> with no parameters and return values</w:t>
       </w:r>
     </w:p>
     <w:p>
@@ -738,7 +1326,15 @@
         </w:numPr>
       </w:pPr>
       <w:r>
-        <w:t>Possibly filter out funcs that invoke external classes or methods</w:t>
+        <w:t xml:space="preserve">Possibly filter out </w:t>
+      </w:r>
+      <w:proofErr w:type="spellStart"/>
+      <w:r>
+        <w:t>funcs</w:t>
+      </w:r>
+      <w:proofErr w:type="spellEnd"/>
+      <w:r>
+        <w:t xml:space="preserve"> that invoke external classes or methods</w:t>
       </w:r>
     </w:p>
     <w:p>
@@ -750,7 +1346,15 @@
         </w:numPr>
       </w:pPr>
       <w:r>
-        <w:t>They use pynguin which is a test generation framework that does not use fuzz testing</w:t>
+        <w:t xml:space="preserve">They use </w:t>
+      </w:r>
+      <w:proofErr w:type="spellStart"/>
+      <w:r>
+        <w:t>pynguin</w:t>
+      </w:r>
+      <w:proofErr w:type="spellEnd"/>
+      <w:r>
+        <w:t xml:space="preserve"> which is a test generation framework that does not use fuzz testing</w:t>
       </w:r>
     </w:p>
     <w:p>
@@ -770,7 +1374,15 @@
     </w:p>
     <w:p>
       <w:r>
-        <w:t>What if u have a class with 1 methods, a factory method which gives u back 3 methods</w:t>
+        <w:t xml:space="preserve">What if u have a class with 1 </w:t>
+      </w:r>
+      <w:proofErr w:type="gramStart"/>
+      <w:r>
+        <w:t>methods</w:t>
+      </w:r>
+      <w:proofErr w:type="gramEnd"/>
+      <w:r>
+        <w:t>, a factory method which gives u back 3 methods</w:t>
       </w:r>
     </w:p>
     <w:p>
@@ -792,7 +1404,7 @@
       </w:r>
     </w:p>
     <w:p>
-      <w:hyperlink r:id="rId12" w:history="1">
+      <w:hyperlink r:id="rId11" w:history="1">
         <w:r>
           <w:rPr>
             <w:rStyle w:val="Hyperlink"/>
@@ -803,13 +1415,29 @@
     </w:p>
     <w:p>
       <w:r>
-        <w:t>could instead go more practical, targeting datastructure implementations online</w:t>
+        <w:t xml:space="preserve">could instead go more practical, targeting </w:t>
+      </w:r>
+      <w:proofErr w:type="spellStart"/>
+      <w:r>
+        <w:t>datastructure</w:t>
+      </w:r>
+      <w:proofErr w:type="spellEnd"/>
+      <w:r>
+        <w:t xml:space="preserve"> implementations online</w:t>
       </w:r>
     </w:p>
     <w:p/>
     <w:p>
       <w:r>
-        <w:t xml:space="preserve">For function-function verification: I am currently implementing the case where both functions return (create) a new function. In this case I want to then perform the same function-function verification on these two new returned functions. The problem is the hypofuzz does not exactly allow for a recursive implementation like this. </w:t>
+        <w:t xml:space="preserve">For function-function verification: I am currently implementing the case where both functions return (create) a new function. In this case I want to then perform the same function-function verification on these two new returned functions. The problem is the </w:t>
+      </w:r>
+      <w:proofErr w:type="spellStart"/>
+      <w:r>
+        <w:t>hypofuzz</w:t>
+      </w:r>
+      <w:proofErr w:type="spellEnd"/>
+      <w:r>
+        <w:t xml:space="preserve"> does not exactly allow for a recursive implementation like this. </w:t>
       </w:r>
     </w:p>
     <w:p>
@@ -854,7 +1482,37 @@
         <w:rPr>
           <w:iCs/>
         </w:rPr>
-        <w:t>Other than this issue, another issue is trying to reason with functions that take callable parameters. Cant exactly fuzz a function as an input so im not sure what to do here</w:t>
+        <w:t xml:space="preserve">Other than this issue, another issue is trying to reason with functions that take callable parameters. </w:t>
+      </w:r>
+      <w:proofErr w:type="spellStart"/>
+      <w:proofErr w:type="gramStart"/>
+      <w:r>
+        <w:rPr>
+          <w:iCs/>
+        </w:rPr>
+        <w:t>Cant</w:t>
+      </w:r>
+      <w:proofErr w:type="spellEnd"/>
+      <w:proofErr w:type="gramEnd"/>
+      <w:r>
+        <w:rPr>
+          <w:iCs/>
+        </w:rPr>
+        <w:t xml:space="preserve"> exactly fuzz a function as an input so </w:t>
+      </w:r>
+      <w:proofErr w:type="spellStart"/>
+      <w:r>
+        <w:rPr>
+          <w:iCs/>
+        </w:rPr>
+        <w:t>im</w:t>
+      </w:r>
+      <w:proofErr w:type="spellEnd"/>
+      <w:r>
+        <w:rPr>
+          <w:iCs/>
+        </w:rPr>
+        <w:t xml:space="preserve"> not sure what to do here</w:t>
       </w:r>
       <w:r>
         <w:rPr>
@@ -891,7 +1549,7 @@
                     <pic:cNvPicPr/>
                   </pic:nvPicPr>
                   <pic:blipFill>
-                    <a:blip r:embed="rId13"/>
+                    <a:blip r:embed="rId12"/>
                     <a:stretch>
                       <a:fillRect/>
                     </a:stretch>
@@ -922,46 +1580,138 @@
         <w:rPr>
           <w:iCs/>
         </w:rPr>
-        <w:t>Using universal strategy + dummy functions (the testing framework doesn’t know that the function arg is necessarily callable so it uses universal strategy) it takes 11 minutes to find the difference in call_nested_param_ineq</w:t>
-      </w:r>
-      <w:r>
-        <w:rPr>
-          <w:iCs/>
-        </w:rPr>
-        <w:t>. Chances are, with type annotations this will be a bit faster as the tester will start passing in more callable args from the start</w:t>
-      </w:r>
-    </w:p>
-    <w:p>
-      <w:pPr>
-        <w:rPr>
-          <w:iCs/>
-        </w:rPr>
-      </w:pPr>
-      <w:r>
-        <w:rPr>
-          <w:iCs/>
-        </w:rPr>
-        <w:t>Adding a mechanism to see if an arg is “called” within a function should be pretty easy and should greatly improve time efficiency</w:t>
-      </w:r>
-    </w:p>
-    <w:p>
-      <w:pPr>
-        <w:rPr>
-          <w:iCs/>
-        </w:rPr>
-      </w:pPr>
-    </w:p>
-    <w:p>
-      <w:pPr>
-        <w:rPr>
-          <w:iCs/>
-        </w:rPr>
-      </w:pPr>
-      <w:r>
-        <w:rPr>
-          <w:iCs/>
-        </w:rPr>
-        <w:t>To be as faithful to the theory: we need to complicate/generalise f() so it can call any function it knows. Bound things, we don’t want more than 2 recursive calls, more than etc.</w:t>
+        <w:t xml:space="preserve">Using universal strategy + dummy functions (the testing framework doesn’t know that the function </w:t>
+      </w:r>
+      <w:proofErr w:type="spellStart"/>
+      <w:r>
+        <w:rPr>
+          <w:iCs/>
+        </w:rPr>
+        <w:t>arg</w:t>
+      </w:r>
+      <w:proofErr w:type="spellEnd"/>
+      <w:r>
+        <w:rPr>
+          <w:iCs/>
+        </w:rPr>
+        <w:t xml:space="preserve"> is necessarily </w:t>
+      </w:r>
+      <w:proofErr w:type="gramStart"/>
+      <w:r>
+        <w:rPr>
+          <w:iCs/>
+        </w:rPr>
+        <w:t>callable</w:t>
+      </w:r>
+      <w:proofErr w:type="gramEnd"/>
+      <w:r>
+        <w:rPr>
+          <w:iCs/>
+        </w:rPr>
+        <w:t xml:space="preserve"> so it uses universal strategy) it takes 11 minutes to find the difference in </w:t>
+      </w:r>
+      <w:proofErr w:type="spellStart"/>
+      <w:r>
+        <w:rPr>
+          <w:iCs/>
+        </w:rPr>
+        <w:t>call_nested_param_ineq</w:t>
+      </w:r>
+      <w:proofErr w:type="spellEnd"/>
+      <w:r>
+        <w:rPr>
+          <w:iCs/>
+        </w:rPr>
+        <w:t xml:space="preserve">. Chances are, with type annotations this will be a bit faster as the tester will start passing in more callable </w:t>
+      </w:r>
+      <w:proofErr w:type="spellStart"/>
+      <w:r>
+        <w:rPr>
+          <w:iCs/>
+        </w:rPr>
+        <w:t>args</w:t>
+      </w:r>
+      <w:proofErr w:type="spellEnd"/>
+      <w:r>
+        <w:rPr>
+          <w:iCs/>
+        </w:rPr>
+        <w:t xml:space="preserve"> from the start</w:t>
+      </w:r>
+    </w:p>
+    <w:p>
+      <w:pPr>
+        <w:rPr>
+          <w:iCs/>
+        </w:rPr>
+      </w:pPr>
+      <w:r>
+        <w:rPr>
+          <w:iCs/>
+        </w:rPr>
+        <w:t xml:space="preserve">Adding a mechanism to see if an </w:t>
+      </w:r>
+      <w:proofErr w:type="spellStart"/>
+      <w:r>
+        <w:rPr>
+          <w:iCs/>
+        </w:rPr>
+        <w:t>arg</w:t>
+      </w:r>
+      <w:proofErr w:type="spellEnd"/>
+      <w:r>
+        <w:rPr>
+          <w:iCs/>
+        </w:rPr>
+        <w:t xml:space="preserve"> is “called” within a function should be </w:t>
+      </w:r>
+      <w:proofErr w:type="gramStart"/>
+      <w:r>
+        <w:rPr>
+          <w:iCs/>
+        </w:rPr>
+        <w:t>pretty easy</w:t>
+      </w:r>
+      <w:proofErr w:type="gramEnd"/>
+      <w:r>
+        <w:rPr>
+          <w:iCs/>
+        </w:rPr>
+        <w:t xml:space="preserve"> and should greatly improve time efficiency</w:t>
+      </w:r>
+    </w:p>
+    <w:p>
+      <w:pPr>
+        <w:rPr>
+          <w:iCs/>
+        </w:rPr>
+      </w:pPr>
+    </w:p>
+    <w:p>
+      <w:pPr>
+        <w:rPr>
+          <w:iCs/>
+        </w:rPr>
+      </w:pPr>
+      <w:r>
+        <w:rPr>
+          <w:iCs/>
+        </w:rPr>
+        <w:t xml:space="preserve">To be as faithful to the theory: we need to complicate/generalise </w:t>
+      </w:r>
+      <w:proofErr w:type="gramStart"/>
+      <w:r>
+        <w:rPr>
+          <w:iCs/>
+        </w:rPr>
+        <w:t>f(</w:t>
+      </w:r>
+      <w:proofErr w:type="gramEnd"/>
+      <w:r>
+        <w:rPr>
+          <w:iCs/>
+        </w:rPr>
+        <w:t>) so it can call any function it knows. Bound things, we don’t want more than 2 recursive calls, more than etc.</w:t>
       </w:r>
     </w:p>
     <w:p>
@@ -1032,20 +1782,48 @@
         <w:rPr>
           <w:iCs/>
         </w:rPr>
-        <w:t>If I have time, extend f() functions to take and return numbers</w:t>
-      </w:r>
-    </w:p>
-    <w:p>
-      <w:pPr>
-        <w:rPr>
-          <w:iCs/>
-        </w:rPr>
-      </w:pPr>
-      <w:r>
-        <w:rPr>
-          <w:iCs/>
-        </w:rPr>
-        <w:t>Then I can look at test suites, try it out in some application areas where equivalence is important, property based testing test suite and run with my pipeline.</w:t>
+        <w:t xml:space="preserve">If I have time, extend </w:t>
+      </w:r>
+      <w:proofErr w:type="gramStart"/>
+      <w:r>
+        <w:rPr>
+          <w:iCs/>
+        </w:rPr>
+        <w:t>f(</w:t>
+      </w:r>
+      <w:proofErr w:type="gramEnd"/>
+      <w:r>
+        <w:rPr>
+          <w:iCs/>
+        </w:rPr>
+        <w:t>) functions to take and return numbers</w:t>
+      </w:r>
+    </w:p>
+    <w:p>
+      <w:pPr>
+        <w:rPr>
+          <w:iCs/>
+        </w:rPr>
+      </w:pPr>
+      <w:r>
+        <w:rPr>
+          <w:iCs/>
+        </w:rPr>
+        <w:t xml:space="preserve">Then I can look at test suites, try it out in some application areas where equivalence is important, </w:t>
+      </w:r>
+      <w:proofErr w:type="gramStart"/>
+      <w:r>
+        <w:rPr>
+          <w:iCs/>
+        </w:rPr>
+        <w:t>property based</w:t>
+      </w:r>
+      <w:proofErr w:type="gramEnd"/>
+      <w:r>
+        <w:rPr>
+          <w:iCs/>
+        </w:rPr>
+        <w:t xml:space="preserve"> testing test suite and run with my pipeline.</w:t>
       </w:r>
     </w:p>
     <w:p>
@@ -1100,33 +1878,79 @@
           <w:bCs/>
           <w:iCs/>
         </w:rPr>
-        <w:t>Pass a datastruct library thru a mutation testing suite to see how it performs against my pipeline, try to find examples my pipeline can find that the existing suite cant</w:t>
-      </w:r>
-    </w:p>
-    <w:p>
-      <w:pPr>
+        <w:t xml:space="preserve">Pass a </w:t>
+      </w:r>
+      <w:proofErr w:type="spellStart"/>
+      <w:r>
         <w:rPr>
           <w:b/>
           <w:bCs/>
           <w:iCs/>
         </w:rPr>
-      </w:pPr>
+        <w:t>datastruct</w:t>
+      </w:r>
+      <w:proofErr w:type="spellEnd"/>
       <w:r>
         <w:rPr>
           <w:b/>
           <w:bCs/>
           <w:iCs/>
         </w:rPr>
-        <w:t>Look at open source library with tests at the end</w:t>
-      </w:r>
-    </w:p>
-    <w:p>
-      <w:pPr>
+        <w:t xml:space="preserve"> library thru a mutation testing suite to see how it performs against my pipeline, try to find examples my pipeline can find that the existing suite </w:t>
+      </w:r>
+      <w:proofErr w:type="gramStart"/>
+      <w:r>
         <w:rPr>
           <w:b/>
           <w:bCs/>
           <w:iCs/>
         </w:rPr>
+        <w:t>cant</w:t>
+      </w:r>
+      <w:proofErr w:type="gramEnd"/>
+    </w:p>
+    <w:p>
+      <w:pPr>
+        <w:rPr>
+          <w:b/>
+          <w:bCs/>
+          <w:iCs/>
+        </w:rPr>
+      </w:pPr>
+      <w:r>
+        <w:rPr>
+          <w:b/>
+          <w:bCs/>
+          <w:iCs/>
+        </w:rPr>
+        <w:t xml:space="preserve">Look at </w:t>
+      </w:r>
+      <w:proofErr w:type="gramStart"/>
+      <w:r>
+        <w:rPr>
+          <w:b/>
+          <w:bCs/>
+          <w:iCs/>
+        </w:rPr>
+        <w:t>open source</w:t>
+      </w:r>
+      <w:proofErr w:type="gramEnd"/>
+      <w:r>
+        <w:rPr>
+          <w:b/>
+          <w:bCs/>
+          <w:iCs/>
+        </w:rPr>
+        <w:t xml:space="preserve"> library with tests at the end</w:t>
+      </w:r>
+    </w:p>
+    <w:p>
+      <w:pPr>
+        <w:rPr>
+          <w:b/>
+          <w:bCs/>
+          <w:iCs/>
+        </w:rPr>
       </w:pPr>
     </w:p>
     <w:p>
@@ -1145,7 +1969,21 @@
         <w:rPr>
           <w:iCs/>
         </w:rPr>
-        <w:t xml:space="preserve"> are_equivalent for profiler to check that the arguments to any function called by the top level</w:t>
+        <w:t xml:space="preserve"> </w:t>
+      </w:r>
+      <w:proofErr w:type="spellStart"/>
+      <w:r>
+        <w:rPr>
+          <w:iCs/>
+        </w:rPr>
+        <w:t>are_equivalent</w:t>
+      </w:r>
+      <w:proofErr w:type="spellEnd"/>
+      <w:r>
+        <w:rPr>
+          <w:iCs/>
+        </w:rPr>
+        <w:t xml:space="preserve"> for profiler to check that the arguments to any function called by the top level</w:t>
       </w:r>
       <w:r>
         <w:rPr>
@@ -1184,7 +2022,21 @@
         <w:rPr>
           <w:iCs/>
         </w:rPr>
-        <w:t>One idea: perform static analysis on the function we are fuzzing before we fuzz it to see if it takes a function f as a param, if that function f itself takes a param. Thus we can narrow down which function fuzzing strategy to employ</w:t>
+        <w:t xml:space="preserve">One idea: perform static analysis on the function we are fuzzing before we fuzz it to see if it takes a function f as a param, if that function f itself takes a param. </w:t>
+      </w:r>
+      <w:proofErr w:type="gramStart"/>
+      <w:r>
+        <w:rPr>
+          <w:iCs/>
+        </w:rPr>
+        <w:t>Thus</w:t>
+      </w:r>
+      <w:proofErr w:type="gramEnd"/>
+      <w:r>
+        <w:rPr>
+          <w:iCs/>
+        </w:rPr>
+        <w:t xml:space="preserve"> we can narrow down which function fuzzing strategy to employ</w:t>
       </w:r>
     </w:p>
     <w:p>
@@ -1220,7 +2072,35 @@
         <w:rPr>
           <w:iCs/>
         </w:rPr>
-        <w:t>Functions f that take a single function as a param like f(h): we can check the sig of the function h given, and fuzz some input accordingly to call h with within f.</w:t>
+        <w:t xml:space="preserve">Functions f that </w:t>
+      </w:r>
+      <w:proofErr w:type="gramStart"/>
+      <w:r>
+        <w:rPr>
+          <w:iCs/>
+        </w:rPr>
+        <w:t>take</w:t>
+      </w:r>
+      <w:proofErr w:type="gramEnd"/>
+      <w:r>
+        <w:rPr>
+          <w:iCs/>
+        </w:rPr>
+        <w:t xml:space="preserve"> a single function as a param like f(h): we can check the </w:t>
+      </w:r>
+      <w:proofErr w:type="spellStart"/>
+      <w:r>
+        <w:rPr>
+          <w:iCs/>
+        </w:rPr>
+        <w:t>sig</w:t>
+      </w:r>
+      <w:proofErr w:type="spellEnd"/>
+      <w:r>
+        <w:rPr>
+          <w:iCs/>
+        </w:rPr>
+        <w:t xml:space="preserve"> of the function h given, and fuzz some input accordingly to call h with within f.</w:t>
       </w:r>
     </w:p>
     <w:p>
@@ -1266,22 +2146,86 @@
         <w:rPr>
           <w:iCs/>
         </w:rPr>
-        <w:t>If (state of module_a before running == state of module_a after n steps) !=</w:t>
+        <w:t xml:space="preserve">If (state of </w:t>
+      </w:r>
+      <w:proofErr w:type="spellStart"/>
+      <w:r>
+        <w:rPr>
+          <w:iCs/>
+        </w:rPr>
+        <w:t>module_a</w:t>
+      </w:r>
+      <w:proofErr w:type="spellEnd"/>
+      <w:r>
+        <w:rPr>
+          <w:iCs/>
+        </w:rPr>
+        <w:t xml:space="preserve"> before running == state of </w:t>
+      </w:r>
+      <w:proofErr w:type="spellStart"/>
+      <w:r>
+        <w:rPr>
+          <w:iCs/>
+        </w:rPr>
+        <w:t>module_a</w:t>
+      </w:r>
+      <w:proofErr w:type="spellEnd"/>
+      <w:r>
+        <w:rPr>
+          <w:iCs/>
+        </w:rPr>
+        <w:t xml:space="preserve"> after n steps) !=</w:t>
       </w:r>
       <w:r>
         <w:rPr>
           <w:iCs/>
         </w:rPr>
         <w:br/>
-        <w:t xml:space="preserve">   (state of module_b before running == state of module_b after n steps):</w:t>
+        <w:t xml:space="preserve">   (state of </w:t>
+      </w:r>
+      <w:proofErr w:type="spellStart"/>
+      <w:r>
+        <w:rPr>
+          <w:iCs/>
+        </w:rPr>
+        <w:t>module_b</w:t>
+      </w:r>
+      <w:proofErr w:type="spellEnd"/>
+      <w:r>
+        <w:rPr>
+          <w:iCs/>
+        </w:rPr>
+        <w:t xml:space="preserve"> before running == state of </w:t>
+      </w:r>
+      <w:proofErr w:type="spellStart"/>
+      <w:r>
+        <w:rPr>
+          <w:iCs/>
+        </w:rPr>
+        <w:t>module_b</w:t>
+      </w:r>
+      <w:proofErr w:type="spellEnd"/>
+      <w:r>
+        <w:rPr>
+          <w:iCs/>
+        </w:rPr>
+        <w:t xml:space="preserve"> after n steps):</w:t>
       </w:r>
       <w:r>
         <w:rPr>
           <w:iCs/>
         </w:rPr>
         <w:br/>
-        <w:t xml:space="preserve">   they are inequiv</w:t>
-      </w:r>
+        <w:t xml:space="preserve">   they are </w:t>
+      </w:r>
+      <w:proofErr w:type="spellStart"/>
+      <w:r>
+        <w:rPr>
+          <w:iCs/>
+        </w:rPr>
+        <w:t>inequiv</w:t>
+      </w:r>
+      <w:proofErr w:type="spellEnd"/>
       <w:r>
         <w:rPr>
           <w:iCs/>
@@ -1294,7 +2238,21 @@
           <w:iCs/>
         </w:rPr>
         <w:br/>
-        <w:t xml:space="preserve">Some examples in plain english for my own sanity: </w:t>
+        <w:t xml:space="preserve">Some examples in plain </w:t>
+      </w:r>
+      <w:proofErr w:type="spellStart"/>
+      <w:r>
+        <w:rPr>
+          <w:iCs/>
+        </w:rPr>
+        <w:t>english</w:t>
+      </w:r>
+      <w:proofErr w:type="spellEnd"/>
+      <w:r>
+        <w:rPr>
+          <w:iCs/>
+        </w:rPr>
+        <w:t xml:space="preserve"> for my own sanity: </w:t>
       </w:r>
       <w:r>
         <w:rPr>
@@ -1307,8 +2265,30 @@
           <w:iCs/>
         </w:rPr>
         <w:br/>
-        <w:t>if module_a alters a global variable x after running n steps, but module_b</w:t>
-      </w:r>
+        <w:t xml:space="preserve">if </w:t>
+      </w:r>
+      <w:proofErr w:type="spellStart"/>
+      <w:r>
+        <w:rPr>
+          <w:iCs/>
+        </w:rPr>
+        <w:t>module_a</w:t>
+      </w:r>
+      <w:proofErr w:type="spellEnd"/>
+      <w:r>
+        <w:rPr>
+          <w:iCs/>
+        </w:rPr>
+        <w:t xml:space="preserve"> alters a global variable x after running n steps, but </w:t>
+      </w:r>
+      <w:proofErr w:type="spellStart"/>
+      <w:r>
+        <w:rPr>
+          <w:iCs/>
+        </w:rPr>
+        <w:t>module_b</w:t>
+      </w:r>
+      <w:proofErr w:type="spellEnd"/>
       <w:r>
         <w:rPr>
           <w:iCs/>
@@ -1340,7 +2320,35 @@
           <w:iCs/>
         </w:rPr>
         <w:br/>
-        <w:t>if module_a contains the definition of a global variable x, but it does not change, and module_b does not</w:t>
+        <w:t xml:space="preserve">if </w:t>
+      </w:r>
+      <w:proofErr w:type="spellStart"/>
+      <w:r>
+        <w:rPr>
+          <w:iCs/>
+        </w:rPr>
+        <w:t>module_a</w:t>
+      </w:r>
+      <w:proofErr w:type="spellEnd"/>
+      <w:r>
+        <w:rPr>
+          <w:iCs/>
+        </w:rPr>
+        <w:t xml:space="preserve"> contains the definition of a global variable x, but it does not change, and </w:t>
+      </w:r>
+      <w:proofErr w:type="spellStart"/>
+      <w:r>
+        <w:rPr>
+          <w:iCs/>
+        </w:rPr>
+        <w:t>module_b</w:t>
+      </w:r>
+      <w:proofErr w:type="spellEnd"/>
+      <w:r>
+        <w:rPr>
+          <w:iCs/>
+        </w:rPr>
+        <w:t xml:space="preserve"> does not</w:t>
       </w:r>
       <w:r>
         <w:rPr>
@@ -1367,7 +2375,35 @@
           <w:iCs/>
         </w:rPr>
         <w:br/>
-        <w:t>if module_a alters a global string variable s after running n steps, but module_b alters a global int</w:t>
+        <w:t xml:space="preserve">if </w:t>
+      </w:r>
+      <w:proofErr w:type="spellStart"/>
+      <w:r>
+        <w:rPr>
+          <w:iCs/>
+        </w:rPr>
+        <w:t>module_a</w:t>
+      </w:r>
+      <w:proofErr w:type="spellEnd"/>
+      <w:r>
+        <w:rPr>
+          <w:iCs/>
+        </w:rPr>
+        <w:t xml:space="preserve"> alters a global string variable s after running n steps, but </w:t>
+      </w:r>
+      <w:proofErr w:type="spellStart"/>
+      <w:r>
+        <w:rPr>
+          <w:iCs/>
+        </w:rPr>
+        <w:t>module_b</w:t>
+      </w:r>
+      <w:proofErr w:type="spellEnd"/>
+      <w:r>
+        <w:rPr>
+          <w:iCs/>
+        </w:rPr>
+        <w:t xml:space="preserve"> alters a global int</w:t>
       </w:r>
       <w:r>
         <w:rPr>
@@ -1410,7 +2446,7 @@
         </w:rPr>
         <w:t xml:space="preserve">Experimented with mutation testing. Started with </w:t>
       </w:r>
-      <w:hyperlink r:id="rId14" w:history="1">
+      <w:hyperlink r:id="rId13" w:history="1">
         <w:r>
           <w:rPr>
             <w:rStyle w:val="Hyperlink"/>
@@ -1503,7 +2539,25 @@
           <w:bCs/>
           <w:iCs/>
         </w:rPr>
-        <w:t xml:space="preserve">Running mutmut on requests: </w:t>
+        <w:t xml:space="preserve">Running </w:t>
+      </w:r>
+      <w:proofErr w:type="spellStart"/>
+      <w:r>
+        <w:rPr>
+          <w:b/>
+          <w:bCs/>
+          <w:iCs/>
+        </w:rPr>
+        <w:t>mutmut</w:t>
+      </w:r>
+      <w:proofErr w:type="spellEnd"/>
+      <w:r>
+        <w:rPr>
+          <w:b/>
+          <w:bCs/>
+          <w:iCs/>
+        </w:rPr>
+        <w:t xml:space="preserve"> on requests: </w:t>
       </w:r>
     </w:p>
     <w:p>
@@ -1536,7 +2590,14 @@
         <w:rPr>
           <w:iCs/>
         </w:rPr>
-        <w:t xml:space="preserve"> 3673/3673  </w:t>
+        <w:t xml:space="preserve"> 3673/</w:t>
+      </w:r>
+      <w:proofErr w:type="gramStart"/>
+      <w:r>
+        <w:rPr>
+          <w:iCs/>
+        </w:rPr>
+        <w:t xml:space="preserve">3673  </w:t>
       </w:r>
       <w:r>
         <w:rPr>
@@ -1545,6 +2606,7 @@
         </w:rPr>
         <w:t>🎉</w:t>
       </w:r>
+      <w:proofErr w:type="gramEnd"/>
       <w:r>
         <w:rPr>
           <w:iCs/>
@@ -1672,7 +2734,21 @@
         <w:rPr>
           <w:iCs/>
         </w:rPr>
-        <w:t>After adding class based stuff</w:t>
+        <w:t xml:space="preserve">After adding </w:t>
+      </w:r>
+      <w:proofErr w:type="gramStart"/>
+      <w:r>
+        <w:rPr>
+          <w:iCs/>
+        </w:rPr>
+        <w:t>class based</w:t>
+      </w:r>
+      <w:proofErr w:type="gramEnd"/>
+      <w:r>
+        <w:rPr>
+          <w:iCs/>
+        </w:rPr>
+        <w:t xml:space="preserve"> stuff</w:t>
       </w:r>
     </w:p>
     <w:p>
@@ -1763,7 +2839,14 @@
         <w:rPr>
           <w:iCs/>
         </w:rPr>
-        <w:t xml:space="preserve"> 445/445  </w:t>
+        <w:t xml:space="preserve"> 445/</w:t>
+      </w:r>
+      <w:proofErr w:type="gramStart"/>
+      <w:r>
+        <w:rPr>
+          <w:iCs/>
+        </w:rPr>
+        <w:t xml:space="preserve">445  </w:t>
       </w:r>
       <w:r>
         <w:rPr>
@@ -1772,6 +2855,7 @@
         </w:rPr>
         <w:t>🎉</w:t>
       </w:r>
+      <w:proofErr w:type="gramEnd"/>
       <w:r>
         <w:rPr>
           <w:iCs/>
@@ -1873,54 +2957,121 @@
         <w:rPr>
           <w:iCs/>
         </w:rPr>
-        <w:t>270/445 after adding more class based stuff</w:t>
-      </w:r>
-    </w:p>
-    <w:p>
-      <w:pPr>
-        <w:rPr>
-          <w:iCs/>
-        </w:rPr>
-      </w:pPr>
-    </w:p>
-    <w:p>
-      <w:pPr>
-        <w:rPr>
-          <w:iCs/>
-        </w:rPr>
-      </w:pPr>
-    </w:p>
-    <w:p>
-      <w:pPr>
-        <w:rPr>
-          <w:iCs/>
-        </w:rPr>
-      </w:pPr>
-      <w:r>
-        <w:rPr>
-          <w:iCs/>
-        </w:rPr>
-        <w:t>With the following addition to pyproject.toml</w:t>
-      </w:r>
-    </w:p>
-    <w:p>
-      <w:pPr>
-        <w:rPr>
-          <w:iCs/>
-        </w:rPr>
-      </w:pPr>
-      <w:r>
-        <w:rPr>
-          <w:iCs/>
-        </w:rPr>
-        <w:t>[tool.mutmut]</w:t>
+        <w:t xml:space="preserve">270/445 after adding more </w:t>
+      </w:r>
+      <w:proofErr w:type="gramStart"/>
+      <w:r>
+        <w:rPr>
+          <w:iCs/>
+        </w:rPr>
+        <w:t>class based</w:t>
+      </w:r>
+      <w:proofErr w:type="gramEnd"/>
+      <w:r>
+        <w:rPr>
+          <w:iCs/>
+        </w:rPr>
+        <w:t xml:space="preserve"> stuff</w:t>
+      </w:r>
+    </w:p>
+    <w:p>
+      <w:pPr>
+        <w:rPr>
+          <w:iCs/>
+        </w:rPr>
+      </w:pPr>
+    </w:p>
+    <w:p>
+      <w:pPr>
+        <w:rPr>
+          <w:iCs/>
+        </w:rPr>
+      </w:pPr>
+    </w:p>
+    <w:p>
+      <w:pPr>
+        <w:rPr>
+          <w:iCs/>
+        </w:rPr>
+      </w:pPr>
+      <w:r>
+        <w:rPr>
+          <w:iCs/>
+        </w:rPr>
+        <w:t xml:space="preserve">With the following addition to </w:t>
+      </w:r>
+      <w:proofErr w:type="spellStart"/>
+      <w:proofErr w:type="gramStart"/>
+      <w:r>
+        <w:rPr>
+          <w:iCs/>
+        </w:rPr>
+        <w:t>pyproject.toml</w:t>
+      </w:r>
+      <w:proofErr w:type="spellEnd"/>
+      <w:proofErr w:type="gramEnd"/>
+    </w:p>
+    <w:p>
+      <w:pPr>
+        <w:rPr>
+          <w:iCs/>
+        </w:rPr>
+      </w:pPr>
+      <w:r>
+        <w:rPr>
+          <w:iCs/>
+        </w:rPr>
+        <w:t>[</w:t>
+      </w:r>
+      <w:proofErr w:type="spellStart"/>
+      <w:proofErr w:type="gramStart"/>
+      <w:r>
+        <w:rPr>
+          <w:iCs/>
+        </w:rPr>
+        <w:t>tool.mutmut</w:t>
+      </w:r>
+      <w:proofErr w:type="spellEnd"/>
+      <w:proofErr w:type="gramEnd"/>
+      <w:r>
+        <w:rPr>
+          <w:iCs/>
+        </w:rPr>
+        <w:t>]</w:t>
       </w:r>
       <w:r>
         <w:rPr>
           <w:iCs/>
         </w:rPr>
         <w:br/>
-        <w:t>pytest_add_cli_args = ["-k", "not test_env_cert_bundles and not test_different_connection_pool_for_tls_settings_verify_bundle_unexpired_cert"]</w:t>
+      </w:r>
+      <w:proofErr w:type="spellStart"/>
+      <w:r>
+        <w:rPr>
+          <w:iCs/>
+        </w:rPr>
+        <w:t>pytest_add_cli_args</w:t>
+      </w:r>
+      <w:proofErr w:type="spellEnd"/>
+      <w:r>
+        <w:rPr>
+          <w:iCs/>
+        </w:rPr>
+        <w:t xml:space="preserve"> = ["-k", "not </w:t>
+      </w:r>
+      <w:proofErr w:type="spellStart"/>
+      <w:r>
+        <w:rPr>
+          <w:iCs/>
+        </w:rPr>
+        <w:t>test_env_cert_bundles</w:t>
+      </w:r>
+      <w:proofErr w:type="spellEnd"/>
+      <w:r>
+        <w:rPr>
+          <w:iCs/>
+        </w:rPr>
+        <w:t xml:space="preserve"> and not test_different_connection_pool_for_tls_settings_verify_bundle_unexpired_cert"]</w:t>
       </w:r>
     </w:p>
     <w:p>
@@ -1993,7 +3144,21 @@
         <w:rPr>
           <w:iCs/>
         </w:rPr>
-        <w:t>Functions can alter  global state</w:t>
+        <w:t xml:space="preserve">Functions can </w:t>
+      </w:r>
+      <w:proofErr w:type="gramStart"/>
+      <w:r>
+        <w:rPr>
+          <w:iCs/>
+        </w:rPr>
+        <w:t>alter  global</w:t>
+      </w:r>
+      <w:proofErr w:type="gramEnd"/>
+      <w:r>
+        <w:rPr>
+          <w:iCs/>
+        </w:rPr>
+        <w:t xml:space="preserve"> state</w:t>
       </w:r>
     </w:p>
     <w:p>
@@ -2039,7 +3204,21 @@
         <w:rPr>
           <w:iCs/>
         </w:rPr>
-        <w:t>What do I say about translating hobbit to python in the thesis? That I used gpt?</w:t>
+        <w:t xml:space="preserve">What do I say about translating hobbit to python in the thesis? That I used </w:t>
+      </w:r>
+      <w:proofErr w:type="spellStart"/>
+      <w:r>
+        <w:rPr>
+          <w:iCs/>
+        </w:rPr>
+        <w:t>gpt</w:t>
+      </w:r>
+      <w:proofErr w:type="spellEnd"/>
+      <w:r>
+        <w:rPr>
+          <w:iCs/>
+        </w:rPr>
+        <w:t>?</w:t>
       </w:r>
     </w:p>
     <w:p>
@@ -2065,8 +3244,16 @@
         <w:rPr>
           <w:iCs/>
         </w:rPr>
-        <w:t>How do I treat two programs where 1 has global state and the other doesnt</w:t>
-      </w:r>
+        <w:t xml:space="preserve">How do I treat two programs where 1 has global state and the other </w:t>
+      </w:r>
+      <w:proofErr w:type="spellStart"/>
+      <w:r>
+        <w:rPr>
+          <w:iCs/>
+        </w:rPr>
+        <w:t>doesnt</w:t>
+      </w:r>
+      <w:proofErr w:type="spellEnd"/>
     </w:p>
     <w:p>
       <w:pPr>
@@ -2098,7 +3285,23 @@
         <w:rPr>
           <w:iCs/>
         </w:rPr>
-        <w:t>We cant see internal recursion</w:t>
+        <w:t xml:space="preserve">We </w:t>
+      </w:r>
+      <w:proofErr w:type="spellStart"/>
+      <w:proofErr w:type="gramStart"/>
+      <w:r>
+        <w:rPr>
+          <w:iCs/>
+        </w:rPr>
+        <w:t>cant</w:t>
+      </w:r>
+      <w:proofErr w:type="spellEnd"/>
+      <w:proofErr w:type="gramEnd"/>
+      <w:r>
+        <w:rPr>
+          <w:iCs/>
+        </w:rPr>
+        <w:t xml:space="preserve"> see internal recursion</w:t>
       </w:r>
     </w:p>
     <w:p>
@@ -2120,24 +3323,46 @@
           <w:iCs/>
         </w:rPr>
       </w:pPr>
-      <w:r>
-        <w:rPr>
-          <w:iCs/>
-        </w:rPr>
-        <w:t xml:space="preserve">Reentrancy. </w:t>
-      </w:r>
-    </w:p>
-    <w:p>
-      <w:pPr>
-        <w:rPr>
-          <w:iCs/>
-        </w:rPr>
-      </w:pPr>
-      <w:r>
-        <w:rPr>
-          <w:iCs/>
-        </w:rPr>
-        <w:t>Function can make a choice between all funcs it knows</w:t>
+      <w:proofErr w:type="spellStart"/>
+      <w:r>
+        <w:rPr>
+          <w:iCs/>
+        </w:rPr>
+        <w:t>Reentrancy</w:t>
+      </w:r>
+      <w:proofErr w:type="spellEnd"/>
+      <w:r>
+        <w:rPr>
+          <w:iCs/>
+        </w:rPr>
+        <w:t xml:space="preserve">. </w:t>
+      </w:r>
+    </w:p>
+    <w:p>
+      <w:pPr>
+        <w:rPr>
+          <w:iCs/>
+        </w:rPr>
+      </w:pPr>
+      <w:r>
+        <w:rPr>
+          <w:iCs/>
+        </w:rPr>
+        <w:t xml:space="preserve">Function can make a choice between all </w:t>
+      </w:r>
+      <w:proofErr w:type="spellStart"/>
+      <w:r>
+        <w:rPr>
+          <w:iCs/>
+        </w:rPr>
+        <w:t>funcs</w:t>
+      </w:r>
+      <w:proofErr w:type="spellEnd"/>
+      <w:r>
+        <w:rPr>
+          <w:iCs/>
+        </w:rPr>
+        <w:t xml:space="preserve"> it knows</w:t>
       </w:r>
     </w:p>
     <w:p>
@@ -2172,11 +3397,19 @@
           <w:iCs/>
         </w:rPr>
       </w:pPr>
-      <w:r>
-        <w:rPr>
-          <w:iCs/>
-        </w:rPr>
-        <w:t>Have to retranslate hobbit suite</w:t>
+      <w:proofErr w:type="gramStart"/>
+      <w:r>
+        <w:rPr>
+          <w:iCs/>
+        </w:rPr>
+        <w:t>Have to</w:t>
+      </w:r>
+      <w:proofErr w:type="gramEnd"/>
+      <w:r>
+        <w:rPr>
+          <w:iCs/>
+        </w:rPr>
+        <w:t xml:space="preserve"> retranslate hobbit suite</w:t>
       </w:r>
     </w:p>
     <w:p>
@@ -2250,27 +3483,37 @@
           <w:bCs/>
           <w:iCs/>
         </w:rPr>
-        <w:t>Check on cross_reentrancy_param</w:t>
-      </w:r>
-    </w:p>
-    <w:p>
-      <w:pPr>
-        <w:rPr>
-          <w:iCs/>
-        </w:rPr>
-      </w:pPr>
-      <w:r>
-        <w:rPr>
-          <w:iCs/>
-        </w:rPr>
-        <w:t xml:space="preserve">Added functionality that if a higher order function returns a </w:t>
-      </w:r>
+        <w:t xml:space="preserve">Check on </w:t>
+      </w:r>
+      <w:proofErr w:type="spellStart"/>
       <w:r>
         <w:rPr>
           <w:b/>
           <w:bCs/>
           <w:iCs/>
         </w:rPr>
+        <w:t>cross_reentrancy_param</w:t>
+      </w:r>
+      <w:proofErr w:type="spellEnd"/>
+    </w:p>
+    <w:p>
+      <w:pPr>
+        <w:rPr>
+          <w:iCs/>
+        </w:rPr>
+      </w:pPr>
+      <w:r>
+        <w:rPr>
+          <w:iCs/>
+        </w:rPr>
+        <w:t xml:space="preserve">Added functionality that if a higher order function returns a </w:t>
+      </w:r>
+      <w:r>
+        <w:rPr>
+          <w:b/>
+          <w:bCs/>
+          <w:iCs/>
+        </w:rPr>
         <w:t>tuple</w:t>
       </w:r>
       <w:r>
@@ -2365,73 +3608,222 @@
         <w:rPr>
           <w:iCs/>
         </w:rPr>
-        <w:t>Seemingly obvious bugs might be overlooked. For bsearch_1, the failing input is 2. Even if I add an int type annotation, the fuzzer can fully fail to discover the bug because it never tried 2, it tried thousands of other numbers but not 2. Highlights a weakness of coverage-guidedness in a function where coverage wont change meaningfully</w:t>
-      </w:r>
-    </w:p>
-    <w:p>
-      <w:pPr>
-        <w:rPr>
-          <w:iCs/>
-        </w:rPr>
-      </w:pPr>
-    </w:p>
-    <w:p>
-      <w:pPr>
-        <w:rPr>
-          <w:iCs/>
-        </w:rPr>
-      </w:pPr>
-      <w:r>
-        <w:rPr>
-          <w:iCs/>
-        </w:rPr>
-        <w:t>Added ability for fuzzer to handle functions that take objects of custom classes as arguments but only if the argument is type annotation.</w:t>
-      </w:r>
-    </w:p>
-    <w:p>
-      <w:pPr>
-        <w:rPr>
-          <w:iCs/>
-        </w:rPr>
-      </w:pPr>
-      <w:r>
-        <w:rPr>
-          <w:iCs/>
-        </w:rPr>
-        <w:t>Improved ability to use type annotations, specifically we can now create containers of callables from type annotations</w:t>
-      </w:r>
-    </w:p>
-    <w:p>
-      <w:pPr>
-        <w:rPr>
-          <w:iCs/>
-        </w:rPr>
-      </w:pPr>
-    </w:p>
-    <w:p>
-      <w:pPr>
-        <w:rPr>
-          <w:iCs/>
-        </w:rPr>
-      </w:pPr>
-      <w:r>
-        <w:rPr>
-          <w:iCs/>
-        </w:rPr>
-        <w:t>Need to add functionality for:</w:t>
-      </w:r>
-    </w:p>
-    <w:p>
-      <w:pPr>
-        <w:rPr>
-          <w:iCs/>
-        </w:rPr>
-      </w:pPr>
-      <w:r>
-        <w:rPr>
-          <w:iCs/>
-        </w:rPr>
-        <w:t xml:space="preserve">Function that </w:t>
+        <w:t xml:space="preserve">Seemingly obvious bugs might be overlooked. For bsearch_1, the failing input is 2. Even if I add an int type annotation, the </w:t>
+      </w:r>
+      <w:proofErr w:type="spellStart"/>
+      <w:r>
+        <w:rPr>
+          <w:iCs/>
+        </w:rPr>
+        <w:t>fuzzer</w:t>
+      </w:r>
+      <w:proofErr w:type="spellEnd"/>
+      <w:r>
+        <w:rPr>
+          <w:iCs/>
+        </w:rPr>
+        <w:t xml:space="preserve"> can fully fail to discover the bug because it never tried 2, it tried thousands of other numbers but not 2. Highlights a weakness of coverage-</w:t>
+      </w:r>
+      <w:proofErr w:type="spellStart"/>
+      <w:r>
+        <w:rPr>
+          <w:iCs/>
+        </w:rPr>
+        <w:t>guidedness</w:t>
+      </w:r>
+      <w:proofErr w:type="spellEnd"/>
+      <w:r>
+        <w:rPr>
+          <w:iCs/>
+        </w:rPr>
+        <w:t xml:space="preserve"> in a function </w:t>
+      </w:r>
+      <w:proofErr w:type="gramStart"/>
+      <w:r>
+        <w:rPr>
+          <w:iCs/>
+        </w:rPr>
+        <w:t>where</w:t>
+      </w:r>
+      <w:proofErr w:type="gramEnd"/>
+      <w:r>
+        <w:rPr>
+          <w:iCs/>
+        </w:rPr>
+        <w:t xml:space="preserve"> coverage </w:t>
+      </w:r>
+      <w:proofErr w:type="spellStart"/>
+      <w:r>
+        <w:rPr>
+          <w:iCs/>
+        </w:rPr>
+        <w:t>wont</w:t>
+      </w:r>
+      <w:proofErr w:type="spellEnd"/>
+      <w:r>
+        <w:rPr>
+          <w:iCs/>
+        </w:rPr>
+        <w:t xml:space="preserve"> change meaningfully</w:t>
+      </w:r>
+    </w:p>
+    <w:p>
+      <w:pPr>
+        <w:rPr>
+          <w:iCs/>
+        </w:rPr>
+      </w:pPr>
+    </w:p>
+    <w:p>
+      <w:pPr>
+        <w:rPr>
+          <w:iCs/>
+        </w:rPr>
+      </w:pPr>
+      <w:r>
+        <w:rPr>
+          <w:iCs/>
+        </w:rPr>
+        <w:t xml:space="preserve">Added ability for </w:t>
+      </w:r>
+      <w:proofErr w:type="spellStart"/>
+      <w:r>
+        <w:rPr>
+          <w:iCs/>
+        </w:rPr>
+        <w:t>fuzzer</w:t>
+      </w:r>
+      <w:proofErr w:type="spellEnd"/>
+      <w:r>
+        <w:rPr>
+          <w:iCs/>
+        </w:rPr>
+        <w:t xml:space="preserve"> to handle functions that take objects of custom classes as arguments but only if the argument is type annotation.</w:t>
+      </w:r>
+    </w:p>
+    <w:p>
+      <w:pPr>
+        <w:rPr>
+          <w:iCs/>
+        </w:rPr>
+      </w:pPr>
+      <w:r>
+        <w:rPr>
+          <w:iCs/>
+        </w:rPr>
+        <w:t xml:space="preserve">Improved ability to use type annotations, specifically we can now create containers of </w:t>
+      </w:r>
+      <w:proofErr w:type="spellStart"/>
+      <w:r>
+        <w:rPr>
+          <w:iCs/>
+        </w:rPr>
+        <w:t>callables</w:t>
+      </w:r>
+      <w:proofErr w:type="spellEnd"/>
+      <w:r>
+        <w:rPr>
+          <w:iCs/>
+        </w:rPr>
+        <w:t xml:space="preserve"> from type annotations</w:t>
+      </w:r>
+    </w:p>
+    <w:p>
+      <w:pPr>
+        <w:rPr>
+          <w:iCs/>
+        </w:rPr>
+      </w:pPr>
+    </w:p>
+    <w:p>
+      <w:pPr>
+        <w:rPr>
+          <w:iCs/>
+        </w:rPr>
+      </w:pPr>
+      <w:r>
+        <w:rPr>
+          <w:iCs/>
+        </w:rPr>
+        <w:t xml:space="preserve">Added check to logs that they have </w:t>
+      </w:r>
+    </w:p>
+    <w:p>
+      <w:pPr>
+        <w:pStyle w:val="ListParagraph"/>
+        <w:numPr>
+          <w:ilvl w:val="0"/>
+          <w:numId w:val="10"/>
+        </w:numPr>
+        <w:rPr>
+          <w:iCs/>
+        </w:rPr>
+      </w:pPr>
+      <w:r>
+        <w:rPr>
+          <w:iCs/>
+        </w:rPr>
+        <w:t>The same number of exceptions</w:t>
+      </w:r>
+    </w:p>
+    <w:p>
+      <w:pPr>
+        <w:pStyle w:val="ListParagraph"/>
+        <w:numPr>
+          <w:ilvl w:val="0"/>
+          <w:numId w:val="10"/>
+        </w:numPr>
+        <w:rPr>
+          <w:iCs/>
+        </w:rPr>
+      </w:pPr>
+      <w:r>
+        <w:rPr>
+          <w:iCs/>
+        </w:rPr>
+        <w:t xml:space="preserve">If the top level </w:t>
+      </w:r>
+      <w:proofErr w:type="spellStart"/>
+      <w:r>
+        <w:rPr>
+          <w:iCs/>
+        </w:rPr>
+        <w:t>funcs</w:t>
+      </w:r>
+      <w:proofErr w:type="spellEnd"/>
+      <w:r>
+        <w:rPr>
+          <w:iCs/>
+        </w:rPr>
+        <w:t xml:space="preserve"> take callable </w:t>
+      </w:r>
+      <w:proofErr w:type="spellStart"/>
+      <w:r>
+        <w:rPr>
+          <w:iCs/>
+        </w:rPr>
+        <w:t>args</w:t>
+      </w:r>
+      <w:proofErr w:type="spellEnd"/>
+      <w:r>
+        <w:rPr>
+          <w:iCs/>
+        </w:rPr>
+        <w:t xml:space="preserve">, the callable </w:t>
+      </w:r>
+      <w:proofErr w:type="spellStart"/>
+      <w:r>
+        <w:rPr>
+          <w:iCs/>
+        </w:rPr>
+        <w:t>args</w:t>
+      </w:r>
+      <w:proofErr w:type="spellEnd"/>
+      <w:r>
+        <w:rPr>
+          <w:iCs/>
+        </w:rPr>
+        <w:t xml:space="preserve"> are called the same number of times</w:t>
       </w:r>
     </w:p>
     <w:p/>
@@ -2596,6 +3988,95 @@
     </w:lvl>
   </w:abstractNum>
   <w:abstractNum w:abstractNumId="1" w15:restartNumberingAfterBreak="0">
+    <w:nsid w:val="110E6C9D"/>
+    <w:multiLevelType w:val="hybridMultilevel"/>
+    <w:tmpl w:val="FE548766"/>
+    <w:lvl w:ilvl="0" w:tplc="0809000F">
+      <w:start w:val="1"/>
+      <w:numFmt w:val="decimal"/>
+      <w:lvlText w:val="%1."/>
+      <w:lvlJc w:val="left"/>
+      <w:pPr>
+        <w:ind w:left="720" w:hanging="360"/>
+      </w:pPr>
+      <w:rPr>
+        <w:rFonts w:hint="default"/>
+      </w:rPr>
+    </w:lvl>
+    <w:lvl w:ilvl="1" w:tplc="08090019" w:tentative="1">
+      <w:start w:val="1"/>
+      <w:numFmt w:val="lowerLetter"/>
+      <w:lvlText w:val="%2."/>
+      <w:lvlJc w:val="left"/>
+      <w:pPr>
+        <w:ind w:left="1440" w:hanging="360"/>
+      </w:pPr>
+    </w:lvl>
+    <w:lvl w:ilvl="2" w:tplc="0809001B" w:tentative="1">
+      <w:start w:val="1"/>
+      <w:numFmt w:val="lowerRoman"/>
+      <w:lvlText w:val="%3."/>
+      <w:lvlJc w:val="right"/>
+      <w:pPr>
+        <w:ind w:left="2160" w:hanging="180"/>
+      </w:pPr>
+    </w:lvl>
+    <w:lvl w:ilvl="3" w:tplc="0809000F" w:tentative="1">
+      <w:start w:val="1"/>
+      <w:numFmt w:val="decimal"/>
+      <w:lvlText w:val="%4."/>
+      <w:lvlJc w:val="left"/>
+      <w:pPr>
+        <w:ind w:left="2880" w:hanging="360"/>
+      </w:pPr>
+    </w:lvl>
+    <w:lvl w:ilvl="4" w:tplc="08090019" w:tentative="1">
+      <w:start w:val="1"/>
+      <w:numFmt w:val="lowerLetter"/>
+      <w:lvlText w:val="%5."/>
+      <w:lvlJc w:val="left"/>
+      <w:pPr>
+        <w:ind w:left="3600" w:hanging="360"/>
+      </w:pPr>
+    </w:lvl>
+    <w:lvl w:ilvl="5" w:tplc="0809001B" w:tentative="1">
+      <w:start w:val="1"/>
+      <w:numFmt w:val="lowerRoman"/>
+      <w:lvlText w:val="%6."/>
+      <w:lvlJc w:val="right"/>
+      <w:pPr>
+        <w:ind w:left="4320" w:hanging="180"/>
+      </w:pPr>
+    </w:lvl>
+    <w:lvl w:ilvl="6" w:tplc="0809000F" w:tentative="1">
+      <w:start w:val="1"/>
+      <w:numFmt w:val="decimal"/>
+      <w:lvlText w:val="%7."/>
+      <w:lvlJc w:val="left"/>
+      <w:pPr>
+        <w:ind w:left="5040" w:hanging="360"/>
+      </w:pPr>
+    </w:lvl>
+    <w:lvl w:ilvl="7" w:tplc="08090019" w:tentative="1">
+      <w:start w:val="1"/>
+      <w:numFmt w:val="lowerLetter"/>
+      <w:lvlText w:val="%8."/>
+      <w:lvlJc w:val="left"/>
+      <w:pPr>
+        <w:ind w:left="5760" w:hanging="360"/>
+      </w:pPr>
+    </w:lvl>
+    <w:lvl w:ilvl="8" w:tplc="0809001B" w:tentative="1">
+      <w:start w:val="1"/>
+      <w:numFmt w:val="lowerRoman"/>
+      <w:lvlText w:val="%9."/>
+      <w:lvlJc w:val="right"/>
+      <w:pPr>
+        <w:ind w:left="6480" w:hanging="180"/>
+      </w:pPr>
+    </w:lvl>
+  </w:abstractNum>
+  <w:abstractNum w:abstractNumId="2" w15:restartNumberingAfterBreak="0">
     <w:nsid w:val="162C5017"/>
     <w:multiLevelType w:val="hybridMultilevel"/>
     <w:tmpl w:val="8CDC5EBE"/>
@@ -2708,7 +4189,7 @@
       </w:rPr>
     </w:lvl>
   </w:abstractNum>
-  <w:abstractNum w:abstractNumId="2" w15:restartNumberingAfterBreak="0">
+  <w:abstractNum w:abstractNumId="3" w15:restartNumberingAfterBreak="0">
     <w:nsid w:val="331E3DD0"/>
     <w:multiLevelType w:val="hybridMultilevel"/>
     <w:tmpl w:val="4B30DAB0"/>
@@ -2821,7 +4302,7 @@
       </w:rPr>
     </w:lvl>
   </w:abstractNum>
-  <w:abstractNum w:abstractNumId="3" w15:restartNumberingAfterBreak="0">
+  <w:abstractNum w:abstractNumId="4" w15:restartNumberingAfterBreak="0">
     <w:nsid w:val="3F1B4245"/>
     <w:multiLevelType w:val="hybridMultilevel"/>
     <w:tmpl w:val="31E0EA9E"/>
@@ -2934,7 +4415,7 @@
       </w:rPr>
     </w:lvl>
   </w:abstractNum>
-  <w:abstractNum w:abstractNumId="4" w15:restartNumberingAfterBreak="0">
+  <w:abstractNum w:abstractNumId="5" w15:restartNumberingAfterBreak="0">
     <w:nsid w:val="48A51D20"/>
     <w:multiLevelType w:val="hybridMultilevel"/>
     <w:tmpl w:val="5768A5B8"/>
@@ -3023,7 +4504,7 @@
       </w:pPr>
     </w:lvl>
   </w:abstractNum>
-  <w:abstractNum w:abstractNumId="5" w15:restartNumberingAfterBreak="0">
+  <w:abstractNum w:abstractNumId="6" w15:restartNumberingAfterBreak="0">
     <w:nsid w:val="4B6C3F3B"/>
     <w:multiLevelType w:val="hybridMultilevel"/>
     <w:tmpl w:val="7A6A9006"/>
@@ -3136,7 +4617,7 @@
       </w:rPr>
     </w:lvl>
   </w:abstractNum>
-  <w:abstractNum w:abstractNumId="6" w15:restartNumberingAfterBreak="0">
+  <w:abstractNum w:abstractNumId="7" w15:restartNumberingAfterBreak="0">
     <w:nsid w:val="579A06EE"/>
     <w:multiLevelType w:val="hybridMultilevel"/>
     <w:tmpl w:val="F2F43A54"/>
@@ -3249,7 +4730,7 @@
       </w:rPr>
     </w:lvl>
   </w:abstractNum>
-  <w:abstractNum w:abstractNumId="7" w15:restartNumberingAfterBreak="0">
+  <w:abstractNum w:abstractNumId="8" w15:restartNumberingAfterBreak="0">
     <w:nsid w:val="6AB61A83"/>
     <w:multiLevelType w:val="hybridMultilevel"/>
     <w:tmpl w:val="76844AC0"/>
@@ -3362,7 +4843,7 @@
       </w:rPr>
     </w:lvl>
   </w:abstractNum>
-  <w:abstractNum w:abstractNumId="8" w15:restartNumberingAfterBreak="0">
+  <w:abstractNum w:abstractNumId="9" w15:restartNumberingAfterBreak="0">
     <w:nsid w:val="6E9A5F6C"/>
     <w:multiLevelType w:val="hybridMultilevel"/>
     <w:tmpl w:val="0F1AB72E"/>
@@ -3476,31 +4957,34 @@
     </w:lvl>
   </w:abstractNum>
   <w:num w:numId="1" w16cid:durableId="1701930696">
-    <w:abstractNumId w:val="5"/>
+    <w:abstractNumId w:val="6"/>
   </w:num>
   <w:num w:numId="2" w16cid:durableId="1842548276">
     <w:abstractNumId w:val="0"/>
   </w:num>
   <w:num w:numId="3" w16cid:durableId="1539927109">
+    <w:abstractNumId w:val="8"/>
+  </w:num>
+  <w:num w:numId="4" w16cid:durableId="829977371">
+    <w:abstractNumId w:val="2"/>
+  </w:num>
+  <w:num w:numId="5" w16cid:durableId="725490437">
+    <w:abstractNumId w:val="3"/>
+  </w:num>
+  <w:num w:numId="6" w16cid:durableId="448285351">
+    <w:abstractNumId w:val="5"/>
+  </w:num>
+  <w:num w:numId="7" w16cid:durableId="1989281346">
+    <w:abstractNumId w:val="4"/>
+  </w:num>
+  <w:num w:numId="8" w16cid:durableId="1263143941">
     <w:abstractNumId w:val="7"/>
   </w:num>
-  <w:num w:numId="4" w16cid:durableId="829977371">
+  <w:num w:numId="9" w16cid:durableId="1135561271">
+    <w:abstractNumId w:val="9"/>
+  </w:num>
+  <w:num w:numId="10" w16cid:durableId="1486043102">
     <w:abstractNumId w:val="1"/>
-  </w:num>
-  <w:num w:numId="5" w16cid:durableId="725490437">
-    <w:abstractNumId w:val="2"/>
-  </w:num>
-  <w:num w:numId="6" w16cid:durableId="448285351">
-    <w:abstractNumId w:val="4"/>
-  </w:num>
-  <w:num w:numId="7" w16cid:durableId="1989281346">
-    <w:abstractNumId w:val="3"/>
-  </w:num>
-  <w:num w:numId="8" w16cid:durableId="1263143941">
-    <w:abstractNumId w:val="6"/>
-  </w:num>
-  <w:num w:numId="9" w16cid:durableId="1135561271">
-    <w:abstractNumId w:val="8"/>
   </w:num>
 </w:numbering>
 </file>

</xml_diff>

<commit_message>
Add support for functions that take expect objects as input
</commit_message>
<xml_diff>
--- a/Masters project notes.docx
+++ b/Masters project notes.docx
@@ -154,28 +154,15 @@
         </w:rPr>
         <w:t xml:space="preserve">HypoFuzz </w:t>
       </w:r>
-      <w:r>
-        <w:fldChar w:fldCharType="begin"/>
-      </w:r>
-      <w:r>
-        <w:rPr>
-          <w:lang w:val="de-DE"/>
-        </w:rPr>
-        <w:instrText>HYPERLINK "https://github.com/Zac-HD/hypofuzz"</w:instrText>
-      </w:r>
-      <w:r>
-        <w:fldChar w:fldCharType="separate"/>
-      </w:r>
-      <w:r>
-        <w:rPr>
-          <w:rStyle w:val="Hyperlink"/>
-          <w:lang w:val="de-DE"/>
-        </w:rPr>
-        <w:t>https://github.com/Zac-HD/hypofuzz</w:t>
-      </w:r>
-      <w:r>
-        <w:fldChar w:fldCharType="end"/>
-      </w:r>
+      <w:hyperlink r:id="rId8" w:history="1">
+        <w:r>
+          <w:rPr>
+            <w:rStyle w:val="Hyperlink"/>
+            <w:lang w:val="de-DE"/>
+          </w:rPr>
+          <w:t>https://github.com/Zac-HD/hypofuzz</w:t>
+        </w:r>
+      </w:hyperlink>
     </w:p>
     <w:p>
       <w:pPr>
@@ -208,7 +195,7 @@
       <w:r>
         <w:t xml:space="preserve"> </w:t>
       </w:r>
-      <w:hyperlink r:id="rId8" w:history="1">
+      <w:hyperlink r:id="rId9" w:history="1">
         <w:r>
           <w:rPr>
             <w:rStyle w:val="Hyperlink"/>
@@ -1175,7 +1162,7 @@
                     <pic:cNvPicPr/>
                   </pic:nvPicPr>
                   <pic:blipFill>
-                    <a:blip r:embed="rId9"/>
+                    <a:blip r:embed="rId10"/>
                     <a:stretch>
                       <a:fillRect/>
                     </a:stretch>
@@ -1251,7 +1238,7 @@
     <w:p/>
     <w:p/>
     <w:p>
-      <w:hyperlink r:id="rId10" w:history="1">
+      <w:hyperlink r:id="rId11" w:history="1">
         <w:r>
           <w:rPr>
             <w:rStyle w:val="Hyperlink"/>
@@ -1404,7 +1391,7 @@
       </w:r>
     </w:p>
     <w:p>
-      <w:hyperlink r:id="rId11" w:history="1">
+      <w:hyperlink r:id="rId12" w:history="1">
         <w:r>
           <w:rPr>
             <w:rStyle w:val="Hyperlink"/>
@@ -1549,7 +1536,7 @@
                     <pic:cNvPicPr/>
                   </pic:nvPicPr>
                   <pic:blipFill>
-                    <a:blip r:embed="rId12"/>
+                    <a:blip r:embed="rId13"/>
                     <a:stretch>
                       <a:fillRect/>
                     </a:stretch>
@@ -2446,7 +2433,7 @@
         </w:rPr>
         <w:t xml:space="preserve">Experimented with mutation testing. Started with </w:t>
       </w:r>
-      <w:hyperlink r:id="rId13" w:history="1">
+      <w:hyperlink r:id="rId14" w:history="1">
         <w:r>
           <w:rPr>
             <w:rStyle w:val="Hyperlink"/>
@@ -3824,6 +3811,59 @@
           <w:iCs/>
         </w:rPr>
         <w:t xml:space="preserve"> are called the same number of times</w:t>
+      </w:r>
+    </w:p>
+    <w:p>
+      <w:pPr>
+        <w:rPr>
+          <w:iCs/>
+        </w:rPr>
+      </w:pPr>
+      <w:r>
+        <w:rPr>
+          <w:iCs/>
+        </w:rPr>
+        <w:t>Added support for generator functions</w:t>
+      </w:r>
+    </w:p>
+    <w:p>
+      <w:pPr>
+        <w:rPr>
+          <w:iCs/>
+        </w:rPr>
+      </w:pPr>
+      <w:r>
+        <w:rPr>
+          <w:iCs/>
+        </w:rPr>
+        <w:t>Made improvements to how class equivalence treats classes, particularly the recursive check that all attributes of one object are equivalent to the attributes of the other object. We keep track of all visited</w:t>
+      </w:r>
+    </w:p>
+    <w:p>
+      <w:pPr>
+        <w:rPr>
+          <w:iCs/>
+        </w:rPr>
+      </w:pPr>
+      <w:r>
+        <w:rPr>
+          <w:iCs/>
+        </w:rPr>
+        <w:t xml:space="preserve">Added </w:t>
+      </w:r>
+      <w:proofErr w:type="spellStart"/>
+      <w:r>
+        <w:rPr>
+          <w:iCs/>
+        </w:rPr>
+        <w:t>DummyObject</w:t>
+      </w:r>
+      <w:proofErr w:type="spellEnd"/>
+      <w:r>
+        <w:rPr>
+          <w:iCs/>
+        </w:rPr>
+        <w:t xml:space="preserve"> which can be passed in when an object is expected. Useful for certain data structures like BSTs where methods can expect a node as an argument</w:t>
       </w:r>
     </w:p>
     <w:p/>

</xml_diff>

<commit_message>
Add nonsensical error check, strip mem addresses from str reprs of objects
</commit_message>
<xml_diff>
--- a/Masters project notes.docx
+++ b/Masters project notes.docx
@@ -154,15 +154,28 @@
         </w:rPr>
         <w:t xml:space="preserve">HypoFuzz </w:t>
       </w:r>
-      <w:hyperlink r:id="rId8" w:history="1">
-        <w:r>
-          <w:rPr>
-            <w:rStyle w:val="Hyperlink"/>
-            <w:lang w:val="de-DE"/>
-          </w:rPr>
-          <w:t>https://github.com/Zac-HD/hypofuzz</w:t>
-        </w:r>
-      </w:hyperlink>
+      <w:r>
+        <w:fldChar w:fldCharType="begin"/>
+      </w:r>
+      <w:r>
+        <w:rPr>
+          <w:lang w:val="de-DE"/>
+        </w:rPr>
+        <w:instrText>HYPERLINK "https://github.com/Zac-HD/hypofuzz"</w:instrText>
+      </w:r>
+      <w:r>
+        <w:fldChar w:fldCharType="separate"/>
+      </w:r>
+      <w:r>
+        <w:rPr>
+          <w:rStyle w:val="Hyperlink"/>
+          <w:lang w:val="de-DE"/>
+        </w:rPr>
+        <w:t>https://github.com/Zac-HD/hypofuzz</w:t>
+      </w:r>
+      <w:r>
+        <w:fldChar w:fldCharType="end"/>
+      </w:r>
     </w:p>
     <w:p>
       <w:pPr>
@@ -195,7 +208,7 @@
       <w:r>
         <w:t xml:space="preserve"> </w:t>
       </w:r>
-      <w:hyperlink r:id="rId9" w:history="1">
+      <w:hyperlink r:id="rId8" w:history="1">
         <w:r>
           <w:rPr>
             <w:rStyle w:val="Hyperlink"/>
@@ -234,15 +247,7 @@
       </w:r>
       <w:proofErr w:type="spellEnd"/>
       <w:r>
-        <w:t xml:space="preserve"> and gives a property-based testing framework for python. It generates structured inputs and saves failing inputs for reproduction. It operates on the semantic properties of a program, making it inherently </w:t>
-      </w:r>
-      <w:proofErr w:type="gramStart"/>
-      <w:r>
-        <w:t>semantic-based</w:t>
-      </w:r>
-      <w:proofErr w:type="gramEnd"/>
-      <w:r>
-        <w:t xml:space="preserve">. It is not coverage-guided by default, so </w:t>
+        <w:t xml:space="preserve"> and gives a property-based testing framework for python. It generates structured inputs and saves failing inputs for reproduction. It operates on the semantic properties of a program, making it inherently semantic-based. It is not coverage-guided by default, so </w:t>
       </w:r>
       <w:proofErr w:type="spellStart"/>
       <w:r>
@@ -282,15 +287,7 @@
     </w:p>
     <w:p>
       <w:r>
-        <w:t xml:space="preserve">At some point, see if you can read the python script, create AST and traverse it </w:t>
-      </w:r>
-      <w:proofErr w:type="gramStart"/>
-      <w:r>
-        <w:t>in order to</w:t>
-      </w:r>
-      <w:proofErr w:type="gramEnd"/>
-      <w:r>
-        <w:t xml:space="preserve"> create the right test.</w:t>
+        <w:t>At some point, see if you can read the python script, create AST and traverse it in order to create the right test.</w:t>
       </w:r>
     </w:p>
     <w:p/>
@@ -325,15 +322,7 @@
       </w:r>
       <w:proofErr w:type="spellEnd"/>
       <w:r>
-        <w:t xml:space="preserve"> universal object </w:t>
-      </w:r>
-      <w:proofErr w:type="gramStart"/>
-      <w:r>
-        <w:t>and also</w:t>
-      </w:r>
-      <w:proofErr w:type="gramEnd"/>
-      <w:r>
-        <w:t xml:space="preserve"> tried manually implementing one and couldn’t get it to spot any bugs but given more time there may be a way to implement this. Just haven’t figured it out yet.</w:t>
+        <w:t xml:space="preserve"> universal object and also tried manually implementing one and couldn’t get it to spot any bugs but given more time there may be a way to implement this. Just haven’t figured it out yet.</w:t>
       </w:r>
     </w:p>
     <w:p>
@@ -347,15 +336,7 @@
       </w:r>
       <w:proofErr w:type="spellEnd"/>
       <w:r>
-        <w:t xml:space="preserve"> was unable to spot the difference when I added a small condition to quicksort if length is &gt;= 6, return the reversed list. For these </w:t>
-      </w:r>
-      <w:proofErr w:type="gramStart"/>
-      <w:r>
-        <w:t>one off</w:t>
-      </w:r>
-      <w:proofErr w:type="gramEnd"/>
-      <w:r>
-        <w:t xml:space="preserve"> conditions, coverage guidance actually makes it harder to spot the difference, as they provide very little feedback. Plain hypothesis was able to catch this bug (without coverage guidance)</w:t>
+        <w:t xml:space="preserve"> was unable to spot the difference when I added a small condition to quicksort if length is &gt;= 6, return the reversed list. For these one off conditions, coverage guidance actually makes it harder to spot the difference, as they provide very little feedback. Plain hypothesis was able to catch this bug (without coverage guidance)</w:t>
       </w:r>
     </w:p>
     <w:p>
@@ -377,17 +358,12 @@
         <w:t xml:space="preserve">Testing universal object on two sorting algorithms always results in empty lists as universals value gets set to empty list if </w:t>
       </w:r>
       <w:proofErr w:type="spellStart"/>
-      <w:proofErr w:type="gramStart"/>
       <w:r>
         <w:t>len</w:t>
       </w:r>
       <w:proofErr w:type="spellEnd"/>
       <w:r>
-        <w:t>(</w:t>
-      </w:r>
-      <w:proofErr w:type="gramEnd"/>
-      <w:r>
-        <w:t xml:space="preserve">) is called on it. This is </w:t>
+        <w:t xml:space="preserve">() is called on it. This is </w:t>
       </w:r>
       <w:proofErr w:type="spellStart"/>
       <w:r>
@@ -451,7 +427,6 @@
     </w:p>
     <w:p>
       <w:proofErr w:type="spellStart"/>
-      <w:proofErr w:type="gramStart"/>
       <w:r>
         <w:t>arr</w:t>
       </w:r>
@@ -460,7 +435,6 @@
         <w:t>[</w:t>
       </w:r>
       <w:proofErr w:type="spellStart"/>
-      <w:proofErr w:type="gramEnd"/>
       <w:r>
         <w:t>i</w:t>
       </w:r>
@@ -637,15 +611,7 @@
       </w:r>
       <w:proofErr w:type="spellEnd"/>
       <w:r>
-        <w:t xml:space="preserve"> “Strategies” are how you define what is passed </w:t>
-      </w:r>
-      <w:proofErr w:type="gramStart"/>
-      <w:r>
-        <w:t>in to</w:t>
-      </w:r>
-      <w:proofErr w:type="gramEnd"/>
-      <w:r>
-        <w:t xml:space="preserve"> the function you want to fuzz. </w:t>
+        <w:t xml:space="preserve"> “Strategies” are how you define what is passed in to the function you want to fuzz. </w:t>
       </w:r>
       <w:proofErr w:type="spellStart"/>
       <w:r>
@@ -659,15 +625,7 @@
     <w:p>
       <w:r>
         <w:lastRenderedPageBreak/>
-        <w:t>@given(</w:t>
-      </w:r>
-      <w:proofErr w:type="gramStart"/>
-      <w:r>
-        <w:t>st.lists</w:t>
-      </w:r>
-      <w:proofErr w:type="gramEnd"/>
-      <w:r>
-        <w:t xml:space="preserve">(st.integers() | </w:t>
+        <w:t xml:space="preserve">@given(st.lists(st.integers() | </w:t>
       </w:r>
       <w:proofErr w:type="spellStart"/>
       <w:r>
@@ -765,15 +723,7 @@
         </w:numPr>
       </w:pPr>
       <w:r>
-        <w:t xml:space="preserve">In the case of my universal strategy, I simply fuzz with a strategy that can be </w:t>
-      </w:r>
-      <w:proofErr w:type="spellStart"/>
-      <w:r>
-        <w:t>though</w:t>
-      </w:r>
-      <w:proofErr w:type="spellEnd"/>
-      <w:r>
-        <w:t xml:space="preserve"> of as the following:</w:t>
+        <w:t>In the case of my universal strategy, I simply fuzz with a strategy that can be though of as the following:</w:t>
       </w:r>
     </w:p>
     <w:p>
@@ -817,12 +767,10 @@
         <w:t>[</w:t>
       </w:r>
       <w:proofErr w:type="spellStart"/>
-      <w:proofErr w:type="gramStart"/>
       <w:r>
         <w:t>str,strat</w:t>
       </w:r>
       <w:proofErr w:type="spellEnd"/>
-      <w:proofErr w:type="gramEnd"/>
       <w:r>
         <w:t>]|tuple[</w:t>
       </w:r>
@@ -864,15 +812,7 @@
         </w:numPr>
       </w:pPr>
       <w:r>
-        <w:t xml:space="preserve">It seems to work </w:t>
-      </w:r>
-      <w:proofErr w:type="gramStart"/>
-      <w:r>
-        <w:t>fairly well</w:t>
-      </w:r>
-      <w:proofErr w:type="gramEnd"/>
-      <w:r>
-        <w:t xml:space="preserve"> for the simple tests I have performed so far</w:t>
+        <w:t>It seems to work fairly well for the simple tests I have performed so far</w:t>
       </w:r>
     </w:p>
     <w:p>
@@ -884,15 +824,7 @@
         </w:numPr>
       </w:pPr>
       <w:r>
-        <w:t xml:space="preserve">Because it essentially brute forces fuzzing with different types until it works, I can imagine this being quite slow for fuzzing complex functions with lots of </w:t>
-      </w:r>
-      <w:proofErr w:type="gramStart"/>
-      <w:r>
-        <w:t>arguments</w:t>
-      </w:r>
-      <w:proofErr w:type="gramEnd"/>
-      <w:r>
-        <w:t xml:space="preserve"> but this will have to be tested more</w:t>
+        <w:t>Because it essentially brute forces fuzzing with different types until it works, I can imagine this being quite slow for fuzzing complex functions with lots of arguments but this will have to be tested more</w:t>
       </w:r>
     </w:p>
     <w:p>
@@ -949,15 +881,7 @@
     </w:p>
     <w:p>
       <w:r>
-        <w:t xml:space="preserve">Theoretically speaking, at best we are determining the type of a (universal) object based on how that object is treated in the code and what functions and operations are applied to it. At best a perfect solution seems to me like it would essentially be a glorified </w:t>
-      </w:r>
-      <w:proofErr w:type="gramStart"/>
-      <w:r>
-        <w:t>type</w:t>
-      </w:r>
-      <w:proofErr w:type="gramEnd"/>
-      <w:r>
-        <w:t xml:space="preserve"> inference algorithm.</w:t>
+        <w:t>Theoretically speaking, at best we are determining the type of a (universal) object based on how that object is treated in the code and what functions and operations are applied to it. At best a perfect solution seems to me like it would essentially be a glorified type inference algorithm.</w:t>
       </w:r>
     </w:p>
     <w:p/>
@@ -1004,13 +928,8 @@
         <w:t xml:space="preserve">classes </w:t>
       </w:r>
       <w:r>
-        <w:t xml:space="preserve">for 2 stack </w:t>
-      </w:r>
-      <w:proofErr w:type="gramStart"/>
-      <w:r>
-        <w:t>implementation</w:t>
-      </w:r>
-      <w:proofErr w:type="gramEnd"/>
+        <w:t>for 2 stack implementation</w:t>
+      </w:r>
     </w:p>
     <w:p>
       <w:r>
@@ -1022,13 +941,8 @@
       </w:r>
       <w:proofErr w:type="spellEnd"/>
       <w:r>
-        <w:t xml:space="preserve"> </w:t>
-      </w:r>
-      <w:proofErr w:type="gramStart"/>
-      <w:r>
-        <w:t>should :</w:t>
-      </w:r>
-      <w:proofErr w:type="gramEnd"/>
+        <w:t xml:space="preserve"> should :</w:t>
+      </w:r>
     </w:p>
     <w:p>
       <w:r>
@@ -1069,15 +983,7 @@
     </w:p>
     <w:p>
       <w:r>
-        <w:t xml:space="preserve">Wrote basic </w:t>
-      </w:r>
-      <w:proofErr w:type="gramStart"/>
-      <w:r>
-        <w:t>first class</w:t>
-      </w:r>
-      <w:proofErr w:type="gramEnd"/>
-      <w:r>
-        <w:t xml:space="preserve"> equivalence tester</w:t>
+        <w:t>Wrote basic first class equivalence tester</w:t>
       </w:r>
     </w:p>
     <w:p>
@@ -1105,15 +1011,7 @@
       </w:r>
       <w:proofErr w:type="spellEnd"/>
       <w:r>
-        <w:t xml:space="preserve"> but have struggled to find working examples. My equivalence tester is quite situational. Method name/signature </w:t>
-      </w:r>
-      <w:proofErr w:type="gramStart"/>
-      <w:r>
-        <w:t>refactors</w:t>
-      </w:r>
-      <w:proofErr w:type="gramEnd"/>
-      <w:r>
-        <w:t xml:space="preserve"> and external dependencies cause issues</w:t>
+        <w:t xml:space="preserve"> but have struggled to find working examples. My equivalence tester is quite situational. Method name/signature refactors and external dependencies cause issues</w:t>
       </w:r>
     </w:p>
     <w:p>
@@ -1162,7 +1060,7 @@
                     <pic:cNvPicPr/>
                   </pic:nvPicPr>
                   <pic:blipFill>
-                    <a:blip r:embed="rId10"/>
+                    <a:blip r:embed="rId9"/>
                     <a:stretch>
                       <a:fillRect/>
                     </a:stretch>
@@ -1224,21 +1122,13 @@
       </w:r>
       <w:proofErr w:type="spellEnd"/>
       <w:r>
-        <w:t xml:space="preserve"> file with the specific methods from the class that they want tested so they can exclude certain methods if they </w:t>
-      </w:r>
-      <w:proofErr w:type="gramStart"/>
-      <w:r>
-        <w:t>like, and</w:t>
-      </w:r>
-      <w:proofErr w:type="gramEnd"/>
-      <w:r>
-        <w:t xml:space="preserve"> optionally allow the user to also define specifically what arguments each method should be tested with.</w:t>
+        <w:t xml:space="preserve"> file with the specific methods from the class that they want tested so they can exclude certain methods if they like, and optionally allow the user to also define specifically what arguments each method should be tested with.</w:t>
       </w:r>
     </w:p>
     <w:p/>
     <w:p/>
     <w:p>
-      <w:hyperlink r:id="rId11" w:history="1">
+      <w:hyperlink r:id="rId10" w:history="1">
         <w:r>
           <w:rPr>
             <w:rStyle w:val="Hyperlink"/>
@@ -1361,15 +1251,7 @@
     </w:p>
     <w:p>
       <w:r>
-        <w:t xml:space="preserve">What if u have a class with 1 </w:t>
-      </w:r>
-      <w:proofErr w:type="gramStart"/>
-      <w:r>
-        <w:t>methods</w:t>
-      </w:r>
-      <w:proofErr w:type="gramEnd"/>
-      <w:r>
-        <w:t>, a factory method which gives u back 3 methods</w:t>
+        <w:t>What if u have a class with 1 methods, a factory method which gives u back 3 methods</w:t>
       </w:r>
     </w:p>
     <w:p>
@@ -1391,7 +1273,7 @@
       </w:r>
     </w:p>
     <w:p>
-      <w:hyperlink r:id="rId12" w:history="1">
+      <w:hyperlink r:id="rId11" w:history="1">
         <w:r>
           <w:rPr>
             <w:rStyle w:val="Hyperlink"/>
@@ -1469,23 +1351,7 @@
         <w:rPr>
           <w:iCs/>
         </w:rPr>
-        <w:t xml:space="preserve">Other than this issue, another issue is trying to reason with functions that take callable parameters. </w:t>
-      </w:r>
-      <w:proofErr w:type="spellStart"/>
-      <w:proofErr w:type="gramStart"/>
-      <w:r>
-        <w:rPr>
-          <w:iCs/>
-        </w:rPr>
-        <w:t>Cant</w:t>
-      </w:r>
-      <w:proofErr w:type="spellEnd"/>
-      <w:proofErr w:type="gramEnd"/>
-      <w:r>
-        <w:rPr>
-          <w:iCs/>
-        </w:rPr>
-        <w:t xml:space="preserve"> exactly fuzz a function as an input so </w:t>
+        <w:t xml:space="preserve">Other than this issue, another issue is trying to reason with functions that take callable parameters. Cant exactly fuzz a function as an input so </w:t>
       </w:r>
       <w:proofErr w:type="spellStart"/>
       <w:r>
@@ -1536,7 +1402,7 @@
                     <pic:cNvPicPr/>
                   </pic:nvPicPr>
                   <pic:blipFill>
-                    <a:blip r:embed="rId13"/>
+                    <a:blip r:embed="rId12"/>
                     <a:stretch>
                       <a:fillRect/>
                     </a:stretch>
@@ -1581,21 +1447,7 @@
         <w:rPr>
           <w:iCs/>
         </w:rPr>
-        <w:t xml:space="preserve"> is necessarily </w:t>
-      </w:r>
-      <w:proofErr w:type="gramStart"/>
-      <w:r>
-        <w:rPr>
-          <w:iCs/>
-        </w:rPr>
-        <w:t>callable</w:t>
-      </w:r>
-      <w:proofErr w:type="gramEnd"/>
-      <w:r>
-        <w:rPr>
-          <w:iCs/>
-        </w:rPr>
-        <w:t xml:space="preserve"> so it uses universal strategy) it takes 11 minutes to find the difference in </w:t>
+        <w:t xml:space="preserve"> is necessarily callable so it uses universal strategy) it takes 11 minutes to find the difference in </w:t>
       </w:r>
       <w:proofErr w:type="spellStart"/>
       <w:r>
@@ -1650,55 +1502,27 @@
         <w:rPr>
           <w:iCs/>
         </w:rPr>
-        <w:t xml:space="preserve"> is “called” within a function should be </w:t>
-      </w:r>
-      <w:proofErr w:type="gramStart"/>
-      <w:r>
-        <w:rPr>
-          <w:iCs/>
-        </w:rPr>
-        <w:t>pretty easy</w:t>
-      </w:r>
-      <w:proofErr w:type="gramEnd"/>
-      <w:r>
-        <w:rPr>
-          <w:iCs/>
-        </w:rPr>
-        <w:t xml:space="preserve"> and should greatly improve time efficiency</w:t>
-      </w:r>
-    </w:p>
-    <w:p>
-      <w:pPr>
-        <w:rPr>
-          <w:iCs/>
-        </w:rPr>
-      </w:pPr>
-    </w:p>
-    <w:p>
-      <w:pPr>
-        <w:rPr>
-          <w:iCs/>
-        </w:rPr>
-      </w:pPr>
-      <w:r>
-        <w:rPr>
-          <w:iCs/>
-        </w:rPr>
-        <w:t xml:space="preserve">To be as faithful to the theory: we need to complicate/generalise </w:t>
-      </w:r>
-      <w:proofErr w:type="gramStart"/>
-      <w:r>
-        <w:rPr>
-          <w:iCs/>
-        </w:rPr>
-        <w:t>f(</w:t>
-      </w:r>
-      <w:proofErr w:type="gramEnd"/>
-      <w:r>
-        <w:rPr>
-          <w:iCs/>
-        </w:rPr>
-        <w:t>) so it can call any function it knows. Bound things, we don’t want more than 2 recursive calls, more than etc.</w:t>
+        <w:t xml:space="preserve"> is “called” within a function should be pretty easy and should greatly improve time efficiency</w:t>
+      </w:r>
+    </w:p>
+    <w:p>
+      <w:pPr>
+        <w:rPr>
+          <w:iCs/>
+        </w:rPr>
+      </w:pPr>
+    </w:p>
+    <w:p>
+      <w:pPr>
+        <w:rPr>
+          <w:iCs/>
+        </w:rPr>
+      </w:pPr>
+      <w:r>
+        <w:rPr>
+          <w:iCs/>
+        </w:rPr>
+        <w:t>To be as faithful to the theory: we need to complicate/generalise f() so it can call any function it knows. Bound things, we don’t want more than 2 recursive calls, more than etc.</w:t>
       </w:r>
     </w:p>
     <w:p>
@@ -1769,48 +1593,20 @@
         <w:rPr>
           <w:iCs/>
         </w:rPr>
-        <w:t xml:space="preserve">If I have time, extend </w:t>
-      </w:r>
-      <w:proofErr w:type="gramStart"/>
-      <w:r>
-        <w:rPr>
-          <w:iCs/>
-        </w:rPr>
-        <w:t>f(</w:t>
-      </w:r>
-      <w:proofErr w:type="gramEnd"/>
-      <w:r>
-        <w:rPr>
-          <w:iCs/>
-        </w:rPr>
-        <w:t>) functions to take and return numbers</w:t>
-      </w:r>
-    </w:p>
-    <w:p>
-      <w:pPr>
-        <w:rPr>
-          <w:iCs/>
-        </w:rPr>
-      </w:pPr>
-      <w:r>
-        <w:rPr>
-          <w:iCs/>
-        </w:rPr>
-        <w:t xml:space="preserve">Then I can look at test suites, try it out in some application areas where equivalence is important, </w:t>
-      </w:r>
-      <w:proofErr w:type="gramStart"/>
-      <w:r>
-        <w:rPr>
-          <w:iCs/>
-        </w:rPr>
-        <w:t>property based</w:t>
-      </w:r>
-      <w:proofErr w:type="gramEnd"/>
-      <w:r>
-        <w:rPr>
-          <w:iCs/>
-        </w:rPr>
-        <w:t xml:space="preserve"> testing test suite and run with my pipeline.</w:t>
+        <w:t>If I have time, extend f() functions to take and return numbers</w:t>
+      </w:r>
+    </w:p>
+    <w:p>
+      <w:pPr>
+        <w:rPr>
+          <w:iCs/>
+        </w:rPr>
+      </w:pPr>
+      <w:r>
+        <w:rPr>
+          <w:iCs/>
+        </w:rPr>
+        <w:t>Then I can look at test suites, try it out in some application areas where equivalence is important, property based testing test suite and run with my pipeline.</w:t>
       </w:r>
     </w:p>
     <w:p>
@@ -1883,61 +1679,33 @@
           <w:bCs/>
           <w:iCs/>
         </w:rPr>
-        <w:t xml:space="preserve"> library thru a mutation testing suite to see how it performs against my pipeline, try to find examples my pipeline can find that the existing suite </w:t>
-      </w:r>
-      <w:proofErr w:type="gramStart"/>
-      <w:r>
+        <w:t xml:space="preserve"> library thru a mutation testing suite to see how it performs against my pipeline, try to find examples my pipeline can find that the existing suite cant</w:t>
+      </w:r>
+    </w:p>
+    <w:p>
+      <w:pPr>
         <w:rPr>
           <w:b/>
           <w:bCs/>
           <w:iCs/>
         </w:rPr>
-        <w:t>cant</w:t>
-      </w:r>
-      <w:proofErr w:type="gramEnd"/>
-    </w:p>
-    <w:p>
-      <w:pPr>
+      </w:pPr>
+      <w:r>
         <w:rPr>
           <w:b/>
           <w:bCs/>
           <w:iCs/>
         </w:rPr>
-      </w:pPr>
-      <w:r>
+        <w:t>Look at open source library with tests at the end</w:t>
+      </w:r>
+    </w:p>
+    <w:p>
+      <w:pPr>
         <w:rPr>
           <w:b/>
           <w:bCs/>
           <w:iCs/>
         </w:rPr>
-        <w:t xml:space="preserve">Look at </w:t>
-      </w:r>
-      <w:proofErr w:type="gramStart"/>
-      <w:r>
-        <w:rPr>
-          <w:b/>
-          <w:bCs/>
-          <w:iCs/>
-        </w:rPr>
-        <w:t>open source</w:t>
-      </w:r>
-      <w:proofErr w:type="gramEnd"/>
-      <w:r>
-        <w:rPr>
-          <w:b/>
-          <w:bCs/>
-          <w:iCs/>
-        </w:rPr>
-        <w:t xml:space="preserve"> library with tests at the end</w:t>
-      </w:r>
-    </w:p>
-    <w:p>
-      <w:pPr>
-        <w:rPr>
-          <w:b/>
-          <w:bCs/>
-          <w:iCs/>
-        </w:rPr>
       </w:pPr>
     </w:p>
     <w:p>
@@ -2009,21 +1777,7 @@
         <w:rPr>
           <w:iCs/>
         </w:rPr>
-        <w:t xml:space="preserve">One idea: perform static analysis on the function we are fuzzing before we fuzz it to see if it takes a function f as a param, if that function f itself takes a param. </w:t>
-      </w:r>
-      <w:proofErr w:type="gramStart"/>
-      <w:r>
-        <w:rPr>
-          <w:iCs/>
-        </w:rPr>
-        <w:t>Thus</w:t>
-      </w:r>
-      <w:proofErr w:type="gramEnd"/>
-      <w:r>
-        <w:rPr>
-          <w:iCs/>
-        </w:rPr>
-        <w:t xml:space="preserve"> we can narrow down which function fuzzing strategy to employ</w:t>
+        <w:t>One idea: perform static analysis on the function we are fuzzing before we fuzz it to see if it takes a function f as a param, if that function f itself takes a param. Thus we can narrow down which function fuzzing strategy to employ</w:t>
       </w:r>
     </w:p>
     <w:p>
@@ -2059,35 +1813,7 @@
         <w:rPr>
           <w:iCs/>
         </w:rPr>
-        <w:t xml:space="preserve">Functions f that </w:t>
-      </w:r>
-      <w:proofErr w:type="gramStart"/>
-      <w:r>
-        <w:rPr>
-          <w:iCs/>
-        </w:rPr>
-        <w:t>take</w:t>
-      </w:r>
-      <w:proofErr w:type="gramEnd"/>
-      <w:r>
-        <w:rPr>
-          <w:iCs/>
-        </w:rPr>
-        <w:t xml:space="preserve"> a single function as a param like f(h): we can check the </w:t>
-      </w:r>
-      <w:proofErr w:type="spellStart"/>
-      <w:r>
-        <w:rPr>
-          <w:iCs/>
-        </w:rPr>
-        <w:t>sig</w:t>
-      </w:r>
-      <w:proofErr w:type="spellEnd"/>
-      <w:r>
-        <w:rPr>
-          <w:iCs/>
-        </w:rPr>
-        <w:t xml:space="preserve"> of the function h given, and fuzz some input accordingly to call h with within f.</w:t>
+        <w:t>Functions f that take a single function as a param like f(h): we can check the sig of the function h given, and fuzz some input accordingly to call h with within f.</w:t>
       </w:r>
     </w:p>
     <w:p>
@@ -2433,7 +2159,7 @@
         </w:rPr>
         <w:t xml:space="preserve">Experimented with mutation testing. Started with </w:t>
       </w:r>
-      <w:hyperlink r:id="rId14" w:history="1">
+      <w:hyperlink r:id="rId13" w:history="1">
         <w:r>
           <w:rPr>
             <w:rStyle w:val="Hyperlink"/>
@@ -2577,14 +2303,7 @@
         <w:rPr>
           <w:iCs/>
         </w:rPr>
-        <w:t xml:space="preserve"> 3673/</w:t>
-      </w:r>
-      <w:proofErr w:type="gramStart"/>
-      <w:r>
-        <w:rPr>
-          <w:iCs/>
-        </w:rPr>
-        <w:t xml:space="preserve">3673  </w:t>
+        <w:t xml:space="preserve"> 3673/3673  </w:t>
       </w:r>
       <w:r>
         <w:rPr>
@@ -2593,7 +2312,6 @@
         </w:rPr>
         <w:t>🎉</w:t>
       </w:r>
-      <w:proofErr w:type="gramEnd"/>
       <w:r>
         <w:rPr>
           <w:iCs/>
@@ -2721,21 +2439,7 @@
         <w:rPr>
           <w:iCs/>
         </w:rPr>
-        <w:t xml:space="preserve">After adding </w:t>
-      </w:r>
-      <w:proofErr w:type="gramStart"/>
-      <w:r>
-        <w:rPr>
-          <w:iCs/>
-        </w:rPr>
-        <w:t>class based</w:t>
-      </w:r>
-      <w:proofErr w:type="gramEnd"/>
-      <w:r>
-        <w:rPr>
-          <w:iCs/>
-        </w:rPr>
-        <w:t xml:space="preserve"> stuff</w:t>
+        <w:t>After adding class based stuff</w:t>
       </w:r>
     </w:p>
     <w:p>
@@ -2826,14 +2530,7 @@
         <w:rPr>
           <w:iCs/>
         </w:rPr>
-        <w:t xml:space="preserve"> 445/</w:t>
-      </w:r>
-      <w:proofErr w:type="gramStart"/>
-      <w:r>
-        <w:rPr>
-          <w:iCs/>
-        </w:rPr>
-        <w:t xml:space="preserve">445  </w:t>
+        <w:t xml:space="preserve"> 445/445  </w:t>
       </w:r>
       <w:r>
         <w:rPr>
@@ -2842,7 +2539,6 @@
         </w:rPr>
         <w:t>🎉</w:t>
       </w:r>
-      <w:proofErr w:type="gramEnd"/>
       <w:r>
         <w:rPr>
           <w:iCs/>
@@ -2944,21 +2640,33 @@
         <w:rPr>
           <w:iCs/>
         </w:rPr>
-        <w:t xml:space="preserve">270/445 after adding more </w:t>
-      </w:r>
-      <w:proofErr w:type="gramStart"/>
-      <w:r>
-        <w:rPr>
-          <w:iCs/>
-        </w:rPr>
-        <w:t>class based</w:t>
-      </w:r>
-      <w:proofErr w:type="gramEnd"/>
-      <w:r>
-        <w:rPr>
-          <w:iCs/>
-        </w:rPr>
-        <w:t xml:space="preserve"> stuff</w:t>
+        <w:t>270/445 after adding more class based stuff</w:t>
+      </w:r>
+    </w:p>
+    <w:p>
+      <w:pPr>
+        <w:rPr>
+          <w:iCs/>
+        </w:rPr>
+      </w:pPr>
+      <w:r>
+        <w:rPr>
+          <w:iCs/>
+        </w:rPr>
+        <w:t>353/445 after 2.5 hrs with basic dummy object</w:t>
+      </w:r>
+    </w:p>
+    <w:p>
+      <w:pPr>
+        <w:rPr>
+          <w:iCs/>
+        </w:rPr>
+      </w:pPr>
+      <w:r>
+        <w:rPr>
+          <w:iCs/>
+        </w:rPr>
+        <w:t>367/445 best so far</w:t>
       </w:r>
     </w:p>
     <w:p>
@@ -2988,7 +2696,6 @@
         <w:t xml:space="preserve">With the following addition to </w:t>
       </w:r>
       <w:proofErr w:type="spellStart"/>
-      <w:proofErr w:type="gramStart"/>
       <w:r>
         <w:rPr>
           <w:iCs/>
@@ -2996,7 +2703,6 @@
         <w:t>pyproject.toml</w:t>
       </w:r>
       <w:proofErr w:type="spellEnd"/>
-      <w:proofErr w:type="gramEnd"/>
     </w:p>
     <w:p>
       <w:pPr>
@@ -3011,7 +2717,6 @@
         <w:t>[</w:t>
       </w:r>
       <w:proofErr w:type="spellStart"/>
-      <w:proofErr w:type="gramStart"/>
       <w:r>
         <w:rPr>
           <w:iCs/>
@@ -3019,7 +2724,6 @@
         <w:t>tool.mutmut</w:t>
       </w:r>
       <w:proofErr w:type="spellEnd"/>
-      <w:proofErr w:type="gramEnd"/>
       <w:r>
         <w:rPr>
           <w:iCs/>
@@ -3091,7 +2795,6 @@
         <w:rPr>
           <w:iCs/>
         </w:rPr>
-        <w:lastRenderedPageBreak/>
         <w:t>Tested more hobbit suite</w:t>
       </w:r>
     </w:p>
@@ -3131,21 +2834,7 @@
         <w:rPr>
           <w:iCs/>
         </w:rPr>
-        <w:t xml:space="preserve">Functions can </w:t>
-      </w:r>
-      <w:proofErr w:type="gramStart"/>
-      <w:r>
-        <w:rPr>
-          <w:iCs/>
-        </w:rPr>
-        <w:t>alter  global</w:t>
-      </w:r>
-      <w:proofErr w:type="gramEnd"/>
-      <w:r>
-        <w:rPr>
-          <w:iCs/>
-        </w:rPr>
-        <w:t xml:space="preserve"> state</w:t>
+        <w:t>Functions can alter  global state</w:t>
       </w:r>
     </w:p>
     <w:p>
@@ -3272,23 +2961,7 @@
         <w:rPr>
           <w:iCs/>
         </w:rPr>
-        <w:t xml:space="preserve">We </w:t>
-      </w:r>
-      <w:proofErr w:type="spellStart"/>
-      <w:proofErr w:type="gramStart"/>
-      <w:r>
-        <w:rPr>
-          <w:iCs/>
-        </w:rPr>
-        <w:t>cant</w:t>
-      </w:r>
-      <w:proofErr w:type="spellEnd"/>
-      <w:proofErr w:type="gramEnd"/>
-      <w:r>
-        <w:rPr>
-          <w:iCs/>
-        </w:rPr>
-        <w:t xml:space="preserve"> see internal recursion</w:t>
+        <w:t>We cant see internal recursion</w:t>
       </w:r>
     </w:p>
     <w:p>
@@ -3384,19 +3057,11 @@
           <w:iCs/>
         </w:rPr>
       </w:pPr>
-      <w:proofErr w:type="gramStart"/>
-      <w:r>
-        <w:rPr>
-          <w:iCs/>
-        </w:rPr>
-        <w:t>Have to</w:t>
-      </w:r>
-      <w:proofErr w:type="gramEnd"/>
-      <w:r>
-        <w:rPr>
-          <w:iCs/>
-        </w:rPr>
-        <w:t xml:space="preserve"> retranslate hobbit suite</w:t>
+      <w:r>
+        <w:rPr>
+          <w:iCs/>
+        </w:rPr>
+        <w:t>Have to retranslate hobbit suite</w:t>
       </w:r>
     </w:p>
     <w:p>
@@ -3526,20 +3191,26 @@
         <w:rPr>
           <w:iCs/>
         </w:rPr>
-        <w:t>Added functionality that if a higher order function takes a callable parameter, and then calls that callable parameter passing in multiple functions as arguments to that callable parameter, then that callable parameter can interleave the execution of the functions it is given</w:t>
-      </w:r>
-    </w:p>
-    <w:p>
-      <w:pPr>
-        <w:rPr>
-          <w:iCs/>
-        </w:rPr>
-      </w:pPr>
+        <w:t xml:space="preserve">Added functionality that if a higher order function takes a callable parameter, and then calls that callable parameter passing in multiple functions as arguments to that callable </w:t>
+      </w:r>
       <w:r>
         <w:rPr>
           <w:iCs/>
         </w:rPr>
         <w:lastRenderedPageBreak/>
+        <w:t>parameter, then that callable parameter can interleave the execution of the functions it is given</w:t>
+      </w:r>
+    </w:p>
+    <w:p>
+      <w:pPr>
+        <w:rPr>
+          <w:iCs/>
+        </w:rPr>
+      </w:pPr>
+      <w:r>
+        <w:rPr>
+          <w:iCs/>
+        </w:rPr>
         <w:t xml:space="preserve">Curried interaction plan: </w:t>
       </w:r>
     </w:p>
@@ -3623,35 +3294,7 @@
         <w:rPr>
           <w:iCs/>
         </w:rPr>
-        <w:t xml:space="preserve"> in a function </w:t>
-      </w:r>
-      <w:proofErr w:type="gramStart"/>
-      <w:r>
-        <w:rPr>
-          <w:iCs/>
-        </w:rPr>
-        <w:t>where</w:t>
-      </w:r>
-      <w:proofErr w:type="gramEnd"/>
-      <w:r>
-        <w:rPr>
-          <w:iCs/>
-        </w:rPr>
-        <w:t xml:space="preserve"> coverage </w:t>
-      </w:r>
-      <w:proofErr w:type="spellStart"/>
-      <w:r>
-        <w:rPr>
-          <w:iCs/>
-        </w:rPr>
-        <w:t>wont</w:t>
-      </w:r>
-      <w:proofErr w:type="spellEnd"/>
-      <w:r>
-        <w:rPr>
-          <w:iCs/>
-        </w:rPr>
-        <w:t xml:space="preserve"> change meaningfully</w:t>
+        <w:t xml:space="preserve"> in a function where coverage wont change meaningfully</w:t>
       </w:r>
     </w:p>
     <w:p>
@@ -3864,6 +3507,61 @@
           <w:iCs/>
         </w:rPr>
         <w:t xml:space="preserve"> which can be passed in when an object is expected. Useful for certain data structures like BSTs where methods can expect a node as an argument</w:t>
+      </w:r>
+    </w:p>
+    <w:p>
+      <w:pPr>
+        <w:rPr>
+          <w:iCs/>
+        </w:rPr>
+      </w:pPr>
+    </w:p>
+    <w:p>
+      <w:pPr>
+        <w:rPr>
+          <w:iCs/>
+        </w:rPr>
+      </w:pPr>
+      <w:r>
+        <w:rPr>
+          <w:iCs/>
+        </w:rPr>
+        <w:t xml:space="preserve">Comparing exception types when testing two </w:t>
+      </w:r>
+      <w:proofErr w:type="spellStart"/>
+      <w:r>
+        <w:rPr>
+          <w:iCs/>
+        </w:rPr>
+        <w:t>non type</w:t>
+      </w:r>
+      <w:proofErr w:type="spellEnd"/>
+      <w:r>
+        <w:rPr>
+          <w:iCs/>
+        </w:rPr>
+        <w:t xml:space="preserve"> annotated functions might be a bad idea. Even if two functions are equivalent but they do things in a different order they could get flagged as inequivalent </w:t>
+      </w:r>
+      <w:proofErr w:type="spellStart"/>
+      <w:r>
+        <w:rPr>
+          <w:iCs/>
+        </w:rPr>
+        <w:t>bcos</w:t>
+      </w:r>
+      <w:proofErr w:type="spellEnd"/>
+      <w:r>
+        <w:rPr>
+          <w:iCs/>
+        </w:rPr>
+        <w:t xml:space="preserve"> they ended up giving two different exception types. My current compromise is to relax the equivalence check for exceptions so that </w:t>
+      </w:r>
+      <w:r>
+        <w:rPr>
+          <w:iCs/>
+        </w:rPr>
+        <w:lastRenderedPageBreak/>
+        <w:t>we only care about exception types mattering if the functions are type annotated, otherwise we only check that both sides threw an exception at all (type doesn’t matter)</w:t>
       </w:r>
     </w:p>
     <w:p/>

</xml_diff>

<commit_message>
improve events and log messages
</commit_message>
<xml_diff>
--- a/Masters project notes.docx
+++ b/Masters project notes.docx
@@ -154,28 +154,15 @@
         </w:rPr>
         <w:t xml:space="preserve">HypoFuzz </w:t>
       </w:r>
-      <w:r>
-        <w:fldChar w:fldCharType="begin"/>
-      </w:r>
-      <w:r>
-        <w:rPr>
-          <w:lang w:val="de-DE"/>
-        </w:rPr>
-        <w:instrText>HYPERLINK "https://github.com/Zac-HD/hypofuzz"</w:instrText>
-      </w:r>
-      <w:r>
-        <w:fldChar w:fldCharType="separate"/>
-      </w:r>
-      <w:r>
-        <w:rPr>
-          <w:rStyle w:val="Hyperlink"/>
-          <w:lang w:val="de-DE"/>
-        </w:rPr>
-        <w:t>https://github.com/Zac-HD/hypofuzz</w:t>
-      </w:r>
-      <w:r>
-        <w:fldChar w:fldCharType="end"/>
-      </w:r>
+      <w:hyperlink r:id="rId8" w:history="1">
+        <w:r>
+          <w:rPr>
+            <w:rStyle w:val="Hyperlink"/>
+            <w:lang w:val="de-DE"/>
+          </w:rPr>
+          <w:t>https://github.com/Zac-HD/hypofuzz</w:t>
+        </w:r>
+      </w:hyperlink>
     </w:p>
     <w:p>
       <w:pPr>
@@ -208,7 +195,7 @@
       <w:r>
         <w:t xml:space="preserve"> </w:t>
       </w:r>
-      <w:hyperlink r:id="rId8" w:history="1">
+      <w:hyperlink r:id="rId9" w:history="1">
         <w:r>
           <w:rPr>
             <w:rStyle w:val="Hyperlink"/>
@@ -247,7 +234,15 @@
       </w:r>
       <w:proofErr w:type="spellEnd"/>
       <w:r>
-        <w:t xml:space="preserve"> and gives a property-based testing framework for python. It generates structured inputs and saves failing inputs for reproduction. It operates on the semantic properties of a program, making it inherently semantic-based. It is not coverage-guided by default, so </w:t>
+        <w:t xml:space="preserve"> and gives a property-based testing framework for python. It generates structured inputs and saves failing inputs for reproduction. It operates on the semantic properties of a program, making it inherently </w:t>
+      </w:r>
+      <w:proofErr w:type="gramStart"/>
+      <w:r>
+        <w:t>semantic-based</w:t>
+      </w:r>
+      <w:proofErr w:type="gramEnd"/>
+      <w:r>
+        <w:t xml:space="preserve">. It is not coverage-guided by default, so </w:t>
       </w:r>
       <w:proofErr w:type="spellStart"/>
       <w:r>
@@ -287,7 +282,15 @@
     </w:p>
     <w:p>
       <w:r>
-        <w:t>At some point, see if you can read the python script, create AST and traverse it in order to create the right test.</w:t>
+        <w:t xml:space="preserve">At some point, see if you can read the python script, create AST and traverse it </w:t>
+      </w:r>
+      <w:proofErr w:type="gramStart"/>
+      <w:r>
+        <w:t>in order to</w:t>
+      </w:r>
+      <w:proofErr w:type="gramEnd"/>
+      <w:r>
+        <w:t xml:space="preserve"> create the right test.</w:t>
       </w:r>
     </w:p>
     <w:p/>
@@ -322,7 +325,15 @@
       </w:r>
       <w:proofErr w:type="spellEnd"/>
       <w:r>
-        <w:t xml:space="preserve"> universal object and also tried manually implementing one and couldn’t get it to spot any bugs but given more time there may be a way to implement this. Just haven’t figured it out yet.</w:t>
+        <w:t xml:space="preserve"> universal object </w:t>
+      </w:r>
+      <w:proofErr w:type="gramStart"/>
+      <w:r>
+        <w:t>and also</w:t>
+      </w:r>
+      <w:proofErr w:type="gramEnd"/>
+      <w:r>
+        <w:t xml:space="preserve"> tried manually implementing one and couldn’t get it to spot any bugs but given more time there may be a way to implement this. Just haven’t figured it out yet.</w:t>
       </w:r>
     </w:p>
     <w:p>
@@ -336,7 +347,15 @@
       </w:r>
       <w:proofErr w:type="spellEnd"/>
       <w:r>
-        <w:t xml:space="preserve"> was unable to spot the difference when I added a small condition to quicksort if length is &gt;= 6, return the reversed list. For these one off conditions, coverage guidance actually makes it harder to spot the difference, as they provide very little feedback. Plain hypothesis was able to catch this bug (without coverage guidance)</w:t>
+        <w:t xml:space="preserve"> was unable to spot the difference when I added a small condition to quicksort if length is &gt;= 6, return the reversed list. For these </w:t>
+      </w:r>
+      <w:proofErr w:type="gramStart"/>
+      <w:r>
+        <w:t>one off</w:t>
+      </w:r>
+      <w:proofErr w:type="gramEnd"/>
+      <w:r>
+        <w:t xml:space="preserve"> conditions, coverage guidance actually makes it harder to spot the difference, as they provide very little feedback. Plain hypothesis was able to catch this bug (without coverage guidance)</w:t>
       </w:r>
     </w:p>
     <w:p>
@@ -358,12 +377,17 @@
         <w:t xml:space="preserve">Testing universal object on two sorting algorithms always results in empty lists as universals value gets set to empty list if </w:t>
       </w:r>
       <w:proofErr w:type="spellStart"/>
+      <w:proofErr w:type="gramStart"/>
       <w:r>
         <w:t>len</w:t>
       </w:r>
       <w:proofErr w:type="spellEnd"/>
       <w:r>
-        <w:t xml:space="preserve">() is called on it. This is </w:t>
+        <w:t>(</w:t>
+      </w:r>
+      <w:proofErr w:type="gramEnd"/>
+      <w:r>
+        <w:t xml:space="preserve">) is called on it. This is </w:t>
       </w:r>
       <w:proofErr w:type="spellStart"/>
       <w:r>
@@ -427,6 +451,7 @@
     </w:p>
     <w:p>
       <w:proofErr w:type="spellStart"/>
+      <w:proofErr w:type="gramStart"/>
       <w:r>
         <w:t>arr</w:t>
       </w:r>
@@ -435,6 +460,7 @@
         <w:t>[</w:t>
       </w:r>
       <w:proofErr w:type="spellStart"/>
+      <w:proofErr w:type="gramEnd"/>
       <w:r>
         <w:t>i</w:t>
       </w:r>
@@ -611,7 +637,15 @@
       </w:r>
       <w:proofErr w:type="spellEnd"/>
       <w:r>
-        <w:t xml:space="preserve"> “Strategies” are how you define what is passed in to the function you want to fuzz. </w:t>
+        <w:t xml:space="preserve"> “Strategies” are how you define what is passed </w:t>
+      </w:r>
+      <w:proofErr w:type="gramStart"/>
+      <w:r>
+        <w:t>in to</w:t>
+      </w:r>
+      <w:proofErr w:type="gramEnd"/>
+      <w:r>
+        <w:t xml:space="preserve"> the function you want to fuzz. </w:t>
       </w:r>
       <w:proofErr w:type="spellStart"/>
       <w:r>
@@ -625,7 +659,15 @@
     <w:p>
       <w:r>
         <w:lastRenderedPageBreak/>
-        <w:t xml:space="preserve">@given(st.lists(st.integers() | </w:t>
+        <w:t>@given(</w:t>
+      </w:r>
+      <w:proofErr w:type="gramStart"/>
+      <w:r>
+        <w:t>st.lists</w:t>
+      </w:r>
+      <w:proofErr w:type="gramEnd"/>
+      <w:r>
+        <w:t xml:space="preserve">(st.integers() | </w:t>
       </w:r>
       <w:proofErr w:type="spellStart"/>
       <w:r>
@@ -767,10 +809,12 @@
         <w:t>[</w:t>
       </w:r>
       <w:proofErr w:type="spellStart"/>
+      <w:proofErr w:type="gramStart"/>
       <w:r>
         <w:t>str,strat</w:t>
       </w:r>
       <w:proofErr w:type="spellEnd"/>
+      <w:proofErr w:type="gramEnd"/>
       <w:r>
         <w:t>]|tuple[</w:t>
       </w:r>
@@ -812,7 +856,15 @@
         </w:numPr>
       </w:pPr>
       <w:r>
-        <w:t>It seems to work fairly well for the simple tests I have performed so far</w:t>
+        <w:t xml:space="preserve">It seems to work </w:t>
+      </w:r>
+      <w:proofErr w:type="gramStart"/>
+      <w:r>
+        <w:t>fairly well</w:t>
+      </w:r>
+      <w:proofErr w:type="gramEnd"/>
+      <w:r>
+        <w:t xml:space="preserve"> for the simple tests I have performed so far</w:t>
       </w:r>
     </w:p>
     <w:p>
@@ -824,7 +876,15 @@
         </w:numPr>
       </w:pPr>
       <w:r>
-        <w:t>Because it essentially brute forces fuzzing with different types until it works, I can imagine this being quite slow for fuzzing complex functions with lots of arguments but this will have to be tested more</w:t>
+        <w:t xml:space="preserve">Because it essentially brute forces fuzzing with different types until it works, I can imagine this being quite slow for fuzzing complex functions with lots of </w:t>
+      </w:r>
+      <w:proofErr w:type="gramStart"/>
+      <w:r>
+        <w:t>arguments</w:t>
+      </w:r>
+      <w:proofErr w:type="gramEnd"/>
+      <w:r>
+        <w:t xml:space="preserve"> but this will have to be tested more</w:t>
       </w:r>
     </w:p>
     <w:p>
@@ -881,7 +941,15 @@
     </w:p>
     <w:p>
       <w:r>
-        <w:t>Theoretically speaking, at best we are determining the type of a (universal) object based on how that object is treated in the code and what functions and operations are applied to it. At best a perfect solution seems to me like it would essentially be a glorified type inference algorithm.</w:t>
+        <w:t xml:space="preserve">Theoretically speaking, at best we are determining the type of a (universal) object based on how that object is treated in the code and what functions and operations are applied to it. At best a perfect solution seems to me like it would essentially be a glorified </w:t>
+      </w:r>
+      <w:proofErr w:type="gramStart"/>
+      <w:r>
+        <w:t>type</w:t>
+      </w:r>
+      <w:proofErr w:type="gramEnd"/>
+      <w:r>
+        <w:t xml:space="preserve"> inference algorithm.</w:t>
       </w:r>
     </w:p>
     <w:p/>
@@ -928,8 +996,13 @@
         <w:t xml:space="preserve">classes </w:t>
       </w:r>
       <w:r>
-        <w:t>for 2 stack implementation</w:t>
-      </w:r>
+        <w:t xml:space="preserve">for 2 stack </w:t>
+      </w:r>
+      <w:proofErr w:type="gramStart"/>
+      <w:r>
+        <w:t>implementation</w:t>
+      </w:r>
+      <w:proofErr w:type="gramEnd"/>
     </w:p>
     <w:p>
       <w:r>
@@ -941,8 +1014,13 @@
       </w:r>
       <w:proofErr w:type="spellEnd"/>
       <w:r>
-        <w:t xml:space="preserve"> should :</w:t>
-      </w:r>
+        <w:t xml:space="preserve"> </w:t>
+      </w:r>
+      <w:proofErr w:type="gramStart"/>
+      <w:r>
+        <w:t>should :</w:t>
+      </w:r>
+      <w:proofErr w:type="gramEnd"/>
     </w:p>
     <w:p>
       <w:r>
@@ -983,7 +1061,15 @@
     </w:p>
     <w:p>
       <w:r>
-        <w:t>Wrote basic first class equivalence tester</w:t>
+        <w:t xml:space="preserve">Wrote basic </w:t>
+      </w:r>
+      <w:proofErr w:type="gramStart"/>
+      <w:r>
+        <w:t>first class</w:t>
+      </w:r>
+      <w:proofErr w:type="gramEnd"/>
+      <w:r>
+        <w:t xml:space="preserve"> equivalence tester</w:t>
       </w:r>
     </w:p>
     <w:p>
@@ -1011,7 +1097,15 @@
       </w:r>
       <w:proofErr w:type="spellEnd"/>
       <w:r>
-        <w:t xml:space="preserve"> but have struggled to find working examples. My equivalence tester is quite situational. Method name/signature refactors and external dependencies cause issues</w:t>
+        <w:t xml:space="preserve"> but have struggled to find working examples. My equivalence tester is quite situational. Method name/signature </w:t>
+      </w:r>
+      <w:proofErr w:type="gramStart"/>
+      <w:r>
+        <w:t>refactors</w:t>
+      </w:r>
+      <w:proofErr w:type="gramEnd"/>
+      <w:r>
+        <w:t xml:space="preserve"> and external dependencies cause issues</w:t>
       </w:r>
     </w:p>
     <w:p>
@@ -1060,7 +1154,7 @@
                     <pic:cNvPicPr/>
                   </pic:nvPicPr>
                   <pic:blipFill>
-                    <a:blip r:embed="rId9"/>
+                    <a:blip r:embed="rId10"/>
                     <a:stretch>
                       <a:fillRect/>
                     </a:stretch>
@@ -1122,13 +1216,21 @@
       </w:r>
       <w:proofErr w:type="spellEnd"/>
       <w:r>
-        <w:t xml:space="preserve"> file with the specific methods from the class that they want tested so they can exclude certain methods if they like, and optionally allow the user to also define specifically what arguments each method should be tested with.</w:t>
+        <w:t xml:space="preserve"> file with the specific methods from the class that they want tested so they can exclude certain methods if they </w:t>
+      </w:r>
+      <w:proofErr w:type="gramStart"/>
+      <w:r>
+        <w:t>like, and</w:t>
+      </w:r>
+      <w:proofErr w:type="gramEnd"/>
+      <w:r>
+        <w:t xml:space="preserve"> optionally allow the user to also define specifically what arguments each method should be tested with.</w:t>
       </w:r>
     </w:p>
     <w:p/>
     <w:p/>
     <w:p>
-      <w:hyperlink r:id="rId10" w:history="1">
+      <w:hyperlink r:id="rId11" w:history="1">
         <w:r>
           <w:rPr>
             <w:rStyle w:val="Hyperlink"/>
@@ -1251,7 +1353,15 @@
     </w:p>
     <w:p>
       <w:r>
-        <w:t>What if u have a class with 1 methods, a factory method which gives u back 3 methods</w:t>
+        <w:t xml:space="preserve">What if u have a class with 1 </w:t>
+      </w:r>
+      <w:proofErr w:type="gramStart"/>
+      <w:r>
+        <w:t>methods</w:t>
+      </w:r>
+      <w:proofErr w:type="gramEnd"/>
+      <w:r>
+        <w:t>, a factory method which gives u back 3 methods</w:t>
       </w:r>
     </w:p>
     <w:p>
@@ -1273,7 +1383,7 @@
       </w:r>
     </w:p>
     <w:p>
-      <w:hyperlink r:id="rId11" w:history="1">
+      <w:hyperlink r:id="rId12" w:history="1">
         <w:r>
           <w:rPr>
             <w:rStyle w:val="Hyperlink"/>
@@ -1351,7 +1461,21 @@
         <w:rPr>
           <w:iCs/>
         </w:rPr>
-        <w:t xml:space="preserve">Other than this issue, another issue is trying to reason with functions that take callable parameters. Cant exactly fuzz a function as an input so </w:t>
+        <w:t xml:space="preserve">Other than this issue, another issue is trying to reason with functions that take callable parameters. </w:t>
+      </w:r>
+      <w:proofErr w:type="gramStart"/>
+      <w:r>
+        <w:rPr>
+          <w:iCs/>
+        </w:rPr>
+        <w:t>Cant</w:t>
+      </w:r>
+      <w:proofErr w:type="gramEnd"/>
+      <w:r>
+        <w:rPr>
+          <w:iCs/>
+        </w:rPr>
+        <w:t xml:space="preserve"> exactly fuzz a function as an input so </w:t>
       </w:r>
       <w:proofErr w:type="spellStart"/>
       <w:r>
@@ -1402,7 +1526,7 @@
                     <pic:cNvPicPr/>
                   </pic:nvPicPr>
                   <pic:blipFill>
-                    <a:blip r:embed="rId12"/>
+                    <a:blip r:embed="rId13"/>
                     <a:stretch>
                       <a:fillRect/>
                     </a:stretch>
@@ -1447,7 +1571,21 @@
         <w:rPr>
           <w:iCs/>
         </w:rPr>
-        <w:t xml:space="preserve"> is necessarily callable so it uses universal strategy) it takes 11 minutes to find the difference in </w:t>
+        <w:t xml:space="preserve"> is necessarily </w:t>
+      </w:r>
+      <w:proofErr w:type="gramStart"/>
+      <w:r>
+        <w:rPr>
+          <w:iCs/>
+        </w:rPr>
+        <w:t>callable</w:t>
+      </w:r>
+      <w:proofErr w:type="gramEnd"/>
+      <w:r>
+        <w:rPr>
+          <w:iCs/>
+        </w:rPr>
+        <w:t xml:space="preserve"> so it uses universal strategy) it takes 11 minutes to find the difference in </w:t>
       </w:r>
       <w:proofErr w:type="spellStart"/>
       <w:r>
@@ -1502,27 +1640,55 @@
         <w:rPr>
           <w:iCs/>
         </w:rPr>
-        <w:t xml:space="preserve"> is “called” within a function should be pretty easy and should greatly improve time efficiency</w:t>
-      </w:r>
-    </w:p>
-    <w:p>
-      <w:pPr>
-        <w:rPr>
-          <w:iCs/>
-        </w:rPr>
-      </w:pPr>
-    </w:p>
-    <w:p>
-      <w:pPr>
-        <w:rPr>
-          <w:iCs/>
-        </w:rPr>
-      </w:pPr>
-      <w:r>
-        <w:rPr>
-          <w:iCs/>
-        </w:rPr>
-        <w:t>To be as faithful to the theory: we need to complicate/generalise f() so it can call any function it knows. Bound things, we don’t want more than 2 recursive calls, more than etc.</w:t>
+        <w:t xml:space="preserve"> is “called” within a function should be </w:t>
+      </w:r>
+      <w:proofErr w:type="gramStart"/>
+      <w:r>
+        <w:rPr>
+          <w:iCs/>
+        </w:rPr>
+        <w:t>pretty easy</w:t>
+      </w:r>
+      <w:proofErr w:type="gramEnd"/>
+      <w:r>
+        <w:rPr>
+          <w:iCs/>
+        </w:rPr>
+        <w:t xml:space="preserve"> and should greatly improve time efficiency</w:t>
+      </w:r>
+    </w:p>
+    <w:p>
+      <w:pPr>
+        <w:rPr>
+          <w:iCs/>
+        </w:rPr>
+      </w:pPr>
+    </w:p>
+    <w:p>
+      <w:pPr>
+        <w:rPr>
+          <w:iCs/>
+        </w:rPr>
+      </w:pPr>
+      <w:r>
+        <w:rPr>
+          <w:iCs/>
+        </w:rPr>
+        <w:t xml:space="preserve">To be as faithful to the theory: we need to complicate/generalise </w:t>
+      </w:r>
+      <w:proofErr w:type="gramStart"/>
+      <w:r>
+        <w:rPr>
+          <w:iCs/>
+        </w:rPr>
+        <w:t>f(</w:t>
+      </w:r>
+      <w:proofErr w:type="gramEnd"/>
+      <w:r>
+        <w:rPr>
+          <w:iCs/>
+        </w:rPr>
+        <w:t>) so it can call any function it knows. Bound things, we don’t want more than 2 recursive calls, more than etc.</w:t>
       </w:r>
     </w:p>
     <w:p>
@@ -1593,20 +1759,48 @@
         <w:rPr>
           <w:iCs/>
         </w:rPr>
-        <w:t>If I have time, extend f() functions to take and return numbers</w:t>
-      </w:r>
-    </w:p>
-    <w:p>
-      <w:pPr>
-        <w:rPr>
-          <w:iCs/>
-        </w:rPr>
-      </w:pPr>
-      <w:r>
-        <w:rPr>
-          <w:iCs/>
-        </w:rPr>
-        <w:t>Then I can look at test suites, try it out in some application areas where equivalence is important, property based testing test suite and run with my pipeline.</w:t>
+        <w:t xml:space="preserve">If I have time, extend </w:t>
+      </w:r>
+      <w:proofErr w:type="gramStart"/>
+      <w:r>
+        <w:rPr>
+          <w:iCs/>
+        </w:rPr>
+        <w:t>f(</w:t>
+      </w:r>
+      <w:proofErr w:type="gramEnd"/>
+      <w:r>
+        <w:rPr>
+          <w:iCs/>
+        </w:rPr>
+        <w:t>) functions to take and return numbers</w:t>
+      </w:r>
+    </w:p>
+    <w:p>
+      <w:pPr>
+        <w:rPr>
+          <w:iCs/>
+        </w:rPr>
+      </w:pPr>
+      <w:r>
+        <w:rPr>
+          <w:iCs/>
+        </w:rPr>
+        <w:t xml:space="preserve">Then I can look at test suites, try it out in some application areas where equivalence is important, </w:t>
+      </w:r>
+      <w:proofErr w:type="gramStart"/>
+      <w:r>
+        <w:rPr>
+          <w:iCs/>
+        </w:rPr>
+        <w:t>property based</w:t>
+      </w:r>
+      <w:proofErr w:type="gramEnd"/>
+      <w:r>
+        <w:rPr>
+          <w:iCs/>
+        </w:rPr>
+        <w:t xml:space="preserve"> testing test suite and run with my pipeline.</w:t>
       </w:r>
     </w:p>
     <w:p>
@@ -1679,33 +1873,61 @@
           <w:bCs/>
           <w:iCs/>
         </w:rPr>
-        <w:t xml:space="preserve"> library thru a mutation testing suite to see how it performs against my pipeline, try to find examples my pipeline can find that the existing suite cant</w:t>
-      </w:r>
-    </w:p>
-    <w:p>
-      <w:pPr>
+        <w:t xml:space="preserve"> library thru a mutation testing suite to see how it performs against my pipeline, try to find examples my pipeline can find that the existing suite </w:t>
+      </w:r>
+      <w:proofErr w:type="gramStart"/>
+      <w:r>
         <w:rPr>
           <w:b/>
           <w:bCs/>
           <w:iCs/>
         </w:rPr>
-      </w:pPr>
-      <w:r>
+        <w:t>cant</w:t>
+      </w:r>
+      <w:proofErr w:type="gramEnd"/>
+    </w:p>
+    <w:p>
+      <w:pPr>
         <w:rPr>
           <w:b/>
           <w:bCs/>
           <w:iCs/>
         </w:rPr>
-        <w:t>Look at open source library with tests at the end</w:t>
-      </w:r>
-    </w:p>
-    <w:p>
-      <w:pPr>
+      </w:pPr>
+      <w:r>
         <w:rPr>
           <w:b/>
           <w:bCs/>
           <w:iCs/>
         </w:rPr>
+        <w:t xml:space="preserve">Look at </w:t>
+      </w:r>
+      <w:proofErr w:type="gramStart"/>
+      <w:r>
+        <w:rPr>
+          <w:b/>
+          <w:bCs/>
+          <w:iCs/>
+        </w:rPr>
+        <w:t>open source</w:t>
+      </w:r>
+      <w:proofErr w:type="gramEnd"/>
+      <w:r>
+        <w:rPr>
+          <w:b/>
+          <w:bCs/>
+          <w:iCs/>
+        </w:rPr>
+        <w:t xml:space="preserve"> library with tests at the end</w:t>
+      </w:r>
+    </w:p>
+    <w:p>
+      <w:pPr>
+        <w:rPr>
+          <w:b/>
+          <w:bCs/>
+          <w:iCs/>
+        </w:rPr>
       </w:pPr>
     </w:p>
     <w:p>
@@ -1777,7 +1999,21 @@
         <w:rPr>
           <w:iCs/>
         </w:rPr>
-        <w:t>One idea: perform static analysis on the function we are fuzzing before we fuzz it to see if it takes a function f as a param, if that function f itself takes a param. Thus we can narrow down which function fuzzing strategy to employ</w:t>
+        <w:t xml:space="preserve">One idea: perform static analysis on the function we are fuzzing before we fuzz it to see if it takes a function f as a param, if that function f itself takes a param. </w:t>
+      </w:r>
+      <w:proofErr w:type="gramStart"/>
+      <w:r>
+        <w:rPr>
+          <w:iCs/>
+        </w:rPr>
+        <w:t>Thus</w:t>
+      </w:r>
+      <w:proofErr w:type="gramEnd"/>
+      <w:r>
+        <w:rPr>
+          <w:iCs/>
+        </w:rPr>
+        <w:t xml:space="preserve"> we can narrow down which function fuzzing strategy to employ</w:t>
       </w:r>
     </w:p>
     <w:p>
@@ -1813,7 +2049,21 @@
         <w:rPr>
           <w:iCs/>
         </w:rPr>
-        <w:t>Functions f that take a single function as a param like f(h): we can check the sig of the function h given, and fuzz some input accordingly to call h with within f.</w:t>
+        <w:t xml:space="preserve">Functions f that </w:t>
+      </w:r>
+      <w:proofErr w:type="gramStart"/>
+      <w:r>
+        <w:rPr>
+          <w:iCs/>
+        </w:rPr>
+        <w:t>take</w:t>
+      </w:r>
+      <w:proofErr w:type="gramEnd"/>
+      <w:r>
+        <w:rPr>
+          <w:iCs/>
+        </w:rPr>
+        <w:t xml:space="preserve"> a single function as a param like f(h): we can check the sig of the function h given, and fuzz some input accordingly to call h with within f.</w:t>
       </w:r>
     </w:p>
     <w:p>
@@ -2159,7 +2409,7 @@
         </w:rPr>
         <w:t xml:space="preserve">Experimented with mutation testing. Started with </w:t>
       </w:r>
-      <w:hyperlink r:id="rId13" w:history="1">
+      <w:hyperlink r:id="rId14" w:history="1">
         <w:r>
           <w:rPr>
             <w:rStyle w:val="Hyperlink"/>
@@ -2303,7 +2553,14 @@
         <w:rPr>
           <w:iCs/>
         </w:rPr>
-        <w:t xml:space="preserve"> 3673/3673  </w:t>
+        <w:t xml:space="preserve"> 3673/</w:t>
+      </w:r>
+      <w:proofErr w:type="gramStart"/>
+      <w:r>
+        <w:rPr>
+          <w:iCs/>
+        </w:rPr>
+        <w:t xml:space="preserve">3673  </w:t>
       </w:r>
       <w:r>
         <w:rPr>
@@ -2312,6 +2569,7 @@
         </w:rPr>
         <w:t>🎉</w:t>
       </w:r>
+      <w:proofErr w:type="gramEnd"/>
       <w:r>
         <w:rPr>
           <w:iCs/>
@@ -2439,7 +2697,21 @@
         <w:rPr>
           <w:iCs/>
         </w:rPr>
-        <w:t>After adding class based stuff</w:t>
+        <w:t xml:space="preserve">After adding </w:t>
+      </w:r>
+      <w:proofErr w:type="gramStart"/>
+      <w:r>
+        <w:rPr>
+          <w:iCs/>
+        </w:rPr>
+        <w:t>class based</w:t>
+      </w:r>
+      <w:proofErr w:type="gramEnd"/>
+      <w:r>
+        <w:rPr>
+          <w:iCs/>
+        </w:rPr>
+        <w:t xml:space="preserve"> stuff</w:t>
       </w:r>
     </w:p>
     <w:p>
@@ -2530,7 +2802,14 @@
         <w:rPr>
           <w:iCs/>
         </w:rPr>
-        <w:t xml:space="preserve"> 445/445  </w:t>
+        <w:t xml:space="preserve"> 445/</w:t>
+      </w:r>
+      <w:proofErr w:type="gramStart"/>
+      <w:r>
+        <w:rPr>
+          <w:iCs/>
+        </w:rPr>
+        <w:t xml:space="preserve">445  </w:t>
       </w:r>
       <w:r>
         <w:rPr>
@@ -2539,6 +2818,7 @@
         </w:rPr>
         <w:t>🎉</w:t>
       </w:r>
+      <w:proofErr w:type="gramEnd"/>
       <w:r>
         <w:rPr>
           <w:iCs/>
@@ -2640,7 +2920,21 @@
         <w:rPr>
           <w:iCs/>
         </w:rPr>
-        <w:t>270/445 after adding more class based stuff</w:t>
+        <w:t xml:space="preserve">270/445 after adding more </w:t>
+      </w:r>
+      <w:proofErr w:type="gramStart"/>
+      <w:r>
+        <w:rPr>
+          <w:iCs/>
+        </w:rPr>
+        <w:t>class based</w:t>
+      </w:r>
+      <w:proofErr w:type="gramEnd"/>
+      <w:r>
+        <w:rPr>
+          <w:iCs/>
+        </w:rPr>
+        <w:t xml:space="preserve"> stuff</w:t>
       </w:r>
     </w:p>
     <w:p>
@@ -2696,6 +2990,7 @@
         <w:t xml:space="preserve">With the following addition to </w:t>
       </w:r>
       <w:proofErr w:type="spellStart"/>
+      <w:proofErr w:type="gramStart"/>
       <w:r>
         <w:rPr>
           <w:iCs/>
@@ -2703,6 +2998,7 @@
         <w:t>pyproject.toml</w:t>
       </w:r>
       <w:proofErr w:type="spellEnd"/>
+      <w:proofErr w:type="gramEnd"/>
     </w:p>
     <w:p>
       <w:pPr>
@@ -2717,6 +3013,7 @@
         <w:t>[</w:t>
       </w:r>
       <w:proofErr w:type="spellStart"/>
+      <w:proofErr w:type="gramStart"/>
       <w:r>
         <w:rPr>
           <w:iCs/>
@@ -2724,6 +3021,7 @@
         <w:t>tool.mutmut</w:t>
       </w:r>
       <w:proofErr w:type="spellEnd"/>
+      <w:proofErr w:type="gramEnd"/>
       <w:r>
         <w:rPr>
           <w:iCs/>
@@ -2834,7 +3132,21 @@
         <w:rPr>
           <w:iCs/>
         </w:rPr>
-        <w:t>Functions can alter  global state</w:t>
+        <w:t xml:space="preserve">Functions can </w:t>
+      </w:r>
+      <w:proofErr w:type="gramStart"/>
+      <w:r>
+        <w:rPr>
+          <w:iCs/>
+        </w:rPr>
+        <w:t>alter  global</w:t>
+      </w:r>
+      <w:proofErr w:type="gramEnd"/>
+      <w:r>
+        <w:rPr>
+          <w:iCs/>
+        </w:rPr>
+        <w:t xml:space="preserve"> state</w:t>
       </w:r>
     </w:p>
     <w:p>
@@ -2961,7 +3273,21 @@
         <w:rPr>
           <w:iCs/>
         </w:rPr>
-        <w:t>We cant see internal recursion</w:t>
+        <w:t xml:space="preserve">We </w:t>
+      </w:r>
+      <w:proofErr w:type="gramStart"/>
+      <w:r>
+        <w:rPr>
+          <w:iCs/>
+        </w:rPr>
+        <w:t>cant</w:t>
+      </w:r>
+      <w:proofErr w:type="gramEnd"/>
+      <w:r>
+        <w:rPr>
+          <w:iCs/>
+        </w:rPr>
+        <w:t xml:space="preserve"> see internal recursion</w:t>
       </w:r>
     </w:p>
     <w:p>
@@ -3057,11 +3383,19 @@
           <w:iCs/>
         </w:rPr>
       </w:pPr>
-      <w:r>
-        <w:rPr>
-          <w:iCs/>
-        </w:rPr>
-        <w:t>Have to retranslate hobbit suite</w:t>
+      <w:proofErr w:type="gramStart"/>
+      <w:r>
+        <w:rPr>
+          <w:iCs/>
+        </w:rPr>
+        <w:t>Have to</w:t>
+      </w:r>
+      <w:proofErr w:type="gramEnd"/>
+      <w:r>
+        <w:rPr>
+          <w:iCs/>
+        </w:rPr>
+        <w:t xml:space="preserve"> retranslate hobbit suite</w:t>
       </w:r>
     </w:p>
     <w:p>
@@ -3151,81 +3485,11 @@
     <w:p>
       <w:pPr>
         <w:rPr>
-          <w:iCs/>
-        </w:rPr>
-      </w:pPr>
-      <w:r>
-        <w:rPr>
-          <w:iCs/>
-        </w:rPr>
-        <w:t xml:space="preserve">Added functionality that if a higher order function returns a </w:t>
-      </w:r>
-      <w:r>
-        <w:rPr>
           <w:b/>
           <w:bCs/>
           <w:iCs/>
         </w:rPr>
-        <w:t>tuple</w:t>
-      </w:r>
-      <w:r>
-        <w:rPr>
-          <w:iCs/>
-        </w:rPr>
-        <w:t xml:space="preserve"> of functions, we interleave the execution of those functions</w:t>
-      </w:r>
-      <w:r>
-        <w:rPr>
-          <w:iCs/>
-        </w:rPr>
-        <w:t xml:space="preserve">. </w:t>
-      </w:r>
-    </w:p>
-    <w:p>
-      <w:pPr>
-        <w:rPr>
-          <w:iCs/>
-        </w:rPr>
-      </w:pPr>
-      <w:r>
-        <w:rPr>
-          <w:iCs/>
-        </w:rPr>
-        <w:t xml:space="preserve">Added functionality that if a higher order function takes a callable parameter, and then calls that callable parameter passing in multiple functions as arguments to that callable </w:t>
-      </w:r>
-      <w:r>
-        <w:rPr>
-          <w:iCs/>
-        </w:rPr>
-        <w:lastRenderedPageBreak/>
-        <w:t>parameter, then that callable parameter can interleave the execution of the functions it is given</w:t>
-      </w:r>
-    </w:p>
-    <w:p>
-      <w:pPr>
-        <w:rPr>
-          <w:iCs/>
-        </w:rPr>
-      </w:pPr>
-      <w:r>
-        <w:rPr>
-          <w:iCs/>
-        </w:rPr>
-        <w:t xml:space="preserve">Curried interaction plan: </w:t>
-      </w:r>
-    </w:p>
-    <w:p>
-      <w:pPr>
-        <w:rPr>
-          <w:iCs/>
-        </w:rPr>
-      </w:pPr>
-      <w:r>
-        <w:rPr>
-          <w:iCs/>
-        </w:rPr>
-        <w:t xml:space="preserve">For combiner-style HOFs, </w:t>
-      </w:r>
+      </w:pPr>
     </w:p>
     <w:p>
       <w:pPr>
@@ -3246,6 +3510,88 @@
         <w:rPr>
           <w:iCs/>
         </w:rPr>
+        <w:lastRenderedPageBreak/>
+        <w:t xml:space="preserve">Added functionality that if a higher order function returns a </w:t>
+      </w:r>
+      <w:r>
+        <w:rPr>
+          <w:b/>
+          <w:bCs/>
+          <w:iCs/>
+        </w:rPr>
+        <w:t>tuple</w:t>
+      </w:r>
+      <w:r>
+        <w:rPr>
+          <w:iCs/>
+        </w:rPr>
+        <w:t xml:space="preserve"> of functions, we interleave the execution of those functions</w:t>
+      </w:r>
+      <w:r>
+        <w:rPr>
+          <w:iCs/>
+        </w:rPr>
+        <w:t xml:space="preserve">. </w:t>
+      </w:r>
+    </w:p>
+    <w:p>
+      <w:pPr>
+        <w:rPr>
+          <w:iCs/>
+        </w:rPr>
+      </w:pPr>
+      <w:r>
+        <w:rPr>
+          <w:iCs/>
+        </w:rPr>
+        <w:t>Added functionality that if a higher order function takes a callable parameter, and then calls that callable parameter passing in multiple functions as arguments to that callable parameter, then that callable parameter can interleave the execution of the functions it is given</w:t>
+      </w:r>
+    </w:p>
+    <w:p>
+      <w:pPr>
+        <w:rPr>
+          <w:iCs/>
+        </w:rPr>
+      </w:pPr>
+      <w:r>
+        <w:rPr>
+          <w:iCs/>
+        </w:rPr>
+        <w:t xml:space="preserve">Curried interaction plan: </w:t>
+      </w:r>
+    </w:p>
+    <w:p>
+      <w:pPr>
+        <w:rPr>
+          <w:iCs/>
+        </w:rPr>
+      </w:pPr>
+      <w:r>
+        <w:rPr>
+          <w:iCs/>
+        </w:rPr>
+        <w:t xml:space="preserve">For combiner-style HOFs, </w:t>
+      </w:r>
+    </w:p>
+    <w:p>
+      <w:pPr>
+        <w:rPr>
+          <w:b/>
+          <w:bCs/>
+          <w:iCs/>
+        </w:rPr>
+      </w:pPr>
+    </w:p>
+    <w:p>
+      <w:pPr>
+        <w:rPr>
+          <w:iCs/>
+        </w:rPr>
+      </w:pPr>
+      <w:r>
+        <w:rPr>
+          <w:iCs/>
+        </w:rPr>
         <w:t>Need to consider if the function we are testing returns a tuple containing a function</w:t>
       </w:r>
     </w:p>
@@ -3294,7 +3640,21 @@
         <w:rPr>
           <w:iCs/>
         </w:rPr>
-        <w:t xml:space="preserve"> in a function where coverage wont change meaningfully</w:t>
+        <w:t xml:space="preserve"> in a function </w:t>
+      </w:r>
+      <w:proofErr w:type="gramStart"/>
+      <w:r>
+        <w:rPr>
+          <w:iCs/>
+        </w:rPr>
+        <w:t>where</w:t>
+      </w:r>
+      <w:proofErr w:type="gramEnd"/>
+      <w:r>
+        <w:rPr>
+          <w:iCs/>
+        </w:rPr>
+        <w:t xml:space="preserve"> coverage wont change meaningfully</w:t>
       </w:r>
     </w:p>
     <w:p>
@@ -3526,21 +3886,8 @@
         <w:rPr>
           <w:iCs/>
         </w:rPr>
-        <w:t xml:space="preserve">Comparing exception types when testing two </w:t>
-      </w:r>
-      <w:proofErr w:type="spellStart"/>
-      <w:r>
-        <w:rPr>
-          <w:iCs/>
-        </w:rPr>
-        <w:t>non type</w:t>
-      </w:r>
-      <w:proofErr w:type="spellEnd"/>
-      <w:r>
-        <w:rPr>
-          <w:iCs/>
-        </w:rPr>
-        <w:t xml:space="preserve"> annotated functions might be a bad idea. Even if two functions are equivalent but they do things in a different order they could get flagged as inequivalent </w:t>
+        <w:lastRenderedPageBreak/>
+        <w:t xml:space="preserve">Comparing exception types when testing two non type annotated functions might be a bad idea. Even if two functions are equivalent but they do things in a different order they could get flagged as inequivalent </w:t>
       </w:r>
       <w:proofErr w:type="spellStart"/>
       <w:r>
@@ -3554,14 +3901,53 @@
         <w:rPr>
           <w:iCs/>
         </w:rPr>
-        <w:t xml:space="preserve"> they ended up giving two different exception types. My current compromise is to relax the equivalence check for exceptions so that </w:t>
-      </w:r>
-      <w:r>
-        <w:rPr>
-          <w:iCs/>
-        </w:rPr>
-        <w:lastRenderedPageBreak/>
-        <w:t>we only care about exception types mattering if the functions are type annotated, otherwise we only check that both sides threw an exception at all (type doesn’t matter)</w:t>
+        <w:t xml:space="preserve"> they ended up giving two different exception types. My current compromise is to relax the equivalence check for exceptions so that we only care about exception types mattering if the functions are type annotated, otherwise we only check that both sides threw an exception at all (type doesn’t matter)</w:t>
+      </w:r>
+    </w:p>
+    <w:p>
+      <w:pPr>
+        <w:rPr>
+          <w:iCs/>
+        </w:rPr>
+      </w:pPr>
+    </w:p>
+    <w:p>
+      <w:pPr>
+        <w:rPr>
+          <w:iCs/>
+        </w:rPr>
+      </w:pPr>
+      <w:r>
+        <w:rPr>
+          <w:iCs/>
+        </w:rPr>
+        <w:t>Questions:</w:t>
+      </w:r>
+    </w:p>
+    <w:p>
+      <w:pPr>
+        <w:rPr>
+          <w:iCs/>
+        </w:rPr>
+      </w:pPr>
+      <w:r>
+        <w:rPr>
+          <w:iCs/>
+        </w:rPr>
+        <w:t>How formal will the demo be, should I prepare a slideshow?</w:t>
+      </w:r>
+    </w:p>
+    <w:p>
+      <w:pPr>
+        <w:rPr>
+          <w:iCs/>
+        </w:rPr>
+      </w:pPr>
+      <w:r>
+        <w:rPr>
+          <w:iCs/>
+        </w:rPr>
+        <w:t>I am working on the literature review, I will probably finish it within a week or so. Can I send it to you to review it?</w:t>
       </w:r>
     </w:p>
     <w:p/>

</xml_diff>

<commit_message>
Add LRU cache for type signatures
</commit_message>
<xml_diff>
--- a/Masters project notes.docx
+++ b/Masters project notes.docx
@@ -53,19 +53,11 @@
           <w:lang w:val="fr-FR"/>
         </w:rPr>
       </w:pPr>
-      <w:proofErr w:type="spellStart"/>
       <w:r>
         <w:rPr>
           <w:lang w:val="fr-FR"/>
         </w:rPr>
-        <w:t>Pythonfuzz</w:t>
-      </w:r>
-      <w:proofErr w:type="spellEnd"/>
-      <w:r>
-        <w:rPr>
-          <w:lang w:val="fr-FR"/>
-        </w:rPr>
-        <w:t xml:space="preserve"> </w:t>
+        <w:t xml:space="preserve">Pythonfuzz </w:t>
       </w:r>
       <w:hyperlink r:id="rId6" w:history="1">
         <w:r>
@@ -86,15 +78,7 @@
         </w:numPr>
       </w:pPr>
       <w:r>
-        <w:t xml:space="preserve">Coverage-guided </w:t>
-      </w:r>
-      <w:proofErr w:type="spellStart"/>
-      <w:r>
-        <w:t>fuzzer</w:t>
-      </w:r>
-      <w:proofErr w:type="spellEnd"/>
-      <w:r>
-        <w:t xml:space="preserve"> for python</w:t>
+        <w:t>Coverage-guided fuzzer for python</w:t>
       </w:r>
     </w:p>
     <w:p>
@@ -126,15 +110,7 @@
         </w:numPr>
       </w:pPr>
       <w:r>
-        <w:t xml:space="preserve">Google’s coverage-guided </w:t>
-      </w:r>
-      <w:proofErr w:type="spellStart"/>
-      <w:r>
-        <w:t>fuzzer</w:t>
-      </w:r>
-      <w:proofErr w:type="spellEnd"/>
-      <w:r>
-        <w:t xml:space="preserve"> for python</w:t>
+        <w:t>Google’s coverage-guided fuzzer for python</w:t>
       </w:r>
     </w:p>
     <w:p>
@@ -187,13 +163,8 @@
           <w:numId w:val="1"/>
         </w:numPr>
       </w:pPr>
-      <w:proofErr w:type="spellStart"/>
-      <w:r>
-        <w:t>CrossHair</w:t>
-      </w:r>
-      <w:proofErr w:type="spellEnd"/>
-      <w:r>
-        <w:t xml:space="preserve"> </w:t>
+      <w:r>
+        <w:t xml:space="preserve">CrossHair </w:t>
       </w:r>
       <w:hyperlink r:id="rId9" w:history="1">
         <w:r>
@@ -218,39 +189,7 @@
     </w:p>
     <w:p>
       <w:r>
-        <w:t xml:space="preserve">From my research, Hypothesis + </w:t>
-      </w:r>
-      <w:proofErr w:type="spellStart"/>
-      <w:r>
-        <w:t>HypoFuzz</w:t>
-      </w:r>
-      <w:proofErr w:type="spellEnd"/>
-      <w:r>
-        <w:t xml:space="preserve"> seems like it achieves everything that JQF does. Hypothesis is heavily inspired by </w:t>
-      </w:r>
-      <w:proofErr w:type="spellStart"/>
-      <w:r>
-        <w:t>QuickCheck</w:t>
-      </w:r>
-      <w:proofErr w:type="spellEnd"/>
-      <w:r>
-        <w:t xml:space="preserve"> and gives a property-based testing framework for python. It generates structured inputs and saves failing inputs for reproduction. It operates on the semantic properties of a program, making it inherently </w:t>
-      </w:r>
-      <w:proofErr w:type="gramStart"/>
-      <w:r>
-        <w:t>semantic-based</w:t>
-      </w:r>
-      <w:proofErr w:type="gramEnd"/>
-      <w:r>
-        <w:t xml:space="preserve">. It is not coverage-guided by default, so </w:t>
-      </w:r>
-      <w:proofErr w:type="spellStart"/>
-      <w:r>
-        <w:t>HypoFuzz</w:t>
-      </w:r>
-      <w:proofErr w:type="spellEnd"/>
-      <w:r>
-        <w:t xml:space="preserve"> extends it for coverage-guided exploration thus providing a fuzzing framework.</w:t>
+        <w:t>From my research, Hypothesis + HypoFuzz seems like it achieves everything that JQF does. Hypothesis is heavily inspired by QuickCheck and gives a property-based testing framework for python. It generates structured inputs and saves failing inputs for reproduction. It operates on the semantic properties of a program, making it inherently semantic-based. It is not coverage-guided by default, so HypoFuzz extends it for coverage-guided exploration thus providing a fuzzing framework.</w:t>
       </w:r>
     </w:p>
     <w:p/>
@@ -269,28 +208,15 @@
     </w:p>
     <w:p>
       <w:r>
-        <w:t>Generalise the stack example to any data structure/</w:t>
-      </w:r>
-      <w:proofErr w:type="spellStart"/>
-      <w:r>
-        <w:t>api</w:t>
-      </w:r>
-      <w:proofErr w:type="spellEnd"/>
+        <w:t>Generalise the stack example to any data structure/api</w:t>
+      </w:r>
       <w:r>
         <w:t xml:space="preserve"> that can take any type of arguments.</w:t>
       </w:r>
     </w:p>
     <w:p>
       <w:r>
-        <w:t xml:space="preserve">At some point, see if you can read the python script, create AST and traverse it </w:t>
-      </w:r>
-      <w:proofErr w:type="gramStart"/>
-      <w:r>
-        <w:t>in order to</w:t>
-      </w:r>
-      <w:proofErr w:type="gramEnd"/>
-      <w:r>
-        <w:t xml:space="preserve"> create the right test.</w:t>
+        <w:t>At some point, see if you can read the python script, create AST and traverse it in order to create the right test.</w:t>
       </w:r>
     </w:p>
     <w:p/>
@@ -304,58 +230,18 @@
         <w:t xml:space="preserve">Using it to test a very simple summing function </w:t>
       </w:r>
       <w:r>
-        <w:t xml:space="preserve">doesn’t work very well. I believe because of how universal is configured and how my two simple functions are configured, </w:t>
-      </w:r>
-      <w:proofErr w:type="spellStart"/>
-      <w:r>
-        <w:t>atheris</w:t>
-      </w:r>
-      <w:proofErr w:type="spellEnd"/>
-      <w:r>
-        <w:t xml:space="preserve"> is unable to quickly find the erroneous input.</w:t>
-      </w:r>
-    </w:p>
-    <w:p>
-      <w:r>
-        <w:t xml:space="preserve">I think the fact that fuzz testing is obfuscated inside the universal object the module is unable to correctly perform its algorithms to find erroneous inputs. I vibe coded a </w:t>
-      </w:r>
-      <w:proofErr w:type="spellStart"/>
-      <w:r>
-        <w:t>hypofuzz</w:t>
-      </w:r>
-      <w:proofErr w:type="spellEnd"/>
-      <w:r>
-        <w:t xml:space="preserve"> universal object </w:t>
-      </w:r>
-      <w:proofErr w:type="gramStart"/>
-      <w:r>
-        <w:t>and also</w:t>
-      </w:r>
-      <w:proofErr w:type="gramEnd"/>
-      <w:r>
-        <w:t xml:space="preserve"> tried manually implementing one and couldn’t get it to spot any bugs but given more time there may be a way to implement this. Just haven’t figured it out yet.</w:t>
+        <w:t>doesn’t work very well. I believe because of how universal is configured and how my two simple functions are configured, atheris is unable to quickly find the erroneous input.</w:t>
+      </w:r>
+    </w:p>
+    <w:p>
+      <w:r>
+        <w:t>I think the fact that fuzz testing is obfuscated inside the universal object the module is unable to correctly perform its algorithms to find erroneous inputs. I vibe coded a hypofuzz universal object and also tried manually implementing one and couldn’t get it to spot any bugs but given more time there may be a way to implement this. Just haven’t figured it out yet.</w:t>
       </w:r>
     </w:p>
     <w:p>
       <w:r>
         <w:lastRenderedPageBreak/>
-        <w:t xml:space="preserve">When comparing two different sorting algorithms, </w:t>
-      </w:r>
-      <w:proofErr w:type="spellStart"/>
-      <w:r>
-        <w:t>hypofuzz</w:t>
-      </w:r>
-      <w:proofErr w:type="spellEnd"/>
-      <w:r>
-        <w:t xml:space="preserve"> was unable to spot the difference when I added a small condition to quicksort if length is &gt;= 6, return the reversed list. For these </w:t>
-      </w:r>
-      <w:proofErr w:type="gramStart"/>
-      <w:r>
-        <w:t>one off</w:t>
-      </w:r>
-      <w:proofErr w:type="gramEnd"/>
-      <w:r>
-        <w:t xml:space="preserve"> conditions, coverage guidance actually makes it harder to spot the difference, as they provide very little feedback. Plain hypothesis was able to catch this bug (without coverage guidance)</w:t>
+        <w:t>When comparing two different sorting algorithms, hypofuzz was unable to spot the difference when I added a small condition to quicksort if length is &gt;= 6, return the reversed list. For these one off conditions, coverage guidance actually makes it harder to spot the difference, as they provide very little feedback. Plain hypothesis was able to catch this bug (without coverage guidance)</w:t>
       </w:r>
     </w:p>
     <w:p>
@@ -374,57 +260,12 @@
     </w:p>
     <w:p>
       <w:r>
-        <w:t xml:space="preserve">Testing universal object on two sorting algorithms always results in empty lists as universals value gets set to empty list if </w:t>
-      </w:r>
-      <w:proofErr w:type="spellStart"/>
-      <w:proofErr w:type="gramStart"/>
-      <w:r>
-        <w:t>len</w:t>
-      </w:r>
-      <w:proofErr w:type="spellEnd"/>
-      <w:r>
-        <w:t>(</w:t>
-      </w:r>
-      <w:proofErr w:type="gramEnd"/>
-      <w:r>
-        <w:t xml:space="preserve">) is called on it. This is </w:t>
-      </w:r>
-      <w:proofErr w:type="spellStart"/>
-      <w:r>
-        <w:t>bcos</w:t>
-      </w:r>
-      <w:proofErr w:type="spellEnd"/>
-      <w:r>
-        <w:t xml:space="preserve"> if we initialise it as a list of universals, this may be wrong as it may be intended to be a string. </w:t>
-      </w:r>
-    </w:p>
-    <w:p>
-      <w:r>
-        <w:t xml:space="preserve">Universal needs </w:t>
-      </w:r>
-      <w:proofErr w:type="spellStart"/>
-      <w:r>
-        <w:t>lt</w:t>
-      </w:r>
-      <w:proofErr w:type="spellEnd"/>
-      <w:r>
-        <w:t xml:space="preserve">, </w:t>
-      </w:r>
-      <w:proofErr w:type="spellStart"/>
-      <w:r>
-        <w:t>gt</w:t>
-      </w:r>
-      <w:proofErr w:type="spellEnd"/>
-      <w:r>
-        <w:t xml:space="preserve">, le, </w:t>
-      </w:r>
-      <w:proofErr w:type="spellStart"/>
-      <w:r>
-        <w:t>ge</w:t>
-      </w:r>
-      <w:proofErr w:type="spellEnd"/>
-      <w:r>
-        <w:t xml:space="preserve"> operators define</w:t>
+        <w:t xml:space="preserve">Testing universal object on two sorting algorithms always results in empty lists as universals value gets set to empty list if len() is called on it. This is bcos if we initialise it as a list of universals, this may be wrong as it may be intended to be a string. </w:t>
+      </w:r>
+    </w:p>
+    <w:p>
+      <w:r>
+        <w:t>Universal needs lt, gt, le, ge operators define</w:t>
       </w:r>
       <w:r>
         <w:t>d</w:t>
@@ -438,99 +279,20 @@
         <w:t>Universal does not support item assignment</w:t>
       </w:r>
       <w:r>
-        <w:t xml:space="preserve"> </w:t>
-      </w:r>
-      <w:proofErr w:type="spellStart"/>
-      <w:r>
-        <w:t>e.g</w:t>
-      </w:r>
-      <w:proofErr w:type="spellEnd"/>
-      <w:r>
-        <w:t xml:space="preserve"> the line</w:t>
-      </w:r>
-    </w:p>
-    <w:p>
-      <w:proofErr w:type="spellStart"/>
-      <w:proofErr w:type="gramStart"/>
-      <w:r>
-        <w:t>arr</w:t>
-      </w:r>
-      <w:proofErr w:type="spellEnd"/>
-      <w:r>
-        <w:t>[</w:t>
-      </w:r>
-      <w:proofErr w:type="spellStart"/>
-      <w:proofErr w:type="gramEnd"/>
-      <w:r>
-        <w:t>i</w:t>
-      </w:r>
-      <w:proofErr w:type="spellEnd"/>
-      <w:r>
-        <w:t xml:space="preserve"> + 1], </w:t>
-      </w:r>
-      <w:proofErr w:type="spellStart"/>
-      <w:r>
-        <w:t>arr</w:t>
-      </w:r>
-      <w:proofErr w:type="spellEnd"/>
-      <w:r>
-        <w:t xml:space="preserve">[high] = </w:t>
-      </w:r>
-      <w:proofErr w:type="spellStart"/>
-      <w:r>
-        <w:t>arr</w:t>
-      </w:r>
-      <w:proofErr w:type="spellEnd"/>
-      <w:r>
-        <w:t xml:space="preserve">[high], </w:t>
-      </w:r>
-      <w:proofErr w:type="spellStart"/>
-      <w:r>
-        <w:t>arr</w:t>
-      </w:r>
-      <w:proofErr w:type="spellEnd"/>
-      <w:r>
-        <w:t>[</w:t>
-      </w:r>
-      <w:proofErr w:type="spellStart"/>
-      <w:r>
-        <w:t>i</w:t>
-      </w:r>
-      <w:proofErr w:type="spellEnd"/>
-      <w:r>
-        <w:t xml:space="preserve"> + 1]</w:t>
-      </w:r>
-    </w:p>
-    <w:p>
-      <w:r>
-        <w:t xml:space="preserve">does not work if </w:t>
-      </w:r>
-      <w:proofErr w:type="spellStart"/>
-      <w:r>
-        <w:t>arr</w:t>
-      </w:r>
-      <w:proofErr w:type="spellEnd"/>
-      <w:r>
-        <w:t xml:space="preserve"> is a universal and each element of </w:t>
-      </w:r>
-      <w:proofErr w:type="spellStart"/>
-      <w:r>
-        <w:t>arr</w:t>
-      </w:r>
-      <w:proofErr w:type="spellEnd"/>
-      <w:r>
-        <w:t xml:space="preserve"> is a universal</w:t>
-      </w:r>
-      <w:r>
-        <w:t xml:space="preserve"> I “</w:t>
-      </w:r>
-      <w:proofErr w:type="spellStart"/>
-      <w:r>
-        <w:t>vibecoded</w:t>
-      </w:r>
-      <w:proofErr w:type="spellEnd"/>
-      <w:r>
-        <w:t>” an implementation of this.</w:t>
+        <w:t xml:space="preserve"> e.g the line</w:t>
+      </w:r>
+    </w:p>
+    <w:p>
+      <w:r>
+        <w:t>arr[i + 1], arr[high] = arr[high], arr[i + 1]</w:t>
+      </w:r>
+    </w:p>
+    <w:p>
+      <w:r>
+        <w:t>does not work if arr is a universal and each element of arr is a universal</w:t>
+      </w:r>
+      <w:r>
+        <w:t xml:space="preserve"> I “vibecoded” an implementation of this.</w:t>
       </w:r>
     </w:p>
     <w:p>
@@ -546,36 +308,12 @@
     </w:p>
     <w:p>
       <w:r>
-        <w:t xml:space="preserve">Read </w:t>
-      </w:r>
-      <w:proofErr w:type="spellStart"/>
-      <w:r>
-        <w:t>TypeEvalPy</w:t>
-      </w:r>
-      <w:proofErr w:type="spellEnd"/>
-      <w:r>
-        <w:t xml:space="preserve"> to find good frameworks for function parameters.</w:t>
-      </w:r>
-    </w:p>
-    <w:p>
-      <w:r>
-        <w:t xml:space="preserve">Tried </w:t>
-      </w:r>
-      <w:proofErr w:type="spellStart"/>
-      <w:r>
-        <w:t>HeaderGen</w:t>
-      </w:r>
-      <w:proofErr w:type="spellEnd"/>
-      <w:r>
-        <w:t xml:space="preserve"> as it was apparently the best for all categories including function parameters. When I tried it, it would only infer function return types and not parameters. The </w:t>
-      </w:r>
-      <w:proofErr w:type="spellStart"/>
-      <w:r>
-        <w:t>github</w:t>
-      </w:r>
-      <w:proofErr w:type="spellEnd"/>
-      <w:r>
-        <w:t xml:space="preserve"> only mentions that it can resolve function return types and I could not figure out any way to get it to infer parameter types. </w:t>
+        <w:t>Read TypeEvalPy to find good frameworks for function parameters.</w:t>
+      </w:r>
+    </w:p>
+    <w:p>
+      <w:r>
+        <w:t xml:space="preserve">Tried HeaderGen as it was apparently the best for all categories including function parameters. When I tried it, it would only infer function return types and not parameters. The github only mentions that it can resolve function return types and I could not figure out any way to get it to infer parameter types. </w:t>
       </w:r>
     </w:p>
     <w:p>
@@ -629,103 +367,23 @@
         </w:numPr>
       </w:pPr>
       <w:r>
-        <w:t>Hypothesis/</w:t>
-      </w:r>
-      <w:proofErr w:type="spellStart"/>
-      <w:r>
-        <w:t>Hypofuzz</w:t>
-      </w:r>
-      <w:proofErr w:type="spellEnd"/>
-      <w:r>
-        <w:t xml:space="preserve"> “Strategies” are how you define what is passed </w:t>
-      </w:r>
-      <w:proofErr w:type="gramStart"/>
-      <w:r>
-        <w:t>in to</w:t>
-      </w:r>
-      <w:proofErr w:type="gramEnd"/>
-      <w:r>
-        <w:t xml:space="preserve"> the function you want to fuzz. </w:t>
-      </w:r>
-      <w:proofErr w:type="spellStart"/>
-      <w:r>
-        <w:t>E.g</w:t>
-      </w:r>
-      <w:proofErr w:type="spellEnd"/>
-      <w:r>
-        <w:t xml:space="preserve">  </w:t>
+        <w:t xml:space="preserve">Hypothesis/Hypofuzz “Strategies” are how you define what is passed in to the function you want to fuzz. E.g  </w:t>
       </w:r>
     </w:p>
     <w:p>
       <w:r>
         <w:lastRenderedPageBreak/>
-        <w:t>@given(</w:t>
-      </w:r>
-      <w:proofErr w:type="gramStart"/>
-      <w:r>
-        <w:t>st.lists</w:t>
-      </w:r>
-      <w:proofErr w:type="gramEnd"/>
-      <w:r>
-        <w:t xml:space="preserve">(st.integers() | </w:t>
-      </w:r>
-      <w:proofErr w:type="spellStart"/>
-      <w:r>
-        <w:t>st.floats</w:t>
-      </w:r>
-      <w:proofErr w:type="spellEnd"/>
-      <w:r>
-        <w:t>()))</w:t>
-      </w:r>
-    </w:p>
-    <w:p>
-      <w:r>
-        <w:t xml:space="preserve">def </w:t>
-      </w:r>
-      <w:proofErr w:type="spellStart"/>
-      <w:r>
-        <w:t>test_sort_correct</w:t>
-      </w:r>
-      <w:proofErr w:type="spellEnd"/>
-      <w:r>
-        <w:t>(</w:t>
-      </w:r>
-      <w:proofErr w:type="spellStart"/>
-      <w:r>
-        <w:t>lst</w:t>
-      </w:r>
-      <w:proofErr w:type="spellEnd"/>
-      <w:r>
-        <w:t>):</w:t>
-      </w:r>
-    </w:p>
-    <w:p>
-      <w:r>
-        <w:t xml:space="preserve">    assert(</w:t>
-      </w:r>
-      <w:proofErr w:type="spellStart"/>
-      <w:r>
-        <w:t>my_sort</w:t>
-      </w:r>
-      <w:proofErr w:type="spellEnd"/>
-      <w:r>
-        <w:t>(</w:t>
-      </w:r>
-      <w:proofErr w:type="spellStart"/>
-      <w:r>
-        <w:t>lst</w:t>
-      </w:r>
-      <w:proofErr w:type="spellEnd"/>
-      <w:r>
-        <w:t>) == sorted(</w:t>
-      </w:r>
-      <w:proofErr w:type="spellStart"/>
-      <w:r>
-        <w:t>lst</w:t>
-      </w:r>
-      <w:proofErr w:type="spellEnd"/>
-      <w:r>
-        <w:t>))</w:t>
+        <w:t>@given(st.lists(st.integers() | st.floats()))</w:t>
+      </w:r>
+    </w:p>
+    <w:p>
+      <w:r>
+        <w:t>def test_sort_correct(lst):</w:t>
+      </w:r>
+    </w:p>
+    <w:p>
+      <w:r>
+        <w:t xml:space="preserve">    assert(my_sort(lst) == sorted(lst))</w:t>
       </w:r>
     </w:p>
     <w:p>
@@ -737,23 +395,7 @@
         </w:numPr>
       </w:pPr>
       <w:r>
-        <w:t xml:space="preserve">In that code snippet, the strategy is to fuzz </w:t>
-      </w:r>
-      <w:proofErr w:type="spellStart"/>
-      <w:r>
-        <w:t>my_sort</w:t>
-      </w:r>
-      <w:proofErr w:type="spellEnd"/>
-      <w:r>
-        <w:t xml:space="preserve"> with inputs of type list[</w:t>
-      </w:r>
-      <w:proofErr w:type="spellStart"/>
-      <w:r>
-        <w:t>int|str</w:t>
-      </w:r>
-      <w:proofErr w:type="spellEnd"/>
-      <w:r>
-        <w:t>]</w:t>
+        <w:t>In that code snippet, the strategy is to fuzz my_sort with inputs of type list[int|str]</w:t>
       </w:r>
     </w:p>
     <w:p>
@@ -776,55 +418,8 @@
           <w:numId w:val="3"/>
         </w:numPr>
       </w:pPr>
-      <w:proofErr w:type="spellStart"/>
-      <w:r>
-        <w:t>strat</w:t>
-      </w:r>
-      <w:proofErr w:type="spellEnd"/>
-      <w:r>
-        <w:t xml:space="preserve"> = </w:t>
-      </w:r>
-      <w:proofErr w:type="spellStart"/>
-      <w:r>
-        <w:t>int|str|float|bool|None|list</w:t>
-      </w:r>
-      <w:proofErr w:type="spellEnd"/>
-      <w:r>
-        <w:t>[</w:t>
-      </w:r>
-      <w:proofErr w:type="spellStart"/>
-      <w:r>
-        <w:t>strat</w:t>
-      </w:r>
-      <w:proofErr w:type="spellEnd"/>
-      <w:r>
-        <w:t>]|</w:t>
-      </w:r>
-      <w:proofErr w:type="spellStart"/>
-      <w:r>
-        <w:t>dict</w:t>
-      </w:r>
-      <w:proofErr w:type="spellEnd"/>
-      <w:r>
-        <w:t>[</w:t>
-      </w:r>
-      <w:proofErr w:type="spellStart"/>
-      <w:proofErr w:type="gramStart"/>
-      <w:r>
-        <w:t>str,strat</w:t>
-      </w:r>
-      <w:proofErr w:type="spellEnd"/>
-      <w:proofErr w:type="gramEnd"/>
-      <w:r>
-        <w:t>]|tuple[</w:t>
-      </w:r>
-      <w:proofErr w:type="spellStart"/>
-      <w:r>
-        <w:t>strat</w:t>
-      </w:r>
-      <w:proofErr w:type="spellEnd"/>
-      <w:r>
-        <w:t>]</w:t>
+      <w:r>
+        <w:t>strat = int|str|float|bool|None|list[strat]|dict[str,strat]|tuple[strat]</w:t>
       </w:r>
     </w:p>
     <w:p>
@@ -836,15 +431,7 @@
         </w:numPr>
       </w:pPr>
       <w:r>
-        <w:t xml:space="preserve">I have logic implemented so that if we encounter a </w:t>
-      </w:r>
-      <w:proofErr w:type="spellStart"/>
-      <w:r>
-        <w:t>TypeError</w:t>
-      </w:r>
-      <w:proofErr w:type="spellEnd"/>
-      <w:r>
-        <w:t>, we discard the type that caused the error from the pool of possible types in our strategy for future iterations.</w:t>
+        <w:t>I have logic implemented so that if we encounter a TypeError, we discard the type that caused the error from the pool of possible types in our strategy for future iterations.</w:t>
       </w:r>
     </w:p>
     <w:p>
@@ -856,15 +443,7 @@
         </w:numPr>
       </w:pPr>
       <w:r>
-        <w:t xml:space="preserve">It seems to work </w:t>
-      </w:r>
-      <w:proofErr w:type="gramStart"/>
-      <w:r>
-        <w:t>fairly well</w:t>
-      </w:r>
-      <w:proofErr w:type="gramEnd"/>
-      <w:r>
-        <w:t xml:space="preserve"> for the simple tests I have performed so far</w:t>
+        <w:t>It seems to work fairly well for the simple tests I have performed so far</w:t>
       </w:r>
     </w:p>
     <w:p>
@@ -876,15 +455,7 @@
         </w:numPr>
       </w:pPr>
       <w:r>
-        <w:t xml:space="preserve">Because it essentially brute forces fuzzing with different types until it works, I can imagine this being quite slow for fuzzing complex functions with lots of </w:t>
-      </w:r>
-      <w:proofErr w:type="gramStart"/>
-      <w:r>
-        <w:t>arguments</w:t>
-      </w:r>
-      <w:proofErr w:type="gramEnd"/>
-      <w:r>
-        <w:t xml:space="preserve"> but this will have to be tested more</w:t>
+        <w:t>Because it essentially brute forces fuzzing with different types until it works, I can imagine this being quite slow for fuzzing complex functions with lots of arguments but this will have to be tested more</w:t>
       </w:r>
     </w:p>
     <w:p>
@@ -907,49 +478,17 @@
     </w:p>
     <w:p>
       <w:r>
-        <w:t xml:space="preserve">If we assume there isn’t any explicit casting in the function we are fuzzing, how would a universal handle a situation where the type is ambiguous </w:t>
-      </w:r>
-      <w:proofErr w:type="spellStart"/>
-      <w:r>
-        <w:t>e.g</w:t>
-      </w:r>
-      <w:proofErr w:type="spellEnd"/>
-      <w:r>
-        <w:t xml:space="preserve"> calling </w:t>
-      </w:r>
-      <w:proofErr w:type="spellStart"/>
-      <w:r>
-        <w:t>len</w:t>
-      </w:r>
-      <w:proofErr w:type="spellEnd"/>
-      <w:r>
-        <w:t>(universal). Len is valid for both string and list so how do we lock universal here?</w:t>
-      </w:r>
-    </w:p>
-    <w:p>
-      <w:r>
-        <w:t xml:space="preserve">Similarly, how would we define operators like plus (+) for example? If we have two universals u1 and u2, the statement u1 + u2 could imply that u1 and u2 are strings, </w:t>
-      </w:r>
-      <w:proofErr w:type="spellStart"/>
-      <w:r>
-        <w:t>ints</w:t>
-      </w:r>
-      <w:proofErr w:type="spellEnd"/>
-      <w:r>
-        <w:t>, floats, lists, tuples so how can we implement this operator.</w:t>
-      </w:r>
-    </w:p>
-    <w:p>
-      <w:r>
-        <w:t xml:space="preserve">Theoretically speaking, at best we are determining the type of a (universal) object based on how that object is treated in the code and what functions and operations are applied to it. At best a perfect solution seems to me like it would essentially be a glorified </w:t>
-      </w:r>
-      <w:proofErr w:type="gramStart"/>
-      <w:r>
-        <w:t>type</w:t>
-      </w:r>
-      <w:proofErr w:type="gramEnd"/>
-      <w:r>
-        <w:t xml:space="preserve"> inference algorithm.</w:t>
+        <w:t>If we assume there isn’t any explicit casting in the function we are fuzzing, how would a universal handle a situation where the type is ambiguous e.g calling len(universal). Len is valid for both string and list so how do we lock universal here?</w:t>
+      </w:r>
+    </w:p>
+    <w:p>
+      <w:r>
+        <w:t>Similarly, how would we define operators like plus (+) for example? If we have two universals u1 and u2, the statement u1 + u2 could imply that u1 and u2 are strings, ints, floats, lists, tuples so how can we implement this operator.</w:t>
+      </w:r>
+    </w:p>
+    <w:p>
+      <w:r>
+        <w:t>Theoretically speaking, at best we are determining the type of a (universal) object based on how that object is treated in the code and what functions and operations are applied to it. At best a perfect solution seems to me like it would essentially be a glorified type inference algorithm.</w:t>
       </w:r>
     </w:p>
     <w:p/>
@@ -966,15 +505,7 @@
     <w:p>
       <w:r>
         <w:lastRenderedPageBreak/>
-        <w:t xml:space="preserve">See if </w:t>
-      </w:r>
-      <w:proofErr w:type="spellStart"/>
-      <w:r>
-        <w:t>func</w:t>
-      </w:r>
-      <w:proofErr w:type="spellEnd"/>
-      <w:r>
-        <w:t xml:space="preserve"> argument is callable, raise exception and print that the code is using callbacks which are not currently supported</w:t>
+        <w:t>See if func argument is callable, raise exception and print that the code is using callbacks which are not currently supported</w:t>
       </w:r>
     </w:p>
     <w:p/>
@@ -996,31 +527,13 @@
         <w:t xml:space="preserve">classes </w:t>
       </w:r>
       <w:r>
-        <w:t xml:space="preserve">for 2 stack </w:t>
-      </w:r>
-      <w:proofErr w:type="gramStart"/>
-      <w:r>
-        <w:t>implementation</w:t>
-      </w:r>
-      <w:proofErr w:type="gramEnd"/>
-    </w:p>
-    <w:p>
-      <w:r>
-        <w:t xml:space="preserve">The </w:t>
-      </w:r>
-      <w:proofErr w:type="spellStart"/>
-      <w:r>
-        <w:t>fuzzer</w:t>
-      </w:r>
-      <w:proofErr w:type="spellEnd"/>
-      <w:r>
-        <w:t xml:space="preserve"> </w:t>
-      </w:r>
-      <w:proofErr w:type="gramStart"/>
-      <w:r>
-        <w:t>should :</w:t>
-      </w:r>
-      <w:proofErr w:type="gramEnd"/>
+        <w:t>for 2 stack implementation</w:t>
+      </w:r>
+    </w:p>
+    <w:p>
+      <w:r>
+        <w:t>The fuzzer should :</w:t>
+      </w:r>
     </w:p>
     <w:p>
       <w:r>
@@ -1040,36 +553,12 @@
     <w:p/>
     <w:p>
       <w:r>
-        <w:t xml:space="preserve">Added </w:t>
-      </w:r>
-      <w:proofErr w:type="spellStart"/>
-      <w:r>
-        <w:t>arg</w:t>
-      </w:r>
-      <w:proofErr w:type="spellEnd"/>
-      <w:r>
-        <w:t>/</w:t>
-      </w:r>
-      <w:proofErr w:type="spellStart"/>
-      <w:r>
-        <w:t>kwarg</w:t>
-      </w:r>
-      <w:proofErr w:type="spellEnd"/>
-      <w:r>
-        <w:t xml:space="preserve"> support for fuzz testing strategy</w:t>
-      </w:r>
-    </w:p>
-    <w:p>
-      <w:r>
-        <w:t xml:space="preserve">Wrote basic </w:t>
-      </w:r>
-      <w:proofErr w:type="gramStart"/>
-      <w:r>
-        <w:t>first class</w:t>
-      </w:r>
-      <w:proofErr w:type="gramEnd"/>
-      <w:r>
-        <w:t xml:space="preserve"> equivalence tester</w:t>
+        <w:t>Added arg/kwarg support for fuzz testing strategy</w:t>
+      </w:r>
+    </w:p>
+    <w:p>
+      <w:r>
+        <w:t>Wrote basic first class equivalence tester</w:t>
       </w:r>
     </w:p>
     <w:p>
@@ -1089,36 +578,12 @@
     </w:p>
     <w:p>
       <w:r>
-        <w:t xml:space="preserve">I have tried applying this equivalence tester to small refactors in real classes from open sources repos such as </w:t>
-      </w:r>
-      <w:proofErr w:type="spellStart"/>
-      <w:r>
-        <w:t>openai</w:t>
-      </w:r>
-      <w:proofErr w:type="spellEnd"/>
-      <w:r>
-        <w:t xml:space="preserve"> but have struggled to find working examples. My equivalence tester is quite situational. Method name/signature </w:t>
-      </w:r>
-      <w:proofErr w:type="gramStart"/>
-      <w:r>
-        <w:t>refactors</w:t>
-      </w:r>
-      <w:proofErr w:type="gramEnd"/>
-      <w:r>
-        <w:t xml:space="preserve"> and external dependencies cause issues</w:t>
-      </w:r>
-    </w:p>
-    <w:p>
-      <w:r>
-        <w:t xml:space="preserve">Tested it on two stack implementations, one that throws index error if you try to peek or pop and empty stack, and one that returns None for these operations. The </w:t>
-      </w:r>
-      <w:proofErr w:type="spellStart"/>
-      <w:r>
-        <w:t>fuzzer</w:t>
-      </w:r>
-      <w:proofErr w:type="spellEnd"/>
-      <w:r>
-        <w:t xml:space="preserve"> was able to pick up on this difference immediately</w:t>
+        <w:t>I have tried applying this equivalence tester to small refactors in real classes from open sources repos such as openai but have struggled to find working examples. My equivalence tester is quite situational. Method name/signature refactors and external dependencies cause issues</w:t>
+      </w:r>
+    </w:p>
+    <w:p>
+      <w:r>
+        <w:t>Tested it on two stack implementations, one that throws index error if you try to peek or pop and empty stack, and one that returns None for these operations. The fuzzer was able to pick up on this difference immediately</w:t>
       </w:r>
     </w:p>
     <w:p/>
@@ -1208,23 +673,7 @@
     </w:p>
     <w:p>
       <w:r>
-        <w:t xml:space="preserve">What I mean by this is that currently, my code will test two classes for equivalence and if the classes have differing methods or even method names, the code will reject them. Allow the user to define a </w:t>
-      </w:r>
-      <w:proofErr w:type="spellStart"/>
-      <w:r>
-        <w:t>json</w:t>
-      </w:r>
-      <w:proofErr w:type="spellEnd"/>
-      <w:r>
-        <w:t xml:space="preserve"> file with the specific methods from the class that they want tested so they can exclude certain methods if they </w:t>
-      </w:r>
-      <w:proofErr w:type="gramStart"/>
-      <w:r>
-        <w:t>like, and</w:t>
-      </w:r>
-      <w:proofErr w:type="gramEnd"/>
-      <w:r>
-        <w:t xml:space="preserve"> optionally allow the user to also define specifically what arguments each method should be tested with.</w:t>
+        <w:t>What I mean by this is that currently, my code will test two classes for equivalence and if the classes have differing methods or even method names, the code will reject them. Allow the user to define a json file with the specific methods from the class that they want tested so they can exclude certain methods if they like, and optionally allow the user to also define specifically what arguments each method should be tested with.</w:t>
       </w:r>
     </w:p>
     <w:p/>
@@ -1265,15 +714,7 @@
       </w:r>
       <w:r>
         <w:lastRenderedPageBreak/>
-        <w:t xml:space="preserve">duplicates, removing the need to fuzz both </w:t>
-      </w:r>
-      <w:proofErr w:type="spellStart"/>
-      <w:r>
-        <w:t>funcs</w:t>
-      </w:r>
-      <w:proofErr w:type="spellEnd"/>
-      <w:r>
-        <w:t>. Useful in practice for speeding up a common case</w:t>
+        <w:t>duplicates, removing the need to fuzz both funcs. Useful in practice for speeding up a common case</w:t>
       </w:r>
     </w:p>
     <w:p>
@@ -1285,15 +726,7 @@
         </w:numPr>
       </w:pPr>
       <w:r>
-        <w:t xml:space="preserve">Filter out </w:t>
-      </w:r>
-      <w:proofErr w:type="spellStart"/>
-      <w:r>
-        <w:t>funcs</w:t>
-      </w:r>
-      <w:proofErr w:type="spellEnd"/>
-      <w:r>
-        <w:t xml:space="preserve"> with no parameters and return values</w:t>
+        <w:t>Filter out funcs with no parameters and return values</w:t>
       </w:r>
     </w:p>
     <w:p>
@@ -1305,15 +738,7 @@
         </w:numPr>
       </w:pPr>
       <w:r>
-        <w:t xml:space="preserve">Possibly filter out </w:t>
-      </w:r>
-      <w:proofErr w:type="spellStart"/>
-      <w:r>
-        <w:t>funcs</w:t>
-      </w:r>
-      <w:proofErr w:type="spellEnd"/>
-      <w:r>
-        <w:t xml:space="preserve"> that invoke external classes or methods</w:t>
+        <w:t>Possibly filter out funcs that invoke external classes or methods</w:t>
       </w:r>
     </w:p>
     <w:p>
@@ -1325,15 +750,7 @@
         </w:numPr>
       </w:pPr>
       <w:r>
-        <w:t xml:space="preserve">They use </w:t>
-      </w:r>
-      <w:proofErr w:type="spellStart"/>
-      <w:r>
-        <w:t>pynguin</w:t>
-      </w:r>
-      <w:proofErr w:type="spellEnd"/>
-      <w:r>
-        <w:t xml:space="preserve"> which is a test generation framework that does not use fuzz testing</w:t>
+        <w:t>They use pynguin which is a test generation framework that does not use fuzz testing</w:t>
       </w:r>
     </w:p>
     <w:p>
@@ -1353,15 +770,7 @@
     </w:p>
     <w:p>
       <w:r>
-        <w:t xml:space="preserve">What if u have a class with 1 </w:t>
-      </w:r>
-      <w:proofErr w:type="gramStart"/>
-      <w:r>
-        <w:t>methods</w:t>
-      </w:r>
-      <w:proofErr w:type="gramEnd"/>
-      <w:r>
-        <w:t>, a factory method which gives u back 3 methods</w:t>
+        <w:t>What if u have a class with 1 methods, a factory method which gives u back 3 methods</w:t>
       </w:r>
     </w:p>
     <w:p>
@@ -1394,29 +803,13 @@
     </w:p>
     <w:p>
       <w:r>
-        <w:t xml:space="preserve">could instead go more practical, targeting </w:t>
-      </w:r>
-      <w:proofErr w:type="spellStart"/>
-      <w:r>
-        <w:t>datastructure</w:t>
-      </w:r>
-      <w:proofErr w:type="spellEnd"/>
-      <w:r>
-        <w:t xml:space="preserve"> implementations online</w:t>
+        <w:t>could instead go more practical, targeting datastructure implementations online</w:t>
       </w:r>
     </w:p>
     <w:p/>
     <w:p>
       <w:r>
-        <w:t xml:space="preserve">For function-function verification: I am currently implementing the case where both functions return (create) a new function. In this case I want to then perform the same function-function verification on these two new returned functions. The problem is the </w:t>
-      </w:r>
-      <w:proofErr w:type="spellStart"/>
-      <w:r>
-        <w:t>hypofuzz</w:t>
-      </w:r>
-      <w:proofErr w:type="spellEnd"/>
-      <w:r>
-        <w:t xml:space="preserve"> does not exactly allow for a recursive implementation like this. </w:t>
+        <w:t xml:space="preserve">For function-function verification: I am currently implementing the case where both functions return (create) a new function. In this case I want to then perform the same function-function verification on these two new returned functions. The problem is the hypofuzz does not exactly allow for a recursive implementation like this. </w:t>
       </w:r>
     </w:p>
     <w:p>
@@ -1461,35 +854,7 @@
         <w:rPr>
           <w:iCs/>
         </w:rPr>
-        <w:t xml:space="preserve">Other than this issue, another issue is trying to reason with functions that take callable parameters. </w:t>
-      </w:r>
-      <w:proofErr w:type="gramStart"/>
-      <w:r>
-        <w:rPr>
-          <w:iCs/>
-        </w:rPr>
-        <w:t>Cant</w:t>
-      </w:r>
-      <w:proofErr w:type="gramEnd"/>
-      <w:r>
-        <w:rPr>
-          <w:iCs/>
-        </w:rPr>
-        <w:t xml:space="preserve"> exactly fuzz a function as an input so </w:t>
-      </w:r>
-      <w:proofErr w:type="spellStart"/>
-      <w:r>
-        <w:rPr>
-          <w:iCs/>
-        </w:rPr>
-        <w:t>im</w:t>
-      </w:r>
-      <w:proofErr w:type="spellEnd"/>
-      <w:r>
-        <w:rPr>
-          <w:iCs/>
-        </w:rPr>
-        <w:t xml:space="preserve"> not sure what to do here</w:t>
+        <w:t>Other than this issue, another issue is trying to reason with functions that take callable parameters. Cant exactly fuzz a function as an input so im not sure what to do here</w:t>
       </w:r>
       <w:r>
         <w:rPr>
@@ -1557,138 +922,46 @@
         <w:rPr>
           <w:iCs/>
         </w:rPr>
-        <w:t xml:space="preserve">Using universal strategy + dummy functions (the testing framework doesn’t know that the function </w:t>
-      </w:r>
-      <w:proofErr w:type="spellStart"/>
-      <w:r>
-        <w:rPr>
-          <w:iCs/>
-        </w:rPr>
-        <w:t>arg</w:t>
-      </w:r>
-      <w:proofErr w:type="spellEnd"/>
-      <w:r>
-        <w:rPr>
-          <w:iCs/>
-        </w:rPr>
-        <w:t xml:space="preserve"> is necessarily </w:t>
-      </w:r>
-      <w:proofErr w:type="gramStart"/>
-      <w:r>
-        <w:rPr>
-          <w:iCs/>
-        </w:rPr>
-        <w:t>callable</w:t>
-      </w:r>
-      <w:proofErr w:type="gramEnd"/>
-      <w:r>
-        <w:rPr>
-          <w:iCs/>
-        </w:rPr>
-        <w:t xml:space="preserve"> so it uses universal strategy) it takes 11 minutes to find the difference in </w:t>
-      </w:r>
-      <w:proofErr w:type="spellStart"/>
-      <w:r>
-        <w:rPr>
-          <w:iCs/>
-        </w:rPr>
-        <w:t>call_nested_param_ineq</w:t>
-      </w:r>
-      <w:proofErr w:type="spellEnd"/>
-      <w:r>
-        <w:rPr>
-          <w:iCs/>
-        </w:rPr>
-        <w:t xml:space="preserve">. Chances are, with type annotations this will be a bit faster as the tester will start passing in more callable </w:t>
-      </w:r>
-      <w:proofErr w:type="spellStart"/>
-      <w:r>
-        <w:rPr>
-          <w:iCs/>
-        </w:rPr>
-        <w:t>args</w:t>
-      </w:r>
-      <w:proofErr w:type="spellEnd"/>
-      <w:r>
-        <w:rPr>
-          <w:iCs/>
-        </w:rPr>
-        <w:t xml:space="preserve"> from the start</w:t>
-      </w:r>
-    </w:p>
-    <w:p>
-      <w:pPr>
-        <w:rPr>
-          <w:iCs/>
-        </w:rPr>
-      </w:pPr>
-      <w:r>
-        <w:rPr>
-          <w:iCs/>
-        </w:rPr>
-        <w:t xml:space="preserve">Adding a mechanism to see if an </w:t>
-      </w:r>
-      <w:proofErr w:type="spellStart"/>
-      <w:r>
-        <w:rPr>
-          <w:iCs/>
-        </w:rPr>
-        <w:t>arg</w:t>
-      </w:r>
-      <w:proofErr w:type="spellEnd"/>
-      <w:r>
-        <w:rPr>
-          <w:iCs/>
-        </w:rPr>
-        <w:t xml:space="preserve"> is “called” within a function should be </w:t>
-      </w:r>
-      <w:proofErr w:type="gramStart"/>
-      <w:r>
-        <w:rPr>
-          <w:iCs/>
-        </w:rPr>
-        <w:t>pretty easy</w:t>
-      </w:r>
-      <w:proofErr w:type="gramEnd"/>
-      <w:r>
-        <w:rPr>
-          <w:iCs/>
-        </w:rPr>
-        <w:t xml:space="preserve"> and should greatly improve time efficiency</w:t>
-      </w:r>
-    </w:p>
-    <w:p>
-      <w:pPr>
-        <w:rPr>
-          <w:iCs/>
-        </w:rPr>
-      </w:pPr>
-    </w:p>
-    <w:p>
-      <w:pPr>
-        <w:rPr>
-          <w:iCs/>
-        </w:rPr>
-      </w:pPr>
-      <w:r>
-        <w:rPr>
-          <w:iCs/>
-        </w:rPr>
-        <w:t xml:space="preserve">To be as faithful to the theory: we need to complicate/generalise </w:t>
-      </w:r>
-      <w:proofErr w:type="gramStart"/>
-      <w:r>
-        <w:rPr>
-          <w:iCs/>
-        </w:rPr>
-        <w:t>f(</w:t>
-      </w:r>
-      <w:proofErr w:type="gramEnd"/>
-      <w:r>
-        <w:rPr>
-          <w:iCs/>
-        </w:rPr>
-        <w:t>) so it can call any function it knows. Bound things, we don’t want more than 2 recursive calls, more than etc.</w:t>
+        <w:t>Using universal strategy + dummy functions (the testing framework doesn’t know that the function arg is necessarily callable so it uses universal strategy) it takes 11 minutes to find the difference in call_nested_param_ineq</w:t>
+      </w:r>
+      <w:r>
+        <w:rPr>
+          <w:iCs/>
+        </w:rPr>
+        <w:t>. Chances are, with type annotations this will be a bit faster as the tester will start passing in more callable args from the start</w:t>
+      </w:r>
+    </w:p>
+    <w:p>
+      <w:pPr>
+        <w:rPr>
+          <w:iCs/>
+        </w:rPr>
+      </w:pPr>
+      <w:r>
+        <w:rPr>
+          <w:iCs/>
+        </w:rPr>
+        <w:t>Adding a mechanism to see if an arg is “called” within a function should be pretty easy and should greatly improve time efficiency</w:t>
+      </w:r>
+    </w:p>
+    <w:p>
+      <w:pPr>
+        <w:rPr>
+          <w:iCs/>
+        </w:rPr>
+      </w:pPr>
+    </w:p>
+    <w:p>
+      <w:pPr>
+        <w:rPr>
+          <w:iCs/>
+        </w:rPr>
+      </w:pPr>
+      <w:r>
+        <w:rPr>
+          <w:iCs/>
+        </w:rPr>
+        <w:t>To be as faithful to the theory: we need to complicate/generalise f() so it can call any function it knows. Bound things, we don’t want more than 2 recursive calls, more than etc.</w:t>
       </w:r>
     </w:p>
     <w:p>
@@ -1759,48 +1032,20 @@
         <w:rPr>
           <w:iCs/>
         </w:rPr>
-        <w:t xml:space="preserve">If I have time, extend </w:t>
-      </w:r>
-      <w:proofErr w:type="gramStart"/>
-      <w:r>
-        <w:rPr>
-          <w:iCs/>
-        </w:rPr>
-        <w:t>f(</w:t>
-      </w:r>
-      <w:proofErr w:type="gramEnd"/>
-      <w:r>
-        <w:rPr>
-          <w:iCs/>
-        </w:rPr>
-        <w:t>) functions to take and return numbers</w:t>
-      </w:r>
-    </w:p>
-    <w:p>
-      <w:pPr>
-        <w:rPr>
-          <w:iCs/>
-        </w:rPr>
-      </w:pPr>
-      <w:r>
-        <w:rPr>
-          <w:iCs/>
-        </w:rPr>
-        <w:t xml:space="preserve">Then I can look at test suites, try it out in some application areas where equivalence is important, </w:t>
-      </w:r>
-      <w:proofErr w:type="gramStart"/>
-      <w:r>
-        <w:rPr>
-          <w:iCs/>
-        </w:rPr>
-        <w:t>property based</w:t>
-      </w:r>
-      <w:proofErr w:type="gramEnd"/>
-      <w:r>
-        <w:rPr>
-          <w:iCs/>
-        </w:rPr>
-        <w:t xml:space="preserve"> testing test suite and run with my pipeline.</w:t>
+        <w:t>If I have time, extend f() functions to take and return numbers</w:t>
+      </w:r>
+    </w:p>
+    <w:p>
+      <w:pPr>
+        <w:rPr>
+          <w:iCs/>
+        </w:rPr>
+      </w:pPr>
+      <w:r>
+        <w:rPr>
+          <w:iCs/>
+        </w:rPr>
+        <w:t>Then I can look at test suites, try it out in some application areas where equivalence is important, property based testing test suite and run with my pipeline.</w:t>
       </w:r>
     </w:p>
     <w:p>
@@ -1855,79 +1100,33 @@
           <w:bCs/>
           <w:iCs/>
         </w:rPr>
-        <w:t xml:space="preserve">Pass a </w:t>
-      </w:r>
-      <w:proofErr w:type="spellStart"/>
-      <w:r>
+        <w:t>Pass a datastruct library thru a mutation testing suite to see how it performs against my pipeline, try to find examples my pipeline can find that the existing suite cant</w:t>
+      </w:r>
+    </w:p>
+    <w:p>
+      <w:pPr>
         <w:rPr>
           <w:b/>
           <w:bCs/>
           <w:iCs/>
         </w:rPr>
-        <w:t>datastruct</w:t>
-      </w:r>
-      <w:proofErr w:type="spellEnd"/>
+      </w:pPr>
       <w:r>
         <w:rPr>
           <w:b/>
           <w:bCs/>
           <w:iCs/>
         </w:rPr>
-        <w:t xml:space="preserve"> library thru a mutation testing suite to see how it performs against my pipeline, try to find examples my pipeline can find that the existing suite </w:t>
-      </w:r>
-      <w:proofErr w:type="gramStart"/>
-      <w:r>
+        <w:t>Look at open source library with tests at the end</w:t>
+      </w:r>
+    </w:p>
+    <w:p>
+      <w:pPr>
         <w:rPr>
           <w:b/>
           <w:bCs/>
           <w:iCs/>
         </w:rPr>
-        <w:t>cant</w:t>
-      </w:r>
-      <w:proofErr w:type="gramEnd"/>
-    </w:p>
-    <w:p>
-      <w:pPr>
-        <w:rPr>
-          <w:b/>
-          <w:bCs/>
-          <w:iCs/>
-        </w:rPr>
-      </w:pPr>
-      <w:r>
-        <w:rPr>
-          <w:b/>
-          <w:bCs/>
-          <w:iCs/>
-        </w:rPr>
-        <w:t xml:space="preserve">Look at </w:t>
-      </w:r>
-      <w:proofErr w:type="gramStart"/>
-      <w:r>
-        <w:rPr>
-          <w:b/>
-          <w:bCs/>
-          <w:iCs/>
-        </w:rPr>
-        <w:t>open source</w:t>
-      </w:r>
-      <w:proofErr w:type="gramEnd"/>
-      <w:r>
-        <w:rPr>
-          <w:b/>
-          <w:bCs/>
-          <w:iCs/>
-        </w:rPr>
-        <w:t xml:space="preserve"> library with tests at the end</w:t>
-      </w:r>
-    </w:p>
-    <w:p>
-      <w:pPr>
-        <w:rPr>
-          <w:b/>
-          <w:bCs/>
-          <w:iCs/>
-        </w:rPr>
       </w:pPr>
     </w:p>
     <w:p>
@@ -1946,21 +1145,7 @@
         <w:rPr>
           <w:iCs/>
         </w:rPr>
-        <w:t xml:space="preserve"> </w:t>
-      </w:r>
-      <w:proofErr w:type="spellStart"/>
-      <w:r>
-        <w:rPr>
-          <w:iCs/>
-        </w:rPr>
-        <w:t>are_equivalent</w:t>
-      </w:r>
-      <w:proofErr w:type="spellEnd"/>
-      <w:r>
-        <w:rPr>
-          <w:iCs/>
-        </w:rPr>
-        <w:t xml:space="preserve"> for profiler to check that the arguments to any function called by the top level</w:t>
+        <w:t xml:space="preserve"> are_equivalent for profiler to check that the arguments to any function called by the top level</w:t>
       </w:r>
       <w:r>
         <w:rPr>
@@ -1999,21 +1184,7 @@
         <w:rPr>
           <w:iCs/>
         </w:rPr>
-        <w:t xml:space="preserve">One idea: perform static analysis on the function we are fuzzing before we fuzz it to see if it takes a function f as a param, if that function f itself takes a param. </w:t>
-      </w:r>
-      <w:proofErr w:type="gramStart"/>
-      <w:r>
-        <w:rPr>
-          <w:iCs/>
-        </w:rPr>
-        <w:t>Thus</w:t>
-      </w:r>
-      <w:proofErr w:type="gramEnd"/>
-      <w:r>
-        <w:rPr>
-          <w:iCs/>
-        </w:rPr>
-        <w:t xml:space="preserve"> we can narrow down which function fuzzing strategy to employ</w:t>
+        <w:t>One idea: perform static analysis on the function we are fuzzing before we fuzz it to see if it takes a function f as a param, if that function f itself takes a param. Thus we can narrow down which function fuzzing strategy to employ</w:t>
       </w:r>
     </w:p>
     <w:p>
@@ -2049,21 +1220,7 @@
         <w:rPr>
           <w:iCs/>
         </w:rPr>
-        <w:t xml:space="preserve">Functions f that </w:t>
-      </w:r>
-      <w:proofErr w:type="gramStart"/>
-      <w:r>
-        <w:rPr>
-          <w:iCs/>
-        </w:rPr>
-        <w:t>take</w:t>
-      </w:r>
-      <w:proofErr w:type="gramEnd"/>
-      <w:r>
-        <w:rPr>
-          <w:iCs/>
-        </w:rPr>
-        <w:t xml:space="preserve"> a single function as a param like f(h): we can check the sig of the function h given, and fuzz some input accordingly to call h with within f.</w:t>
+        <w:t>Functions f that take a single function as a param like f(h): we can check the sig of the function h given, and fuzz some input accordingly to call h with within f.</w:t>
       </w:r>
     </w:p>
     <w:p>
@@ -2109,86 +1266,22 @@
         <w:rPr>
           <w:iCs/>
         </w:rPr>
-        <w:t xml:space="preserve">If (state of </w:t>
-      </w:r>
-      <w:proofErr w:type="spellStart"/>
-      <w:r>
-        <w:rPr>
-          <w:iCs/>
-        </w:rPr>
-        <w:t>module_a</w:t>
-      </w:r>
-      <w:proofErr w:type="spellEnd"/>
-      <w:r>
-        <w:rPr>
-          <w:iCs/>
-        </w:rPr>
-        <w:t xml:space="preserve"> before running == state of </w:t>
-      </w:r>
-      <w:proofErr w:type="spellStart"/>
-      <w:r>
-        <w:rPr>
-          <w:iCs/>
-        </w:rPr>
-        <w:t>module_a</w:t>
-      </w:r>
-      <w:proofErr w:type="spellEnd"/>
-      <w:r>
-        <w:rPr>
-          <w:iCs/>
-        </w:rPr>
-        <w:t xml:space="preserve"> after n steps) !=</w:t>
+        <w:t>If (state of module_a before running == state of module_a after n steps) !=</w:t>
       </w:r>
       <w:r>
         <w:rPr>
           <w:iCs/>
         </w:rPr>
         <w:br/>
-        <w:t xml:space="preserve">   (state of </w:t>
-      </w:r>
-      <w:proofErr w:type="spellStart"/>
-      <w:r>
-        <w:rPr>
-          <w:iCs/>
-        </w:rPr>
-        <w:t>module_b</w:t>
-      </w:r>
-      <w:proofErr w:type="spellEnd"/>
-      <w:r>
-        <w:rPr>
-          <w:iCs/>
-        </w:rPr>
-        <w:t xml:space="preserve"> before running == state of </w:t>
-      </w:r>
-      <w:proofErr w:type="spellStart"/>
-      <w:r>
-        <w:rPr>
-          <w:iCs/>
-        </w:rPr>
-        <w:t>module_b</w:t>
-      </w:r>
-      <w:proofErr w:type="spellEnd"/>
-      <w:r>
-        <w:rPr>
-          <w:iCs/>
-        </w:rPr>
-        <w:t xml:space="preserve"> after n steps):</w:t>
+        <w:t xml:space="preserve">   (state of module_b before running == state of module_b after n steps):</w:t>
       </w:r>
       <w:r>
         <w:rPr>
           <w:iCs/>
         </w:rPr>
         <w:br/>
-        <w:t xml:space="preserve">   they are </w:t>
-      </w:r>
-      <w:proofErr w:type="spellStart"/>
-      <w:r>
-        <w:rPr>
-          <w:iCs/>
-        </w:rPr>
-        <w:t>inequiv</w:t>
-      </w:r>
-      <w:proofErr w:type="spellEnd"/>
+        <w:t xml:space="preserve">   they are inequiv</w:t>
+      </w:r>
       <w:r>
         <w:rPr>
           <w:iCs/>
@@ -2201,21 +1294,7 @@
           <w:iCs/>
         </w:rPr>
         <w:br/>
-        <w:t xml:space="preserve">Some examples in plain </w:t>
-      </w:r>
-      <w:proofErr w:type="spellStart"/>
-      <w:r>
-        <w:rPr>
-          <w:iCs/>
-        </w:rPr>
-        <w:t>english</w:t>
-      </w:r>
-      <w:proofErr w:type="spellEnd"/>
-      <w:r>
-        <w:rPr>
-          <w:iCs/>
-        </w:rPr>
-        <w:t xml:space="preserve"> for my own sanity: </w:t>
+        <w:t xml:space="preserve">Some examples in plain english for my own sanity: </w:t>
       </w:r>
       <w:r>
         <w:rPr>
@@ -2228,30 +1307,8 @@
           <w:iCs/>
         </w:rPr>
         <w:br/>
-        <w:t xml:space="preserve">if </w:t>
-      </w:r>
-      <w:proofErr w:type="spellStart"/>
-      <w:r>
-        <w:rPr>
-          <w:iCs/>
-        </w:rPr>
-        <w:t>module_a</w:t>
-      </w:r>
-      <w:proofErr w:type="spellEnd"/>
-      <w:r>
-        <w:rPr>
-          <w:iCs/>
-        </w:rPr>
-        <w:t xml:space="preserve"> alters a global variable x after running n steps, but </w:t>
-      </w:r>
-      <w:proofErr w:type="spellStart"/>
-      <w:r>
-        <w:rPr>
-          <w:iCs/>
-        </w:rPr>
-        <w:t>module_b</w:t>
-      </w:r>
-      <w:proofErr w:type="spellEnd"/>
+        <w:t>if module_a alters a global variable x after running n steps, but module_b</w:t>
+      </w:r>
       <w:r>
         <w:rPr>
           <w:iCs/>
@@ -2283,35 +1340,7 @@
           <w:iCs/>
         </w:rPr>
         <w:br/>
-        <w:t xml:space="preserve">if </w:t>
-      </w:r>
-      <w:proofErr w:type="spellStart"/>
-      <w:r>
-        <w:rPr>
-          <w:iCs/>
-        </w:rPr>
-        <w:t>module_a</w:t>
-      </w:r>
-      <w:proofErr w:type="spellEnd"/>
-      <w:r>
-        <w:rPr>
-          <w:iCs/>
-        </w:rPr>
-        <w:t xml:space="preserve"> contains the definition of a global variable x, but it does not change, and </w:t>
-      </w:r>
-      <w:proofErr w:type="spellStart"/>
-      <w:r>
-        <w:rPr>
-          <w:iCs/>
-        </w:rPr>
-        <w:t>module_b</w:t>
-      </w:r>
-      <w:proofErr w:type="spellEnd"/>
-      <w:r>
-        <w:rPr>
-          <w:iCs/>
-        </w:rPr>
-        <w:t xml:space="preserve"> does not</w:t>
+        <w:t>if module_a contains the definition of a global variable x, but it does not change, and module_b does not</w:t>
       </w:r>
       <w:r>
         <w:rPr>
@@ -2338,35 +1367,7 @@
           <w:iCs/>
         </w:rPr>
         <w:br/>
-        <w:t xml:space="preserve">if </w:t>
-      </w:r>
-      <w:proofErr w:type="spellStart"/>
-      <w:r>
-        <w:rPr>
-          <w:iCs/>
-        </w:rPr>
-        <w:t>module_a</w:t>
-      </w:r>
-      <w:proofErr w:type="spellEnd"/>
-      <w:r>
-        <w:rPr>
-          <w:iCs/>
-        </w:rPr>
-        <w:t xml:space="preserve"> alters a global string variable s after running n steps, but </w:t>
-      </w:r>
-      <w:proofErr w:type="spellStart"/>
-      <w:r>
-        <w:rPr>
-          <w:iCs/>
-        </w:rPr>
-        <w:t>module_b</w:t>
-      </w:r>
-      <w:proofErr w:type="spellEnd"/>
-      <w:r>
-        <w:rPr>
-          <w:iCs/>
-        </w:rPr>
-        <w:t xml:space="preserve"> alters a global int</w:t>
+        <w:t>if module_a alters a global string variable s after running n steps, but module_b alters a global int</w:t>
       </w:r>
       <w:r>
         <w:rPr>
@@ -2502,957 +1503,779 @@
           <w:bCs/>
           <w:iCs/>
         </w:rPr>
-        <w:t xml:space="preserve">Running </w:t>
-      </w:r>
-      <w:proofErr w:type="spellStart"/>
-      <w:r>
+        <w:t xml:space="preserve">Running mutmut on requests: </w:t>
+      </w:r>
+    </w:p>
+    <w:p>
+      <w:pPr>
+        <w:rPr>
+          <w:iCs/>
+        </w:rPr>
+      </w:pPr>
+      <w:r>
+        <w:rPr>
+          <w:iCs/>
+        </w:rPr>
+        <w:t>Running mutation testing</w:t>
+      </w:r>
+    </w:p>
+    <w:p>
+      <w:pPr>
+        <w:rPr>
+          <w:iCs/>
+        </w:rPr>
+      </w:pPr>
+      <w:r>
+        <w:rPr>
+          <w:rFonts w:ascii="Segoe UI Symbol" w:hAnsi="Segoe UI Symbol" w:cs="Segoe UI Symbol"/>
+          <w:iCs/>
+        </w:rPr>
+        <w:t>⠧</w:t>
+      </w:r>
+      <w:r>
+        <w:rPr>
+          <w:iCs/>
+        </w:rPr>
+        <w:t xml:space="preserve"> 3673/3673  </w:t>
+      </w:r>
+      <w:r>
+        <w:rPr>
+          <w:rFonts w:ascii="Segoe UI Emoji" w:hAnsi="Segoe UI Emoji" w:cs="Segoe UI Emoji"/>
+          <w:iCs/>
+        </w:rPr>
+        <w:t>🎉</w:t>
+      </w:r>
+      <w:r>
+        <w:rPr>
+          <w:iCs/>
+        </w:rPr>
+        <w:t xml:space="preserve"> 2241 </w:t>
+      </w:r>
+      <w:r>
+        <w:rPr>
+          <w:rFonts w:ascii="Aptos" w:hAnsi="Aptos" w:cs="Aptos"/>
+          <w:iCs/>
+        </w:rPr>
+        <w:t>🫥</w:t>
+      </w:r>
+      <w:r>
+        <w:rPr>
+          <w:iCs/>
+        </w:rPr>
+        <w:t xml:space="preserve"> 337  </w:t>
+      </w:r>
+      <w:r>
+        <w:rPr>
+          <w:rFonts w:ascii="Segoe UI Emoji" w:hAnsi="Segoe UI Emoji" w:cs="Segoe UI Emoji"/>
+          <w:iCs/>
+        </w:rPr>
+        <w:t>⏰</w:t>
+      </w:r>
+      <w:r>
+        <w:rPr>
+          <w:iCs/>
+        </w:rPr>
+        <w:t xml:space="preserve"> 453  </w:t>
+      </w:r>
+      <w:r>
+        <w:rPr>
+          <w:rFonts w:ascii="Segoe UI Emoji" w:hAnsi="Segoe UI Emoji" w:cs="Segoe UI Emoji"/>
+          <w:iCs/>
+        </w:rPr>
+        <w:t>🤔</w:t>
+      </w:r>
+      <w:r>
+        <w:rPr>
+          <w:iCs/>
+        </w:rPr>
+        <w:t xml:space="preserve"> 0  </w:t>
+      </w:r>
+      <w:r>
+        <w:rPr>
+          <w:rFonts w:ascii="Segoe UI Emoji" w:hAnsi="Segoe UI Emoji" w:cs="Segoe UI Emoji"/>
+          <w:iCs/>
+        </w:rPr>
+        <w:t>🙁</w:t>
+      </w:r>
+      <w:r>
+        <w:rPr>
+          <w:iCs/>
+        </w:rPr>
+        <w:t xml:space="preserve"> 642  </w:t>
+      </w:r>
+      <w:r>
+        <w:rPr>
+          <w:rFonts w:ascii="Segoe UI Emoji" w:hAnsi="Segoe UI Emoji" w:cs="Segoe UI Emoji"/>
+          <w:iCs/>
+        </w:rPr>
+        <w:t>🔇</w:t>
+      </w:r>
+      <w:r>
+        <w:rPr>
+          <w:iCs/>
+        </w:rPr>
+        <w:t xml:space="preserve"> 0</w:t>
+      </w:r>
+    </w:p>
+    <w:p>
+      <w:pPr>
+        <w:rPr>
+          <w:iCs/>
+        </w:rPr>
+      </w:pPr>
+      <w:r>
+        <w:rPr>
+          <w:iCs/>
+        </w:rPr>
+        <w:t>Mutants identified: 347/1449</w:t>
+      </w:r>
+      <w:r>
+        <w:rPr>
+          <w:iCs/>
+        </w:rPr>
+        <w:t xml:space="preserve"> – not sure why not all mutants were hit</w:t>
+      </w:r>
+    </w:p>
+    <w:p>
+      <w:pPr>
+        <w:rPr>
+          <w:iCs/>
+        </w:rPr>
+      </w:pPr>
+      <w:r>
+        <w:rPr>
+          <w:iCs/>
+        </w:rPr>
+        <w:t>Completed in 13372.785392045975 seconds.</w:t>
+      </w:r>
+      <w:r>
+        <w:rPr>
+          <w:iCs/>
+        </w:rPr>
+        <w:t xml:space="preserve"> (3.7 hrs)</w:t>
+      </w:r>
+    </w:p>
+    <w:p>
+      <w:pPr>
+        <w:rPr>
+          <w:iCs/>
+        </w:rPr>
+      </w:pPr>
+    </w:p>
+    <w:p>
+      <w:pPr>
+        <w:rPr>
+          <w:iCs/>
+        </w:rPr>
+      </w:pPr>
+      <w:r>
+        <w:rPr>
+          <w:iCs/>
+        </w:rPr>
+        <w:t>After adding class based stuff</w:t>
+      </w:r>
+    </w:p>
+    <w:p>
+      <w:pPr>
+        <w:rPr>
+          <w:iCs/>
+        </w:rPr>
+      </w:pPr>
+      <w:r>
+        <w:rPr>
+          <w:iCs/>
+        </w:rPr>
+        <w:t>Mutants identified: 917/4467</w:t>
+      </w:r>
+      <w:r>
+        <w:rPr>
+          <w:iCs/>
+        </w:rPr>
+        <w:t xml:space="preserve"> in 6.8 hrs (but I suspect this may be over eager)</w:t>
+      </w:r>
+    </w:p>
+    <w:p>
+      <w:pPr>
+        <w:rPr>
+          <w:iCs/>
+        </w:rPr>
+      </w:pPr>
+      <w:r>
+        <w:rPr>
+          <w:iCs/>
+        </w:rPr>
+        <w:t>537/4467</w:t>
+      </w:r>
+      <w:r>
+        <w:rPr>
+          <w:iCs/>
+        </w:rPr>
+        <w:t xml:space="preserve"> after fixing it in 7.4 hrs</w:t>
+      </w:r>
+    </w:p>
+    <w:p>
+      <w:pPr>
+        <w:rPr>
+          <w:iCs/>
+        </w:rPr>
+      </w:pPr>
+    </w:p>
+    <w:p>
+      <w:pPr>
+        <w:rPr>
+          <w:iCs/>
+        </w:rPr>
+      </w:pPr>
+      <w:r>
+        <w:rPr>
+          <w:iCs/>
+        </w:rPr>
+        <w:t>Ran it on a library of data structures:</w:t>
+      </w:r>
+    </w:p>
+    <w:p>
+      <w:pPr>
+        <w:rPr>
+          <w:iCs/>
+        </w:rPr>
+      </w:pPr>
+      <w:r>
+        <w:rPr>
+          <w:iCs/>
+        </w:rPr>
+        <w:t>https://github.com/clair3st/Data-Structures/tree/master</w:t>
+      </w:r>
+    </w:p>
+    <w:p>
+      <w:pPr>
+        <w:rPr>
+          <w:iCs/>
+        </w:rPr>
+      </w:pPr>
+      <w:r>
+        <w:rPr>
+          <w:rFonts w:ascii="Segoe UI Symbol" w:hAnsi="Segoe UI Symbol" w:cs="Segoe UI Symbol"/>
+          <w:iCs/>
+        </w:rPr>
+        <w:t>⠸</w:t>
+      </w:r>
+      <w:r>
+        <w:rPr>
+          <w:iCs/>
+        </w:rPr>
+        <w:t xml:space="preserve"> 445/445  </w:t>
+      </w:r>
+      <w:r>
+        <w:rPr>
+          <w:rFonts w:ascii="Segoe UI Emoji" w:hAnsi="Segoe UI Emoji" w:cs="Segoe UI Emoji"/>
+          <w:iCs/>
+        </w:rPr>
+        <w:t>🎉</w:t>
+      </w:r>
+      <w:r>
+        <w:rPr>
+          <w:iCs/>
+        </w:rPr>
+        <w:t xml:space="preserve"> 383 </w:t>
+      </w:r>
+      <w:r>
+        <w:rPr>
+          <w:rFonts w:ascii="Aptos" w:hAnsi="Aptos" w:cs="Aptos"/>
+          <w:iCs/>
+        </w:rPr>
+        <w:t>🫥</w:t>
+      </w:r>
+      <w:r>
+        <w:rPr>
+          <w:iCs/>
+        </w:rPr>
+        <w:t xml:space="preserve"> 4  </w:t>
+      </w:r>
+      <w:r>
+        <w:rPr>
+          <w:rFonts w:ascii="Segoe UI Emoji" w:hAnsi="Segoe UI Emoji" w:cs="Segoe UI Emoji"/>
+          <w:iCs/>
+        </w:rPr>
+        <w:t>⏰</w:t>
+      </w:r>
+      <w:r>
+        <w:rPr>
+          <w:iCs/>
+        </w:rPr>
+        <w:t xml:space="preserve"> 10  </w:t>
+      </w:r>
+      <w:r>
+        <w:rPr>
+          <w:rFonts w:ascii="Segoe UI Emoji" w:hAnsi="Segoe UI Emoji" w:cs="Segoe UI Emoji"/>
+          <w:iCs/>
+        </w:rPr>
+        <w:t>🤔</w:t>
+      </w:r>
+      <w:r>
+        <w:rPr>
+          <w:iCs/>
+        </w:rPr>
+        <w:t xml:space="preserve"> 0  </w:t>
+      </w:r>
+      <w:r>
+        <w:rPr>
+          <w:rFonts w:ascii="Segoe UI Emoji" w:hAnsi="Segoe UI Emoji" w:cs="Segoe UI Emoji"/>
+          <w:iCs/>
+        </w:rPr>
+        <w:t>🙁</w:t>
+      </w:r>
+      <w:r>
+        <w:rPr>
+          <w:iCs/>
+        </w:rPr>
+        <w:t xml:space="preserve"> 48  </w:t>
+      </w:r>
+      <w:r>
+        <w:rPr>
+          <w:rFonts w:ascii="Segoe UI Emoji" w:hAnsi="Segoe UI Emoji" w:cs="Segoe UI Emoji"/>
+          <w:iCs/>
+        </w:rPr>
+        <w:t>🔇</w:t>
+      </w:r>
+      <w:r>
+        <w:rPr>
+          <w:iCs/>
+        </w:rPr>
+        <w:t xml:space="preserve"> 0</w:t>
+      </w:r>
+    </w:p>
+    <w:p>
+      <w:pPr>
+        <w:rPr>
+          <w:iCs/>
+        </w:rPr>
+      </w:pPr>
+      <w:r>
+        <w:rPr>
+          <w:iCs/>
+        </w:rPr>
+        <w:t>11</w:t>
+      </w:r>
+      <w:r>
+        <w:rPr>
+          <w:iCs/>
+        </w:rPr>
+        <w:t>8/445</w:t>
+      </w:r>
+    </w:p>
+    <w:p>
+      <w:pPr>
+        <w:rPr>
+          <w:iCs/>
+        </w:rPr>
+      </w:pPr>
+      <w:r>
+        <w:rPr>
+          <w:iCs/>
+        </w:rPr>
+        <w:t>270/445 after adding more class based stuff</w:t>
+      </w:r>
+    </w:p>
+    <w:p>
+      <w:pPr>
+        <w:rPr>
+          <w:iCs/>
+        </w:rPr>
+      </w:pPr>
+      <w:r>
+        <w:rPr>
+          <w:iCs/>
+        </w:rPr>
+        <w:t>353/445 after 2.5 hrs with basic dummy object</w:t>
+      </w:r>
+    </w:p>
+    <w:p>
+      <w:pPr>
+        <w:rPr>
+          <w:iCs/>
+        </w:rPr>
+      </w:pPr>
+      <w:r>
+        <w:rPr>
+          <w:iCs/>
+        </w:rPr>
+        <w:t>367/445 best so far</w:t>
+      </w:r>
+    </w:p>
+    <w:p>
+      <w:pPr>
+        <w:rPr>
+          <w:iCs/>
+        </w:rPr>
+      </w:pPr>
+    </w:p>
+    <w:p>
+      <w:pPr>
+        <w:rPr>
+          <w:iCs/>
+        </w:rPr>
+      </w:pPr>
+    </w:p>
+    <w:p>
+      <w:pPr>
+        <w:rPr>
+          <w:iCs/>
+        </w:rPr>
+      </w:pPr>
+      <w:r>
+        <w:rPr>
+          <w:iCs/>
+        </w:rPr>
+        <w:t>With the following addition to pyproject.toml</w:t>
+      </w:r>
+    </w:p>
+    <w:p>
+      <w:pPr>
+        <w:rPr>
+          <w:iCs/>
+        </w:rPr>
+      </w:pPr>
+      <w:r>
+        <w:rPr>
+          <w:iCs/>
+        </w:rPr>
+        <w:t>[tool.mutmut]</w:t>
+      </w:r>
+      <w:r>
+        <w:rPr>
+          <w:iCs/>
+        </w:rPr>
+        <w:br/>
+        <w:t>pytest_add_cli_args = ["-k", "not test_env_cert_bundles and not test_different_connection_pool_for_tls_settings_verify_bundle_unexpired_cert"]</w:t>
+      </w:r>
+    </w:p>
+    <w:p>
+      <w:pPr>
+        <w:rPr>
+          <w:iCs/>
+        </w:rPr>
+      </w:pPr>
+    </w:p>
+    <w:p>
+      <w:pPr>
+        <w:rPr>
+          <w:iCs/>
+        </w:rPr>
+      </w:pPr>
+      <w:r>
+        <w:rPr>
+          <w:iCs/>
+        </w:rPr>
+        <w:t>Additions:</w:t>
+      </w:r>
+    </w:p>
+    <w:p>
+      <w:pPr>
+        <w:rPr>
+          <w:iCs/>
+        </w:rPr>
+      </w:pPr>
+      <w:r>
+        <w:rPr>
+          <w:iCs/>
+        </w:rPr>
+        <w:t>Tested more hobbit suite</w:t>
+      </w:r>
+    </w:p>
+    <w:p>
+      <w:pPr>
+        <w:rPr>
+          <w:iCs/>
+        </w:rPr>
+      </w:pPr>
+      <w:r>
+        <w:rPr>
+          <w:iCs/>
+        </w:rPr>
+        <w:t>Wrote program equivalence</w:t>
+      </w:r>
+    </w:p>
+    <w:p>
+      <w:pPr>
+        <w:rPr>
+          <w:iCs/>
+        </w:rPr>
+      </w:pPr>
+      <w:r>
+        <w:rPr>
+          <w:iCs/>
+        </w:rPr>
+        <w:t>Wrote script to run entire hobbit suite</w:t>
+      </w:r>
+    </w:p>
+    <w:p>
+      <w:pPr>
+        <w:rPr>
+          <w:iCs/>
+        </w:rPr>
+      </w:pPr>
+      <w:r>
+        <w:rPr>
+          <w:iCs/>
+        </w:rPr>
+        <w:t>Functions can alter  global state</w:t>
+      </w:r>
+    </w:p>
+    <w:p>
+      <w:pPr>
+        <w:rPr>
+          <w:iCs/>
+        </w:rPr>
+      </w:pPr>
+      <w:r>
+        <w:rPr>
+          <w:iCs/>
+        </w:rPr>
+        <w:t>Mutation testing stuff</w:t>
+      </w:r>
+    </w:p>
+    <w:p>
+      <w:pPr>
+        <w:rPr>
+          <w:iCs/>
+        </w:rPr>
+      </w:pPr>
+    </w:p>
+    <w:p>
+      <w:pPr>
+        <w:rPr>
+          <w:iCs/>
+        </w:rPr>
+      </w:pPr>
+      <w:r>
+        <w:rPr>
+          <w:iCs/>
+        </w:rPr>
+        <w:t>Questions:</w:t>
+      </w:r>
+    </w:p>
+    <w:p>
+      <w:pPr>
+        <w:rPr>
+          <w:iCs/>
+        </w:rPr>
+      </w:pPr>
+      <w:r>
+        <w:rPr>
+          <w:iCs/>
+        </w:rPr>
+        <w:t>What do I say about translating hobbit to python in the thesis? That I used gpt?</w:t>
+      </w:r>
+    </w:p>
+    <w:p>
+      <w:pPr>
+        <w:rPr>
+          <w:iCs/>
+        </w:rPr>
+      </w:pPr>
+      <w:r>
+        <w:rPr>
+          <w:iCs/>
+        </w:rPr>
+        <w:t>Yes. Include sample prompts with responses</w:t>
+      </w:r>
+    </w:p>
+    <w:p>
+      <w:pPr>
+        <w:rPr>
+          <w:iCs/>
+        </w:rPr>
+      </w:pPr>
+      <w:r>
+        <w:rPr>
+          <w:iCs/>
+        </w:rPr>
+        <w:t>How do I treat two programs where 1 has global state and the other doesnt</w:t>
+      </w:r>
+    </w:p>
+    <w:p>
+      <w:pPr>
+        <w:rPr>
+          <w:iCs/>
+        </w:rPr>
+      </w:pPr>
+    </w:p>
+    <w:p>
+      <w:pPr>
+        <w:rPr>
+          <w:iCs/>
+        </w:rPr>
+      </w:pPr>
+      <w:r>
+        <w:rPr>
+          <w:iCs/>
+        </w:rPr>
+        <w:t>The trace is from the perspective of the observer</w:t>
+      </w:r>
+    </w:p>
+    <w:p>
+      <w:pPr>
+        <w:rPr>
+          <w:iCs/>
+        </w:rPr>
+      </w:pPr>
+      <w:r>
+        <w:rPr>
+          <w:iCs/>
+        </w:rPr>
+        <w:t>We cant see internal recursion</w:t>
+      </w:r>
+    </w:p>
+    <w:p>
+      <w:pPr>
+        <w:rPr>
+          <w:iCs/>
+        </w:rPr>
+      </w:pPr>
+      <w:r>
+        <w:rPr>
+          <w:iCs/>
+        </w:rPr>
+        <w:t>If function returns function, observer can call that function maybe</w:t>
+      </w:r>
+    </w:p>
+    <w:p>
+      <w:pPr>
+        <w:rPr>
+          <w:iCs/>
+        </w:rPr>
+      </w:pPr>
+      <w:r>
+        <w:rPr>
+          <w:iCs/>
+        </w:rPr>
+        <w:t xml:space="preserve">Reentrancy. </w:t>
+      </w:r>
+    </w:p>
+    <w:p>
+      <w:pPr>
+        <w:rPr>
+          <w:iCs/>
+        </w:rPr>
+      </w:pPr>
+      <w:r>
+        <w:rPr>
+          <w:iCs/>
+        </w:rPr>
+        <w:t>Function can make a choice between all funcs it knows</w:t>
+      </w:r>
+    </w:p>
+    <w:p>
+      <w:pPr>
+        <w:rPr>
+          <w:iCs/>
+        </w:rPr>
+      </w:pPr>
+      <w:r>
+        <w:rPr>
+          <w:iCs/>
+        </w:rPr>
+        <w:t>Maybe make observers store return values received in sequence</w:t>
+      </w:r>
+    </w:p>
+    <w:p>
+      <w:pPr>
+        <w:rPr>
+          <w:iCs/>
+        </w:rPr>
+      </w:pPr>
+      <w:r>
+        <w:rPr>
+          <w:iCs/>
+        </w:rPr>
+        <w:t>F can write a stream to a file</w:t>
+      </w:r>
+    </w:p>
+    <w:p>
+      <w:pPr>
+        <w:rPr>
+          <w:iCs/>
+        </w:rPr>
+      </w:pPr>
+      <w:r>
+        <w:rPr>
+          <w:iCs/>
+        </w:rPr>
+        <w:t>Have to retranslate hobbit suite</w:t>
+      </w:r>
+    </w:p>
+    <w:p>
+      <w:pPr>
+        <w:rPr>
+          <w:iCs/>
+        </w:rPr>
+      </w:pPr>
+      <w:r>
+        <w:rPr>
+          <w:iCs/>
+        </w:rPr>
+        <w:t xml:space="preserve">Currently, catch </w:t>
+      </w:r>
+      <w:r>
+        <w:rPr>
+          <w:iCs/>
+        </w:rPr>
+        <w:t>41-47</w:t>
+      </w:r>
+      <w:r>
+        <w:rPr>
+          <w:iCs/>
+        </w:rPr>
+        <w:t>/79 from hobbit suite</w:t>
+      </w:r>
+      <w:r>
+        <w:rPr>
+          <w:iCs/>
+        </w:rPr>
+        <w:t xml:space="preserve"> in 14-17 mins</w:t>
+      </w:r>
+    </w:p>
+    <w:p>
+      <w:pPr>
+        <w:rPr>
+          <w:iCs/>
+        </w:rPr>
+      </w:pPr>
+      <w:r>
+        <w:rPr>
+          <w:iCs/>
+        </w:rPr>
+        <w:t>Need to check if input arguments get mutated</w:t>
+      </w:r>
+    </w:p>
+    <w:p>
+      <w:pPr>
+        <w:rPr>
+          <w:iCs/>
+        </w:rPr>
+      </w:pPr>
+      <w:r>
+        <w:rPr>
+          <w:iCs/>
+        </w:rPr>
+        <w:t>There is a demo</w:t>
+      </w:r>
+    </w:p>
+    <w:p>
+      <w:pPr>
         <w:rPr>
           <w:b/>
           <w:bCs/>
           <w:iCs/>
         </w:rPr>
-        <w:t>mutmut</w:t>
-      </w:r>
-      <w:proofErr w:type="spellEnd"/>
+      </w:pPr>
       <w:r>
         <w:rPr>
           <w:b/>
           <w:bCs/>
           <w:iCs/>
         </w:rPr>
-        <w:t xml:space="preserve"> on requests: </w:t>
-      </w:r>
-    </w:p>
-    <w:p>
-      <w:pPr>
-        <w:rPr>
-          <w:iCs/>
-        </w:rPr>
-      </w:pPr>
-      <w:r>
-        <w:rPr>
-          <w:iCs/>
-        </w:rPr>
-        <w:t>Running mutation testing</w:t>
-      </w:r>
-    </w:p>
-    <w:p>
-      <w:pPr>
-        <w:rPr>
-          <w:iCs/>
-        </w:rPr>
-      </w:pPr>
-      <w:r>
-        <w:rPr>
-          <w:rFonts w:ascii="Segoe UI Symbol" w:hAnsi="Segoe UI Symbol" w:cs="Segoe UI Symbol"/>
-          <w:iCs/>
-        </w:rPr>
-        <w:t>⠧</w:t>
-      </w:r>
-      <w:r>
-        <w:rPr>
-          <w:iCs/>
-        </w:rPr>
-        <w:t xml:space="preserve"> 3673/</w:t>
-      </w:r>
-      <w:proofErr w:type="gramStart"/>
-      <w:r>
-        <w:rPr>
-          <w:iCs/>
-        </w:rPr>
-        <w:t xml:space="preserve">3673  </w:t>
-      </w:r>
-      <w:r>
-        <w:rPr>
-          <w:rFonts w:ascii="Segoe UI Emoji" w:hAnsi="Segoe UI Emoji" w:cs="Segoe UI Emoji"/>
-          <w:iCs/>
-        </w:rPr>
-        <w:t>🎉</w:t>
-      </w:r>
-      <w:proofErr w:type="gramEnd"/>
-      <w:r>
-        <w:rPr>
-          <w:iCs/>
-        </w:rPr>
-        <w:t xml:space="preserve"> 2241 </w:t>
-      </w:r>
-      <w:r>
-        <w:rPr>
-          <w:rFonts w:ascii="Aptos" w:hAnsi="Aptos" w:cs="Aptos"/>
-          <w:iCs/>
-        </w:rPr>
-        <w:t>🫥</w:t>
-      </w:r>
-      <w:r>
-        <w:rPr>
-          <w:iCs/>
-        </w:rPr>
-        <w:t xml:space="preserve"> 337  </w:t>
-      </w:r>
-      <w:r>
-        <w:rPr>
-          <w:rFonts w:ascii="Segoe UI Emoji" w:hAnsi="Segoe UI Emoji" w:cs="Segoe UI Emoji"/>
-          <w:iCs/>
-        </w:rPr>
-        <w:t>⏰</w:t>
-      </w:r>
-      <w:r>
-        <w:rPr>
-          <w:iCs/>
-        </w:rPr>
-        <w:t xml:space="preserve"> 453  </w:t>
-      </w:r>
-      <w:r>
-        <w:rPr>
-          <w:rFonts w:ascii="Segoe UI Emoji" w:hAnsi="Segoe UI Emoji" w:cs="Segoe UI Emoji"/>
-          <w:iCs/>
-        </w:rPr>
-        <w:t>🤔</w:t>
-      </w:r>
-      <w:r>
-        <w:rPr>
-          <w:iCs/>
-        </w:rPr>
-        <w:t xml:space="preserve"> 0  </w:t>
-      </w:r>
-      <w:r>
-        <w:rPr>
-          <w:rFonts w:ascii="Segoe UI Emoji" w:hAnsi="Segoe UI Emoji" w:cs="Segoe UI Emoji"/>
-          <w:iCs/>
-        </w:rPr>
-        <w:t>🙁</w:t>
-      </w:r>
-      <w:r>
-        <w:rPr>
-          <w:iCs/>
-        </w:rPr>
-        <w:t xml:space="preserve"> 642  </w:t>
-      </w:r>
-      <w:r>
-        <w:rPr>
-          <w:rFonts w:ascii="Segoe UI Emoji" w:hAnsi="Segoe UI Emoji" w:cs="Segoe UI Emoji"/>
-          <w:iCs/>
-        </w:rPr>
-        <w:t>🔇</w:t>
-      </w:r>
-      <w:r>
-        <w:rPr>
-          <w:iCs/>
-        </w:rPr>
-        <w:t xml:space="preserve"> 0</w:t>
-      </w:r>
-    </w:p>
-    <w:p>
-      <w:pPr>
-        <w:rPr>
-          <w:iCs/>
-        </w:rPr>
-      </w:pPr>
-      <w:r>
-        <w:rPr>
-          <w:iCs/>
-        </w:rPr>
-        <w:t>Mutants identified: 347/1449</w:t>
-      </w:r>
-      <w:r>
-        <w:rPr>
-          <w:iCs/>
-        </w:rPr>
-        <w:t xml:space="preserve"> – not sure why not all mutants were hit</w:t>
-      </w:r>
-    </w:p>
-    <w:p>
-      <w:pPr>
-        <w:rPr>
-          <w:iCs/>
-        </w:rPr>
-      </w:pPr>
-      <w:r>
-        <w:rPr>
-          <w:iCs/>
-        </w:rPr>
-        <w:t>Completed in 13372.785392045975 seconds.</w:t>
-      </w:r>
-      <w:r>
-        <w:rPr>
-          <w:iCs/>
-        </w:rPr>
-        <w:t xml:space="preserve"> (3.7 hrs)</w:t>
-      </w:r>
-    </w:p>
-    <w:p>
-      <w:pPr>
-        <w:rPr>
-          <w:iCs/>
-        </w:rPr>
-      </w:pPr>
-    </w:p>
-    <w:p>
-      <w:pPr>
-        <w:rPr>
-          <w:iCs/>
-        </w:rPr>
-      </w:pPr>
-      <w:r>
-        <w:rPr>
-          <w:iCs/>
-        </w:rPr>
-        <w:t xml:space="preserve">After adding </w:t>
-      </w:r>
-      <w:proofErr w:type="gramStart"/>
-      <w:r>
-        <w:rPr>
-          <w:iCs/>
-        </w:rPr>
-        <w:t>class based</w:t>
-      </w:r>
-      <w:proofErr w:type="gramEnd"/>
-      <w:r>
-        <w:rPr>
-          <w:iCs/>
-        </w:rPr>
-        <w:t xml:space="preserve"> stuff</w:t>
-      </w:r>
-    </w:p>
-    <w:p>
-      <w:pPr>
-        <w:rPr>
-          <w:iCs/>
-        </w:rPr>
-      </w:pPr>
-      <w:r>
-        <w:rPr>
-          <w:iCs/>
-        </w:rPr>
-        <w:t>Mutants identified: 917/4467</w:t>
-      </w:r>
-      <w:r>
-        <w:rPr>
-          <w:iCs/>
-        </w:rPr>
-        <w:t xml:space="preserve"> in 6.8 hrs (but I suspect this may be over eager)</w:t>
-      </w:r>
-    </w:p>
-    <w:p>
-      <w:pPr>
-        <w:rPr>
-          <w:iCs/>
-        </w:rPr>
-      </w:pPr>
-      <w:r>
-        <w:rPr>
-          <w:iCs/>
-        </w:rPr>
-        <w:t>537/4467</w:t>
-      </w:r>
-      <w:r>
-        <w:rPr>
-          <w:iCs/>
-        </w:rPr>
-        <w:t xml:space="preserve"> after fixing it in 7.4 hrs</w:t>
-      </w:r>
-    </w:p>
-    <w:p>
-      <w:pPr>
-        <w:rPr>
-          <w:iCs/>
-        </w:rPr>
-      </w:pPr>
-    </w:p>
-    <w:p>
-      <w:pPr>
-        <w:rPr>
-          <w:iCs/>
-        </w:rPr>
-      </w:pPr>
-      <w:r>
-        <w:rPr>
-          <w:iCs/>
-        </w:rPr>
-        <w:t>Ran it on a library of data structures:</w:t>
-      </w:r>
-    </w:p>
-    <w:p>
-      <w:pPr>
-        <w:rPr>
-          <w:iCs/>
-        </w:rPr>
-      </w:pPr>
-      <w:r>
-        <w:rPr>
-          <w:iCs/>
-        </w:rPr>
-        <w:t>https://github.com/clair3st/Data-Structures/tree/master</w:t>
-      </w:r>
-    </w:p>
-    <w:p>
-      <w:pPr>
-        <w:rPr>
-          <w:iCs/>
-        </w:rPr>
-      </w:pPr>
-      <w:r>
-        <w:rPr>
-          <w:rFonts w:ascii="Segoe UI Symbol" w:hAnsi="Segoe UI Symbol" w:cs="Segoe UI Symbol"/>
-          <w:iCs/>
-        </w:rPr>
-        <w:t>⠸</w:t>
-      </w:r>
-      <w:r>
-        <w:rPr>
-          <w:iCs/>
-        </w:rPr>
-        <w:t xml:space="preserve"> 445/</w:t>
-      </w:r>
-      <w:proofErr w:type="gramStart"/>
-      <w:r>
-        <w:rPr>
-          <w:iCs/>
-        </w:rPr>
-        <w:t xml:space="preserve">445  </w:t>
-      </w:r>
-      <w:r>
-        <w:rPr>
-          <w:rFonts w:ascii="Segoe UI Emoji" w:hAnsi="Segoe UI Emoji" w:cs="Segoe UI Emoji"/>
-          <w:iCs/>
-        </w:rPr>
-        <w:t>🎉</w:t>
-      </w:r>
-      <w:proofErr w:type="gramEnd"/>
-      <w:r>
-        <w:rPr>
-          <w:iCs/>
-        </w:rPr>
-        <w:t xml:space="preserve"> 383 </w:t>
-      </w:r>
-      <w:r>
-        <w:rPr>
-          <w:rFonts w:ascii="Aptos" w:hAnsi="Aptos" w:cs="Aptos"/>
-          <w:iCs/>
-        </w:rPr>
-        <w:t>🫥</w:t>
-      </w:r>
-      <w:r>
-        <w:rPr>
-          <w:iCs/>
-        </w:rPr>
-        <w:t xml:space="preserve"> 4  </w:t>
-      </w:r>
-      <w:r>
-        <w:rPr>
-          <w:rFonts w:ascii="Segoe UI Emoji" w:hAnsi="Segoe UI Emoji" w:cs="Segoe UI Emoji"/>
-          <w:iCs/>
-        </w:rPr>
-        <w:t>⏰</w:t>
-      </w:r>
-      <w:r>
-        <w:rPr>
-          <w:iCs/>
-        </w:rPr>
-        <w:t xml:space="preserve"> 10  </w:t>
-      </w:r>
-      <w:r>
-        <w:rPr>
-          <w:rFonts w:ascii="Segoe UI Emoji" w:hAnsi="Segoe UI Emoji" w:cs="Segoe UI Emoji"/>
-          <w:iCs/>
-        </w:rPr>
-        <w:t>🤔</w:t>
-      </w:r>
-      <w:r>
-        <w:rPr>
-          <w:iCs/>
-        </w:rPr>
-        <w:t xml:space="preserve"> 0  </w:t>
-      </w:r>
-      <w:r>
-        <w:rPr>
-          <w:rFonts w:ascii="Segoe UI Emoji" w:hAnsi="Segoe UI Emoji" w:cs="Segoe UI Emoji"/>
-          <w:iCs/>
-        </w:rPr>
-        <w:t>🙁</w:t>
-      </w:r>
-      <w:r>
-        <w:rPr>
-          <w:iCs/>
-        </w:rPr>
-        <w:t xml:space="preserve"> 48  </w:t>
-      </w:r>
-      <w:r>
-        <w:rPr>
-          <w:rFonts w:ascii="Segoe UI Emoji" w:hAnsi="Segoe UI Emoji" w:cs="Segoe UI Emoji"/>
-          <w:iCs/>
-        </w:rPr>
-        <w:t>🔇</w:t>
-      </w:r>
-      <w:r>
-        <w:rPr>
-          <w:iCs/>
-        </w:rPr>
-        <w:t xml:space="preserve"> 0</w:t>
-      </w:r>
-    </w:p>
-    <w:p>
-      <w:pPr>
-        <w:rPr>
-          <w:iCs/>
-        </w:rPr>
-      </w:pPr>
-      <w:r>
-        <w:rPr>
-          <w:iCs/>
-        </w:rPr>
-        <w:t>11</w:t>
-      </w:r>
-      <w:r>
-        <w:rPr>
-          <w:iCs/>
-        </w:rPr>
-        <w:t>8/445</w:t>
-      </w:r>
-    </w:p>
-    <w:p>
-      <w:pPr>
-        <w:rPr>
-          <w:iCs/>
-        </w:rPr>
-      </w:pPr>
-      <w:r>
-        <w:rPr>
-          <w:iCs/>
-        </w:rPr>
-        <w:t xml:space="preserve">270/445 after adding more </w:t>
-      </w:r>
-      <w:proofErr w:type="gramStart"/>
-      <w:r>
-        <w:rPr>
-          <w:iCs/>
-        </w:rPr>
-        <w:t>class based</w:t>
-      </w:r>
-      <w:proofErr w:type="gramEnd"/>
-      <w:r>
-        <w:rPr>
-          <w:iCs/>
-        </w:rPr>
-        <w:t xml:space="preserve"> stuff</w:t>
-      </w:r>
-    </w:p>
-    <w:p>
-      <w:pPr>
-        <w:rPr>
-          <w:iCs/>
-        </w:rPr>
-      </w:pPr>
-      <w:r>
-        <w:rPr>
-          <w:iCs/>
-        </w:rPr>
-        <w:t>353/445 after 2.5 hrs with basic dummy object</w:t>
-      </w:r>
-    </w:p>
-    <w:p>
-      <w:pPr>
-        <w:rPr>
-          <w:iCs/>
-        </w:rPr>
-      </w:pPr>
-      <w:r>
-        <w:rPr>
-          <w:iCs/>
-        </w:rPr>
-        <w:t>367/445 best so far</w:t>
-      </w:r>
-    </w:p>
-    <w:p>
-      <w:pPr>
-        <w:rPr>
-          <w:iCs/>
-        </w:rPr>
-      </w:pPr>
-    </w:p>
-    <w:p>
-      <w:pPr>
-        <w:rPr>
-          <w:iCs/>
-        </w:rPr>
-      </w:pPr>
-    </w:p>
-    <w:p>
-      <w:pPr>
-        <w:rPr>
-          <w:iCs/>
-        </w:rPr>
-      </w:pPr>
-      <w:r>
-        <w:rPr>
-          <w:iCs/>
-        </w:rPr>
-        <w:t xml:space="preserve">With the following addition to </w:t>
-      </w:r>
-      <w:proofErr w:type="spellStart"/>
-      <w:proofErr w:type="gramStart"/>
-      <w:r>
-        <w:rPr>
-          <w:iCs/>
-        </w:rPr>
-        <w:t>pyproject.toml</w:t>
-      </w:r>
-      <w:proofErr w:type="spellEnd"/>
-      <w:proofErr w:type="gramEnd"/>
-    </w:p>
-    <w:p>
-      <w:pPr>
-        <w:rPr>
-          <w:iCs/>
-        </w:rPr>
-      </w:pPr>
-      <w:r>
-        <w:rPr>
-          <w:iCs/>
-        </w:rPr>
-        <w:t>[</w:t>
-      </w:r>
-      <w:proofErr w:type="spellStart"/>
-      <w:proofErr w:type="gramStart"/>
-      <w:r>
-        <w:rPr>
-          <w:iCs/>
-        </w:rPr>
-        <w:t>tool.mutmut</w:t>
-      </w:r>
-      <w:proofErr w:type="spellEnd"/>
-      <w:proofErr w:type="gramEnd"/>
-      <w:r>
-        <w:rPr>
-          <w:iCs/>
-        </w:rPr>
-        <w:t>]</w:t>
-      </w:r>
-      <w:r>
-        <w:rPr>
-          <w:iCs/>
-        </w:rPr>
-        <w:br/>
-      </w:r>
-      <w:proofErr w:type="spellStart"/>
-      <w:r>
-        <w:rPr>
-          <w:iCs/>
-        </w:rPr>
-        <w:t>pytest_add_cli_args</w:t>
-      </w:r>
-      <w:proofErr w:type="spellEnd"/>
-      <w:r>
-        <w:rPr>
-          <w:iCs/>
-        </w:rPr>
-        <w:t xml:space="preserve"> = ["-k", "not </w:t>
-      </w:r>
-      <w:proofErr w:type="spellStart"/>
-      <w:r>
-        <w:rPr>
-          <w:iCs/>
-        </w:rPr>
-        <w:t>test_env_cert_bundles</w:t>
-      </w:r>
-      <w:proofErr w:type="spellEnd"/>
-      <w:r>
-        <w:rPr>
-          <w:iCs/>
-        </w:rPr>
-        <w:t xml:space="preserve"> and not test_different_connection_pool_for_tls_settings_verify_bundle_unexpired_cert"]</w:t>
-      </w:r>
-    </w:p>
-    <w:p>
-      <w:pPr>
-        <w:rPr>
-          <w:iCs/>
-        </w:rPr>
-      </w:pPr>
-    </w:p>
-    <w:p>
-      <w:pPr>
-        <w:rPr>
-          <w:iCs/>
-        </w:rPr>
-      </w:pPr>
-      <w:r>
-        <w:rPr>
-          <w:iCs/>
-        </w:rPr>
-        <w:t>Additions:</w:t>
-      </w:r>
-    </w:p>
-    <w:p>
-      <w:pPr>
-        <w:rPr>
-          <w:iCs/>
-        </w:rPr>
-      </w:pPr>
-      <w:r>
-        <w:rPr>
-          <w:iCs/>
-        </w:rPr>
-        <w:t>Tested more hobbit suite</w:t>
-      </w:r>
-    </w:p>
-    <w:p>
-      <w:pPr>
-        <w:rPr>
-          <w:iCs/>
-        </w:rPr>
-      </w:pPr>
-      <w:r>
-        <w:rPr>
-          <w:iCs/>
-        </w:rPr>
-        <w:t>Wrote program equivalence</w:t>
-      </w:r>
-    </w:p>
-    <w:p>
-      <w:pPr>
-        <w:rPr>
-          <w:iCs/>
-        </w:rPr>
-      </w:pPr>
-      <w:r>
-        <w:rPr>
-          <w:iCs/>
-        </w:rPr>
-        <w:t>Wrote script to run entire hobbit suite</w:t>
-      </w:r>
-    </w:p>
-    <w:p>
-      <w:pPr>
-        <w:rPr>
-          <w:iCs/>
-        </w:rPr>
-      </w:pPr>
-      <w:r>
-        <w:rPr>
-          <w:iCs/>
-        </w:rPr>
-        <w:t xml:space="preserve">Functions can </w:t>
-      </w:r>
-      <w:proofErr w:type="gramStart"/>
-      <w:r>
-        <w:rPr>
-          <w:iCs/>
-        </w:rPr>
-        <w:t>alter  global</w:t>
-      </w:r>
-      <w:proofErr w:type="gramEnd"/>
-      <w:r>
-        <w:rPr>
-          <w:iCs/>
-        </w:rPr>
-        <w:t xml:space="preserve"> state</w:t>
-      </w:r>
-    </w:p>
-    <w:p>
-      <w:pPr>
-        <w:rPr>
-          <w:iCs/>
-        </w:rPr>
-      </w:pPr>
-      <w:r>
-        <w:rPr>
-          <w:iCs/>
-        </w:rPr>
-        <w:t>Mutation testing stuff</w:t>
-      </w:r>
-    </w:p>
-    <w:p>
-      <w:pPr>
-        <w:rPr>
-          <w:iCs/>
-        </w:rPr>
-      </w:pPr>
-    </w:p>
-    <w:p>
-      <w:pPr>
-        <w:rPr>
-          <w:iCs/>
-        </w:rPr>
-      </w:pPr>
-      <w:r>
-        <w:rPr>
-          <w:iCs/>
-        </w:rPr>
-        <w:t>Questions:</w:t>
-      </w:r>
-    </w:p>
-    <w:p>
-      <w:pPr>
-        <w:rPr>
-          <w:iCs/>
-        </w:rPr>
-      </w:pPr>
-      <w:r>
-        <w:rPr>
-          <w:iCs/>
-        </w:rPr>
-        <w:t xml:space="preserve">What do I say about translating hobbit to python in the thesis? That I used </w:t>
-      </w:r>
-      <w:proofErr w:type="spellStart"/>
-      <w:r>
-        <w:rPr>
-          <w:iCs/>
-        </w:rPr>
-        <w:t>gpt</w:t>
-      </w:r>
-      <w:proofErr w:type="spellEnd"/>
-      <w:r>
-        <w:rPr>
-          <w:iCs/>
-        </w:rPr>
-        <w:t>?</w:t>
-      </w:r>
-    </w:p>
-    <w:p>
-      <w:pPr>
-        <w:rPr>
-          <w:iCs/>
-        </w:rPr>
-      </w:pPr>
-      <w:r>
-        <w:rPr>
-          <w:iCs/>
-        </w:rPr>
-        <w:t>Yes. Include sample prompts with responses</w:t>
-      </w:r>
-    </w:p>
-    <w:p>
-      <w:pPr>
-        <w:rPr>
-          <w:iCs/>
-        </w:rPr>
-      </w:pPr>
-      <w:r>
-        <w:rPr>
-          <w:iCs/>
-        </w:rPr>
-        <w:t xml:space="preserve">How do I treat two programs where 1 has global state and the other </w:t>
-      </w:r>
-      <w:proofErr w:type="spellStart"/>
-      <w:r>
-        <w:rPr>
-          <w:iCs/>
-        </w:rPr>
-        <w:t>doesnt</w:t>
-      </w:r>
-      <w:proofErr w:type="spellEnd"/>
-    </w:p>
-    <w:p>
-      <w:pPr>
-        <w:rPr>
-          <w:iCs/>
-        </w:rPr>
-      </w:pPr>
-    </w:p>
-    <w:p>
-      <w:pPr>
-        <w:rPr>
-          <w:iCs/>
-        </w:rPr>
-      </w:pPr>
-      <w:r>
-        <w:rPr>
-          <w:iCs/>
-        </w:rPr>
-        <w:t>The trace is from the perspective of the observer</w:t>
-      </w:r>
-    </w:p>
-    <w:p>
-      <w:pPr>
-        <w:rPr>
-          <w:iCs/>
-        </w:rPr>
-      </w:pPr>
-      <w:r>
-        <w:rPr>
-          <w:iCs/>
-        </w:rPr>
-        <w:t xml:space="preserve">We </w:t>
-      </w:r>
-      <w:proofErr w:type="gramStart"/>
-      <w:r>
-        <w:rPr>
-          <w:iCs/>
-        </w:rPr>
-        <w:t>cant</w:t>
-      </w:r>
-      <w:proofErr w:type="gramEnd"/>
-      <w:r>
-        <w:rPr>
-          <w:iCs/>
-        </w:rPr>
-        <w:t xml:space="preserve"> see internal recursion</w:t>
-      </w:r>
-    </w:p>
-    <w:p>
-      <w:pPr>
-        <w:rPr>
-          <w:iCs/>
-        </w:rPr>
-      </w:pPr>
-      <w:r>
-        <w:rPr>
-          <w:iCs/>
-        </w:rPr>
-        <w:t>If function returns function, observer can call that function maybe</w:t>
-      </w:r>
-    </w:p>
-    <w:p>
-      <w:pPr>
-        <w:rPr>
-          <w:iCs/>
-        </w:rPr>
-      </w:pPr>
-      <w:proofErr w:type="spellStart"/>
-      <w:r>
-        <w:rPr>
-          <w:iCs/>
-        </w:rPr>
-        <w:t>Reentrancy</w:t>
-      </w:r>
-      <w:proofErr w:type="spellEnd"/>
-      <w:r>
-        <w:rPr>
-          <w:iCs/>
-        </w:rPr>
-        <w:t xml:space="preserve">. </w:t>
-      </w:r>
-    </w:p>
-    <w:p>
-      <w:pPr>
-        <w:rPr>
-          <w:iCs/>
-        </w:rPr>
-      </w:pPr>
-      <w:r>
-        <w:rPr>
-          <w:iCs/>
-        </w:rPr>
-        <w:t xml:space="preserve">Function can make a choice between all </w:t>
-      </w:r>
-      <w:proofErr w:type="spellStart"/>
-      <w:r>
-        <w:rPr>
-          <w:iCs/>
-        </w:rPr>
-        <w:t>funcs</w:t>
-      </w:r>
-      <w:proofErr w:type="spellEnd"/>
-      <w:r>
-        <w:rPr>
-          <w:iCs/>
-        </w:rPr>
-        <w:t xml:space="preserve"> it knows</w:t>
-      </w:r>
-    </w:p>
-    <w:p>
-      <w:pPr>
-        <w:rPr>
-          <w:iCs/>
-        </w:rPr>
-      </w:pPr>
-      <w:r>
-        <w:rPr>
-          <w:iCs/>
-        </w:rPr>
-        <w:t>Maybe make observers store return values received in sequence</w:t>
-      </w:r>
-    </w:p>
-    <w:p>
-      <w:pPr>
-        <w:rPr>
-          <w:iCs/>
-        </w:rPr>
-      </w:pPr>
-      <w:r>
-        <w:rPr>
-          <w:iCs/>
-        </w:rPr>
-        <w:t>F can write a stream to a file</w:t>
-      </w:r>
-    </w:p>
-    <w:p>
-      <w:pPr>
-        <w:rPr>
-          <w:iCs/>
-        </w:rPr>
-      </w:pPr>
-      <w:proofErr w:type="gramStart"/>
-      <w:r>
-        <w:rPr>
-          <w:iCs/>
-        </w:rPr>
-        <w:t>Have to</w:t>
-      </w:r>
-      <w:proofErr w:type="gramEnd"/>
-      <w:r>
-        <w:rPr>
-          <w:iCs/>
-        </w:rPr>
-        <w:t xml:space="preserve"> retranslate hobbit suite</w:t>
-      </w:r>
-    </w:p>
-    <w:p>
-      <w:pPr>
-        <w:rPr>
-          <w:iCs/>
-        </w:rPr>
-      </w:pPr>
-      <w:r>
-        <w:rPr>
-          <w:iCs/>
-        </w:rPr>
-        <w:t xml:space="preserve">Currently, catch </w:t>
-      </w:r>
-      <w:r>
-        <w:rPr>
-          <w:iCs/>
-        </w:rPr>
-        <w:t>41-47</w:t>
-      </w:r>
-      <w:r>
-        <w:rPr>
-          <w:iCs/>
-        </w:rPr>
-        <w:t>/79 from hobbit suite</w:t>
-      </w:r>
-      <w:r>
-        <w:rPr>
-          <w:iCs/>
-        </w:rPr>
-        <w:t xml:space="preserve"> in 14-17 mins</w:t>
-      </w:r>
-    </w:p>
-    <w:p>
-      <w:pPr>
-        <w:rPr>
-          <w:iCs/>
-        </w:rPr>
-      </w:pPr>
-      <w:r>
-        <w:rPr>
-          <w:iCs/>
-        </w:rPr>
-        <w:t>Need to check if input arguments get mutated</w:t>
-      </w:r>
-    </w:p>
-    <w:p>
-      <w:pPr>
-        <w:rPr>
-          <w:iCs/>
-        </w:rPr>
-      </w:pPr>
-      <w:r>
-        <w:rPr>
-          <w:iCs/>
-        </w:rPr>
-        <w:t>There is a demo</w:t>
+        <w:t>Check on cross_reentrancy_param</w:t>
       </w:r>
     </w:p>
     <w:p>
@@ -3463,24 +2286,88 @@
           <w:iCs/>
         </w:rPr>
       </w:pPr>
-      <w:r>
+    </w:p>
+    <w:p>
+      <w:pPr>
         <w:rPr>
           <w:b/>
           <w:bCs/>
           <w:iCs/>
         </w:rPr>
-        <w:t xml:space="preserve">Check on </w:t>
-      </w:r>
-      <w:proofErr w:type="spellStart"/>
+      </w:pPr>
+    </w:p>
+    <w:p>
+      <w:pPr>
+        <w:rPr>
+          <w:iCs/>
+        </w:rPr>
+      </w:pPr>
+      <w:r>
+        <w:rPr>
+          <w:iCs/>
+        </w:rPr>
+        <w:lastRenderedPageBreak/>
+        <w:t xml:space="preserve">Added functionality that if a higher order function returns a </w:t>
+      </w:r>
       <w:r>
         <w:rPr>
           <w:b/>
           <w:bCs/>
           <w:iCs/>
         </w:rPr>
-        <w:t>cross_reentrancy_param</w:t>
-      </w:r>
-      <w:proofErr w:type="spellEnd"/>
+        <w:t>tuple</w:t>
+      </w:r>
+      <w:r>
+        <w:rPr>
+          <w:iCs/>
+        </w:rPr>
+        <w:t xml:space="preserve"> of functions, we interleave the execution of those functions</w:t>
+      </w:r>
+      <w:r>
+        <w:rPr>
+          <w:iCs/>
+        </w:rPr>
+        <w:t xml:space="preserve">. </w:t>
+      </w:r>
+    </w:p>
+    <w:p>
+      <w:pPr>
+        <w:rPr>
+          <w:iCs/>
+        </w:rPr>
+      </w:pPr>
+      <w:r>
+        <w:rPr>
+          <w:iCs/>
+        </w:rPr>
+        <w:t>Added functionality that if a higher order function takes a callable parameter, and then calls that callable parameter passing in multiple functions as arguments to that callable parameter, then that callable parameter can interleave the execution of the functions it is given</w:t>
+      </w:r>
+    </w:p>
+    <w:p>
+      <w:pPr>
+        <w:rPr>
+          <w:iCs/>
+        </w:rPr>
+      </w:pPr>
+      <w:r>
+        <w:rPr>
+          <w:iCs/>
+        </w:rPr>
+        <w:t xml:space="preserve">Curried interaction plan: </w:t>
+      </w:r>
+    </w:p>
+    <w:p>
+      <w:pPr>
+        <w:rPr>
+          <w:iCs/>
+        </w:rPr>
+      </w:pPr>
+      <w:r>
+        <w:rPr>
+          <w:iCs/>
+        </w:rPr>
+        <w:t xml:space="preserve">For combiner-style HOFs, </w:t>
+      </w:r>
     </w:p>
     <w:p>
       <w:pPr>
@@ -3494,97 +2381,6 @@
     <w:p>
       <w:pPr>
         <w:rPr>
-          <w:b/>
-          <w:bCs/>
-          <w:iCs/>
-        </w:rPr>
-      </w:pPr>
-    </w:p>
-    <w:p>
-      <w:pPr>
-        <w:rPr>
-          <w:iCs/>
-        </w:rPr>
-      </w:pPr>
-      <w:r>
-        <w:rPr>
-          <w:iCs/>
-        </w:rPr>
-        <w:lastRenderedPageBreak/>
-        <w:t xml:space="preserve">Added functionality that if a higher order function returns a </w:t>
-      </w:r>
-      <w:r>
-        <w:rPr>
-          <w:b/>
-          <w:bCs/>
-          <w:iCs/>
-        </w:rPr>
-        <w:t>tuple</w:t>
-      </w:r>
-      <w:r>
-        <w:rPr>
-          <w:iCs/>
-        </w:rPr>
-        <w:t xml:space="preserve"> of functions, we interleave the execution of those functions</w:t>
-      </w:r>
-      <w:r>
-        <w:rPr>
-          <w:iCs/>
-        </w:rPr>
-        <w:t xml:space="preserve">. </w:t>
-      </w:r>
-    </w:p>
-    <w:p>
-      <w:pPr>
-        <w:rPr>
-          <w:iCs/>
-        </w:rPr>
-      </w:pPr>
-      <w:r>
-        <w:rPr>
-          <w:iCs/>
-        </w:rPr>
-        <w:t>Added functionality that if a higher order function takes a callable parameter, and then calls that callable parameter passing in multiple functions as arguments to that callable parameter, then that callable parameter can interleave the execution of the functions it is given</w:t>
-      </w:r>
-    </w:p>
-    <w:p>
-      <w:pPr>
-        <w:rPr>
-          <w:iCs/>
-        </w:rPr>
-      </w:pPr>
-      <w:r>
-        <w:rPr>
-          <w:iCs/>
-        </w:rPr>
-        <w:t xml:space="preserve">Curried interaction plan: </w:t>
-      </w:r>
-    </w:p>
-    <w:p>
-      <w:pPr>
-        <w:rPr>
-          <w:iCs/>
-        </w:rPr>
-      </w:pPr>
-      <w:r>
-        <w:rPr>
-          <w:iCs/>
-        </w:rPr>
-        <w:t xml:space="preserve">For combiner-style HOFs, </w:t>
-      </w:r>
-    </w:p>
-    <w:p>
-      <w:pPr>
-        <w:rPr>
-          <w:b/>
-          <w:bCs/>
-          <w:iCs/>
-        </w:rPr>
-      </w:pPr>
-    </w:p>
-    <w:p>
-      <w:pPr>
-        <w:rPr>
           <w:iCs/>
         </w:rPr>
       </w:pPr>
@@ -3612,110 +2408,40 @@
         <w:rPr>
           <w:iCs/>
         </w:rPr>
-        <w:t xml:space="preserve">Seemingly obvious bugs might be overlooked. For bsearch_1, the failing input is 2. Even if I add an int type annotation, the </w:t>
-      </w:r>
-      <w:proofErr w:type="spellStart"/>
-      <w:r>
-        <w:rPr>
-          <w:iCs/>
-        </w:rPr>
-        <w:t>fuzzer</w:t>
-      </w:r>
-      <w:proofErr w:type="spellEnd"/>
-      <w:r>
-        <w:rPr>
-          <w:iCs/>
-        </w:rPr>
-        <w:t xml:space="preserve"> can fully fail to discover the bug because it never tried 2, it tried thousands of other numbers but not 2. Highlights a weakness of coverage-</w:t>
-      </w:r>
-      <w:proofErr w:type="spellStart"/>
-      <w:r>
-        <w:rPr>
-          <w:iCs/>
-        </w:rPr>
-        <w:t>guidedness</w:t>
-      </w:r>
-      <w:proofErr w:type="spellEnd"/>
-      <w:r>
-        <w:rPr>
-          <w:iCs/>
-        </w:rPr>
-        <w:t xml:space="preserve"> in a function </w:t>
-      </w:r>
-      <w:proofErr w:type="gramStart"/>
-      <w:r>
-        <w:rPr>
-          <w:iCs/>
-        </w:rPr>
-        <w:t>where</w:t>
-      </w:r>
-      <w:proofErr w:type="gramEnd"/>
-      <w:r>
-        <w:rPr>
-          <w:iCs/>
-        </w:rPr>
-        <w:t xml:space="preserve"> coverage wont change meaningfully</w:t>
-      </w:r>
-    </w:p>
-    <w:p>
-      <w:pPr>
-        <w:rPr>
-          <w:iCs/>
-        </w:rPr>
-      </w:pPr>
-    </w:p>
-    <w:p>
-      <w:pPr>
-        <w:rPr>
-          <w:iCs/>
-        </w:rPr>
-      </w:pPr>
-      <w:r>
-        <w:rPr>
-          <w:iCs/>
-        </w:rPr>
-        <w:t xml:space="preserve">Added ability for </w:t>
-      </w:r>
-      <w:proofErr w:type="spellStart"/>
-      <w:r>
-        <w:rPr>
-          <w:iCs/>
-        </w:rPr>
-        <w:t>fuzzer</w:t>
-      </w:r>
-      <w:proofErr w:type="spellEnd"/>
-      <w:r>
-        <w:rPr>
-          <w:iCs/>
-        </w:rPr>
-        <w:t xml:space="preserve"> to handle functions that take objects of custom classes as arguments but only if the argument is type annotation.</w:t>
-      </w:r>
-    </w:p>
-    <w:p>
-      <w:pPr>
-        <w:rPr>
-          <w:iCs/>
-        </w:rPr>
-      </w:pPr>
-      <w:r>
-        <w:rPr>
-          <w:iCs/>
-        </w:rPr>
-        <w:t xml:space="preserve">Improved ability to use type annotations, specifically we can now create containers of </w:t>
-      </w:r>
-      <w:proofErr w:type="spellStart"/>
-      <w:r>
-        <w:rPr>
-          <w:iCs/>
-        </w:rPr>
-        <w:t>callables</w:t>
-      </w:r>
-      <w:proofErr w:type="spellEnd"/>
-      <w:r>
-        <w:rPr>
-          <w:iCs/>
-        </w:rPr>
-        <w:t xml:space="preserve"> from type annotations</w:t>
+        <w:t>Seemingly obvious bugs might be overlooked. For bsearch_1, the failing input is 2. Even if I add an int type annotation, the fuzzer can fully fail to discover the bug because it never tried 2, it tried thousands of other numbers but not 2. Highlights a weakness of coverage-guidedness in a function where coverage wont change meaningfully</w:t>
+      </w:r>
+    </w:p>
+    <w:p>
+      <w:pPr>
+        <w:rPr>
+          <w:iCs/>
+        </w:rPr>
+      </w:pPr>
+    </w:p>
+    <w:p>
+      <w:pPr>
+        <w:rPr>
+          <w:iCs/>
+        </w:rPr>
+      </w:pPr>
+      <w:r>
+        <w:rPr>
+          <w:iCs/>
+        </w:rPr>
+        <w:t>Added ability for fuzzer to handle functions that take objects of custom classes as arguments but only if the argument is type annotation.</w:t>
+      </w:r>
+    </w:p>
+    <w:p>
+      <w:pPr>
+        <w:rPr>
+          <w:iCs/>
+        </w:rPr>
+      </w:pPr>
+      <w:r>
+        <w:rPr>
+          <w:iCs/>
+        </w:rPr>
+        <w:t>Improved ability to use type annotations, specifically we can now create containers of callables from type annotations</w:t>
       </w:r>
     </w:p>
     <w:p>
@@ -3771,49 +2497,7 @@
         <w:rPr>
           <w:iCs/>
         </w:rPr>
-        <w:t xml:space="preserve">If the top level </w:t>
-      </w:r>
-      <w:proofErr w:type="spellStart"/>
-      <w:r>
-        <w:rPr>
-          <w:iCs/>
-        </w:rPr>
-        <w:t>funcs</w:t>
-      </w:r>
-      <w:proofErr w:type="spellEnd"/>
-      <w:r>
-        <w:rPr>
-          <w:iCs/>
-        </w:rPr>
-        <w:t xml:space="preserve"> take callable </w:t>
-      </w:r>
-      <w:proofErr w:type="spellStart"/>
-      <w:r>
-        <w:rPr>
-          <w:iCs/>
-        </w:rPr>
-        <w:t>args</w:t>
-      </w:r>
-      <w:proofErr w:type="spellEnd"/>
-      <w:r>
-        <w:rPr>
-          <w:iCs/>
-        </w:rPr>
-        <w:t xml:space="preserve">, the callable </w:t>
-      </w:r>
-      <w:proofErr w:type="spellStart"/>
-      <w:r>
-        <w:rPr>
-          <w:iCs/>
-        </w:rPr>
-        <w:t>args</w:t>
-      </w:r>
-      <w:proofErr w:type="spellEnd"/>
-      <w:r>
-        <w:rPr>
-          <w:iCs/>
-        </w:rPr>
-        <w:t xml:space="preserve"> are called the same number of times</w:t>
+        <w:t>If the top level funcs take callable args, the callable args are called the same number of times</w:t>
       </w:r>
     </w:p>
     <w:p>
@@ -3852,21 +2536,7 @@
         <w:rPr>
           <w:iCs/>
         </w:rPr>
-        <w:t xml:space="preserve">Added </w:t>
-      </w:r>
-      <w:proofErr w:type="spellStart"/>
-      <w:r>
-        <w:rPr>
-          <w:iCs/>
-        </w:rPr>
-        <w:t>DummyObject</w:t>
-      </w:r>
-      <w:proofErr w:type="spellEnd"/>
-      <w:r>
-        <w:rPr>
-          <w:iCs/>
-        </w:rPr>
-        <w:t xml:space="preserve"> which can be passed in when an object is expected. Useful for certain data structures like BSTs where methods can expect a node as an argument</w:t>
+        <w:t>Added DummyObject which can be passed in when an object is expected. Useful for certain data structures like BSTs where methods can expect a node as an argument</w:t>
       </w:r>
     </w:p>
     <w:p>
@@ -3887,21 +2557,7 @@
           <w:iCs/>
         </w:rPr>
         <w:lastRenderedPageBreak/>
-        <w:t xml:space="preserve">Comparing exception types when testing two non type annotated functions might be a bad idea. Even if two functions are equivalent but they do things in a different order they could get flagged as inequivalent </w:t>
-      </w:r>
-      <w:proofErr w:type="spellStart"/>
-      <w:r>
-        <w:rPr>
-          <w:iCs/>
-        </w:rPr>
-        <w:t>bcos</w:t>
-      </w:r>
-      <w:proofErr w:type="spellEnd"/>
-      <w:r>
-        <w:rPr>
-          <w:iCs/>
-        </w:rPr>
-        <w:t xml:space="preserve"> they ended up giving two different exception types. My current compromise is to relax the equivalence check for exceptions so that we only care about exception types mattering if the functions are type annotated, otherwise we only check that both sides threw an exception at all (type doesn’t matter)</w:t>
+        <w:t>Comparing exception types when testing two non type annotated functions might be a bad idea. Even if two functions are equivalent but they do things in a different order they could get flagged as inequivalent bcos they ended up giving two different exception types. My current compromise is to relax the equivalence check for exceptions so that we only care about exception types mattering if the functions are type annotated, otherwise we only check that both sides threw an exception at all (type doesn’t matter)</w:t>
       </w:r>
     </w:p>
     <w:p>
@@ -3948,6 +2604,50 @@
           <w:iCs/>
         </w:rPr>
         <w:t>I am working on the literature review, I will probably finish it within a week or so. Can I send it to you to review it?</w:t>
+      </w:r>
+    </w:p>
+    <w:p>
+      <w:pPr>
+        <w:rPr>
+          <w:iCs/>
+        </w:rPr>
+      </w:pPr>
+    </w:p>
+    <w:p>
+      <w:pPr>
+        <w:rPr>
+          <w:iCs/>
+        </w:rPr>
+      </w:pPr>
+      <w:r>
+        <w:rPr>
+          <w:iCs/>
+        </w:rPr>
+        <w:t xml:space="preserve">TODO: I want to allow users to optionally add a hypothesis strategy to the type annotation for function to allow them to specifically gear the fuzzing strategy if they want some precondition for the input. </w:t>
+      </w:r>
+    </w:p>
+    <w:p>
+      <w:pPr>
+        <w:rPr>
+          <w:iCs/>
+        </w:rPr>
+      </w:pPr>
+      <w:r>
+        <w:rPr>
+          <w:iCs/>
+        </w:rPr>
+        <w:t xml:space="preserve">e.g: </w:t>
+      </w:r>
+      <w:r>
+        <w:rPr>
+          <w:iCs/>
+        </w:rPr>
+        <w:t>def func(a: Annotated[list[int], st.lists(st.integers(), min_size=1)]):</w:t>
+      </w:r>
+    </w:p>
+    <w:p>
+      <w:r>
+        <w:t>This is a function where input a has the precondition that it is a singleton list of ints.</w:t>
       </w:r>
     </w:p>
     <w:p/>
@@ -5715,7 +4415,6 @@
   <w:style w:type="character" w:default="1" w:styleId="DefaultParagraphFont">
     <w:name w:val="Default Paragraph Font"/>
     <w:uiPriority w:val="1"/>
-    <w:semiHidden/>
     <w:unhideWhenUsed/>
   </w:style>
   <w:style w:type="table" w:default="1" w:styleId="TableNormal">

</xml_diff>

<commit_message>
Add code to plot results
</commit_message>
<xml_diff>
--- a/Masters project notes.docx
+++ b/Masters project notes.docx
@@ -53,19 +53,11 @@
           <w:lang w:val="fr-FR"/>
         </w:rPr>
       </w:pPr>
-      <w:proofErr w:type="spellStart"/>
       <w:r>
         <w:rPr>
           <w:lang w:val="fr-FR"/>
         </w:rPr>
-        <w:t>Pythonfuzz</w:t>
-      </w:r>
-      <w:proofErr w:type="spellEnd"/>
-      <w:r>
-        <w:rPr>
-          <w:lang w:val="fr-FR"/>
-        </w:rPr>
-        <w:t xml:space="preserve"> </w:t>
+        <w:t xml:space="preserve">Pythonfuzz </w:t>
       </w:r>
       <w:hyperlink r:id="rId6" w:history="1">
         <w:r>
@@ -86,15 +78,7 @@
         </w:numPr>
       </w:pPr>
       <w:r>
-        <w:t xml:space="preserve">Coverage-guided </w:t>
-      </w:r>
-      <w:proofErr w:type="spellStart"/>
-      <w:r>
-        <w:t>fuzzer</w:t>
-      </w:r>
-      <w:proofErr w:type="spellEnd"/>
-      <w:r>
-        <w:t xml:space="preserve"> for python</w:t>
+        <w:t>Coverage-guided fuzzer for python</w:t>
       </w:r>
     </w:p>
     <w:p>
@@ -126,15 +110,7 @@
         </w:numPr>
       </w:pPr>
       <w:r>
-        <w:t xml:space="preserve">Google’s coverage-guided </w:t>
-      </w:r>
-      <w:proofErr w:type="spellStart"/>
-      <w:r>
-        <w:t>fuzzer</w:t>
-      </w:r>
-      <w:proofErr w:type="spellEnd"/>
-      <w:r>
-        <w:t xml:space="preserve"> for python</w:t>
+        <w:t>Google’s coverage-guided fuzzer for python</w:t>
       </w:r>
     </w:p>
     <w:p>
@@ -187,13 +163,8 @@
           <w:numId w:val="1"/>
         </w:numPr>
       </w:pPr>
-      <w:proofErr w:type="spellStart"/>
-      <w:r>
-        <w:t>CrossHair</w:t>
-      </w:r>
-      <w:proofErr w:type="spellEnd"/>
-      <w:r>
-        <w:t xml:space="preserve"> </w:t>
+      <w:r>
+        <w:t xml:space="preserve">CrossHair </w:t>
       </w:r>
       <w:hyperlink r:id="rId9" w:history="1">
         <w:r>
@@ -218,39 +189,7 @@
     </w:p>
     <w:p>
       <w:r>
-        <w:t xml:space="preserve">From my research, Hypothesis + </w:t>
-      </w:r>
-      <w:proofErr w:type="spellStart"/>
-      <w:r>
-        <w:t>HypoFuzz</w:t>
-      </w:r>
-      <w:proofErr w:type="spellEnd"/>
-      <w:r>
-        <w:t xml:space="preserve"> seems like it achieves everything that JQF does. Hypothesis is heavily inspired by </w:t>
-      </w:r>
-      <w:proofErr w:type="spellStart"/>
-      <w:r>
-        <w:t>QuickCheck</w:t>
-      </w:r>
-      <w:proofErr w:type="spellEnd"/>
-      <w:r>
-        <w:t xml:space="preserve"> and gives a property-based testing framework for python. It generates structured inputs and saves failing inputs for reproduction. It operates on the semantic properties of a program, making it inherently </w:t>
-      </w:r>
-      <w:proofErr w:type="gramStart"/>
-      <w:r>
-        <w:t>semantic-based</w:t>
-      </w:r>
-      <w:proofErr w:type="gramEnd"/>
-      <w:r>
-        <w:t xml:space="preserve">. It is not coverage-guided by default, so </w:t>
-      </w:r>
-      <w:proofErr w:type="spellStart"/>
-      <w:r>
-        <w:t>HypoFuzz</w:t>
-      </w:r>
-      <w:proofErr w:type="spellEnd"/>
-      <w:r>
-        <w:t xml:space="preserve"> extends it for coverage-guided exploration thus providing a fuzzing framework.</w:t>
+        <w:t>From my research, Hypothesis + HypoFuzz seems like it achieves everything that JQF does. Hypothesis is heavily inspired by QuickCheck and gives a property-based testing framework for python. It generates structured inputs and saves failing inputs for reproduction. It operates on the semantic properties of a program, making it inherently semantic-based. It is not coverage-guided by default, so HypoFuzz extends it for coverage-guided exploration thus providing a fuzzing framework.</w:t>
       </w:r>
     </w:p>
     <w:p/>
@@ -269,28 +208,15 @@
     </w:p>
     <w:p>
       <w:r>
-        <w:t>Generalise the stack example to any data structure/</w:t>
-      </w:r>
-      <w:proofErr w:type="spellStart"/>
-      <w:r>
-        <w:t>api</w:t>
-      </w:r>
-      <w:proofErr w:type="spellEnd"/>
+        <w:t>Generalise the stack example to any data structure/api</w:t>
+      </w:r>
       <w:r>
         <w:t xml:space="preserve"> that can take any type of arguments.</w:t>
       </w:r>
     </w:p>
     <w:p>
       <w:r>
-        <w:t xml:space="preserve">At some point, see if you can read the python script, create AST and traverse it </w:t>
-      </w:r>
-      <w:proofErr w:type="gramStart"/>
-      <w:r>
-        <w:t>in order to</w:t>
-      </w:r>
-      <w:proofErr w:type="gramEnd"/>
-      <w:r>
-        <w:t xml:space="preserve"> create the right test.</w:t>
+        <w:t>At some point, see if you can read the python script, create AST and traverse it in order to create the right test.</w:t>
       </w:r>
     </w:p>
     <w:p/>
@@ -304,58 +230,18 @@
         <w:t xml:space="preserve">Using it to test a very simple summing function </w:t>
       </w:r>
       <w:r>
-        <w:t xml:space="preserve">doesn’t work very well. I believe because of how universal is configured and how my two simple functions are configured, </w:t>
-      </w:r>
-      <w:proofErr w:type="spellStart"/>
-      <w:r>
-        <w:t>atheris</w:t>
-      </w:r>
-      <w:proofErr w:type="spellEnd"/>
-      <w:r>
-        <w:t xml:space="preserve"> is unable to quickly find the erroneous input.</w:t>
-      </w:r>
-    </w:p>
-    <w:p>
-      <w:r>
-        <w:t xml:space="preserve">I think the fact that fuzz testing is obfuscated inside the universal object the module is unable to correctly perform its algorithms to find erroneous inputs. I vibe coded a </w:t>
-      </w:r>
-      <w:proofErr w:type="spellStart"/>
-      <w:r>
-        <w:t>hypofuzz</w:t>
-      </w:r>
-      <w:proofErr w:type="spellEnd"/>
-      <w:r>
-        <w:t xml:space="preserve"> universal object </w:t>
-      </w:r>
-      <w:proofErr w:type="gramStart"/>
-      <w:r>
-        <w:t>and also</w:t>
-      </w:r>
-      <w:proofErr w:type="gramEnd"/>
-      <w:r>
-        <w:t xml:space="preserve"> tried manually implementing one and couldn’t get it to spot any bugs but given more time there may be a way to implement this. Just haven’t figured it out yet.</w:t>
+        <w:t>doesn’t work very well. I believe because of how universal is configured and how my two simple functions are configured, atheris is unable to quickly find the erroneous input.</w:t>
+      </w:r>
+    </w:p>
+    <w:p>
+      <w:r>
+        <w:t>I think the fact that fuzz testing is obfuscated inside the universal object the module is unable to correctly perform its algorithms to find erroneous inputs. I vibe coded a hypofuzz universal object and also tried manually implementing one and couldn’t get it to spot any bugs but given more time there may be a way to implement this. Just haven’t figured it out yet.</w:t>
       </w:r>
     </w:p>
     <w:p>
       <w:r>
         <w:lastRenderedPageBreak/>
-        <w:t xml:space="preserve">When comparing two different sorting algorithms, </w:t>
-      </w:r>
-      <w:proofErr w:type="spellStart"/>
-      <w:r>
-        <w:t>hypofuzz</w:t>
-      </w:r>
-      <w:proofErr w:type="spellEnd"/>
-      <w:r>
-        <w:t xml:space="preserve"> was unable to spot the difference when I added a small condition to quicksort if length is &gt;= 6, return the reversed list. For these </w:t>
-      </w:r>
-      <w:proofErr w:type="gramStart"/>
-      <w:r>
-        <w:t>one off</w:t>
-      </w:r>
-      <w:proofErr w:type="gramEnd"/>
-      <w:r>
-        <w:t xml:space="preserve"> conditions, coverage guidance actually makes it harder to spot the difference, as they provide very little feedback. Plain hypothesis was able to catch this bug (without coverage guidance)</w:t>
+        <w:t>When comparing two different sorting algorithms, hypofuzz was unable to spot the difference when I added a small condition to quicksort if length is &gt;= 6, return the reversed list. For these one off conditions, coverage guidance actually makes it harder to spot the difference, as they provide very little feedback. Plain hypothesis was able to catch this bug (without coverage guidance)</w:t>
       </w:r>
     </w:p>
     <w:p>
@@ -374,57 +260,12 @@
     </w:p>
     <w:p>
       <w:r>
-        <w:t xml:space="preserve">Testing universal object on two sorting algorithms always results in empty lists as universals value gets set to empty list if </w:t>
-      </w:r>
-      <w:proofErr w:type="spellStart"/>
-      <w:proofErr w:type="gramStart"/>
-      <w:r>
-        <w:t>len</w:t>
-      </w:r>
-      <w:proofErr w:type="spellEnd"/>
-      <w:r>
-        <w:t>(</w:t>
-      </w:r>
-      <w:proofErr w:type="gramEnd"/>
-      <w:r>
-        <w:t xml:space="preserve">) is called on it. This is </w:t>
-      </w:r>
-      <w:proofErr w:type="spellStart"/>
-      <w:r>
-        <w:t>bcos</w:t>
-      </w:r>
-      <w:proofErr w:type="spellEnd"/>
-      <w:r>
-        <w:t xml:space="preserve"> if we initialise it as a list of universals, this may be wrong as it may be intended to be a string. </w:t>
-      </w:r>
-    </w:p>
-    <w:p>
-      <w:r>
-        <w:t xml:space="preserve">Universal needs </w:t>
-      </w:r>
-      <w:proofErr w:type="spellStart"/>
-      <w:r>
-        <w:t>lt</w:t>
-      </w:r>
-      <w:proofErr w:type="spellEnd"/>
-      <w:r>
-        <w:t xml:space="preserve">, </w:t>
-      </w:r>
-      <w:proofErr w:type="spellStart"/>
-      <w:r>
-        <w:t>gt</w:t>
-      </w:r>
-      <w:proofErr w:type="spellEnd"/>
-      <w:r>
-        <w:t xml:space="preserve">, le, </w:t>
-      </w:r>
-      <w:proofErr w:type="spellStart"/>
-      <w:r>
-        <w:t>ge</w:t>
-      </w:r>
-      <w:proofErr w:type="spellEnd"/>
-      <w:r>
-        <w:t xml:space="preserve"> operators define</w:t>
+        <w:t xml:space="preserve">Testing universal object on two sorting algorithms always results in empty lists as universals value gets set to empty list if len() is called on it. This is bcos if we initialise it as a list of universals, this may be wrong as it may be intended to be a string. </w:t>
+      </w:r>
+    </w:p>
+    <w:p>
+      <w:r>
+        <w:t>Universal needs lt, gt, le, ge operators define</w:t>
       </w:r>
       <w:r>
         <w:t>d</w:t>
@@ -438,99 +279,20 @@
         <w:t>Universal does not support item assignment</w:t>
       </w:r>
       <w:r>
-        <w:t xml:space="preserve"> </w:t>
-      </w:r>
-      <w:proofErr w:type="spellStart"/>
-      <w:r>
-        <w:t>e.g</w:t>
-      </w:r>
-      <w:proofErr w:type="spellEnd"/>
-      <w:r>
-        <w:t xml:space="preserve"> the line</w:t>
-      </w:r>
-    </w:p>
-    <w:p>
-      <w:proofErr w:type="spellStart"/>
-      <w:proofErr w:type="gramStart"/>
-      <w:r>
-        <w:t>arr</w:t>
-      </w:r>
-      <w:proofErr w:type="spellEnd"/>
-      <w:r>
-        <w:t>[</w:t>
-      </w:r>
-      <w:proofErr w:type="spellStart"/>
-      <w:proofErr w:type="gramEnd"/>
-      <w:r>
-        <w:t>i</w:t>
-      </w:r>
-      <w:proofErr w:type="spellEnd"/>
-      <w:r>
-        <w:t xml:space="preserve"> + 1], </w:t>
-      </w:r>
-      <w:proofErr w:type="spellStart"/>
-      <w:r>
-        <w:t>arr</w:t>
-      </w:r>
-      <w:proofErr w:type="spellEnd"/>
-      <w:r>
-        <w:t xml:space="preserve">[high] = </w:t>
-      </w:r>
-      <w:proofErr w:type="spellStart"/>
-      <w:r>
-        <w:t>arr</w:t>
-      </w:r>
-      <w:proofErr w:type="spellEnd"/>
-      <w:r>
-        <w:t xml:space="preserve">[high], </w:t>
-      </w:r>
-      <w:proofErr w:type="spellStart"/>
-      <w:r>
-        <w:t>arr</w:t>
-      </w:r>
-      <w:proofErr w:type="spellEnd"/>
-      <w:r>
-        <w:t>[</w:t>
-      </w:r>
-      <w:proofErr w:type="spellStart"/>
-      <w:r>
-        <w:t>i</w:t>
-      </w:r>
-      <w:proofErr w:type="spellEnd"/>
-      <w:r>
-        <w:t xml:space="preserve"> + 1]</w:t>
-      </w:r>
-    </w:p>
-    <w:p>
-      <w:r>
-        <w:t xml:space="preserve">does not work if </w:t>
-      </w:r>
-      <w:proofErr w:type="spellStart"/>
-      <w:r>
-        <w:t>arr</w:t>
-      </w:r>
-      <w:proofErr w:type="spellEnd"/>
-      <w:r>
-        <w:t xml:space="preserve"> is a universal and each element of </w:t>
-      </w:r>
-      <w:proofErr w:type="spellStart"/>
-      <w:r>
-        <w:t>arr</w:t>
-      </w:r>
-      <w:proofErr w:type="spellEnd"/>
-      <w:r>
-        <w:t xml:space="preserve"> is a universal</w:t>
-      </w:r>
-      <w:r>
-        <w:t xml:space="preserve"> I “</w:t>
-      </w:r>
-      <w:proofErr w:type="spellStart"/>
-      <w:r>
-        <w:t>vibecoded</w:t>
-      </w:r>
-      <w:proofErr w:type="spellEnd"/>
-      <w:r>
-        <w:t>” an implementation of this.</w:t>
+        <w:t xml:space="preserve"> e.g the line</w:t>
+      </w:r>
+    </w:p>
+    <w:p>
+      <w:r>
+        <w:t>arr[i + 1], arr[high] = arr[high], arr[i + 1]</w:t>
+      </w:r>
+    </w:p>
+    <w:p>
+      <w:r>
+        <w:t>does not work if arr is a universal and each element of arr is a universal</w:t>
+      </w:r>
+      <w:r>
+        <w:t xml:space="preserve"> I “vibecoded” an implementation of this.</w:t>
       </w:r>
     </w:p>
     <w:p>
@@ -546,36 +308,12 @@
     </w:p>
     <w:p>
       <w:r>
-        <w:t xml:space="preserve">Read </w:t>
-      </w:r>
-      <w:proofErr w:type="spellStart"/>
-      <w:r>
-        <w:t>TypeEvalPy</w:t>
-      </w:r>
-      <w:proofErr w:type="spellEnd"/>
-      <w:r>
-        <w:t xml:space="preserve"> to find good frameworks for function parameters.</w:t>
-      </w:r>
-    </w:p>
-    <w:p>
-      <w:r>
-        <w:t xml:space="preserve">Tried </w:t>
-      </w:r>
-      <w:proofErr w:type="spellStart"/>
-      <w:r>
-        <w:t>HeaderGen</w:t>
-      </w:r>
-      <w:proofErr w:type="spellEnd"/>
-      <w:r>
-        <w:t xml:space="preserve"> as it was apparently the best for all categories including function parameters. When I tried it, it would only infer function return types and not parameters. The </w:t>
-      </w:r>
-      <w:proofErr w:type="spellStart"/>
-      <w:r>
-        <w:t>github</w:t>
-      </w:r>
-      <w:proofErr w:type="spellEnd"/>
-      <w:r>
-        <w:t xml:space="preserve"> only mentions that it can resolve function return types and I could not figure out any way to get it to infer parameter types. </w:t>
+        <w:t>Read TypeEvalPy to find good frameworks for function parameters.</w:t>
+      </w:r>
+    </w:p>
+    <w:p>
+      <w:r>
+        <w:t xml:space="preserve">Tried HeaderGen as it was apparently the best for all categories including function parameters. When I tried it, it would only infer function return types and not parameters. The github only mentions that it can resolve function return types and I could not figure out any way to get it to infer parameter types. </w:t>
       </w:r>
     </w:p>
     <w:p>
@@ -629,103 +367,23 @@
         </w:numPr>
       </w:pPr>
       <w:r>
-        <w:t>Hypothesis/</w:t>
-      </w:r>
-      <w:proofErr w:type="spellStart"/>
-      <w:r>
-        <w:t>Hypofuzz</w:t>
-      </w:r>
-      <w:proofErr w:type="spellEnd"/>
-      <w:r>
-        <w:t xml:space="preserve"> “Strategies” are how you define what is passed </w:t>
-      </w:r>
-      <w:proofErr w:type="gramStart"/>
-      <w:r>
-        <w:t>in to</w:t>
-      </w:r>
-      <w:proofErr w:type="gramEnd"/>
-      <w:r>
-        <w:t xml:space="preserve"> the function you want to fuzz. </w:t>
-      </w:r>
-      <w:proofErr w:type="spellStart"/>
-      <w:r>
-        <w:t>E.g</w:t>
-      </w:r>
-      <w:proofErr w:type="spellEnd"/>
-      <w:r>
-        <w:t xml:space="preserve">  </w:t>
+        <w:t xml:space="preserve">Hypothesis/Hypofuzz “Strategies” are how you define what is passed in to the function you want to fuzz. E.g  </w:t>
       </w:r>
     </w:p>
     <w:p>
       <w:r>
         <w:lastRenderedPageBreak/>
-        <w:t>@given(</w:t>
-      </w:r>
-      <w:proofErr w:type="gramStart"/>
-      <w:r>
-        <w:t>st.lists</w:t>
-      </w:r>
-      <w:proofErr w:type="gramEnd"/>
-      <w:r>
-        <w:t xml:space="preserve">(st.integers() | </w:t>
-      </w:r>
-      <w:proofErr w:type="spellStart"/>
-      <w:r>
-        <w:t>st.floats</w:t>
-      </w:r>
-      <w:proofErr w:type="spellEnd"/>
-      <w:r>
-        <w:t>()))</w:t>
-      </w:r>
-    </w:p>
-    <w:p>
-      <w:r>
-        <w:t xml:space="preserve">def </w:t>
-      </w:r>
-      <w:proofErr w:type="spellStart"/>
-      <w:r>
-        <w:t>test_sort_correct</w:t>
-      </w:r>
-      <w:proofErr w:type="spellEnd"/>
-      <w:r>
-        <w:t>(</w:t>
-      </w:r>
-      <w:proofErr w:type="spellStart"/>
-      <w:r>
-        <w:t>lst</w:t>
-      </w:r>
-      <w:proofErr w:type="spellEnd"/>
-      <w:r>
-        <w:t>):</w:t>
-      </w:r>
-    </w:p>
-    <w:p>
-      <w:r>
-        <w:t xml:space="preserve">    assert(</w:t>
-      </w:r>
-      <w:proofErr w:type="spellStart"/>
-      <w:r>
-        <w:t>my_sort</w:t>
-      </w:r>
-      <w:proofErr w:type="spellEnd"/>
-      <w:r>
-        <w:t>(</w:t>
-      </w:r>
-      <w:proofErr w:type="spellStart"/>
-      <w:r>
-        <w:t>lst</w:t>
-      </w:r>
-      <w:proofErr w:type="spellEnd"/>
-      <w:r>
-        <w:t>) == sorted(</w:t>
-      </w:r>
-      <w:proofErr w:type="spellStart"/>
-      <w:r>
-        <w:t>lst</w:t>
-      </w:r>
-      <w:proofErr w:type="spellEnd"/>
-      <w:r>
-        <w:t>))</w:t>
+        <w:t>@given(st.lists(st.integers() | st.floats()))</w:t>
+      </w:r>
+    </w:p>
+    <w:p>
+      <w:r>
+        <w:t>def test_sort_correct(lst):</w:t>
+      </w:r>
+    </w:p>
+    <w:p>
+      <w:r>
+        <w:t xml:space="preserve">    assert(my_sort(lst) == sorted(lst))</w:t>
       </w:r>
     </w:p>
     <w:p>
@@ -737,23 +395,7 @@
         </w:numPr>
       </w:pPr>
       <w:r>
-        <w:t xml:space="preserve">In that code snippet, the strategy is to fuzz </w:t>
-      </w:r>
-      <w:proofErr w:type="spellStart"/>
-      <w:r>
-        <w:t>my_sort</w:t>
-      </w:r>
-      <w:proofErr w:type="spellEnd"/>
-      <w:r>
-        <w:t xml:space="preserve"> with inputs of type list[</w:t>
-      </w:r>
-      <w:proofErr w:type="spellStart"/>
-      <w:r>
-        <w:t>int|str</w:t>
-      </w:r>
-      <w:proofErr w:type="spellEnd"/>
-      <w:r>
-        <w:t>]</w:t>
+        <w:t>In that code snippet, the strategy is to fuzz my_sort with inputs of type list[int|str]</w:t>
       </w:r>
     </w:p>
     <w:p>
@@ -765,15 +407,7 @@
         </w:numPr>
       </w:pPr>
       <w:r>
-        <w:t xml:space="preserve">In the case of my universal strategy, I simply fuzz with a strategy that can be </w:t>
-      </w:r>
-      <w:proofErr w:type="spellStart"/>
-      <w:r>
-        <w:t>though</w:t>
-      </w:r>
-      <w:proofErr w:type="spellEnd"/>
-      <w:r>
-        <w:t xml:space="preserve"> of as the following:</w:t>
+        <w:t>In the case of my universal strategy, I simply fuzz with a strategy that can be though of as the following:</w:t>
       </w:r>
     </w:p>
     <w:p>
@@ -784,55 +418,8 @@
           <w:numId w:val="3"/>
         </w:numPr>
       </w:pPr>
-      <w:proofErr w:type="spellStart"/>
-      <w:r>
-        <w:t>strat</w:t>
-      </w:r>
-      <w:proofErr w:type="spellEnd"/>
-      <w:r>
-        <w:t xml:space="preserve"> = </w:t>
-      </w:r>
-      <w:proofErr w:type="spellStart"/>
-      <w:r>
-        <w:t>int|str|float|bool|None|list</w:t>
-      </w:r>
-      <w:proofErr w:type="spellEnd"/>
-      <w:r>
-        <w:t>[</w:t>
-      </w:r>
-      <w:proofErr w:type="spellStart"/>
-      <w:r>
-        <w:t>strat</w:t>
-      </w:r>
-      <w:proofErr w:type="spellEnd"/>
-      <w:r>
-        <w:t>]|</w:t>
-      </w:r>
-      <w:proofErr w:type="spellStart"/>
-      <w:r>
-        <w:t>dict</w:t>
-      </w:r>
-      <w:proofErr w:type="spellEnd"/>
-      <w:r>
-        <w:t>[</w:t>
-      </w:r>
-      <w:proofErr w:type="spellStart"/>
-      <w:proofErr w:type="gramStart"/>
-      <w:r>
-        <w:t>str,strat</w:t>
-      </w:r>
-      <w:proofErr w:type="spellEnd"/>
-      <w:proofErr w:type="gramEnd"/>
-      <w:r>
-        <w:t>]|tuple[</w:t>
-      </w:r>
-      <w:proofErr w:type="spellStart"/>
-      <w:r>
-        <w:t>strat</w:t>
-      </w:r>
-      <w:proofErr w:type="spellEnd"/>
-      <w:r>
-        <w:t>]</w:t>
+      <w:r>
+        <w:t>strat = int|str|float|bool|None|list[strat]|dict[str,strat]|tuple[strat]</w:t>
       </w:r>
     </w:p>
     <w:p>
@@ -844,15 +431,7 @@
         </w:numPr>
       </w:pPr>
       <w:r>
-        <w:t xml:space="preserve">I have logic implemented so that if we encounter a </w:t>
-      </w:r>
-      <w:proofErr w:type="spellStart"/>
-      <w:r>
-        <w:t>TypeError</w:t>
-      </w:r>
-      <w:proofErr w:type="spellEnd"/>
-      <w:r>
-        <w:t>, we discard the type that caused the error from the pool of possible types in our strategy for future iterations.</w:t>
+        <w:t>I have logic implemented so that if we encounter a TypeError, we discard the type that caused the error from the pool of possible types in our strategy for future iterations.</w:t>
       </w:r>
     </w:p>
     <w:p>
@@ -864,15 +443,7 @@
         </w:numPr>
       </w:pPr>
       <w:r>
-        <w:t xml:space="preserve">It seems to work </w:t>
-      </w:r>
-      <w:proofErr w:type="gramStart"/>
-      <w:r>
-        <w:t>fairly well</w:t>
-      </w:r>
-      <w:proofErr w:type="gramEnd"/>
-      <w:r>
-        <w:t xml:space="preserve"> for the simple tests I have performed so far</w:t>
+        <w:t>It seems to work fairly well for the simple tests I have performed so far</w:t>
       </w:r>
     </w:p>
     <w:p>
@@ -884,15 +455,7 @@
         </w:numPr>
       </w:pPr>
       <w:r>
-        <w:t xml:space="preserve">Because it essentially brute forces fuzzing with different types until it works, I can imagine this being quite slow for fuzzing complex functions with lots of </w:t>
-      </w:r>
-      <w:proofErr w:type="gramStart"/>
-      <w:r>
-        <w:t>arguments</w:t>
-      </w:r>
-      <w:proofErr w:type="gramEnd"/>
-      <w:r>
-        <w:t xml:space="preserve"> but this will have to be tested more</w:t>
+        <w:t>Because it essentially brute forces fuzzing with different types until it works, I can imagine this being quite slow for fuzzing complex functions with lots of arguments but this will have to be tested more</w:t>
       </w:r>
     </w:p>
     <w:p>
@@ -915,49 +478,17 @@
     </w:p>
     <w:p>
       <w:r>
-        <w:t xml:space="preserve">If we assume there isn’t any explicit casting in the function we are fuzzing, how would a universal handle a situation where the type is ambiguous </w:t>
-      </w:r>
-      <w:proofErr w:type="spellStart"/>
-      <w:r>
-        <w:t>e.g</w:t>
-      </w:r>
-      <w:proofErr w:type="spellEnd"/>
-      <w:r>
-        <w:t xml:space="preserve"> calling </w:t>
-      </w:r>
-      <w:proofErr w:type="spellStart"/>
-      <w:r>
-        <w:t>len</w:t>
-      </w:r>
-      <w:proofErr w:type="spellEnd"/>
-      <w:r>
-        <w:t>(universal). Len is valid for both string and list so how do we lock universal here?</w:t>
-      </w:r>
-    </w:p>
-    <w:p>
-      <w:r>
-        <w:t xml:space="preserve">Similarly, how would we define operators like plus (+) for example? If we have two universals u1 and u2, the statement u1 + u2 could imply that u1 and u2 are strings, </w:t>
-      </w:r>
-      <w:proofErr w:type="spellStart"/>
-      <w:r>
-        <w:t>ints</w:t>
-      </w:r>
-      <w:proofErr w:type="spellEnd"/>
-      <w:r>
-        <w:t>, floats, lists, tuples so how can we implement this operator.</w:t>
-      </w:r>
-    </w:p>
-    <w:p>
-      <w:r>
-        <w:t xml:space="preserve">Theoretically speaking, at best we are determining the type of a (universal) object based on how that object is treated in the code and what functions and operations are applied to it. At best a perfect solution seems to me like it would essentially be a glorified </w:t>
-      </w:r>
-      <w:proofErr w:type="gramStart"/>
-      <w:r>
-        <w:t>type</w:t>
-      </w:r>
-      <w:proofErr w:type="gramEnd"/>
-      <w:r>
-        <w:t xml:space="preserve"> inference algorithm.</w:t>
+        <w:t>If we assume there isn’t any explicit casting in the function we are fuzzing, how would a universal handle a situation where the type is ambiguous e.g calling len(universal). Len is valid for both string and list so how do we lock universal here?</w:t>
+      </w:r>
+    </w:p>
+    <w:p>
+      <w:r>
+        <w:t>Similarly, how would we define operators like plus (+) for example? If we have two universals u1 and u2, the statement u1 + u2 could imply that u1 and u2 are strings, ints, floats, lists, tuples so how can we implement this operator.</w:t>
+      </w:r>
+    </w:p>
+    <w:p>
+      <w:r>
+        <w:t>Theoretically speaking, at best we are determining the type of a (universal) object based on how that object is treated in the code and what functions and operations are applied to it. At best a perfect solution seems to me like it would essentially be a glorified type inference algorithm.</w:t>
       </w:r>
     </w:p>
     <w:p/>
@@ -974,15 +505,7 @@
     <w:p>
       <w:r>
         <w:lastRenderedPageBreak/>
-        <w:t xml:space="preserve">See if </w:t>
-      </w:r>
-      <w:proofErr w:type="spellStart"/>
-      <w:r>
-        <w:t>func</w:t>
-      </w:r>
-      <w:proofErr w:type="spellEnd"/>
-      <w:r>
-        <w:t xml:space="preserve"> argument is callable, raise exception and print that the code is using callbacks which are not currently supported</w:t>
+        <w:t>See if func argument is callable, raise exception and print that the code is using callbacks which are not currently supported</w:t>
       </w:r>
     </w:p>
     <w:p/>
@@ -1004,31 +527,13 @@
         <w:t xml:space="preserve">classes </w:t>
       </w:r>
       <w:r>
-        <w:t xml:space="preserve">for 2 stack </w:t>
-      </w:r>
-      <w:proofErr w:type="gramStart"/>
-      <w:r>
-        <w:t>implementation</w:t>
-      </w:r>
-      <w:proofErr w:type="gramEnd"/>
-    </w:p>
-    <w:p>
-      <w:r>
-        <w:t xml:space="preserve">The </w:t>
-      </w:r>
-      <w:proofErr w:type="spellStart"/>
-      <w:r>
-        <w:t>fuzzer</w:t>
-      </w:r>
-      <w:proofErr w:type="spellEnd"/>
-      <w:r>
-        <w:t xml:space="preserve"> </w:t>
-      </w:r>
-      <w:proofErr w:type="gramStart"/>
-      <w:r>
-        <w:t>should :</w:t>
-      </w:r>
-      <w:proofErr w:type="gramEnd"/>
+        <w:t>for 2 stack implementation</w:t>
+      </w:r>
+    </w:p>
+    <w:p>
+      <w:r>
+        <w:t>The fuzzer should :</w:t>
+      </w:r>
     </w:p>
     <w:p>
       <w:r>
@@ -1048,36 +553,12 @@
     <w:p/>
     <w:p>
       <w:r>
-        <w:t xml:space="preserve">Added </w:t>
-      </w:r>
-      <w:proofErr w:type="spellStart"/>
-      <w:r>
-        <w:t>arg</w:t>
-      </w:r>
-      <w:proofErr w:type="spellEnd"/>
-      <w:r>
-        <w:t>/</w:t>
-      </w:r>
-      <w:proofErr w:type="spellStart"/>
-      <w:r>
-        <w:t>kwarg</w:t>
-      </w:r>
-      <w:proofErr w:type="spellEnd"/>
-      <w:r>
-        <w:t xml:space="preserve"> support for fuzz testing strategy</w:t>
-      </w:r>
-    </w:p>
-    <w:p>
-      <w:r>
-        <w:t xml:space="preserve">Wrote basic </w:t>
-      </w:r>
-      <w:proofErr w:type="gramStart"/>
-      <w:r>
-        <w:t>first class</w:t>
-      </w:r>
-      <w:proofErr w:type="gramEnd"/>
-      <w:r>
-        <w:t xml:space="preserve"> equivalence tester</w:t>
+        <w:t>Added arg/kwarg support for fuzz testing strategy</w:t>
+      </w:r>
+    </w:p>
+    <w:p>
+      <w:r>
+        <w:t>Wrote basic first class equivalence tester</w:t>
       </w:r>
     </w:p>
     <w:p>
@@ -1097,36 +578,12 @@
     </w:p>
     <w:p>
       <w:r>
-        <w:t xml:space="preserve">I have tried applying this equivalence tester to small refactors in real classes from open sources repos such as </w:t>
-      </w:r>
-      <w:proofErr w:type="spellStart"/>
-      <w:r>
-        <w:t>openai</w:t>
-      </w:r>
-      <w:proofErr w:type="spellEnd"/>
-      <w:r>
-        <w:t xml:space="preserve"> but have struggled to find working examples. My equivalence tester is quite situational. Method name/signature </w:t>
-      </w:r>
-      <w:proofErr w:type="gramStart"/>
-      <w:r>
-        <w:t>refactors</w:t>
-      </w:r>
-      <w:proofErr w:type="gramEnd"/>
-      <w:r>
-        <w:t xml:space="preserve"> and external dependencies cause issues</w:t>
-      </w:r>
-    </w:p>
-    <w:p>
-      <w:r>
-        <w:t xml:space="preserve">Tested it on two stack implementations, one that throws index error if you try to peek or pop and empty stack, and one that returns None for these operations. The </w:t>
-      </w:r>
-      <w:proofErr w:type="spellStart"/>
-      <w:r>
-        <w:t>fuzzer</w:t>
-      </w:r>
-      <w:proofErr w:type="spellEnd"/>
-      <w:r>
-        <w:t xml:space="preserve"> was able to pick up on this difference immediately</w:t>
+        <w:t>I have tried applying this equivalence tester to small refactors in real classes from open sources repos such as openai but have struggled to find working examples. My equivalence tester is quite situational. Method name/signature refactors and external dependencies cause issues</w:t>
+      </w:r>
+    </w:p>
+    <w:p>
+      <w:r>
+        <w:t>Tested it on two stack implementations, one that throws index error if you try to peek or pop and empty stack, and one that returns None for these operations. The fuzzer was able to pick up on this difference immediately</w:t>
       </w:r>
     </w:p>
     <w:p/>
@@ -1216,23 +673,7 @@
     </w:p>
     <w:p>
       <w:r>
-        <w:t xml:space="preserve">What I mean by this is that currently, my code will test two classes for equivalence and if the classes have differing methods or even method names, the code will reject them. Allow the user to define a </w:t>
-      </w:r>
-      <w:proofErr w:type="spellStart"/>
-      <w:r>
-        <w:t>json</w:t>
-      </w:r>
-      <w:proofErr w:type="spellEnd"/>
-      <w:r>
-        <w:t xml:space="preserve"> file with the specific methods from the class that they want tested so they can exclude certain methods if they </w:t>
-      </w:r>
-      <w:proofErr w:type="gramStart"/>
-      <w:r>
-        <w:t>like, and</w:t>
-      </w:r>
-      <w:proofErr w:type="gramEnd"/>
-      <w:r>
-        <w:t xml:space="preserve"> optionally allow the user to also define specifically what arguments each method should be tested with.</w:t>
+        <w:t>What I mean by this is that currently, my code will test two classes for equivalence and if the classes have differing methods or even method names, the code will reject them. Allow the user to define a json file with the specific methods from the class that they want tested so they can exclude certain methods if they like, and optionally allow the user to also define specifically what arguments each method should be tested with.</w:t>
       </w:r>
     </w:p>
     <w:p/>
@@ -1273,15 +714,7 @@
       </w:r>
       <w:r>
         <w:lastRenderedPageBreak/>
-        <w:t xml:space="preserve">duplicates, removing the need to fuzz both </w:t>
-      </w:r>
-      <w:proofErr w:type="spellStart"/>
-      <w:r>
-        <w:t>funcs</w:t>
-      </w:r>
-      <w:proofErr w:type="spellEnd"/>
-      <w:r>
-        <w:t>. Useful in practice for speeding up a common case</w:t>
+        <w:t>duplicates, removing the need to fuzz both funcs. Useful in practice for speeding up a common case</w:t>
       </w:r>
     </w:p>
     <w:p>
@@ -1293,15 +726,7 @@
         </w:numPr>
       </w:pPr>
       <w:r>
-        <w:t xml:space="preserve">Filter out </w:t>
-      </w:r>
-      <w:proofErr w:type="spellStart"/>
-      <w:r>
-        <w:t>funcs</w:t>
-      </w:r>
-      <w:proofErr w:type="spellEnd"/>
-      <w:r>
-        <w:t xml:space="preserve"> with no parameters and return values</w:t>
+        <w:t>Filter out funcs with no parameters and return values</w:t>
       </w:r>
     </w:p>
     <w:p>
@@ -1313,15 +738,7 @@
         </w:numPr>
       </w:pPr>
       <w:r>
-        <w:t xml:space="preserve">Possibly filter out </w:t>
-      </w:r>
-      <w:proofErr w:type="spellStart"/>
-      <w:r>
-        <w:t>funcs</w:t>
-      </w:r>
-      <w:proofErr w:type="spellEnd"/>
-      <w:r>
-        <w:t xml:space="preserve"> that invoke external classes or methods</w:t>
+        <w:t>Possibly filter out funcs that invoke external classes or methods</w:t>
       </w:r>
     </w:p>
     <w:p>
@@ -1333,15 +750,7 @@
         </w:numPr>
       </w:pPr>
       <w:r>
-        <w:t xml:space="preserve">They use </w:t>
-      </w:r>
-      <w:proofErr w:type="spellStart"/>
-      <w:r>
-        <w:t>pynguin</w:t>
-      </w:r>
-      <w:proofErr w:type="spellEnd"/>
-      <w:r>
-        <w:t xml:space="preserve"> which is a test generation framework that does not use fuzz testing</w:t>
+        <w:t>They use pynguin which is a test generation framework that does not use fuzz testing</w:t>
       </w:r>
     </w:p>
     <w:p>
@@ -1361,15 +770,7 @@
     </w:p>
     <w:p>
       <w:r>
-        <w:t xml:space="preserve">What if u have a class with 1 </w:t>
-      </w:r>
-      <w:proofErr w:type="gramStart"/>
-      <w:r>
-        <w:t>methods</w:t>
-      </w:r>
-      <w:proofErr w:type="gramEnd"/>
-      <w:r>
-        <w:t>, a factory method which gives u back 3 methods</w:t>
+        <w:t>What if u have a class with 1 methods, a factory method which gives u back 3 methods</w:t>
       </w:r>
     </w:p>
     <w:p>
@@ -1402,29 +803,13 @@
     </w:p>
     <w:p>
       <w:r>
-        <w:t xml:space="preserve">could instead go more practical, targeting </w:t>
-      </w:r>
-      <w:proofErr w:type="spellStart"/>
-      <w:r>
-        <w:t>datastructure</w:t>
-      </w:r>
-      <w:proofErr w:type="spellEnd"/>
-      <w:r>
-        <w:t xml:space="preserve"> implementations online</w:t>
+        <w:t>could instead go more practical, targeting datastructure implementations online</w:t>
       </w:r>
     </w:p>
     <w:p/>
     <w:p>
       <w:r>
-        <w:t xml:space="preserve">For function-function verification: I am currently implementing the case where both functions return (create) a new function. In this case I want to then perform the same function-function verification on these two new returned functions. The problem is the </w:t>
-      </w:r>
-      <w:proofErr w:type="spellStart"/>
-      <w:r>
-        <w:t>hypofuzz</w:t>
-      </w:r>
-      <w:proofErr w:type="spellEnd"/>
-      <w:r>
-        <w:t xml:space="preserve"> does not exactly allow for a recursive implementation like this. </w:t>
+        <w:t xml:space="preserve">For function-function verification: I am currently implementing the case where both functions return (create) a new function. In this case I want to then perform the same function-function verification on these two new returned functions. The problem is the hypofuzz does not exactly allow for a recursive implementation like this. </w:t>
       </w:r>
     </w:p>
     <w:p>
@@ -1469,37 +854,7 @@
         <w:rPr>
           <w:iCs/>
         </w:rPr>
-        <w:t xml:space="preserve">Other than this issue, another issue is trying to reason with functions that take callable parameters. </w:t>
-      </w:r>
-      <w:proofErr w:type="spellStart"/>
-      <w:proofErr w:type="gramStart"/>
-      <w:r>
-        <w:rPr>
-          <w:iCs/>
-        </w:rPr>
-        <w:t>Cant</w:t>
-      </w:r>
-      <w:proofErr w:type="spellEnd"/>
-      <w:proofErr w:type="gramEnd"/>
-      <w:r>
-        <w:rPr>
-          <w:iCs/>
-        </w:rPr>
-        <w:t xml:space="preserve"> exactly fuzz a function as an input so </w:t>
-      </w:r>
-      <w:proofErr w:type="spellStart"/>
-      <w:r>
-        <w:rPr>
-          <w:iCs/>
-        </w:rPr>
-        <w:t>im</w:t>
-      </w:r>
-      <w:proofErr w:type="spellEnd"/>
-      <w:r>
-        <w:rPr>
-          <w:iCs/>
-        </w:rPr>
-        <w:t xml:space="preserve"> not sure what to do here</w:t>
+        <w:t>Other than this issue, another issue is trying to reason with functions that take callable parameters. Cant exactly fuzz a function as an input so im not sure what to do here</w:t>
       </w:r>
       <w:r>
         <w:rPr>
@@ -1567,138 +922,46 @@
         <w:rPr>
           <w:iCs/>
         </w:rPr>
-        <w:t xml:space="preserve">Using universal strategy + dummy functions (the testing framework doesn’t know that the function </w:t>
-      </w:r>
-      <w:proofErr w:type="spellStart"/>
-      <w:r>
-        <w:rPr>
-          <w:iCs/>
-        </w:rPr>
-        <w:t>arg</w:t>
-      </w:r>
-      <w:proofErr w:type="spellEnd"/>
-      <w:r>
-        <w:rPr>
-          <w:iCs/>
-        </w:rPr>
-        <w:t xml:space="preserve"> is necessarily </w:t>
-      </w:r>
-      <w:proofErr w:type="gramStart"/>
-      <w:r>
-        <w:rPr>
-          <w:iCs/>
-        </w:rPr>
-        <w:t>callable</w:t>
-      </w:r>
-      <w:proofErr w:type="gramEnd"/>
-      <w:r>
-        <w:rPr>
-          <w:iCs/>
-        </w:rPr>
-        <w:t xml:space="preserve"> so it uses universal strategy) it takes 11 minutes to find the difference in </w:t>
-      </w:r>
-      <w:proofErr w:type="spellStart"/>
-      <w:r>
-        <w:rPr>
-          <w:iCs/>
-        </w:rPr>
-        <w:t>call_nested_param_ineq</w:t>
-      </w:r>
-      <w:proofErr w:type="spellEnd"/>
-      <w:r>
-        <w:rPr>
-          <w:iCs/>
-        </w:rPr>
-        <w:t xml:space="preserve">. Chances are, with type annotations this will be a bit faster as the tester will start passing in more callable </w:t>
-      </w:r>
-      <w:proofErr w:type="spellStart"/>
-      <w:r>
-        <w:rPr>
-          <w:iCs/>
-        </w:rPr>
-        <w:t>args</w:t>
-      </w:r>
-      <w:proofErr w:type="spellEnd"/>
-      <w:r>
-        <w:rPr>
-          <w:iCs/>
-        </w:rPr>
-        <w:t xml:space="preserve"> from the start</w:t>
-      </w:r>
-    </w:p>
-    <w:p>
-      <w:pPr>
-        <w:rPr>
-          <w:iCs/>
-        </w:rPr>
-      </w:pPr>
-      <w:r>
-        <w:rPr>
-          <w:iCs/>
-        </w:rPr>
-        <w:t xml:space="preserve">Adding a mechanism to see if an </w:t>
-      </w:r>
-      <w:proofErr w:type="spellStart"/>
-      <w:r>
-        <w:rPr>
-          <w:iCs/>
-        </w:rPr>
-        <w:t>arg</w:t>
-      </w:r>
-      <w:proofErr w:type="spellEnd"/>
-      <w:r>
-        <w:rPr>
-          <w:iCs/>
-        </w:rPr>
-        <w:t xml:space="preserve"> is “called” within a function should be </w:t>
-      </w:r>
-      <w:proofErr w:type="gramStart"/>
-      <w:r>
-        <w:rPr>
-          <w:iCs/>
-        </w:rPr>
-        <w:t>pretty easy</w:t>
-      </w:r>
-      <w:proofErr w:type="gramEnd"/>
-      <w:r>
-        <w:rPr>
-          <w:iCs/>
-        </w:rPr>
-        <w:t xml:space="preserve"> and should greatly improve time efficiency</w:t>
-      </w:r>
-    </w:p>
-    <w:p>
-      <w:pPr>
-        <w:rPr>
-          <w:iCs/>
-        </w:rPr>
-      </w:pPr>
-    </w:p>
-    <w:p>
-      <w:pPr>
-        <w:rPr>
-          <w:iCs/>
-        </w:rPr>
-      </w:pPr>
-      <w:r>
-        <w:rPr>
-          <w:iCs/>
-        </w:rPr>
-        <w:t xml:space="preserve">To be as faithful to the theory: we need to complicate/generalise </w:t>
-      </w:r>
-      <w:proofErr w:type="gramStart"/>
-      <w:r>
-        <w:rPr>
-          <w:iCs/>
-        </w:rPr>
-        <w:t>f(</w:t>
-      </w:r>
-      <w:proofErr w:type="gramEnd"/>
-      <w:r>
-        <w:rPr>
-          <w:iCs/>
-        </w:rPr>
-        <w:t>) so it can call any function it knows. Bound things, we don’t want more than 2 recursive calls, more than etc.</w:t>
+        <w:t>Using universal strategy + dummy functions (the testing framework doesn’t know that the function arg is necessarily callable so it uses universal strategy) it takes 11 minutes to find the difference in call_nested_param_ineq</w:t>
+      </w:r>
+      <w:r>
+        <w:rPr>
+          <w:iCs/>
+        </w:rPr>
+        <w:t>. Chances are, with type annotations this will be a bit faster as the tester will start passing in more callable args from the start</w:t>
+      </w:r>
+    </w:p>
+    <w:p>
+      <w:pPr>
+        <w:rPr>
+          <w:iCs/>
+        </w:rPr>
+      </w:pPr>
+      <w:r>
+        <w:rPr>
+          <w:iCs/>
+        </w:rPr>
+        <w:t>Adding a mechanism to see if an arg is “called” within a function should be pretty easy and should greatly improve time efficiency</w:t>
+      </w:r>
+    </w:p>
+    <w:p>
+      <w:pPr>
+        <w:rPr>
+          <w:iCs/>
+        </w:rPr>
+      </w:pPr>
+    </w:p>
+    <w:p>
+      <w:pPr>
+        <w:rPr>
+          <w:iCs/>
+        </w:rPr>
+      </w:pPr>
+      <w:r>
+        <w:rPr>
+          <w:iCs/>
+        </w:rPr>
+        <w:t>To be as faithful to the theory: we need to complicate/generalise f() so it can call any function it knows. Bound things, we don’t want more than 2 recursive calls, more than etc.</w:t>
       </w:r>
     </w:p>
     <w:p>
@@ -1769,48 +1032,20 @@
         <w:rPr>
           <w:iCs/>
         </w:rPr>
-        <w:t xml:space="preserve">If I have time, extend </w:t>
-      </w:r>
-      <w:proofErr w:type="gramStart"/>
-      <w:r>
-        <w:rPr>
-          <w:iCs/>
-        </w:rPr>
-        <w:t>f(</w:t>
-      </w:r>
-      <w:proofErr w:type="gramEnd"/>
-      <w:r>
-        <w:rPr>
-          <w:iCs/>
-        </w:rPr>
-        <w:t>) functions to take and return numbers</w:t>
-      </w:r>
-    </w:p>
-    <w:p>
-      <w:pPr>
-        <w:rPr>
-          <w:iCs/>
-        </w:rPr>
-      </w:pPr>
-      <w:r>
-        <w:rPr>
-          <w:iCs/>
-        </w:rPr>
-        <w:t xml:space="preserve">Then I can look at test suites, try it out in some application areas where equivalence is important, </w:t>
-      </w:r>
-      <w:proofErr w:type="gramStart"/>
-      <w:r>
-        <w:rPr>
-          <w:iCs/>
-        </w:rPr>
-        <w:t>property based</w:t>
-      </w:r>
-      <w:proofErr w:type="gramEnd"/>
-      <w:r>
-        <w:rPr>
-          <w:iCs/>
-        </w:rPr>
-        <w:t xml:space="preserve"> testing test suite and run with my pipeline.</w:t>
+        <w:t>If I have time, extend f() functions to take and return numbers</w:t>
+      </w:r>
+    </w:p>
+    <w:p>
+      <w:pPr>
+        <w:rPr>
+          <w:iCs/>
+        </w:rPr>
+      </w:pPr>
+      <w:r>
+        <w:rPr>
+          <w:iCs/>
+        </w:rPr>
+        <w:t>Then I can look at test suites, try it out in some application areas where equivalence is important, property based testing test suite and run with my pipeline.</w:t>
       </w:r>
     </w:p>
     <w:p>
@@ -1865,79 +1100,33 @@
           <w:bCs/>
           <w:iCs/>
         </w:rPr>
-        <w:t xml:space="preserve">Pass a </w:t>
-      </w:r>
-      <w:proofErr w:type="spellStart"/>
-      <w:r>
+        <w:t>Pass a datastruct library thru a mutation testing suite to see how it performs against my pipeline, try to find examples my pipeline can find that the existing suite cant</w:t>
+      </w:r>
+    </w:p>
+    <w:p>
+      <w:pPr>
         <w:rPr>
           <w:b/>
           <w:bCs/>
           <w:iCs/>
         </w:rPr>
-        <w:t>datastruct</w:t>
-      </w:r>
-      <w:proofErr w:type="spellEnd"/>
+      </w:pPr>
       <w:r>
         <w:rPr>
           <w:b/>
           <w:bCs/>
           <w:iCs/>
         </w:rPr>
-        <w:t xml:space="preserve"> library thru a mutation testing suite to see how it performs against my pipeline, try to find examples my pipeline can find that the existing suite </w:t>
-      </w:r>
-      <w:proofErr w:type="gramStart"/>
-      <w:r>
+        <w:t>Look at open source library with tests at the end</w:t>
+      </w:r>
+    </w:p>
+    <w:p>
+      <w:pPr>
         <w:rPr>
           <w:b/>
           <w:bCs/>
           <w:iCs/>
         </w:rPr>
-        <w:t>cant</w:t>
-      </w:r>
-      <w:proofErr w:type="gramEnd"/>
-    </w:p>
-    <w:p>
-      <w:pPr>
-        <w:rPr>
-          <w:b/>
-          <w:bCs/>
-          <w:iCs/>
-        </w:rPr>
-      </w:pPr>
-      <w:r>
-        <w:rPr>
-          <w:b/>
-          <w:bCs/>
-          <w:iCs/>
-        </w:rPr>
-        <w:t xml:space="preserve">Look at </w:t>
-      </w:r>
-      <w:proofErr w:type="gramStart"/>
-      <w:r>
-        <w:rPr>
-          <w:b/>
-          <w:bCs/>
-          <w:iCs/>
-        </w:rPr>
-        <w:t>open source</w:t>
-      </w:r>
-      <w:proofErr w:type="gramEnd"/>
-      <w:r>
-        <w:rPr>
-          <w:b/>
-          <w:bCs/>
-          <w:iCs/>
-        </w:rPr>
-        <w:t xml:space="preserve"> library with tests at the end</w:t>
-      </w:r>
-    </w:p>
-    <w:p>
-      <w:pPr>
-        <w:rPr>
-          <w:b/>
-          <w:bCs/>
-          <w:iCs/>
-        </w:rPr>
       </w:pPr>
     </w:p>
     <w:p>
@@ -1956,21 +1145,7 @@
         <w:rPr>
           <w:iCs/>
         </w:rPr>
-        <w:t xml:space="preserve"> </w:t>
-      </w:r>
-      <w:proofErr w:type="spellStart"/>
-      <w:r>
-        <w:rPr>
-          <w:iCs/>
-        </w:rPr>
-        <w:t>are_equivalent</w:t>
-      </w:r>
-      <w:proofErr w:type="spellEnd"/>
-      <w:r>
-        <w:rPr>
-          <w:iCs/>
-        </w:rPr>
-        <w:t xml:space="preserve"> for profiler to check that the arguments to any function called by the top level</w:t>
+        <w:t xml:space="preserve"> are_equivalent for profiler to check that the arguments to any function called by the top level</w:t>
       </w:r>
       <w:r>
         <w:rPr>
@@ -2009,21 +1184,7 @@
         <w:rPr>
           <w:iCs/>
         </w:rPr>
-        <w:t xml:space="preserve">One idea: perform static analysis on the function we are fuzzing before we fuzz it to see if it takes a function f as a param, if that function f itself takes a param. </w:t>
-      </w:r>
-      <w:proofErr w:type="gramStart"/>
-      <w:r>
-        <w:rPr>
-          <w:iCs/>
-        </w:rPr>
-        <w:t>Thus</w:t>
-      </w:r>
-      <w:proofErr w:type="gramEnd"/>
-      <w:r>
-        <w:rPr>
-          <w:iCs/>
-        </w:rPr>
-        <w:t xml:space="preserve"> we can narrow down which function fuzzing strategy to employ</w:t>
+        <w:t>One idea: perform static analysis on the function we are fuzzing before we fuzz it to see if it takes a function f as a param, if that function f itself takes a param. Thus we can narrow down which function fuzzing strategy to employ</w:t>
       </w:r>
     </w:p>
     <w:p>
@@ -2059,35 +1220,7 @@
         <w:rPr>
           <w:iCs/>
         </w:rPr>
-        <w:t xml:space="preserve">Functions f that </w:t>
-      </w:r>
-      <w:proofErr w:type="gramStart"/>
-      <w:r>
-        <w:rPr>
-          <w:iCs/>
-        </w:rPr>
-        <w:t>take</w:t>
-      </w:r>
-      <w:proofErr w:type="gramEnd"/>
-      <w:r>
-        <w:rPr>
-          <w:iCs/>
-        </w:rPr>
-        <w:t xml:space="preserve"> a single function as a param like f(h): we can check the </w:t>
-      </w:r>
-      <w:proofErr w:type="spellStart"/>
-      <w:r>
-        <w:rPr>
-          <w:iCs/>
-        </w:rPr>
-        <w:t>sig</w:t>
-      </w:r>
-      <w:proofErr w:type="spellEnd"/>
-      <w:r>
-        <w:rPr>
-          <w:iCs/>
-        </w:rPr>
-        <w:t xml:space="preserve"> of the function h given, and fuzz some input accordingly to call h with within f.</w:t>
+        <w:t>Functions f that take a single function as a param like f(h): we can check the sig of the function h given, and fuzz some input accordingly to call h with within f.</w:t>
       </w:r>
     </w:p>
     <w:p>
@@ -2133,86 +1266,22 @@
         <w:rPr>
           <w:iCs/>
         </w:rPr>
-        <w:t xml:space="preserve">If (state of </w:t>
-      </w:r>
-      <w:proofErr w:type="spellStart"/>
-      <w:r>
-        <w:rPr>
-          <w:iCs/>
-        </w:rPr>
-        <w:t>module_a</w:t>
-      </w:r>
-      <w:proofErr w:type="spellEnd"/>
-      <w:r>
-        <w:rPr>
-          <w:iCs/>
-        </w:rPr>
-        <w:t xml:space="preserve"> before running == state of </w:t>
-      </w:r>
-      <w:proofErr w:type="spellStart"/>
-      <w:r>
-        <w:rPr>
-          <w:iCs/>
-        </w:rPr>
-        <w:t>module_a</w:t>
-      </w:r>
-      <w:proofErr w:type="spellEnd"/>
-      <w:r>
-        <w:rPr>
-          <w:iCs/>
-        </w:rPr>
-        <w:t xml:space="preserve"> after n steps) !=</w:t>
+        <w:t>If (state of module_a before running == state of module_a after n steps) !=</w:t>
       </w:r>
       <w:r>
         <w:rPr>
           <w:iCs/>
         </w:rPr>
         <w:br/>
-        <w:t xml:space="preserve">   (state of </w:t>
-      </w:r>
-      <w:proofErr w:type="spellStart"/>
-      <w:r>
-        <w:rPr>
-          <w:iCs/>
-        </w:rPr>
-        <w:t>module_b</w:t>
-      </w:r>
-      <w:proofErr w:type="spellEnd"/>
-      <w:r>
-        <w:rPr>
-          <w:iCs/>
-        </w:rPr>
-        <w:t xml:space="preserve"> before running == state of </w:t>
-      </w:r>
-      <w:proofErr w:type="spellStart"/>
-      <w:r>
-        <w:rPr>
-          <w:iCs/>
-        </w:rPr>
-        <w:t>module_b</w:t>
-      </w:r>
-      <w:proofErr w:type="spellEnd"/>
-      <w:r>
-        <w:rPr>
-          <w:iCs/>
-        </w:rPr>
-        <w:t xml:space="preserve"> after n steps):</w:t>
+        <w:t xml:space="preserve">   (state of module_b before running == state of module_b after n steps):</w:t>
       </w:r>
       <w:r>
         <w:rPr>
           <w:iCs/>
         </w:rPr>
         <w:br/>
-        <w:t xml:space="preserve">   they are </w:t>
-      </w:r>
-      <w:proofErr w:type="spellStart"/>
-      <w:r>
-        <w:rPr>
-          <w:iCs/>
-        </w:rPr>
-        <w:t>inequiv</w:t>
-      </w:r>
-      <w:proofErr w:type="spellEnd"/>
+        <w:t xml:space="preserve">   they are inequiv</w:t>
+      </w:r>
       <w:r>
         <w:rPr>
           <w:iCs/>
@@ -2225,21 +1294,7 @@
           <w:iCs/>
         </w:rPr>
         <w:br/>
-        <w:t xml:space="preserve">Some examples in plain </w:t>
-      </w:r>
-      <w:proofErr w:type="spellStart"/>
-      <w:r>
-        <w:rPr>
-          <w:iCs/>
-        </w:rPr>
-        <w:t>english</w:t>
-      </w:r>
-      <w:proofErr w:type="spellEnd"/>
-      <w:r>
-        <w:rPr>
-          <w:iCs/>
-        </w:rPr>
-        <w:t xml:space="preserve"> for my own sanity: </w:t>
+        <w:t xml:space="preserve">Some examples in plain english for my own sanity: </w:t>
       </w:r>
       <w:r>
         <w:rPr>
@@ -2252,30 +1307,8 @@
           <w:iCs/>
         </w:rPr>
         <w:br/>
-        <w:t xml:space="preserve">if </w:t>
-      </w:r>
-      <w:proofErr w:type="spellStart"/>
-      <w:r>
-        <w:rPr>
-          <w:iCs/>
-        </w:rPr>
-        <w:t>module_a</w:t>
-      </w:r>
-      <w:proofErr w:type="spellEnd"/>
-      <w:r>
-        <w:rPr>
-          <w:iCs/>
-        </w:rPr>
-        <w:t xml:space="preserve"> alters a global variable x after running n steps, but </w:t>
-      </w:r>
-      <w:proofErr w:type="spellStart"/>
-      <w:r>
-        <w:rPr>
-          <w:iCs/>
-        </w:rPr>
-        <w:t>module_b</w:t>
-      </w:r>
-      <w:proofErr w:type="spellEnd"/>
+        <w:t>if module_a alters a global variable x after running n steps, but module_b</w:t>
+      </w:r>
       <w:r>
         <w:rPr>
           <w:iCs/>
@@ -2307,35 +1340,7 @@
           <w:iCs/>
         </w:rPr>
         <w:br/>
-        <w:t xml:space="preserve">if </w:t>
-      </w:r>
-      <w:proofErr w:type="spellStart"/>
-      <w:r>
-        <w:rPr>
-          <w:iCs/>
-        </w:rPr>
-        <w:t>module_a</w:t>
-      </w:r>
-      <w:proofErr w:type="spellEnd"/>
-      <w:r>
-        <w:rPr>
-          <w:iCs/>
-        </w:rPr>
-        <w:t xml:space="preserve"> contains the definition of a global variable x, but it does not change, and </w:t>
-      </w:r>
-      <w:proofErr w:type="spellStart"/>
-      <w:r>
-        <w:rPr>
-          <w:iCs/>
-        </w:rPr>
-        <w:t>module_b</w:t>
-      </w:r>
-      <w:proofErr w:type="spellEnd"/>
-      <w:r>
-        <w:rPr>
-          <w:iCs/>
-        </w:rPr>
-        <w:t xml:space="preserve"> does not</w:t>
+        <w:t>if module_a contains the definition of a global variable x, but it does not change, and module_b does not</w:t>
       </w:r>
       <w:r>
         <w:rPr>
@@ -2362,35 +1367,7 @@
           <w:iCs/>
         </w:rPr>
         <w:br/>
-        <w:t xml:space="preserve">if </w:t>
-      </w:r>
-      <w:proofErr w:type="spellStart"/>
-      <w:r>
-        <w:rPr>
-          <w:iCs/>
-        </w:rPr>
-        <w:t>module_a</w:t>
-      </w:r>
-      <w:proofErr w:type="spellEnd"/>
-      <w:r>
-        <w:rPr>
-          <w:iCs/>
-        </w:rPr>
-        <w:t xml:space="preserve"> alters a global string variable s after running n steps, but </w:t>
-      </w:r>
-      <w:proofErr w:type="spellStart"/>
-      <w:r>
-        <w:rPr>
-          <w:iCs/>
-        </w:rPr>
-        <w:t>module_b</w:t>
-      </w:r>
-      <w:proofErr w:type="spellEnd"/>
-      <w:r>
-        <w:rPr>
-          <w:iCs/>
-        </w:rPr>
-        <w:t xml:space="preserve"> alters a global int</w:t>
+        <w:t>if module_a alters a global string variable s after running n steps, but module_b alters a global int</w:t>
       </w:r>
       <w:r>
         <w:rPr>
@@ -2526,1295 +1503,1085 @@
           <w:bCs/>
           <w:iCs/>
         </w:rPr>
-        <w:t xml:space="preserve">Running </w:t>
-      </w:r>
-      <w:proofErr w:type="spellStart"/>
-      <w:r>
+        <w:t xml:space="preserve">Running mutmut on requests: </w:t>
+      </w:r>
+    </w:p>
+    <w:p>
+      <w:pPr>
+        <w:rPr>
+          <w:iCs/>
+        </w:rPr>
+      </w:pPr>
+      <w:r>
+        <w:rPr>
+          <w:iCs/>
+        </w:rPr>
+        <w:t>Running mutation testing</w:t>
+      </w:r>
+    </w:p>
+    <w:p>
+      <w:pPr>
+        <w:rPr>
+          <w:iCs/>
+        </w:rPr>
+      </w:pPr>
+      <w:r>
+        <w:rPr>
+          <w:rFonts w:ascii="Segoe UI Symbol" w:hAnsi="Segoe UI Symbol" w:cs="Segoe UI Symbol"/>
+          <w:iCs/>
+        </w:rPr>
+        <w:t>⠧</w:t>
+      </w:r>
+      <w:r>
+        <w:rPr>
+          <w:iCs/>
+        </w:rPr>
+        <w:t xml:space="preserve"> 3673/3673  </w:t>
+      </w:r>
+      <w:r>
+        <w:rPr>
+          <w:rFonts w:ascii="Segoe UI Emoji" w:hAnsi="Segoe UI Emoji" w:cs="Segoe UI Emoji"/>
+          <w:iCs/>
+        </w:rPr>
+        <w:t>🎉</w:t>
+      </w:r>
+      <w:r>
+        <w:rPr>
+          <w:iCs/>
+        </w:rPr>
+        <w:t xml:space="preserve"> 2241 </w:t>
+      </w:r>
+      <w:r>
+        <w:rPr>
+          <w:rFonts w:ascii="Aptos" w:hAnsi="Aptos" w:cs="Aptos"/>
+          <w:iCs/>
+        </w:rPr>
+        <w:t>🫥</w:t>
+      </w:r>
+      <w:r>
+        <w:rPr>
+          <w:iCs/>
+        </w:rPr>
+        <w:t xml:space="preserve"> 337  </w:t>
+      </w:r>
+      <w:r>
+        <w:rPr>
+          <w:rFonts w:ascii="Segoe UI Emoji" w:hAnsi="Segoe UI Emoji" w:cs="Segoe UI Emoji"/>
+          <w:iCs/>
+        </w:rPr>
+        <w:t>⏰</w:t>
+      </w:r>
+      <w:r>
+        <w:rPr>
+          <w:iCs/>
+        </w:rPr>
+        <w:t xml:space="preserve"> 453  </w:t>
+      </w:r>
+      <w:r>
+        <w:rPr>
+          <w:rFonts w:ascii="Segoe UI Emoji" w:hAnsi="Segoe UI Emoji" w:cs="Segoe UI Emoji"/>
+          <w:iCs/>
+        </w:rPr>
+        <w:t>🤔</w:t>
+      </w:r>
+      <w:r>
+        <w:rPr>
+          <w:iCs/>
+        </w:rPr>
+        <w:t xml:space="preserve"> 0  </w:t>
+      </w:r>
+      <w:r>
+        <w:rPr>
+          <w:rFonts w:ascii="Segoe UI Emoji" w:hAnsi="Segoe UI Emoji" w:cs="Segoe UI Emoji"/>
+          <w:iCs/>
+        </w:rPr>
+        <w:t>🙁</w:t>
+      </w:r>
+      <w:r>
+        <w:rPr>
+          <w:iCs/>
+        </w:rPr>
+        <w:t xml:space="preserve"> 642  </w:t>
+      </w:r>
+      <w:r>
+        <w:rPr>
+          <w:rFonts w:ascii="Segoe UI Emoji" w:hAnsi="Segoe UI Emoji" w:cs="Segoe UI Emoji"/>
+          <w:iCs/>
+        </w:rPr>
+        <w:t>🔇</w:t>
+      </w:r>
+      <w:r>
+        <w:rPr>
+          <w:iCs/>
+        </w:rPr>
+        <w:t xml:space="preserve"> 0</w:t>
+      </w:r>
+    </w:p>
+    <w:p>
+      <w:pPr>
+        <w:rPr>
+          <w:iCs/>
+        </w:rPr>
+      </w:pPr>
+      <w:r>
+        <w:rPr>
+          <w:iCs/>
+        </w:rPr>
+        <w:t>Mutants identified: 347/1449</w:t>
+      </w:r>
+      <w:r>
+        <w:rPr>
+          <w:iCs/>
+        </w:rPr>
+        <w:t xml:space="preserve"> – not sure why not all mutants were hit</w:t>
+      </w:r>
+    </w:p>
+    <w:p>
+      <w:pPr>
+        <w:rPr>
+          <w:iCs/>
+        </w:rPr>
+      </w:pPr>
+      <w:r>
+        <w:rPr>
+          <w:iCs/>
+        </w:rPr>
+        <w:t>Completed in 13372.785392045975 seconds.</w:t>
+      </w:r>
+      <w:r>
+        <w:rPr>
+          <w:iCs/>
+        </w:rPr>
+        <w:t xml:space="preserve"> (3.7 hrs)</w:t>
+      </w:r>
+    </w:p>
+    <w:p>
+      <w:pPr>
+        <w:rPr>
+          <w:iCs/>
+        </w:rPr>
+      </w:pPr>
+    </w:p>
+    <w:p>
+      <w:pPr>
+        <w:rPr>
+          <w:iCs/>
+        </w:rPr>
+      </w:pPr>
+      <w:r>
+        <w:rPr>
+          <w:iCs/>
+        </w:rPr>
+        <w:t>After adding class based stuff</w:t>
+      </w:r>
+    </w:p>
+    <w:p>
+      <w:pPr>
+        <w:rPr>
+          <w:iCs/>
+        </w:rPr>
+      </w:pPr>
+      <w:r>
+        <w:rPr>
+          <w:iCs/>
+        </w:rPr>
+        <w:t>Mutants identified: 917/4467</w:t>
+      </w:r>
+      <w:r>
+        <w:rPr>
+          <w:iCs/>
+        </w:rPr>
+        <w:t xml:space="preserve"> in 6.8 hrs (but I suspect this may be over eager)</w:t>
+      </w:r>
+    </w:p>
+    <w:p>
+      <w:pPr>
+        <w:rPr>
+          <w:iCs/>
+        </w:rPr>
+      </w:pPr>
+      <w:r>
+        <w:rPr>
+          <w:iCs/>
+        </w:rPr>
+        <w:t>537/4467</w:t>
+      </w:r>
+      <w:r>
+        <w:rPr>
+          <w:iCs/>
+        </w:rPr>
+        <w:t xml:space="preserve"> after fixing it in 7.4 hrs</w:t>
+      </w:r>
+    </w:p>
+    <w:p>
+      <w:pPr>
+        <w:rPr>
+          <w:iCs/>
+        </w:rPr>
+      </w:pPr>
+    </w:p>
+    <w:p>
+      <w:pPr>
+        <w:rPr>
+          <w:iCs/>
+        </w:rPr>
+      </w:pPr>
+      <w:r>
+        <w:rPr>
+          <w:iCs/>
+        </w:rPr>
+        <w:t>Ran it on a library of data structures:</w:t>
+      </w:r>
+    </w:p>
+    <w:p>
+      <w:pPr>
+        <w:rPr>
+          <w:iCs/>
+        </w:rPr>
+      </w:pPr>
+      <w:r>
+        <w:rPr>
+          <w:iCs/>
+        </w:rPr>
+        <w:t>https://github.com/clair3st/Data-Structures/tree/master</w:t>
+      </w:r>
+    </w:p>
+    <w:p>
+      <w:pPr>
+        <w:rPr>
+          <w:iCs/>
+        </w:rPr>
+      </w:pPr>
+      <w:r>
+        <w:rPr>
+          <w:rFonts w:ascii="Segoe UI Symbol" w:hAnsi="Segoe UI Symbol" w:cs="Segoe UI Symbol"/>
+          <w:iCs/>
+        </w:rPr>
+        <w:t>⠸</w:t>
+      </w:r>
+      <w:r>
+        <w:rPr>
+          <w:iCs/>
+        </w:rPr>
+        <w:t xml:space="preserve"> 445/445  </w:t>
+      </w:r>
+      <w:r>
+        <w:rPr>
+          <w:rFonts w:ascii="Segoe UI Emoji" w:hAnsi="Segoe UI Emoji" w:cs="Segoe UI Emoji"/>
+          <w:iCs/>
+        </w:rPr>
+        <w:t>🎉</w:t>
+      </w:r>
+      <w:r>
+        <w:rPr>
+          <w:iCs/>
+        </w:rPr>
+        <w:t xml:space="preserve"> 383 </w:t>
+      </w:r>
+      <w:r>
+        <w:rPr>
+          <w:rFonts w:ascii="Aptos" w:hAnsi="Aptos" w:cs="Aptos"/>
+          <w:iCs/>
+        </w:rPr>
+        <w:t>🫥</w:t>
+      </w:r>
+      <w:r>
+        <w:rPr>
+          <w:iCs/>
+        </w:rPr>
+        <w:t xml:space="preserve"> 4  </w:t>
+      </w:r>
+      <w:r>
+        <w:rPr>
+          <w:rFonts w:ascii="Segoe UI Emoji" w:hAnsi="Segoe UI Emoji" w:cs="Segoe UI Emoji"/>
+          <w:iCs/>
+        </w:rPr>
+        <w:t>⏰</w:t>
+      </w:r>
+      <w:r>
+        <w:rPr>
+          <w:iCs/>
+        </w:rPr>
+        <w:t xml:space="preserve"> 10  </w:t>
+      </w:r>
+      <w:r>
+        <w:rPr>
+          <w:rFonts w:ascii="Segoe UI Emoji" w:hAnsi="Segoe UI Emoji" w:cs="Segoe UI Emoji"/>
+          <w:iCs/>
+        </w:rPr>
+        <w:t>🤔</w:t>
+      </w:r>
+      <w:r>
+        <w:rPr>
+          <w:iCs/>
+        </w:rPr>
+        <w:t xml:space="preserve"> 0  </w:t>
+      </w:r>
+      <w:r>
+        <w:rPr>
+          <w:rFonts w:ascii="Segoe UI Emoji" w:hAnsi="Segoe UI Emoji" w:cs="Segoe UI Emoji"/>
+          <w:iCs/>
+        </w:rPr>
+        <w:t>🙁</w:t>
+      </w:r>
+      <w:r>
+        <w:rPr>
+          <w:iCs/>
+        </w:rPr>
+        <w:t xml:space="preserve"> 48  </w:t>
+      </w:r>
+      <w:r>
+        <w:rPr>
+          <w:rFonts w:ascii="Segoe UI Emoji" w:hAnsi="Segoe UI Emoji" w:cs="Segoe UI Emoji"/>
+          <w:iCs/>
+        </w:rPr>
+        <w:t>🔇</w:t>
+      </w:r>
+      <w:r>
+        <w:rPr>
+          <w:iCs/>
+        </w:rPr>
+        <w:t xml:space="preserve"> 0</w:t>
+      </w:r>
+    </w:p>
+    <w:p>
+      <w:pPr>
+        <w:rPr>
+          <w:iCs/>
+        </w:rPr>
+      </w:pPr>
+      <w:r>
+        <w:rPr>
+          <w:iCs/>
+        </w:rPr>
+        <w:t>11</w:t>
+      </w:r>
+      <w:r>
+        <w:rPr>
+          <w:iCs/>
+        </w:rPr>
+        <w:t>8/445</w:t>
+      </w:r>
+    </w:p>
+    <w:p>
+      <w:pPr>
+        <w:rPr>
+          <w:iCs/>
+        </w:rPr>
+      </w:pPr>
+      <w:r>
+        <w:rPr>
+          <w:iCs/>
+        </w:rPr>
+        <w:t>270/445 after adding more class based stuff</w:t>
+      </w:r>
+    </w:p>
+    <w:p>
+      <w:pPr>
+        <w:rPr>
+          <w:iCs/>
+        </w:rPr>
+      </w:pPr>
+      <w:r>
+        <w:rPr>
+          <w:iCs/>
+        </w:rPr>
+        <w:t>353/445 after 2.5 hrs with basic dummy object</w:t>
+      </w:r>
+    </w:p>
+    <w:p>
+      <w:pPr>
+        <w:rPr>
+          <w:iCs/>
+        </w:rPr>
+      </w:pPr>
+      <w:r>
+        <w:rPr>
+          <w:iCs/>
+        </w:rPr>
+        <w:t>367/445 best so far</w:t>
+      </w:r>
+    </w:p>
+    <w:p>
+      <w:pPr>
+        <w:rPr>
+          <w:iCs/>
+        </w:rPr>
+      </w:pPr>
+      <w:r>
+        <w:rPr>
+          <w:iCs/>
+        </w:rPr>
+        <w:t>346</w:t>
+      </w:r>
+      <w:r>
+        <w:rPr>
+          <w:iCs/>
+        </w:rPr>
+        <w:t xml:space="preserve"> – look at what I caught that the suite </w:t>
+      </w:r>
+      <w:r>
+        <w:rPr>
+          <w:iCs/>
+        </w:rPr>
+        <w:t>didn’t</w:t>
+      </w:r>
+    </w:p>
+    <w:p>
+      <w:pPr>
+        <w:rPr>
+          <w:iCs/>
+        </w:rPr>
+      </w:pPr>
+      <w:r>
+        <w:rPr>
+          <w:iCs/>
+        </w:rPr>
+        <w:t>Plain hypothesis: 316</w:t>
+      </w:r>
+    </w:p>
+    <w:p>
+      <w:pPr>
+        <w:rPr>
+          <w:iCs/>
+        </w:rPr>
+      </w:pPr>
+      <w:r>
+        <w:rPr>
+          <w:iCs/>
+        </w:rPr>
+        <w:t>Just refactored data structures:</w:t>
+      </w:r>
+    </w:p>
+    <w:p>
+      <w:pPr>
+        <w:rPr>
+          <w:iCs/>
+        </w:rPr>
+      </w:pPr>
+      <w:r>
+        <w:rPr>
+          <w:rFonts w:ascii="Segoe UI Symbol" w:hAnsi="Segoe UI Symbol" w:cs="Segoe UI Symbol"/>
+          <w:iCs/>
+        </w:rPr>
+        <w:t>⠸</w:t>
+      </w:r>
+      <w:r>
+        <w:rPr>
+          <w:iCs/>
+        </w:rPr>
+        <w:t xml:space="preserve"> 527/527  </w:t>
+      </w:r>
+      <w:r>
+        <w:rPr>
+          <w:rFonts w:ascii="Segoe UI Emoji" w:hAnsi="Segoe UI Emoji" w:cs="Segoe UI Emoji"/>
+          <w:iCs/>
+        </w:rPr>
+        <w:t>🎉</w:t>
+      </w:r>
+      <w:r>
+        <w:rPr>
+          <w:iCs/>
+        </w:rPr>
+        <w:t xml:space="preserve"> 425 </w:t>
+      </w:r>
+      <w:r>
+        <w:rPr>
+          <w:rFonts w:ascii="Aptos" w:hAnsi="Aptos" w:cs="Aptos"/>
+          <w:iCs/>
+        </w:rPr>
+        <w:t>🫥</w:t>
+      </w:r>
+      <w:r>
+        <w:rPr>
+          <w:iCs/>
+        </w:rPr>
+        <w:t xml:space="preserve"> 6  </w:t>
+      </w:r>
+      <w:r>
+        <w:rPr>
+          <w:rFonts w:ascii="Segoe UI Emoji" w:hAnsi="Segoe UI Emoji" w:cs="Segoe UI Emoji"/>
+          <w:iCs/>
+        </w:rPr>
+        <w:t>⏰</w:t>
+      </w:r>
+      <w:r>
+        <w:rPr>
+          <w:iCs/>
+        </w:rPr>
+        <w:t xml:space="preserve"> 2  </w:t>
+      </w:r>
+      <w:r>
+        <w:rPr>
+          <w:rFonts w:ascii="Segoe UI Emoji" w:hAnsi="Segoe UI Emoji" w:cs="Segoe UI Emoji"/>
+          <w:iCs/>
+        </w:rPr>
+        <w:t>🤔</w:t>
+      </w:r>
+      <w:r>
+        <w:rPr>
+          <w:iCs/>
+        </w:rPr>
+        <w:t xml:space="preserve"> 0  </w:t>
+      </w:r>
+      <w:r>
+        <w:rPr>
+          <w:rFonts w:ascii="Segoe UI Emoji" w:hAnsi="Segoe UI Emoji" w:cs="Segoe UI Emoji"/>
+          <w:iCs/>
+        </w:rPr>
+        <w:t>🙁</w:t>
+      </w:r>
+      <w:r>
+        <w:rPr>
+          <w:iCs/>
+        </w:rPr>
+        <w:t xml:space="preserve"> 94  </w:t>
+      </w:r>
+      <w:r>
+        <w:rPr>
+          <w:rFonts w:ascii="Segoe UI Emoji" w:hAnsi="Segoe UI Emoji" w:cs="Segoe UI Emoji"/>
+          <w:iCs/>
+        </w:rPr>
+        <w:t>🔇</w:t>
+      </w:r>
+      <w:r>
+        <w:rPr>
+          <w:iCs/>
+        </w:rPr>
+        <w:t xml:space="preserve"> 0</w:t>
+      </w:r>
+    </w:p>
+    <w:p>
+      <w:pPr>
+        <w:rPr>
+          <w:iCs/>
+        </w:rPr>
+      </w:pPr>
+      <w:r>
+        <w:rPr>
+          <w:iCs/>
+        </w:rPr>
+        <w:t>370/527 mutants killed</w:t>
+      </w:r>
+      <w:r>
+        <w:rPr>
+          <w:iCs/>
+        </w:rPr>
+        <w:t xml:space="preserve"> – 244 with plain hypothesis</w:t>
+      </w:r>
+    </w:p>
+    <w:p>
+      <w:pPr>
+        <w:rPr>
+          <w:iCs/>
+        </w:rPr>
+      </w:pPr>
+    </w:p>
+    <w:p>
+      <w:pPr>
+        <w:rPr>
+          <w:iCs/>
+        </w:rPr>
+      </w:pPr>
+      <w:r>
+        <w:rPr>
+          <w:iCs/>
+        </w:rPr>
+        <w:t>With the following addition to pyproject.toml</w:t>
+      </w:r>
+    </w:p>
+    <w:p>
+      <w:pPr>
+        <w:rPr>
+          <w:iCs/>
+        </w:rPr>
+      </w:pPr>
+      <w:r>
+        <w:rPr>
+          <w:iCs/>
+        </w:rPr>
+        <w:t>[tool.mutmut]</w:t>
+      </w:r>
+      <w:r>
+        <w:rPr>
+          <w:iCs/>
+        </w:rPr>
+        <w:br/>
+        <w:t>pytest_add_cli_args = ["-k", "not test_env_cert_bundles and not test_different_connection_pool_for_tls_settings_verify_bundle_unexpired_cert"]</w:t>
+      </w:r>
+    </w:p>
+    <w:p>
+      <w:pPr>
+        <w:rPr>
+          <w:iCs/>
+        </w:rPr>
+      </w:pPr>
+    </w:p>
+    <w:p>
+      <w:pPr>
+        <w:rPr>
+          <w:iCs/>
+        </w:rPr>
+      </w:pPr>
+      <w:r>
+        <w:rPr>
+          <w:iCs/>
+        </w:rPr>
+        <w:t>Running mutation testing</w:t>
+      </w:r>
+    </w:p>
+    <w:p>
+      <w:pPr>
+        <w:rPr>
+          <w:iCs/>
+        </w:rPr>
+      </w:pPr>
+      <w:r>
+        <w:rPr>
+          <w:rFonts w:ascii="Segoe UI Symbol" w:hAnsi="Segoe UI Symbol" w:cs="Segoe UI Symbol"/>
+          <w:iCs/>
+        </w:rPr>
+        <w:t>⠴</w:t>
+      </w:r>
+      <w:r>
+        <w:rPr>
+          <w:iCs/>
+        </w:rPr>
+        <w:t xml:space="preserve"> 2250/2250  </w:t>
+      </w:r>
+      <w:r>
+        <w:rPr>
+          <w:rFonts w:ascii="Segoe UI Emoji" w:hAnsi="Segoe UI Emoji" w:cs="Segoe UI Emoji"/>
+          <w:iCs/>
+        </w:rPr>
+        <w:t>🎉</w:t>
+      </w:r>
+      <w:r>
+        <w:rPr>
+          <w:iCs/>
+        </w:rPr>
+        <w:t xml:space="preserve"> 1796 </w:t>
+      </w:r>
+      <w:r>
+        <w:rPr>
+          <w:rFonts w:ascii="Aptos" w:hAnsi="Aptos" w:cs="Aptos"/>
+          <w:iCs/>
+        </w:rPr>
+        <w:t>🫥</w:t>
+      </w:r>
+      <w:r>
+        <w:rPr>
+          <w:iCs/>
+        </w:rPr>
+        <w:t xml:space="preserve"> 13  </w:t>
+      </w:r>
+      <w:r>
+        <w:rPr>
+          <w:rFonts w:ascii="Segoe UI Emoji" w:hAnsi="Segoe UI Emoji" w:cs="Segoe UI Emoji"/>
+          <w:iCs/>
+        </w:rPr>
+        <w:t>⏰</w:t>
+      </w:r>
+      <w:r>
+        <w:rPr>
+          <w:iCs/>
+        </w:rPr>
+        <w:t xml:space="preserve"> 294  </w:t>
+      </w:r>
+      <w:r>
+        <w:rPr>
+          <w:rFonts w:ascii="Segoe UI Emoji" w:hAnsi="Segoe UI Emoji" w:cs="Segoe UI Emoji"/>
+          <w:iCs/>
+        </w:rPr>
+        <w:t>🤔</w:t>
+      </w:r>
+      <w:r>
+        <w:rPr>
+          <w:iCs/>
+        </w:rPr>
+        <w:t xml:space="preserve"> 0  </w:t>
+      </w:r>
+      <w:r>
+        <w:rPr>
+          <w:rFonts w:ascii="Segoe UI Emoji" w:hAnsi="Segoe UI Emoji" w:cs="Segoe UI Emoji"/>
+          <w:iCs/>
+        </w:rPr>
+        <w:t>🙁</w:t>
+      </w:r>
+      <w:r>
+        <w:rPr>
+          <w:iCs/>
+        </w:rPr>
+        <w:t xml:space="preserve"> 147  </w:t>
+      </w:r>
+      <w:r>
+        <w:rPr>
+          <w:rFonts w:ascii="Segoe UI Emoji" w:hAnsi="Segoe UI Emoji" w:cs="Segoe UI Emoji"/>
+          <w:iCs/>
+        </w:rPr>
+        <w:t>🔇</w:t>
+      </w:r>
+      <w:r>
+        <w:rPr>
+          <w:iCs/>
+        </w:rPr>
+        <w:t xml:space="preserve"> 0  </w:t>
+      </w:r>
+      <w:r>
+        <w:rPr>
+          <w:rFonts w:ascii="Segoe UI Emoji" w:hAnsi="Segoe UI Emoji" w:cs="Segoe UI Emoji"/>
+          <w:iCs/>
+        </w:rPr>
+        <w:t>🧙</w:t>
+      </w:r>
+      <w:r>
+        <w:rPr>
+          <w:iCs/>
+        </w:rPr>
+        <w:t xml:space="preserve"> 0</w:t>
+      </w:r>
+    </w:p>
+    <w:p>
+      <w:pPr>
+        <w:rPr>
+          <w:iCs/>
+        </w:rPr>
+      </w:pPr>
+      <w:r>
+        <w:rPr>
+          <w:iCs/>
+        </w:rPr>
+        <w:t>For SortedContainers repo</w:t>
+      </w:r>
+    </w:p>
+    <w:p>
+      <w:pPr>
+        <w:rPr>
+          <w:iCs/>
+        </w:rPr>
+      </w:pPr>
+    </w:p>
+    <w:p>
+      <w:pPr>
+        <w:rPr>
+          <w:iCs/>
+        </w:rPr>
+      </w:pPr>
+      <w:r>
+        <w:rPr>
+          <w:iCs/>
+        </w:rPr>
+        <w:t>Additions:</w:t>
+      </w:r>
+    </w:p>
+    <w:p>
+      <w:pPr>
+        <w:rPr>
+          <w:iCs/>
+        </w:rPr>
+      </w:pPr>
+      <w:r>
+        <w:rPr>
+          <w:iCs/>
+        </w:rPr>
+        <w:t>Tested more hobbit suite</w:t>
+      </w:r>
+    </w:p>
+    <w:p>
+      <w:pPr>
+        <w:rPr>
+          <w:iCs/>
+        </w:rPr>
+      </w:pPr>
+      <w:r>
+        <w:rPr>
+          <w:iCs/>
+        </w:rPr>
+        <w:t>Wrote program equivalence</w:t>
+      </w:r>
+    </w:p>
+    <w:p>
+      <w:pPr>
+        <w:rPr>
+          <w:iCs/>
+        </w:rPr>
+      </w:pPr>
+      <w:r>
+        <w:rPr>
+          <w:iCs/>
+        </w:rPr>
+        <w:t>Wrote script to run entire hobbit suite</w:t>
+      </w:r>
+    </w:p>
+    <w:p>
+      <w:pPr>
+        <w:rPr>
+          <w:iCs/>
+        </w:rPr>
+      </w:pPr>
+      <w:r>
+        <w:rPr>
+          <w:iCs/>
+        </w:rPr>
+        <w:t>Functions can alter  global state</w:t>
+      </w:r>
+    </w:p>
+    <w:p>
+      <w:pPr>
+        <w:rPr>
+          <w:iCs/>
+        </w:rPr>
+      </w:pPr>
+      <w:r>
+        <w:rPr>
+          <w:iCs/>
+        </w:rPr>
+        <w:t>Mutation testing stuff</w:t>
+      </w:r>
+    </w:p>
+    <w:p>
+      <w:pPr>
+        <w:rPr>
+          <w:iCs/>
+        </w:rPr>
+      </w:pPr>
+    </w:p>
+    <w:p>
+      <w:pPr>
+        <w:rPr>
+          <w:iCs/>
+        </w:rPr>
+      </w:pPr>
+      <w:r>
+        <w:rPr>
+          <w:iCs/>
+        </w:rPr>
+        <w:t>Questions:</w:t>
+      </w:r>
+    </w:p>
+    <w:p>
+      <w:pPr>
+        <w:rPr>
+          <w:iCs/>
+        </w:rPr>
+      </w:pPr>
+      <w:r>
+        <w:rPr>
+          <w:iCs/>
+        </w:rPr>
+        <w:t>What do I say about translating hobbit to python in the thesis? That I used gpt?</w:t>
+      </w:r>
+    </w:p>
+    <w:p>
+      <w:pPr>
+        <w:rPr>
+          <w:iCs/>
+        </w:rPr>
+      </w:pPr>
+      <w:r>
+        <w:rPr>
+          <w:iCs/>
+        </w:rPr>
+        <w:t>Yes. Include sample prompts with responses</w:t>
+      </w:r>
+    </w:p>
+    <w:p>
+      <w:pPr>
+        <w:rPr>
+          <w:iCs/>
+        </w:rPr>
+      </w:pPr>
+      <w:r>
+        <w:rPr>
+          <w:iCs/>
+        </w:rPr>
+        <w:t>How do I treat two programs where 1 has global state and the other doesnt</w:t>
+      </w:r>
+    </w:p>
+    <w:p>
+      <w:pPr>
+        <w:rPr>
+          <w:iCs/>
+        </w:rPr>
+      </w:pPr>
+    </w:p>
+    <w:p>
+      <w:pPr>
+        <w:rPr>
+          <w:iCs/>
+        </w:rPr>
+      </w:pPr>
+      <w:r>
+        <w:rPr>
+          <w:iCs/>
+        </w:rPr>
+        <w:t>The trace is from the perspective of the observer</w:t>
+      </w:r>
+    </w:p>
+    <w:p>
+      <w:pPr>
+        <w:rPr>
+          <w:iCs/>
+        </w:rPr>
+      </w:pPr>
+      <w:r>
+        <w:rPr>
+          <w:iCs/>
+        </w:rPr>
+        <w:t>We cant see internal recursion</w:t>
+      </w:r>
+    </w:p>
+    <w:p>
+      <w:pPr>
+        <w:rPr>
+          <w:iCs/>
+        </w:rPr>
+      </w:pPr>
+      <w:r>
+        <w:rPr>
+          <w:iCs/>
+        </w:rPr>
+        <w:t>If function returns function, observer can call that function maybe</w:t>
+      </w:r>
+    </w:p>
+    <w:p>
+      <w:pPr>
+        <w:rPr>
+          <w:iCs/>
+        </w:rPr>
+      </w:pPr>
+      <w:r>
+        <w:rPr>
+          <w:iCs/>
+        </w:rPr>
+        <w:t xml:space="preserve">Reentrancy. </w:t>
+      </w:r>
+    </w:p>
+    <w:p>
+      <w:pPr>
+        <w:rPr>
+          <w:iCs/>
+        </w:rPr>
+      </w:pPr>
+      <w:r>
+        <w:rPr>
+          <w:iCs/>
+        </w:rPr>
+        <w:t>Function can make a choice between all funcs it knows</w:t>
+      </w:r>
+    </w:p>
+    <w:p>
+      <w:pPr>
+        <w:rPr>
+          <w:iCs/>
+        </w:rPr>
+      </w:pPr>
+      <w:r>
+        <w:rPr>
+          <w:iCs/>
+        </w:rPr>
+        <w:t>Maybe make observers store return values received in sequence</w:t>
+      </w:r>
+    </w:p>
+    <w:p>
+      <w:pPr>
+        <w:rPr>
+          <w:iCs/>
+        </w:rPr>
+      </w:pPr>
+      <w:r>
+        <w:rPr>
+          <w:iCs/>
+        </w:rPr>
+        <w:lastRenderedPageBreak/>
+        <w:t>F can write a stream to a file</w:t>
+      </w:r>
+    </w:p>
+    <w:p>
+      <w:pPr>
+        <w:rPr>
+          <w:iCs/>
+        </w:rPr>
+      </w:pPr>
+      <w:r>
+        <w:rPr>
+          <w:iCs/>
+        </w:rPr>
+        <w:t>Have to retranslate hobbit suite</w:t>
+      </w:r>
+    </w:p>
+    <w:p>
+      <w:pPr>
+        <w:rPr>
+          <w:iCs/>
+        </w:rPr>
+      </w:pPr>
+      <w:r>
+        <w:rPr>
+          <w:iCs/>
+        </w:rPr>
+        <w:t xml:space="preserve">Currently, catch </w:t>
+      </w:r>
+      <w:r>
+        <w:rPr>
+          <w:iCs/>
+        </w:rPr>
+        <w:t>41-47</w:t>
+      </w:r>
+      <w:r>
+        <w:rPr>
+          <w:iCs/>
+        </w:rPr>
+        <w:t>/79 from hobbit suite</w:t>
+      </w:r>
+      <w:r>
+        <w:rPr>
+          <w:iCs/>
+        </w:rPr>
+        <w:t xml:space="preserve"> in 14-17 mins</w:t>
+      </w:r>
+    </w:p>
+    <w:p>
+      <w:pPr>
+        <w:rPr>
+          <w:iCs/>
+        </w:rPr>
+      </w:pPr>
+      <w:r>
+        <w:rPr>
+          <w:iCs/>
+        </w:rPr>
+        <w:t>Need to check if input arguments get mutated</w:t>
+      </w:r>
+    </w:p>
+    <w:p>
+      <w:pPr>
+        <w:rPr>
+          <w:iCs/>
+        </w:rPr>
+      </w:pPr>
+      <w:r>
+        <w:rPr>
+          <w:iCs/>
+        </w:rPr>
+        <w:t>There is a demo</w:t>
+      </w:r>
+    </w:p>
+    <w:p>
+      <w:pPr>
         <w:rPr>
           <w:b/>
           <w:bCs/>
           <w:iCs/>
         </w:rPr>
-        <w:t>mutmut</w:t>
-      </w:r>
-      <w:proofErr w:type="spellEnd"/>
+      </w:pPr>
       <w:r>
         <w:rPr>
           <w:b/>
           <w:bCs/>
           <w:iCs/>
         </w:rPr>
-        <w:t xml:space="preserve"> on requests: </w:t>
-      </w:r>
-    </w:p>
-    <w:p>
-      <w:pPr>
-        <w:rPr>
-          <w:iCs/>
-        </w:rPr>
-      </w:pPr>
-      <w:r>
-        <w:rPr>
-          <w:iCs/>
-        </w:rPr>
-        <w:t>Running mutation testing</w:t>
-      </w:r>
-    </w:p>
-    <w:p>
-      <w:pPr>
-        <w:rPr>
-          <w:iCs/>
-        </w:rPr>
-      </w:pPr>
-      <w:r>
-        <w:rPr>
-          <w:rFonts w:ascii="Segoe UI Symbol" w:hAnsi="Segoe UI Symbol" w:cs="Segoe UI Symbol"/>
-          <w:iCs/>
-        </w:rPr>
-        <w:t>⠧</w:t>
-      </w:r>
-      <w:r>
-        <w:rPr>
-          <w:iCs/>
-        </w:rPr>
-        <w:t xml:space="preserve"> 3673/</w:t>
-      </w:r>
-      <w:proofErr w:type="gramStart"/>
-      <w:r>
-        <w:rPr>
-          <w:iCs/>
-        </w:rPr>
-        <w:t xml:space="preserve">3673  </w:t>
-      </w:r>
-      <w:r>
-        <w:rPr>
-          <w:rFonts w:ascii="Segoe UI Emoji" w:hAnsi="Segoe UI Emoji" w:cs="Segoe UI Emoji"/>
-          <w:iCs/>
-        </w:rPr>
-        <w:t>🎉</w:t>
-      </w:r>
-      <w:proofErr w:type="gramEnd"/>
-      <w:r>
-        <w:rPr>
-          <w:iCs/>
-        </w:rPr>
-        <w:t xml:space="preserve"> 2241 </w:t>
-      </w:r>
-      <w:r>
-        <w:rPr>
-          <w:rFonts w:ascii="Aptos" w:hAnsi="Aptos" w:cs="Aptos"/>
-          <w:iCs/>
-        </w:rPr>
-        <w:t>🫥</w:t>
-      </w:r>
-      <w:r>
-        <w:rPr>
-          <w:iCs/>
-        </w:rPr>
-        <w:t xml:space="preserve"> 337  </w:t>
-      </w:r>
-      <w:r>
-        <w:rPr>
-          <w:rFonts w:ascii="Segoe UI Emoji" w:hAnsi="Segoe UI Emoji" w:cs="Segoe UI Emoji"/>
-          <w:iCs/>
-        </w:rPr>
-        <w:t>⏰</w:t>
-      </w:r>
-      <w:r>
-        <w:rPr>
-          <w:iCs/>
-        </w:rPr>
-        <w:t xml:space="preserve"> 453  </w:t>
-      </w:r>
-      <w:r>
-        <w:rPr>
-          <w:rFonts w:ascii="Segoe UI Emoji" w:hAnsi="Segoe UI Emoji" w:cs="Segoe UI Emoji"/>
-          <w:iCs/>
-        </w:rPr>
-        <w:t>🤔</w:t>
-      </w:r>
-      <w:r>
-        <w:rPr>
-          <w:iCs/>
-        </w:rPr>
-        <w:t xml:space="preserve"> 0  </w:t>
-      </w:r>
-      <w:r>
-        <w:rPr>
-          <w:rFonts w:ascii="Segoe UI Emoji" w:hAnsi="Segoe UI Emoji" w:cs="Segoe UI Emoji"/>
-          <w:iCs/>
-        </w:rPr>
-        <w:t>🙁</w:t>
-      </w:r>
-      <w:r>
-        <w:rPr>
-          <w:iCs/>
-        </w:rPr>
-        <w:t xml:space="preserve"> 642  </w:t>
-      </w:r>
-      <w:r>
-        <w:rPr>
-          <w:rFonts w:ascii="Segoe UI Emoji" w:hAnsi="Segoe UI Emoji" w:cs="Segoe UI Emoji"/>
-          <w:iCs/>
-        </w:rPr>
-        <w:t>🔇</w:t>
-      </w:r>
-      <w:r>
-        <w:rPr>
-          <w:iCs/>
-        </w:rPr>
-        <w:t xml:space="preserve"> 0</w:t>
-      </w:r>
-    </w:p>
-    <w:p>
-      <w:pPr>
-        <w:rPr>
-          <w:iCs/>
-        </w:rPr>
-      </w:pPr>
-      <w:r>
-        <w:rPr>
-          <w:iCs/>
-        </w:rPr>
-        <w:t>Mutants identified: 347/1449</w:t>
-      </w:r>
-      <w:r>
-        <w:rPr>
-          <w:iCs/>
-        </w:rPr>
-        <w:t xml:space="preserve"> – not sure why not all mutants were hit</w:t>
-      </w:r>
-    </w:p>
-    <w:p>
-      <w:pPr>
-        <w:rPr>
-          <w:iCs/>
-        </w:rPr>
-      </w:pPr>
-      <w:r>
-        <w:rPr>
-          <w:iCs/>
-        </w:rPr>
-        <w:t>Completed in 13372.785392045975 seconds.</w:t>
-      </w:r>
-      <w:r>
-        <w:rPr>
-          <w:iCs/>
-        </w:rPr>
-        <w:t xml:space="preserve"> (3.7 hrs)</w:t>
-      </w:r>
-    </w:p>
-    <w:p>
-      <w:pPr>
-        <w:rPr>
-          <w:iCs/>
-        </w:rPr>
-      </w:pPr>
-    </w:p>
-    <w:p>
-      <w:pPr>
-        <w:rPr>
-          <w:iCs/>
-        </w:rPr>
-      </w:pPr>
-      <w:r>
-        <w:rPr>
-          <w:iCs/>
-        </w:rPr>
-        <w:t xml:space="preserve">After adding </w:t>
-      </w:r>
-      <w:proofErr w:type="gramStart"/>
-      <w:r>
-        <w:rPr>
-          <w:iCs/>
-        </w:rPr>
-        <w:t>class based</w:t>
-      </w:r>
-      <w:proofErr w:type="gramEnd"/>
-      <w:r>
-        <w:rPr>
-          <w:iCs/>
-        </w:rPr>
-        <w:t xml:space="preserve"> stuff</w:t>
-      </w:r>
-    </w:p>
-    <w:p>
-      <w:pPr>
-        <w:rPr>
-          <w:iCs/>
-        </w:rPr>
-      </w:pPr>
-      <w:r>
-        <w:rPr>
-          <w:iCs/>
-        </w:rPr>
-        <w:t>Mutants identified: 917/4467</w:t>
-      </w:r>
-      <w:r>
-        <w:rPr>
-          <w:iCs/>
-        </w:rPr>
-        <w:t xml:space="preserve"> in 6.8 hrs (but I suspect this may be over eager)</w:t>
-      </w:r>
-    </w:p>
-    <w:p>
-      <w:pPr>
-        <w:rPr>
-          <w:iCs/>
-        </w:rPr>
-      </w:pPr>
-      <w:r>
-        <w:rPr>
-          <w:iCs/>
-        </w:rPr>
-        <w:t>537/4467</w:t>
-      </w:r>
-      <w:r>
-        <w:rPr>
-          <w:iCs/>
-        </w:rPr>
-        <w:t xml:space="preserve"> after fixing it in 7.4 hrs</w:t>
-      </w:r>
-    </w:p>
-    <w:p>
-      <w:pPr>
-        <w:rPr>
-          <w:iCs/>
-        </w:rPr>
-      </w:pPr>
-    </w:p>
-    <w:p>
-      <w:pPr>
-        <w:rPr>
-          <w:iCs/>
-        </w:rPr>
-      </w:pPr>
-      <w:r>
-        <w:rPr>
-          <w:iCs/>
-        </w:rPr>
-        <w:t>Ran it on a library of data structures:</w:t>
-      </w:r>
-    </w:p>
-    <w:p>
-      <w:pPr>
-        <w:rPr>
-          <w:iCs/>
-        </w:rPr>
-      </w:pPr>
-      <w:r>
-        <w:rPr>
-          <w:iCs/>
-        </w:rPr>
-        <w:t>https://github.com/clair3st/Data-Structures/tree/master</w:t>
-      </w:r>
-    </w:p>
-    <w:p>
-      <w:pPr>
-        <w:rPr>
-          <w:iCs/>
-        </w:rPr>
-      </w:pPr>
-      <w:r>
-        <w:rPr>
-          <w:rFonts w:ascii="Segoe UI Symbol" w:hAnsi="Segoe UI Symbol" w:cs="Segoe UI Symbol"/>
-          <w:iCs/>
-        </w:rPr>
-        <w:t>⠸</w:t>
-      </w:r>
-      <w:r>
-        <w:rPr>
-          <w:iCs/>
-        </w:rPr>
-        <w:t xml:space="preserve"> 445/</w:t>
-      </w:r>
-      <w:proofErr w:type="gramStart"/>
-      <w:r>
-        <w:rPr>
-          <w:iCs/>
-        </w:rPr>
-        <w:t xml:space="preserve">445  </w:t>
-      </w:r>
-      <w:r>
-        <w:rPr>
-          <w:rFonts w:ascii="Segoe UI Emoji" w:hAnsi="Segoe UI Emoji" w:cs="Segoe UI Emoji"/>
-          <w:iCs/>
-        </w:rPr>
-        <w:t>🎉</w:t>
-      </w:r>
-      <w:proofErr w:type="gramEnd"/>
-      <w:r>
-        <w:rPr>
-          <w:iCs/>
-        </w:rPr>
-        <w:t xml:space="preserve"> 383 </w:t>
-      </w:r>
-      <w:r>
-        <w:rPr>
-          <w:rFonts w:ascii="Aptos" w:hAnsi="Aptos" w:cs="Aptos"/>
-          <w:iCs/>
-        </w:rPr>
-        <w:t>🫥</w:t>
-      </w:r>
-      <w:r>
-        <w:rPr>
-          <w:iCs/>
-        </w:rPr>
-        <w:t xml:space="preserve"> 4  </w:t>
-      </w:r>
-      <w:r>
-        <w:rPr>
-          <w:rFonts w:ascii="Segoe UI Emoji" w:hAnsi="Segoe UI Emoji" w:cs="Segoe UI Emoji"/>
-          <w:iCs/>
-        </w:rPr>
-        <w:t>⏰</w:t>
-      </w:r>
-      <w:r>
-        <w:rPr>
-          <w:iCs/>
-        </w:rPr>
-        <w:t xml:space="preserve"> 10  </w:t>
-      </w:r>
-      <w:r>
-        <w:rPr>
-          <w:rFonts w:ascii="Segoe UI Emoji" w:hAnsi="Segoe UI Emoji" w:cs="Segoe UI Emoji"/>
-          <w:iCs/>
-        </w:rPr>
-        <w:t>🤔</w:t>
-      </w:r>
-      <w:r>
-        <w:rPr>
-          <w:iCs/>
-        </w:rPr>
-        <w:t xml:space="preserve"> 0  </w:t>
-      </w:r>
-      <w:r>
-        <w:rPr>
-          <w:rFonts w:ascii="Segoe UI Emoji" w:hAnsi="Segoe UI Emoji" w:cs="Segoe UI Emoji"/>
-          <w:iCs/>
-        </w:rPr>
-        <w:t>🙁</w:t>
-      </w:r>
-      <w:r>
-        <w:rPr>
-          <w:iCs/>
-        </w:rPr>
-        <w:t xml:space="preserve"> 48  </w:t>
-      </w:r>
-      <w:r>
-        <w:rPr>
-          <w:rFonts w:ascii="Segoe UI Emoji" w:hAnsi="Segoe UI Emoji" w:cs="Segoe UI Emoji"/>
-          <w:iCs/>
-        </w:rPr>
-        <w:t>🔇</w:t>
-      </w:r>
-      <w:r>
-        <w:rPr>
-          <w:iCs/>
-        </w:rPr>
-        <w:t xml:space="preserve"> 0</w:t>
-      </w:r>
-    </w:p>
-    <w:p>
-      <w:pPr>
-        <w:rPr>
-          <w:iCs/>
-        </w:rPr>
-      </w:pPr>
-      <w:r>
-        <w:rPr>
-          <w:iCs/>
-        </w:rPr>
-        <w:t>11</w:t>
-      </w:r>
-      <w:r>
-        <w:rPr>
-          <w:iCs/>
-        </w:rPr>
-        <w:t>8/445</w:t>
-      </w:r>
-    </w:p>
-    <w:p>
-      <w:pPr>
-        <w:rPr>
-          <w:iCs/>
-        </w:rPr>
-      </w:pPr>
-      <w:r>
-        <w:rPr>
-          <w:iCs/>
-        </w:rPr>
-        <w:t xml:space="preserve">270/445 after adding more </w:t>
-      </w:r>
-      <w:proofErr w:type="gramStart"/>
-      <w:r>
-        <w:rPr>
-          <w:iCs/>
-        </w:rPr>
-        <w:t>class based</w:t>
-      </w:r>
-      <w:proofErr w:type="gramEnd"/>
-      <w:r>
-        <w:rPr>
-          <w:iCs/>
-        </w:rPr>
-        <w:t xml:space="preserve"> stuff</w:t>
-      </w:r>
-    </w:p>
-    <w:p>
-      <w:pPr>
-        <w:rPr>
-          <w:iCs/>
-        </w:rPr>
-      </w:pPr>
-      <w:r>
-        <w:rPr>
-          <w:iCs/>
-        </w:rPr>
-        <w:t>353/445 after 2.5 hrs with basic dummy object</w:t>
-      </w:r>
-    </w:p>
-    <w:p>
-      <w:pPr>
-        <w:rPr>
-          <w:iCs/>
-        </w:rPr>
-      </w:pPr>
-      <w:r>
-        <w:rPr>
-          <w:iCs/>
-        </w:rPr>
-        <w:t>367/445 best so far</w:t>
-      </w:r>
-    </w:p>
-    <w:p>
-      <w:pPr>
-        <w:rPr>
-          <w:iCs/>
-        </w:rPr>
-      </w:pPr>
-      <w:r>
-        <w:rPr>
-          <w:iCs/>
-        </w:rPr>
-        <w:t>346</w:t>
-      </w:r>
-      <w:r>
-        <w:rPr>
-          <w:iCs/>
-        </w:rPr>
-        <w:t xml:space="preserve"> – look at what I caught that the suite </w:t>
-      </w:r>
-      <w:r>
-        <w:rPr>
-          <w:iCs/>
-        </w:rPr>
-        <w:t>didn’t</w:t>
-      </w:r>
-    </w:p>
-    <w:p>
-      <w:pPr>
-        <w:rPr>
-          <w:iCs/>
-        </w:rPr>
-      </w:pPr>
-      <w:r>
-        <w:rPr>
-          <w:iCs/>
-        </w:rPr>
-        <w:t>Plain hypothesis: 316</w:t>
-      </w:r>
-    </w:p>
-    <w:p>
-      <w:pPr>
-        <w:rPr>
-          <w:iCs/>
-        </w:rPr>
-      </w:pPr>
-      <w:r>
-        <w:rPr>
-          <w:iCs/>
-        </w:rPr>
-        <w:t>Just refactored data structures:</w:t>
-      </w:r>
-    </w:p>
-    <w:p>
-      <w:pPr>
-        <w:rPr>
-          <w:iCs/>
-        </w:rPr>
-      </w:pPr>
-      <w:r>
-        <w:rPr>
-          <w:rFonts w:ascii="Segoe UI Symbol" w:hAnsi="Segoe UI Symbol" w:cs="Segoe UI Symbol"/>
-          <w:iCs/>
-        </w:rPr>
-        <w:t>⠸</w:t>
-      </w:r>
-      <w:r>
-        <w:rPr>
-          <w:iCs/>
-        </w:rPr>
-        <w:t xml:space="preserve"> 527/</w:t>
-      </w:r>
-      <w:proofErr w:type="gramStart"/>
-      <w:r>
-        <w:rPr>
-          <w:iCs/>
-        </w:rPr>
-        <w:t xml:space="preserve">527  </w:t>
-      </w:r>
-      <w:r>
-        <w:rPr>
-          <w:rFonts w:ascii="Segoe UI Emoji" w:hAnsi="Segoe UI Emoji" w:cs="Segoe UI Emoji"/>
-          <w:iCs/>
-        </w:rPr>
-        <w:t>🎉</w:t>
-      </w:r>
-      <w:proofErr w:type="gramEnd"/>
-      <w:r>
-        <w:rPr>
-          <w:iCs/>
-        </w:rPr>
-        <w:t xml:space="preserve"> 425 </w:t>
-      </w:r>
-      <w:r>
-        <w:rPr>
-          <w:rFonts w:ascii="Aptos" w:hAnsi="Aptos" w:cs="Aptos"/>
-          <w:iCs/>
-        </w:rPr>
-        <w:t>🫥</w:t>
-      </w:r>
-      <w:r>
-        <w:rPr>
-          <w:iCs/>
-        </w:rPr>
-        <w:t xml:space="preserve"> 6  </w:t>
-      </w:r>
-      <w:r>
-        <w:rPr>
-          <w:rFonts w:ascii="Segoe UI Emoji" w:hAnsi="Segoe UI Emoji" w:cs="Segoe UI Emoji"/>
-          <w:iCs/>
-        </w:rPr>
-        <w:t>⏰</w:t>
-      </w:r>
-      <w:r>
-        <w:rPr>
-          <w:iCs/>
-        </w:rPr>
-        <w:t xml:space="preserve"> 2  </w:t>
-      </w:r>
-      <w:r>
-        <w:rPr>
-          <w:rFonts w:ascii="Segoe UI Emoji" w:hAnsi="Segoe UI Emoji" w:cs="Segoe UI Emoji"/>
-          <w:iCs/>
-        </w:rPr>
-        <w:t>🤔</w:t>
-      </w:r>
-      <w:r>
-        <w:rPr>
-          <w:iCs/>
-        </w:rPr>
-        <w:t xml:space="preserve"> 0  </w:t>
-      </w:r>
-      <w:r>
-        <w:rPr>
-          <w:rFonts w:ascii="Segoe UI Emoji" w:hAnsi="Segoe UI Emoji" w:cs="Segoe UI Emoji"/>
-          <w:iCs/>
-        </w:rPr>
-        <w:t>🙁</w:t>
-      </w:r>
-      <w:r>
-        <w:rPr>
-          <w:iCs/>
-        </w:rPr>
-        <w:t xml:space="preserve"> 94  </w:t>
-      </w:r>
-      <w:r>
-        <w:rPr>
-          <w:rFonts w:ascii="Segoe UI Emoji" w:hAnsi="Segoe UI Emoji" w:cs="Segoe UI Emoji"/>
-          <w:iCs/>
-        </w:rPr>
-        <w:t>🔇</w:t>
-      </w:r>
-      <w:r>
-        <w:rPr>
-          <w:iCs/>
-        </w:rPr>
-        <w:t xml:space="preserve"> 0</w:t>
-      </w:r>
-    </w:p>
-    <w:p>
-      <w:pPr>
-        <w:rPr>
-          <w:iCs/>
-        </w:rPr>
-      </w:pPr>
-      <w:r>
-        <w:rPr>
-          <w:iCs/>
-        </w:rPr>
-        <w:t>370/527 mutants killed</w:t>
-      </w:r>
-      <w:r>
-        <w:rPr>
-          <w:iCs/>
-        </w:rPr>
-        <w:t xml:space="preserve"> – 244 with plain hypothesis</w:t>
-      </w:r>
-    </w:p>
-    <w:p>
-      <w:pPr>
-        <w:rPr>
-          <w:iCs/>
-        </w:rPr>
-      </w:pPr>
-    </w:p>
-    <w:p>
-      <w:pPr>
-        <w:rPr>
-          <w:iCs/>
-        </w:rPr>
-      </w:pPr>
-      <w:r>
-        <w:rPr>
-          <w:iCs/>
-        </w:rPr>
-        <w:t xml:space="preserve">With the following addition to </w:t>
-      </w:r>
-      <w:proofErr w:type="spellStart"/>
-      <w:proofErr w:type="gramStart"/>
-      <w:r>
-        <w:rPr>
-          <w:iCs/>
-        </w:rPr>
-        <w:t>pyproject.toml</w:t>
-      </w:r>
-      <w:proofErr w:type="spellEnd"/>
-      <w:proofErr w:type="gramEnd"/>
-    </w:p>
-    <w:p>
-      <w:pPr>
-        <w:rPr>
-          <w:iCs/>
-        </w:rPr>
-      </w:pPr>
-      <w:r>
-        <w:rPr>
-          <w:iCs/>
-        </w:rPr>
-        <w:t>[</w:t>
-      </w:r>
-      <w:proofErr w:type="spellStart"/>
-      <w:proofErr w:type="gramStart"/>
-      <w:r>
-        <w:rPr>
-          <w:iCs/>
-        </w:rPr>
-        <w:t>tool.mutmut</w:t>
-      </w:r>
-      <w:proofErr w:type="spellEnd"/>
-      <w:proofErr w:type="gramEnd"/>
-      <w:r>
-        <w:rPr>
-          <w:iCs/>
-        </w:rPr>
-        <w:t>]</w:t>
-      </w:r>
-      <w:r>
-        <w:rPr>
-          <w:iCs/>
-        </w:rPr>
-        <w:br/>
-      </w:r>
-      <w:proofErr w:type="spellStart"/>
-      <w:r>
-        <w:rPr>
-          <w:iCs/>
-        </w:rPr>
-        <w:t>pytest_add_cli_args</w:t>
-      </w:r>
-      <w:proofErr w:type="spellEnd"/>
-      <w:r>
-        <w:rPr>
-          <w:iCs/>
-        </w:rPr>
-        <w:t xml:space="preserve"> = ["-k", "not </w:t>
-      </w:r>
-      <w:proofErr w:type="spellStart"/>
-      <w:r>
-        <w:rPr>
-          <w:iCs/>
-        </w:rPr>
-        <w:t>test_env_cert_bundles</w:t>
-      </w:r>
-      <w:proofErr w:type="spellEnd"/>
-      <w:r>
-        <w:rPr>
-          <w:iCs/>
-        </w:rPr>
-        <w:t xml:space="preserve"> and not test_different_connection_pool_for_tls_settings_verify_bundle_unexpired_cert"]</w:t>
-      </w:r>
-    </w:p>
-    <w:p>
-      <w:pPr>
-        <w:rPr>
-          <w:iCs/>
-        </w:rPr>
-      </w:pPr>
-    </w:p>
-    <w:p>
-      <w:pPr>
-        <w:rPr>
-          <w:iCs/>
-        </w:rPr>
-      </w:pPr>
-      <w:r>
-        <w:rPr>
-          <w:iCs/>
-        </w:rPr>
-        <w:t>Running mutation testing</w:t>
-      </w:r>
-    </w:p>
-    <w:p>
-      <w:pPr>
-        <w:rPr>
-          <w:iCs/>
-        </w:rPr>
-      </w:pPr>
-      <w:r>
-        <w:rPr>
-          <w:rFonts w:ascii="Segoe UI Symbol" w:hAnsi="Segoe UI Symbol" w:cs="Segoe UI Symbol"/>
-          <w:iCs/>
-        </w:rPr>
-        <w:t>⠴</w:t>
-      </w:r>
-      <w:r>
-        <w:rPr>
-          <w:iCs/>
-        </w:rPr>
-        <w:t xml:space="preserve"> 2250/</w:t>
-      </w:r>
-      <w:proofErr w:type="gramStart"/>
-      <w:r>
-        <w:rPr>
-          <w:iCs/>
-        </w:rPr>
-        <w:t xml:space="preserve">2250  </w:t>
-      </w:r>
-      <w:r>
-        <w:rPr>
-          <w:rFonts w:ascii="Segoe UI Emoji" w:hAnsi="Segoe UI Emoji" w:cs="Segoe UI Emoji"/>
-          <w:iCs/>
-        </w:rPr>
-        <w:t>🎉</w:t>
-      </w:r>
-      <w:proofErr w:type="gramEnd"/>
-      <w:r>
-        <w:rPr>
-          <w:iCs/>
-        </w:rPr>
-        <w:t xml:space="preserve"> 1796 </w:t>
-      </w:r>
-      <w:r>
-        <w:rPr>
-          <w:rFonts w:ascii="Aptos" w:hAnsi="Aptos" w:cs="Aptos"/>
-          <w:iCs/>
-        </w:rPr>
-        <w:t>🫥</w:t>
-      </w:r>
-      <w:r>
-        <w:rPr>
-          <w:iCs/>
-        </w:rPr>
-        <w:t xml:space="preserve"> 13  </w:t>
-      </w:r>
-      <w:r>
-        <w:rPr>
-          <w:rFonts w:ascii="Segoe UI Emoji" w:hAnsi="Segoe UI Emoji" w:cs="Segoe UI Emoji"/>
-          <w:iCs/>
-        </w:rPr>
-        <w:t>⏰</w:t>
-      </w:r>
-      <w:r>
-        <w:rPr>
-          <w:iCs/>
-        </w:rPr>
-        <w:t xml:space="preserve"> 294  </w:t>
-      </w:r>
-      <w:r>
-        <w:rPr>
-          <w:rFonts w:ascii="Segoe UI Emoji" w:hAnsi="Segoe UI Emoji" w:cs="Segoe UI Emoji"/>
-          <w:iCs/>
-        </w:rPr>
-        <w:t>🤔</w:t>
-      </w:r>
-      <w:r>
-        <w:rPr>
-          <w:iCs/>
-        </w:rPr>
-        <w:t xml:space="preserve"> 0  </w:t>
-      </w:r>
-      <w:r>
-        <w:rPr>
-          <w:rFonts w:ascii="Segoe UI Emoji" w:hAnsi="Segoe UI Emoji" w:cs="Segoe UI Emoji"/>
-          <w:iCs/>
-        </w:rPr>
-        <w:t>🙁</w:t>
-      </w:r>
-      <w:r>
-        <w:rPr>
-          <w:iCs/>
-        </w:rPr>
-        <w:t xml:space="preserve"> 147  </w:t>
-      </w:r>
-      <w:r>
-        <w:rPr>
-          <w:rFonts w:ascii="Segoe UI Emoji" w:hAnsi="Segoe UI Emoji" w:cs="Segoe UI Emoji"/>
-          <w:iCs/>
-        </w:rPr>
-        <w:t>🔇</w:t>
-      </w:r>
-      <w:r>
-        <w:rPr>
-          <w:iCs/>
-        </w:rPr>
-        <w:t xml:space="preserve"> 0  </w:t>
-      </w:r>
-      <w:r>
-        <w:rPr>
-          <w:rFonts w:ascii="Segoe UI Emoji" w:hAnsi="Segoe UI Emoji" w:cs="Segoe UI Emoji"/>
-          <w:iCs/>
-        </w:rPr>
-        <w:t>🧙</w:t>
-      </w:r>
-      <w:r>
-        <w:rPr>
-          <w:iCs/>
-        </w:rPr>
-        <w:t xml:space="preserve"> 0</w:t>
-      </w:r>
-    </w:p>
-    <w:p>
-      <w:pPr>
-        <w:rPr>
-          <w:iCs/>
-        </w:rPr>
-      </w:pPr>
-      <w:r>
-        <w:rPr>
-          <w:iCs/>
-        </w:rPr>
-        <w:t xml:space="preserve">For </w:t>
-      </w:r>
-      <w:proofErr w:type="spellStart"/>
-      <w:r>
-        <w:rPr>
-          <w:iCs/>
-        </w:rPr>
-        <w:t>SortedContainers</w:t>
-      </w:r>
-      <w:proofErr w:type="spellEnd"/>
-      <w:r>
-        <w:rPr>
-          <w:iCs/>
-        </w:rPr>
-        <w:t xml:space="preserve"> repo</w:t>
-      </w:r>
-    </w:p>
-    <w:p>
-      <w:pPr>
-        <w:rPr>
-          <w:iCs/>
-        </w:rPr>
-      </w:pPr>
-    </w:p>
-    <w:p>
-      <w:pPr>
-        <w:rPr>
-          <w:iCs/>
-        </w:rPr>
-      </w:pPr>
-      <w:r>
-        <w:rPr>
-          <w:iCs/>
-        </w:rPr>
-        <w:t>Additions:</w:t>
-      </w:r>
-    </w:p>
-    <w:p>
-      <w:pPr>
-        <w:rPr>
-          <w:iCs/>
-        </w:rPr>
-      </w:pPr>
-      <w:r>
-        <w:rPr>
-          <w:iCs/>
-        </w:rPr>
-        <w:t>Tested more hobbit suite</w:t>
-      </w:r>
-    </w:p>
-    <w:p>
-      <w:pPr>
-        <w:rPr>
-          <w:iCs/>
-        </w:rPr>
-      </w:pPr>
-      <w:r>
-        <w:rPr>
-          <w:iCs/>
-        </w:rPr>
-        <w:t>Wrote program equivalence</w:t>
-      </w:r>
-    </w:p>
-    <w:p>
-      <w:pPr>
-        <w:rPr>
-          <w:iCs/>
-        </w:rPr>
-      </w:pPr>
-      <w:r>
-        <w:rPr>
-          <w:iCs/>
-        </w:rPr>
-        <w:t>Wrote script to run entire hobbit suite</w:t>
-      </w:r>
-    </w:p>
-    <w:p>
-      <w:pPr>
-        <w:rPr>
-          <w:iCs/>
-        </w:rPr>
-      </w:pPr>
-      <w:r>
-        <w:rPr>
-          <w:iCs/>
-        </w:rPr>
-        <w:t xml:space="preserve">Functions can </w:t>
-      </w:r>
-      <w:proofErr w:type="gramStart"/>
-      <w:r>
-        <w:rPr>
-          <w:iCs/>
-        </w:rPr>
-        <w:t>alter  global</w:t>
-      </w:r>
-      <w:proofErr w:type="gramEnd"/>
-      <w:r>
-        <w:rPr>
-          <w:iCs/>
-        </w:rPr>
-        <w:t xml:space="preserve"> state</w:t>
-      </w:r>
-    </w:p>
-    <w:p>
-      <w:pPr>
-        <w:rPr>
-          <w:iCs/>
-        </w:rPr>
-      </w:pPr>
-      <w:r>
-        <w:rPr>
-          <w:iCs/>
-        </w:rPr>
-        <w:t>Mutation testing stuff</w:t>
-      </w:r>
-    </w:p>
-    <w:p>
-      <w:pPr>
-        <w:rPr>
-          <w:iCs/>
-        </w:rPr>
-      </w:pPr>
-    </w:p>
-    <w:p>
-      <w:pPr>
-        <w:rPr>
-          <w:iCs/>
-        </w:rPr>
-      </w:pPr>
-      <w:r>
-        <w:rPr>
-          <w:iCs/>
-        </w:rPr>
-        <w:t>Questions:</w:t>
-      </w:r>
-    </w:p>
-    <w:p>
-      <w:pPr>
-        <w:rPr>
-          <w:iCs/>
-        </w:rPr>
-      </w:pPr>
-      <w:r>
-        <w:rPr>
-          <w:iCs/>
-        </w:rPr>
-        <w:t xml:space="preserve">What do I say about translating hobbit to python in the thesis? That I used </w:t>
-      </w:r>
-      <w:proofErr w:type="spellStart"/>
-      <w:r>
-        <w:rPr>
-          <w:iCs/>
-        </w:rPr>
-        <w:t>gpt</w:t>
-      </w:r>
-      <w:proofErr w:type="spellEnd"/>
-      <w:r>
-        <w:rPr>
-          <w:iCs/>
-        </w:rPr>
-        <w:t>?</w:t>
-      </w:r>
-    </w:p>
-    <w:p>
-      <w:pPr>
-        <w:rPr>
-          <w:iCs/>
-        </w:rPr>
-      </w:pPr>
-      <w:r>
-        <w:rPr>
-          <w:iCs/>
-        </w:rPr>
-        <w:t>Yes. Include sample prompts with responses</w:t>
-      </w:r>
-    </w:p>
-    <w:p>
-      <w:pPr>
-        <w:rPr>
-          <w:iCs/>
-        </w:rPr>
-      </w:pPr>
-      <w:r>
-        <w:rPr>
-          <w:iCs/>
-        </w:rPr>
-        <w:t xml:space="preserve">How do I treat two programs where 1 has global state and the other </w:t>
-      </w:r>
-      <w:proofErr w:type="spellStart"/>
-      <w:r>
-        <w:rPr>
-          <w:iCs/>
-        </w:rPr>
-        <w:t>doesnt</w:t>
-      </w:r>
-      <w:proofErr w:type="spellEnd"/>
-    </w:p>
-    <w:p>
-      <w:pPr>
-        <w:rPr>
-          <w:iCs/>
-        </w:rPr>
-      </w:pPr>
-    </w:p>
-    <w:p>
-      <w:pPr>
-        <w:rPr>
-          <w:iCs/>
-        </w:rPr>
-      </w:pPr>
-      <w:r>
-        <w:rPr>
-          <w:iCs/>
-        </w:rPr>
-        <w:t>The trace is from the perspective of the observer</w:t>
-      </w:r>
-    </w:p>
-    <w:p>
-      <w:pPr>
-        <w:rPr>
-          <w:iCs/>
-        </w:rPr>
-      </w:pPr>
-      <w:r>
-        <w:rPr>
-          <w:iCs/>
-        </w:rPr>
-        <w:t xml:space="preserve">We </w:t>
-      </w:r>
-      <w:proofErr w:type="spellStart"/>
-      <w:proofErr w:type="gramStart"/>
-      <w:r>
-        <w:rPr>
-          <w:iCs/>
-        </w:rPr>
-        <w:t>cant</w:t>
-      </w:r>
-      <w:proofErr w:type="spellEnd"/>
-      <w:proofErr w:type="gramEnd"/>
-      <w:r>
-        <w:rPr>
-          <w:iCs/>
-        </w:rPr>
-        <w:t xml:space="preserve"> see internal recursion</w:t>
-      </w:r>
-    </w:p>
-    <w:p>
-      <w:pPr>
-        <w:rPr>
-          <w:iCs/>
-        </w:rPr>
-      </w:pPr>
-      <w:r>
-        <w:rPr>
-          <w:iCs/>
-        </w:rPr>
-        <w:t>If function returns function, observer can call that function maybe</w:t>
-      </w:r>
-    </w:p>
-    <w:p>
-      <w:pPr>
-        <w:rPr>
-          <w:iCs/>
-        </w:rPr>
-      </w:pPr>
-      <w:proofErr w:type="spellStart"/>
-      <w:r>
-        <w:rPr>
-          <w:iCs/>
-        </w:rPr>
-        <w:t>Reentrancy</w:t>
-      </w:r>
-      <w:proofErr w:type="spellEnd"/>
-      <w:r>
-        <w:rPr>
-          <w:iCs/>
-        </w:rPr>
-        <w:t xml:space="preserve">. </w:t>
-      </w:r>
-    </w:p>
-    <w:p>
-      <w:pPr>
-        <w:rPr>
-          <w:iCs/>
-        </w:rPr>
-      </w:pPr>
-      <w:r>
-        <w:rPr>
-          <w:iCs/>
-        </w:rPr>
-        <w:t xml:space="preserve">Function can make a choice between all </w:t>
-      </w:r>
-      <w:proofErr w:type="spellStart"/>
-      <w:r>
-        <w:rPr>
-          <w:iCs/>
-        </w:rPr>
-        <w:t>funcs</w:t>
-      </w:r>
-      <w:proofErr w:type="spellEnd"/>
-      <w:r>
-        <w:rPr>
-          <w:iCs/>
-        </w:rPr>
-        <w:t xml:space="preserve"> it knows</w:t>
-      </w:r>
-    </w:p>
-    <w:p>
-      <w:pPr>
-        <w:rPr>
-          <w:iCs/>
-        </w:rPr>
-      </w:pPr>
-      <w:r>
-        <w:rPr>
-          <w:iCs/>
-        </w:rPr>
-        <w:t>Maybe make observers store return values received in sequence</w:t>
-      </w:r>
-    </w:p>
-    <w:p>
-      <w:pPr>
-        <w:rPr>
-          <w:iCs/>
-        </w:rPr>
-      </w:pPr>
-      <w:r>
-        <w:rPr>
-          <w:iCs/>
-        </w:rPr>
-        <w:lastRenderedPageBreak/>
-        <w:t>F can write a stream to a file</w:t>
-      </w:r>
-    </w:p>
-    <w:p>
-      <w:pPr>
-        <w:rPr>
-          <w:iCs/>
-        </w:rPr>
-      </w:pPr>
-      <w:proofErr w:type="gramStart"/>
-      <w:r>
-        <w:rPr>
-          <w:iCs/>
-        </w:rPr>
-        <w:t>Have to</w:t>
-      </w:r>
-      <w:proofErr w:type="gramEnd"/>
-      <w:r>
-        <w:rPr>
-          <w:iCs/>
-        </w:rPr>
-        <w:t xml:space="preserve"> retranslate hobbit suite</w:t>
-      </w:r>
-    </w:p>
-    <w:p>
-      <w:pPr>
-        <w:rPr>
-          <w:iCs/>
-        </w:rPr>
-      </w:pPr>
-      <w:r>
-        <w:rPr>
-          <w:iCs/>
-        </w:rPr>
-        <w:t xml:space="preserve">Currently, catch </w:t>
-      </w:r>
-      <w:r>
-        <w:rPr>
-          <w:iCs/>
-        </w:rPr>
-        <w:t>41-47</w:t>
-      </w:r>
-      <w:r>
-        <w:rPr>
-          <w:iCs/>
-        </w:rPr>
-        <w:t>/79 from hobbit suite</w:t>
-      </w:r>
-      <w:r>
-        <w:rPr>
-          <w:iCs/>
-        </w:rPr>
-        <w:t xml:space="preserve"> in 14-17 mins</w:t>
-      </w:r>
-    </w:p>
-    <w:p>
-      <w:pPr>
-        <w:rPr>
-          <w:iCs/>
-        </w:rPr>
-      </w:pPr>
-      <w:r>
-        <w:rPr>
-          <w:iCs/>
-        </w:rPr>
-        <w:t>Need to check if input arguments get mutated</w:t>
-      </w:r>
-    </w:p>
-    <w:p>
-      <w:pPr>
-        <w:rPr>
-          <w:iCs/>
-        </w:rPr>
-      </w:pPr>
-      <w:r>
-        <w:rPr>
-          <w:iCs/>
-        </w:rPr>
-        <w:t>There is a demo</w:t>
+        <w:t>Check on cross_reentrancy_param</w:t>
       </w:r>
     </w:p>
     <w:p>
@@ -3825,24 +2592,87 @@
           <w:iCs/>
         </w:rPr>
       </w:pPr>
-      <w:r>
+    </w:p>
+    <w:p>
+      <w:pPr>
         <w:rPr>
           <w:b/>
           <w:bCs/>
           <w:iCs/>
         </w:rPr>
-        <w:t xml:space="preserve">Check on </w:t>
-      </w:r>
-      <w:proofErr w:type="spellStart"/>
+      </w:pPr>
+    </w:p>
+    <w:p>
+      <w:pPr>
+        <w:rPr>
+          <w:iCs/>
+        </w:rPr>
+      </w:pPr>
+      <w:r>
+        <w:rPr>
+          <w:iCs/>
+        </w:rPr>
+        <w:t xml:space="preserve">Added functionality that if a higher order function returns a </w:t>
+      </w:r>
       <w:r>
         <w:rPr>
           <w:b/>
           <w:bCs/>
           <w:iCs/>
         </w:rPr>
-        <w:t>cross_reentrancy_param</w:t>
-      </w:r>
-      <w:proofErr w:type="spellEnd"/>
+        <w:t>tuple</w:t>
+      </w:r>
+      <w:r>
+        <w:rPr>
+          <w:iCs/>
+        </w:rPr>
+        <w:t xml:space="preserve"> of functions, we interleave the execution of those functions</w:t>
+      </w:r>
+      <w:r>
+        <w:rPr>
+          <w:iCs/>
+        </w:rPr>
+        <w:t xml:space="preserve">. </w:t>
+      </w:r>
+    </w:p>
+    <w:p>
+      <w:pPr>
+        <w:rPr>
+          <w:iCs/>
+        </w:rPr>
+      </w:pPr>
+      <w:r>
+        <w:rPr>
+          <w:iCs/>
+        </w:rPr>
+        <w:t>Added functionality that if a higher order function takes a callable parameter, and then calls that callable parameter passing in multiple functions as arguments to that callable parameter, then that callable parameter can interleave the execution of the functions it is given</w:t>
+      </w:r>
+    </w:p>
+    <w:p>
+      <w:pPr>
+        <w:rPr>
+          <w:iCs/>
+        </w:rPr>
+      </w:pPr>
+      <w:r>
+        <w:rPr>
+          <w:iCs/>
+        </w:rPr>
+        <w:t xml:space="preserve">Curried interaction plan: </w:t>
+      </w:r>
+    </w:p>
+    <w:p>
+      <w:pPr>
+        <w:rPr>
+          <w:iCs/>
+        </w:rPr>
+      </w:pPr>
+      <w:r>
+        <w:rPr>
+          <w:iCs/>
+        </w:rPr>
+        <w:t xml:space="preserve">For combiner-style HOFs, </w:t>
+      </w:r>
     </w:p>
     <w:p>
       <w:pPr>
@@ -3856,96 +2686,6 @@
     <w:p>
       <w:pPr>
         <w:rPr>
-          <w:b/>
-          <w:bCs/>
-          <w:iCs/>
-        </w:rPr>
-      </w:pPr>
-    </w:p>
-    <w:p>
-      <w:pPr>
-        <w:rPr>
-          <w:iCs/>
-        </w:rPr>
-      </w:pPr>
-      <w:r>
-        <w:rPr>
-          <w:iCs/>
-        </w:rPr>
-        <w:t xml:space="preserve">Added functionality that if a higher order function returns a </w:t>
-      </w:r>
-      <w:r>
-        <w:rPr>
-          <w:b/>
-          <w:bCs/>
-          <w:iCs/>
-        </w:rPr>
-        <w:t>tuple</w:t>
-      </w:r>
-      <w:r>
-        <w:rPr>
-          <w:iCs/>
-        </w:rPr>
-        <w:t xml:space="preserve"> of functions, we interleave the execution of those functions</w:t>
-      </w:r>
-      <w:r>
-        <w:rPr>
-          <w:iCs/>
-        </w:rPr>
-        <w:t xml:space="preserve">. </w:t>
-      </w:r>
-    </w:p>
-    <w:p>
-      <w:pPr>
-        <w:rPr>
-          <w:iCs/>
-        </w:rPr>
-      </w:pPr>
-      <w:r>
-        <w:rPr>
-          <w:iCs/>
-        </w:rPr>
-        <w:t>Added functionality that if a higher order function takes a callable parameter, and then calls that callable parameter passing in multiple functions as arguments to that callable parameter, then that callable parameter can interleave the execution of the functions it is given</w:t>
-      </w:r>
-    </w:p>
-    <w:p>
-      <w:pPr>
-        <w:rPr>
-          <w:iCs/>
-        </w:rPr>
-      </w:pPr>
-      <w:r>
-        <w:rPr>
-          <w:iCs/>
-        </w:rPr>
-        <w:t xml:space="preserve">Curried interaction plan: </w:t>
-      </w:r>
-    </w:p>
-    <w:p>
-      <w:pPr>
-        <w:rPr>
-          <w:iCs/>
-        </w:rPr>
-      </w:pPr>
-      <w:r>
-        <w:rPr>
-          <w:iCs/>
-        </w:rPr>
-        <w:t xml:space="preserve">For combiner-style HOFs, </w:t>
-      </w:r>
-    </w:p>
-    <w:p>
-      <w:pPr>
-        <w:rPr>
-          <w:b/>
-          <w:bCs/>
-          <w:iCs/>
-        </w:rPr>
-      </w:pPr>
-    </w:p>
-    <w:p>
-      <w:pPr>
-        <w:rPr>
           <w:iCs/>
         </w:rPr>
       </w:pPr>
@@ -3973,124 +2713,40 @@
         <w:rPr>
           <w:iCs/>
         </w:rPr>
-        <w:t xml:space="preserve">Seemingly obvious bugs might be overlooked. For bsearch_1, the failing input is 2. Even if I add an int type annotation, the </w:t>
-      </w:r>
-      <w:proofErr w:type="spellStart"/>
-      <w:r>
-        <w:rPr>
-          <w:iCs/>
-        </w:rPr>
-        <w:t>fuzzer</w:t>
-      </w:r>
-      <w:proofErr w:type="spellEnd"/>
-      <w:r>
-        <w:rPr>
-          <w:iCs/>
-        </w:rPr>
-        <w:t xml:space="preserve"> can fully fail to discover the bug because it never tried 2, it tried thousands of other numbers but not 2. Highlights a weakness of coverage-</w:t>
-      </w:r>
-      <w:proofErr w:type="spellStart"/>
-      <w:r>
-        <w:rPr>
-          <w:iCs/>
-        </w:rPr>
-        <w:t>guidedness</w:t>
-      </w:r>
-      <w:proofErr w:type="spellEnd"/>
-      <w:r>
-        <w:rPr>
-          <w:iCs/>
-        </w:rPr>
-        <w:t xml:space="preserve"> in a function </w:t>
-      </w:r>
-      <w:proofErr w:type="gramStart"/>
-      <w:r>
-        <w:rPr>
-          <w:iCs/>
-        </w:rPr>
-        <w:t>where</w:t>
-      </w:r>
-      <w:proofErr w:type="gramEnd"/>
-      <w:r>
-        <w:rPr>
-          <w:iCs/>
-        </w:rPr>
-        <w:t xml:space="preserve"> coverage </w:t>
-      </w:r>
-      <w:proofErr w:type="spellStart"/>
-      <w:r>
-        <w:rPr>
-          <w:iCs/>
-        </w:rPr>
-        <w:t>wont</w:t>
-      </w:r>
-      <w:proofErr w:type="spellEnd"/>
-      <w:r>
-        <w:rPr>
-          <w:iCs/>
-        </w:rPr>
-        <w:t xml:space="preserve"> change meaningfully</w:t>
-      </w:r>
-    </w:p>
-    <w:p>
-      <w:pPr>
-        <w:rPr>
-          <w:iCs/>
-        </w:rPr>
-      </w:pPr>
-    </w:p>
-    <w:p>
-      <w:pPr>
-        <w:rPr>
-          <w:iCs/>
-        </w:rPr>
-      </w:pPr>
-      <w:r>
-        <w:rPr>
-          <w:iCs/>
-        </w:rPr>
-        <w:t xml:space="preserve">Added ability for </w:t>
-      </w:r>
-      <w:proofErr w:type="spellStart"/>
-      <w:r>
-        <w:rPr>
-          <w:iCs/>
-        </w:rPr>
-        <w:t>fuzzer</w:t>
-      </w:r>
-      <w:proofErr w:type="spellEnd"/>
-      <w:r>
-        <w:rPr>
-          <w:iCs/>
-        </w:rPr>
-        <w:t xml:space="preserve"> to handle functions that take objects of custom classes as arguments but only if the argument is type annotation.</w:t>
-      </w:r>
-    </w:p>
-    <w:p>
-      <w:pPr>
-        <w:rPr>
-          <w:iCs/>
-        </w:rPr>
-      </w:pPr>
-      <w:r>
-        <w:rPr>
-          <w:iCs/>
-        </w:rPr>
-        <w:t xml:space="preserve">Improved ability to use type annotations, specifically we can now create containers of </w:t>
-      </w:r>
-      <w:proofErr w:type="spellStart"/>
-      <w:r>
-        <w:rPr>
-          <w:iCs/>
-        </w:rPr>
-        <w:t>callables</w:t>
-      </w:r>
-      <w:proofErr w:type="spellEnd"/>
-      <w:r>
-        <w:rPr>
-          <w:iCs/>
-        </w:rPr>
-        <w:t xml:space="preserve"> from type annotations</w:t>
+        <w:t>Seemingly obvious bugs might be overlooked. For bsearch_1, the failing input is 2. Even if I add an int type annotation, the fuzzer can fully fail to discover the bug because it never tried 2, it tried thousands of other numbers but not 2. Highlights a weakness of coverage-guidedness in a function where coverage wont change meaningfully</w:t>
+      </w:r>
+    </w:p>
+    <w:p>
+      <w:pPr>
+        <w:rPr>
+          <w:iCs/>
+        </w:rPr>
+      </w:pPr>
+    </w:p>
+    <w:p>
+      <w:pPr>
+        <w:rPr>
+          <w:iCs/>
+        </w:rPr>
+      </w:pPr>
+      <w:r>
+        <w:rPr>
+          <w:iCs/>
+        </w:rPr>
+        <w:t>Added ability for fuzzer to handle functions that take objects of custom classes as arguments but only if the argument is type annotation.</w:t>
+      </w:r>
+    </w:p>
+    <w:p>
+      <w:pPr>
+        <w:rPr>
+          <w:iCs/>
+        </w:rPr>
+      </w:pPr>
+      <w:r>
+        <w:rPr>
+          <w:iCs/>
+        </w:rPr>
+        <w:t>Improved ability to use type annotations, specifically we can now create containers of callables from type annotations</w:t>
       </w:r>
     </w:p>
     <w:p>
@@ -4147,49 +2803,7 @@
           <w:iCs/>
         </w:rPr>
         <w:lastRenderedPageBreak/>
-        <w:t xml:space="preserve">If the top level </w:t>
-      </w:r>
-      <w:proofErr w:type="spellStart"/>
-      <w:r>
-        <w:rPr>
-          <w:iCs/>
-        </w:rPr>
-        <w:t>funcs</w:t>
-      </w:r>
-      <w:proofErr w:type="spellEnd"/>
-      <w:r>
-        <w:rPr>
-          <w:iCs/>
-        </w:rPr>
-        <w:t xml:space="preserve"> take callable </w:t>
-      </w:r>
-      <w:proofErr w:type="spellStart"/>
-      <w:r>
-        <w:rPr>
-          <w:iCs/>
-        </w:rPr>
-        <w:t>args</w:t>
-      </w:r>
-      <w:proofErr w:type="spellEnd"/>
-      <w:r>
-        <w:rPr>
-          <w:iCs/>
-        </w:rPr>
-        <w:t xml:space="preserve">, the callable </w:t>
-      </w:r>
-      <w:proofErr w:type="spellStart"/>
-      <w:r>
-        <w:rPr>
-          <w:iCs/>
-        </w:rPr>
-        <w:t>args</w:t>
-      </w:r>
-      <w:proofErr w:type="spellEnd"/>
-      <w:r>
-        <w:rPr>
-          <w:iCs/>
-        </w:rPr>
-        <w:t xml:space="preserve"> are called the same number of times</w:t>
+        <w:t>If the top level funcs take callable args, the callable args are called the same number of times</w:t>
       </w:r>
     </w:p>
     <w:p>
@@ -4228,69 +2842,27 @@
         <w:rPr>
           <w:iCs/>
         </w:rPr>
-        <w:t xml:space="preserve">Added </w:t>
-      </w:r>
-      <w:proofErr w:type="spellStart"/>
-      <w:r>
-        <w:rPr>
-          <w:iCs/>
-        </w:rPr>
-        <w:t>DummyObject</w:t>
-      </w:r>
-      <w:proofErr w:type="spellEnd"/>
-      <w:r>
-        <w:rPr>
-          <w:iCs/>
-        </w:rPr>
-        <w:t xml:space="preserve"> which can be passed in when an object is expected. Useful for certain data structures like BSTs where methods can expect a node as an argument</w:t>
-      </w:r>
-    </w:p>
-    <w:p>
-      <w:pPr>
-        <w:rPr>
-          <w:iCs/>
-        </w:rPr>
-      </w:pPr>
-    </w:p>
-    <w:p>
-      <w:pPr>
-        <w:rPr>
-          <w:iCs/>
-        </w:rPr>
-      </w:pPr>
-      <w:r>
-        <w:rPr>
-          <w:iCs/>
-        </w:rPr>
-        <w:t xml:space="preserve">Comparing exception types when testing two </w:t>
-      </w:r>
-      <w:proofErr w:type="spellStart"/>
-      <w:r>
-        <w:rPr>
-          <w:iCs/>
-        </w:rPr>
-        <w:t>non type</w:t>
-      </w:r>
-      <w:proofErr w:type="spellEnd"/>
-      <w:r>
-        <w:rPr>
-          <w:iCs/>
-        </w:rPr>
-        <w:t xml:space="preserve"> annotated functions might be a bad idea. Even if two functions are equivalent but they do things in a different order they could get flagged as inequivalent </w:t>
-      </w:r>
-      <w:proofErr w:type="spellStart"/>
-      <w:r>
-        <w:rPr>
-          <w:iCs/>
-        </w:rPr>
-        <w:t>bcos</w:t>
-      </w:r>
-      <w:proofErr w:type="spellEnd"/>
-      <w:r>
-        <w:rPr>
-          <w:iCs/>
-        </w:rPr>
-        <w:t xml:space="preserve"> they ended up giving two different exception types. My current compromise is to relax the equivalence check for exceptions so that we only care about exception types mattering if the functions are type annotated, otherwise we only check that both sides threw an exception at all (type doesn’t matter)</w:t>
+        <w:t>Added DummyObject which can be passed in when an object is expected. Useful for certain data structures like BSTs where methods can expect a node as an argument</w:t>
+      </w:r>
+    </w:p>
+    <w:p>
+      <w:pPr>
+        <w:rPr>
+          <w:iCs/>
+        </w:rPr>
+      </w:pPr>
+    </w:p>
+    <w:p>
+      <w:pPr>
+        <w:rPr>
+          <w:iCs/>
+        </w:rPr>
+      </w:pPr>
+      <w:r>
+        <w:rPr>
+          <w:iCs/>
+        </w:rPr>
+        <w:t>Comparing exception types when testing two non type annotated functions might be a bad idea. Even if two functions are equivalent but they do things in a different order they could get flagged as inequivalent bcos they ended up giving two different exception types. My current compromise is to relax the equivalence check for exceptions so that we only care about exception types mattering if the functions are type annotated, otherwise we only check that both sides threw an exception at all (type doesn’t matter)</w:t>
       </w:r>
     </w:p>
     <w:p>
@@ -4369,119 +2941,31 @@
         <w:rPr>
           <w:iCs/>
         </w:rPr>
-        <w:t xml:space="preserve">TODO: I want to allow users to optionally add a hypothesis strategy to the </w:t>
-      </w:r>
-      <w:proofErr w:type="gramStart"/>
-      <w:r>
-        <w:rPr>
-          <w:iCs/>
-        </w:rPr>
-        <w:t>type</w:t>
-      </w:r>
-      <w:proofErr w:type="gramEnd"/>
-      <w:r>
-        <w:rPr>
-          <w:iCs/>
-        </w:rPr>
-        <w:t xml:space="preserve"> annotation for function to allow them to specifically gear the fuzzing strategy if they want some precondition for the input. </w:t>
-      </w:r>
-    </w:p>
-    <w:p>
-      <w:pPr>
-        <w:rPr>
-          <w:iCs/>
-        </w:rPr>
-      </w:pPr>
-      <w:proofErr w:type="spellStart"/>
-      <w:proofErr w:type="gramStart"/>
-      <w:r>
-        <w:rPr>
-          <w:iCs/>
-        </w:rPr>
-        <w:t>e.g</w:t>
-      </w:r>
-      <w:proofErr w:type="spellEnd"/>
-      <w:proofErr w:type="gramEnd"/>
-      <w:r>
-        <w:rPr>
-          <w:iCs/>
-        </w:rPr>
-        <w:t xml:space="preserve">: </w:t>
-      </w:r>
-      <w:r>
-        <w:rPr>
-          <w:iCs/>
-        </w:rPr>
-        <w:t xml:space="preserve">def </w:t>
-      </w:r>
-      <w:proofErr w:type="spellStart"/>
-      <w:r>
-        <w:rPr>
-          <w:iCs/>
-        </w:rPr>
-        <w:t>func</w:t>
-      </w:r>
-      <w:proofErr w:type="spellEnd"/>
-      <w:r>
-        <w:rPr>
-          <w:iCs/>
-        </w:rPr>
-        <w:t xml:space="preserve">(a: Annotated[list[int], </w:t>
-      </w:r>
-      <w:proofErr w:type="spellStart"/>
-      <w:r>
-        <w:rPr>
-          <w:iCs/>
-        </w:rPr>
-        <w:t>st.lists</w:t>
-      </w:r>
-      <w:proofErr w:type="spellEnd"/>
-      <w:r>
-        <w:rPr>
-          <w:iCs/>
-        </w:rPr>
-        <w:t>(</w:t>
-      </w:r>
-      <w:proofErr w:type="spellStart"/>
-      <w:r>
-        <w:rPr>
-          <w:iCs/>
-        </w:rPr>
-        <w:t>st.integers</w:t>
-      </w:r>
-      <w:proofErr w:type="spellEnd"/>
-      <w:r>
-        <w:rPr>
-          <w:iCs/>
-        </w:rPr>
-        <w:t xml:space="preserve">(), </w:t>
-      </w:r>
-      <w:proofErr w:type="spellStart"/>
-      <w:r>
-        <w:rPr>
-          <w:iCs/>
-        </w:rPr>
-        <w:t>min_size</w:t>
-      </w:r>
-      <w:proofErr w:type="spellEnd"/>
-      <w:r>
-        <w:rPr>
-          <w:iCs/>
-        </w:rPr>
-        <w:t>=1)]):</w:t>
-      </w:r>
-    </w:p>
-    <w:p>
-      <w:r>
-        <w:t xml:space="preserve">This is a function where input a has the precondition that it is a singleton list of </w:t>
-      </w:r>
-      <w:proofErr w:type="spellStart"/>
-      <w:r>
-        <w:t>ints</w:t>
-      </w:r>
-      <w:proofErr w:type="spellEnd"/>
-      <w:r>
-        <w:t>.</w:t>
+        <w:t xml:space="preserve">TODO: I want to allow users to optionally add a hypothesis strategy to the type annotation for function to allow them to specifically gear the fuzzing strategy if they want some precondition for the input. </w:t>
+      </w:r>
+    </w:p>
+    <w:p>
+      <w:pPr>
+        <w:rPr>
+          <w:iCs/>
+        </w:rPr>
+      </w:pPr>
+      <w:r>
+        <w:rPr>
+          <w:iCs/>
+        </w:rPr>
+        <w:t xml:space="preserve">e.g: </w:t>
+      </w:r>
+      <w:r>
+        <w:rPr>
+          <w:iCs/>
+        </w:rPr>
+        <w:t>def func(a: Annotated[list[int], st.lists(st.integers(), min_size=1)]):</w:t>
+      </w:r>
+    </w:p>
+    <w:p>
+      <w:r>
+        <w:t>This is a function where input a has the precondition that it is a singleton list of ints.</w:t>
       </w:r>
     </w:p>
     <w:p/>
@@ -4516,6 +3000,62 @@
     <w:p>
       <w:r>
         <w:t>57/77 test cases</w:t>
+      </w:r>
+    </w:p>
+    <w:p/>
+    <w:p>
+      <w:r>
+        <w:t>Look into statistics like coverage, look at what coverage I got on mutants that I failed to kill vs what the test suite killed</w:t>
+      </w:r>
+      <w:r>
+        <w:t xml:space="preserve"> – one important consideration. Do I take coverage for the whole class or coverage for the mutant method – probably the method</w:t>
+      </w:r>
+    </w:p>
+    <w:p>
+      <w:r>
+        <w:t>If I randomly remove a test, if there are fewer killed mutants (else put it back), this means the test was important in killing mutants, would my equivalence checker warn me about it? If so, that is a win. This might not be necessary to do, we could frame it this way but just take some mutants that overlaps from both</w:t>
+      </w:r>
+    </w:p>
+    <w:p>
+      <w:r>
+        <w:t>Can use the equivalence tester to find which mutants are equivalent to eachother, we can shrink the number of mutants – lower priority</w:t>
+      </w:r>
+    </w:p>
+    <w:p>
+      <w:r>
+        <w:t xml:space="preserve">From the original suite, what is the min number of tests we can keep that gets the same result as equivalence tester – can get 90% of the way there writing tests that emulate what my tester can do as a time saving exercise. </w:t>
+      </w:r>
+    </w:p>
+    <w:p>
+      <w:r>
+        <w:t>Potential use case: take all the mutants my tool is able to kill, give them to genAI and tell it to create tests that kill those mutants</w:t>
+      </w:r>
+    </w:p>
+    <w:p>
+      <w:r>
+        <w:t>Performance – find statistics for compute needed</w:t>
+      </w:r>
+    </w:p>
+    <w:p/>
+    <w:p>
+      <w:r>
+        <w:t>Disable higher order features option</w:t>
+      </w:r>
+    </w:p>
+    <w:p/>
+    <w:p>
+      <w:r>
+        <w:t>Added check that exception messages are equivalent – this requires normalising exception messages</w:t>
+      </w:r>
+    </w:p>
+    <w:p>
+      <w:r>
+        <w:t>Made class equivalence properly fuzz constructor</w:t>
+      </w:r>
+    </w:p>
+    <w:p>
+      <w:r>
+        <w:t>Added coverage checking</w:t>
       </w:r>
     </w:p>
     <w:p/>

</xml_diff>